<commit_message>
Add badge advantages for local police, sheriffs and U.S. Marshals
The Legal Enforcement Powers from the Grimm template, as three advantages with their
jurisdiction and duty; Eliza Kessler carries the Marshal's badge.

Co-Authored-By: Claude Opus 5.5 <noreply@anthropic.com>
Claude-Session: https://claude.ai/code/session_015SADCFzhKijkC2foUmXrpC
</commit_message>
<xml_diff>
--- a/grimm-west/Grimm_Players_Guide.docx
+++ b/grimm-west/Grimm_Players_Guide.docx
@@ -10574,7 +10574,7 @@
         <w:t xml:space="preserve"> </w:t>
       </w:r>
       <w:r>
-        <w:t xml:space="preserve">True grit.</w:t>
+        <w:t xml:space="preserve">Second advantage: Badge: Deputy U.S. Marshal.</w:t>
       </w:r>
       <w:r>
         <w:t xml:space="preserve"> </w:t>
@@ -13458,7 +13458,124 @@
           </w:p>
         </w:tc>
       </w:tr>
+      <w:tr>
+        <w:tc>
+          <w:tcPr/>
+          <w:p>
+            <w:pPr>
+              <w:pStyle w:val="Compact"/>
+              <w:jc w:val="left"/>
+            </w:pPr>
+            <w:r>
+              <w:rPr>
+                <w:b/>
+                <w:sz w:val="19"/>
+              </w:rPr>
+              <w:t xml:space="preserve">Badge: Town Police or Deputy</w:t>
+            </w:r>
+          </w:p>
+        </w:tc>
+        <w:tc>
+          <w:tcPr/>
+          <w:p>
+            <w:pPr>
+              <w:pStyle w:val="Compact"/>
+              <w:jc w:val="left"/>
+            </w:pPr>
+            <w:r>
+              <w:rPr>
+                <w:sz w:val="19"/>
+              </w:rPr>
+              <w:t xml:space="preserve">Legal authority in one town or county: you can carry arms where others can’t, question witnesses, make arrests and hold suspects. +2 to Leadership or Persuasion when invoking that authority with people who respect the law. Outside your jurisdiction it’s just tin.</w:t>
+            </w:r>
+          </w:p>
+        </w:tc>
+      </w:tr>
+      <w:tr>
+        <w:tc>
+          <w:tcPr/>
+          <w:p>
+            <w:pPr>
+              <w:pStyle w:val="Compact"/>
+              <w:jc w:val="left"/>
+            </w:pPr>
+            <w:r>
+              <w:rPr>
+                <w:b/>
+                <w:sz w:val="19"/>
+              </w:rPr>
+              <w:t xml:space="preserve">Badge: Sheriff</w:t>
+            </w:r>
+          </w:p>
+        </w:tc>
+        <w:tc>
+          <w:tcPr/>
+          <w:p>
+            <w:pPr>
+              <w:pStyle w:val="Compact"/>
+              <w:jc w:val="left"/>
+            </w:pPr>
+            <w:r>
+              <w:rPr>
+                <w:sz w:val="19"/>
+              </w:rPr>
+              <w:t xml:space="preserve">Authority across your county: everything a deputy can do, plus serving warrants, running the jail, and swearing in deputies and armed citizens. +2 to Leadership or Persuasion when invoking that authority with people who respect the law.</w:t>
+            </w:r>
+          </w:p>
+        </w:tc>
+      </w:tr>
+      <w:tr>
+        <w:tc>
+          <w:tcPr/>
+          <w:p>
+            <w:pPr>
+              <w:pStyle w:val="Compact"/>
+              <w:jc w:val="left"/>
+            </w:pPr>
+            <w:r>
+              <w:rPr>
+                <w:b/>
+                <w:sz w:val="19"/>
+              </w:rPr>
+              <w:t xml:space="preserve">Badge: Deputy U.S. Marshal</w:t>
+            </w:r>
+          </w:p>
+        </w:tc>
+        <w:tc>
+          <w:tcPr/>
+          <w:p>
+            <w:pPr>
+              <w:pStyle w:val="Compact"/>
+              <w:jc w:val="left"/>
+            </w:pPr>
+            <w:r>
+              <w:rPr>
+                <w:sz w:val="19"/>
+              </w:rPr>
+              <w:t xml:space="preserve">Federal authority across states and territories: serving federal warrants, pursuing fugitives across county and state lines, swearing in deputies, and calling on local lawmen for help. +2 to Leadership or Persuasion when invoking that authority with people who respect the law.</w:t>
+            </w:r>
+          </w:p>
+        </w:tc>
+      </w:tr>
     </w:tbl>
+    <w:p>
+      <w:pPr>
+        <w:pStyle w:val="BodyText"/>
+      </w:pPr>
+      <w:r>
+        <w:rPr>
+          <w:bCs/>
+          <w:b/>
+        </w:rPr>
+        <w:t xml:space="preserve">Badges.</w:t>
+      </w:r>
+      <w:r>
+        <w:t xml:space="preserve"> </w:t>
+      </w:r>
+      <w:r>
+        <w:t xml:space="preserve">A badge is legal authority, not a magic word: Wesen, outlaws and the powers of the hidden world don’t care about it, and it carries a duty. Your superiors can give you orders, and abusing the badge or failing in your duty can cost you it. Law callings (Marshal, Deputy) usually take one, as their advantage or as a second advantage Edge.</w:t>
+      </w:r>
+    </w:p>
     <w:bookmarkEnd w:id="84"/>
     <w:bookmarkStart w:id="106" w:name="heritages"/>
     <w:p>

</xml_diff>

<commit_message>
Add a Pinkerton Credentials advantage
Agency reach and files for Pinkerton detectives, without a badge's powers of arrest.

Co-Authored-By: Claude Opus 5.5 <noreply@anthropic.com>
Claude-Session: https://claude.ai/code/session_015SADCFzhKijkC2foUmXrpC
</commit_message>
<xml_diff>
--- a/grimm-west/Grimm_Players_Guide.docx
+++ b/grimm-west/Grimm_Players_Guide.docx
@@ -13557,6 +13557,39 @@
           </w:p>
         </w:tc>
       </w:tr>
+      <w:tr>
+        <w:tc>
+          <w:tcPr/>
+          <w:p>
+            <w:pPr>
+              <w:pStyle w:val="Compact"/>
+              <w:jc w:val="left"/>
+            </w:pPr>
+            <w:r>
+              <w:rPr>
+                <w:b/>
+                <w:sz w:val="19"/>
+              </w:rPr>
+              <w:t xml:space="preserve">Pinkerton Credentials</w:t>
+            </w:r>
+          </w:p>
+        </w:tc>
+        <w:tc>
+          <w:tcPr/>
+          <w:p>
+            <w:pPr>
+              <w:pStyle w:val="Compact"/>
+              <w:jc w:val="left"/>
+            </w:pPr>
+            <w:r>
+              <w:rPr>
+                <w:sz w:val="19"/>
+              </w:rPr>
+              <w:t xml:space="preserve">A commission from the Pinkerton National Detective Agency: carry arms on the job, work a client’s case across county and state lines, and draw on the agency’s offices and files (records, photographs and descriptions of wanted men). +2 to Investigation when using the agency’s records or contacts. You have no powers of arrest beyond any citizen’s unless local law deputizes you, and you answer to the client and the agency.</w:t>
+            </w:r>
+          </w:p>
+        </w:tc>
+      </w:tr>
     </w:tbl>
     <w:p>
       <w:pPr>
@@ -13573,7 +13606,7 @@
         <w:t xml:space="preserve"> </w:t>
       </w:r>
       <w:r>
-        <w:t xml:space="preserve">A badge is legal authority, not a magic word: Wesen, outlaws and the powers of the hidden world don’t care about it, and it carries a duty. Your superiors can give you orders, and abusing the badge or failing in your duty can cost you it. Law callings (Marshal, Deputy) usually take one, as their advantage or as a second advantage Edge.</w:t>
+        <w:t xml:space="preserve">A badge is legal authority, not a magic word: Wesen, outlaws and the powers of the hidden world don’t care about it, and it carries a duty. Your superiors can give you orders, and abusing the badge or failing in your duty can cost you it. Law callings (Marshal, Deputy) usually take one, as their advantage or as a second advantage Edge. A Pinkerton detective takes Pinkerton Credentials instead: the agency’s reach and files, but no badge.</w:t>
       </w:r>
     </w:p>
     <w:bookmarkEnd w:id="84"/>

</xml_diff>

<commit_message>
Guides: add a Discord commands chapter for players and GMs
All four creators (Iron Roads, Starward, USS Pelion, Grimm) get the
chapter with that game's point name, tracks and examples, generated by
tools/discord_chapter.py. Code in guide tables now wraps on phones.

Co-Authored-By: Claude Opus 5.5 <noreply@anthropic.com>
Claude-Session: https://claude.ai/code/session_015SADCFzhKijkC2foUmXrpC
</commit_message>
<xml_diff>
--- a/grimm-west/Grimm_Players_Guide.docx
+++ b/grimm-west/Grimm_Players_Guide.docx
@@ -23456,6 +23456,1154 @@
       </w:r>
     </w:p>
     <w:bookmarkEnd w:id="108"/>
+    <w:bookmarkStart w:id="111" w:name="discord-commands"/>
+    <w:p>
+      <w:pPr>
+        <w:pStyle w:val="Heading1"/>
+      </w:pPr>
+      <w:r>
+        <w:t xml:space="preserve">Discord commands</w:t>
+      </w:r>
+    </w:p>
+    <w:p>
+      <w:pPr>
+        <w:pStyle w:val="FirstParagraph"/>
+      </w:pPr>
+      <w:r>
+        <w:t xml:space="preserve">The table’s Discord bot rolls the dice and keeps the shared Grit points, clocks and Trouble tracks for the server. Type</w:t>
+      </w:r>
+      <w:r>
+        <w:t xml:space="preserve"> </w:t>
+      </w:r>
+      <w:r>
+        <w:rPr>
+          <w:rStyle w:val="VerbatimChar"/>
+        </w:rPr>
+        <w:t xml:space="preserve">/</w:t>
+      </w:r>
+      <w:r>
+        <w:t xml:space="preserve"> </w:t>
+      </w:r>
+      <w:r>
+        <w:t xml:space="preserve">in a channel to see the commands; Discord shows each option as you fill it in. The bot doesn’t know your sheet, so you give it the target number.</w:t>
+      </w:r>
+    </w:p>
+    <w:bookmarkStart w:id="109" w:name="for-players"/>
+    <w:p>
+      <w:pPr>
+        <w:pStyle w:val="Heading2"/>
+      </w:pPr>
+      <w:r>
+        <w:t xml:space="preserve">For players</w:t>
+      </w:r>
+    </w:p>
+    <w:tbl>
+      <w:tblPr>
+        <w:tblStyle w:val="Table"/>
+        <w:tblW w:type="pct" w:w="5000"/>
+        <w:tblLook w:firstRow="1" w:lastRow="0" w:firstColumn="0" w:lastColumn="0" w:noHBand="0" w:noVBand="0" w:val="0020"/>
+        <w:jc w:val="start"/>
+        <w:tblBorders>
+          <w:top w:val="single" w:sz="4" w:color="B8C2D3"/>
+          <w:left w:val="single" w:sz="4" w:color="B8C2D3"/>
+          <w:bottom w:val="single" w:sz="4" w:color="B8C2D3"/>
+          <w:right w:val="single" w:sz="4" w:color="B8C2D3"/>
+          <w:insideH w:val="single" w:sz="4" w:color="B8C2D3"/>
+          <w:insideV w:val="single" w:sz="4" w:color="B8C2D3"/>
+        </w:tblBorders>
+      </w:tblPr>
+      <w:tblGrid>
+        <w:gridCol w:w="3960"/>
+        <w:gridCol w:w="3960"/>
+      </w:tblGrid>
+      <w:tr>
+        <w:trPr>
+          <w:tblHeader w:val="true"/>
+        </w:trPr>
+        <w:tc>
+          <w:tcPr>
+            <w:shd w:val="clear" w:fill="F1E6D2"/>
+          </w:tcPr>
+          <w:p>
+            <w:pPr>
+              <w:pStyle w:val="Compact"/>
+              <w:jc w:val="left"/>
+            </w:pPr>
+            <w:r>
+              <w:rPr>
+                <w:b/>
+                <w:sz w:val="19"/>
+              </w:rPr>
+              <w:t xml:space="preserve">Command</w:t>
+            </w:r>
+          </w:p>
+        </w:tc>
+        <w:tc>
+          <w:tcPr>
+            <w:shd w:val="clear" w:fill="F1E6D2"/>
+          </w:tcPr>
+          <w:p>
+            <w:pPr>
+              <w:pStyle w:val="Compact"/>
+              <w:jc w:val="left"/>
+            </w:pPr>
+            <w:r>
+              <w:rPr>
+                <w:b/>
+                <w:sz w:val="19"/>
+              </w:rPr>
+              <w:t xml:space="preserve">What it does</w:t>
+            </w:r>
+          </w:p>
+        </w:tc>
+      </w:tr>
+      <w:tr>
+        <w:tc>
+          <w:tcPr/>
+          <w:p>
+            <w:pPr>
+              <w:pStyle w:val="Compact"/>
+              <w:jc w:val="left"/>
+            </w:pPr>
+            <w:r>
+              <w:rPr>
+                <w:rStyle w:val="VerbatimChar"/>
+                <w:b/>
+                <w:sz w:val="19"/>
+              </w:rPr>
+              <w:t xml:space="preserve">/roll target:13 modifier:-2 label:Tracking</w:t>
+            </w:r>
+          </w:p>
+        </w:tc>
+        <w:tc>
+          <w:tcPr/>
+          <w:p>
+            <w:pPr>
+              <w:pStyle w:val="Compact"/>
+              <w:jc w:val="left"/>
+            </w:pPr>
+            <w:r>
+              <w:rPr>
+                <w:sz w:val="19"/>
+              </w:rPr>
+              <w:t xml:space="preserve">Roll 3d6 under your target. Use the number from your sheet, and add up every modifier yourself: circumstance, injury, assistance. The bot shows the result, the margin and your chance.</w:t>
+            </w:r>
+            <w:r>
+              <w:rPr>
+                <w:sz w:val="19"/>
+              </w:rPr>
+              <w:t xml:space="preserve"> </w:t>
+            </w:r>
+            <w:r>
+              <w:rPr>
+                <w:bCs/>
+                <w:b/>
+                <w:sz w:val="19"/>
+              </w:rPr>
+              <w:t xml:space="preserve">Spend a Grit point to reroll</w:t>
+            </w:r>
+            <w:r>
+              <w:rPr>
+                <w:sz w:val="19"/>
+              </w:rPr>
+              <w:t xml:space="preserve"> </w:t>
+            </w:r>
+            <w:r>
+              <w:rPr>
+                <w:sz w:val="19"/>
+              </w:rPr>
+              <w:t xml:space="preserve">lets you reroll once, and the second result stands.</w:t>
+            </w:r>
+          </w:p>
+        </w:tc>
+      </w:tr>
+      <w:tr>
+        <w:tc>
+          <w:tcPr/>
+          <w:p>
+            <w:pPr>
+              <w:pStyle w:val="Compact"/>
+              <w:jc w:val="left"/>
+            </w:pPr>
+            <w:r>
+              <w:rPr>
+                <w:rStyle w:val="VerbatimChar"/>
+                <w:b/>
+                <w:sz w:val="19"/>
+              </w:rPr>
+              <w:t xml:space="preserve">/contest target:13 opponent:14 opponent_name:"Blutbad" label:Grapple</w:t>
+            </w:r>
+          </w:p>
+        </w:tc>
+        <w:tc>
+          <w:tcPr/>
+          <w:p>
+            <w:pPr>
+              <w:pStyle w:val="Compact"/>
+              <w:jc w:val="left"/>
+            </w:pPr>
+            <w:r>
+              <w:rPr>
+                <w:sz w:val="19"/>
+              </w:rPr>
+              <w:t xml:space="preserve">An opposed roll. The bot rolls both sides and names the winner. Ties and double failures go to the defender, which is the opponent unless you add</w:t>
+            </w:r>
+            <w:r>
+              <w:rPr>
+                <w:sz w:val="19"/>
+              </w:rPr>
+              <w:t xml:space="preserve"> </w:t>
+            </w:r>
+            <w:r>
+              <w:rPr>
+                <w:rStyle w:val="VerbatimChar"/>
+                <w:sz w:val="19"/>
+              </w:rPr>
+              <w:t xml:space="preserve">defender:me</w:t>
+            </w:r>
+            <w:r>
+              <w:rPr>
+                <w:sz w:val="19"/>
+              </w:rPr>
+              <w:t xml:space="preserve">.</w:t>
+            </w:r>
+          </w:p>
+        </w:tc>
+      </w:tr>
+      <w:tr>
+        <w:tc>
+          <w:tcPr/>
+          <w:p>
+            <w:pPr>
+              <w:pStyle w:val="Compact"/>
+              <w:jc w:val="left"/>
+            </w:pPr>
+            <w:r>
+              <w:rPr>
+                <w:rStyle w:val="VerbatimChar"/>
+                <w:b/>
+                <w:sz w:val="19"/>
+              </w:rPr>
+              <w:t xml:space="preserve">/assist target:12 helper_target:14 helper:@name label:"Hold the door"</w:t>
+            </w:r>
+          </w:p>
+        </w:tc>
+        <w:tc>
+          <w:tcPr/>
+          <w:p>
+            <w:pPr>
+              <w:pStyle w:val="Compact"/>
+              <w:jc w:val="left"/>
+            </w:pPr>
+            <w:r>
+              <w:rPr>
+                <w:sz w:val="19"/>
+              </w:rPr>
+              <w:t xml:space="preserve">Someone helps you. They roll first (Athletics, say): success gives +1, success by 5 or more +2, and a natural 18 brings a complication. Then you roll with their bonus.</w:t>
+            </w:r>
+          </w:p>
+        </w:tc>
+      </w:tr>
+      <w:tr>
+        <w:tc>
+          <w:tcPr/>
+          <w:p>
+            <w:pPr>
+              <w:pStyle w:val="Compact"/>
+              <w:jc w:val="left"/>
+            </w:pPr>
+            <w:r>
+              <w:rPr>
+                <w:rStyle w:val="VerbatimChar"/>
+                <w:b/>
+                <w:sz w:val="19"/>
+              </w:rPr>
+              <w:t xml:space="preserve">/points show</w:t>
+            </w:r>
+          </w:p>
+        </w:tc>
+        <w:tc>
+          <w:tcPr/>
+          <w:p>
+            <w:pPr>
+              <w:pStyle w:val="Compact"/>
+              <w:jc w:val="left"/>
+            </w:pPr>
+            <w:r>
+              <w:rPr>
+                <w:sz w:val="19"/>
+              </w:rPr>
+              <w:t xml:space="preserve">Your Grit points this session. Add</w:t>
+            </w:r>
+            <w:r>
+              <w:rPr>
+                <w:sz w:val="19"/>
+              </w:rPr>
+              <w:t xml:space="preserve"> </w:t>
+            </w:r>
+            <w:r>
+              <w:rPr>
+                <w:rStyle w:val="VerbatimChar"/>
+                <w:sz w:val="19"/>
+              </w:rPr>
+              <w:t xml:space="preserve">player:@name</w:t>
+            </w:r>
+            <w:r>
+              <w:rPr>
+                <w:sz w:val="19"/>
+              </w:rPr>
+              <w:t xml:space="preserve"> </w:t>
+            </w:r>
+            <w:r>
+              <w:rPr>
+                <w:sz w:val="19"/>
+              </w:rPr>
+              <w:t xml:space="preserve">to see someone else’s.</w:t>
+            </w:r>
+          </w:p>
+        </w:tc>
+      </w:tr>
+      <w:tr>
+        <w:tc>
+          <w:tcPr/>
+          <w:p>
+            <w:pPr>
+              <w:pStyle w:val="Compact"/>
+              <w:jc w:val="left"/>
+            </w:pPr>
+            <w:r>
+              <w:rPr>
+                <w:rStyle w:val="VerbatimChar"/>
+                <w:b/>
+                <w:sz w:val="19"/>
+              </w:rPr>
+              <w:t xml:space="preserve">/points spend</w:t>
+            </w:r>
+          </w:p>
+        </w:tc>
+        <w:tc>
+          <w:tcPr/>
+          <w:p>
+            <w:pPr>
+              <w:pStyle w:val="Compact"/>
+              <w:jc w:val="left"/>
+            </w:pPr>
+            <w:r>
+              <w:rPr>
+                <w:sz w:val="19"/>
+              </w:rPr>
+              <w:t xml:space="preserve">Spend a Grit point without rolling, e.g. to reduce an injury by one box or to establish a small preparation.</w:t>
+            </w:r>
+          </w:p>
+        </w:tc>
+      </w:tr>
+      <w:tr>
+        <w:tc>
+          <w:tcPr/>
+          <w:p>
+            <w:pPr>
+              <w:pStyle w:val="Compact"/>
+              <w:jc w:val="left"/>
+            </w:pPr>
+            <w:r>
+              <w:rPr>
+                <w:rStyle w:val="VerbatimChar"/>
+                <w:b/>
+                <w:sz w:val="19"/>
+              </w:rPr>
+              <w:t xml:space="preserve">/points gain</w:t>
+            </w:r>
+          </w:p>
+        </w:tc>
+        <w:tc>
+          <w:tcPr/>
+          <w:p>
+            <w:pPr>
+              <w:pStyle w:val="Compact"/>
+              <w:jc w:val="left"/>
+            </w:pPr>
+            <w:r>
+              <w:rPr>
+                <w:sz w:val="19"/>
+              </w:rPr>
+              <w:t xml:space="preserve">Gain a Grit point, e.g. when you accept a complication the GM offers. With Extra Grit, use it once at the start of a session.</w:t>
+            </w:r>
+          </w:p>
+        </w:tc>
+      </w:tr>
+      <w:tr>
+        <w:tc>
+          <w:tcPr/>
+          <w:p>
+            <w:pPr>
+              <w:pStyle w:val="Compact"/>
+              <w:jc w:val="left"/>
+            </w:pPr>
+            <w:r>
+              <w:rPr>
+                <w:rStyle w:val="VerbatimChar"/>
+                <w:b/>
+                <w:sz w:val="19"/>
+              </w:rPr>
+              <w:t xml:space="preserve">/clock show</w:t>
+            </w:r>
+          </w:p>
+        </w:tc>
+        <w:tc>
+          <w:tcPr/>
+          <w:p>
+            <w:pPr>
+              <w:pStyle w:val="Compact"/>
+              <w:jc w:val="left"/>
+            </w:pPr>
+            <w:r>
+              <w:rPr>
+                <w:sz w:val="19"/>
+              </w:rPr>
+              <w:t xml:space="preserve">Every clock the GM is running.</w:t>
+            </w:r>
+          </w:p>
+        </w:tc>
+      </w:tr>
+      <w:tr>
+        <w:tc>
+          <w:tcPr/>
+          <w:p>
+            <w:pPr>
+              <w:pStyle w:val="Compact"/>
+              <w:jc w:val="left"/>
+            </w:pPr>
+            <w:r>
+              <w:rPr>
+                <w:rStyle w:val="VerbatimChar"/>
+                <w:b/>
+                <w:sz w:val="19"/>
+              </w:rPr>
+              <w:t xml:space="preserve">/track show</w:t>
+            </w:r>
+          </w:p>
+        </w:tc>
+        <w:tc>
+          <w:tcPr/>
+          <w:p>
+            <w:pPr>
+              <w:pStyle w:val="Compact"/>
+              <w:jc w:val="left"/>
+            </w:pPr>
+            <w:r>
+              <w:rPr>
+                <w:sz w:val="19"/>
+              </w:rPr>
+              <w:t xml:space="preserve">The shared Trouble tracks (Suspicion, Exposure, Attention) and what each one means right now.</w:t>
+            </w:r>
+          </w:p>
+        </w:tc>
+      </w:tr>
+    </w:tbl>
+    <w:p>
+      <w:pPr>
+        <w:pStyle w:val="BodyText"/>
+      </w:pPr>
+      <w:r>
+        <w:t xml:space="preserve">The bot’s original names still work:</w:t>
+      </w:r>
+      <w:r>
+        <w:t xml:space="preserve"> </w:t>
+      </w:r>
+      <w:r>
+        <w:rPr>
+          <w:rStyle w:val="VerbatimChar"/>
+        </w:rPr>
+        <w:t xml:space="preserve">/grimm</w:t>
+      </w:r>
+      <w:r>
+        <w:t xml:space="preserve"> </w:t>
+      </w:r>
+      <w:r>
+        <w:t xml:space="preserve">is the same as</w:t>
+      </w:r>
+      <w:r>
+        <w:t xml:space="preserve"> </w:t>
+      </w:r>
+      <w:r>
+        <w:rPr>
+          <w:rStyle w:val="VerbatimChar"/>
+        </w:rPr>
+        <w:t xml:space="preserve">/roll</w:t>
+      </w:r>
+      <w:r>
+        <w:t xml:space="preserve">, and</w:t>
+      </w:r>
+      <w:r>
+        <w:t xml:space="preserve"> </w:t>
+      </w:r>
+      <w:r>
+        <w:rPr>
+          <w:rStyle w:val="VerbatimChar"/>
+        </w:rPr>
+        <w:t xml:space="preserve">/grit</w:t>
+      </w:r>
+      <w:r>
+        <w:t xml:space="preserve"> </w:t>
+      </w:r>
+      <w:r>
+        <w:t xml:space="preserve">is the same as</w:t>
+      </w:r>
+      <w:r>
+        <w:t xml:space="preserve"> </w:t>
+      </w:r>
+      <w:r>
+        <w:rPr>
+          <w:rStyle w:val="VerbatimChar"/>
+        </w:rPr>
+        <w:t xml:space="preserve">/points</w:t>
+      </w:r>
+      <w:r>
+        <w:t xml:space="preserve">.</w:t>
+      </w:r>
+    </w:p>
+    <w:p>
+      <w:pPr>
+        <w:pStyle w:val="BodyText"/>
+      </w:pPr>
+      <w:r>
+        <w:t xml:space="preserve">Only the player who rolled can press the reroll button. Rolls that miss by 1 or 2 remind the GM that success at a cost is on offer.</w:t>
+      </w:r>
+    </w:p>
+    <w:bookmarkEnd w:id="109"/>
+    <w:bookmarkStart w:id="110" w:name="for-the-gm"/>
+    <w:p>
+      <w:pPr>
+        <w:pStyle w:val="Heading2"/>
+      </w:pPr>
+      <w:r>
+        <w:t xml:space="preserve">For the GM</w:t>
+      </w:r>
+    </w:p>
+    <w:p>
+      <w:pPr>
+        <w:pStyle w:val="FirstParagraph"/>
+      </w:pPr>
+      <w:r>
+        <w:t xml:space="preserve">GM commands need the</w:t>
+      </w:r>
+      <w:r>
+        <w:t xml:space="preserve"> </w:t>
+      </w:r>
+      <w:r>
+        <w:rPr>
+          <w:bCs/>
+          <w:b/>
+        </w:rPr>
+        <w:t xml:space="preserve">Manage Server</w:t>
+      </w:r>
+      <w:r>
+        <w:t xml:space="preserve"> </w:t>
+      </w:r>
+      <w:r>
+        <w:t xml:space="preserve">permission on the Discord server. Everyone can see clocks, tracks and points.</w:t>
+      </w:r>
+    </w:p>
+    <w:tbl>
+      <w:tblPr>
+        <w:tblStyle w:val="Table"/>
+        <w:tblW w:type="pct" w:w="5000"/>
+        <w:tblLook w:firstRow="1" w:lastRow="0" w:firstColumn="0" w:lastColumn="0" w:noHBand="0" w:noVBand="0" w:val="0020"/>
+        <w:jc w:val="start"/>
+        <w:tblBorders>
+          <w:top w:val="single" w:sz="4" w:color="B8C2D3"/>
+          <w:left w:val="single" w:sz="4" w:color="B8C2D3"/>
+          <w:bottom w:val="single" w:sz="4" w:color="B8C2D3"/>
+          <w:right w:val="single" w:sz="4" w:color="B8C2D3"/>
+          <w:insideH w:val="single" w:sz="4" w:color="B8C2D3"/>
+          <w:insideV w:val="single" w:sz="4" w:color="B8C2D3"/>
+        </w:tblBorders>
+      </w:tblPr>
+      <w:tblGrid>
+        <w:gridCol w:w="3960"/>
+        <w:gridCol w:w="3960"/>
+      </w:tblGrid>
+      <w:tr>
+        <w:trPr>
+          <w:tblHeader w:val="true"/>
+        </w:trPr>
+        <w:tc>
+          <w:tcPr>
+            <w:shd w:val="clear" w:fill="F1E6D2"/>
+          </w:tcPr>
+          <w:p>
+            <w:pPr>
+              <w:pStyle w:val="Compact"/>
+              <w:jc w:val="left"/>
+            </w:pPr>
+            <w:r>
+              <w:rPr>
+                <w:b/>
+                <w:sz w:val="19"/>
+              </w:rPr>
+              <w:t xml:space="preserve">Command</w:t>
+            </w:r>
+          </w:p>
+        </w:tc>
+        <w:tc>
+          <w:tcPr>
+            <w:shd w:val="clear" w:fill="F1E6D2"/>
+          </w:tcPr>
+          <w:p>
+            <w:pPr>
+              <w:pStyle w:val="Compact"/>
+              <w:jc w:val="left"/>
+            </w:pPr>
+            <w:r>
+              <w:rPr>
+                <w:b/>
+                <w:sz w:val="19"/>
+              </w:rPr>
+              <w:t xml:space="preserve">What it does</w:t>
+            </w:r>
+          </w:p>
+        </w:tc>
+      </w:tr>
+      <w:tr>
+        <w:tc>
+          <w:tcPr/>
+          <w:p>
+            <w:pPr>
+              <w:pStyle w:val="Compact"/>
+              <w:jc w:val="left"/>
+            </w:pPr>
+            <w:r>
+              <w:rPr>
+                <w:rStyle w:val="VerbatimChar"/>
+                <w:b/>
+                <w:sz w:val="19"/>
+              </w:rPr>
+              <w:t xml:space="preserve">/game set game:Grimm</w:t>
+            </w:r>
+          </w:p>
+        </w:tc>
+        <w:tc>
+          <w:tcPr/>
+          <w:p>
+            <w:pPr>
+              <w:pStyle w:val="Compact"/>
+              <w:jc w:val="left"/>
+            </w:pPr>
+            <w:r>
+              <w:rPr>
+                <w:sz w:val="19"/>
+              </w:rPr>
+              <w:t xml:space="preserve">Choose this server’s game. Do it once;</w:t>
+            </w:r>
+            <w:r>
+              <w:rPr>
+                <w:sz w:val="19"/>
+              </w:rPr>
+              <w:t xml:space="preserve"> </w:t>
+            </w:r>
+            <w:r>
+              <w:rPr>
+                <w:rStyle w:val="VerbatimChar"/>
+                <w:sz w:val="19"/>
+              </w:rPr>
+              <w:t xml:space="preserve">/game show</w:t>
+            </w:r>
+            <w:r>
+              <w:rPr>
+                <w:sz w:val="19"/>
+              </w:rPr>
+              <w:t xml:space="preserve"> </w:t>
+            </w:r>
+            <w:r>
+              <w:rPr>
+                <w:sz w:val="19"/>
+              </w:rPr>
+              <w:t xml:space="preserve">checks it.</w:t>
+            </w:r>
+          </w:p>
+        </w:tc>
+      </w:tr>
+      <w:tr>
+        <w:tc>
+          <w:tcPr/>
+          <w:p>
+            <w:pPr>
+              <w:pStyle w:val="Compact"/>
+              <w:jc w:val="left"/>
+            </w:pPr>
+            <w:r>
+              <w:rPr>
+                <w:rStyle w:val="VerbatimChar"/>
+                <w:b/>
+                <w:sz w:val="19"/>
+              </w:rPr>
+              <w:t xml:space="preserve">/points newsession</w:t>
+            </w:r>
+          </w:p>
+        </w:tc>
+        <w:tc>
+          <w:tcPr/>
+          <w:p>
+            <w:pPr>
+              <w:pStyle w:val="Compact"/>
+              <w:jc w:val="left"/>
+            </w:pPr>
+            <w:r>
+              <w:rPr>
+                <w:sz w:val="19"/>
+              </w:rPr>
+              <w:t xml:space="preserve">Start a session: everyone goes back to two Grit points, and unused points are gone.</w:t>
+            </w:r>
+          </w:p>
+        </w:tc>
+      </w:tr>
+      <w:tr>
+        <w:tc>
+          <w:tcPr/>
+          <w:p>
+            <w:pPr>
+              <w:pStyle w:val="Compact"/>
+              <w:jc w:val="left"/>
+            </w:pPr>
+            <w:r>
+              <w:rPr>
+                <w:rStyle w:val="VerbatimChar"/>
+                <w:b/>
+                <w:sz w:val="19"/>
+              </w:rPr>
+              <w:t xml:space="preserve">/points gain player:@name</w:t>
+            </w:r>
+          </w:p>
+        </w:tc>
+        <w:tc>
+          <w:tcPr/>
+          <w:p>
+            <w:pPr>
+              <w:pStyle w:val="Compact"/>
+              <w:jc w:val="left"/>
+            </w:pPr>
+            <w:r>
+              <w:rPr>
+                <w:sz w:val="19"/>
+              </w:rPr>
+              <w:t xml:space="preserve">Award a Grit point, e.g. for an accepted complication.</w:t>
+            </w:r>
+          </w:p>
+        </w:tc>
+      </w:tr>
+      <w:tr>
+        <w:tc>
+          <w:tcPr/>
+          <w:p>
+            <w:pPr>
+              <w:pStyle w:val="Compact"/>
+              <w:jc w:val="left"/>
+            </w:pPr>
+            <w:r>
+              <w:rPr>
+                <w:rStyle w:val="VerbatimChar"/>
+                <w:b/>
+                <w:sz w:val="19"/>
+              </w:rPr>
+              <w:t xml:space="preserve">/points set player:@name points:3</w:t>
+            </w:r>
+          </w:p>
+        </w:tc>
+        <w:tc>
+          <w:tcPr/>
+          <w:p>
+            <w:pPr>
+              <w:pStyle w:val="Compact"/>
+              <w:jc w:val="left"/>
+            </w:pPr>
+            <w:r>
+              <w:rPr>
+                <w:sz w:val="19"/>
+              </w:rPr>
+              <w:t xml:space="preserve">Correct a player’s total.</w:t>
+            </w:r>
+          </w:p>
+        </w:tc>
+      </w:tr>
+      <w:tr>
+        <w:tc>
+          <w:tcPr/>
+          <w:p>
+            <w:pPr>
+              <w:pStyle w:val="Compact"/>
+              <w:jc w:val="left"/>
+            </w:pPr>
+            <w:r>
+              <w:rPr>
+                <w:rStyle w:val="VerbatimChar"/>
+                <w:b/>
+                <w:sz w:val="19"/>
+              </w:rPr>
+              <w:t xml:space="preserve">/clock new name:"The mob forms" segments:6 kind:danger</w:t>
+            </w:r>
+          </w:p>
+        </w:tc>
+        <w:tc>
+          <w:tcPr/>
+          <w:p>
+            <w:pPr>
+              <w:pStyle w:val="Compact"/>
+              <w:jc w:val="left"/>
+            </w:pPr>
+            <w:r>
+              <w:rPr>
+                <w:sz w:val="19"/>
+              </w:rPr>
+              <w:t xml:space="preserve">Start a clock of 2, 4, 6 or 8 segments. Danger clocks fill on failures and time; use</w:t>
+            </w:r>
+            <w:r>
+              <w:rPr>
+                <w:sz w:val="19"/>
+              </w:rPr>
+              <w:t xml:space="preserve"> </w:t>
+            </w:r>
+            <w:r>
+              <w:rPr>
+                <w:rStyle w:val="VerbatimChar"/>
+                <w:sz w:val="19"/>
+              </w:rPr>
+              <w:t xml:space="preserve">kind:progress</w:t>
+            </w:r>
+            <w:r>
+              <w:rPr>
+                <w:sz w:val="19"/>
+              </w:rPr>
+              <w:t xml:space="preserve"> </w:t>
+            </w:r>
+            <w:r>
+              <w:rPr>
+                <w:sz w:val="19"/>
+              </w:rPr>
+              <w:t xml:space="preserve">for one that fills on successes.</w:t>
+            </w:r>
+          </w:p>
+        </w:tc>
+      </w:tr>
+      <w:tr>
+        <w:tc>
+          <w:tcPr/>
+          <w:p>
+            <w:pPr>
+              <w:pStyle w:val="Compact"/>
+              <w:jc w:val="left"/>
+            </w:pPr>
+            <w:r>
+              <w:rPr>
+                <w:rStyle w:val="VerbatimChar"/>
+                <w:b/>
+                <w:sz w:val="19"/>
+              </w:rPr>
+              <w:t xml:space="preserve">/clock tick name:"The mob forms"</w:t>
+            </w:r>
+          </w:p>
+        </w:tc>
+        <w:tc>
+          <w:tcPr/>
+          <w:p>
+            <w:pPr>
+              <w:pStyle w:val="Compact"/>
+              <w:jc w:val="left"/>
+            </w:pPr>
+            <w:r>
+              <w:rPr>
+                <w:sz w:val="19"/>
+              </w:rPr>
+              <w:t xml:space="preserve">Fill one segment. Add</w:t>
+            </w:r>
+            <w:r>
+              <w:rPr>
+                <w:sz w:val="19"/>
+              </w:rPr>
+              <w:t xml:space="preserve"> </w:t>
+            </w:r>
+            <w:r>
+              <w:rPr>
+                <w:rStyle w:val="VerbatimChar"/>
+                <w:sz w:val="19"/>
+              </w:rPr>
+              <w:t xml:space="preserve">segments:2</w:t>
+            </w:r>
+            <w:r>
+              <w:rPr>
+                <w:sz w:val="19"/>
+              </w:rPr>
+              <w:t xml:space="preserve"> </w:t>
+            </w:r>
+            <w:r>
+              <w:rPr>
+                <w:sz w:val="19"/>
+              </w:rPr>
+              <w:t xml:space="preserve">for two, or</w:t>
+            </w:r>
+            <w:r>
+              <w:rPr>
+                <w:sz w:val="19"/>
+              </w:rPr>
+              <w:t xml:space="preserve"> </w:t>
+            </w:r>
+            <w:r>
+              <w:rPr>
+                <w:rStyle w:val="VerbatimChar"/>
+                <w:sz w:val="19"/>
+              </w:rPr>
+              <w:t xml:space="preserve">segments:-1</w:t>
+            </w:r>
+            <w:r>
+              <w:rPr>
+                <w:sz w:val="19"/>
+              </w:rPr>
+              <w:t xml:space="preserve"> </w:t>
+            </w:r>
+            <w:r>
+              <w:rPr>
+                <w:sz w:val="19"/>
+              </w:rPr>
+              <w:t xml:space="preserve">to undo.</w:t>
+            </w:r>
+            <w:r>
+              <w:rPr>
+                <w:sz w:val="19"/>
+              </w:rPr>
+              <w:t xml:space="preserve"> </w:t>
+            </w:r>
+            <w:r>
+              <w:rPr>
+                <w:rStyle w:val="VerbatimChar"/>
+                <w:sz w:val="19"/>
+              </w:rPr>
+              <w:t xml:space="preserve">/clock remove</w:t>
+            </w:r>
+            <w:r>
+              <w:rPr>
+                <w:sz w:val="19"/>
+              </w:rPr>
+              <w:t xml:space="preserve"> </w:t>
+            </w:r>
+            <w:r>
+              <w:rPr>
+                <w:sz w:val="19"/>
+              </w:rPr>
+              <w:t xml:space="preserve">deletes a clock.</w:t>
+            </w:r>
+          </w:p>
+        </w:tc>
+      </w:tr>
+      <w:tr>
+        <w:tc>
+          <w:tcPr/>
+          <w:p>
+            <w:pPr>
+              <w:pStyle w:val="Compact"/>
+              <w:jc w:val="left"/>
+            </w:pPr>
+            <w:r>
+              <w:rPr>
+                <w:rStyle w:val="VerbatimChar"/>
+                <w:b/>
+                <w:sz w:val="19"/>
+              </w:rPr>
+              <w:t xml:space="preserve">/track mark name:exposure</w:t>
+            </w:r>
+          </w:p>
+        </w:tc>
+        <w:tc>
+          <w:tcPr/>
+          <w:p>
+            <w:pPr>
+              <w:pStyle w:val="Compact"/>
+              <w:jc w:val="left"/>
+            </w:pPr>
+            <w:r>
+              <w:rPr>
+                <w:sz w:val="19"/>
+              </w:rPr>
+              <w:t xml:space="preserve">Mark a box on a track; a partial name works (</w:t>
+            </w:r>
+            <w:r>
+              <w:rPr>
+                <w:sz w:val="19"/>
+              </w:rPr>
+              <w:t xml:space="preserve">“</w:t>
+            </w:r>
+            <w:r>
+              <w:rPr>
+                <w:sz w:val="19"/>
+              </w:rPr>
+              <w:t xml:space="preserve">exposure</w:t>
+            </w:r>
+            <w:r>
+              <w:rPr>
+                <w:sz w:val="19"/>
+              </w:rPr>
+              <w:t xml:space="preserve">”</w:t>
+            </w:r>
+            <w:r>
+              <w:rPr>
+                <w:sz w:val="19"/>
+              </w:rPr>
+              <w:t xml:space="preserve"> </w:t>
+            </w:r>
+            <w:r>
+              <w:rPr>
+                <w:sz w:val="19"/>
+              </w:rPr>
+              <w:t xml:space="preserve">finds Exposure).</w:t>
+            </w:r>
+            <w:r>
+              <w:rPr>
+                <w:sz w:val="19"/>
+              </w:rPr>
+              <w:t xml:space="preserve"> </w:t>
+            </w:r>
+            <w:r>
+              <w:rPr>
+                <w:rStyle w:val="VerbatimChar"/>
+                <w:sz w:val="19"/>
+              </w:rPr>
+              <w:t xml:space="preserve">/track clear</w:t>
+            </w:r>
+            <w:r>
+              <w:rPr>
+                <w:sz w:val="19"/>
+              </w:rPr>
+              <w:t xml:space="preserve"> </w:t>
+            </w:r>
+            <w:r>
+              <w:rPr>
+                <w:sz w:val="19"/>
+              </w:rPr>
+              <w:t xml:space="preserve">clears one, and</w:t>
+            </w:r>
+            <w:r>
+              <w:rPr>
+                <w:sz w:val="19"/>
+              </w:rPr>
+              <w:t xml:space="preserve"> </w:t>
+            </w:r>
+            <w:r>
+              <w:rPr>
+                <w:rStyle w:val="VerbatimChar"/>
+                <w:sz w:val="19"/>
+              </w:rPr>
+              <w:t xml:space="preserve">/track reset</w:t>
+            </w:r>
+            <w:r>
+              <w:rPr>
+                <w:sz w:val="19"/>
+              </w:rPr>
+              <w:t xml:space="preserve"> </w:t>
+            </w:r>
+            <w:r>
+              <w:rPr>
+                <w:sz w:val="19"/>
+              </w:rPr>
+              <w:t xml:space="preserve">clears them all.</w:t>
+            </w:r>
+          </w:p>
+        </w:tc>
+      </w:tr>
+      <w:tr>
+        <w:tc>
+          <w:tcPr/>
+          <w:p>
+            <w:pPr>
+              <w:pStyle w:val="Compact"/>
+              <w:jc w:val="left"/>
+            </w:pPr>
+            <w:r>
+              <w:rPr>
+                <w:rStyle w:val="VerbatimChar"/>
+                <w:b/>
+                <w:sz w:val="19"/>
+              </w:rPr>
+              <w:t xml:space="preserve">/seed</w:t>
+            </w:r>
+          </w:p>
+        </w:tc>
+        <w:tc>
+          <w:tcPr/>
+          <w:p>
+            <w:pPr>
+              <w:pStyle w:val="Compact"/>
+              <w:jc w:val="left"/>
+            </w:pPr>
+            <w:r>
+              <w:rPr>
+                <w:sz w:val="19"/>
+              </w:rPr>
+              <w:t xml:space="preserve">Roll an adventure seed: one line from each seed table, and the command to start its ticking clock.</w:t>
+            </w:r>
+          </w:p>
+        </w:tc>
+      </w:tr>
+      <w:tr>
+        <w:tc>
+          <w:tcPr/>
+          <w:p>
+            <w:pPr>
+              <w:pStyle w:val="Compact"/>
+              <w:jc w:val="left"/>
+            </w:pPr>
+            <w:r>
+              <w:rPr>
+                <w:rStyle w:val="VerbatimChar"/>
+                <w:b/>
+                <w:sz w:val="19"/>
+              </w:rPr>
+              <w:t xml:space="preserve">/contest ... defender:me</w:t>
+            </w:r>
+          </w:p>
+        </w:tc>
+        <w:tc>
+          <w:tcPr/>
+          <w:p>
+            <w:pPr>
+              <w:pStyle w:val="Compact"/>
+              <w:jc w:val="left"/>
+            </w:pPr>
+            <w:r>
+              <w:rPr>
+                <w:sz w:val="19"/>
+              </w:rPr>
+              <w:t xml:space="preserve">When a player resists you (a grapple, a lie, a chase), they are the defender: ties and double failures go to them.</w:t>
+            </w:r>
+          </w:p>
+        </w:tc>
+      </w:tr>
+    </w:tbl>
+    <w:p>
+      <w:pPr>
+        <w:pStyle w:val="BodyText"/>
+      </w:pPr>
+      <w:r>
+        <w:t xml:space="preserve">Each server keeps its own points, clocks and tracks. If a command is missing from Discord’s list, open the bot’s</w:t>
+      </w:r>
+      <w:r>
+        <w:t xml:space="preserve"> </w:t>
+      </w:r>
+      <w:r>
+        <w:rPr>
+          <w:rStyle w:val="VerbatimChar"/>
+        </w:rPr>
+        <w:t xml:space="preserve">/register</w:t>
+      </w:r>
+      <w:r>
+        <w:t xml:space="preserve"> </w:t>
+      </w:r>
+      <w:r>
+        <w:t xml:space="preserve">page once (see the bot’s README), then press Ctrl+R in Discord.</w:t>
+      </w:r>
+      <w:r>
+        <w:t xml:space="preserve"> </w:t>
+      </w:r>
+    </w:p>
+    <w:bookmarkEnd w:id="110"/>
+    <w:bookmarkEnd w:id="111"/>
     <w:sectPr/>
   </w:body>
 </w:document>

</xml_diff>

<commit_message>
Grimm: clear Edges when a new heritage leaves fewer; add Discord commands chapter
Switching to a higher-tier heritage kept the Edges already chosen; now
they are cleared with a message. The guide gains a Discord commands
chapter for players and GMs, and code in guide tables wraps on phones.

Co-Authored-By: Claude Opus 5.5 <noreply@anthropic.com>
Claude-Session: https://claude.ai/code/session_015SADCFzhKijkC2foUmXrpC
</commit_message>
<xml_diff>
--- a/grimm-west/Grimm_Players_Guide.docx
+++ b/grimm-west/Grimm_Players_Guide.docx
@@ -23456,6 +23456,1154 @@
       </w:r>
     </w:p>
     <w:bookmarkEnd w:id="108"/>
+    <w:bookmarkStart w:id="111" w:name="discord-commands"/>
+    <w:p>
+      <w:pPr>
+        <w:pStyle w:val="Heading1"/>
+      </w:pPr>
+      <w:r>
+        <w:t xml:space="preserve">Discord commands</w:t>
+      </w:r>
+    </w:p>
+    <w:p>
+      <w:pPr>
+        <w:pStyle w:val="FirstParagraph"/>
+      </w:pPr>
+      <w:r>
+        <w:t xml:space="preserve">The table’s Discord bot rolls the dice and keeps the shared Grit points, clocks and Trouble tracks for the server. Type</w:t>
+      </w:r>
+      <w:r>
+        <w:t xml:space="preserve"> </w:t>
+      </w:r>
+      <w:r>
+        <w:rPr>
+          <w:rStyle w:val="VerbatimChar"/>
+        </w:rPr>
+        <w:t xml:space="preserve">/</w:t>
+      </w:r>
+      <w:r>
+        <w:t xml:space="preserve"> </w:t>
+      </w:r>
+      <w:r>
+        <w:t xml:space="preserve">in a channel to see the commands; Discord shows each option as you fill it in. The bot doesn’t know your sheet, so you give it the target number.</w:t>
+      </w:r>
+    </w:p>
+    <w:bookmarkStart w:id="109" w:name="for-players"/>
+    <w:p>
+      <w:pPr>
+        <w:pStyle w:val="Heading2"/>
+      </w:pPr>
+      <w:r>
+        <w:t xml:space="preserve">For players</w:t>
+      </w:r>
+    </w:p>
+    <w:tbl>
+      <w:tblPr>
+        <w:tblStyle w:val="Table"/>
+        <w:tblW w:type="pct" w:w="5000"/>
+        <w:tblLook w:firstRow="1" w:lastRow="0" w:firstColumn="0" w:lastColumn="0" w:noHBand="0" w:noVBand="0" w:val="0020"/>
+        <w:jc w:val="start"/>
+        <w:tblBorders>
+          <w:top w:val="single" w:sz="4" w:color="B8C2D3"/>
+          <w:left w:val="single" w:sz="4" w:color="B8C2D3"/>
+          <w:bottom w:val="single" w:sz="4" w:color="B8C2D3"/>
+          <w:right w:val="single" w:sz="4" w:color="B8C2D3"/>
+          <w:insideH w:val="single" w:sz="4" w:color="B8C2D3"/>
+          <w:insideV w:val="single" w:sz="4" w:color="B8C2D3"/>
+        </w:tblBorders>
+      </w:tblPr>
+      <w:tblGrid>
+        <w:gridCol w:w="3960"/>
+        <w:gridCol w:w="3960"/>
+      </w:tblGrid>
+      <w:tr>
+        <w:trPr>
+          <w:tblHeader w:val="true"/>
+        </w:trPr>
+        <w:tc>
+          <w:tcPr>
+            <w:shd w:val="clear" w:fill="F1E6D2"/>
+          </w:tcPr>
+          <w:p>
+            <w:pPr>
+              <w:pStyle w:val="Compact"/>
+              <w:jc w:val="left"/>
+            </w:pPr>
+            <w:r>
+              <w:rPr>
+                <w:b/>
+                <w:sz w:val="19"/>
+              </w:rPr>
+              <w:t xml:space="preserve">Command</w:t>
+            </w:r>
+          </w:p>
+        </w:tc>
+        <w:tc>
+          <w:tcPr>
+            <w:shd w:val="clear" w:fill="F1E6D2"/>
+          </w:tcPr>
+          <w:p>
+            <w:pPr>
+              <w:pStyle w:val="Compact"/>
+              <w:jc w:val="left"/>
+            </w:pPr>
+            <w:r>
+              <w:rPr>
+                <w:b/>
+                <w:sz w:val="19"/>
+              </w:rPr>
+              <w:t xml:space="preserve">What it does</w:t>
+            </w:r>
+          </w:p>
+        </w:tc>
+      </w:tr>
+      <w:tr>
+        <w:tc>
+          <w:tcPr/>
+          <w:p>
+            <w:pPr>
+              <w:pStyle w:val="Compact"/>
+              <w:jc w:val="left"/>
+            </w:pPr>
+            <w:r>
+              <w:rPr>
+                <w:rStyle w:val="VerbatimChar"/>
+                <w:b/>
+                <w:sz w:val="19"/>
+              </w:rPr>
+              <w:t xml:space="preserve">/roll target:13 modifier:-2 label:Tracking</w:t>
+            </w:r>
+          </w:p>
+        </w:tc>
+        <w:tc>
+          <w:tcPr/>
+          <w:p>
+            <w:pPr>
+              <w:pStyle w:val="Compact"/>
+              <w:jc w:val="left"/>
+            </w:pPr>
+            <w:r>
+              <w:rPr>
+                <w:sz w:val="19"/>
+              </w:rPr>
+              <w:t xml:space="preserve">Roll 3d6 under your target. Use the number from your sheet, and add up every modifier yourself: circumstance, injury, assistance. The bot shows the result, the margin and your chance.</w:t>
+            </w:r>
+            <w:r>
+              <w:rPr>
+                <w:sz w:val="19"/>
+              </w:rPr>
+              <w:t xml:space="preserve"> </w:t>
+            </w:r>
+            <w:r>
+              <w:rPr>
+                <w:bCs/>
+                <w:b/>
+                <w:sz w:val="19"/>
+              </w:rPr>
+              <w:t xml:space="preserve">Spend a Grit point to reroll</w:t>
+            </w:r>
+            <w:r>
+              <w:rPr>
+                <w:sz w:val="19"/>
+              </w:rPr>
+              <w:t xml:space="preserve"> </w:t>
+            </w:r>
+            <w:r>
+              <w:rPr>
+                <w:sz w:val="19"/>
+              </w:rPr>
+              <w:t xml:space="preserve">lets you reroll once, and the second result stands.</w:t>
+            </w:r>
+          </w:p>
+        </w:tc>
+      </w:tr>
+      <w:tr>
+        <w:tc>
+          <w:tcPr/>
+          <w:p>
+            <w:pPr>
+              <w:pStyle w:val="Compact"/>
+              <w:jc w:val="left"/>
+            </w:pPr>
+            <w:r>
+              <w:rPr>
+                <w:rStyle w:val="VerbatimChar"/>
+                <w:b/>
+                <w:sz w:val="19"/>
+              </w:rPr>
+              <w:t xml:space="preserve">/contest target:13 opponent:14 opponent_name:"Blutbad" label:Grapple</w:t>
+            </w:r>
+          </w:p>
+        </w:tc>
+        <w:tc>
+          <w:tcPr/>
+          <w:p>
+            <w:pPr>
+              <w:pStyle w:val="Compact"/>
+              <w:jc w:val="left"/>
+            </w:pPr>
+            <w:r>
+              <w:rPr>
+                <w:sz w:val="19"/>
+              </w:rPr>
+              <w:t xml:space="preserve">An opposed roll. The bot rolls both sides and names the winner. Ties and double failures go to the defender, which is the opponent unless you add</w:t>
+            </w:r>
+            <w:r>
+              <w:rPr>
+                <w:sz w:val="19"/>
+              </w:rPr>
+              <w:t xml:space="preserve"> </w:t>
+            </w:r>
+            <w:r>
+              <w:rPr>
+                <w:rStyle w:val="VerbatimChar"/>
+                <w:sz w:val="19"/>
+              </w:rPr>
+              <w:t xml:space="preserve">defender:me</w:t>
+            </w:r>
+            <w:r>
+              <w:rPr>
+                <w:sz w:val="19"/>
+              </w:rPr>
+              <w:t xml:space="preserve">.</w:t>
+            </w:r>
+          </w:p>
+        </w:tc>
+      </w:tr>
+      <w:tr>
+        <w:tc>
+          <w:tcPr/>
+          <w:p>
+            <w:pPr>
+              <w:pStyle w:val="Compact"/>
+              <w:jc w:val="left"/>
+            </w:pPr>
+            <w:r>
+              <w:rPr>
+                <w:rStyle w:val="VerbatimChar"/>
+                <w:b/>
+                <w:sz w:val="19"/>
+              </w:rPr>
+              <w:t xml:space="preserve">/assist target:12 helper_target:14 helper:@name label:"Hold the door"</w:t>
+            </w:r>
+          </w:p>
+        </w:tc>
+        <w:tc>
+          <w:tcPr/>
+          <w:p>
+            <w:pPr>
+              <w:pStyle w:val="Compact"/>
+              <w:jc w:val="left"/>
+            </w:pPr>
+            <w:r>
+              <w:rPr>
+                <w:sz w:val="19"/>
+              </w:rPr>
+              <w:t xml:space="preserve">Someone helps you. They roll first (Athletics, say): success gives +1, success by 5 or more +2, and a natural 18 brings a complication. Then you roll with their bonus.</w:t>
+            </w:r>
+          </w:p>
+        </w:tc>
+      </w:tr>
+      <w:tr>
+        <w:tc>
+          <w:tcPr/>
+          <w:p>
+            <w:pPr>
+              <w:pStyle w:val="Compact"/>
+              <w:jc w:val="left"/>
+            </w:pPr>
+            <w:r>
+              <w:rPr>
+                <w:rStyle w:val="VerbatimChar"/>
+                <w:b/>
+                <w:sz w:val="19"/>
+              </w:rPr>
+              <w:t xml:space="preserve">/points show</w:t>
+            </w:r>
+          </w:p>
+        </w:tc>
+        <w:tc>
+          <w:tcPr/>
+          <w:p>
+            <w:pPr>
+              <w:pStyle w:val="Compact"/>
+              <w:jc w:val="left"/>
+            </w:pPr>
+            <w:r>
+              <w:rPr>
+                <w:sz w:val="19"/>
+              </w:rPr>
+              <w:t xml:space="preserve">Your Grit points this session. Add</w:t>
+            </w:r>
+            <w:r>
+              <w:rPr>
+                <w:sz w:val="19"/>
+              </w:rPr>
+              <w:t xml:space="preserve"> </w:t>
+            </w:r>
+            <w:r>
+              <w:rPr>
+                <w:rStyle w:val="VerbatimChar"/>
+                <w:sz w:val="19"/>
+              </w:rPr>
+              <w:t xml:space="preserve">player:@name</w:t>
+            </w:r>
+            <w:r>
+              <w:rPr>
+                <w:sz w:val="19"/>
+              </w:rPr>
+              <w:t xml:space="preserve"> </w:t>
+            </w:r>
+            <w:r>
+              <w:rPr>
+                <w:sz w:val="19"/>
+              </w:rPr>
+              <w:t xml:space="preserve">to see someone else’s.</w:t>
+            </w:r>
+          </w:p>
+        </w:tc>
+      </w:tr>
+      <w:tr>
+        <w:tc>
+          <w:tcPr/>
+          <w:p>
+            <w:pPr>
+              <w:pStyle w:val="Compact"/>
+              <w:jc w:val="left"/>
+            </w:pPr>
+            <w:r>
+              <w:rPr>
+                <w:rStyle w:val="VerbatimChar"/>
+                <w:b/>
+                <w:sz w:val="19"/>
+              </w:rPr>
+              <w:t xml:space="preserve">/points spend</w:t>
+            </w:r>
+          </w:p>
+        </w:tc>
+        <w:tc>
+          <w:tcPr/>
+          <w:p>
+            <w:pPr>
+              <w:pStyle w:val="Compact"/>
+              <w:jc w:val="left"/>
+            </w:pPr>
+            <w:r>
+              <w:rPr>
+                <w:sz w:val="19"/>
+              </w:rPr>
+              <w:t xml:space="preserve">Spend a Grit point without rolling, e.g. to reduce an injury by one box or to establish a small preparation.</w:t>
+            </w:r>
+          </w:p>
+        </w:tc>
+      </w:tr>
+      <w:tr>
+        <w:tc>
+          <w:tcPr/>
+          <w:p>
+            <w:pPr>
+              <w:pStyle w:val="Compact"/>
+              <w:jc w:val="left"/>
+            </w:pPr>
+            <w:r>
+              <w:rPr>
+                <w:rStyle w:val="VerbatimChar"/>
+                <w:b/>
+                <w:sz w:val="19"/>
+              </w:rPr>
+              <w:t xml:space="preserve">/points gain</w:t>
+            </w:r>
+          </w:p>
+        </w:tc>
+        <w:tc>
+          <w:tcPr/>
+          <w:p>
+            <w:pPr>
+              <w:pStyle w:val="Compact"/>
+              <w:jc w:val="left"/>
+            </w:pPr>
+            <w:r>
+              <w:rPr>
+                <w:sz w:val="19"/>
+              </w:rPr>
+              <w:t xml:space="preserve">Gain a Grit point, e.g. when you accept a complication the GM offers. With Extra Grit, use it once at the start of a session.</w:t>
+            </w:r>
+          </w:p>
+        </w:tc>
+      </w:tr>
+      <w:tr>
+        <w:tc>
+          <w:tcPr/>
+          <w:p>
+            <w:pPr>
+              <w:pStyle w:val="Compact"/>
+              <w:jc w:val="left"/>
+            </w:pPr>
+            <w:r>
+              <w:rPr>
+                <w:rStyle w:val="VerbatimChar"/>
+                <w:b/>
+                <w:sz w:val="19"/>
+              </w:rPr>
+              <w:t xml:space="preserve">/clock show</w:t>
+            </w:r>
+          </w:p>
+        </w:tc>
+        <w:tc>
+          <w:tcPr/>
+          <w:p>
+            <w:pPr>
+              <w:pStyle w:val="Compact"/>
+              <w:jc w:val="left"/>
+            </w:pPr>
+            <w:r>
+              <w:rPr>
+                <w:sz w:val="19"/>
+              </w:rPr>
+              <w:t xml:space="preserve">Every clock the GM is running.</w:t>
+            </w:r>
+          </w:p>
+        </w:tc>
+      </w:tr>
+      <w:tr>
+        <w:tc>
+          <w:tcPr/>
+          <w:p>
+            <w:pPr>
+              <w:pStyle w:val="Compact"/>
+              <w:jc w:val="left"/>
+            </w:pPr>
+            <w:r>
+              <w:rPr>
+                <w:rStyle w:val="VerbatimChar"/>
+                <w:b/>
+                <w:sz w:val="19"/>
+              </w:rPr>
+              <w:t xml:space="preserve">/track show</w:t>
+            </w:r>
+          </w:p>
+        </w:tc>
+        <w:tc>
+          <w:tcPr/>
+          <w:p>
+            <w:pPr>
+              <w:pStyle w:val="Compact"/>
+              <w:jc w:val="left"/>
+            </w:pPr>
+            <w:r>
+              <w:rPr>
+                <w:sz w:val="19"/>
+              </w:rPr>
+              <w:t xml:space="preserve">The shared Trouble tracks (Suspicion, Exposure, Attention) and what each one means right now.</w:t>
+            </w:r>
+          </w:p>
+        </w:tc>
+      </w:tr>
+    </w:tbl>
+    <w:p>
+      <w:pPr>
+        <w:pStyle w:val="BodyText"/>
+      </w:pPr>
+      <w:r>
+        <w:t xml:space="preserve">The bot’s original names still work:</w:t>
+      </w:r>
+      <w:r>
+        <w:t xml:space="preserve"> </w:t>
+      </w:r>
+      <w:r>
+        <w:rPr>
+          <w:rStyle w:val="VerbatimChar"/>
+        </w:rPr>
+        <w:t xml:space="preserve">/grimm</w:t>
+      </w:r>
+      <w:r>
+        <w:t xml:space="preserve"> </w:t>
+      </w:r>
+      <w:r>
+        <w:t xml:space="preserve">is the same as</w:t>
+      </w:r>
+      <w:r>
+        <w:t xml:space="preserve"> </w:t>
+      </w:r>
+      <w:r>
+        <w:rPr>
+          <w:rStyle w:val="VerbatimChar"/>
+        </w:rPr>
+        <w:t xml:space="preserve">/roll</w:t>
+      </w:r>
+      <w:r>
+        <w:t xml:space="preserve">, and</w:t>
+      </w:r>
+      <w:r>
+        <w:t xml:space="preserve"> </w:t>
+      </w:r>
+      <w:r>
+        <w:rPr>
+          <w:rStyle w:val="VerbatimChar"/>
+        </w:rPr>
+        <w:t xml:space="preserve">/grit</w:t>
+      </w:r>
+      <w:r>
+        <w:t xml:space="preserve"> </w:t>
+      </w:r>
+      <w:r>
+        <w:t xml:space="preserve">is the same as</w:t>
+      </w:r>
+      <w:r>
+        <w:t xml:space="preserve"> </w:t>
+      </w:r>
+      <w:r>
+        <w:rPr>
+          <w:rStyle w:val="VerbatimChar"/>
+        </w:rPr>
+        <w:t xml:space="preserve">/points</w:t>
+      </w:r>
+      <w:r>
+        <w:t xml:space="preserve">.</w:t>
+      </w:r>
+    </w:p>
+    <w:p>
+      <w:pPr>
+        <w:pStyle w:val="BodyText"/>
+      </w:pPr>
+      <w:r>
+        <w:t xml:space="preserve">Only the player who rolled can press the reroll button. Rolls that miss by 1 or 2 remind the GM that success at a cost is on offer.</w:t>
+      </w:r>
+    </w:p>
+    <w:bookmarkEnd w:id="109"/>
+    <w:bookmarkStart w:id="110" w:name="for-the-gm"/>
+    <w:p>
+      <w:pPr>
+        <w:pStyle w:val="Heading2"/>
+      </w:pPr>
+      <w:r>
+        <w:t xml:space="preserve">For the GM</w:t>
+      </w:r>
+    </w:p>
+    <w:p>
+      <w:pPr>
+        <w:pStyle w:val="FirstParagraph"/>
+      </w:pPr>
+      <w:r>
+        <w:t xml:space="preserve">GM commands need the</w:t>
+      </w:r>
+      <w:r>
+        <w:t xml:space="preserve"> </w:t>
+      </w:r>
+      <w:r>
+        <w:rPr>
+          <w:bCs/>
+          <w:b/>
+        </w:rPr>
+        <w:t xml:space="preserve">Manage Server</w:t>
+      </w:r>
+      <w:r>
+        <w:t xml:space="preserve"> </w:t>
+      </w:r>
+      <w:r>
+        <w:t xml:space="preserve">permission on the Discord server. Everyone can see clocks, tracks and points.</w:t>
+      </w:r>
+    </w:p>
+    <w:tbl>
+      <w:tblPr>
+        <w:tblStyle w:val="Table"/>
+        <w:tblW w:type="pct" w:w="5000"/>
+        <w:tblLook w:firstRow="1" w:lastRow="0" w:firstColumn="0" w:lastColumn="0" w:noHBand="0" w:noVBand="0" w:val="0020"/>
+        <w:jc w:val="start"/>
+        <w:tblBorders>
+          <w:top w:val="single" w:sz="4" w:color="B8C2D3"/>
+          <w:left w:val="single" w:sz="4" w:color="B8C2D3"/>
+          <w:bottom w:val="single" w:sz="4" w:color="B8C2D3"/>
+          <w:right w:val="single" w:sz="4" w:color="B8C2D3"/>
+          <w:insideH w:val="single" w:sz="4" w:color="B8C2D3"/>
+          <w:insideV w:val="single" w:sz="4" w:color="B8C2D3"/>
+        </w:tblBorders>
+      </w:tblPr>
+      <w:tblGrid>
+        <w:gridCol w:w="3960"/>
+        <w:gridCol w:w="3960"/>
+      </w:tblGrid>
+      <w:tr>
+        <w:trPr>
+          <w:tblHeader w:val="true"/>
+        </w:trPr>
+        <w:tc>
+          <w:tcPr>
+            <w:shd w:val="clear" w:fill="F1E6D2"/>
+          </w:tcPr>
+          <w:p>
+            <w:pPr>
+              <w:pStyle w:val="Compact"/>
+              <w:jc w:val="left"/>
+            </w:pPr>
+            <w:r>
+              <w:rPr>
+                <w:b/>
+                <w:sz w:val="19"/>
+              </w:rPr>
+              <w:t xml:space="preserve">Command</w:t>
+            </w:r>
+          </w:p>
+        </w:tc>
+        <w:tc>
+          <w:tcPr>
+            <w:shd w:val="clear" w:fill="F1E6D2"/>
+          </w:tcPr>
+          <w:p>
+            <w:pPr>
+              <w:pStyle w:val="Compact"/>
+              <w:jc w:val="left"/>
+            </w:pPr>
+            <w:r>
+              <w:rPr>
+                <w:b/>
+                <w:sz w:val="19"/>
+              </w:rPr>
+              <w:t xml:space="preserve">What it does</w:t>
+            </w:r>
+          </w:p>
+        </w:tc>
+      </w:tr>
+      <w:tr>
+        <w:tc>
+          <w:tcPr/>
+          <w:p>
+            <w:pPr>
+              <w:pStyle w:val="Compact"/>
+              <w:jc w:val="left"/>
+            </w:pPr>
+            <w:r>
+              <w:rPr>
+                <w:rStyle w:val="VerbatimChar"/>
+                <w:b/>
+                <w:sz w:val="19"/>
+              </w:rPr>
+              <w:t xml:space="preserve">/game set game:Grimm</w:t>
+            </w:r>
+          </w:p>
+        </w:tc>
+        <w:tc>
+          <w:tcPr/>
+          <w:p>
+            <w:pPr>
+              <w:pStyle w:val="Compact"/>
+              <w:jc w:val="left"/>
+            </w:pPr>
+            <w:r>
+              <w:rPr>
+                <w:sz w:val="19"/>
+              </w:rPr>
+              <w:t xml:space="preserve">Choose this server’s game. Do it once;</w:t>
+            </w:r>
+            <w:r>
+              <w:rPr>
+                <w:sz w:val="19"/>
+              </w:rPr>
+              <w:t xml:space="preserve"> </w:t>
+            </w:r>
+            <w:r>
+              <w:rPr>
+                <w:rStyle w:val="VerbatimChar"/>
+                <w:sz w:val="19"/>
+              </w:rPr>
+              <w:t xml:space="preserve">/game show</w:t>
+            </w:r>
+            <w:r>
+              <w:rPr>
+                <w:sz w:val="19"/>
+              </w:rPr>
+              <w:t xml:space="preserve"> </w:t>
+            </w:r>
+            <w:r>
+              <w:rPr>
+                <w:sz w:val="19"/>
+              </w:rPr>
+              <w:t xml:space="preserve">checks it.</w:t>
+            </w:r>
+          </w:p>
+        </w:tc>
+      </w:tr>
+      <w:tr>
+        <w:tc>
+          <w:tcPr/>
+          <w:p>
+            <w:pPr>
+              <w:pStyle w:val="Compact"/>
+              <w:jc w:val="left"/>
+            </w:pPr>
+            <w:r>
+              <w:rPr>
+                <w:rStyle w:val="VerbatimChar"/>
+                <w:b/>
+                <w:sz w:val="19"/>
+              </w:rPr>
+              <w:t xml:space="preserve">/points newsession</w:t>
+            </w:r>
+          </w:p>
+        </w:tc>
+        <w:tc>
+          <w:tcPr/>
+          <w:p>
+            <w:pPr>
+              <w:pStyle w:val="Compact"/>
+              <w:jc w:val="left"/>
+            </w:pPr>
+            <w:r>
+              <w:rPr>
+                <w:sz w:val="19"/>
+              </w:rPr>
+              <w:t xml:space="preserve">Start a session: everyone goes back to two Grit points, and unused points are gone.</w:t>
+            </w:r>
+          </w:p>
+        </w:tc>
+      </w:tr>
+      <w:tr>
+        <w:tc>
+          <w:tcPr/>
+          <w:p>
+            <w:pPr>
+              <w:pStyle w:val="Compact"/>
+              <w:jc w:val="left"/>
+            </w:pPr>
+            <w:r>
+              <w:rPr>
+                <w:rStyle w:val="VerbatimChar"/>
+                <w:b/>
+                <w:sz w:val="19"/>
+              </w:rPr>
+              <w:t xml:space="preserve">/points gain player:@name</w:t>
+            </w:r>
+          </w:p>
+        </w:tc>
+        <w:tc>
+          <w:tcPr/>
+          <w:p>
+            <w:pPr>
+              <w:pStyle w:val="Compact"/>
+              <w:jc w:val="left"/>
+            </w:pPr>
+            <w:r>
+              <w:rPr>
+                <w:sz w:val="19"/>
+              </w:rPr>
+              <w:t xml:space="preserve">Award a Grit point, e.g. for an accepted complication.</w:t>
+            </w:r>
+          </w:p>
+        </w:tc>
+      </w:tr>
+      <w:tr>
+        <w:tc>
+          <w:tcPr/>
+          <w:p>
+            <w:pPr>
+              <w:pStyle w:val="Compact"/>
+              <w:jc w:val="left"/>
+            </w:pPr>
+            <w:r>
+              <w:rPr>
+                <w:rStyle w:val="VerbatimChar"/>
+                <w:b/>
+                <w:sz w:val="19"/>
+              </w:rPr>
+              <w:t xml:space="preserve">/points set player:@name points:3</w:t>
+            </w:r>
+          </w:p>
+        </w:tc>
+        <w:tc>
+          <w:tcPr/>
+          <w:p>
+            <w:pPr>
+              <w:pStyle w:val="Compact"/>
+              <w:jc w:val="left"/>
+            </w:pPr>
+            <w:r>
+              <w:rPr>
+                <w:sz w:val="19"/>
+              </w:rPr>
+              <w:t xml:space="preserve">Correct a player’s total.</w:t>
+            </w:r>
+          </w:p>
+        </w:tc>
+      </w:tr>
+      <w:tr>
+        <w:tc>
+          <w:tcPr/>
+          <w:p>
+            <w:pPr>
+              <w:pStyle w:val="Compact"/>
+              <w:jc w:val="left"/>
+            </w:pPr>
+            <w:r>
+              <w:rPr>
+                <w:rStyle w:val="VerbatimChar"/>
+                <w:b/>
+                <w:sz w:val="19"/>
+              </w:rPr>
+              <w:t xml:space="preserve">/clock new name:"The mob forms" segments:6 kind:danger</w:t>
+            </w:r>
+          </w:p>
+        </w:tc>
+        <w:tc>
+          <w:tcPr/>
+          <w:p>
+            <w:pPr>
+              <w:pStyle w:val="Compact"/>
+              <w:jc w:val="left"/>
+            </w:pPr>
+            <w:r>
+              <w:rPr>
+                <w:sz w:val="19"/>
+              </w:rPr>
+              <w:t xml:space="preserve">Start a clock of 2, 4, 6 or 8 segments. Danger clocks fill on failures and time; use</w:t>
+            </w:r>
+            <w:r>
+              <w:rPr>
+                <w:sz w:val="19"/>
+              </w:rPr>
+              <w:t xml:space="preserve"> </w:t>
+            </w:r>
+            <w:r>
+              <w:rPr>
+                <w:rStyle w:val="VerbatimChar"/>
+                <w:sz w:val="19"/>
+              </w:rPr>
+              <w:t xml:space="preserve">kind:progress</w:t>
+            </w:r>
+            <w:r>
+              <w:rPr>
+                <w:sz w:val="19"/>
+              </w:rPr>
+              <w:t xml:space="preserve"> </w:t>
+            </w:r>
+            <w:r>
+              <w:rPr>
+                <w:sz w:val="19"/>
+              </w:rPr>
+              <w:t xml:space="preserve">for one that fills on successes.</w:t>
+            </w:r>
+          </w:p>
+        </w:tc>
+      </w:tr>
+      <w:tr>
+        <w:tc>
+          <w:tcPr/>
+          <w:p>
+            <w:pPr>
+              <w:pStyle w:val="Compact"/>
+              <w:jc w:val="left"/>
+            </w:pPr>
+            <w:r>
+              <w:rPr>
+                <w:rStyle w:val="VerbatimChar"/>
+                <w:b/>
+                <w:sz w:val="19"/>
+              </w:rPr>
+              <w:t xml:space="preserve">/clock tick name:"The mob forms"</w:t>
+            </w:r>
+          </w:p>
+        </w:tc>
+        <w:tc>
+          <w:tcPr/>
+          <w:p>
+            <w:pPr>
+              <w:pStyle w:val="Compact"/>
+              <w:jc w:val="left"/>
+            </w:pPr>
+            <w:r>
+              <w:rPr>
+                <w:sz w:val="19"/>
+              </w:rPr>
+              <w:t xml:space="preserve">Fill one segment. Add</w:t>
+            </w:r>
+            <w:r>
+              <w:rPr>
+                <w:sz w:val="19"/>
+              </w:rPr>
+              <w:t xml:space="preserve"> </w:t>
+            </w:r>
+            <w:r>
+              <w:rPr>
+                <w:rStyle w:val="VerbatimChar"/>
+                <w:sz w:val="19"/>
+              </w:rPr>
+              <w:t xml:space="preserve">segments:2</w:t>
+            </w:r>
+            <w:r>
+              <w:rPr>
+                <w:sz w:val="19"/>
+              </w:rPr>
+              <w:t xml:space="preserve"> </w:t>
+            </w:r>
+            <w:r>
+              <w:rPr>
+                <w:sz w:val="19"/>
+              </w:rPr>
+              <w:t xml:space="preserve">for two, or</w:t>
+            </w:r>
+            <w:r>
+              <w:rPr>
+                <w:sz w:val="19"/>
+              </w:rPr>
+              <w:t xml:space="preserve"> </w:t>
+            </w:r>
+            <w:r>
+              <w:rPr>
+                <w:rStyle w:val="VerbatimChar"/>
+                <w:sz w:val="19"/>
+              </w:rPr>
+              <w:t xml:space="preserve">segments:-1</w:t>
+            </w:r>
+            <w:r>
+              <w:rPr>
+                <w:sz w:val="19"/>
+              </w:rPr>
+              <w:t xml:space="preserve"> </w:t>
+            </w:r>
+            <w:r>
+              <w:rPr>
+                <w:sz w:val="19"/>
+              </w:rPr>
+              <w:t xml:space="preserve">to undo.</w:t>
+            </w:r>
+            <w:r>
+              <w:rPr>
+                <w:sz w:val="19"/>
+              </w:rPr>
+              <w:t xml:space="preserve"> </w:t>
+            </w:r>
+            <w:r>
+              <w:rPr>
+                <w:rStyle w:val="VerbatimChar"/>
+                <w:sz w:val="19"/>
+              </w:rPr>
+              <w:t xml:space="preserve">/clock remove</w:t>
+            </w:r>
+            <w:r>
+              <w:rPr>
+                <w:sz w:val="19"/>
+              </w:rPr>
+              <w:t xml:space="preserve"> </w:t>
+            </w:r>
+            <w:r>
+              <w:rPr>
+                <w:sz w:val="19"/>
+              </w:rPr>
+              <w:t xml:space="preserve">deletes a clock.</w:t>
+            </w:r>
+          </w:p>
+        </w:tc>
+      </w:tr>
+      <w:tr>
+        <w:tc>
+          <w:tcPr/>
+          <w:p>
+            <w:pPr>
+              <w:pStyle w:val="Compact"/>
+              <w:jc w:val="left"/>
+            </w:pPr>
+            <w:r>
+              <w:rPr>
+                <w:rStyle w:val="VerbatimChar"/>
+                <w:b/>
+                <w:sz w:val="19"/>
+              </w:rPr>
+              <w:t xml:space="preserve">/track mark name:exposure</w:t>
+            </w:r>
+          </w:p>
+        </w:tc>
+        <w:tc>
+          <w:tcPr/>
+          <w:p>
+            <w:pPr>
+              <w:pStyle w:val="Compact"/>
+              <w:jc w:val="left"/>
+            </w:pPr>
+            <w:r>
+              <w:rPr>
+                <w:sz w:val="19"/>
+              </w:rPr>
+              <w:t xml:space="preserve">Mark a box on a track; a partial name works (</w:t>
+            </w:r>
+            <w:r>
+              <w:rPr>
+                <w:sz w:val="19"/>
+              </w:rPr>
+              <w:t xml:space="preserve">“</w:t>
+            </w:r>
+            <w:r>
+              <w:rPr>
+                <w:sz w:val="19"/>
+              </w:rPr>
+              <w:t xml:space="preserve">exposure</w:t>
+            </w:r>
+            <w:r>
+              <w:rPr>
+                <w:sz w:val="19"/>
+              </w:rPr>
+              <w:t xml:space="preserve">”</w:t>
+            </w:r>
+            <w:r>
+              <w:rPr>
+                <w:sz w:val="19"/>
+              </w:rPr>
+              <w:t xml:space="preserve"> </w:t>
+            </w:r>
+            <w:r>
+              <w:rPr>
+                <w:sz w:val="19"/>
+              </w:rPr>
+              <w:t xml:space="preserve">finds Exposure).</w:t>
+            </w:r>
+            <w:r>
+              <w:rPr>
+                <w:sz w:val="19"/>
+              </w:rPr>
+              <w:t xml:space="preserve"> </w:t>
+            </w:r>
+            <w:r>
+              <w:rPr>
+                <w:rStyle w:val="VerbatimChar"/>
+                <w:sz w:val="19"/>
+              </w:rPr>
+              <w:t xml:space="preserve">/track clear</w:t>
+            </w:r>
+            <w:r>
+              <w:rPr>
+                <w:sz w:val="19"/>
+              </w:rPr>
+              <w:t xml:space="preserve"> </w:t>
+            </w:r>
+            <w:r>
+              <w:rPr>
+                <w:sz w:val="19"/>
+              </w:rPr>
+              <w:t xml:space="preserve">clears one, and</w:t>
+            </w:r>
+            <w:r>
+              <w:rPr>
+                <w:sz w:val="19"/>
+              </w:rPr>
+              <w:t xml:space="preserve"> </w:t>
+            </w:r>
+            <w:r>
+              <w:rPr>
+                <w:rStyle w:val="VerbatimChar"/>
+                <w:sz w:val="19"/>
+              </w:rPr>
+              <w:t xml:space="preserve">/track reset</w:t>
+            </w:r>
+            <w:r>
+              <w:rPr>
+                <w:sz w:val="19"/>
+              </w:rPr>
+              <w:t xml:space="preserve"> </w:t>
+            </w:r>
+            <w:r>
+              <w:rPr>
+                <w:sz w:val="19"/>
+              </w:rPr>
+              <w:t xml:space="preserve">clears them all.</w:t>
+            </w:r>
+          </w:p>
+        </w:tc>
+      </w:tr>
+      <w:tr>
+        <w:tc>
+          <w:tcPr/>
+          <w:p>
+            <w:pPr>
+              <w:pStyle w:val="Compact"/>
+              <w:jc w:val="left"/>
+            </w:pPr>
+            <w:r>
+              <w:rPr>
+                <w:rStyle w:val="VerbatimChar"/>
+                <w:b/>
+                <w:sz w:val="19"/>
+              </w:rPr>
+              <w:t xml:space="preserve">/seed</w:t>
+            </w:r>
+          </w:p>
+        </w:tc>
+        <w:tc>
+          <w:tcPr/>
+          <w:p>
+            <w:pPr>
+              <w:pStyle w:val="Compact"/>
+              <w:jc w:val="left"/>
+            </w:pPr>
+            <w:r>
+              <w:rPr>
+                <w:sz w:val="19"/>
+              </w:rPr>
+              <w:t xml:space="preserve">Roll an adventure seed: one line from each seed table, and the command to start its ticking clock.</w:t>
+            </w:r>
+          </w:p>
+        </w:tc>
+      </w:tr>
+      <w:tr>
+        <w:tc>
+          <w:tcPr/>
+          <w:p>
+            <w:pPr>
+              <w:pStyle w:val="Compact"/>
+              <w:jc w:val="left"/>
+            </w:pPr>
+            <w:r>
+              <w:rPr>
+                <w:rStyle w:val="VerbatimChar"/>
+                <w:b/>
+                <w:sz w:val="19"/>
+              </w:rPr>
+              <w:t xml:space="preserve">/contest ... defender:me</w:t>
+            </w:r>
+          </w:p>
+        </w:tc>
+        <w:tc>
+          <w:tcPr/>
+          <w:p>
+            <w:pPr>
+              <w:pStyle w:val="Compact"/>
+              <w:jc w:val="left"/>
+            </w:pPr>
+            <w:r>
+              <w:rPr>
+                <w:sz w:val="19"/>
+              </w:rPr>
+              <w:t xml:space="preserve">When a player resists you (a grapple, a lie, a chase), they are the defender: ties and double failures go to them.</w:t>
+            </w:r>
+          </w:p>
+        </w:tc>
+      </w:tr>
+    </w:tbl>
+    <w:p>
+      <w:pPr>
+        <w:pStyle w:val="BodyText"/>
+      </w:pPr>
+      <w:r>
+        <w:t xml:space="preserve">Each server keeps its own points, clocks and tracks. If a command is missing from Discord’s list, open the bot’s</w:t>
+      </w:r>
+      <w:r>
+        <w:t xml:space="preserve"> </w:t>
+      </w:r>
+      <w:r>
+        <w:rPr>
+          <w:rStyle w:val="VerbatimChar"/>
+        </w:rPr>
+        <w:t xml:space="preserve">/register</w:t>
+      </w:r>
+      <w:r>
+        <w:t xml:space="preserve"> </w:t>
+      </w:r>
+      <w:r>
+        <w:t xml:space="preserve">page once (see the bot’s README), then press Ctrl+R in Discord.</w:t>
+      </w:r>
+      <w:r>
+        <w:t xml:space="preserve"> </w:t>
+      </w:r>
+    </w:p>
+    <w:bookmarkEnd w:id="110"/>
+    <w:bookmarkEnd w:id="111"/>
     <w:sectPr/>
   </w:body>
 </w:document>

</xml_diff>

<commit_message>
Creators: mark each role's core skills Trained when it is chosen
Every role (department, calling) in Iron Roads, Starward, USS Pelion and
Grimm now has four core skills. A new character starts with them, and
changing role swaps the core skills the player hasn't changed; skills
trained or raised by hand stay. The role selector names them, and each
guide's role table gains a Core skills column.

Co-Authored-By: Claude Opus 5.5 <noreply@anthropic.com>
Claude-Session: https://claude.ai/code/session_015SADCFzhKijkC2foUmXrpC
</commit_message>
<xml_diff>
--- a/grimm-west/Grimm_Players_Guide.docx
+++ b/grimm-west/Grimm_Players_Guide.docx
@@ -459,9 +459,10 @@
         </w:tblBorders>
       </w:tblPr>
       <w:tblGrid>
-        <w:gridCol w:w="2640"/>
-        <w:gridCol w:w="2640"/>
-        <w:gridCol w:w="2640"/>
+        <w:gridCol w:w="1980"/>
+        <w:gridCol w:w="1980"/>
+        <w:gridCol w:w="1980"/>
+        <w:gridCol w:w="1980"/>
       </w:tblGrid>
       <w:tr>
         <w:trPr>
@@ -521,6 +522,24 @@
             </w:r>
           </w:p>
         </w:tc>
+        <w:tc>
+          <w:tcPr>
+            <w:shd w:val="clear" w:fill="F1E6D2"/>
+          </w:tcPr>
+          <w:p>
+            <w:pPr>
+              <w:pStyle w:val="Compact"/>
+              <w:jc w:val="left"/>
+            </w:pPr>
+            <w:r>
+              <w:rPr>
+                <w:b/>
+                <w:sz w:val="19"/>
+              </w:rPr>
+              <w:t xml:space="preserve">Core skills</w:t>
+            </w:r>
+          </w:p>
+        </w:tc>
       </w:tr>
       <w:tr>
         <w:tc>
@@ -569,6 +588,21 @@
             </w:r>
           </w:p>
         </w:tc>
+        <w:tc>
+          <w:tcPr/>
+          <w:p>
+            <w:pPr>
+              <w:pStyle w:val="Compact"/>
+              <w:jc w:val="left"/>
+            </w:pPr>
+            <w:r>
+              <w:rPr>
+                <w:sz w:val="19"/>
+              </w:rPr>
+              <w:t xml:space="preserve">Leadership, Shooting, Riding, Read People</w:t>
+            </w:r>
+          </w:p>
+        </w:tc>
       </w:tr>
       <w:tr>
         <w:tc>
@@ -617,6 +651,21 @@
             </w:r>
           </w:p>
         </w:tc>
+        <w:tc>
+          <w:tcPr/>
+          <w:p>
+            <w:pPr>
+              <w:pStyle w:val="Compact"/>
+              <w:jc w:val="left"/>
+            </w:pPr>
+            <w:r>
+              <w:rPr>
+                <w:sz w:val="19"/>
+              </w:rPr>
+              <w:t xml:space="preserve">Shooting, Brawling, Riding, Read People</w:t>
+            </w:r>
+          </w:p>
+        </w:tc>
       </w:tr>
       <w:tr>
         <w:tc>
@@ -665,6 +714,21 @@
             </w:r>
           </w:p>
         </w:tc>
+        <w:tc>
+          <w:tcPr/>
+          <w:p>
+            <w:pPr>
+              <w:pStyle w:val="Compact"/>
+              <w:jc w:val="left"/>
+            </w:pPr>
+            <w:r>
+              <w:rPr>
+                <w:sz w:val="19"/>
+              </w:rPr>
+              <w:t xml:space="preserve">Investigation, Read People, Deception, Stealth</w:t>
+            </w:r>
+          </w:p>
+        </w:tc>
       </w:tr>
       <w:tr>
         <w:tc>
@@ -713,6 +777,21 @@
             </w:r>
           </w:p>
         </w:tc>
+        <w:tc>
+          <w:tcPr/>
+          <w:p>
+            <w:pPr>
+              <w:pStyle w:val="Compact"/>
+              <w:jc w:val="left"/>
+            </w:pPr>
+            <w:r>
+              <w:rPr>
+                <w:sz w:val="19"/>
+              </w:rPr>
+              <w:t xml:space="preserve">Tracking, Shooting, Riding, Wesen Lore</w:t>
+            </w:r>
+          </w:p>
+        </w:tc>
       </w:tr>
       <w:tr>
         <w:tc>
@@ -761,6 +840,21 @@
             </w:r>
           </w:p>
         </w:tc>
+        <w:tc>
+          <w:tcPr/>
+          <w:p>
+            <w:pPr>
+              <w:pStyle w:val="Compact"/>
+              <w:jc w:val="left"/>
+            </w:pPr>
+            <w:r>
+              <w:rPr>
+                <w:sz w:val="19"/>
+              </w:rPr>
+              <w:t xml:space="preserve">Medicine, Investigation, Read People, Apothecary</w:t>
+            </w:r>
+          </w:p>
+        </w:tc>
       </w:tr>
       <w:tr>
         <w:tc>
@@ -809,6 +903,21 @@
             </w:r>
           </w:p>
         </w:tc>
+        <w:tc>
+          <w:tcPr/>
+          <w:p>
+            <w:pPr>
+              <w:pStyle w:val="Compact"/>
+              <w:jc w:val="left"/>
+            </w:pPr>
+            <w:r>
+              <w:rPr>
+                <w:sz w:val="19"/>
+              </w:rPr>
+              <w:t xml:space="preserve">Apothecary, Medicine, Occult, Wesen Lore</w:t>
+            </w:r>
+          </w:p>
+        </w:tc>
       </w:tr>
       <w:tr>
         <w:tc>
@@ -857,6 +966,21 @@
             </w:r>
           </w:p>
         </w:tc>
+        <w:tc>
+          <w:tcPr/>
+          <w:p>
+            <w:pPr>
+              <w:pStyle w:val="Compact"/>
+              <w:jc w:val="left"/>
+            </w:pPr>
+            <w:r>
+              <w:rPr>
+                <w:sz w:val="19"/>
+              </w:rPr>
+              <w:t xml:space="preserve">Wesen Lore, Occult, Investigation, Persuasion</w:t>
+            </w:r>
+          </w:p>
+        </w:tc>
       </w:tr>
       <w:tr>
         <w:tc>
@@ -905,6 +1029,21 @@
             </w:r>
           </w:p>
         </w:tc>
+        <w:tc>
+          <w:tcPr/>
+          <w:p>
+            <w:pPr>
+              <w:pStyle w:val="Compact"/>
+              <w:jc w:val="left"/>
+            </w:pPr>
+            <w:r>
+              <w:rPr>
+                <w:sz w:val="19"/>
+              </w:rPr>
+              <w:t xml:space="preserve">Persuasion, Leadership, Occult, Shooting</w:t>
+            </w:r>
+          </w:p>
+        </w:tc>
       </w:tr>
       <w:tr>
         <w:tc>
@@ -953,6 +1092,21 @@
             </w:r>
           </w:p>
         </w:tc>
+        <w:tc>
+          <w:tcPr/>
+          <w:p>
+            <w:pPr>
+              <w:pStyle w:val="Compact"/>
+              <w:jc w:val="left"/>
+            </w:pPr>
+            <w:r>
+              <w:rPr>
+                <w:sz w:val="19"/>
+              </w:rPr>
+              <w:t xml:space="preserve">Shooting, Athletics, Read People, Riding</w:t>
+            </w:r>
+          </w:p>
+        </w:tc>
       </w:tr>
       <w:tr>
         <w:tc>
@@ -1001,6 +1155,21 @@
             </w:r>
           </w:p>
         </w:tc>
+        <w:tc>
+          <w:tcPr/>
+          <w:p>
+            <w:pPr>
+              <w:pStyle w:val="Compact"/>
+              <w:jc w:val="left"/>
+            </w:pPr>
+            <w:r>
+              <w:rPr>
+                <w:sz w:val="19"/>
+              </w:rPr>
+              <w:t xml:space="preserve">Tracking, Survival, Riding, Stealth</w:t>
+            </w:r>
+          </w:p>
+        </w:tc>
       </w:tr>
       <w:tr>
         <w:tc>
@@ -1049,6 +1218,21 @@
             </w:r>
           </w:p>
         </w:tc>
+        <w:tc>
+          <w:tcPr/>
+          <w:p>
+            <w:pPr>
+              <w:pStyle w:val="Compact"/>
+              <w:jc w:val="left"/>
+            </w:pPr>
+            <w:r>
+              <w:rPr>
+                <w:sz w:val="19"/>
+              </w:rPr>
+              <w:t xml:space="preserve">Gambling, Read People, Deception, Shooting</w:t>
+            </w:r>
+          </w:p>
+        </w:tc>
       </w:tr>
       <w:tr>
         <w:tc>
@@ -1097,8 +1281,47 @@
             </w:r>
           </w:p>
         </w:tc>
+        <w:tc>
+          <w:tcPr/>
+          <w:p>
+            <w:pPr>
+              <w:pStyle w:val="Compact"/>
+              <w:jc w:val="left"/>
+            </w:pPr>
+            <w:r>
+              <w:rPr>
+                <w:sz w:val="19"/>
+              </w:rPr>
+              <w:t xml:space="preserve">Tinkering, Shooting, Investigation, Athletics</w:t>
+            </w:r>
+          </w:p>
+        </w:tc>
       </w:tr>
     </w:tbl>
+    <w:p>
+      <w:pPr>
+        <w:pStyle w:val="BodyText"/>
+      </w:pPr>
+      <w:r>
+        <w:t xml:space="preserve">The creator marks your calling’s four</w:t>
+      </w:r>
+      <w:r>
+        <w:t xml:space="preserve"> </w:t>
+      </w:r>
+      <w:r>
+        <w:rPr>
+          <w:bCs/>
+          <w:b/>
+        </w:rPr>
+        <w:t xml:space="preserve">core skills</w:t>
+      </w:r>
+      <w:r>
+        <w:t xml:space="preserve"> </w:t>
+      </w:r>
+      <w:r>
+        <w:t xml:space="preserve">(in the table above) Trained when you choose it. Keep them, raise one to your Specialty, or swap any of them for other skills; changing calling swaps the core skills you haven’t changed.</w:t>
+      </w:r>
+    </w:p>
     <w:bookmarkStart w:id="22" w:name="well-rounded-or-old-hand"/>
     <w:p>
       <w:pPr>

</xml_diff>

<commit_message>
Grimm: mark each calling's core skills Trained when it is chosen
A new character starts with their calling's four core skills; changing
calling swaps the ones the player hasn't changed. The guide's calling
table lists them.

Co-Authored-By: Claude Opus 5.5 <noreply@anthropic.com>
Claude-Session: https://claude.ai/code/session_015SADCFzhKijkC2foUmXrpC
</commit_message>
<xml_diff>
--- a/grimm-west/Grimm_Players_Guide.docx
+++ b/grimm-west/Grimm_Players_Guide.docx
@@ -459,9 +459,10 @@
         </w:tblBorders>
       </w:tblPr>
       <w:tblGrid>
-        <w:gridCol w:w="2640"/>
-        <w:gridCol w:w="2640"/>
-        <w:gridCol w:w="2640"/>
+        <w:gridCol w:w="1980"/>
+        <w:gridCol w:w="1980"/>
+        <w:gridCol w:w="1980"/>
+        <w:gridCol w:w="1980"/>
       </w:tblGrid>
       <w:tr>
         <w:trPr>
@@ -521,6 +522,24 @@
             </w:r>
           </w:p>
         </w:tc>
+        <w:tc>
+          <w:tcPr>
+            <w:shd w:val="clear" w:fill="F1E6D2"/>
+          </w:tcPr>
+          <w:p>
+            <w:pPr>
+              <w:pStyle w:val="Compact"/>
+              <w:jc w:val="left"/>
+            </w:pPr>
+            <w:r>
+              <w:rPr>
+                <w:b/>
+                <w:sz w:val="19"/>
+              </w:rPr>
+              <w:t xml:space="preserve">Core skills</w:t>
+            </w:r>
+          </w:p>
+        </w:tc>
       </w:tr>
       <w:tr>
         <w:tc>
@@ -569,6 +588,21 @@
             </w:r>
           </w:p>
         </w:tc>
+        <w:tc>
+          <w:tcPr/>
+          <w:p>
+            <w:pPr>
+              <w:pStyle w:val="Compact"/>
+              <w:jc w:val="left"/>
+            </w:pPr>
+            <w:r>
+              <w:rPr>
+                <w:sz w:val="19"/>
+              </w:rPr>
+              <w:t xml:space="preserve">Leadership, Shooting, Riding, Read People</w:t>
+            </w:r>
+          </w:p>
+        </w:tc>
       </w:tr>
       <w:tr>
         <w:tc>
@@ -617,6 +651,21 @@
             </w:r>
           </w:p>
         </w:tc>
+        <w:tc>
+          <w:tcPr/>
+          <w:p>
+            <w:pPr>
+              <w:pStyle w:val="Compact"/>
+              <w:jc w:val="left"/>
+            </w:pPr>
+            <w:r>
+              <w:rPr>
+                <w:sz w:val="19"/>
+              </w:rPr>
+              <w:t xml:space="preserve">Shooting, Brawling, Riding, Read People</w:t>
+            </w:r>
+          </w:p>
+        </w:tc>
       </w:tr>
       <w:tr>
         <w:tc>
@@ -665,6 +714,21 @@
             </w:r>
           </w:p>
         </w:tc>
+        <w:tc>
+          <w:tcPr/>
+          <w:p>
+            <w:pPr>
+              <w:pStyle w:val="Compact"/>
+              <w:jc w:val="left"/>
+            </w:pPr>
+            <w:r>
+              <w:rPr>
+                <w:sz w:val="19"/>
+              </w:rPr>
+              <w:t xml:space="preserve">Investigation, Read People, Deception, Stealth</w:t>
+            </w:r>
+          </w:p>
+        </w:tc>
       </w:tr>
       <w:tr>
         <w:tc>
@@ -713,6 +777,21 @@
             </w:r>
           </w:p>
         </w:tc>
+        <w:tc>
+          <w:tcPr/>
+          <w:p>
+            <w:pPr>
+              <w:pStyle w:val="Compact"/>
+              <w:jc w:val="left"/>
+            </w:pPr>
+            <w:r>
+              <w:rPr>
+                <w:sz w:val="19"/>
+              </w:rPr>
+              <w:t xml:space="preserve">Tracking, Shooting, Riding, Wesen Lore</w:t>
+            </w:r>
+          </w:p>
+        </w:tc>
       </w:tr>
       <w:tr>
         <w:tc>
@@ -761,6 +840,21 @@
             </w:r>
           </w:p>
         </w:tc>
+        <w:tc>
+          <w:tcPr/>
+          <w:p>
+            <w:pPr>
+              <w:pStyle w:val="Compact"/>
+              <w:jc w:val="left"/>
+            </w:pPr>
+            <w:r>
+              <w:rPr>
+                <w:sz w:val="19"/>
+              </w:rPr>
+              <w:t xml:space="preserve">Medicine, Investigation, Read People, Apothecary</w:t>
+            </w:r>
+          </w:p>
+        </w:tc>
       </w:tr>
       <w:tr>
         <w:tc>
@@ -809,6 +903,21 @@
             </w:r>
           </w:p>
         </w:tc>
+        <w:tc>
+          <w:tcPr/>
+          <w:p>
+            <w:pPr>
+              <w:pStyle w:val="Compact"/>
+              <w:jc w:val="left"/>
+            </w:pPr>
+            <w:r>
+              <w:rPr>
+                <w:sz w:val="19"/>
+              </w:rPr>
+              <w:t xml:space="preserve">Apothecary, Medicine, Occult, Wesen Lore</w:t>
+            </w:r>
+          </w:p>
+        </w:tc>
       </w:tr>
       <w:tr>
         <w:tc>
@@ -857,6 +966,21 @@
             </w:r>
           </w:p>
         </w:tc>
+        <w:tc>
+          <w:tcPr/>
+          <w:p>
+            <w:pPr>
+              <w:pStyle w:val="Compact"/>
+              <w:jc w:val="left"/>
+            </w:pPr>
+            <w:r>
+              <w:rPr>
+                <w:sz w:val="19"/>
+              </w:rPr>
+              <w:t xml:space="preserve">Wesen Lore, Occult, Investigation, Persuasion</w:t>
+            </w:r>
+          </w:p>
+        </w:tc>
       </w:tr>
       <w:tr>
         <w:tc>
@@ -905,6 +1029,21 @@
             </w:r>
           </w:p>
         </w:tc>
+        <w:tc>
+          <w:tcPr/>
+          <w:p>
+            <w:pPr>
+              <w:pStyle w:val="Compact"/>
+              <w:jc w:val="left"/>
+            </w:pPr>
+            <w:r>
+              <w:rPr>
+                <w:sz w:val="19"/>
+              </w:rPr>
+              <w:t xml:space="preserve">Persuasion, Leadership, Occult, Shooting</w:t>
+            </w:r>
+          </w:p>
+        </w:tc>
       </w:tr>
       <w:tr>
         <w:tc>
@@ -953,6 +1092,21 @@
             </w:r>
           </w:p>
         </w:tc>
+        <w:tc>
+          <w:tcPr/>
+          <w:p>
+            <w:pPr>
+              <w:pStyle w:val="Compact"/>
+              <w:jc w:val="left"/>
+            </w:pPr>
+            <w:r>
+              <w:rPr>
+                <w:sz w:val="19"/>
+              </w:rPr>
+              <w:t xml:space="preserve">Shooting, Athletics, Read People, Riding</w:t>
+            </w:r>
+          </w:p>
+        </w:tc>
       </w:tr>
       <w:tr>
         <w:tc>
@@ -1001,6 +1155,21 @@
             </w:r>
           </w:p>
         </w:tc>
+        <w:tc>
+          <w:tcPr/>
+          <w:p>
+            <w:pPr>
+              <w:pStyle w:val="Compact"/>
+              <w:jc w:val="left"/>
+            </w:pPr>
+            <w:r>
+              <w:rPr>
+                <w:sz w:val="19"/>
+              </w:rPr>
+              <w:t xml:space="preserve">Tracking, Survival, Riding, Stealth</w:t>
+            </w:r>
+          </w:p>
+        </w:tc>
       </w:tr>
       <w:tr>
         <w:tc>
@@ -1049,6 +1218,21 @@
             </w:r>
           </w:p>
         </w:tc>
+        <w:tc>
+          <w:tcPr/>
+          <w:p>
+            <w:pPr>
+              <w:pStyle w:val="Compact"/>
+              <w:jc w:val="left"/>
+            </w:pPr>
+            <w:r>
+              <w:rPr>
+                <w:sz w:val="19"/>
+              </w:rPr>
+              <w:t xml:space="preserve">Gambling, Read People, Deception, Shooting</w:t>
+            </w:r>
+          </w:p>
+        </w:tc>
       </w:tr>
       <w:tr>
         <w:tc>
@@ -1097,8 +1281,47 @@
             </w:r>
           </w:p>
         </w:tc>
+        <w:tc>
+          <w:tcPr/>
+          <w:p>
+            <w:pPr>
+              <w:pStyle w:val="Compact"/>
+              <w:jc w:val="left"/>
+            </w:pPr>
+            <w:r>
+              <w:rPr>
+                <w:sz w:val="19"/>
+              </w:rPr>
+              <w:t xml:space="preserve">Tinkering, Shooting, Investigation, Athletics</w:t>
+            </w:r>
+          </w:p>
+        </w:tc>
       </w:tr>
     </w:tbl>
+    <w:p>
+      <w:pPr>
+        <w:pStyle w:val="BodyText"/>
+      </w:pPr>
+      <w:r>
+        <w:t xml:space="preserve">The creator marks your calling’s four</w:t>
+      </w:r>
+      <w:r>
+        <w:t xml:space="preserve"> </w:t>
+      </w:r>
+      <w:r>
+        <w:rPr>
+          <w:bCs/>
+          <w:b/>
+        </w:rPr>
+        <w:t xml:space="preserve">core skills</w:t>
+      </w:r>
+      <w:r>
+        <w:t xml:space="preserve"> </w:t>
+      </w:r>
+      <w:r>
+        <w:t xml:space="preserve">(in the table above) Trained when you choose it. Keep them, raise one to your Specialty, or swap any of them for other skills; changing calling swaps the core skills you haven’t changed.</w:t>
+      </w:r>
+    </w:p>
     <w:bookmarkStart w:id="22" w:name="well-rounded-or-old-hand"/>
     <w:p>
       <w:pPr>

</xml_diff>

<commit_message>
Creators and guides: make your own calling or origin
Every creator gains a Custom calling/role/department option (name and
group; core skills are the player's choice), and step 1 and step 2 now
say custom options exist. Every guide gains a Making your own chapter:
step-by-step instructions for a custom calling and a custom origin
(concept, tier, adjustments, core rules, advantages with companion
complications, optional form), how to enter them in the creator, and an
example in each setting's flavor.

Co-Authored-By: Claude Opus 5.5 <noreply@anthropic.com>
Claude-Session: https://claude.ai/code/session_015SADCFzhKijkC2foUmXrpC
</commit_message>
<xml_diff>
--- a/grimm-west/Grimm_Players_Guide.docx
+++ b/grimm-west/Grimm_Players_Guide.docx
@@ -2219,7 +2219,23 @@
         <w:pStyle w:val="FirstParagraph"/>
       </w:pPr>
       <w:r>
-        <w:t xml:space="preserve">Agree on a heritage with the GM, give it adjustments from −2 to +2 per attribute that total zero, and agree its tier. The normal starting maximum and heritage base rules apply.</w:t>
+        <w:t xml:space="preserve">You can build your own heritage with the GM. See</w:t>
+      </w:r>
+      <w:r>
+        <w:t xml:space="preserve"> </w:t>
+      </w:r>
+      <w:r>
+        <w:rPr>
+          <w:iCs/>
+          <w:i/>
+        </w:rPr>
+        <w:t xml:space="preserve">Making your own</w:t>
+      </w:r>
+      <w:r>
+        <w:t xml:space="preserve"> </w:t>
+      </w:r>
+      <w:r>
+        <w:t xml:space="preserve">for the steps.</w:t>
       </w:r>
     </w:p>
     <w:bookmarkEnd w:id="28"/>
@@ -22666,7 +22682,919 @@
     </w:p>
     <w:bookmarkEnd w:id="105"/>
     <w:bookmarkEnd w:id="106"/>
-    <w:bookmarkStart w:id="107" w:name="complications"/>
+    <w:bookmarkStart w:id="117" w:name="making-your-own"/>
+    <w:p>
+      <w:pPr>
+        <w:pStyle w:val="Heading1"/>
+      </w:pPr>
+      <w:r>
+        <w:t xml:space="preserve">Making your own</w:t>
+      </w:r>
+    </w:p>
+    <w:p>
+      <w:pPr>
+        <w:pStyle w:val="FirstParagraph"/>
+      </w:pPr>
+      <w:r>
+        <w:t xml:space="preserve">The callings and heritages in this book are a starting point, not a limit. With the GM’s agreement, any player can create their own calling or heritage. The creator has a</w:t>
+      </w:r>
+      <w:r>
+        <w:t xml:space="preserve"> </w:t>
+      </w:r>
+      <w:r>
+        <w:rPr>
+          <w:bCs/>
+          <w:b/>
+        </w:rPr>
+        <w:t xml:space="preserve">Custom</w:t>
+      </w:r>
+      <w:r>
+        <w:t xml:space="preserve"> </w:t>
+      </w:r>
+      <w:r>
+        <w:t xml:space="preserve">option at the end of each list, and its checklist holds a custom choice to the same rules as everything else.</w:t>
+      </w:r>
+    </w:p>
+    <w:bookmarkStart w:id="107" w:name="a-custom-calling"/>
+    <w:p>
+      <w:pPr>
+        <w:pStyle w:val="Heading2"/>
+      </w:pPr>
+      <w:r>
+        <w:t xml:space="preserve">A custom calling</w:t>
+      </w:r>
+    </w:p>
+    <w:p>
+      <w:pPr>
+        <w:pStyle w:val="FirstParagraph"/>
+      </w:pPr>
+      <w:r>
+        <w:t xml:space="preserve">A calling is a concept, not a package of powers: it gives no bonus of its own. A custom one only needs a clear place in the group.</w:t>
+      </w:r>
+    </w:p>
+    <w:p>
+      <w:pPr>
+        <w:numPr>
+          <w:ilvl w:val="0"/>
+          <w:numId w:val="1032"/>
+        </w:numPr>
+        <w:pStyle w:val="Compact"/>
+      </w:pPr>
+      <w:r>
+        <w:rPr>
+          <w:bCs/>
+          <w:b/>
+        </w:rPr>
+        <w:t xml:space="preserve">Name it and describe it.</w:t>
+      </w:r>
+      <w:r>
+        <w:t xml:space="preserve"> </w:t>
+      </w:r>
+      <w:r>
+        <w:t xml:space="preserve">One sentence for what your character does that no one else does, in the style of the callings above:</w:t>
+      </w:r>
+      <w:r>
+        <w:t xml:space="preserve"> </w:t>
+      </w:r>
+      <w:r>
+        <w:rPr>
+          <w:iCs/>
+          <w:i/>
+        </w:rPr>
+        <w:t xml:space="preserve">“</w:t>
+      </w:r>
+      <w:r>
+        <w:rPr>
+          <w:iCs/>
+          <w:i/>
+        </w:rPr>
+        <w:t xml:space="preserve">Undertaker: buries the dead, and makes sure they stay buried.</w:t>
+      </w:r>
+      <w:r>
+        <w:rPr>
+          <w:iCs/>
+          <w:i/>
+        </w:rPr>
+        <w:t xml:space="preserve">”</w:t>
+      </w:r>
+    </w:p>
+    <w:p>
+      <w:pPr>
+        <w:numPr>
+          <w:ilvl w:val="0"/>
+          <w:numId w:val="1032"/>
+        </w:numPr>
+        <w:pStyle w:val="Compact"/>
+      </w:pPr>
+      <w:r>
+        <w:rPr>
+          <w:bCs/>
+          <w:b/>
+        </w:rPr>
+        <w:t xml:space="preserve">Choose a group.</w:t>
+      </w:r>
+      <w:r>
+        <w:t xml:space="preserve"> </w:t>
+      </w:r>
+      <w:r>
+        <w:t xml:space="preserve">Pick the one it belongs with: The Law, The Learned or The Frontier. The group only sets your sheet’s colors and emblem.</w:t>
+      </w:r>
+    </w:p>
+    <w:p>
+      <w:pPr>
+        <w:numPr>
+          <w:ilvl w:val="0"/>
+          <w:numId w:val="1032"/>
+        </w:numPr>
+        <w:pStyle w:val="Compact"/>
+      </w:pPr>
+      <w:r>
+        <w:rPr>
+          <w:bCs/>
+          <w:b/>
+        </w:rPr>
+        <w:t xml:space="preserve">Pick four core skills.</w:t>
+      </w:r>
+      <w:r>
+        <w:t xml:space="preserve"> </w:t>
+      </w:r>
+      <w:r>
+        <w:t xml:space="preserve">The skills it can’t do without. Mark them Trained yourself in step 3 (the built-in callings do this for you); they count toward your normal Trained skills.</w:t>
+      </w:r>
+    </w:p>
+    <w:p>
+      <w:pPr>
+        <w:numPr>
+          <w:ilvl w:val="0"/>
+          <w:numId w:val="1032"/>
+        </w:numPr>
+        <w:pStyle w:val="Compact"/>
+      </w:pPr>
+      <w:r>
+        <w:rPr>
+          <w:bCs/>
+          <w:b/>
+        </w:rPr>
+        <w:t xml:space="preserve">Check it with the GM.</w:t>
+      </w:r>
+      <w:r>
+        <w:t xml:space="preserve"> </w:t>
+      </w:r>
+      <w:r>
+        <w:t xml:space="preserve">It should fit the setting and overlap the existing callings as little as possible.</w:t>
+      </w:r>
+    </w:p>
+    <w:p>
+      <w:pPr>
+        <w:pStyle w:val="FirstParagraph"/>
+      </w:pPr>
+      <w:r>
+        <w:rPr>
+          <w:bCs/>
+          <w:b/>
+        </w:rPr>
+        <w:t xml:space="preserve">In the creator:</w:t>
+      </w:r>
+      <w:r>
+        <w:t xml:space="preserve"> </w:t>
+      </w:r>
+      <w:r>
+        <w:t xml:space="preserve">in step 1, choose</w:t>
+      </w:r>
+      <w:r>
+        <w:t xml:space="preserve"> </w:t>
+      </w:r>
+      <w:r>
+        <w:rPr>
+          <w:bCs/>
+          <w:b/>
+        </w:rPr>
+        <w:t xml:space="preserve">Custom calling…</w:t>
+      </w:r>
+      <w:r>
+        <w:t xml:space="preserve"> </w:t>
+      </w:r>
+      <w:r>
+        <w:t xml:space="preserve">at the end of the Calling list, then enter its name and group. Write the description in</w:t>
+      </w:r>
+      <w:r>
+        <w:t xml:space="preserve"> </w:t>
+      </w:r>
+      <w:r>
+        <w:rPr>
+          <w:iCs/>
+          <w:i/>
+        </w:rPr>
+        <w:t xml:space="preserve">What you bring</w:t>
+      </w:r>
+      <w:r>
+        <w:t xml:space="preserve">.</w:t>
+      </w:r>
+    </w:p>
+    <w:bookmarkEnd w:id="107"/>
+    <w:bookmarkStart w:id="116" w:name="a-custom-heritage"/>
+    <w:p>
+      <w:pPr>
+        <w:pStyle w:val="Heading2"/>
+      </w:pPr>
+      <w:r>
+        <w:t xml:space="preserve">A custom heritage</w:t>
+      </w:r>
+    </w:p>
+    <w:p>
+      <w:pPr>
+        <w:pStyle w:val="FirstParagraph"/>
+      </w:pPr>
+      <w:r>
+        <w:t xml:space="preserve">Build it with the GM, one step at a time.</w:t>
+      </w:r>
+    </w:p>
+    <w:bookmarkStart w:id="108" w:name="the-concept"/>
+    <w:p>
+      <w:pPr>
+        <w:pStyle w:val="Heading3"/>
+      </w:pPr>
+      <w:r>
+        <w:t xml:space="preserve">1. The concept</w:t>
+      </w:r>
+    </w:p>
+    <w:p>
+      <w:pPr>
+        <w:pStyle w:val="FirstParagraph"/>
+      </w:pPr>
+      <w:r>
+        <w:t xml:space="preserve">Two or three sentences: where they come from, what sets them apart, and how others see them. It should be something the heritages in this book don’t already cover.</w:t>
+      </w:r>
+    </w:p>
+    <w:bookmarkEnd w:id="108"/>
+    <w:bookmarkStart w:id="109" w:name="the-tier"/>
+    <w:p>
+      <w:pPr>
+        <w:pStyle w:val="Heading3"/>
+      </w:pPr>
+      <w:r>
+        <w:t xml:space="preserve">2. The tier</w:t>
+      </w:r>
+    </w:p>
+    <w:p>
+      <w:pPr>
+        <w:pStyle w:val="FirstParagraph"/>
+      </w:pPr>
+      <w:r>
+        <w:t xml:space="preserve">The tier measures how much the heritage gives on its own. Each tier costs one of your 3 Edge points, so stronger heritages start with fewer Edges.</w:t>
+      </w:r>
+    </w:p>
+    <w:tbl>
+      <w:tblPr>
+        <w:tblStyle w:val="Table"/>
+        <w:tblW w:type="pct" w:w="5000"/>
+        <w:tblLook w:firstRow="1" w:lastRow="0" w:firstColumn="0" w:lastColumn="0" w:noHBand="0" w:noVBand="0" w:val="0020"/>
+        <w:jc w:val="start"/>
+        <w:tblBorders>
+          <w:top w:val="single" w:sz="4" w:color="B8C2D3"/>
+          <w:left w:val="single" w:sz="4" w:color="B8C2D3"/>
+          <w:bottom w:val="single" w:sz="4" w:color="B8C2D3"/>
+          <w:right w:val="single" w:sz="4" w:color="B8C2D3"/>
+          <w:insideH w:val="single" w:sz="4" w:color="B8C2D3"/>
+          <w:insideV w:val="single" w:sz="4" w:color="B8C2D3"/>
+        </w:tblBorders>
+      </w:tblPr>
+      <w:tblGrid>
+        <w:gridCol w:w="2640"/>
+        <w:gridCol w:w="2640"/>
+        <w:gridCol w:w="2640"/>
+      </w:tblGrid>
+      <w:tr>
+        <w:trPr>
+          <w:tblHeader w:val="true"/>
+        </w:trPr>
+        <w:tc>
+          <w:tcPr>
+            <w:shd w:val="clear" w:fill="F1E6D2"/>
+          </w:tcPr>
+          <w:p>
+            <w:pPr>
+              <w:pStyle w:val="Compact"/>
+              <w:jc w:val="left"/>
+            </w:pPr>
+            <w:r>
+              <w:rPr>
+                <w:b/>
+                <w:sz w:val="19"/>
+              </w:rPr>
+              <w:t xml:space="preserve">Tier</w:t>
+            </w:r>
+          </w:p>
+        </w:tc>
+        <w:tc>
+          <w:tcPr>
+            <w:shd w:val="clear" w:fill="F1E6D2"/>
+          </w:tcPr>
+          <w:p>
+            <w:pPr>
+              <w:pStyle w:val="Compact"/>
+              <w:jc w:val="left"/>
+            </w:pPr>
+            <w:r>
+              <w:rPr>
+                <w:b/>
+                <w:sz w:val="19"/>
+              </w:rPr>
+              <w:t xml:space="preserve">Edges</w:t>
+            </w:r>
+          </w:p>
+        </w:tc>
+        <w:tc>
+          <w:tcPr>
+            <w:shd w:val="clear" w:fill="F1E6D2"/>
+          </w:tcPr>
+          <w:p>
+            <w:pPr>
+              <w:pStyle w:val="Compact"/>
+              <w:jc w:val="left"/>
+            </w:pPr>
+            <w:r>
+              <w:rPr>
+                <w:b/>
+                <w:sz w:val="19"/>
+              </w:rPr>
+              <w:t xml:space="preserve">Use it for</w:t>
+            </w:r>
+          </w:p>
+        </w:tc>
+      </w:tr>
+      <w:tr>
+        <w:tc>
+          <w:tcPr/>
+          <w:p>
+            <w:pPr>
+              <w:pStyle w:val="Compact"/>
+              <w:jc w:val="left"/>
+            </w:pPr>
+            <w:r>
+              <w:rPr>
+                <w:b/>
+                <w:sz w:val="19"/>
+              </w:rPr>
+              <w:t xml:space="preserve">0</w:t>
+            </w:r>
+          </w:p>
+        </w:tc>
+        <w:tc>
+          <w:tcPr/>
+          <w:p>
+            <w:pPr>
+              <w:pStyle w:val="Compact"/>
+              <w:jc w:val="left"/>
+            </w:pPr>
+            <w:r>
+              <w:rPr>
+                <w:sz w:val="19"/>
+              </w:rPr>
+              <w:t xml:space="preserve">3</w:t>
+            </w:r>
+          </w:p>
+        </w:tc>
+        <w:tc>
+          <w:tcPr/>
+          <w:p>
+            <w:pPr>
+              <w:pStyle w:val="Compact"/>
+              <w:jc w:val="left"/>
+            </w:pPr>
+            <w:r>
+              <w:rPr>
+                <w:sz w:val="19"/>
+              </w:rPr>
+              <w:t xml:space="preserve">Ordinary people: a homeland, upbringing or culture, with no special abilities</w:t>
+            </w:r>
+          </w:p>
+        </w:tc>
+      </w:tr>
+      <w:tr>
+        <w:tc>
+          <w:tcPr/>
+          <w:p>
+            <w:pPr>
+              <w:pStyle w:val="Compact"/>
+              <w:jc w:val="left"/>
+            </w:pPr>
+            <w:r>
+              <w:rPr>
+                <w:b/>
+                <w:sz w:val="19"/>
+              </w:rPr>
+              <w:t xml:space="preserve">1</w:t>
+            </w:r>
+          </w:p>
+        </w:tc>
+        <w:tc>
+          <w:tcPr/>
+          <w:p>
+            <w:pPr>
+              <w:pStyle w:val="Compact"/>
+              <w:jc w:val="left"/>
+            </w:pPr>
+            <w:r>
+              <w:rPr>
+                <w:sz w:val="19"/>
+              </w:rPr>
+              <w:t xml:space="preserve">2</w:t>
+            </w:r>
+          </w:p>
+        </w:tc>
+        <w:tc>
+          <w:tcPr/>
+          <w:p>
+            <w:pPr>
+              <w:pStyle w:val="Compact"/>
+              <w:jc w:val="left"/>
+            </w:pPr>
+            <w:r>
+              <w:rPr>
+                <w:sz w:val="19"/>
+              </w:rPr>
+              <w:t xml:space="preserve">One small, constant edge: keen senses, a tough hide, a free Trained skill, resistance to one hazard</w:t>
+            </w:r>
+          </w:p>
+        </w:tc>
+      </w:tr>
+      <w:tr>
+        <w:tc>
+          <w:tcPr/>
+          <w:p>
+            <w:pPr>
+              <w:pStyle w:val="Compact"/>
+              <w:jc w:val="left"/>
+            </w:pPr>
+            <w:r>
+              <w:rPr>
+                <w:b/>
+                <w:sz w:val="19"/>
+              </w:rPr>
+              <w:t xml:space="preserve">2</w:t>
+            </w:r>
+          </w:p>
+        </w:tc>
+        <w:tc>
+          <w:tcPr/>
+          <w:p>
+            <w:pPr>
+              <w:pStyle w:val="Compact"/>
+              <w:jc w:val="left"/>
+            </w:pPr>
+            <w:r>
+              <w:rPr>
+                <w:sz w:val="19"/>
+              </w:rPr>
+              <w:t xml:space="preserve">1</w:t>
+            </w:r>
+          </w:p>
+        </w:tc>
+        <w:tc>
+          <w:tcPr/>
+          <w:p>
+            <w:pPr>
+              <w:pStyle w:val="Compact"/>
+              <w:jc w:val="left"/>
+            </w:pPr>
+            <w:r>
+              <w:rPr>
+                <w:sz w:val="19"/>
+              </w:rPr>
+              <w:t xml:space="preserve">Clear inhuman or supernatural gifts: venom, a second form, strong resistances</w:t>
+            </w:r>
+          </w:p>
+        </w:tc>
+      </w:tr>
+      <w:tr>
+        <w:tc>
+          <w:tcPr/>
+          <w:p>
+            <w:pPr>
+              <w:pStyle w:val="Compact"/>
+              <w:jc w:val="left"/>
+            </w:pPr>
+            <w:r>
+              <w:rPr>
+                <w:b/>
+                <w:sz w:val="19"/>
+              </w:rPr>
+              <w:t xml:space="preserve">3</w:t>
+            </w:r>
+          </w:p>
+        </w:tc>
+        <w:tc>
+          <w:tcPr/>
+          <w:p>
+            <w:pPr>
+              <w:pStyle w:val="Compact"/>
+              <w:jc w:val="left"/>
+            </w:pPr>
+            <w:r>
+              <w:rPr>
+                <w:sz w:val="19"/>
+              </w:rPr>
+              <w:t xml:space="preserve">0</w:t>
+            </w:r>
+          </w:p>
+        </w:tc>
+        <w:tc>
+          <w:tcPr/>
+          <w:p>
+            <w:pPr>
+              <w:pStyle w:val="Compact"/>
+              <w:jc w:val="left"/>
+            </w:pPr>
+            <w:r>
+              <w:rPr>
+                <w:sz w:val="19"/>
+              </w:rPr>
+              <w:t xml:space="preserve">Remarkable beings: several strong abilities, and serious weaknesses to match</w:t>
+            </w:r>
+          </w:p>
+        </w:tc>
+      </w:tr>
+    </w:tbl>
+    <w:p>
+      <w:pPr>
+        <w:pStyle w:val="BodyText"/>
+      </w:pPr>
+      <w:r>
+        <w:t xml:space="preserve">When in doubt, choose the higher tier.</w:t>
+      </w:r>
+    </w:p>
+    <w:bookmarkEnd w:id="109"/>
+    <w:bookmarkStart w:id="110" w:name="attribute-adjustments"/>
+    <w:p>
+      <w:pPr>
+        <w:pStyle w:val="Heading3"/>
+      </w:pPr>
+      <w:r>
+        <w:t xml:space="preserve">3. Attribute adjustments</w:t>
+      </w:r>
+    </w:p>
+    <w:p>
+      <w:pPr>
+        <w:pStyle w:val="FirstParagraph"/>
+      </w:pPr>
+      <w:r>
+        <w:t xml:space="preserve">Give adjustments from</w:t>
+      </w:r>
+      <w:r>
+        <w:t xml:space="preserve"> </w:t>
+      </w:r>
+      <w:r>
+        <w:rPr>
+          <w:bCs/>
+          <w:b/>
+        </w:rPr>
+        <w:t xml:space="preserve">−2 to +2</w:t>
+      </w:r>
+      <w:r>
+        <w:t xml:space="preserve"> </w:t>
+      </w:r>
+      <w:r>
+        <w:t xml:space="preserve">per attribute that</w:t>
+      </w:r>
+      <w:r>
+        <w:t xml:space="preserve"> </w:t>
+      </w:r>
+      <w:r>
+        <w:rPr>
+          <w:bCs/>
+          <w:b/>
+        </w:rPr>
+        <w:t xml:space="preserve">total zero</w:t>
+      </w:r>
+      <w:r>
+        <w:t xml:space="preserve">: a +2 needs a −2 or two −1s. The adjustments move the attribute’s base (+1 starts it at 11) and raise its starting maximum (13 plus the bonus). Most heritages change two to four attributes.</w:t>
+      </w:r>
+    </w:p>
+    <w:bookmarkEnd w:id="110"/>
+    <w:bookmarkStart w:id="111" w:name="core-rules-tier-1-and-up"/>
+    <w:p>
+      <w:pPr>
+        <w:pStyle w:val="Heading3"/>
+      </w:pPr>
+      <w:r>
+        <w:t xml:space="preserve">4. Core rules (tier 1 and up)</w:t>
+      </w:r>
+    </w:p>
+    <w:p>
+      <w:pPr>
+        <w:pStyle w:val="FirstParagraph"/>
+      </w:pPr>
+      <w:r>
+        <w:t xml:space="preserve">One to three short rules that always apply: what they can do (see in the dark, resist cold, a free Trained skill) and what it costs (a weakness, a people’s distrust, a hazard they can’t abide). A strength with no drawback is worth more than it looks, so price it a tier higher.</w:t>
+      </w:r>
+    </w:p>
+    <w:bookmarkEnd w:id="111"/>
+    <w:bookmarkStart w:id="112" w:name="heritage-advantages"/>
+    <w:p>
+      <w:pPr>
+        <w:pStyle w:val="Heading3"/>
+      </w:pPr>
+      <w:r>
+        <w:t xml:space="preserve">5. Heritage advantages</w:t>
+      </w:r>
+    </w:p>
+    <w:p>
+      <w:pPr>
+        <w:pStyle w:val="FirstParagraph"/>
+      </w:pPr>
+      <w:r>
+        <w:t xml:space="preserve">Write one to three. Each works like a general advantage:</w:t>
+      </w:r>
+      <w:r>
+        <w:t xml:space="preserve"> </w:t>
+      </w:r>
+      <w:r>
+        <w:rPr>
+          <w:bCs/>
+          <w:b/>
+        </w:rPr>
+        <w:t xml:space="preserve">+2 to one skill in a narrow situation</w:t>
+      </w:r>
+      <w:r>
+        <w:t xml:space="preserve">, or a small, limited permission (</w:t>
+      </w:r>
+      <w:r>
+        <w:t xml:space="preserve">“</w:t>
+      </w:r>
+      <w:r>
+        <w:t xml:space="preserve">once per scene…</w:t>
+      </w:r>
+      <w:r>
+        <w:t xml:space="preserve">”</w:t>
+      </w:r>
+      <w:r>
+        <w:t xml:space="preserve">). Each comes with a</w:t>
+      </w:r>
+      <w:r>
+        <w:t xml:space="preserve"> </w:t>
+      </w:r>
+      <w:r>
+        <w:rPr>
+          <w:bCs/>
+          <w:b/>
+        </w:rPr>
+        <w:t xml:space="preserve">companion complication</w:t>
+      </w:r>
+      <w:r>
+        <w:t xml:space="preserve">: a problem the trait causes, with a clear trigger and a real consequence, which earns a Grit point when it bites, like any complication. A character takes one advantage, general or heritage, so make them distinct choices.</w:t>
+      </w:r>
+    </w:p>
+    <w:bookmarkEnd w:id="112"/>
+    <w:bookmarkStart w:id="113" w:name="a-woge-optional-tier-2-or-3"/>
+    <w:p>
+      <w:pPr>
+        <w:pStyle w:val="Heading3"/>
+      </w:pPr>
+      <w:r>
+        <w:t xml:space="preserve">6. A woge (optional, tier 2 or 3)</w:t>
+      </w:r>
+    </w:p>
+    <w:p>
+      <w:pPr>
+        <w:pStyle w:val="FirstParagraph"/>
+      </w:pPr>
+      <w:r>
+        <w:t xml:space="preserve">If the heritage changes shape, give the form attribute bonuses (usually +2 to one attribute and +1 to another), two or three traits, and its drawbacks. The shared rules for forms in</w:t>
+      </w:r>
+      <w:r>
+        <w:t xml:space="preserve"> </w:t>
+      </w:r>
+      <w:r>
+        <w:rPr>
+          <w:iCs/>
+          <w:i/>
+        </w:rPr>
+        <w:t xml:space="preserve">The woge and the hidden world</w:t>
+      </w:r>
+      <w:r>
+        <w:t xml:space="preserve"> </w:t>
+      </w:r>
+      <w:r>
+        <w:t xml:space="preserve">apply.</w:t>
+      </w:r>
+    </w:p>
+    <w:bookmarkEnd w:id="113"/>
+    <w:bookmarkStart w:id="114" w:name="in-the-creator"/>
+    <w:p>
+      <w:pPr>
+        <w:pStyle w:val="Heading3"/>
+      </w:pPr>
+      <w:r>
+        <w:t xml:space="preserve">In the creator</w:t>
+      </w:r>
+    </w:p>
+    <w:p>
+      <w:pPr>
+        <w:numPr>
+          <w:ilvl w:val="0"/>
+          <w:numId w:val="1033"/>
+        </w:numPr>
+        <w:pStyle w:val="Compact"/>
+      </w:pPr>
+      <w:r>
+        <w:t xml:space="preserve">In step 2, choose</w:t>
+      </w:r>
+      <w:r>
+        <w:t xml:space="preserve"> </w:t>
+      </w:r>
+      <w:r>
+        <w:rPr>
+          <w:bCs/>
+          <w:b/>
+        </w:rPr>
+        <w:t xml:space="preserve">Custom heritage…</w:t>
+      </w:r>
+      <w:r>
+        <w:t xml:space="preserve"> </w:t>
+      </w:r>
+      <w:r>
+        <w:t xml:space="preserve">at the end of the Heritage list.</w:t>
+      </w:r>
+    </w:p>
+    <w:p>
+      <w:pPr>
+        <w:numPr>
+          <w:ilvl w:val="0"/>
+          <w:numId w:val="1033"/>
+        </w:numPr>
+        <w:pStyle w:val="Compact"/>
+      </w:pPr>
+      <w:r>
+        <w:t xml:space="preserve">Name it, choose the tier you agreed, and set its adjustments. The checklist confirms they total zero.</w:t>
+      </w:r>
+    </w:p>
+    <w:p>
+      <w:pPr>
+        <w:numPr>
+          <w:ilvl w:val="0"/>
+          <w:numId w:val="1033"/>
+        </w:numPr>
+        <w:pStyle w:val="Compact"/>
+      </w:pPr>
+      <w:r>
+        <w:t xml:space="preserve">Write its core rules in</w:t>
+      </w:r>
+      <w:r>
+        <w:t xml:space="preserve"> </w:t>
+      </w:r>
+      <w:r>
+        <w:rPr>
+          <w:bCs/>
+          <w:b/>
+        </w:rPr>
+        <w:t xml:space="preserve">Other ability (GM approval required)</w:t>
+      </w:r>
+      <w:r>
+        <w:t xml:space="preserve"> </w:t>
+      </w:r>
+      <w:r>
+        <w:t xml:space="preserve">in step 4.</w:t>
+      </w:r>
+    </w:p>
+    <w:p>
+      <w:pPr>
+        <w:numPr>
+          <w:ilvl w:val="0"/>
+          <w:numId w:val="1033"/>
+        </w:numPr>
+        <w:pStyle w:val="Compact"/>
+      </w:pPr>
+      <w:r>
+        <w:t xml:space="preserve">In step 4, choose</w:t>
+      </w:r>
+      <w:r>
+        <w:t xml:space="preserve"> </w:t>
+      </w:r>
+      <w:r>
+        <w:rPr>
+          <w:bCs/>
+          <w:b/>
+        </w:rPr>
+        <w:t xml:space="preserve">Custom heritage advantage…</w:t>
+      </w:r>
+      <w:r>
+        <w:t xml:space="preserve"> </w:t>
+      </w:r>
+      <w:r>
+        <w:t xml:space="preserve">and enter the advantage and its companion complication.</w:t>
+      </w:r>
+    </w:p>
+    <w:bookmarkEnd w:id="114"/>
+    <w:bookmarkStart w:id="115" w:name="example"/>
+    <w:p>
+      <w:pPr>
+        <w:pStyle w:val="Heading3"/>
+      </w:pPr>
+      <w:r>
+        <w:t xml:space="preserve">Example</w:t>
+      </w:r>
+    </w:p>
+    <w:p>
+      <w:pPr>
+        <w:pStyle w:val="FirstParagraph"/>
+      </w:pPr>
+      <w:r>
+        <w:rPr>
+          <w:bCs/>
+          <w:b/>
+        </w:rPr>
+        <w:t xml:space="preserve">Hundjäger-blooded (tier 1).</w:t>
+      </w:r>
+      <w:r>
+        <w:t xml:space="preserve"> </w:t>
+      </w:r>
+      <w:r>
+        <w:t xml:space="preserve">A human family with a little Wesen blood: no woge, but the instincts.</w:t>
+      </w:r>
+      <w:r>
+        <w:t xml:space="preserve"> </w:t>
+      </w:r>
+      <w:r>
+        <w:rPr>
+          <w:iCs/>
+          <w:i/>
+        </w:rPr>
+        <w:t xml:space="preserve">Adjustments:</w:t>
+      </w:r>
+      <w:r>
+        <w:t xml:space="preserve"> </w:t>
+      </w:r>
+      <w:r>
+        <w:t xml:space="preserve">Body +1, Presence −1.</w:t>
+      </w:r>
+      <w:r>
+        <w:t xml:space="preserve"> </w:t>
+      </w:r>
+      <w:r>
+        <w:rPr>
+          <w:iCs/>
+          <w:i/>
+        </w:rPr>
+        <w:t xml:space="preserve">Core rule:</w:t>
+      </w:r>
+      <w:r>
+        <w:t xml:space="preserve"> </w:t>
+      </w:r>
+      <w:r>
+        <w:t xml:space="preserve">keen nose: you smell fear and blood on anyone close by.</w:t>
+      </w:r>
+      <w:r>
+        <w:t xml:space="preserve"> </w:t>
+      </w:r>
+      <w:r>
+        <w:rPr>
+          <w:iCs/>
+          <w:i/>
+        </w:rPr>
+        <w:t xml:space="preserve">Heritage advantage:</w:t>
+      </w:r>
+      <w:r>
+        <w:t xml:space="preserve"> </w:t>
+      </w:r>
+      <w:r>
+        <w:rPr>
+          <w:bCs/>
+          <w:b/>
+        </w:rPr>
+        <w:t xml:space="preserve">Bloodhound’s Nose</w:t>
+      </w:r>
+      <w:r>
+        <w:t xml:space="preserve">: +2 to Tracking by scent.</w:t>
+      </w:r>
+      <w:r>
+        <w:t xml:space="preserve"> </w:t>
+      </w:r>
+      <w:r>
+        <w:rPr>
+          <w:iCs/>
+          <w:i/>
+        </w:rPr>
+        <w:t xml:space="preserve">Companion:</w:t>
+      </w:r>
+      <w:r>
+        <w:t xml:space="preserve"> </w:t>
+      </w:r>
+      <w:r>
+        <w:rPr>
+          <w:bCs/>
+          <w:b/>
+        </w:rPr>
+        <w:t xml:space="preserve">Wesen Kin</w:t>
+      </w:r>
+      <w:r>
+        <w:t xml:space="preserve">: Wesen recognize their own, and some want you back in the fold; accept the visit at the worst time.</w:t>
+      </w:r>
+    </w:p>
+    <w:bookmarkEnd w:id="115"/>
+    <w:bookmarkEnd w:id="116"/>
+    <w:bookmarkEnd w:id="117"/>
+    <w:bookmarkStart w:id="118" w:name="complications"/>
     <w:p>
       <w:pPr>
         <w:pStyle w:val="Heading1"/>
@@ -23470,8 +24398,8 @@
         </w:tc>
       </w:tr>
     </w:tbl>
-    <w:bookmarkEnd w:id="107"/>
-    <w:bookmarkStart w:id="108" w:name="quick-reference"/>
+    <w:bookmarkEnd w:id="118"/>
+    <w:bookmarkStart w:id="119" w:name="quick-reference"/>
     <w:p>
       <w:pPr>
         <w:pStyle w:val="Heading1"/>
@@ -23678,8 +24606,8 @@
         <w:t xml:space="preserve">start each session with two (three with True grit). Reroll, reduce an injury by one box, or establish a small preparation. Earn one from an accepted complication.</w:t>
       </w:r>
     </w:p>
-    <w:bookmarkEnd w:id="108"/>
-    <w:bookmarkStart w:id="111" w:name="discord-commands"/>
+    <w:bookmarkEnd w:id="119"/>
+    <w:bookmarkStart w:id="122" w:name="discord-commands"/>
     <w:p>
       <w:pPr>
         <w:pStyle w:val="Heading1"/>
@@ -23711,7 +24639,7 @@
         <w:t xml:space="preserve">in a channel to see the commands; Discord shows each option as you fill it in. The bot doesn’t know your sheet, so you give it the target number.</w:t>
       </w:r>
     </w:p>
-    <w:bookmarkStart w:id="109" w:name="for-players"/>
+    <w:bookmarkStart w:id="120" w:name="for-players"/>
     <w:p>
       <w:pPr>
         <w:pStyle w:val="Heading2"/>
@@ -24193,8 +25121,8 @@
         <w:t xml:space="preserve">Only the player who rolled can press the reroll button. Rolls that miss by 1 or 2 remind the GM that success at a cost is on offer.</w:t>
       </w:r>
     </w:p>
-    <w:bookmarkEnd w:id="109"/>
-    <w:bookmarkStart w:id="110" w:name="for-the-gm"/>
+    <w:bookmarkEnd w:id="120"/>
+    <w:bookmarkStart w:id="121" w:name="for-the-gm"/>
     <w:p>
       <w:pPr>
         <w:pStyle w:val="Heading2"/>
@@ -24825,8 +25753,8 @@
         <w:t xml:space="preserve"> </w:t>
       </w:r>
     </w:p>
-    <w:bookmarkEnd w:id="110"/>
-    <w:bookmarkEnd w:id="111"/>
+    <w:bookmarkEnd w:id="121"/>
+    <w:bookmarkEnd w:id="122"/>
     <w:sectPr/>
   </w:body>
 </w:document>
@@ -25297,6 +26225,66 @@
   </w:num>
   <w:num w:numId="1031">
     <w:abstractNumId w:val="991"/>
+  </w:num>
+  <w:num w:numId="1032">
+    <w:abstractNumId w:val="99411"/>
+    <w:lvlOverride w:ilvl="0">
+      <w:startOverride w:val="1"/>
+    </w:lvlOverride>
+    <w:lvlOverride w:ilvl="1">
+      <w:startOverride w:val="1"/>
+    </w:lvlOverride>
+    <w:lvlOverride w:ilvl="2">
+      <w:startOverride w:val="1"/>
+    </w:lvlOverride>
+    <w:lvlOverride w:ilvl="3">
+      <w:startOverride w:val="1"/>
+    </w:lvlOverride>
+    <w:lvlOverride w:ilvl="4">
+      <w:startOverride w:val="1"/>
+    </w:lvlOverride>
+    <w:lvlOverride w:ilvl="5">
+      <w:startOverride w:val="1"/>
+    </w:lvlOverride>
+    <w:lvlOverride w:ilvl="6">
+      <w:startOverride w:val="1"/>
+    </w:lvlOverride>
+    <w:lvlOverride w:ilvl="7">
+      <w:startOverride w:val="1"/>
+    </w:lvlOverride>
+    <w:lvlOverride w:ilvl="8">
+      <w:startOverride w:val="1"/>
+    </w:lvlOverride>
+  </w:num>
+  <w:num w:numId="1033">
+    <w:abstractNumId w:val="99411"/>
+    <w:lvlOverride w:ilvl="0">
+      <w:startOverride w:val="1"/>
+    </w:lvlOverride>
+    <w:lvlOverride w:ilvl="1">
+      <w:startOverride w:val="1"/>
+    </w:lvlOverride>
+    <w:lvlOverride w:ilvl="2">
+      <w:startOverride w:val="1"/>
+    </w:lvlOverride>
+    <w:lvlOverride w:ilvl="3">
+      <w:startOverride w:val="1"/>
+    </w:lvlOverride>
+    <w:lvlOverride w:ilvl="4">
+      <w:startOverride w:val="1"/>
+    </w:lvlOverride>
+    <w:lvlOverride w:ilvl="5">
+      <w:startOverride w:val="1"/>
+    </w:lvlOverride>
+    <w:lvlOverride w:ilvl="6">
+      <w:startOverride w:val="1"/>
+    </w:lvlOverride>
+    <w:lvlOverride w:ilvl="7">
+      <w:startOverride w:val="1"/>
+    </w:lvlOverride>
+    <w:lvlOverride w:ilvl="8">
+      <w:startOverride w:val="1"/>
+    </w:lvlOverride>
   </w:num>
 </w:numbering>
 </file>

</xml_diff>

<commit_message>
Make your own calling/heritage: a Custom option in the creator and a guide chapter
Co-Authored-By: Claude Opus 5.5 <noreply@anthropic.com>
Claude-Session: https://claude.ai/code/session_015SADCFzhKijkC2foUmXrpC
</commit_message>
<xml_diff>
--- a/grimm-west/Grimm_Players_Guide.docx
+++ b/grimm-west/Grimm_Players_Guide.docx
@@ -2219,7 +2219,23 @@
         <w:pStyle w:val="FirstParagraph"/>
       </w:pPr>
       <w:r>
-        <w:t xml:space="preserve">Agree on a heritage with the GM, give it adjustments from −2 to +2 per attribute that total zero, and agree its tier. The normal starting maximum and heritage base rules apply.</w:t>
+        <w:t xml:space="preserve">You can build your own heritage with the GM. See</w:t>
+      </w:r>
+      <w:r>
+        <w:t xml:space="preserve"> </w:t>
+      </w:r>
+      <w:r>
+        <w:rPr>
+          <w:iCs/>
+          <w:i/>
+        </w:rPr>
+        <w:t xml:space="preserve">Making your own</w:t>
+      </w:r>
+      <w:r>
+        <w:t xml:space="preserve"> </w:t>
+      </w:r>
+      <w:r>
+        <w:t xml:space="preserve">for the steps.</w:t>
       </w:r>
     </w:p>
     <w:bookmarkEnd w:id="28"/>
@@ -22666,7 +22682,919 @@
     </w:p>
     <w:bookmarkEnd w:id="105"/>
     <w:bookmarkEnd w:id="106"/>
-    <w:bookmarkStart w:id="107" w:name="complications"/>
+    <w:bookmarkStart w:id="117" w:name="making-your-own"/>
+    <w:p>
+      <w:pPr>
+        <w:pStyle w:val="Heading1"/>
+      </w:pPr>
+      <w:r>
+        <w:t xml:space="preserve">Making your own</w:t>
+      </w:r>
+    </w:p>
+    <w:p>
+      <w:pPr>
+        <w:pStyle w:val="FirstParagraph"/>
+      </w:pPr>
+      <w:r>
+        <w:t xml:space="preserve">The callings and heritages in this book are a starting point, not a limit. With the GM’s agreement, any player can create their own calling or heritage. The creator has a</w:t>
+      </w:r>
+      <w:r>
+        <w:t xml:space="preserve"> </w:t>
+      </w:r>
+      <w:r>
+        <w:rPr>
+          <w:bCs/>
+          <w:b/>
+        </w:rPr>
+        <w:t xml:space="preserve">Custom</w:t>
+      </w:r>
+      <w:r>
+        <w:t xml:space="preserve"> </w:t>
+      </w:r>
+      <w:r>
+        <w:t xml:space="preserve">option at the end of each list, and its checklist holds a custom choice to the same rules as everything else.</w:t>
+      </w:r>
+    </w:p>
+    <w:bookmarkStart w:id="107" w:name="a-custom-calling"/>
+    <w:p>
+      <w:pPr>
+        <w:pStyle w:val="Heading2"/>
+      </w:pPr>
+      <w:r>
+        <w:t xml:space="preserve">A custom calling</w:t>
+      </w:r>
+    </w:p>
+    <w:p>
+      <w:pPr>
+        <w:pStyle w:val="FirstParagraph"/>
+      </w:pPr>
+      <w:r>
+        <w:t xml:space="preserve">A calling is a concept, not a package of powers: it gives no bonus of its own. A custom one only needs a clear place in the group.</w:t>
+      </w:r>
+    </w:p>
+    <w:p>
+      <w:pPr>
+        <w:numPr>
+          <w:ilvl w:val="0"/>
+          <w:numId w:val="1032"/>
+        </w:numPr>
+        <w:pStyle w:val="Compact"/>
+      </w:pPr>
+      <w:r>
+        <w:rPr>
+          <w:bCs/>
+          <w:b/>
+        </w:rPr>
+        <w:t xml:space="preserve">Name it and describe it.</w:t>
+      </w:r>
+      <w:r>
+        <w:t xml:space="preserve"> </w:t>
+      </w:r>
+      <w:r>
+        <w:t xml:space="preserve">One sentence for what your character does that no one else does, in the style of the callings above:</w:t>
+      </w:r>
+      <w:r>
+        <w:t xml:space="preserve"> </w:t>
+      </w:r>
+      <w:r>
+        <w:rPr>
+          <w:iCs/>
+          <w:i/>
+        </w:rPr>
+        <w:t xml:space="preserve">“</w:t>
+      </w:r>
+      <w:r>
+        <w:rPr>
+          <w:iCs/>
+          <w:i/>
+        </w:rPr>
+        <w:t xml:space="preserve">Undertaker: buries the dead, and makes sure they stay buried.</w:t>
+      </w:r>
+      <w:r>
+        <w:rPr>
+          <w:iCs/>
+          <w:i/>
+        </w:rPr>
+        <w:t xml:space="preserve">”</w:t>
+      </w:r>
+    </w:p>
+    <w:p>
+      <w:pPr>
+        <w:numPr>
+          <w:ilvl w:val="0"/>
+          <w:numId w:val="1032"/>
+        </w:numPr>
+        <w:pStyle w:val="Compact"/>
+      </w:pPr>
+      <w:r>
+        <w:rPr>
+          <w:bCs/>
+          <w:b/>
+        </w:rPr>
+        <w:t xml:space="preserve">Choose a group.</w:t>
+      </w:r>
+      <w:r>
+        <w:t xml:space="preserve"> </w:t>
+      </w:r>
+      <w:r>
+        <w:t xml:space="preserve">Pick the one it belongs with: The Law, The Learned or The Frontier. The group only sets your sheet’s colors and emblem.</w:t>
+      </w:r>
+    </w:p>
+    <w:p>
+      <w:pPr>
+        <w:numPr>
+          <w:ilvl w:val="0"/>
+          <w:numId w:val="1032"/>
+        </w:numPr>
+        <w:pStyle w:val="Compact"/>
+      </w:pPr>
+      <w:r>
+        <w:rPr>
+          <w:bCs/>
+          <w:b/>
+        </w:rPr>
+        <w:t xml:space="preserve">Pick four core skills.</w:t>
+      </w:r>
+      <w:r>
+        <w:t xml:space="preserve"> </w:t>
+      </w:r>
+      <w:r>
+        <w:t xml:space="preserve">The skills it can’t do without. Mark them Trained yourself in step 3 (the built-in callings do this for you); they count toward your normal Trained skills.</w:t>
+      </w:r>
+    </w:p>
+    <w:p>
+      <w:pPr>
+        <w:numPr>
+          <w:ilvl w:val="0"/>
+          <w:numId w:val="1032"/>
+        </w:numPr>
+        <w:pStyle w:val="Compact"/>
+      </w:pPr>
+      <w:r>
+        <w:rPr>
+          <w:bCs/>
+          <w:b/>
+        </w:rPr>
+        <w:t xml:space="preserve">Check it with the GM.</w:t>
+      </w:r>
+      <w:r>
+        <w:t xml:space="preserve"> </w:t>
+      </w:r>
+      <w:r>
+        <w:t xml:space="preserve">It should fit the setting and overlap the existing callings as little as possible.</w:t>
+      </w:r>
+    </w:p>
+    <w:p>
+      <w:pPr>
+        <w:pStyle w:val="FirstParagraph"/>
+      </w:pPr>
+      <w:r>
+        <w:rPr>
+          <w:bCs/>
+          <w:b/>
+        </w:rPr>
+        <w:t xml:space="preserve">In the creator:</w:t>
+      </w:r>
+      <w:r>
+        <w:t xml:space="preserve"> </w:t>
+      </w:r>
+      <w:r>
+        <w:t xml:space="preserve">in step 1, choose</w:t>
+      </w:r>
+      <w:r>
+        <w:t xml:space="preserve"> </w:t>
+      </w:r>
+      <w:r>
+        <w:rPr>
+          <w:bCs/>
+          <w:b/>
+        </w:rPr>
+        <w:t xml:space="preserve">Custom calling…</w:t>
+      </w:r>
+      <w:r>
+        <w:t xml:space="preserve"> </w:t>
+      </w:r>
+      <w:r>
+        <w:t xml:space="preserve">at the end of the Calling list, then enter its name and group. Write the description in</w:t>
+      </w:r>
+      <w:r>
+        <w:t xml:space="preserve"> </w:t>
+      </w:r>
+      <w:r>
+        <w:rPr>
+          <w:iCs/>
+          <w:i/>
+        </w:rPr>
+        <w:t xml:space="preserve">What you bring</w:t>
+      </w:r>
+      <w:r>
+        <w:t xml:space="preserve">.</w:t>
+      </w:r>
+    </w:p>
+    <w:bookmarkEnd w:id="107"/>
+    <w:bookmarkStart w:id="116" w:name="a-custom-heritage"/>
+    <w:p>
+      <w:pPr>
+        <w:pStyle w:val="Heading2"/>
+      </w:pPr>
+      <w:r>
+        <w:t xml:space="preserve">A custom heritage</w:t>
+      </w:r>
+    </w:p>
+    <w:p>
+      <w:pPr>
+        <w:pStyle w:val="FirstParagraph"/>
+      </w:pPr>
+      <w:r>
+        <w:t xml:space="preserve">Build it with the GM, one step at a time.</w:t>
+      </w:r>
+    </w:p>
+    <w:bookmarkStart w:id="108" w:name="the-concept"/>
+    <w:p>
+      <w:pPr>
+        <w:pStyle w:val="Heading3"/>
+      </w:pPr>
+      <w:r>
+        <w:t xml:space="preserve">1. The concept</w:t>
+      </w:r>
+    </w:p>
+    <w:p>
+      <w:pPr>
+        <w:pStyle w:val="FirstParagraph"/>
+      </w:pPr>
+      <w:r>
+        <w:t xml:space="preserve">Two or three sentences: where they come from, what sets them apart, and how others see them. It should be something the heritages in this book don’t already cover.</w:t>
+      </w:r>
+    </w:p>
+    <w:bookmarkEnd w:id="108"/>
+    <w:bookmarkStart w:id="109" w:name="the-tier"/>
+    <w:p>
+      <w:pPr>
+        <w:pStyle w:val="Heading3"/>
+      </w:pPr>
+      <w:r>
+        <w:t xml:space="preserve">2. The tier</w:t>
+      </w:r>
+    </w:p>
+    <w:p>
+      <w:pPr>
+        <w:pStyle w:val="FirstParagraph"/>
+      </w:pPr>
+      <w:r>
+        <w:t xml:space="preserve">The tier measures how much the heritage gives on its own. Each tier costs one of your 3 Edge points, so stronger heritages start with fewer Edges.</w:t>
+      </w:r>
+    </w:p>
+    <w:tbl>
+      <w:tblPr>
+        <w:tblStyle w:val="Table"/>
+        <w:tblW w:type="pct" w:w="5000"/>
+        <w:tblLook w:firstRow="1" w:lastRow="0" w:firstColumn="0" w:lastColumn="0" w:noHBand="0" w:noVBand="0" w:val="0020"/>
+        <w:jc w:val="start"/>
+        <w:tblBorders>
+          <w:top w:val="single" w:sz="4" w:color="B8C2D3"/>
+          <w:left w:val="single" w:sz="4" w:color="B8C2D3"/>
+          <w:bottom w:val="single" w:sz="4" w:color="B8C2D3"/>
+          <w:right w:val="single" w:sz="4" w:color="B8C2D3"/>
+          <w:insideH w:val="single" w:sz="4" w:color="B8C2D3"/>
+          <w:insideV w:val="single" w:sz="4" w:color="B8C2D3"/>
+        </w:tblBorders>
+      </w:tblPr>
+      <w:tblGrid>
+        <w:gridCol w:w="2640"/>
+        <w:gridCol w:w="2640"/>
+        <w:gridCol w:w="2640"/>
+      </w:tblGrid>
+      <w:tr>
+        <w:trPr>
+          <w:tblHeader w:val="true"/>
+        </w:trPr>
+        <w:tc>
+          <w:tcPr>
+            <w:shd w:val="clear" w:fill="F1E6D2"/>
+          </w:tcPr>
+          <w:p>
+            <w:pPr>
+              <w:pStyle w:val="Compact"/>
+              <w:jc w:val="left"/>
+            </w:pPr>
+            <w:r>
+              <w:rPr>
+                <w:b/>
+                <w:sz w:val="19"/>
+              </w:rPr>
+              <w:t xml:space="preserve">Tier</w:t>
+            </w:r>
+          </w:p>
+        </w:tc>
+        <w:tc>
+          <w:tcPr>
+            <w:shd w:val="clear" w:fill="F1E6D2"/>
+          </w:tcPr>
+          <w:p>
+            <w:pPr>
+              <w:pStyle w:val="Compact"/>
+              <w:jc w:val="left"/>
+            </w:pPr>
+            <w:r>
+              <w:rPr>
+                <w:b/>
+                <w:sz w:val="19"/>
+              </w:rPr>
+              <w:t xml:space="preserve">Edges</w:t>
+            </w:r>
+          </w:p>
+        </w:tc>
+        <w:tc>
+          <w:tcPr>
+            <w:shd w:val="clear" w:fill="F1E6D2"/>
+          </w:tcPr>
+          <w:p>
+            <w:pPr>
+              <w:pStyle w:val="Compact"/>
+              <w:jc w:val="left"/>
+            </w:pPr>
+            <w:r>
+              <w:rPr>
+                <w:b/>
+                <w:sz w:val="19"/>
+              </w:rPr>
+              <w:t xml:space="preserve">Use it for</w:t>
+            </w:r>
+          </w:p>
+        </w:tc>
+      </w:tr>
+      <w:tr>
+        <w:tc>
+          <w:tcPr/>
+          <w:p>
+            <w:pPr>
+              <w:pStyle w:val="Compact"/>
+              <w:jc w:val="left"/>
+            </w:pPr>
+            <w:r>
+              <w:rPr>
+                <w:b/>
+                <w:sz w:val="19"/>
+              </w:rPr>
+              <w:t xml:space="preserve">0</w:t>
+            </w:r>
+          </w:p>
+        </w:tc>
+        <w:tc>
+          <w:tcPr/>
+          <w:p>
+            <w:pPr>
+              <w:pStyle w:val="Compact"/>
+              <w:jc w:val="left"/>
+            </w:pPr>
+            <w:r>
+              <w:rPr>
+                <w:sz w:val="19"/>
+              </w:rPr>
+              <w:t xml:space="preserve">3</w:t>
+            </w:r>
+          </w:p>
+        </w:tc>
+        <w:tc>
+          <w:tcPr/>
+          <w:p>
+            <w:pPr>
+              <w:pStyle w:val="Compact"/>
+              <w:jc w:val="left"/>
+            </w:pPr>
+            <w:r>
+              <w:rPr>
+                <w:sz w:val="19"/>
+              </w:rPr>
+              <w:t xml:space="preserve">Ordinary people: a homeland, upbringing or culture, with no special abilities</w:t>
+            </w:r>
+          </w:p>
+        </w:tc>
+      </w:tr>
+      <w:tr>
+        <w:tc>
+          <w:tcPr/>
+          <w:p>
+            <w:pPr>
+              <w:pStyle w:val="Compact"/>
+              <w:jc w:val="left"/>
+            </w:pPr>
+            <w:r>
+              <w:rPr>
+                <w:b/>
+                <w:sz w:val="19"/>
+              </w:rPr>
+              <w:t xml:space="preserve">1</w:t>
+            </w:r>
+          </w:p>
+        </w:tc>
+        <w:tc>
+          <w:tcPr/>
+          <w:p>
+            <w:pPr>
+              <w:pStyle w:val="Compact"/>
+              <w:jc w:val="left"/>
+            </w:pPr>
+            <w:r>
+              <w:rPr>
+                <w:sz w:val="19"/>
+              </w:rPr>
+              <w:t xml:space="preserve">2</w:t>
+            </w:r>
+          </w:p>
+        </w:tc>
+        <w:tc>
+          <w:tcPr/>
+          <w:p>
+            <w:pPr>
+              <w:pStyle w:val="Compact"/>
+              <w:jc w:val="left"/>
+            </w:pPr>
+            <w:r>
+              <w:rPr>
+                <w:sz w:val="19"/>
+              </w:rPr>
+              <w:t xml:space="preserve">One small, constant edge: keen senses, a tough hide, a free Trained skill, resistance to one hazard</w:t>
+            </w:r>
+          </w:p>
+        </w:tc>
+      </w:tr>
+      <w:tr>
+        <w:tc>
+          <w:tcPr/>
+          <w:p>
+            <w:pPr>
+              <w:pStyle w:val="Compact"/>
+              <w:jc w:val="left"/>
+            </w:pPr>
+            <w:r>
+              <w:rPr>
+                <w:b/>
+                <w:sz w:val="19"/>
+              </w:rPr>
+              <w:t xml:space="preserve">2</w:t>
+            </w:r>
+          </w:p>
+        </w:tc>
+        <w:tc>
+          <w:tcPr/>
+          <w:p>
+            <w:pPr>
+              <w:pStyle w:val="Compact"/>
+              <w:jc w:val="left"/>
+            </w:pPr>
+            <w:r>
+              <w:rPr>
+                <w:sz w:val="19"/>
+              </w:rPr>
+              <w:t xml:space="preserve">1</w:t>
+            </w:r>
+          </w:p>
+        </w:tc>
+        <w:tc>
+          <w:tcPr/>
+          <w:p>
+            <w:pPr>
+              <w:pStyle w:val="Compact"/>
+              <w:jc w:val="left"/>
+            </w:pPr>
+            <w:r>
+              <w:rPr>
+                <w:sz w:val="19"/>
+              </w:rPr>
+              <w:t xml:space="preserve">Clear inhuman or supernatural gifts: venom, a second form, strong resistances</w:t>
+            </w:r>
+          </w:p>
+        </w:tc>
+      </w:tr>
+      <w:tr>
+        <w:tc>
+          <w:tcPr/>
+          <w:p>
+            <w:pPr>
+              <w:pStyle w:val="Compact"/>
+              <w:jc w:val="left"/>
+            </w:pPr>
+            <w:r>
+              <w:rPr>
+                <w:b/>
+                <w:sz w:val="19"/>
+              </w:rPr>
+              <w:t xml:space="preserve">3</w:t>
+            </w:r>
+          </w:p>
+        </w:tc>
+        <w:tc>
+          <w:tcPr/>
+          <w:p>
+            <w:pPr>
+              <w:pStyle w:val="Compact"/>
+              <w:jc w:val="left"/>
+            </w:pPr>
+            <w:r>
+              <w:rPr>
+                <w:sz w:val="19"/>
+              </w:rPr>
+              <w:t xml:space="preserve">0</w:t>
+            </w:r>
+          </w:p>
+        </w:tc>
+        <w:tc>
+          <w:tcPr/>
+          <w:p>
+            <w:pPr>
+              <w:pStyle w:val="Compact"/>
+              <w:jc w:val="left"/>
+            </w:pPr>
+            <w:r>
+              <w:rPr>
+                <w:sz w:val="19"/>
+              </w:rPr>
+              <w:t xml:space="preserve">Remarkable beings: several strong abilities, and serious weaknesses to match</w:t>
+            </w:r>
+          </w:p>
+        </w:tc>
+      </w:tr>
+    </w:tbl>
+    <w:p>
+      <w:pPr>
+        <w:pStyle w:val="BodyText"/>
+      </w:pPr>
+      <w:r>
+        <w:t xml:space="preserve">When in doubt, choose the higher tier.</w:t>
+      </w:r>
+    </w:p>
+    <w:bookmarkEnd w:id="109"/>
+    <w:bookmarkStart w:id="110" w:name="attribute-adjustments"/>
+    <w:p>
+      <w:pPr>
+        <w:pStyle w:val="Heading3"/>
+      </w:pPr>
+      <w:r>
+        <w:t xml:space="preserve">3. Attribute adjustments</w:t>
+      </w:r>
+    </w:p>
+    <w:p>
+      <w:pPr>
+        <w:pStyle w:val="FirstParagraph"/>
+      </w:pPr>
+      <w:r>
+        <w:t xml:space="preserve">Give adjustments from</w:t>
+      </w:r>
+      <w:r>
+        <w:t xml:space="preserve"> </w:t>
+      </w:r>
+      <w:r>
+        <w:rPr>
+          <w:bCs/>
+          <w:b/>
+        </w:rPr>
+        <w:t xml:space="preserve">−2 to +2</w:t>
+      </w:r>
+      <w:r>
+        <w:t xml:space="preserve"> </w:t>
+      </w:r>
+      <w:r>
+        <w:t xml:space="preserve">per attribute that</w:t>
+      </w:r>
+      <w:r>
+        <w:t xml:space="preserve"> </w:t>
+      </w:r>
+      <w:r>
+        <w:rPr>
+          <w:bCs/>
+          <w:b/>
+        </w:rPr>
+        <w:t xml:space="preserve">total zero</w:t>
+      </w:r>
+      <w:r>
+        <w:t xml:space="preserve">: a +2 needs a −2 or two −1s. The adjustments move the attribute’s base (+1 starts it at 11) and raise its starting maximum (13 plus the bonus). Most heritages change two to four attributes.</w:t>
+      </w:r>
+    </w:p>
+    <w:bookmarkEnd w:id="110"/>
+    <w:bookmarkStart w:id="111" w:name="core-rules-tier-1-and-up"/>
+    <w:p>
+      <w:pPr>
+        <w:pStyle w:val="Heading3"/>
+      </w:pPr>
+      <w:r>
+        <w:t xml:space="preserve">4. Core rules (tier 1 and up)</w:t>
+      </w:r>
+    </w:p>
+    <w:p>
+      <w:pPr>
+        <w:pStyle w:val="FirstParagraph"/>
+      </w:pPr>
+      <w:r>
+        <w:t xml:space="preserve">One to three short rules that always apply: what they can do (see in the dark, resist cold, a free Trained skill) and what it costs (a weakness, a people’s distrust, a hazard they can’t abide). A strength with no drawback is worth more than it looks, so price it a tier higher.</w:t>
+      </w:r>
+    </w:p>
+    <w:bookmarkEnd w:id="111"/>
+    <w:bookmarkStart w:id="112" w:name="heritage-advantages"/>
+    <w:p>
+      <w:pPr>
+        <w:pStyle w:val="Heading3"/>
+      </w:pPr>
+      <w:r>
+        <w:t xml:space="preserve">5. Heritage advantages</w:t>
+      </w:r>
+    </w:p>
+    <w:p>
+      <w:pPr>
+        <w:pStyle w:val="FirstParagraph"/>
+      </w:pPr>
+      <w:r>
+        <w:t xml:space="preserve">Write one to three. Each works like a general advantage:</w:t>
+      </w:r>
+      <w:r>
+        <w:t xml:space="preserve"> </w:t>
+      </w:r>
+      <w:r>
+        <w:rPr>
+          <w:bCs/>
+          <w:b/>
+        </w:rPr>
+        <w:t xml:space="preserve">+2 to one skill in a narrow situation</w:t>
+      </w:r>
+      <w:r>
+        <w:t xml:space="preserve">, or a small, limited permission (</w:t>
+      </w:r>
+      <w:r>
+        <w:t xml:space="preserve">“</w:t>
+      </w:r>
+      <w:r>
+        <w:t xml:space="preserve">once per scene…</w:t>
+      </w:r>
+      <w:r>
+        <w:t xml:space="preserve">”</w:t>
+      </w:r>
+      <w:r>
+        <w:t xml:space="preserve">). Each comes with a</w:t>
+      </w:r>
+      <w:r>
+        <w:t xml:space="preserve"> </w:t>
+      </w:r>
+      <w:r>
+        <w:rPr>
+          <w:bCs/>
+          <w:b/>
+        </w:rPr>
+        <w:t xml:space="preserve">companion complication</w:t>
+      </w:r>
+      <w:r>
+        <w:t xml:space="preserve">: a problem the trait causes, with a clear trigger and a real consequence, which earns a Grit point when it bites, like any complication. A character takes one advantage, general or heritage, so make them distinct choices.</w:t>
+      </w:r>
+    </w:p>
+    <w:bookmarkEnd w:id="112"/>
+    <w:bookmarkStart w:id="113" w:name="a-woge-optional-tier-2-or-3"/>
+    <w:p>
+      <w:pPr>
+        <w:pStyle w:val="Heading3"/>
+      </w:pPr>
+      <w:r>
+        <w:t xml:space="preserve">6. A woge (optional, tier 2 or 3)</w:t>
+      </w:r>
+    </w:p>
+    <w:p>
+      <w:pPr>
+        <w:pStyle w:val="FirstParagraph"/>
+      </w:pPr>
+      <w:r>
+        <w:t xml:space="preserve">If the heritage changes shape, give the form attribute bonuses (usually +2 to one attribute and +1 to another), two or three traits, and its drawbacks. The shared rules for forms in</w:t>
+      </w:r>
+      <w:r>
+        <w:t xml:space="preserve"> </w:t>
+      </w:r>
+      <w:r>
+        <w:rPr>
+          <w:iCs/>
+          <w:i/>
+        </w:rPr>
+        <w:t xml:space="preserve">The woge and the hidden world</w:t>
+      </w:r>
+      <w:r>
+        <w:t xml:space="preserve"> </w:t>
+      </w:r>
+      <w:r>
+        <w:t xml:space="preserve">apply.</w:t>
+      </w:r>
+    </w:p>
+    <w:bookmarkEnd w:id="113"/>
+    <w:bookmarkStart w:id="114" w:name="in-the-creator"/>
+    <w:p>
+      <w:pPr>
+        <w:pStyle w:val="Heading3"/>
+      </w:pPr>
+      <w:r>
+        <w:t xml:space="preserve">In the creator</w:t>
+      </w:r>
+    </w:p>
+    <w:p>
+      <w:pPr>
+        <w:numPr>
+          <w:ilvl w:val="0"/>
+          <w:numId w:val="1033"/>
+        </w:numPr>
+        <w:pStyle w:val="Compact"/>
+      </w:pPr>
+      <w:r>
+        <w:t xml:space="preserve">In step 2, choose</w:t>
+      </w:r>
+      <w:r>
+        <w:t xml:space="preserve"> </w:t>
+      </w:r>
+      <w:r>
+        <w:rPr>
+          <w:bCs/>
+          <w:b/>
+        </w:rPr>
+        <w:t xml:space="preserve">Custom heritage…</w:t>
+      </w:r>
+      <w:r>
+        <w:t xml:space="preserve"> </w:t>
+      </w:r>
+      <w:r>
+        <w:t xml:space="preserve">at the end of the Heritage list.</w:t>
+      </w:r>
+    </w:p>
+    <w:p>
+      <w:pPr>
+        <w:numPr>
+          <w:ilvl w:val="0"/>
+          <w:numId w:val="1033"/>
+        </w:numPr>
+        <w:pStyle w:val="Compact"/>
+      </w:pPr>
+      <w:r>
+        <w:t xml:space="preserve">Name it, choose the tier you agreed, and set its adjustments. The checklist confirms they total zero.</w:t>
+      </w:r>
+    </w:p>
+    <w:p>
+      <w:pPr>
+        <w:numPr>
+          <w:ilvl w:val="0"/>
+          <w:numId w:val="1033"/>
+        </w:numPr>
+        <w:pStyle w:val="Compact"/>
+      </w:pPr>
+      <w:r>
+        <w:t xml:space="preserve">Write its core rules in</w:t>
+      </w:r>
+      <w:r>
+        <w:t xml:space="preserve"> </w:t>
+      </w:r>
+      <w:r>
+        <w:rPr>
+          <w:bCs/>
+          <w:b/>
+        </w:rPr>
+        <w:t xml:space="preserve">Other ability (GM approval required)</w:t>
+      </w:r>
+      <w:r>
+        <w:t xml:space="preserve"> </w:t>
+      </w:r>
+      <w:r>
+        <w:t xml:space="preserve">in step 4.</w:t>
+      </w:r>
+    </w:p>
+    <w:p>
+      <w:pPr>
+        <w:numPr>
+          <w:ilvl w:val="0"/>
+          <w:numId w:val="1033"/>
+        </w:numPr>
+        <w:pStyle w:val="Compact"/>
+      </w:pPr>
+      <w:r>
+        <w:t xml:space="preserve">In step 4, choose</w:t>
+      </w:r>
+      <w:r>
+        <w:t xml:space="preserve"> </w:t>
+      </w:r>
+      <w:r>
+        <w:rPr>
+          <w:bCs/>
+          <w:b/>
+        </w:rPr>
+        <w:t xml:space="preserve">Custom heritage advantage…</w:t>
+      </w:r>
+      <w:r>
+        <w:t xml:space="preserve"> </w:t>
+      </w:r>
+      <w:r>
+        <w:t xml:space="preserve">and enter the advantage and its companion complication.</w:t>
+      </w:r>
+    </w:p>
+    <w:bookmarkEnd w:id="114"/>
+    <w:bookmarkStart w:id="115" w:name="example"/>
+    <w:p>
+      <w:pPr>
+        <w:pStyle w:val="Heading3"/>
+      </w:pPr>
+      <w:r>
+        <w:t xml:space="preserve">Example</w:t>
+      </w:r>
+    </w:p>
+    <w:p>
+      <w:pPr>
+        <w:pStyle w:val="FirstParagraph"/>
+      </w:pPr>
+      <w:r>
+        <w:rPr>
+          <w:bCs/>
+          <w:b/>
+        </w:rPr>
+        <w:t xml:space="preserve">Hundjäger-blooded (tier 1).</w:t>
+      </w:r>
+      <w:r>
+        <w:t xml:space="preserve"> </w:t>
+      </w:r>
+      <w:r>
+        <w:t xml:space="preserve">A human family with a little Wesen blood: no woge, but the instincts.</w:t>
+      </w:r>
+      <w:r>
+        <w:t xml:space="preserve"> </w:t>
+      </w:r>
+      <w:r>
+        <w:rPr>
+          <w:iCs/>
+          <w:i/>
+        </w:rPr>
+        <w:t xml:space="preserve">Adjustments:</w:t>
+      </w:r>
+      <w:r>
+        <w:t xml:space="preserve"> </w:t>
+      </w:r>
+      <w:r>
+        <w:t xml:space="preserve">Body +1, Presence −1.</w:t>
+      </w:r>
+      <w:r>
+        <w:t xml:space="preserve"> </w:t>
+      </w:r>
+      <w:r>
+        <w:rPr>
+          <w:iCs/>
+          <w:i/>
+        </w:rPr>
+        <w:t xml:space="preserve">Core rule:</w:t>
+      </w:r>
+      <w:r>
+        <w:t xml:space="preserve"> </w:t>
+      </w:r>
+      <w:r>
+        <w:t xml:space="preserve">keen nose: you smell fear and blood on anyone close by.</w:t>
+      </w:r>
+      <w:r>
+        <w:t xml:space="preserve"> </w:t>
+      </w:r>
+      <w:r>
+        <w:rPr>
+          <w:iCs/>
+          <w:i/>
+        </w:rPr>
+        <w:t xml:space="preserve">Heritage advantage:</w:t>
+      </w:r>
+      <w:r>
+        <w:t xml:space="preserve"> </w:t>
+      </w:r>
+      <w:r>
+        <w:rPr>
+          <w:bCs/>
+          <w:b/>
+        </w:rPr>
+        <w:t xml:space="preserve">Bloodhound’s Nose</w:t>
+      </w:r>
+      <w:r>
+        <w:t xml:space="preserve">: +2 to Tracking by scent.</w:t>
+      </w:r>
+      <w:r>
+        <w:t xml:space="preserve"> </w:t>
+      </w:r>
+      <w:r>
+        <w:rPr>
+          <w:iCs/>
+          <w:i/>
+        </w:rPr>
+        <w:t xml:space="preserve">Companion:</w:t>
+      </w:r>
+      <w:r>
+        <w:t xml:space="preserve"> </w:t>
+      </w:r>
+      <w:r>
+        <w:rPr>
+          <w:bCs/>
+          <w:b/>
+        </w:rPr>
+        <w:t xml:space="preserve">Wesen Kin</w:t>
+      </w:r>
+      <w:r>
+        <w:t xml:space="preserve">: Wesen recognize their own, and some want you back in the fold; accept the visit at the worst time.</w:t>
+      </w:r>
+    </w:p>
+    <w:bookmarkEnd w:id="115"/>
+    <w:bookmarkEnd w:id="116"/>
+    <w:bookmarkEnd w:id="117"/>
+    <w:bookmarkStart w:id="118" w:name="complications"/>
     <w:p>
       <w:pPr>
         <w:pStyle w:val="Heading1"/>
@@ -23470,8 +24398,8 @@
         </w:tc>
       </w:tr>
     </w:tbl>
-    <w:bookmarkEnd w:id="107"/>
-    <w:bookmarkStart w:id="108" w:name="quick-reference"/>
+    <w:bookmarkEnd w:id="118"/>
+    <w:bookmarkStart w:id="119" w:name="quick-reference"/>
     <w:p>
       <w:pPr>
         <w:pStyle w:val="Heading1"/>
@@ -23678,8 +24606,8 @@
         <w:t xml:space="preserve">start each session with two (three with True grit). Reroll, reduce an injury by one box, or establish a small preparation. Earn one from an accepted complication.</w:t>
       </w:r>
     </w:p>
-    <w:bookmarkEnd w:id="108"/>
-    <w:bookmarkStart w:id="111" w:name="discord-commands"/>
+    <w:bookmarkEnd w:id="119"/>
+    <w:bookmarkStart w:id="122" w:name="discord-commands"/>
     <w:p>
       <w:pPr>
         <w:pStyle w:val="Heading1"/>
@@ -23711,7 +24639,7 @@
         <w:t xml:space="preserve">in a channel to see the commands; Discord shows each option as you fill it in. The bot doesn’t know your sheet, so you give it the target number.</w:t>
       </w:r>
     </w:p>
-    <w:bookmarkStart w:id="109" w:name="for-players"/>
+    <w:bookmarkStart w:id="120" w:name="for-players"/>
     <w:p>
       <w:pPr>
         <w:pStyle w:val="Heading2"/>
@@ -24193,8 +25121,8 @@
         <w:t xml:space="preserve">Only the player who rolled can press the reroll button. Rolls that miss by 1 or 2 remind the GM that success at a cost is on offer.</w:t>
       </w:r>
     </w:p>
-    <w:bookmarkEnd w:id="109"/>
-    <w:bookmarkStart w:id="110" w:name="for-the-gm"/>
+    <w:bookmarkEnd w:id="120"/>
+    <w:bookmarkStart w:id="121" w:name="for-the-gm"/>
     <w:p>
       <w:pPr>
         <w:pStyle w:val="Heading2"/>
@@ -24825,8 +25753,8 @@
         <w:t xml:space="preserve"> </w:t>
       </w:r>
     </w:p>
-    <w:bookmarkEnd w:id="110"/>
-    <w:bookmarkEnd w:id="111"/>
+    <w:bookmarkEnd w:id="121"/>
+    <w:bookmarkEnd w:id="122"/>
     <w:sectPr/>
   </w:body>
 </w:document>
@@ -25297,6 +26225,66 @@
   </w:num>
   <w:num w:numId="1031">
     <w:abstractNumId w:val="991"/>
+  </w:num>
+  <w:num w:numId="1032">
+    <w:abstractNumId w:val="99411"/>
+    <w:lvlOverride w:ilvl="0">
+      <w:startOverride w:val="1"/>
+    </w:lvlOverride>
+    <w:lvlOverride w:ilvl="1">
+      <w:startOverride w:val="1"/>
+    </w:lvlOverride>
+    <w:lvlOverride w:ilvl="2">
+      <w:startOverride w:val="1"/>
+    </w:lvlOverride>
+    <w:lvlOverride w:ilvl="3">
+      <w:startOverride w:val="1"/>
+    </w:lvlOverride>
+    <w:lvlOverride w:ilvl="4">
+      <w:startOverride w:val="1"/>
+    </w:lvlOverride>
+    <w:lvlOverride w:ilvl="5">
+      <w:startOverride w:val="1"/>
+    </w:lvlOverride>
+    <w:lvlOverride w:ilvl="6">
+      <w:startOverride w:val="1"/>
+    </w:lvlOverride>
+    <w:lvlOverride w:ilvl="7">
+      <w:startOverride w:val="1"/>
+    </w:lvlOverride>
+    <w:lvlOverride w:ilvl="8">
+      <w:startOverride w:val="1"/>
+    </w:lvlOverride>
+  </w:num>
+  <w:num w:numId="1033">
+    <w:abstractNumId w:val="99411"/>
+    <w:lvlOverride w:ilvl="0">
+      <w:startOverride w:val="1"/>
+    </w:lvlOverride>
+    <w:lvlOverride w:ilvl="1">
+      <w:startOverride w:val="1"/>
+    </w:lvlOverride>
+    <w:lvlOverride w:ilvl="2">
+      <w:startOverride w:val="1"/>
+    </w:lvlOverride>
+    <w:lvlOverride w:ilvl="3">
+      <w:startOverride w:val="1"/>
+    </w:lvlOverride>
+    <w:lvlOverride w:ilvl="4">
+      <w:startOverride w:val="1"/>
+    </w:lvlOverride>
+    <w:lvlOverride w:ilvl="5">
+      <w:startOverride w:val="1"/>
+    </w:lvlOverride>
+    <w:lvlOverride w:ilvl="6">
+      <w:startOverride w:val="1"/>
+    </w:lvlOverride>
+    <w:lvlOverride w:ilvl="7">
+      <w:startOverride w:val="1"/>
+    </w:lvlOverride>
+    <w:lvlOverride w:ilvl="8">
+      <w:startOverride w:val="1"/>
+    </w:lvlOverride>
   </w:num>
 </w:numbering>
 </file>

</xml_diff>

<commit_message>
Use only 3d6: seed tables, ship hits and the Grimm draught
Seed tables grow from 12 to 16 entries, read by the 3d6 total (3-18):
the existing entries sit at 5-16 and four new rare ones at 3, 4, 17 and
18. The creators' GM tabs, the guides and the Discord bot's /seed all
roll 3d6 and show the total. Ship-system hits and the Chymiater's
draught use 3d6 instead of 1d6. Fracture Lines gets its approved job,
place and trouble tables.

Co-Authored-By: Claude Opus 5.5 <noreply@anthropic.com>
Claude-Session: https://claude.ai/code/session_015SADCFzhKijkC2foUmXrpC
</commit_message>
<xml_diff>
--- a/grimm-west/Grimm_Players_Guide.docx
+++ b/grimm-west/Grimm_Players_Guide.docx
@@ -5958,10 +5958,13 @@
           <w:bCs/>
           <w:b/>
         </w:rPr>
-        <w:t xml:space="preserve">1d6 days</w:t>
-      </w:r>
-      <w:r>
-        <w:t xml:space="preserve">: an Incantare’s Lens, a Hexenbiest’s telekinesis and spells, or a Wesen’s magical signature power. It does not stop a woge.</w:t>
+        <w:t xml:space="preserve">3d6 ÷ 3 days</w:t>
+      </w:r>
+      <w:r>
+        <w:t xml:space="preserve"> </w:t>
+      </w:r>
+      <w:r>
+        <w:t xml:space="preserve">(round down: one to six days): an Incantare’s Lens, a Hexenbiest’s telekinesis and spells, or a Wesen’s magical signature power. It does not stop a woge.</w:t>
       </w:r>
     </w:p>
     <w:p>
@@ -8762,7 +8765,7 @@
         <w:pStyle w:val="FirstParagraph"/>
       </w:pPr>
       <w:r>
-        <w:t xml:space="preserve">Roll 1d12 on each table, or pick what you like: a</w:t>
+        <w:t xml:space="preserve">Roll 3d6 on each table and read the total; middle results come up most often, the strangest sit at 3, 4, 17 and 18, or pick what you like: a</w:t>
       </w:r>
       <w:r>
         <w:t xml:space="preserve"> </w:t>
@@ -8888,7 +8891,7 @@
                 <w:b/>
                 <w:sz w:val="19"/>
               </w:rPr>
-              <w:t xml:space="preserve">d12</w:t>
+              <w:t xml:space="preserve">3d6</w:t>
             </w:r>
           </w:p>
         </w:tc>
@@ -8960,7 +8963,133 @@
                 <w:b/>
                 <w:sz w:val="19"/>
               </w:rPr>
-              <w:t xml:space="preserve">1</w:t>
+              <w:t xml:space="preserve">3</w:t>
+            </w:r>
+          </w:p>
+        </w:tc>
+        <w:tc>
+          <w:tcPr/>
+          <w:p>
+            <w:pPr>
+              <w:pStyle w:val="Compact"/>
+              <w:jc w:val="left"/>
+            </w:pPr>
+            <w:r>
+              <w:rPr>
+                <w:sz w:val="19"/>
+              </w:rPr>
+              <w:t xml:space="preserve">A Grimm’s grave robbed</w:t>
+            </w:r>
+          </w:p>
+        </w:tc>
+        <w:tc>
+          <w:tcPr/>
+          <w:p>
+            <w:pPr>
+              <w:pStyle w:val="Compact"/>
+              <w:jc w:val="left"/>
+            </w:pPr>
+            <w:r>
+              <w:rPr>
+                <w:sz w:val="19"/>
+              </w:rPr>
+              <w:t xml:space="preserve">A Royal Family’s estate</w:t>
+            </w:r>
+          </w:p>
+        </w:tc>
+        <w:tc>
+          <w:tcPr/>
+          <w:p>
+            <w:pPr>
+              <w:pStyle w:val="Compact"/>
+              <w:jc w:val="left"/>
+            </w:pPr>
+            <w:r>
+              <w:rPr>
+                <w:sz w:val="19"/>
+              </w:rPr>
+              <w:t xml:space="preserve">A Hexenbiest queen</w:t>
+            </w:r>
+          </w:p>
+        </w:tc>
+      </w:tr>
+      <w:tr>
+        <w:tc>
+          <w:tcPr/>
+          <w:p>
+            <w:pPr>
+              <w:pStyle w:val="Compact"/>
+              <w:jc w:val="left"/>
+            </w:pPr>
+            <w:r>
+              <w:rPr>
+                <w:b/>
+                <w:sz w:val="19"/>
+              </w:rPr>
+              <w:t xml:space="preserve">4</w:t>
+            </w:r>
+          </w:p>
+        </w:tc>
+        <w:tc>
+          <w:tcPr/>
+          <w:p>
+            <w:pPr>
+              <w:pStyle w:val="Compact"/>
+              <w:jc w:val="left"/>
+            </w:pPr>
+            <w:r>
+              <w:rPr>
+                <w:sz w:val="19"/>
+              </w:rPr>
+              <w:t xml:space="preserve">The Wesen Council summons you</w:t>
+            </w:r>
+          </w:p>
+        </w:tc>
+        <w:tc>
+          <w:tcPr/>
+          <w:p>
+            <w:pPr>
+              <w:pStyle w:val="Compact"/>
+              <w:jc w:val="left"/>
+            </w:pPr>
+            <w:r>
+              <w:rPr>
+                <w:sz w:val="19"/>
+              </w:rPr>
+              <w:t xml:space="preserve">A Wesen fight ring under a church</w:t>
+            </w:r>
+          </w:p>
+        </w:tc>
+        <w:tc>
+          <w:tcPr/>
+          <w:p>
+            <w:pPr>
+              <w:pStyle w:val="Compact"/>
+              <w:jc w:val="left"/>
+            </w:pPr>
+            <w:r>
+              <w:rPr>
+                <w:sz w:val="19"/>
+              </w:rPr>
+              <w:t xml:space="preserve">The Wesen Council itself</w:t>
+            </w:r>
+          </w:p>
+        </w:tc>
+      </w:tr>
+      <w:tr>
+        <w:tc>
+          <w:tcPr/>
+          <w:p>
+            <w:pPr>
+              <w:pStyle w:val="Compact"/>
+              <w:jc w:val="left"/>
+            </w:pPr>
+            <w:r>
+              <w:rPr>
+                <w:b/>
+                <w:sz w:val="19"/>
+              </w:rPr>
+              <w:t xml:space="preserve">5</w:t>
             </w:r>
           </w:p>
         </w:tc>
@@ -9023,7 +9152,7 @@
                 <w:b/>
                 <w:sz w:val="19"/>
               </w:rPr>
-              <w:t xml:space="preserve">2</w:t>
+              <w:t xml:space="preserve">6</w:t>
             </w:r>
           </w:p>
         </w:tc>
@@ -9086,7 +9215,7 @@
                 <w:b/>
                 <w:sz w:val="19"/>
               </w:rPr>
-              <w:t xml:space="preserve">3</w:t>
+              <w:t xml:space="preserve">7</w:t>
             </w:r>
           </w:p>
         </w:tc>
@@ -9149,7 +9278,7 @@
                 <w:b/>
                 <w:sz w:val="19"/>
               </w:rPr>
-              <w:t xml:space="preserve">4</w:t>
+              <w:t xml:space="preserve">8</w:t>
             </w:r>
           </w:p>
         </w:tc>
@@ -9212,7 +9341,7 @@
                 <w:b/>
                 <w:sz w:val="19"/>
               </w:rPr>
-              <w:t xml:space="preserve">5</w:t>
+              <w:t xml:space="preserve">9</w:t>
             </w:r>
           </w:p>
         </w:tc>
@@ -9275,7 +9404,7 @@
                 <w:b/>
                 <w:sz w:val="19"/>
               </w:rPr>
-              <w:t xml:space="preserve">6</w:t>
+              <w:t xml:space="preserve">10</w:t>
             </w:r>
           </w:p>
         </w:tc>
@@ -9338,7 +9467,7 @@
                 <w:b/>
                 <w:sz w:val="19"/>
               </w:rPr>
-              <w:t xml:space="preserve">7</w:t>
+              <w:t xml:space="preserve">11</w:t>
             </w:r>
           </w:p>
         </w:tc>
@@ -9401,7 +9530,7 @@
                 <w:b/>
                 <w:sz w:val="19"/>
               </w:rPr>
-              <w:t xml:space="preserve">8</w:t>
+              <w:t xml:space="preserve">12</w:t>
             </w:r>
           </w:p>
         </w:tc>
@@ -9464,7 +9593,7 @@
                 <w:b/>
                 <w:sz w:val="19"/>
               </w:rPr>
-              <w:t xml:space="preserve">9</w:t>
+              <w:t xml:space="preserve">13</w:t>
             </w:r>
           </w:p>
         </w:tc>
@@ -9527,7 +9656,7 @@
                 <w:b/>
                 <w:sz w:val="19"/>
               </w:rPr>
-              <w:t xml:space="preserve">10</w:t>
+              <w:t xml:space="preserve">14</w:t>
             </w:r>
           </w:p>
         </w:tc>
@@ -9590,7 +9719,7 @@
                 <w:b/>
                 <w:sz w:val="19"/>
               </w:rPr>
-              <w:t xml:space="preserve">11</w:t>
+              <w:t xml:space="preserve">15</w:t>
             </w:r>
           </w:p>
         </w:tc>
@@ -9653,7 +9782,7 @@
                 <w:b/>
                 <w:sz w:val="19"/>
               </w:rPr>
-              <w:t xml:space="preserve">12</w:t>
+              <w:t xml:space="preserve">16</w:t>
             </w:r>
           </w:p>
         </w:tc>
@@ -9699,6 +9828,132 @@
                 <w:sz w:val="19"/>
               </w:rPr>
               <w:t xml:space="preserve">A Golden Dawn magician’s working gone wrong</w:t>
+            </w:r>
+          </w:p>
+        </w:tc>
+      </w:tr>
+      <w:tr>
+        <w:tc>
+          <w:tcPr/>
+          <w:p>
+            <w:pPr>
+              <w:pStyle w:val="Compact"/>
+              <w:jc w:val="left"/>
+            </w:pPr>
+            <w:r>
+              <w:rPr>
+                <w:b/>
+                <w:sz w:val="19"/>
+              </w:rPr>
+              <w:t xml:space="preserve">17</w:t>
+            </w:r>
+          </w:p>
+        </w:tc>
+        <w:tc>
+          <w:tcPr/>
+          <w:p>
+            <w:pPr>
+              <w:pStyle w:val="Compact"/>
+              <w:jc w:val="left"/>
+            </w:pPr>
+            <w:r>
+              <w:rPr>
+                <w:sz w:val="19"/>
+              </w:rPr>
+              <w:t xml:space="preserve">A Royal’s child goes missing</w:t>
+            </w:r>
+          </w:p>
+        </w:tc>
+        <w:tc>
+          <w:tcPr/>
+          <w:p>
+            <w:pPr>
+              <w:pStyle w:val="Compact"/>
+              <w:jc w:val="left"/>
+            </w:pPr>
+            <w:r>
+              <w:rPr>
+                <w:sz w:val="19"/>
+              </w:rPr>
+              <w:t xml:space="preserve">A Grimm’s hidden library</w:t>
+            </w:r>
+          </w:p>
+        </w:tc>
+        <w:tc>
+          <w:tcPr/>
+          <w:p>
+            <w:pPr>
+              <w:pStyle w:val="Compact"/>
+              <w:jc w:val="left"/>
+            </w:pPr>
+            <w:r>
+              <w:rPr>
+                <w:sz w:val="19"/>
+              </w:rPr>
+              <w:t xml:space="preserve">A Grimm gone bad</w:t>
+            </w:r>
+          </w:p>
+        </w:tc>
+      </w:tr>
+      <w:tr>
+        <w:tc>
+          <w:tcPr/>
+          <w:p>
+            <w:pPr>
+              <w:pStyle w:val="Compact"/>
+              <w:jc w:val="left"/>
+            </w:pPr>
+            <w:r>
+              <w:rPr>
+                <w:b/>
+                <w:sz w:val="19"/>
+              </w:rPr>
+              <w:t xml:space="preserve">18</w:t>
+            </w:r>
+          </w:p>
+        </w:tc>
+        <w:tc>
+          <w:tcPr/>
+          <w:p>
+            <w:pPr>
+              <w:pStyle w:val="Compact"/>
+              <w:jc w:val="left"/>
+            </w:pPr>
+            <w:r>
+              <w:rPr>
+                <w:sz w:val="19"/>
+              </w:rPr>
+              <w:t xml:space="preserve">A town where everyone is Wesen</w:t>
+            </w:r>
+          </w:p>
+        </w:tc>
+        <w:tc>
+          <w:tcPr/>
+          <w:p>
+            <w:pPr>
+              <w:pStyle w:val="Compact"/>
+              <w:jc w:val="left"/>
+            </w:pPr>
+            <w:r>
+              <w:rPr>
+                <w:sz w:val="19"/>
+              </w:rPr>
+              <w:t xml:space="preserve">An abandoned asylum</w:t>
+            </w:r>
+          </w:p>
+        </w:tc>
+        <w:tc>
+          <w:tcPr/>
+          <w:p>
+            <w:pPr>
+              <w:pStyle w:val="Compact"/>
+              <w:jc w:val="left"/>
+            </w:pPr>
+            <w:r>
+              <w:rPr>
+                <w:sz w:val="19"/>
+              </w:rPr>
+              <w:t xml:space="preserve">A Zauberbiest’s working</w:t>
             </w:r>
           </w:p>
         </w:tc>
@@ -9744,7 +9999,7 @@
                 <w:b/>
                 <w:sz w:val="19"/>
               </w:rPr>
-              <w:t xml:space="preserve">d12</w:t>
+              <w:t xml:space="preserve">3d6</w:t>
             </w:r>
           </w:p>
         </w:tc>
@@ -9816,7 +10071,133 @@
                 <w:b/>
                 <w:sz w:val="19"/>
               </w:rPr>
-              <w:t xml:space="preserve">1</w:t>
+              <w:t xml:space="preserve">3</w:t>
+            </w:r>
+          </w:p>
+        </w:tc>
+        <w:tc>
+          <w:tcPr/>
+          <w:p>
+            <w:pPr>
+              <w:pStyle w:val="Compact"/>
+              <w:jc w:val="left"/>
+            </w:pPr>
+            <w:r>
+              <w:rPr>
+                <w:sz w:val="19"/>
+              </w:rPr>
+              <w:t xml:space="preserve">A character has Wesen blood</w:t>
+            </w:r>
+          </w:p>
+        </w:tc>
+        <w:tc>
+          <w:tcPr/>
+          <w:p>
+            <w:pPr>
+              <w:pStyle w:val="Compact"/>
+              <w:jc w:val="left"/>
+            </w:pPr>
+            <w:r>
+              <w:rPr>
+                <w:sz w:val="19"/>
+              </w:rPr>
+              <w:t xml:space="preserve">The Royals arrive (6)</w:t>
+            </w:r>
+          </w:p>
+        </w:tc>
+        <w:tc>
+          <w:tcPr/>
+          <w:p>
+            <w:pPr>
+              <w:pStyle w:val="Compact"/>
+              <w:jc w:val="left"/>
+            </w:pPr>
+            <w:r>
+              <w:rPr>
+                <w:sz w:val="19"/>
+              </w:rPr>
+              <w:t xml:space="preserve">A Royal heir in hiding</w:t>
+            </w:r>
+          </w:p>
+        </w:tc>
+      </w:tr>
+      <w:tr>
+        <w:tc>
+          <w:tcPr/>
+          <w:p>
+            <w:pPr>
+              <w:pStyle w:val="Compact"/>
+              <w:jc w:val="left"/>
+            </w:pPr>
+            <w:r>
+              <w:rPr>
+                <w:b/>
+                <w:sz w:val="19"/>
+              </w:rPr>
+              <w:t xml:space="preserve">4</w:t>
+            </w:r>
+          </w:p>
+        </w:tc>
+        <w:tc>
+          <w:tcPr/>
+          <w:p>
+            <w:pPr>
+              <w:pStyle w:val="Compact"/>
+              <w:jc w:val="left"/>
+            </w:pPr>
+            <w:r>
+              <w:rPr>
+                <w:sz w:val="19"/>
+              </w:rPr>
+              <w:t xml:space="preserve">The Grimm is the target</w:t>
+            </w:r>
+          </w:p>
+        </w:tc>
+        <w:tc>
+          <w:tcPr/>
+          <w:p>
+            <w:pPr>
+              <w:pStyle w:val="Compact"/>
+              <w:jc w:val="left"/>
+            </w:pPr>
+            <w:r>
+              <w:rPr>
+                <w:sz w:val="19"/>
+              </w:rPr>
+              <w:t xml:space="preserve">The full moon (4)</w:t>
+            </w:r>
+          </w:p>
+        </w:tc>
+        <w:tc>
+          <w:tcPr/>
+          <w:p>
+            <w:pPr>
+              <w:pStyle w:val="Compact"/>
+              <w:jc w:val="left"/>
+            </w:pPr>
+            <w:r>
+              <w:rPr>
+                <w:sz w:val="19"/>
+              </w:rPr>
+              <w:t xml:space="preserve">A Grimm’s long-lost sibling</w:t>
+            </w:r>
+          </w:p>
+        </w:tc>
+      </w:tr>
+      <w:tr>
+        <w:tc>
+          <w:tcPr/>
+          <w:p>
+            <w:pPr>
+              <w:pStyle w:val="Compact"/>
+              <w:jc w:val="left"/>
+            </w:pPr>
+            <w:r>
+              <w:rPr>
+                <w:b/>
+                <w:sz w:val="19"/>
+              </w:rPr>
+              <w:t xml:space="preserve">5</w:t>
             </w:r>
           </w:p>
         </w:tc>
@@ -9879,7 +10260,7 @@
                 <w:b/>
                 <w:sz w:val="19"/>
               </w:rPr>
-              <w:t xml:space="preserve">2</w:t>
+              <w:t xml:space="preserve">6</w:t>
             </w:r>
           </w:p>
         </w:tc>
@@ -9942,7 +10323,7 @@
                 <w:b/>
                 <w:sz w:val="19"/>
               </w:rPr>
-              <w:t xml:space="preserve">3</w:t>
+              <w:t xml:space="preserve">7</w:t>
             </w:r>
           </w:p>
         </w:tc>
@@ -10005,7 +10386,7 @@
                 <w:b/>
                 <w:sz w:val="19"/>
               </w:rPr>
-              <w:t xml:space="preserve">4</w:t>
+              <w:t xml:space="preserve">8</w:t>
             </w:r>
           </w:p>
         </w:tc>
@@ -10068,7 +10449,7 @@
                 <w:b/>
                 <w:sz w:val="19"/>
               </w:rPr>
-              <w:t xml:space="preserve">5</w:t>
+              <w:t xml:space="preserve">9</w:t>
             </w:r>
           </w:p>
         </w:tc>
@@ -10131,7 +10512,7 @@
                 <w:b/>
                 <w:sz w:val="19"/>
               </w:rPr>
-              <w:t xml:space="preserve">6</w:t>
+              <w:t xml:space="preserve">10</w:t>
             </w:r>
           </w:p>
         </w:tc>
@@ -10194,7 +10575,7 @@
                 <w:b/>
                 <w:sz w:val="19"/>
               </w:rPr>
-              <w:t xml:space="preserve">7</w:t>
+              <w:t xml:space="preserve">11</w:t>
             </w:r>
           </w:p>
         </w:tc>
@@ -10257,7 +10638,7 @@
                 <w:b/>
                 <w:sz w:val="19"/>
               </w:rPr>
-              <w:t xml:space="preserve">8</w:t>
+              <w:t xml:space="preserve">12</w:t>
             </w:r>
           </w:p>
         </w:tc>
@@ -10320,7 +10701,7 @@
                 <w:b/>
                 <w:sz w:val="19"/>
               </w:rPr>
-              <w:t xml:space="preserve">9</w:t>
+              <w:t xml:space="preserve">13</w:t>
             </w:r>
           </w:p>
         </w:tc>
@@ -10383,7 +10764,7 @@
                 <w:b/>
                 <w:sz w:val="19"/>
               </w:rPr>
-              <w:t xml:space="preserve">10</w:t>
+              <w:t xml:space="preserve">14</w:t>
             </w:r>
           </w:p>
         </w:tc>
@@ -10446,7 +10827,7 @@
                 <w:b/>
                 <w:sz w:val="19"/>
               </w:rPr>
-              <w:t xml:space="preserve">11</w:t>
+              <w:t xml:space="preserve">15</w:t>
             </w:r>
           </w:p>
         </w:tc>
@@ -10509,7 +10890,7 @@
                 <w:b/>
                 <w:sz w:val="19"/>
               </w:rPr>
-              <w:t xml:space="preserve">12</w:t>
+              <w:t xml:space="preserve">16</w:t>
             </w:r>
           </w:p>
         </w:tc>
@@ -10555,6 +10936,132 @@
                 <w:sz w:val="19"/>
               </w:rPr>
               <w:t xml:space="preserve">A dying Grimm with a last request</w:t>
+            </w:r>
+          </w:p>
+        </w:tc>
+      </w:tr>
+      <w:tr>
+        <w:tc>
+          <w:tcPr/>
+          <w:p>
+            <w:pPr>
+              <w:pStyle w:val="Compact"/>
+              <w:jc w:val="left"/>
+            </w:pPr>
+            <w:r>
+              <w:rPr>
+                <w:b/>
+                <w:sz w:val="19"/>
+              </w:rPr>
+              <w:t xml:space="preserve">17</w:t>
+            </w:r>
+          </w:p>
+        </w:tc>
+        <w:tc>
+          <w:tcPr/>
+          <w:p>
+            <w:pPr>
+              <w:pStyle w:val="Compact"/>
+              <w:jc w:val="left"/>
+            </w:pPr>
+            <w:r>
+              <w:rPr>
+                <w:sz w:val="19"/>
+              </w:rPr>
+              <w:t xml:space="preserve">The Royals want it to happen</w:t>
+            </w:r>
+          </w:p>
+        </w:tc>
+        <w:tc>
+          <w:tcPr/>
+          <w:p>
+            <w:pPr>
+              <w:pStyle w:val="Compact"/>
+              <w:jc w:val="left"/>
+            </w:pPr>
+            <w:r>
+              <w:rPr>
+                <w:sz w:val="19"/>
+              </w:rPr>
+              <w:t xml:space="preserve">The Reapers’ deadline (4)</w:t>
+            </w:r>
+          </w:p>
+        </w:tc>
+        <w:tc>
+          <w:tcPr/>
+          <w:p>
+            <w:pPr>
+              <w:pStyle w:val="Compact"/>
+              <w:jc w:val="left"/>
+            </w:pPr>
+            <w:r>
+              <w:rPr>
+                <w:sz w:val="19"/>
+              </w:rPr>
+              <w:t xml:space="preserve">A Wesen Council judge</w:t>
+            </w:r>
+          </w:p>
+        </w:tc>
+      </w:tr>
+      <w:tr>
+        <w:tc>
+          <w:tcPr/>
+          <w:p>
+            <w:pPr>
+              <w:pStyle w:val="Compact"/>
+              <w:jc w:val="left"/>
+            </w:pPr>
+            <w:r>
+              <w:rPr>
+                <w:b/>
+                <w:sz w:val="19"/>
+              </w:rPr>
+              <w:t xml:space="preserve">18</w:t>
+            </w:r>
+          </w:p>
+        </w:tc>
+        <w:tc>
+          <w:tcPr/>
+          <w:p>
+            <w:pPr>
+              <w:pStyle w:val="Compact"/>
+              <w:jc w:val="left"/>
+            </w:pPr>
+            <w:r>
+              <w:rPr>
+                <w:sz w:val="19"/>
+              </w:rPr>
+              <w:t xml:space="preserve">The Council wanted the Grimm to find it</w:t>
+            </w:r>
+          </w:p>
+        </w:tc>
+        <w:tc>
+          <w:tcPr/>
+          <w:p>
+            <w:pPr>
+              <w:pStyle w:val="Compact"/>
+              <w:jc w:val="left"/>
+            </w:pPr>
+            <w:r>
+              <w:rPr>
+                <w:sz w:val="19"/>
+              </w:rPr>
+              <w:t xml:space="preserve">The Council’s verdict (6)</w:t>
+            </w:r>
+          </w:p>
+        </w:tc>
+        <w:tc>
+          <w:tcPr/>
+          <w:p>
+            <w:pPr>
+              <w:pStyle w:val="Compact"/>
+              <w:jc w:val="left"/>
+            </w:pPr>
+            <w:r>
+              <w:rPr>
+                <w:sz w:val="19"/>
+              </w:rPr>
+              <w:t xml:space="preserve">A Hexenbiest who wants out</w:t>
             </w:r>
           </w:p>
         </w:tc>

</xml_diff>

<commit_message>
Use only 3d6: 16-entry seed tables read by the 3d6 total
Co-Authored-By: Claude Opus 5.5 <noreply@anthropic.com>
Claude-Session: https://claude.ai/code/session_015SADCFzhKijkC2foUmXrpC
</commit_message>
<xml_diff>
--- a/grimm-west/Grimm_Players_Guide.docx
+++ b/grimm-west/Grimm_Players_Guide.docx
@@ -5958,10 +5958,13 @@
           <w:bCs/>
           <w:b/>
         </w:rPr>
-        <w:t xml:space="preserve">1d6 days</w:t>
-      </w:r>
-      <w:r>
-        <w:t xml:space="preserve">: an Incantare’s Lens, a Hexenbiest’s telekinesis and spells, or a Wesen’s magical signature power. It does not stop a woge.</w:t>
+        <w:t xml:space="preserve">3d6 ÷ 3 days</w:t>
+      </w:r>
+      <w:r>
+        <w:t xml:space="preserve"> </w:t>
+      </w:r>
+      <w:r>
+        <w:t xml:space="preserve">(round down: one to six days): an Incantare’s Lens, a Hexenbiest’s telekinesis and spells, or a Wesen’s magical signature power. It does not stop a woge.</w:t>
       </w:r>
     </w:p>
     <w:p>
@@ -8762,7 +8765,7 @@
         <w:pStyle w:val="FirstParagraph"/>
       </w:pPr>
       <w:r>
-        <w:t xml:space="preserve">Roll 1d12 on each table, or pick what you like: a</w:t>
+        <w:t xml:space="preserve">Roll 3d6 on each table and read the total; middle results come up most often, the strangest sit at 3, 4, 17 and 18, or pick what you like: a</w:t>
       </w:r>
       <w:r>
         <w:t xml:space="preserve"> </w:t>
@@ -8888,7 +8891,7 @@
                 <w:b/>
                 <w:sz w:val="19"/>
               </w:rPr>
-              <w:t xml:space="preserve">d12</w:t>
+              <w:t xml:space="preserve">3d6</w:t>
             </w:r>
           </w:p>
         </w:tc>
@@ -8960,7 +8963,133 @@
                 <w:b/>
                 <w:sz w:val="19"/>
               </w:rPr>
-              <w:t xml:space="preserve">1</w:t>
+              <w:t xml:space="preserve">3</w:t>
+            </w:r>
+          </w:p>
+        </w:tc>
+        <w:tc>
+          <w:tcPr/>
+          <w:p>
+            <w:pPr>
+              <w:pStyle w:val="Compact"/>
+              <w:jc w:val="left"/>
+            </w:pPr>
+            <w:r>
+              <w:rPr>
+                <w:sz w:val="19"/>
+              </w:rPr>
+              <w:t xml:space="preserve">A Grimm’s grave robbed</w:t>
+            </w:r>
+          </w:p>
+        </w:tc>
+        <w:tc>
+          <w:tcPr/>
+          <w:p>
+            <w:pPr>
+              <w:pStyle w:val="Compact"/>
+              <w:jc w:val="left"/>
+            </w:pPr>
+            <w:r>
+              <w:rPr>
+                <w:sz w:val="19"/>
+              </w:rPr>
+              <w:t xml:space="preserve">A Royal Family’s estate</w:t>
+            </w:r>
+          </w:p>
+        </w:tc>
+        <w:tc>
+          <w:tcPr/>
+          <w:p>
+            <w:pPr>
+              <w:pStyle w:val="Compact"/>
+              <w:jc w:val="left"/>
+            </w:pPr>
+            <w:r>
+              <w:rPr>
+                <w:sz w:val="19"/>
+              </w:rPr>
+              <w:t xml:space="preserve">A Hexenbiest queen</w:t>
+            </w:r>
+          </w:p>
+        </w:tc>
+      </w:tr>
+      <w:tr>
+        <w:tc>
+          <w:tcPr/>
+          <w:p>
+            <w:pPr>
+              <w:pStyle w:val="Compact"/>
+              <w:jc w:val="left"/>
+            </w:pPr>
+            <w:r>
+              <w:rPr>
+                <w:b/>
+                <w:sz w:val="19"/>
+              </w:rPr>
+              <w:t xml:space="preserve">4</w:t>
+            </w:r>
+          </w:p>
+        </w:tc>
+        <w:tc>
+          <w:tcPr/>
+          <w:p>
+            <w:pPr>
+              <w:pStyle w:val="Compact"/>
+              <w:jc w:val="left"/>
+            </w:pPr>
+            <w:r>
+              <w:rPr>
+                <w:sz w:val="19"/>
+              </w:rPr>
+              <w:t xml:space="preserve">The Wesen Council summons you</w:t>
+            </w:r>
+          </w:p>
+        </w:tc>
+        <w:tc>
+          <w:tcPr/>
+          <w:p>
+            <w:pPr>
+              <w:pStyle w:val="Compact"/>
+              <w:jc w:val="left"/>
+            </w:pPr>
+            <w:r>
+              <w:rPr>
+                <w:sz w:val="19"/>
+              </w:rPr>
+              <w:t xml:space="preserve">A Wesen fight ring under a church</w:t>
+            </w:r>
+          </w:p>
+        </w:tc>
+        <w:tc>
+          <w:tcPr/>
+          <w:p>
+            <w:pPr>
+              <w:pStyle w:val="Compact"/>
+              <w:jc w:val="left"/>
+            </w:pPr>
+            <w:r>
+              <w:rPr>
+                <w:sz w:val="19"/>
+              </w:rPr>
+              <w:t xml:space="preserve">The Wesen Council itself</w:t>
+            </w:r>
+          </w:p>
+        </w:tc>
+      </w:tr>
+      <w:tr>
+        <w:tc>
+          <w:tcPr/>
+          <w:p>
+            <w:pPr>
+              <w:pStyle w:val="Compact"/>
+              <w:jc w:val="left"/>
+            </w:pPr>
+            <w:r>
+              <w:rPr>
+                <w:b/>
+                <w:sz w:val="19"/>
+              </w:rPr>
+              <w:t xml:space="preserve">5</w:t>
             </w:r>
           </w:p>
         </w:tc>
@@ -9023,7 +9152,7 @@
                 <w:b/>
                 <w:sz w:val="19"/>
               </w:rPr>
-              <w:t xml:space="preserve">2</w:t>
+              <w:t xml:space="preserve">6</w:t>
             </w:r>
           </w:p>
         </w:tc>
@@ -9086,7 +9215,7 @@
                 <w:b/>
                 <w:sz w:val="19"/>
               </w:rPr>
-              <w:t xml:space="preserve">3</w:t>
+              <w:t xml:space="preserve">7</w:t>
             </w:r>
           </w:p>
         </w:tc>
@@ -9149,7 +9278,7 @@
                 <w:b/>
                 <w:sz w:val="19"/>
               </w:rPr>
-              <w:t xml:space="preserve">4</w:t>
+              <w:t xml:space="preserve">8</w:t>
             </w:r>
           </w:p>
         </w:tc>
@@ -9212,7 +9341,7 @@
                 <w:b/>
                 <w:sz w:val="19"/>
               </w:rPr>
-              <w:t xml:space="preserve">5</w:t>
+              <w:t xml:space="preserve">9</w:t>
             </w:r>
           </w:p>
         </w:tc>
@@ -9275,7 +9404,7 @@
                 <w:b/>
                 <w:sz w:val="19"/>
               </w:rPr>
-              <w:t xml:space="preserve">6</w:t>
+              <w:t xml:space="preserve">10</w:t>
             </w:r>
           </w:p>
         </w:tc>
@@ -9338,7 +9467,7 @@
                 <w:b/>
                 <w:sz w:val="19"/>
               </w:rPr>
-              <w:t xml:space="preserve">7</w:t>
+              <w:t xml:space="preserve">11</w:t>
             </w:r>
           </w:p>
         </w:tc>
@@ -9401,7 +9530,7 @@
                 <w:b/>
                 <w:sz w:val="19"/>
               </w:rPr>
-              <w:t xml:space="preserve">8</w:t>
+              <w:t xml:space="preserve">12</w:t>
             </w:r>
           </w:p>
         </w:tc>
@@ -9464,7 +9593,7 @@
                 <w:b/>
                 <w:sz w:val="19"/>
               </w:rPr>
-              <w:t xml:space="preserve">9</w:t>
+              <w:t xml:space="preserve">13</w:t>
             </w:r>
           </w:p>
         </w:tc>
@@ -9527,7 +9656,7 @@
                 <w:b/>
                 <w:sz w:val="19"/>
               </w:rPr>
-              <w:t xml:space="preserve">10</w:t>
+              <w:t xml:space="preserve">14</w:t>
             </w:r>
           </w:p>
         </w:tc>
@@ -9590,7 +9719,7 @@
                 <w:b/>
                 <w:sz w:val="19"/>
               </w:rPr>
-              <w:t xml:space="preserve">11</w:t>
+              <w:t xml:space="preserve">15</w:t>
             </w:r>
           </w:p>
         </w:tc>
@@ -9653,7 +9782,7 @@
                 <w:b/>
                 <w:sz w:val="19"/>
               </w:rPr>
-              <w:t xml:space="preserve">12</w:t>
+              <w:t xml:space="preserve">16</w:t>
             </w:r>
           </w:p>
         </w:tc>
@@ -9699,6 +9828,132 @@
                 <w:sz w:val="19"/>
               </w:rPr>
               <w:t xml:space="preserve">A Golden Dawn magician’s working gone wrong</w:t>
+            </w:r>
+          </w:p>
+        </w:tc>
+      </w:tr>
+      <w:tr>
+        <w:tc>
+          <w:tcPr/>
+          <w:p>
+            <w:pPr>
+              <w:pStyle w:val="Compact"/>
+              <w:jc w:val="left"/>
+            </w:pPr>
+            <w:r>
+              <w:rPr>
+                <w:b/>
+                <w:sz w:val="19"/>
+              </w:rPr>
+              <w:t xml:space="preserve">17</w:t>
+            </w:r>
+          </w:p>
+        </w:tc>
+        <w:tc>
+          <w:tcPr/>
+          <w:p>
+            <w:pPr>
+              <w:pStyle w:val="Compact"/>
+              <w:jc w:val="left"/>
+            </w:pPr>
+            <w:r>
+              <w:rPr>
+                <w:sz w:val="19"/>
+              </w:rPr>
+              <w:t xml:space="preserve">A Royal’s child goes missing</w:t>
+            </w:r>
+          </w:p>
+        </w:tc>
+        <w:tc>
+          <w:tcPr/>
+          <w:p>
+            <w:pPr>
+              <w:pStyle w:val="Compact"/>
+              <w:jc w:val="left"/>
+            </w:pPr>
+            <w:r>
+              <w:rPr>
+                <w:sz w:val="19"/>
+              </w:rPr>
+              <w:t xml:space="preserve">A Grimm’s hidden library</w:t>
+            </w:r>
+          </w:p>
+        </w:tc>
+        <w:tc>
+          <w:tcPr/>
+          <w:p>
+            <w:pPr>
+              <w:pStyle w:val="Compact"/>
+              <w:jc w:val="left"/>
+            </w:pPr>
+            <w:r>
+              <w:rPr>
+                <w:sz w:val="19"/>
+              </w:rPr>
+              <w:t xml:space="preserve">A Grimm gone bad</w:t>
+            </w:r>
+          </w:p>
+        </w:tc>
+      </w:tr>
+      <w:tr>
+        <w:tc>
+          <w:tcPr/>
+          <w:p>
+            <w:pPr>
+              <w:pStyle w:val="Compact"/>
+              <w:jc w:val="left"/>
+            </w:pPr>
+            <w:r>
+              <w:rPr>
+                <w:b/>
+                <w:sz w:val="19"/>
+              </w:rPr>
+              <w:t xml:space="preserve">18</w:t>
+            </w:r>
+          </w:p>
+        </w:tc>
+        <w:tc>
+          <w:tcPr/>
+          <w:p>
+            <w:pPr>
+              <w:pStyle w:val="Compact"/>
+              <w:jc w:val="left"/>
+            </w:pPr>
+            <w:r>
+              <w:rPr>
+                <w:sz w:val="19"/>
+              </w:rPr>
+              <w:t xml:space="preserve">A town where everyone is Wesen</w:t>
+            </w:r>
+          </w:p>
+        </w:tc>
+        <w:tc>
+          <w:tcPr/>
+          <w:p>
+            <w:pPr>
+              <w:pStyle w:val="Compact"/>
+              <w:jc w:val="left"/>
+            </w:pPr>
+            <w:r>
+              <w:rPr>
+                <w:sz w:val="19"/>
+              </w:rPr>
+              <w:t xml:space="preserve">An abandoned asylum</w:t>
+            </w:r>
+          </w:p>
+        </w:tc>
+        <w:tc>
+          <w:tcPr/>
+          <w:p>
+            <w:pPr>
+              <w:pStyle w:val="Compact"/>
+              <w:jc w:val="left"/>
+            </w:pPr>
+            <w:r>
+              <w:rPr>
+                <w:sz w:val="19"/>
+              </w:rPr>
+              <w:t xml:space="preserve">A Zauberbiest’s working</w:t>
             </w:r>
           </w:p>
         </w:tc>
@@ -9744,7 +9999,7 @@
                 <w:b/>
                 <w:sz w:val="19"/>
               </w:rPr>
-              <w:t xml:space="preserve">d12</w:t>
+              <w:t xml:space="preserve">3d6</w:t>
             </w:r>
           </w:p>
         </w:tc>
@@ -9816,7 +10071,133 @@
                 <w:b/>
                 <w:sz w:val="19"/>
               </w:rPr>
-              <w:t xml:space="preserve">1</w:t>
+              <w:t xml:space="preserve">3</w:t>
+            </w:r>
+          </w:p>
+        </w:tc>
+        <w:tc>
+          <w:tcPr/>
+          <w:p>
+            <w:pPr>
+              <w:pStyle w:val="Compact"/>
+              <w:jc w:val="left"/>
+            </w:pPr>
+            <w:r>
+              <w:rPr>
+                <w:sz w:val="19"/>
+              </w:rPr>
+              <w:t xml:space="preserve">A character has Wesen blood</w:t>
+            </w:r>
+          </w:p>
+        </w:tc>
+        <w:tc>
+          <w:tcPr/>
+          <w:p>
+            <w:pPr>
+              <w:pStyle w:val="Compact"/>
+              <w:jc w:val="left"/>
+            </w:pPr>
+            <w:r>
+              <w:rPr>
+                <w:sz w:val="19"/>
+              </w:rPr>
+              <w:t xml:space="preserve">The Royals arrive (6)</w:t>
+            </w:r>
+          </w:p>
+        </w:tc>
+        <w:tc>
+          <w:tcPr/>
+          <w:p>
+            <w:pPr>
+              <w:pStyle w:val="Compact"/>
+              <w:jc w:val="left"/>
+            </w:pPr>
+            <w:r>
+              <w:rPr>
+                <w:sz w:val="19"/>
+              </w:rPr>
+              <w:t xml:space="preserve">A Royal heir in hiding</w:t>
+            </w:r>
+          </w:p>
+        </w:tc>
+      </w:tr>
+      <w:tr>
+        <w:tc>
+          <w:tcPr/>
+          <w:p>
+            <w:pPr>
+              <w:pStyle w:val="Compact"/>
+              <w:jc w:val="left"/>
+            </w:pPr>
+            <w:r>
+              <w:rPr>
+                <w:b/>
+                <w:sz w:val="19"/>
+              </w:rPr>
+              <w:t xml:space="preserve">4</w:t>
+            </w:r>
+          </w:p>
+        </w:tc>
+        <w:tc>
+          <w:tcPr/>
+          <w:p>
+            <w:pPr>
+              <w:pStyle w:val="Compact"/>
+              <w:jc w:val="left"/>
+            </w:pPr>
+            <w:r>
+              <w:rPr>
+                <w:sz w:val="19"/>
+              </w:rPr>
+              <w:t xml:space="preserve">The Grimm is the target</w:t>
+            </w:r>
+          </w:p>
+        </w:tc>
+        <w:tc>
+          <w:tcPr/>
+          <w:p>
+            <w:pPr>
+              <w:pStyle w:val="Compact"/>
+              <w:jc w:val="left"/>
+            </w:pPr>
+            <w:r>
+              <w:rPr>
+                <w:sz w:val="19"/>
+              </w:rPr>
+              <w:t xml:space="preserve">The full moon (4)</w:t>
+            </w:r>
+          </w:p>
+        </w:tc>
+        <w:tc>
+          <w:tcPr/>
+          <w:p>
+            <w:pPr>
+              <w:pStyle w:val="Compact"/>
+              <w:jc w:val="left"/>
+            </w:pPr>
+            <w:r>
+              <w:rPr>
+                <w:sz w:val="19"/>
+              </w:rPr>
+              <w:t xml:space="preserve">A Grimm’s long-lost sibling</w:t>
+            </w:r>
+          </w:p>
+        </w:tc>
+      </w:tr>
+      <w:tr>
+        <w:tc>
+          <w:tcPr/>
+          <w:p>
+            <w:pPr>
+              <w:pStyle w:val="Compact"/>
+              <w:jc w:val="left"/>
+            </w:pPr>
+            <w:r>
+              <w:rPr>
+                <w:b/>
+                <w:sz w:val="19"/>
+              </w:rPr>
+              <w:t xml:space="preserve">5</w:t>
             </w:r>
           </w:p>
         </w:tc>
@@ -9879,7 +10260,7 @@
                 <w:b/>
                 <w:sz w:val="19"/>
               </w:rPr>
-              <w:t xml:space="preserve">2</w:t>
+              <w:t xml:space="preserve">6</w:t>
             </w:r>
           </w:p>
         </w:tc>
@@ -9942,7 +10323,7 @@
                 <w:b/>
                 <w:sz w:val="19"/>
               </w:rPr>
-              <w:t xml:space="preserve">3</w:t>
+              <w:t xml:space="preserve">7</w:t>
             </w:r>
           </w:p>
         </w:tc>
@@ -10005,7 +10386,7 @@
                 <w:b/>
                 <w:sz w:val="19"/>
               </w:rPr>
-              <w:t xml:space="preserve">4</w:t>
+              <w:t xml:space="preserve">8</w:t>
             </w:r>
           </w:p>
         </w:tc>
@@ -10068,7 +10449,7 @@
                 <w:b/>
                 <w:sz w:val="19"/>
               </w:rPr>
-              <w:t xml:space="preserve">5</w:t>
+              <w:t xml:space="preserve">9</w:t>
             </w:r>
           </w:p>
         </w:tc>
@@ -10131,7 +10512,7 @@
                 <w:b/>
                 <w:sz w:val="19"/>
               </w:rPr>
-              <w:t xml:space="preserve">6</w:t>
+              <w:t xml:space="preserve">10</w:t>
             </w:r>
           </w:p>
         </w:tc>
@@ -10194,7 +10575,7 @@
                 <w:b/>
                 <w:sz w:val="19"/>
               </w:rPr>
-              <w:t xml:space="preserve">7</w:t>
+              <w:t xml:space="preserve">11</w:t>
             </w:r>
           </w:p>
         </w:tc>
@@ -10257,7 +10638,7 @@
                 <w:b/>
                 <w:sz w:val="19"/>
               </w:rPr>
-              <w:t xml:space="preserve">8</w:t>
+              <w:t xml:space="preserve">12</w:t>
             </w:r>
           </w:p>
         </w:tc>
@@ -10320,7 +10701,7 @@
                 <w:b/>
                 <w:sz w:val="19"/>
               </w:rPr>
-              <w:t xml:space="preserve">9</w:t>
+              <w:t xml:space="preserve">13</w:t>
             </w:r>
           </w:p>
         </w:tc>
@@ -10383,7 +10764,7 @@
                 <w:b/>
                 <w:sz w:val="19"/>
               </w:rPr>
-              <w:t xml:space="preserve">10</w:t>
+              <w:t xml:space="preserve">14</w:t>
             </w:r>
           </w:p>
         </w:tc>
@@ -10446,7 +10827,7 @@
                 <w:b/>
                 <w:sz w:val="19"/>
               </w:rPr>
-              <w:t xml:space="preserve">11</w:t>
+              <w:t xml:space="preserve">15</w:t>
             </w:r>
           </w:p>
         </w:tc>
@@ -10509,7 +10890,7 @@
                 <w:b/>
                 <w:sz w:val="19"/>
               </w:rPr>
-              <w:t xml:space="preserve">12</w:t>
+              <w:t xml:space="preserve">16</w:t>
             </w:r>
           </w:p>
         </w:tc>
@@ -10555,6 +10936,132 @@
                 <w:sz w:val="19"/>
               </w:rPr>
               <w:t xml:space="preserve">A dying Grimm with a last request</w:t>
+            </w:r>
+          </w:p>
+        </w:tc>
+      </w:tr>
+      <w:tr>
+        <w:tc>
+          <w:tcPr/>
+          <w:p>
+            <w:pPr>
+              <w:pStyle w:val="Compact"/>
+              <w:jc w:val="left"/>
+            </w:pPr>
+            <w:r>
+              <w:rPr>
+                <w:b/>
+                <w:sz w:val="19"/>
+              </w:rPr>
+              <w:t xml:space="preserve">17</w:t>
+            </w:r>
+          </w:p>
+        </w:tc>
+        <w:tc>
+          <w:tcPr/>
+          <w:p>
+            <w:pPr>
+              <w:pStyle w:val="Compact"/>
+              <w:jc w:val="left"/>
+            </w:pPr>
+            <w:r>
+              <w:rPr>
+                <w:sz w:val="19"/>
+              </w:rPr>
+              <w:t xml:space="preserve">The Royals want it to happen</w:t>
+            </w:r>
+          </w:p>
+        </w:tc>
+        <w:tc>
+          <w:tcPr/>
+          <w:p>
+            <w:pPr>
+              <w:pStyle w:val="Compact"/>
+              <w:jc w:val="left"/>
+            </w:pPr>
+            <w:r>
+              <w:rPr>
+                <w:sz w:val="19"/>
+              </w:rPr>
+              <w:t xml:space="preserve">The Reapers’ deadline (4)</w:t>
+            </w:r>
+          </w:p>
+        </w:tc>
+        <w:tc>
+          <w:tcPr/>
+          <w:p>
+            <w:pPr>
+              <w:pStyle w:val="Compact"/>
+              <w:jc w:val="left"/>
+            </w:pPr>
+            <w:r>
+              <w:rPr>
+                <w:sz w:val="19"/>
+              </w:rPr>
+              <w:t xml:space="preserve">A Wesen Council judge</w:t>
+            </w:r>
+          </w:p>
+        </w:tc>
+      </w:tr>
+      <w:tr>
+        <w:tc>
+          <w:tcPr/>
+          <w:p>
+            <w:pPr>
+              <w:pStyle w:val="Compact"/>
+              <w:jc w:val="left"/>
+            </w:pPr>
+            <w:r>
+              <w:rPr>
+                <w:b/>
+                <w:sz w:val="19"/>
+              </w:rPr>
+              <w:t xml:space="preserve">18</w:t>
+            </w:r>
+          </w:p>
+        </w:tc>
+        <w:tc>
+          <w:tcPr/>
+          <w:p>
+            <w:pPr>
+              <w:pStyle w:val="Compact"/>
+              <w:jc w:val="left"/>
+            </w:pPr>
+            <w:r>
+              <w:rPr>
+                <w:sz w:val="19"/>
+              </w:rPr>
+              <w:t xml:space="preserve">The Council wanted the Grimm to find it</w:t>
+            </w:r>
+          </w:p>
+        </w:tc>
+        <w:tc>
+          <w:tcPr/>
+          <w:p>
+            <w:pPr>
+              <w:pStyle w:val="Compact"/>
+              <w:jc w:val="left"/>
+            </w:pPr>
+            <w:r>
+              <w:rPr>
+                <w:sz w:val="19"/>
+              </w:rPr>
+              <w:t xml:space="preserve">The Council’s verdict (6)</w:t>
+            </w:r>
+          </w:p>
+        </w:tc>
+        <w:tc>
+          <w:tcPr/>
+          <w:p>
+            <w:pPr>
+              <w:pStyle w:val="Compact"/>
+              <w:jc w:val="left"/>
+            </w:pPr>
+            <w:r>
+              <w:rPr>
+                <w:sz w:val="19"/>
+              </w:rPr>
+              <w:t xml:space="preserve">A Hexenbiest who wants out</w:t>
             </w:r>
           </w:p>
         </w:tc>

</xml_diff>

<commit_message>
Move the Discord commands out of the guides into a handout per game
Each game now has discord-commands.html, a players-first page in the look of its creator.
The guides, Core Rules and creators no longer mention the bot.

Co-Authored-By: Claude Opus 5.5 <noreply@anthropic.com>
Claude-Session: https://claude.ai/code/session_015SADCFzhKijkC2foUmXrpC
</commit_message>
<xml_diff>
--- a/grimm-west/Grimm_Players_Guide.docx
+++ b/grimm-west/Grimm_Players_Guide.docx
@@ -25114,1154 +25114,6 @@
       </w:r>
     </w:p>
     <w:bookmarkEnd w:id="119"/>
-    <w:bookmarkStart w:id="122" w:name="discord-commands"/>
-    <w:p>
-      <w:pPr>
-        <w:pStyle w:val="Heading1"/>
-      </w:pPr>
-      <w:r>
-        <w:t xml:space="preserve">Discord commands</w:t>
-      </w:r>
-    </w:p>
-    <w:p>
-      <w:pPr>
-        <w:pStyle w:val="FirstParagraph"/>
-      </w:pPr>
-      <w:r>
-        <w:t xml:space="preserve">The table’s Discord bot rolls the dice and keeps the shared Grit points, clocks and Trouble tracks for the server. Type</w:t>
-      </w:r>
-      <w:r>
-        <w:t xml:space="preserve"> </w:t>
-      </w:r>
-      <w:r>
-        <w:rPr>
-          <w:rStyle w:val="VerbatimChar"/>
-        </w:rPr>
-        <w:t xml:space="preserve">/</w:t>
-      </w:r>
-      <w:r>
-        <w:t xml:space="preserve"> </w:t>
-      </w:r>
-      <w:r>
-        <w:t xml:space="preserve">in a channel to see the commands; Discord shows each option as you fill it in. The bot doesn’t know your sheet, so you give it the target number.</w:t>
-      </w:r>
-    </w:p>
-    <w:bookmarkStart w:id="120" w:name="for-players"/>
-    <w:p>
-      <w:pPr>
-        <w:pStyle w:val="Heading2"/>
-      </w:pPr>
-      <w:r>
-        <w:t xml:space="preserve">For players</w:t>
-      </w:r>
-    </w:p>
-    <w:tbl>
-      <w:tblPr>
-        <w:tblStyle w:val="Table"/>
-        <w:tblW w:type="pct" w:w="5000"/>
-        <w:tblLook w:firstRow="1" w:lastRow="0" w:firstColumn="0" w:lastColumn="0" w:noHBand="0" w:noVBand="0" w:val="0020"/>
-        <w:jc w:val="start"/>
-        <w:tblBorders>
-          <w:top w:val="single" w:sz="4" w:color="B8C2D3"/>
-          <w:left w:val="single" w:sz="4" w:color="B8C2D3"/>
-          <w:bottom w:val="single" w:sz="4" w:color="B8C2D3"/>
-          <w:right w:val="single" w:sz="4" w:color="B8C2D3"/>
-          <w:insideH w:val="single" w:sz="4" w:color="B8C2D3"/>
-          <w:insideV w:val="single" w:sz="4" w:color="B8C2D3"/>
-        </w:tblBorders>
-      </w:tblPr>
-      <w:tblGrid>
-        <w:gridCol w:w="3960"/>
-        <w:gridCol w:w="3960"/>
-      </w:tblGrid>
-      <w:tr>
-        <w:trPr>
-          <w:tblHeader w:val="true"/>
-        </w:trPr>
-        <w:tc>
-          <w:tcPr>
-            <w:shd w:val="clear" w:fill="F1E6D2"/>
-          </w:tcPr>
-          <w:p>
-            <w:pPr>
-              <w:pStyle w:val="Compact"/>
-              <w:jc w:val="left"/>
-            </w:pPr>
-            <w:r>
-              <w:rPr>
-                <w:b/>
-                <w:sz w:val="19"/>
-              </w:rPr>
-              <w:t xml:space="preserve">Command</w:t>
-            </w:r>
-          </w:p>
-        </w:tc>
-        <w:tc>
-          <w:tcPr>
-            <w:shd w:val="clear" w:fill="F1E6D2"/>
-          </w:tcPr>
-          <w:p>
-            <w:pPr>
-              <w:pStyle w:val="Compact"/>
-              <w:jc w:val="left"/>
-            </w:pPr>
-            <w:r>
-              <w:rPr>
-                <w:b/>
-                <w:sz w:val="19"/>
-              </w:rPr>
-              <w:t xml:space="preserve">What it does</w:t>
-            </w:r>
-          </w:p>
-        </w:tc>
-      </w:tr>
-      <w:tr>
-        <w:tc>
-          <w:tcPr/>
-          <w:p>
-            <w:pPr>
-              <w:pStyle w:val="Compact"/>
-              <w:jc w:val="left"/>
-            </w:pPr>
-            <w:r>
-              <w:rPr>
-                <w:rStyle w:val="VerbatimChar"/>
-                <w:b/>
-                <w:sz w:val="19"/>
-              </w:rPr>
-              <w:t xml:space="preserve">/roll target:13 modifier:-2 label:Tracking</w:t>
-            </w:r>
-          </w:p>
-        </w:tc>
-        <w:tc>
-          <w:tcPr/>
-          <w:p>
-            <w:pPr>
-              <w:pStyle w:val="Compact"/>
-              <w:jc w:val="left"/>
-            </w:pPr>
-            <w:r>
-              <w:rPr>
-                <w:sz w:val="19"/>
-              </w:rPr>
-              <w:t xml:space="preserve">Roll 3d6 under your target. Use the number from your sheet, and add up every modifier yourself: circumstance, injury, assistance. The bot shows the result, the margin and your chance.</w:t>
-            </w:r>
-            <w:r>
-              <w:rPr>
-                <w:sz w:val="19"/>
-              </w:rPr>
-              <w:t xml:space="preserve"> </w:t>
-            </w:r>
-            <w:r>
-              <w:rPr>
-                <w:bCs/>
-                <w:b/>
-                <w:sz w:val="19"/>
-              </w:rPr>
-              <w:t xml:space="preserve">Spend a Grit point to reroll</w:t>
-            </w:r>
-            <w:r>
-              <w:rPr>
-                <w:sz w:val="19"/>
-              </w:rPr>
-              <w:t xml:space="preserve"> </w:t>
-            </w:r>
-            <w:r>
-              <w:rPr>
-                <w:sz w:val="19"/>
-              </w:rPr>
-              <w:t xml:space="preserve">lets you reroll once, and the second result stands.</w:t>
-            </w:r>
-          </w:p>
-        </w:tc>
-      </w:tr>
-      <w:tr>
-        <w:tc>
-          <w:tcPr/>
-          <w:p>
-            <w:pPr>
-              <w:pStyle w:val="Compact"/>
-              <w:jc w:val="left"/>
-            </w:pPr>
-            <w:r>
-              <w:rPr>
-                <w:rStyle w:val="VerbatimChar"/>
-                <w:b/>
-                <w:sz w:val="19"/>
-              </w:rPr>
-              <w:t xml:space="preserve">/contest target:13 opponent:14 opponent_name:"Blutbad" label:Grapple</w:t>
-            </w:r>
-          </w:p>
-        </w:tc>
-        <w:tc>
-          <w:tcPr/>
-          <w:p>
-            <w:pPr>
-              <w:pStyle w:val="Compact"/>
-              <w:jc w:val="left"/>
-            </w:pPr>
-            <w:r>
-              <w:rPr>
-                <w:sz w:val="19"/>
-              </w:rPr>
-              <w:t xml:space="preserve">An opposed roll. The bot rolls both sides and names the winner. Ties and double failures go to the defender, which is the opponent unless you add</w:t>
-            </w:r>
-            <w:r>
-              <w:rPr>
-                <w:sz w:val="19"/>
-              </w:rPr>
-              <w:t xml:space="preserve"> </w:t>
-            </w:r>
-            <w:r>
-              <w:rPr>
-                <w:rStyle w:val="VerbatimChar"/>
-                <w:sz w:val="19"/>
-              </w:rPr>
-              <w:t xml:space="preserve">defender:me</w:t>
-            </w:r>
-            <w:r>
-              <w:rPr>
-                <w:sz w:val="19"/>
-              </w:rPr>
-              <w:t xml:space="preserve">.</w:t>
-            </w:r>
-          </w:p>
-        </w:tc>
-      </w:tr>
-      <w:tr>
-        <w:tc>
-          <w:tcPr/>
-          <w:p>
-            <w:pPr>
-              <w:pStyle w:val="Compact"/>
-              <w:jc w:val="left"/>
-            </w:pPr>
-            <w:r>
-              <w:rPr>
-                <w:rStyle w:val="VerbatimChar"/>
-                <w:b/>
-                <w:sz w:val="19"/>
-              </w:rPr>
-              <w:t xml:space="preserve">/assist target:12 helper_target:14 helper:@name label:"Hold the door"</w:t>
-            </w:r>
-          </w:p>
-        </w:tc>
-        <w:tc>
-          <w:tcPr/>
-          <w:p>
-            <w:pPr>
-              <w:pStyle w:val="Compact"/>
-              <w:jc w:val="left"/>
-            </w:pPr>
-            <w:r>
-              <w:rPr>
-                <w:sz w:val="19"/>
-              </w:rPr>
-              <w:t xml:space="preserve">Someone helps you. They roll first (Athletics, say): success gives +1, success by 5 or more +2, and a natural 18 brings a complication. Then you roll with their bonus.</w:t>
-            </w:r>
-          </w:p>
-        </w:tc>
-      </w:tr>
-      <w:tr>
-        <w:tc>
-          <w:tcPr/>
-          <w:p>
-            <w:pPr>
-              <w:pStyle w:val="Compact"/>
-              <w:jc w:val="left"/>
-            </w:pPr>
-            <w:r>
-              <w:rPr>
-                <w:rStyle w:val="VerbatimChar"/>
-                <w:b/>
-                <w:sz w:val="19"/>
-              </w:rPr>
-              <w:t xml:space="preserve">/points show</w:t>
-            </w:r>
-          </w:p>
-        </w:tc>
-        <w:tc>
-          <w:tcPr/>
-          <w:p>
-            <w:pPr>
-              <w:pStyle w:val="Compact"/>
-              <w:jc w:val="left"/>
-            </w:pPr>
-            <w:r>
-              <w:rPr>
-                <w:sz w:val="19"/>
-              </w:rPr>
-              <w:t xml:space="preserve">Your Grit points this session. Add</w:t>
-            </w:r>
-            <w:r>
-              <w:rPr>
-                <w:sz w:val="19"/>
-              </w:rPr>
-              <w:t xml:space="preserve"> </w:t>
-            </w:r>
-            <w:r>
-              <w:rPr>
-                <w:rStyle w:val="VerbatimChar"/>
-                <w:sz w:val="19"/>
-              </w:rPr>
-              <w:t xml:space="preserve">player:@name</w:t>
-            </w:r>
-            <w:r>
-              <w:rPr>
-                <w:sz w:val="19"/>
-              </w:rPr>
-              <w:t xml:space="preserve"> </w:t>
-            </w:r>
-            <w:r>
-              <w:rPr>
-                <w:sz w:val="19"/>
-              </w:rPr>
-              <w:t xml:space="preserve">to see someone else’s.</w:t>
-            </w:r>
-          </w:p>
-        </w:tc>
-      </w:tr>
-      <w:tr>
-        <w:tc>
-          <w:tcPr/>
-          <w:p>
-            <w:pPr>
-              <w:pStyle w:val="Compact"/>
-              <w:jc w:val="left"/>
-            </w:pPr>
-            <w:r>
-              <w:rPr>
-                <w:rStyle w:val="VerbatimChar"/>
-                <w:b/>
-                <w:sz w:val="19"/>
-              </w:rPr>
-              <w:t xml:space="preserve">/points spend</w:t>
-            </w:r>
-          </w:p>
-        </w:tc>
-        <w:tc>
-          <w:tcPr/>
-          <w:p>
-            <w:pPr>
-              <w:pStyle w:val="Compact"/>
-              <w:jc w:val="left"/>
-            </w:pPr>
-            <w:r>
-              <w:rPr>
-                <w:sz w:val="19"/>
-              </w:rPr>
-              <w:t xml:space="preserve">Spend a Grit point without rolling, e.g. to reduce an injury by one box or to establish a small preparation.</w:t>
-            </w:r>
-          </w:p>
-        </w:tc>
-      </w:tr>
-      <w:tr>
-        <w:tc>
-          <w:tcPr/>
-          <w:p>
-            <w:pPr>
-              <w:pStyle w:val="Compact"/>
-              <w:jc w:val="left"/>
-            </w:pPr>
-            <w:r>
-              <w:rPr>
-                <w:rStyle w:val="VerbatimChar"/>
-                <w:b/>
-                <w:sz w:val="19"/>
-              </w:rPr>
-              <w:t xml:space="preserve">/points gain</w:t>
-            </w:r>
-          </w:p>
-        </w:tc>
-        <w:tc>
-          <w:tcPr/>
-          <w:p>
-            <w:pPr>
-              <w:pStyle w:val="Compact"/>
-              <w:jc w:val="left"/>
-            </w:pPr>
-            <w:r>
-              <w:rPr>
-                <w:sz w:val="19"/>
-              </w:rPr>
-              <w:t xml:space="preserve">Gain a Grit point, e.g. when you accept a complication the GM offers. With Extra Grit, use it once at the start of a session.</w:t>
-            </w:r>
-          </w:p>
-        </w:tc>
-      </w:tr>
-      <w:tr>
-        <w:tc>
-          <w:tcPr/>
-          <w:p>
-            <w:pPr>
-              <w:pStyle w:val="Compact"/>
-              <w:jc w:val="left"/>
-            </w:pPr>
-            <w:r>
-              <w:rPr>
-                <w:rStyle w:val="VerbatimChar"/>
-                <w:b/>
-                <w:sz w:val="19"/>
-              </w:rPr>
-              <w:t xml:space="preserve">/clock show</w:t>
-            </w:r>
-          </w:p>
-        </w:tc>
-        <w:tc>
-          <w:tcPr/>
-          <w:p>
-            <w:pPr>
-              <w:pStyle w:val="Compact"/>
-              <w:jc w:val="left"/>
-            </w:pPr>
-            <w:r>
-              <w:rPr>
-                <w:sz w:val="19"/>
-              </w:rPr>
-              <w:t xml:space="preserve">Every clock the GM is running.</w:t>
-            </w:r>
-          </w:p>
-        </w:tc>
-      </w:tr>
-      <w:tr>
-        <w:tc>
-          <w:tcPr/>
-          <w:p>
-            <w:pPr>
-              <w:pStyle w:val="Compact"/>
-              <w:jc w:val="left"/>
-            </w:pPr>
-            <w:r>
-              <w:rPr>
-                <w:rStyle w:val="VerbatimChar"/>
-                <w:b/>
-                <w:sz w:val="19"/>
-              </w:rPr>
-              <w:t xml:space="preserve">/track show</w:t>
-            </w:r>
-          </w:p>
-        </w:tc>
-        <w:tc>
-          <w:tcPr/>
-          <w:p>
-            <w:pPr>
-              <w:pStyle w:val="Compact"/>
-              <w:jc w:val="left"/>
-            </w:pPr>
-            <w:r>
-              <w:rPr>
-                <w:sz w:val="19"/>
-              </w:rPr>
-              <w:t xml:space="preserve">The shared Trouble tracks (Suspicion, Exposure, Attention) and what each one means right now.</w:t>
-            </w:r>
-          </w:p>
-        </w:tc>
-      </w:tr>
-    </w:tbl>
-    <w:p>
-      <w:pPr>
-        <w:pStyle w:val="BodyText"/>
-      </w:pPr>
-      <w:r>
-        <w:t xml:space="preserve">The bot’s original names still work:</w:t>
-      </w:r>
-      <w:r>
-        <w:t xml:space="preserve"> </w:t>
-      </w:r>
-      <w:r>
-        <w:rPr>
-          <w:rStyle w:val="VerbatimChar"/>
-        </w:rPr>
-        <w:t xml:space="preserve">/grimm</w:t>
-      </w:r>
-      <w:r>
-        <w:t xml:space="preserve"> </w:t>
-      </w:r>
-      <w:r>
-        <w:t xml:space="preserve">is the same as</w:t>
-      </w:r>
-      <w:r>
-        <w:t xml:space="preserve"> </w:t>
-      </w:r>
-      <w:r>
-        <w:rPr>
-          <w:rStyle w:val="VerbatimChar"/>
-        </w:rPr>
-        <w:t xml:space="preserve">/roll</w:t>
-      </w:r>
-      <w:r>
-        <w:t xml:space="preserve">, and</w:t>
-      </w:r>
-      <w:r>
-        <w:t xml:space="preserve"> </w:t>
-      </w:r>
-      <w:r>
-        <w:rPr>
-          <w:rStyle w:val="VerbatimChar"/>
-        </w:rPr>
-        <w:t xml:space="preserve">/grit</w:t>
-      </w:r>
-      <w:r>
-        <w:t xml:space="preserve"> </w:t>
-      </w:r>
-      <w:r>
-        <w:t xml:space="preserve">is the same as</w:t>
-      </w:r>
-      <w:r>
-        <w:t xml:space="preserve"> </w:t>
-      </w:r>
-      <w:r>
-        <w:rPr>
-          <w:rStyle w:val="VerbatimChar"/>
-        </w:rPr>
-        <w:t xml:space="preserve">/points</w:t>
-      </w:r>
-      <w:r>
-        <w:t xml:space="preserve">.</w:t>
-      </w:r>
-    </w:p>
-    <w:p>
-      <w:pPr>
-        <w:pStyle w:val="BodyText"/>
-      </w:pPr>
-      <w:r>
-        <w:t xml:space="preserve">Only the player who rolled can press the reroll button. Rolls that miss by 1 or 2 remind the GM that success at a cost is on offer.</w:t>
-      </w:r>
-    </w:p>
-    <w:bookmarkEnd w:id="120"/>
-    <w:bookmarkStart w:id="121" w:name="for-the-gm"/>
-    <w:p>
-      <w:pPr>
-        <w:pStyle w:val="Heading2"/>
-      </w:pPr>
-      <w:r>
-        <w:t xml:space="preserve">For the GM</w:t>
-      </w:r>
-    </w:p>
-    <w:p>
-      <w:pPr>
-        <w:pStyle w:val="FirstParagraph"/>
-      </w:pPr>
-      <w:r>
-        <w:t xml:space="preserve">GM commands need the</w:t>
-      </w:r>
-      <w:r>
-        <w:t xml:space="preserve"> </w:t>
-      </w:r>
-      <w:r>
-        <w:rPr>
-          <w:bCs/>
-          <w:b/>
-        </w:rPr>
-        <w:t xml:space="preserve">Manage Server</w:t>
-      </w:r>
-      <w:r>
-        <w:t xml:space="preserve"> </w:t>
-      </w:r>
-      <w:r>
-        <w:t xml:space="preserve">permission on the Discord server. Everyone can see clocks, tracks and points.</w:t>
-      </w:r>
-    </w:p>
-    <w:tbl>
-      <w:tblPr>
-        <w:tblStyle w:val="Table"/>
-        <w:tblW w:type="pct" w:w="5000"/>
-        <w:tblLook w:firstRow="1" w:lastRow="0" w:firstColumn="0" w:lastColumn="0" w:noHBand="0" w:noVBand="0" w:val="0020"/>
-        <w:jc w:val="start"/>
-        <w:tblBorders>
-          <w:top w:val="single" w:sz="4" w:color="B8C2D3"/>
-          <w:left w:val="single" w:sz="4" w:color="B8C2D3"/>
-          <w:bottom w:val="single" w:sz="4" w:color="B8C2D3"/>
-          <w:right w:val="single" w:sz="4" w:color="B8C2D3"/>
-          <w:insideH w:val="single" w:sz="4" w:color="B8C2D3"/>
-          <w:insideV w:val="single" w:sz="4" w:color="B8C2D3"/>
-        </w:tblBorders>
-      </w:tblPr>
-      <w:tblGrid>
-        <w:gridCol w:w="3960"/>
-        <w:gridCol w:w="3960"/>
-      </w:tblGrid>
-      <w:tr>
-        <w:trPr>
-          <w:tblHeader w:val="true"/>
-        </w:trPr>
-        <w:tc>
-          <w:tcPr>
-            <w:shd w:val="clear" w:fill="F1E6D2"/>
-          </w:tcPr>
-          <w:p>
-            <w:pPr>
-              <w:pStyle w:val="Compact"/>
-              <w:jc w:val="left"/>
-            </w:pPr>
-            <w:r>
-              <w:rPr>
-                <w:b/>
-                <w:sz w:val="19"/>
-              </w:rPr>
-              <w:t xml:space="preserve">Command</w:t>
-            </w:r>
-          </w:p>
-        </w:tc>
-        <w:tc>
-          <w:tcPr>
-            <w:shd w:val="clear" w:fill="F1E6D2"/>
-          </w:tcPr>
-          <w:p>
-            <w:pPr>
-              <w:pStyle w:val="Compact"/>
-              <w:jc w:val="left"/>
-            </w:pPr>
-            <w:r>
-              <w:rPr>
-                <w:b/>
-                <w:sz w:val="19"/>
-              </w:rPr>
-              <w:t xml:space="preserve">What it does</w:t>
-            </w:r>
-          </w:p>
-        </w:tc>
-      </w:tr>
-      <w:tr>
-        <w:tc>
-          <w:tcPr/>
-          <w:p>
-            <w:pPr>
-              <w:pStyle w:val="Compact"/>
-              <w:jc w:val="left"/>
-            </w:pPr>
-            <w:r>
-              <w:rPr>
-                <w:rStyle w:val="VerbatimChar"/>
-                <w:b/>
-                <w:sz w:val="19"/>
-              </w:rPr>
-              <w:t xml:space="preserve">/game set game:Grimm</w:t>
-            </w:r>
-          </w:p>
-        </w:tc>
-        <w:tc>
-          <w:tcPr/>
-          <w:p>
-            <w:pPr>
-              <w:pStyle w:val="Compact"/>
-              <w:jc w:val="left"/>
-            </w:pPr>
-            <w:r>
-              <w:rPr>
-                <w:sz w:val="19"/>
-              </w:rPr>
-              <w:t xml:space="preserve">Choose this server’s game. Do it once;</w:t>
-            </w:r>
-            <w:r>
-              <w:rPr>
-                <w:sz w:val="19"/>
-              </w:rPr>
-              <w:t xml:space="preserve"> </w:t>
-            </w:r>
-            <w:r>
-              <w:rPr>
-                <w:rStyle w:val="VerbatimChar"/>
-                <w:sz w:val="19"/>
-              </w:rPr>
-              <w:t xml:space="preserve">/game show</w:t>
-            </w:r>
-            <w:r>
-              <w:rPr>
-                <w:sz w:val="19"/>
-              </w:rPr>
-              <w:t xml:space="preserve"> </w:t>
-            </w:r>
-            <w:r>
-              <w:rPr>
-                <w:sz w:val="19"/>
-              </w:rPr>
-              <w:t xml:space="preserve">checks it.</w:t>
-            </w:r>
-          </w:p>
-        </w:tc>
-      </w:tr>
-      <w:tr>
-        <w:tc>
-          <w:tcPr/>
-          <w:p>
-            <w:pPr>
-              <w:pStyle w:val="Compact"/>
-              <w:jc w:val="left"/>
-            </w:pPr>
-            <w:r>
-              <w:rPr>
-                <w:rStyle w:val="VerbatimChar"/>
-                <w:b/>
-                <w:sz w:val="19"/>
-              </w:rPr>
-              <w:t xml:space="preserve">/points newsession</w:t>
-            </w:r>
-          </w:p>
-        </w:tc>
-        <w:tc>
-          <w:tcPr/>
-          <w:p>
-            <w:pPr>
-              <w:pStyle w:val="Compact"/>
-              <w:jc w:val="left"/>
-            </w:pPr>
-            <w:r>
-              <w:rPr>
-                <w:sz w:val="19"/>
-              </w:rPr>
-              <w:t xml:space="preserve">Start a session: everyone goes back to two Grit points, and unused points are gone.</w:t>
-            </w:r>
-          </w:p>
-        </w:tc>
-      </w:tr>
-      <w:tr>
-        <w:tc>
-          <w:tcPr/>
-          <w:p>
-            <w:pPr>
-              <w:pStyle w:val="Compact"/>
-              <w:jc w:val="left"/>
-            </w:pPr>
-            <w:r>
-              <w:rPr>
-                <w:rStyle w:val="VerbatimChar"/>
-                <w:b/>
-                <w:sz w:val="19"/>
-              </w:rPr>
-              <w:t xml:space="preserve">/points gain player:@name</w:t>
-            </w:r>
-          </w:p>
-        </w:tc>
-        <w:tc>
-          <w:tcPr/>
-          <w:p>
-            <w:pPr>
-              <w:pStyle w:val="Compact"/>
-              <w:jc w:val="left"/>
-            </w:pPr>
-            <w:r>
-              <w:rPr>
-                <w:sz w:val="19"/>
-              </w:rPr>
-              <w:t xml:space="preserve">Award a Grit point, e.g. for an accepted complication.</w:t>
-            </w:r>
-          </w:p>
-        </w:tc>
-      </w:tr>
-      <w:tr>
-        <w:tc>
-          <w:tcPr/>
-          <w:p>
-            <w:pPr>
-              <w:pStyle w:val="Compact"/>
-              <w:jc w:val="left"/>
-            </w:pPr>
-            <w:r>
-              <w:rPr>
-                <w:rStyle w:val="VerbatimChar"/>
-                <w:b/>
-                <w:sz w:val="19"/>
-              </w:rPr>
-              <w:t xml:space="preserve">/points set player:@name points:3</w:t>
-            </w:r>
-          </w:p>
-        </w:tc>
-        <w:tc>
-          <w:tcPr/>
-          <w:p>
-            <w:pPr>
-              <w:pStyle w:val="Compact"/>
-              <w:jc w:val="left"/>
-            </w:pPr>
-            <w:r>
-              <w:rPr>
-                <w:sz w:val="19"/>
-              </w:rPr>
-              <w:t xml:space="preserve">Correct a player’s total.</w:t>
-            </w:r>
-          </w:p>
-        </w:tc>
-      </w:tr>
-      <w:tr>
-        <w:tc>
-          <w:tcPr/>
-          <w:p>
-            <w:pPr>
-              <w:pStyle w:val="Compact"/>
-              <w:jc w:val="left"/>
-            </w:pPr>
-            <w:r>
-              <w:rPr>
-                <w:rStyle w:val="VerbatimChar"/>
-                <w:b/>
-                <w:sz w:val="19"/>
-              </w:rPr>
-              <w:t xml:space="preserve">/clock new name:"The mob forms" segments:6 kind:danger</w:t>
-            </w:r>
-          </w:p>
-        </w:tc>
-        <w:tc>
-          <w:tcPr/>
-          <w:p>
-            <w:pPr>
-              <w:pStyle w:val="Compact"/>
-              <w:jc w:val="left"/>
-            </w:pPr>
-            <w:r>
-              <w:rPr>
-                <w:sz w:val="19"/>
-              </w:rPr>
-              <w:t xml:space="preserve">Start a clock of 2, 4, 6 or 8 segments. Danger clocks fill on failures and time; use</w:t>
-            </w:r>
-            <w:r>
-              <w:rPr>
-                <w:sz w:val="19"/>
-              </w:rPr>
-              <w:t xml:space="preserve"> </w:t>
-            </w:r>
-            <w:r>
-              <w:rPr>
-                <w:rStyle w:val="VerbatimChar"/>
-                <w:sz w:val="19"/>
-              </w:rPr>
-              <w:t xml:space="preserve">kind:progress</w:t>
-            </w:r>
-            <w:r>
-              <w:rPr>
-                <w:sz w:val="19"/>
-              </w:rPr>
-              <w:t xml:space="preserve"> </w:t>
-            </w:r>
-            <w:r>
-              <w:rPr>
-                <w:sz w:val="19"/>
-              </w:rPr>
-              <w:t xml:space="preserve">for one that fills on successes.</w:t>
-            </w:r>
-          </w:p>
-        </w:tc>
-      </w:tr>
-      <w:tr>
-        <w:tc>
-          <w:tcPr/>
-          <w:p>
-            <w:pPr>
-              <w:pStyle w:val="Compact"/>
-              <w:jc w:val="left"/>
-            </w:pPr>
-            <w:r>
-              <w:rPr>
-                <w:rStyle w:val="VerbatimChar"/>
-                <w:b/>
-                <w:sz w:val="19"/>
-              </w:rPr>
-              <w:t xml:space="preserve">/clock tick name:"The mob forms"</w:t>
-            </w:r>
-          </w:p>
-        </w:tc>
-        <w:tc>
-          <w:tcPr/>
-          <w:p>
-            <w:pPr>
-              <w:pStyle w:val="Compact"/>
-              <w:jc w:val="left"/>
-            </w:pPr>
-            <w:r>
-              <w:rPr>
-                <w:sz w:val="19"/>
-              </w:rPr>
-              <w:t xml:space="preserve">Fill one segment. Add</w:t>
-            </w:r>
-            <w:r>
-              <w:rPr>
-                <w:sz w:val="19"/>
-              </w:rPr>
-              <w:t xml:space="preserve"> </w:t>
-            </w:r>
-            <w:r>
-              <w:rPr>
-                <w:rStyle w:val="VerbatimChar"/>
-                <w:sz w:val="19"/>
-              </w:rPr>
-              <w:t xml:space="preserve">segments:2</w:t>
-            </w:r>
-            <w:r>
-              <w:rPr>
-                <w:sz w:val="19"/>
-              </w:rPr>
-              <w:t xml:space="preserve"> </w:t>
-            </w:r>
-            <w:r>
-              <w:rPr>
-                <w:sz w:val="19"/>
-              </w:rPr>
-              <w:t xml:space="preserve">for two, or</w:t>
-            </w:r>
-            <w:r>
-              <w:rPr>
-                <w:sz w:val="19"/>
-              </w:rPr>
-              <w:t xml:space="preserve"> </w:t>
-            </w:r>
-            <w:r>
-              <w:rPr>
-                <w:rStyle w:val="VerbatimChar"/>
-                <w:sz w:val="19"/>
-              </w:rPr>
-              <w:t xml:space="preserve">segments:-1</w:t>
-            </w:r>
-            <w:r>
-              <w:rPr>
-                <w:sz w:val="19"/>
-              </w:rPr>
-              <w:t xml:space="preserve"> </w:t>
-            </w:r>
-            <w:r>
-              <w:rPr>
-                <w:sz w:val="19"/>
-              </w:rPr>
-              <w:t xml:space="preserve">to undo.</w:t>
-            </w:r>
-            <w:r>
-              <w:rPr>
-                <w:sz w:val="19"/>
-              </w:rPr>
-              <w:t xml:space="preserve"> </w:t>
-            </w:r>
-            <w:r>
-              <w:rPr>
-                <w:rStyle w:val="VerbatimChar"/>
-                <w:sz w:val="19"/>
-              </w:rPr>
-              <w:t xml:space="preserve">/clock remove</w:t>
-            </w:r>
-            <w:r>
-              <w:rPr>
-                <w:sz w:val="19"/>
-              </w:rPr>
-              <w:t xml:space="preserve"> </w:t>
-            </w:r>
-            <w:r>
-              <w:rPr>
-                <w:sz w:val="19"/>
-              </w:rPr>
-              <w:t xml:space="preserve">deletes a clock.</w:t>
-            </w:r>
-          </w:p>
-        </w:tc>
-      </w:tr>
-      <w:tr>
-        <w:tc>
-          <w:tcPr/>
-          <w:p>
-            <w:pPr>
-              <w:pStyle w:val="Compact"/>
-              <w:jc w:val="left"/>
-            </w:pPr>
-            <w:r>
-              <w:rPr>
-                <w:rStyle w:val="VerbatimChar"/>
-                <w:b/>
-                <w:sz w:val="19"/>
-              </w:rPr>
-              <w:t xml:space="preserve">/track mark name:exposure</w:t>
-            </w:r>
-          </w:p>
-        </w:tc>
-        <w:tc>
-          <w:tcPr/>
-          <w:p>
-            <w:pPr>
-              <w:pStyle w:val="Compact"/>
-              <w:jc w:val="left"/>
-            </w:pPr>
-            <w:r>
-              <w:rPr>
-                <w:sz w:val="19"/>
-              </w:rPr>
-              <w:t xml:space="preserve">Mark a box on a track; a partial name works (</w:t>
-            </w:r>
-            <w:r>
-              <w:rPr>
-                <w:sz w:val="19"/>
-              </w:rPr>
-              <w:t xml:space="preserve">“</w:t>
-            </w:r>
-            <w:r>
-              <w:rPr>
-                <w:sz w:val="19"/>
-              </w:rPr>
-              <w:t xml:space="preserve">exposure</w:t>
-            </w:r>
-            <w:r>
-              <w:rPr>
-                <w:sz w:val="19"/>
-              </w:rPr>
-              <w:t xml:space="preserve">”</w:t>
-            </w:r>
-            <w:r>
-              <w:rPr>
-                <w:sz w:val="19"/>
-              </w:rPr>
-              <w:t xml:space="preserve"> </w:t>
-            </w:r>
-            <w:r>
-              <w:rPr>
-                <w:sz w:val="19"/>
-              </w:rPr>
-              <w:t xml:space="preserve">finds Exposure).</w:t>
-            </w:r>
-            <w:r>
-              <w:rPr>
-                <w:sz w:val="19"/>
-              </w:rPr>
-              <w:t xml:space="preserve"> </w:t>
-            </w:r>
-            <w:r>
-              <w:rPr>
-                <w:rStyle w:val="VerbatimChar"/>
-                <w:sz w:val="19"/>
-              </w:rPr>
-              <w:t xml:space="preserve">/track clear</w:t>
-            </w:r>
-            <w:r>
-              <w:rPr>
-                <w:sz w:val="19"/>
-              </w:rPr>
-              <w:t xml:space="preserve"> </w:t>
-            </w:r>
-            <w:r>
-              <w:rPr>
-                <w:sz w:val="19"/>
-              </w:rPr>
-              <w:t xml:space="preserve">clears one, and</w:t>
-            </w:r>
-            <w:r>
-              <w:rPr>
-                <w:sz w:val="19"/>
-              </w:rPr>
-              <w:t xml:space="preserve"> </w:t>
-            </w:r>
-            <w:r>
-              <w:rPr>
-                <w:rStyle w:val="VerbatimChar"/>
-                <w:sz w:val="19"/>
-              </w:rPr>
-              <w:t xml:space="preserve">/track reset</w:t>
-            </w:r>
-            <w:r>
-              <w:rPr>
-                <w:sz w:val="19"/>
-              </w:rPr>
-              <w:t xml:space="preserve"> </w:t>
-            </w:r>
-            <w:r>
-              <w:rPr>
-                <w:sz w:val="19"/>
-              </w:rPr>
-              <w:t xml:space="preserve">clears them all.</w:t>
-            </w:r>
-          </w:p>
-        </w:tc>
-      </w:tr>
-      <w:tr>
-        <w:tc>
-          <w:tcPr/>
-          <w:p>
-            <w:pPr>
-              <w:pStyle w:val="Compact"/>
-              <w:jc w:val="left"/>
-            </w:pPr>
-            <w:r>
-              <w:rPr>
-                <w:rStyle w:val="VerbatimChar"/>
-                <w:b/>
-                <w:sz w:val="19"/>
-              </w:rPr>
-              <w:t xml:space="preserve">/seed</w:t>
-            </w:r>
-          </w:p>
-        </w:tc>
-        <w:tc>
-          <w:tcPr/>
-          <w:p>
-            <w:pPr>
-              <w:pStyle w:val="Compact"/>
-              <w:jc w:val="left"/>
-            </w:pPr>
-            <w:r>
-              <w:rPr>
-                <w:sz w:val="19"/>
-              </w:rPr>
-              <w:t xml:space="preserve">Roll an adventure seed: one line from each seed table, and the command to start its ticking clock.</w:t>
-            </w:r>
-          </w:p>
-        </w:tc>
-      </w:tr>
-      <w:tr>
-        <w:tc>
-          <w:tcPr/>
-          <w:p>
-            <w:pPr>
-              <w:pStyle w:val="Compact"/>
-              <w:jc w:val="left"/>
-            </w:pPr>
-            <w:r>
-              <w:rPr>
-                <w:rStyle w:val="VerbatimChar"/>
-                <w:b/>
-                <w:sz w:val="19"/>
-              </w:rPr>
-              <w:t xml:space="preserve">/contest ... defender:me</w:t>
-            </w:r>
-          </w:p>
-        </w:tc>
-        <w:tc>
-          <w:tcPr/>
-          <w:p>
-            <w:pPr>
-              <w:pStyle w:val="Compact"/>
-              <w:jc w:val="left"/>
-            </w:pPr>
-            <w:r>
-              <w:rPr>
-                <w:sz w:val="19"/>
-              </w:rPr>
-              <w:t xml:space="preserve">When a player resists you (a grapple, a lie, a chase), they are the defender: ties and double failures go to them.</w:t>
-            </w:r>
-          </w:p>
-        </w:tc>
-      </w:tr>
-    </w:tbl>
-    <w:p>
-      <w:pPr>
-        <w:pStyle w:val="BodyText"/>
-      </w:pPr>
-      <w:r>
-        <w:t xml:space="preserve">Each server keeps its own points, clocks and tracks. If a command is missing from Discord’s list, open the bot’s</w:t>
-      </w:r>
-      <w:r>
-        <w:t xml:space="preserve"> </w:t>
-      </w:r>
-      <w:r>
-        <w:rPr>
-          <w:rStyle w:val="VerbatimChar"/>
-        </w:rPr>
-        <w:t xml:space="preserve">/register</w:t>
-      </w:r>
-      <w:r>
-        <w:t xml:space="preserve"> </w:t>
-      </w:r>
-      <w:r>
-        <w:t xml:space="preserve">page once (see the bot’s README), then press Ctrl+R in Discord.</w:t>
-      </w:r>
-      <w:r>
-        <w:t xml:space="preserve"> </w:t>
-      </w:r>
-    </w:p>
-    <w:bookmarkEnd w:id="121"/>
-    <w:bookmarkEnd w:id="122"/>
     <w:sectPr/>
   </w:body>
 </w:document>

</xml_diff>

<commit_message>
Move the Discord commands out of the guide into a handout page
grimm-west/discord-commands.html is a players-first page in the creator's look; the guide and creator no longer mention the bot.

Co-Authored-By: Claude Opus 5.5 <noreply@anthropic.com>
Claude-Session: https://claude.ai/code/session_015SADCFzhKijkC2foUmXrpC
</commit_message>
<xml_diff>
--- a/grimm-west/Grimm_Players_Guide.docx
+++ b/grimm-west/Grimm_Players_Guide.docx
@@ -25114,1154 +25114,6 @@
       </w:r>
     </w:p>
     <w:bookmarkEnd w:id="119"/>
-    <w:bookmarkStart w:id="122" w:name="discord-commands"/>
-    <w:p>
-      <w:pPr>
-        <w:pStyle w:val="Heading1"/>
-      </w:pPr>
-      <w:r>
-        <w:t xml:space="preserve">Discord commands</w:t>
-      </w:r>
-    </w:p>
-    <w:p>
-      <w:pPr>
-        <w:pStyle w:val="FirstParagraph"/>
-      </w:pPr>
-      <w:r>
-        <w:t xml:space="preserve">The table’s Discord bot rolls the dice and keeps the shared Grit points, clocks and Trouble tracks for the server. Type</w:t>
-      </w:r>
-      <w:r>
-        <w:t xml:space="preserve"> </w:t>
-      </w:r>
-      <w:r>
-        <w:rPr>
-          <w:rStyle w:val="VerbatimChar"/>
-        </w:rPr>
-        <w:t xml:space="preserve">/</w:t>
-      </w:r>
-      <w:r>
-        <w:t xml:space="preserve"> </w:t>
-      </w:r>
-      <w:r>
-        <w:t xml:space="preserve">in a channel to see the commands; Discord shows each option as you fill it in. The bot doesn’t know your sheet, so you give it the target number.</w:t>
-      </w:r>
-    </w:p>
-    <w:bookmarkStart w:id="120" w:name="for-players"/>
-    <w:p>
-      <w:pPr>
-        <w:pStyle w:val="Heading2"/>
-      </w:pPr>
-      <w:r>
-        <w:t xml:space="preserve">For players</w:t>
-      </w:r>
-    </w:p>
-    <w:tbl>
-      <w:tblPr>
-        <w:tblStyle w:val="Table"/>
-        <w:tblW w:type="pct" w:w="5000"/>
-        <w:tblLook w:firstRow="1" w:lastRow="0" w:firstColumn="0" w:lastColumn="0" w:noHBand="0" w:noVBand="0" w:val="0020"/>
-        <w:jc w:val="start"/>
-        <w:tblBorders>
-          <w:top w:val="single" w:sz="4" w:color="B8C2D3"/>
-          <w:left w:val="single" w:sz="4" w:color="B8C2D3"/>
-          <w:bottom w:val="single" w:sz="4" w:color="B8C2D3"/>
-          <w:right w:val="single" w:sz="4" w:color="B8C2D3"/>
-          <w:insideH w:val="single" w:sz="4" w:color="B8C2D3"/>
-          <w:insideV w:val="single" w:sz="4" w:color="B8C2D3"/>
-        </w:tblBorders>
-      </w:tblPr>
-      <w:tblGrid>
-        <w:gridCol w:w="3960"/>
-        <w:gridCol w:w="3960"/>
-      </w:tblGrid>
-      <w:tr>
-        <w:trPr>
-          <w:tblHeader w:val="true"/>
-        </w:trPr>
-        <w:tc>
-          <w:tcPr>
-            <w:shd w:val="clear" w:fill="F1E6D2"/>
-          </w:tcPr>
-          <w:p>
-            <w:pPr>
-              <w:pStyle w:val="Compact"/>
-              <w:jc w:val="left"/>
-            </w:pPr>
-            <w:r>
-              <w:rPr>
-                <w:b/>
-                <w:sz w:val="19"/>
-              </w:rPr>
-              <w:t xml:space="preserve">Command</w:t>
-            </w:r>
-          </w:p>
-        </w:tc>
-        <w:tc>
-          <w:tcPr>
-            <w:shd w:val="clear" w:fill="F1E6D2"/>
-          </w:tcPr>
-          <w:p>
-            <w:pPr>
-              <w:pStyle w:val="Compact"/>
-              <w:jc w:val="left"/>
-            </w:pPr>
-            <w:r>
-              <w:rPr>
-                <w:b/>
-                <w:sz w:val="19"/>
-              </w:rPr>
-              <w:t xml:space="preserve">What it does</w:t>
-            </w:r>
-          </w:p>
-        </w:tc>
-      </w:tr>
-      <w:tr>
-        <w:tc>
-          <w:tcPr/>
-          <w:p>
-            <w:pPr>
-              <w:pStyle w:val="Compact"/>
-              <w:jc w:val="left"/>
-            </w:pPr>
-            <w:r>
-              <w:rPr>
-                <w:rStyle w:val="VerbatimChar"/>
-                <w:b/>
-                <w:sz w:val="19"/>
-              </w:rPr>
-              <w:t xml:space="preserve">/roll target:13 modifier:-2 label:Tracking</w:t>
-            </w:r>
-          </w:p>
-        </w:tc>
-        <w:tc>
-          <w:tcPr/>
-          <w:p>
-            <w:pPr>
-              <w:pStyle w:val="Compact"/>
-              <w:jc w:val="left"/>
-            </w:pPr>
-            <w:r>
-              <w:rPr>
-                <w:sz w:val="19"/>
-              </w:rPr>
-              <w:t xml:space="preserve">Roll 3d6 under your target. Use the number from your sheet, and add up every modifier yourself: circumstance, injury, assistance. The bot shows the result, the margin and your chance.</w:t>
-            </w:r>
-            <w:r>
-              <w:rPr>
-                <w:sz w:val="19"/>
-              </w:rPr>
-              <w:t xml:space="preserve"> </w:t>
-            </w:r>
-            <w:r>
-              <w:rPr>
-                <w:bCs/>
-                <w:b/>
-                <w:sz w:val="19"/>
-              </w:rPr>
-              <w:t xml:space="preserve">Spend a Grit point to reroll</w:t>
-            </w:r>
-            <w:r>
-              <w:rPr>
-                <w:sz w:val="19"/>
-              </w:rPr>
-              <w:t xml:space="preserve"> </w:t>
-            </w:r>
-            <w:r>
-              <w:rPr>
-                <w:sz w:val="19"/>
-              </w:rPr>
-              <w:t xml:space="preserve">lets you reroll once, and the second result stands.</w:t>
-            </w:r>
-          </w:p>
-        </w:tc>
-      </w:tr>
-      <w:tr>
-        <w:tc>
-          <w:tcPr/>
-          <w:p>
-            <w:pPr>
-              <w:pStyle w:val="Compact"/>
-              <w:jc w:val="left"/>
-            </w:pPr>
-            <w:r>
-              <w:rPr>
-                <w:rStyle w:val="VerbatimChar"/>
-                <w:b/>
-                <w:sz w:val="19"/>
-              </w:rPr>
-              <w:t xml:space="preserve">/contest target:13 opponent:14 opponent_name:"Blutbad" label:Grapple</w:t>
-            </w:r>
-          </w:p>
-        </w:tc>
-        <w:tc>
-          <w:tcPr/>
-          <w:p>
-            <w:pPr>
-              <w:pStyle w:val="Compact"/>
-              <w:jc w:val="left"/>
-            </w:pPr>
-            <w:r>
-              <w:rPr>
-                <w:sz w:val="19"/>
-              </w:rPr>
-              <w:t xml:space="preserve">An opposed roll. The bot rolls both sides and names the winner. Ties and double failures go to the defender, which is the opponent unless you add</w:t>
-            </w:r>
-            <w:r>
-              <w:rPr>
-                <w:sz w:val="19"/>
-              </w:rPr>
-              <w:t xml:space="preserve"> </w:t>
-            </w:r>
-            <w:r>
-              <w:rPr>
-                <w:rStyle w:val="VerbatimChar"/>
-                <w:sz w:val="19"/>
-              </w:rPr>
-              <w:t xml:space="preserve">defender:me</w:t>
-            </w:r>
-            <w:r>
-              <w:rPr>
-                <w:sz w:val="19"/>
-              </w:rPr>
-              <w:t xml:space="preserve">.</w:t>
-            </w:r>
-          </w:p>
-        </w:tc>
-      </w:tr>
-      <w:tr>
-        <w:tc>
-          <w:tcPr/>
-          <w:p>
-            <w:pPr>
-              <w:pStyle w:val="Compact"/>
-              <w:jc w:val="left"/>
-            </w:pPr>
-            <w:r>
-              <w:rPr>
-                <w:rStyle w:val="VerbatimChar"/>
-                <w:b/>
-                <w:sz w:val="19"/>
-              </w:rPr>
-              <w:t xml:space="preserve">/assist target:12 helper_target:14 helper:@name label:"Hold the door"</w:t>
-            </w:r>
-          </w:p>
-        </w:tc>
-        <w:tc>
-          <w:tcPr/>
-          <w:p>
-            <w:pPr>
-              <w:pStyle w:val="Compact"/>
-              <w:jc w:val="left"/>
-            </w:pPr>
-            <w:r>
-              <w:rPr>
-                <w:sz w:val="19"/>
-              </w:rPr>
-              <w:t xml:space="preserve">Someone helps you. They roll first (Athletics, say): success gives +1, success by 5 or more +2, and a natural 18 brings a complication. Then you roll with their bonus.</w:t>
-            </w:r>
-          </w:p>
-        </w:tc>
-      </w:tr>
-      <w:tr>
-        <w:tc>
-          <w:tcPr/>
-          <w:p>
-            <w:pPr>
-              <w:pStyle w:val="Compact"/>
-              <w:jc w:val="left"/>
-            </w:pPr>
-            <w:r>
-              <w:rPr>
-                <w:rStyle w:val="VerbatimChar"/>
-                <w:b/>
-                <w:sz w:val="19"/>
-              </w:rPr>
-              <w:t xml:space="preserve">/points show</w:t>
-            </w:r>
-          </w:p>
-        </w:tc>
-        <w:tc>
-          <w:tcPr/>
-          <w:p>
-            <w:pPr>
-              <w:pStyle w:val="Compact"/>
-              <w:jc w:val="left"/>
-            </w:pPr>
-            <w:r>
-              <w:rPr>
-                <w:sz w:val="19"/>
-              </w:rPr>
-              <w:t xml:space="preserve">Your Grit points this session. Add</w:t>
-            </w:r>
-            <w:r>
-              <w:rPr>
-                <w:sz w:val="19"/>
-              </w:rPr>
-              <w:t xml:space="preserve"> </w:t>
-            </w:r>
-            <w:r>
-              <w:rPr>
-                <w:rStyle w:val="VerbatimChar"/>
-                <w:sz w:val="19"/>
-              </w:rPr>
-              <w:t xml:space="preserve">player:@name</w:t>
-            </w:r>
-            <w:r>
-              <w:rPr>
-                <w:sz w:val="19"/>
-              </w:rPr>
-              <w:t xml:space="preserve"> </w:t>
-            </w:r>
-            <w:r>
-              <w:rPr>
-                <w:sz w:val="19"/>
-              </w:rPr>
-              <w:t xml:space="preserve">to see someone else’s.</w:t>
-            </w:r>
-          </w:p>
-        </w:tc>
-      </w:tr>
-      <w:tr>
-        <w:tc>
-          <w:tcPr/>
-          <w:p>
-            <w:pPr>
-              <w:pStyle w:val="Compact"/>
-              <w:jc w:val="left"/>
-            </w:pPr>
-            <w:r>
-              <w:rPr>
-                <w:rStyle w:val="VerbatimChar"/>
-                <w:b/>
-                <w:sz w:val="19"/>
-              </w:rPr>
-              <w:t xml:space="preserve">/points spend</w:t>
-            </w:r>
-          </w:p>
-        </w:tc>
-        <w:tc>
-          <w:tcPr/>
-          <w:p>
-            <w:pPr>
-              <w:pStyle w:val="Compact"/>
-              <w:jc w:val="left"/>
-            </w:pPr>
-            <w:r>
-              <w:rPr>
-                <w:sz w:val="19"/>
-              </w:rPr>
-              <w:t xml:space="preserve">Spend a Grit point without rolling, e.g. to reduce an injury by one box or to establish a small preparation.</w:t>
-            </w:r>
-          </w:p>
-        </w:tc>
-      </w:tr>
-      <w:tr>
-        <w:tc>
-          <w:tcPr/>
-          <w:p>
-            <w:pPr>
-              <w:pStyle w:val="Compact"/>
-              <w:jc w:val="left"/>
-            </w:pPr>
-            <w:r>
-              <w:rPr>
-                <w:rStyle w:val="VerbatimChar"/>
-                <w:b/>
-                <w:sz w:val="19"/>
-              </w:rPr>
-              <w:t xml:space="preserve">/points gain</w:t>
-            </w:r>
-          </w:p>
-        </w:tc>
-        <w:tc>
-          <w:tcPr/>
-          <w:p>
-            <w:pPr>
-              <w:pStyle w:val="Compact"/>
-              <w:jc w:val="left"/>
-            </w:pPr>
-            <w:r>
-              <w:rPr>
-                <w:sz w:val="19"/>
-              </w:rPr>
-              <w:t xml:space="preserve">Gain a Grit point, e.g. when you accept a complication the GM offers. With Extra Grit, use it once at the start of a session.</w:t>
-            </w:r>
-          </w:p>
-        </w:tc>
-      </w:tr>
-      <w:tr>
-        <w:tc>
-          <w:tcPr/>
-          <w:p>
-            <w:pPr>
-              <w:pStyle w:val="Compact"/>
-              <w:jc w:val="left"/>
-            </w:pPr>
-            <w:r>
-              <w:rPr>
-                <w:rStyle w:val="VerbatimChar"/>
-                <w:b/>
-                <w:sz w:val="19"/>
-              </w:rPr>
-              <w:t xml:space="preserve">/clock show</w:t>
-            </w:r>
-          </w:p>
-        </w:tc>
-        <w:tc>
-          <w:tcPr/>
-          <w:p>
-            <w:pPr>
-              <w:pStyle w:val="Compact"/>
-              <w:jc w:val="left"/>
-            </w:pPr>
-            <w:r>
-              <w:rPr>
-                <w:sz w:val="19"/>
-              </w:rPr>
-              <w:t xml:space="preserve">Every clock the GM is running.</w:t>
-            </w:r>
-          </w:p>
-        </w:tc>
-      </w:tr>
-      <w:tr>
-        <w:tc>
-          <w:tcPr/>
-          <w:p>
-            <w:pPr>
-              <w:pStyle w:val="Compact"/>
-              <w:jc w:val="left"/>
-            </w:pPr>
-            <w:r>
-              <w:rPr>
-                <w:rStyle w:val="VerbatimChar"/>
-                <w:b/>
-                <w:sz w:val="19"/>
-              </w:rPr>
-              <w:t xml:space="preserve">/track show</w:t>
-            </w:r>
-          </w:p>
-        </w:tc>
-        <w:tc>
-          <w:tcPr/>
-          <w:p>
-            <w:pPr>
-              <w:pStyle w:val="Compact"/>
-              <w:jc w:val="left"/>
-            </w:pPr>
-            <w:r>
-              <w:rPr>
-                <w:sz w:val="19"/>
-              </w:rPr>
-              <w:t xml:space="preserve">The shared Trouble tracks (Suspicion, Exposure, Attention) and what each one means right now.</w:t>
-            </w:r>
-          </w:p>
-        </w:tc>
-      </w:tr>
-    </w:tbl>
-    <w:p>
-      <w:pPr>
-        <w:pStyle w:val="BodyText"/>
-      </w:pPr>
-      <w:r>
-        <w:t xml:space="preserve">The bot’s original names still work:</w:t>
-      </w:r>
-      <w:r>
-        <w:t xml:space="preserve"> </w:t>
-      </w:r>
-      <w:r>
-        <w:rPr>
-          <w:rStyle w:val="VerbatimChar"/>
-        </w:rPr>
-        <w:t xml:space="preserve">/grimm</w:t>
-      </w:r>
-      <w:r>
-        <w:t xml:space="preserve"> </w:t>
-      </w:r>
-      <w:r>
-        <w:t xml:space="preserve">is the same as</w:t>
-      </w:r>
-      <w:r>
-        <w:t xml:space="preserve"> </w:t>
-      </w:r>
-      <w:r>
-        <w:rPr>
-          <w:rStyle w:val="VerbatimChar"/>
-        </w:rPr>
-        <w:t xml:space="preserve">/roll</w:t>
-      </w:r>
-      <w:r>
-        <w:t xml:space="preserve">, and</w:t>
-      </w:r>
-      <w:r>
-        <w:t xml:space="preserve"> </w:t>
-      </w:r>
-      <w:r>
-        <w:rPr>
-          <w:rStyle w:val="VerbatimChar"/>
-        </w:rPr>
-        <w:t xml:space="preserve">/grit</w:t>
-      </w:r>
-      <w:r>
-        <w:t xml:space="preserve"> </w:t>
-      </w:r>
-      <w:r>
-        <w:t xml:space="preserve">is the same as</w:t>
-      </w:r>
-      <w:r>
-        <w:t xml:space="preserve"> </w:t>
-      </w:r>
-      <w:r>
-        <w:rPr>
-          <w:rStyle w:val="VerbatimChar"/>
-        </w:rPr>
-        <w:t xml:space="preserve">/points</w:t>
-      </w:r>
-      <w:r>
-        <w:t xml:space="preserve">.</w:t>
-      </w:r>
-    </w:p>
-    <w:p>
-      <w:pPr>
-        <w:pStyle w:val="BodyText"/>
-      </w:pPr>
-      <w:r>
-        <w:t xml:space="preserve">Only the player who rolled can press the reroll button. Rolls that miss by 1 or 2 remind the GM that success at a cost is on offer.</w:t>
-      </w:r>
-    </w:p>
-    <w:bookmarkEnd w:id="120"/>
-    <w:bookmarkStart w:id="121" w:name="for-the-gm"/>
-    <w:p>
-      <w:pPr>
-        <w:pStyle w:val="Heading2"/>
-      </w:pPr>
-      <w:r>
-        <w:t xml:space="preserve">For the GM</w:t>
-      </w:r>
-    </w:p>
-    <w:p>
-      <w:pPr>
-        <w:pStyle w:val="FirstParagraph"/>
-      </w:pPr>
-      <w:r>
-        <w:t xml:space="preserve">GM commands need the</w:t>
-      </w:r>
-      <w:r>
-        <w:t xml:space="preserve"> </w:t>
-      </w:r>
-      <w:r>
-        <w:rPr>
-          <w:bCs/>
-          <w:b/>
-        </w:rPr>
-        <w:t xml:space="preserve">Manage Server</w:t>
-      </w:r>
-      <w:r>
-        <w:t xml:space="preserve"> </w:t>
-      </w:r>
-      <w:r>
-        <w:t xml:space="preserve">permission on the Discord server. Everyone can see clocks, tracks and points.</w:t>
-      </w:r>
-    </w:p>
-    <w:tbl>
-      <w:tblPr>
-        <w:tblStyle w:val="Table"/>
-        <w:tblW w:type="pct" w:w="5000"/>
-        <w:tblLook w:firstRow="1" w:lastRow="0" w:firstColumn="0" w:lastColumn="0" w:noHBand="0" w:noVBand="0" w:val="0020"/>
-        <w:jc w:val="start"/>
-        <w:tblBorders>
-          <w:top w:val="single" w:sz="4" w:color="B8C2D3"/>
-          <w:left w:val="single" w:sz="4" w:color="B8C2D3"/>
-          <w:bottom w:val="single" w:sz="4" w:color="B8C2D3"/>
-          <w:right w:val="single" w:sz="4" w:color="B8C2D3"/>
-          <w:insideH w:val="single" w:sz="4" w:color="B8C2D3"/>
-          <w:insideV w:val="single" w:sz="4" w:color="B8C2D3"/>
-        </w:tblBorders>
-      </w:tblPr>
-      <w:tblGrid>
-        <w:gridCol w:w="3960"/>
-        <w:gridCol w:w="3960"/>
-      </w:tblGrid>
-      <w:tr>
-        <w:trPr>
-          <w:tblHeader w:val="true"/>
-        </w:trPr>
-        <w:tc>
-          <w:tcPr>
-            <w:shd w:val="clear" w:fill="F1E6D2"/>
-          </w:tcPr>
-          <w:p>
-            <w:pPr>
-              <w:pStyle w:val="Compact"/>
-              <w:jc w:val="left"/>
-            </w:pPr>
-            <w:r>
-              <w:rPr>
-                <w:b/>
-                <w:sz w:val="19"/>
-              </w:rPr>
-              <w:t xml:space="preserve">Command</w:t>
-            </w:r>
-          </w:p>
-        </w:tc>
-        <w:tc>
-          <w:tcPr>
-            <w:shd w:val="clear" w:fill="F1E6D2"/>
-          </w:tcPr>
-          <w:p>
-            <w:pPr>
-              <w:pStyle w:val="Compact"/>
-              <w:jc w:val="left"/>
-            </w:pPr>
-            <w:r>
-              <w:rPr>
-                <w:b/>
-                <w:sz w:val="19"/>
-              </w:rPr>
-              <w:t xml:space="preserve">What it does</w:t>
-            </w:r>
-          </w:p>
-        </w:tc>
-      </w:tr>
-      <w:tr>
-        <w:tc>
-          <w:tcPr/>
-          <w:p>
-            <w:pPr>
-              <w:pStyle w:val="Compact"/>
-              <w:jc w:val="left"/>
-            </w:pPr>
-            <w:r>
-              <w:rPr>
-                <w:rStyle w:val="VerbatimChar"/>
-                <w:b/>
-                <w:sz w:val="19"/>
-              </w:rPr>
-              <w:t xml:space="preserve">/game set game:Grimm</w:t>
-            </w:r>
-          </w:p>
-        </w:tc>
-        <w:tc>
-          <w:tcPr/>
-          <w:p>
-            <w:pPr>
-              <w:pStyle w:val="Compact"/>
-              <w:jc w:val="left"/>
-            </w:pPr>
-            <w:r>
-              <w:rPr>
-                <w:sz w:val="19"/>
-              </w:rPr>
-              <w:t xml:space="preserve">Choose this server’s game. Do it once;</w:t>
-            </w:r>
-            <w:r>
-              <w:rPr>
-                <w:sz w:val="19"/>
-              </w:rPr>
-              <w:t xml:space="preserve"> </w:t>
-            </w:r>
-            <w:r>
-              <w:rPr>
-                <w:rStyle w:val="VerbatimChar"/>
-                <w:sz w:val="19"/>
-              </w:rPr>
-              <w:t xml:space="preserve">/game show</w:t>
-            </w:r>
-            <w:r>
-              <w:rPr>
-                <w:sz w:val="19"/>
-              </w:rPr>
-              <w:t xml:space="preserve"> </w:t>
-            </w:r>
-            <w:r>
-              <w:rPr>
-                <w:sz w:val="19"/>
-              </w:rPr>
-              <w:t xml:space="preserve">checks it.</w:t>
-            </w:r>
-          </w:p>
-        </w:tc>
-      </w:tr>
-      <w:tr>
-        <w:tc>
-          <w:tcPr/>
-          <w:p>
-            <w:pPr>
-              <w:pStyle w:val="Compact"/>
-              <w:jc w:val="left"/>
-            </w:pPr>
-            <w:r>
-              <w:rPr>
-                <w:rStyle w:val="VerbatimChar"/>
-                <w:b/>
-                <w:sz w:val="19"/>
-              </w:rPr>
-              <w:t xml:space="preserve">/points newsession</w:t>
-            </w:r>
-          </w:p>
-        </w:tc>
-        <w:tc>
-          <w:tcPr/>
-          <w:p>
-            <w:pPr>
-              <w:pStyle w:val="Compact"/>
-              <w:jc w:val="left"/>
-            </w:pPr>
-            <w:r>
-              <w:rPr>
-                <w:sz w:val="19"/>
-              </w:rPr>
-              <w:t xml:space="preserve">Start a session: everyone goes back to two Grit points, and unused points are gone.</w:t>
-            </w:r>
-          </w:p>
-        </w:tc>
-      </w:tr>
-      <w:tr>
-        <w:tc>
-          <w:tcPr/>
-          <w:p>
-            <w:pPr>
-              <w:pStyle w:val="Compact"/>
-              <w:jc w:val="left"/>
-            </w:pPr>
-            <w:r>
-              <w:rPr>
-                <w:rStyle w:val="VerbatimChar"/>
-                <w:b/>
-                <w:sz w:val="19"/>
-              </w:rPr>
-              <w:t xml:space="preserve">/points gain player:@name</w:t>
-            </w:r>
-          </w:p>
-        </w:tc>
-        <w:tc>
-          <w:tcPr/>
-          <w:p>
-            <w:pPr>
-              <w:pStyle w:val="Compact"/>
-              <w:jc w:val="left"/>
-            </w:pPr>
-            <w:r>
-              <w:rPr>
-                <w:sz w:val="19"/>
-              </w:rPr>
-              <w:t xml:space="preserve">Award a Grit point, e.g. for an accepted complication.</w:t>
-            </w:r>
-          </w:p>
-        </w:tc>
-      </w:tr>
-      <w:tr>
-        <w:tc>
-          <w:tcPr/>
-          <w:p>
-            <w:pPr>
-              <w:pStyle w:val="Compact"/>
-              <w:jc w:val="left"/>
-            </w:pPr>
-            <w:r>
-              <w:rPr>
-                <w:rStyle w:val="VerbatimChar"/>
-                <w:b/>
-                <w:sz w:val="19"/>
-              </w:rPr>
-              <w:t xml:space="preserve">/points set player:@name points:3</w:t>
-            </w:r>
-          </w:p>
-        </w:tc>
-        <w:tc>
-          <w:tcPr/>
-          <w:p>
-            <w:pPr>
-              <w:pStyle w:val="Compact"/>
-              <w:jc w:val="left"/>
-            </w:pPr>
-            <w:r>
-              <w:rPr>
-                <w:sz w:val="19"/>
-              </w:rPr>
-              <w:t xml:space="preserve">Correct a player’s total.</w:t>
-            </w:r>
-          </w:p>
-        </w:tc>
-      </w:tr>
-      <w:tr>
-        <w:tc>
-          <w:tcPr/>
-          <w:p>
-            <w:pPr>
-              <w:pStyle w:val="Compact"/>
-              <w:jc w:val="left"/>
-            </w:pPr>
-            <w:r>
-              <w:rPr>
-                <w:rStyle w:val="VerbatimChar"/>
-                <w:b/>
-                <w:sz w:val="19"/>
-              </w:rPr>
-              <w:t xml:space="preserve">/clock new name:"The mob forms" segments:6 kind:danger</w:t>
-            </w:r>
-          </w:p>
-        </w:tc>
-        <w:tc>
-          <w:tcPr/>
-          <w:p>
-            <w:pPr>
-              <w:pStyle w:val="Compact"/>
-              <w:jc w:val="left"/>
-            </w:pPr>
-            <w:r>
-              <w:rPr>
-                <w:sz w:val="19"/>
-              </w:rPr>
-              <w:t xml:space="preserve">Start a clock of 2, 4, 6 or 8 segments. Danger clocks fill on failures and time; use</w:t>
-            </w:r>
-            <w:r>
-              <w:rPr>
-                <w:sz w:val="19"/>
-              </w:rPr>
-              <w:t xml:space="preserve"> </w:t>
-            </w:r>
-            <w:r>
-              <w:rPr>
-                <w:rStyle w:val="VerbatimChar"/>
-                <w:sz w:val="19"/>
-              </w:rPr>
-              <w:t xml:space="preserve">kind:progress</w:t>
-            </w:r>
-            <w:r>
-              <w:rPr>
-                <w:sz w:val="19"/>
-              </w:rPr>
-              <w:t xml:space="preserve"> </w:t>
-            </w:r>
-            <w:r>
-              <w:rPr>
-                <w:sz w:val="19"/>
-              </w:rPr>
-              <w:t xml:space="preserve">for one that fills on successes.</w:t>
-            </w:r>
-          </w:p>
-        </w:tc>
-      </w:tr>
-      <w:tr>
-        <w:tc>
-          <w:tcPr/>
-          <w:p>
-            <w:pPr>
-              <w:pStyle w:val="Compact"/>
-              <w:jc w:val="left"/>
-            </w:pPr>
-            <w:r>
-              <w:rPr>
-                <w:rStyle w:val="VerbatimChar"/>
-                <w:b/>
-                <w:sz w:val="19"/>
-              </w:rPr>
-              <w:t xml:space="preserve">/clock tick name:"The mob forms"</w:t>
-            </w:r>
-          </w:p>
-        </w:tc>
-        <w:tc>
-          <w:tcPr/>
-          <w:p>
-            <w:pPr>
-              <w:pStyle w:val="Compact"/>
-              <w:jc w:val="left"/>
-            </w:pPr>
-            <w:r>
-              <w:rPr>
-                <w:sz w:val="19"/>
-              </w:rPr>
-              <w:t xml:space="preserve">Fill one segment. Add</w:t>
-            </w:r>
-            <w:r>
-              <w:rPr>
-                <w:sz w:val="19"/>
-              </w:rPr>
-              <w:t xml:space="preserve"> </w:t>
-            </w:r>
-            <w:r>
-              <w:rPr>
-                <w:rStyle w:val="VerbatimChar"/>
-                <w:sz w:val="19"/>
-              </w:rPr>
-              <w:t xml:space="preserve">segments:2</w:t>
-            </w:r>
-            <w:r>
-              <w:rPr>
-                <w:sz w:val="19"/>
-              </w:rPr>
-              <w:t xml:space="preserve"> </w:t>
-            </w:r>
-            <w:r>
-              <w:rPr>
-                <w:sz w:val="19"/>
-              </w:rPr>
-              <w:t xml:space="preserve">for two, or</w:t>
-            </w:r>
-            <w:r>
-              <w:rPr>
-                <w:sz w:val="19"/>
-              </w:rPr>
-              <w:t xml:space="preserve"> </w:t>
-            </w:r>
-            <w:r>
-              <w:rPr>
-                <w:rStyle w:val="VerbatimChar"/>
-                <w:sz w:val="19"/>
-              </w:rPr>
-              <w:t xml:space="preserve">segments:-1</w:t>
-            </w:r>
-            <w:r>
-              <w:rPr>
-                <w:sz w:val="19"/>
-              </w:rPr>
-              <w:t xml:space="preserve"> </w:t>
-            </w:r>
-            <w:r>
-              <w:rPr>
-                <w:sz w:val="19"/>
-              </w:rPr>
-              <w:t xml:space="preserve">to undo.</w:t>
-            </w:r>
-            <w:r>
-              <w:rPr>
-                <w:sz w:val="19"/>
-              </w:rPr>
-              <w:t xml:space="preserve"> </w:t>
-            </w:r>
-            <w:r>
-              <w:rPr>
-                <w:rStyle w:val="VerbatimChar"/>
-                <w:sz w:val="19"/>
-              </w:rPr>
-              <w:t xml:space="preserve">/clock remove</w:t>
-            </w:r>
-            <w:r>
-              <w:rPr>
-                <w:sz w:val="19"/>
-              </w:rPr>
-              <w:t xml:space="preserve"> </w:t>
-            </w:r>
-            <w:r>
-              <w:rPr>
-                <w:sz w:val="19"/>
-              </w:rPr>
-              <w:t xml:space="preserve">deletes a clock.</w:t>
-            </w:r>
-          </w:p>
-        </w:tc>
-      </w:tr>
-      <w:tr>
-        <w:tc>
-          <w:tcPr/>
-          <w:p>
-            <w:pPr>
-              <w:pStyle w:val="Compact"/>
-              <w:jc w:val="left"/>
-            </w:pPr>
-            <w:r>
-              <w:rPr>
-                <w:rStyle w:val="VerbatimChar"/>
-                <w:b/>
-                <w:sz w:val="19"/>
-              </w:rPr>
-              <w:t xml:space="preserve">/track mark name:exposure</w:t>
-            </w:r>
-          </w:p>
-        </w:tc>
-        <w:tc>
-          <w:tcPr/>
-          <w:p>
-            <w:pPr>
-              <w:pStyle w:val="Compact"/>
-              <w:jc w:val="left"/>
-            </w:pPr>
-            <w:r>
-              <w:rPr>
-                <w:sz w:val="19"/>
-              </w:rPr>
-              <w:t xml:space="preserve">Mark a box on a track; a partial name works (</w:t>
-            </w:r>
-            <w:r>
-              <w:rPr>
-                <w:sz w:val="19"/>
-              </w:rPr>
-              <w:t xml:space="preserve">“</w:t>
-            </w:r>
-            <w:r>
-              <w:rPr>
-                <w:sz w:val="19"/>
-              </w:rPr>
-              <w:t xml:space="preserve">exposure</w:t>
-            </w:r>
-            <w:r>
-              <w:rPr>
-                <w:sz w:val="19"/>
-              </w:rPr>
-              <w:t xml:space="preserve">”</w:t>
-            </w:r>
-            <w:r>
-              <w:rPr>
-                <w:sz w:val="19"/>
-              </w:rPr>
-              <w:t xml:space="preserve"> </w:t>
-            </w:r>
-            <w:r>
-              <w:rPr>
-                <w:sz w:val="19"/>
-              </w:rPr>
-              <w:t xml:space="preserve">finds Exposure).</w:t>
-            </w:r>
-            <w:r>
-              <w:rPr>
-                <w:sz w:val="19"/>
-              </w:rPr>
-              <w:t xml:space="preserve"> </w:t>
-            </w:r>
-            <w:r>
-              <w:rPr>
-                <w:rStyle w:val="VerbatimChar"/>
-                <w:sz w:val="19"/>
-              </w:rPr>
-              <w:t xml:space="preserve">/track clear</w:t>
-            </w:r>
-            <w:r>
-              <w:rPr>
-                <w:sz w:val="19"/>
-              </w:rPr>
-              <w:t xml:space="preserve"> </w:t>
-            </w:r>
-            <w:r>
-              <w:rPr>
-                <w:sz w:val="19"/>
-              </w:rPr>
-              <w:t xml:space="preserve">clears one, and</w:t>
-            </w:r>
-            <w:r>
-              <w:rPr>
-                <w:sz w:val="19"/>
-              </w:rPr>
-              <w:t xml:space="preserve"> </w:t>
-            </w:r>
-            <w:r>
-              <w:rPr>
-                <w:rStyle w:val="VerbatimChar"/>
-                <w:sz w:val="19"/>
-              </w:rPr>
-              <w:t xml:space="preserve">/track reset</w:t>
-            </w:r>
-            <w:r>
-              <w:rPr>
-                <w:sz w:val="19"/>
-              </w:rPr>
-              <w:t xml:space="preserve"> </w:t>
-            </w:r>
-            <w:r>
-              <w:rPr>
-                <w:sz w:val="19"/>
-              </w:rPr>
-              <w:t xml:space="preserve">clears them all.</w:t>
-            </w:r>
-          </w:p>
-        </w:tc>
-      </w:tr>
-      <w:tr>
-        <w:tc>
-          <w:tcPr/>
-          <w:p>
-            <w:pPr>
-              <w:pStyle w:val="Compact"/>
-              <w:jc w:val="left"/>
-            </w:pPr>
-            <w:r>
-              <w:rPr>
-                <w:rStyle w:val="VerbatimChar"/>
-                <w:b/>
-                <w:sz w:val="19"/>
-              </w:rPr>
-              <w:t xml:space="preserve">/seed</w:t>
-            </w:r>
-          </w:p>
-        </w:tc>
-        <w:tc>
-          <w:tcPr/>
-          <w:p>
-            <w:pPr>
-              <w:pStyle w:val="Compact"/>
-              <w:jc w:val="left"/>
-            </w:pPr>
-            <w:r>
-              <w:rPr>
-                <w:sz w:val="19"/>
-              </w:rPr>
-              <w:t xml:space="preserve">Roll an adventure seed: one line from each seed table, and the command to start its ticking clock.</w:t>
-            </w:r>
-          </w:p>
-        </w:tc>
-      </w:tr>
-      <w:tr>
-        <w:tc>
-          <w:tcPr/>
-          <w:p>
-            <w:pPr>
-              <w:pStyle w:val="Compact"/>
-              <w:jc w:val="left"/>
-            </w:pPr>
-            <w:r>
-              <w:rPr>
-                <w:rStyle w:val="VerbatimChar"/>
-                <w:b/>
-                <w:sz w:val="19"/>
-              </w:rPr>
-              <w:t xml:space="preserve">/contest ... defender:me</w:t>
-            </w:r>
-          </w:p>
-        </w:tc>
-        <w:tc>
-          <w:tcPr/>
-          <w:p>
-            <w:pPr>
-              <w:pStyle w:val="Compact"/>
-              <w:jc w:val="left"/>
-            </w:pPr>
-            <w:r>
-              <w:rPr>
-                <w:sz w:val="19"/>
-              </w:rPr>
-              <w:t xml:space="preserve">When a player resists you (a grapple, a lie, a chase), they are the defender: ties and double failures go to them.</w:t>
-            </w:r>
-          </w:p>
-        </w:tc>
-      </w:tr>
-    </w:tbl>
-    <w:p>
-      <w:pPr>
-        <w:pStyle w:val="BodyText"/>
-      </w:pPr>
-      <w:r>
-        <w:t xml:space="preserve">Each server keeps its own points, clocks and tracks. If a command is missing from Discord’s list, open the bot’s</w:t>
-      </w:r>
-      <w:r>
-        <w:t xml:space="preserve"> </w:t>
-      </w:r>
-      <w:r>
-        <w:rPr>
-          <w:rStyle w:val="VerbatimChar"/>
-        </w:rPr>
-        <w:t xml:space="preserve">/register</w:t>
-      </w:r>
-      <w:r>
-        <w:t xml:space="preserve"> </w:t>
-      </w:r>
-      <w:r>
-        <w:t xml:space="preserve">page once (see the bot’s README), then press Ctrl+R in Discord.</w:t>
-      </w:r>
-      <w:r>
-        <w:t xml:space="preserve"> </w:t>
-      </w:r>
-    </w:p>
-    <w:bookmarkEnd w:id="121"/>
-    <w:bookmarkEnd w:id="122"/>
     <w:sectPr/>
   </w:body>
 </w:document>

</xml_diff>

<commit_message>
Grimm: range bands, and an effective range for every weapon
Co-Authored-By: Claude Opus 5.5 <noreply@anthropic.com>
Claude-Session: https://claude.ai/code/session_015SADCFzhKijkC2foUmXrpC
</commit_message>
<xml_diff>
--- a/grimm-west/Grimm_Players_Guide.docx
+++ b/grimm-west/Grimm_Players_Guide.docx
@@ -6305,7 +6305,7 @@
     </w:p>
     <w:bookmarkEnd w:id="54"/>
     <w:bookmarkEnd w:id="55"/>
-    <w:bookmarkStart w:id="62" w:name="personal-combat"/>
+    <w:bookmarkStart w:id="63" w:name="personal-combat"/>
     <w:p>
       <w:pPr>
         <w:pStyle w:val="Heading1"/>
@@ -6358,7 +6358,366 @@
       </w:r>
     </w:p>
     <w:bookmarkEnd w:id="57"/>
-    <w:bookmarkStart w:id="59" w:name="injury"/>
+    <w:bookmarkStart w:id="58" w:name="range"/>
+    <w:p>
+      <w:pPr>
+        <w:pStyle w:val="Heading2"/>
+      </w:pPr>
+      <w:r>
+        <w:t xml:space="preserve">Range</w:t>
+      </w:r>
+    </w:p>
+    <w:p>
+      <w:pPr>
+        <w:pStyle w:val="FirstParagraph"/>
+      </w:pPr>
+      <w:r>
+        <w:t xml:space="preserve">Distances fall into five bands:</w:t>
+      </w:r>
+    </w:p>
+    <w:tbl>
+      <w:tblPr>
+        <w:tblStyle w:val="Table"/>
+        <w:tblW w:type="pct" w:w="5000"/>
+        <w:tblLook w:firstRow="1" w:lastRow="0" w:firstColumn="0" w:lastColumn="0" w:noHBand="0" w:noVBand="0" w:val="0020"/>
+        <w:jc w:val="start"/>
+        <w:tblBorders>
+          <w:top w:val="single" w:sz="4" w:color="B8C2D3"/>
+          <w:left w:val="single" w:sz="4" w:color="B8C2D3"/>
+          <w:bottom w:val="single" w:sz="4" w:color="B8C2D3"/>
+          <w:right w:val="single" w:sz="4" w:color="B8C2D3"/>
+          <w:insideH w:val="single" w:sz="4" w:color="B8C2D3"/>
+          <w:insideV w:val="single" w:sz="4" w:color="B8C2D3"/>
+        </w:tblBorders>
+      </w:tblPr>
+      <w:tblGrid>
+        <w:gridCol w:w="2640"/>
+        <w:gridCol w:w="2640"/>
+        <w:gridCol w:w="2640"/>
+      </w:tblGrid>
+      <w:tr>
+        <w:trPr>
+          <w:tblHeader w:val="true"/>
+        </w:trPr>
+        <w:tc>
+          <w:tcPr>
+            <w:shd w:val="clear" w:fill="F1E6D2"/>
+          </w:tcPr>
+          <w:p>
+            <w:pPr>
+              <w:pStyle w:val="Compact"/>
+              <w:jc w:val="left"/>
+            </w:pPr>
+            <w:r>
+              <w:rPr>
+                <w:b/>
+                <w:sz w:val="19"/>
+              </w:rPr>
+              <w:t xml:space="preserve">Band</w:t>
+            </w:r>
+          </w:p>
+        </w:tc>
+        <w:tc>
+          <w:tcPr>
+            <w:shd w:val="clear" w:fill="F1E6D2"/>
+          </w:tcPr>
+          <w:p>
+            <w:pPr>
+              <w:pStyle w:val="Compact"/>
+              <w:jc w:val="left"/>
+            </w:pPr>
+            <w:r>
+              <w:rPr>
+                <w:b/>
+                <w:sz w:val="19"/>
+              </w:rPr>
+              <w:t xml:space="preserve">Distance</w:t>
+            </w:r>
+          </w:p>
+        </w:tc>
+        <w:tc>
+          <w:tcPr>
+            <w:shd w:val="clear" w:fill="F1E6D2"/>
+          </w:tcPr>
+          <w:p>
+            <w:pPr>
+              <w:pStyle w:val="Compact"/>
+              <w:jc w:val="left"/>
+            </w:pPr>
+            <w:r>
+              <w:rPr>
+                <w:b/>
+                <w:sz w:val="19"/>
+              </w:rPr>
+              <w:t xml:space="preserve">For example</w:t>
+            </w:r>
+          </w:p>
+        </w:tc>
+      </w:tr>
+      <w:tr>
+        <w:tc>
+          <w:tcPr/>
+          <w:p>
+            <w:pPr>
+              <w:pStyle w:val="Compact"/>
+              <w:jc w:val="left"/>
+            </w:pPr>
+            <w:r>
+              <w:rPr>
+                <w:b/>
+                <w:sz w:val="19"/>
+              </w:rPr>
+              <w:t xml:space="preserve">Close</w:t>
+            </w:r>
+          </w:p>
+        </w:tc>
+        <w:tc>
+          <w:tcPr/>
+          <w:p>
+            <w:pPr>
+              <w:pStyle w:val="Compact"/>
+              <w:jc w:val="left"/>
+            </w:pPr>
+            <w:r>
+              <w:rPr>
+                <w:sz w:val="19"/>
+              </w:rPr>
+              <w:t xml:space="preserve">Up to 10 yards</w:t>
+            </w:r>
+          </w:p>
+        </w:tc>
+        <w:tc>
+          <w:tcPr/>
+          <w:p>
+            <w:pPr>
+              <w:pStyle w:val="Compact"/>
+              <w:jc w:val="left"/>
+            </w:pPr>
+            <w:r>
+              <w:rPr>
+                <w:sz w:val="19"/>
+              </w:rPr>
+              <w:t xml:space="preserve">Across a room or a saloon; one move covers it</w:t>
+            </w:r>
+          </w:p>
+        </w:tc>
+      </w:tr>
+      <w:tr>
+        <w:tc>
+          <w:tcPr/>
+          <w:p>
+            <w:pPr>
+              <w:pStyle w:val="Compact"/>
+              <w:jc w:val="left"/>
+            </w:pPr>
+            <w:r>
+              <w:rPr>
+                <w:b/>
+                <w:sz w:val="19"/>
+              </w:rPr>
+              <w:t xml:space="preserve">Short</w:t>
+            </w:r>
+          </w:p>
+        </w:tc>
+        <w:tc>
+          <w:tcPr/>
+          <w:p>
+            <w:pPr>
+              <w:pStyle w:val="Compact"/>
+              <w:jc w:val="left"/>
+            </w:pPr>
+            <w:r>
+              <w:rPr>
+                <w:sz w:val="19"/>
+              </w:rPr>
+              <w:t xml:space="preserve">Up to 50 yards</w:t>
+            </w:r>
+          </w:p>
+        </w:tc>
+        <w:tc>
+          <w:tcPr/>
+          <w:p>
+            <w:pPr>
+              <w:pStyle w:val="Compact"/>
+              <w:jc w:val="left"/>
+            </w:pPr>
+            <w:r>
+              <w:rPr>
+                <w:sz w:val="19"/>
+              </w:rPr>
+              <w:t xml:space="preserve">Across a street or a corral</w:t>
+            </w:r>
+          </w:p>
+        </w:tc>
+      </w:tr>
+      <w:tr>
+        <w:tc>
+          <w:tcPr/>
+          <w:p>
+            <w:pPr>
+              <w:pStyle w:val="Compact"/>
+              <w:jc w:val="left"/>
+            </w:pPr>
+            <w:r>
+              <w:rPr>
+                <w:b/>
+                <w:sz w:val="19"/>
+              </w:rPr>
+              <w:t xml:space="preserve">Medium</w:t>
+            </w:r>
+          </w:p>
+        </w:tc>
+        <w:tc>
+          <w:tcPr/>
+          <w:p>
+            <w:pPr>
+              <w:pStyle w:val="Compact"/>
+              <w:jc w:val="left"/>
+            </w:pPr>
+            <w:r>
+              <w:rPr>
+                <w:sz w:val="19"/>
+              </w:rPr>
+              <w:t xml:space="preserve">Up to 150 yards</w:t>
+            </w:r>
+          </w:p>
+        </w:tc>
+        <w:tc>
+          <w:tcPr/>
+          <w:p>
+            <w:pPr>
+              <w:pStyle w:val="Compact"/>
+              <w:jc w:val="left"/>
+            </w:pPr>
+            <w:r>
+              <w:rPr>
+                <w:sz w:val="19"/>
+              </w:rPr>
+              <w:t xml:space="preserve">Down the length of a town</w:t>
+            </w:r>
+          </w:p>
+        </w:tc>
+      </w:tr>
+      <w:tr>
+        <w:tc>
+          <w:tcPr/>
+          <w:p>
+            <w:pPr>
+              <w:pStyle w:val="Compact"/>
+              <w:jc w:val="left"/>
+            </w:pPr>
+            <w:r>
+              <w:rPr>
+                <w:b/>
+                <w:sz w:val="19"/>
+              </w:rPr>
+              <w:t xml:space="preserve">Long</w:t>
+            </w:r>
+          </w:p>
+        </w:tc>
+        <w:tc>
+          <w:tcPr/>
+          <w:p>
+            <w:pPr>
+              <w:pStyle w:val="Compact"/>
+              <w:jc w:val="left"/>
+            </w:pPr>
+            <w:r>
+              <w:rPr>
+                <w:sz w:val="19"/>
+              </w:rPr>
+              <w:t xml:space="preserve">Up to 500 yards</w:t>
+            </w:r>
+          </w:p>
+        </w:tc>
+        <w:tc>
+          <w:tcPr/>
+          <w:p>
+            <w:pPr>
+              <w:pStyle w:val="Compact"/>
+              <w:jc w:val="left"/>
+            </w:pPr>
+            <w:r>
+              <w:rPr>
+                <w:sz w:val="19"/>
+              </w:rPr>
+              <w:t xml:space="preserve">Across a valley or a river crossing</w:t>
+            </w:r>
+          </w:p>
+        </w:tc>
+      </w:tr>
+      <w:tr>
+        <w:tc>
+          <w:tcPr/>
+          <w:p>
+            <w:pPr>
+              <w:pStyle w:val="Compact"/>
+              <w:jc w:val="left"/>
+            </w:pPr>
+            <w:r>
+              <w:rPr>
+                <w:b/>
+                <w:sz w:val="19"/>
+              </w:rPr>
+              <w:t xml:space="preserve">Extreme</w:t>
+            </w:r>
+          </w:p>
+        </w:tc>
+        <w:tc>
+          <w:tcPr/>
+          <w:p>
+            <w:pPr>
+              <w:pStyle w:val="Compact"/>
+              <w:jc w:val="left"/>
+            </w:pPr>
+            <w:r>
+              <w:rPr>
+                <w:sz w:val="19"/>
+              </w:rPr>
+              <w:t xml:space="preserve">Up to a mile, in line of sight</w:t>
+            </w:r>
+          </w:p>
+        </w:tc>
+        <w:tc>
+          <w:tcPr/>
+          <w:p>
+            <w:pPr>
+              <w:pStyle w:val="Compact"/>
+              <w:jc w:val="left"/>
+            </w:pPr>
+            <w:r>
+              <w:rPr>
+                <w:sz w:val="19"/>
+              </w:rPr>
+              <w:t xml:space="preserve">Ridge to ridge</w:t>
+            </w:r>
+          </w:p>
+        </w:tc>
+      </w:tr>
+    </w:tbl>
+    <w:p>
+      <w:pPr>
+        <w:pStyle w:val="BodyText"/>
+      </w:pPr>
+      <w:r>
+        <w:t xml:space="preserve">Every ranged weapon has an</w:t>
+      </w:r>
+      <w:r>
+        <w:t xml:space="preserve"> </w:t>
+      </w:r>
+      <w:r>
+        <w:rPr>
+          <w:bCs/>
+          <w:b/>
+        </w:rPr>
+        <w:t xml:space="preserve">effective band</w:t>
+      </w:r>
+      <w:r>
+        <w:t xml:space="preserve">, shown in the weapons table. Attacks within it take no penalty. One band beyond it is −2, two bands beyond is −4, and anything farther is out of range. Weapons in hand, claws and fists reach only someone next to you. Your move each turn covers the Close band; give up your action to run and you cover Short.</w:t>
+      </w:r>
+    </w:p>
+    <w:bookmarkEnd w:id="58"/>
+    <w:bookmarkStart w:id="60" w:name="injury"/>
     <w:p>
       <w:pPr>
         <w:pStyle w:val="Heading2"/>
@@ -6647,7 +7006,7 @@
         <w:t xml:space="preserve">Injury penalties replace each other rather than stacking. They apply to movement, attacks, Dodge, and other tasks the injury physically hinders.</w:t>
       </w:r>
     </w:p>
-    <w:bookmarkStart w:id="58" w:name="dying-and-death"/>
+    <w:bookmarkStart w:id="59" w:name="dying-and-death"/>
     <w:p>
       <w:pPr>
         <w:pStyle w:val="Heading3"/>
@@ -6759,9 +7118,9 @@
         <w:t xml:space="preserve">Your protection is avoiding the hit: Dodge, cover, and a Grit point, which reduces a hit by one box.</w:t>
       </w:r>
     </w:p>
-    <w:bookmarkEnd w:id="58"/>
     <w:bookmarkEnd w:id="59"/>
-    <w:bookmarkStart w:id="60" w:name="weapons-and-damage"/>
+    <w:bookmarkEnd w:id="60"/>
+    <w:bookmarkStart w:id="61" w:name="weapons-and-damage"/>
     <w:p>
       <w:pPr>
         <w:pStyle w:val="Heading2"/>
@@ -6807,9 +7166,10 @@
         </w:tblBorders>
       </w:tblPr>
       <w:tblGrid>
-        <w:gridCol w:w="2640"/>
-        <w:gridCol w:w="2640"/>
-        <w:gridCol w:w="2640"/>
+        <w:gridCol w:w="1980"/>
+        <w:gridCol w:w="1980"/>
+        <w:gridCol w:w="1980"/>
+        <w:gridCol w:w="1980"/>
       </w:tblGrid>
       <w:tr>
         <w:trPr>
@@ -6847,7 +7207,7 @@
                 <w:b/>
                 <w:sz w:val="19"/>
               </w:rPr>
-              <w:t xml:space="preserve">Boxes on a hit</w:t>
+              <w:t xml:space="preserve">Range</w:t>
             </w:r>
           </w:p>
         </w:tc>
@@ -6865,6 +7225,24 @@
                 <w:b/>
                 <w:sz w:val="19"/>
               </w:rPr>
+              <w:t xml:space="preserve">Boxes on a hit</w:t>
+            </w:r>
+          </w:p>
+        </w:tc>
+        <w:tc>
+          <w:tcPr>
+            <w:shd w:val="clear" w:fill="F1E6D2"/>
+          </w:tcPr>
+          <w:p>
+            <w:pPr>
+              <w:pStyle w:val="Compact"/>
+              <w:jc w:val="left"/>
+            </w:pPr>
+            <w:r>
+              <w:rPr>
+                <w:b/>
+                <w:sz w:val="19"/>
+              </w:rPr>
               <w:t xml:space="preserve">What the injury looks like</w:t>
             </w:r>
           </w:p>
@@ -6898,6 +7276,21 @@
               <w:rPr>
                 <w:sz w:val="19"/>
               </w:rPr>
+              <w:t xml:space="preserve">Melee</w:t>
+            </w:r>
+          </w:p>
+        </w:tc>
+        <w:tc>
+          <w:tcPr/>
+          <w:p>
+            <w:pPr>
+              <w:pStyle w:val="Compact"/>
+              <w:jc w:val="left"/>
+            </w:pPr>
+            <w:r>
+              <w:rPr>
+                <w:sz w:val="19"/>
+              </w:rPr>
               <w:t xml:space="preserve">1</w:t>
             </w:r>
           </w:p>
@@ -6946,6 +7339,21 @@
               <w:rPr>
                 <w:sz w:val="19"/>
               </w:rPr>
+              <w:t xml:space="preserve">Melee</w:t>
+            </w:r>
+          </w:p>
+        </w:tc>
+        <w:tc>
+          <w:tcPr/>
+          <w:p>
+            <w:pPr>
+              <w:pStyle w:val="Compact"/>
+              <w:jc w:val="left"/>
+            </w:pPr>
+            <w:r>
+              <w:rPr>
+                <w:sz w:val="19"/>
+              </w:rPr>
               <w:t xml:space="preserve">1</w:t>
             </w:r>
           </w:p>
@@ -6979,7 +7387,22 @@
                 <w:b/>
                 <w:sz w:val="19"/>
               </w:rPr>
-              <w:t xml:space="preserve">Knife, hatchet, arrow</w:t>
+              <w:t xml:space="preserve">Knife or hatchet</w:t>
+            </w:r>
+          </w:p>
+        </w:tc>
+        <w:tc>
+          <w:tcPr/>
+          <w:p>
+            <w:pPr>
+              <w:pStyle w:val="Compact"/>
+              <w:jc w:val="left"/>
+            </w:pPr>
+            <w:r>
+              <w:rPr>
+                <w:sz w:val="19"/>
+              </w:rPr>
+              <w:t xml:space="preserve">Melee; Close thrown</w:t>
             </w:r>
           </w:p>
         </w:tc>
@@ -7027,6 +7450,69 @@
                 <w:b/>
                 <w:sz w:val="19"/>
               </w:rPr>
+              <w:t xml:space="preserve">Arrow</w:t>
+            </w:r>
+          </w:p>
+        </w:tc>
+        <w:tc>
+          <w:tcPr/>
+          <w:p>
+            <w:pPr>
+              <w:pStyle w:val="Compact"/>
+              <w:jc w:val="left"/>
+            </w:pPr>
+            <w:r>
+              <w:rPr>
+                <w:sz w:val="19"/>
+              </w:rPr>
+              <w:t xml:space="preserve">Medium</w:t>
+            </w:r>
+          </w:p>
+        </w:tc>
+        <w:tc>
+          <w:tcPr/>
+          <w:p>
+            <w:pPr>
+              <w:pStyle w:val="Compact"/>
+              <w:jc w:val="left"/>
+            </w:pPr>
+            <w:r>
+              <w:rPr>
+                <w:sz w:val="19"/>
+              </w:rPr>
+              <w:t xml:space="preserve">1</w:t>
+            </w:r>
+          </w:p>
+        </w:tc>
+        <w:tc>
+          <w:tcPr/>
+          <w:p>
+            <w:pPr>
+              <w:pStyle w:val="Compact"/>
+              <w:jc w:val="left"/>
+            </w:pPr>
+            <w:r>
+              <w:rPr>
+                <w:sz w:val="19"/>
+              </w:rPr>
+              <w:t xml:space="preserve">A cut or stab wound that bleeds</w:t>
+            </w:r>
+          </w:p>
+        </w:tc>
+      </w:tr>
+      <w:tr>
+        <w:tc>
+          <w:tcPr/>
+          <w:p>
+            <w:pPr>
+              <w:pStyle w:val="Compact"/>
+              <w:jc w:val="left"/>
+            </w:pPr>
+            <w:r>
+              <w:rPr>
+                <w:b/>
+                <w:sz w:val="19"/>
+              </w:rPr>
               <w:t xml:space="preserve">Axe, saber, or an old Grimm weapon</w:t>
             </w:r>
           </w:p>
@@ -7042,6 +7528,21 @@
               <w:rPr>
                 <w:sz w:val="19"/>
               </w:rPr>
+              <w:t xml:space="preserve">Melee</w:t>
+            </w:r>
+          </w:p>
+        </w:tc>
+        <w:tc>
+          <w:tcPr/>
+          <w:p>
+            <w:pPr>
+              <w:pStyle w:val="Compact"/>
+              <w:jc w:val="left"/>
+            </w:pPr>
+            <w:r>
+              <w:rPr>
+                <w:sz w:val="19"/>
+              </w:rPr>
               <w:t xml:space="preserve">2</w:t>
             </w:r>
           </w:p>
@@ -7090,6 +7591,21 @@
               <w:rPr>
                 <w:sz w:val="19"/>
               </w:rPr>
+              <w:t xml:space="preserve">Medium</w:t>
+            </w:r>
+          </w:p>
+        </w:tc>
+        <w:tc>
+          <w:tcPr/>
+          <w:p>
+            <w:pPr>
+              <w:pStyle w:val="Compact"/>
+              <w:jc w:val="left"/>
+            </w:pPr>
+            <w:r>
+              <w:rPr>
+                <w:sz w:val="19"/>
+              </w:rPr>
               <w:t xml:space="preserve">2</w:t>
             </w:r>
           </w:p>
@@ -7138,6 +7654,21 @@
               <w:rPr>
                 <w:sz w:val="19"/>
               </w:rPr>
+              <w:t xml:space="preserve">Melee</w:t>
+            </w:r>
+          </w:p>
+        </w:tc>
+        <w:tc>
+          <w:tcPr/>
+          <w:p>
+            <w:pPr>
+              <w:pStyle w:val="Compact"/>
+              <w:jc w:val="left"/>
+            </w:pPr>
+            <w:r>
+              <w:rPr>
+                <w:sz w:val="19"/>
+              </w:rPr>
               <w:t xml:space="preserve">2</w:t>
             </w:r>
           </w:p>
@@ -7171,7 +7702,22 @@
                 <w:b/>
                 <w:sz w:val="19"/>
               </w:rPr>
-              <w:t xml:space="preserve">Derringer, revolver or rifle</w:t>
+              <w:t xml:space="preserve">Derringer</w:t>
+            </w:r>
+          </w:p>
+        </w:tc>
+        <w:tc>
+          <w:tcPr/>
+          <w:p>
+            <w:pPr>
+              <w:pStyle w:val="Compact"/>
+              <w:jc w:val="left"/>
+            </w:pPr>
+            <w:r>
+              <w:rPr>
+                <w:sz w:val="19"/>
+              </w:rPr>
+              <w:t xml:space="preserve">Close</w:t>
             </w:r>
           </w:p>
         </w:tc>
@@ -7219,7 +7765,148 @@
                 <w:b/>
                 <w:sz w:val="19"/>
               </w:rPr>
-              <w:t xml:space="preserve">Shotgun, within a few paces</w:t>
+              <w:t xml:space="preserve">Revolver</w:t>
+            </w:r>
+          </w:p>
+        </w:tc>
+        <w:tc>
+          <w:tcPr/>
+          <w:p>
+            <w:pPr>
+              <w:pStyle w:val="Compact"/>
+              <w:jc w:val="left"/>
+            </w:pPr>
+            <w:r>
+              <w:rPr>
+                <w:sz w:val="19"/>
+              </w:rPr>
+              <w:t xml:space="preserve">Short</w:t>
+            </w:r>
+          </w:p>
+        </w:tc>
+        <w:tc>
+          <w:tcPr/>
+          <w:p>
+            <w:pPr>
+              <w:pStyle w:val="Compact"/>
+              <w:jc w:val="left"/>
+            </w:pPr>
+            <w:r>
+              <w:rPr>
+                <w:sz w:val="19"/>
+              </w:rPr>
+              <w:t xml:space="preserve">2</w:t>
+            </w:r>
+          </w:p>
+        </w:tc>
+        <w:tc>
+          <w:tcPr/>
+          <w:p>
+            <w:pPr>
+              <w:pStyle w:val="Compact"/>
+              <w:jc w:val="left"/>
+            </w:pPr>
+            <w:r>
+              <w:rPr>
+                <w:sz w:val="19"/>
+              </w:rPr>
+              <w:t xml:space="preserve">A gunshot wound</w:t>
+            </w:r>
+          </w:p>
+        </w:tc>
+      </w:tr>
+      <w:tr>
+        <w:tc>
+          <w:tcPr/>
+          <w:p>
+            <w:pPr>
+              <w:pStyle w:val="Compact"/>
+              <w:jc w:val="left"/>
+            </w:pPr>
+            <w:r>
+              <w:rPr>
+                <w:b/>
+                <w:sz w:val="19"/>
+              </w:rPr>
+              <w:t xml:space="preserve">Rifle</w:t>
+            </w:r>
+          </w:p>
+        </w:tc>
+        <w:tc>
+          <w:tcPr/>
+          <w:p>
+            <w:pPr>
+              <w:pStyle w:val="Compact"/>
+              <w:jc w:val="left"/>
+            </w:pPr>
+            <w:r>
+              <w:rPr>
+                <w:sz w:val="19"/>
+              </w:rPr>
+              <w:t xml:space="preserve">Long</w:t>
+            </w:r>
+          </w:p>
+        </w:tc>
+        <w:tc>
+          <w:tcPr/>
+          <w:p>
+            <w:pPr>
+              <w:pStyle w:val="Compact"/>
+              <w:jc w:val="left"/>
+            </w:pPr>
+            <w:r>
+              <w:rPr>
+                <w:sz w:val="19"/>
+              </w:rPr>
+              <w:t xml:space="preserve">2</w:t>
+            </w:r>
+          </w:p>
+        </w:tc>
+        <w:tc>
+          <w:tcPr/>
+          <w:p>
+            <w:pPr>
+              <w:pStyle w:val="Compact"/>
+              <w:jc w:val="left"/>
+            </w:pPr>
+            <w:r>
+              <w:rPr>
+                <w:sz w:val="19"/>
+              </w:rPr>
+              <w:t xml:space="preserve">A gunshot wound</w:t>
+            </w:r>
+          </w:p>
+        </w:tc>
+      </w:tr>
+      <w:tr>
+        <w:tc>
+          <w:tcPr/>
+          <w:p>
+            <w:pPr>
+              <w:pStyle w:val="Compact"/>
+              <w:jc w:val="left"/>
+            </w:pPr>
+            <w:r>
+              <w:rPr>
+                <w:b/>
+                <w:sz w:val="19"/>
+              </w:rPr>
+              <w:t xml:space="preserve">Shotgun, at Close range</w:t>
+            </w:r>
+          </w:p>
+        </w:tc>
+        <w:tc>
+          <w:tcPr/>
+          <w:p>
+            <w:pPr>
+              <w:pStyle w:val="Compact"/>
+              <w:jc w:val="left"/>
+            </w:pPr>
+            <w:r>
+              <w:rPr>
+                <w:sz w:val="19"/>
+              </w:rPr>
+              <w:t xml:space="preserve">Close</w:t>
             </w:r>
           </w:p>
         </w:tc>
@@ -7267,7 +7954,22 @@
                 <w:b/>
                 <w:sz w:val="19"/>
               </w:rPr>
-              <w:t xml:space="preserve">Shotgun, farther away</w:t>
+              <w:t xml:space="preserve">Shotgun, at Short range</w:t>
+            </w:r>
+          </w:p>
+        </w:tc>
+        <w:tc>
+          <w:tcPr/>
+          <w:p>
+            <w:pPr>
+              <w:pStyle w:val="Compact"/>
+              <w:jc w:val="left"/>
+            </w:pPr>
+            <w:r>
+              <w:rPr>
+                <w:sz w:val="19"/>
+              </w:rPr>
+              <w:t xml:space="preserve">Short (no effect beyond)</w:t>
             </w:r>
           </w:p>
         </w:tc>
@@ -7330,6 +8032,21 @@
               <w:rPr>
                 <w:sz w:val="19"/>
               </w:rPr>
+              <w:t xml:space="preserve">Extreme</w:t>
+            </w:r>
+          </w:p>
+        </w:tc>
+        <w:tc>
+          <w:tcPr/>
+          <w:p>
+            <w:pPr>
+              <w:pStyle w:val="Compact"/>
+              <w:jc w:val="left"/>
+            </w:pPr>
+            <w:r>
+              <w:rPr>
+                <w:sz w:val="19"/>
+              </w:rPr>
               <w:t xml:space="preserve">3, and Dying</w:t>
             </w:r>
           </w:p>
@@ -7378,6 +8095,21 @@
               <w:rPr>
                 <w:sz w:val="19"/>
               </w:rPr>
+              <w:t xml:space="preserve">Close (thrown)</w:t>
+            </w:r>
+          </w:p>
+        </w:tc>
+        <w:tc>
+          <w:tcPr/>
+          <w:p>
+            <w:pPr>
+              <w:pStyle w:val="Compact"/>
+              <w:jc w:val="left"/>
+            </w:pPr>
+            <w:r>
+              <w:rPr>
+                <w:sz w:val="19"/>
+              </w:rPr>
               <w:t xml:space="preserve">1 to everyone nearby, 3 and Dying at the centre</w:t>
             </w:r>
           </w:p>
@@ -7426,6 +8158,21 @@
               <w:rPr>
                 <w:sz w:val="19"/>
               </w:rPr>
+              <w:t xml:space="preserve">—</w:t>
+            </w:r>
+          </w:p>
+        </w:tc>
+        <w:tc>
+          <w:tcPr/>
+          <w:p>
+            <w:pPr>
+              <w:pStyle w:val="Compact"/>
+              <w:jc w:val="left"/>
+            </w:pPr>
+            <w:r>
+              <w:rPr>
+                <w:sz w:val="19"/>
+              </w:rPr>
               <w:t xml:space="preserve">1 for a bad fall, 2 for a long one</w:t>
             </w:r>
           </w:p>
@@ -7460,6 +8207,21 @@
                 <w:sz w:val="19"/>
               </w:rPr>
               <w:t xml:space="preserve">Fire</w:t>
+            </w:r>
+          </w:p>
+        </w:tc>
+        <w:tc>
+          <w:tcPr/>
+          <w:p>
+            <w:pPr>
+              <w:pStyle w:val="Compact"/>
+              <w:jc w:val="left"/>
+            </w:pPr>
+            <w:r>
+              <w:rPr>
+                <w:sz w:val="19"/>
+              </w:rPr>
+              <w:t xml:space="preserve">—</w:t>
             </w:r>
           </w:p>
         </w:tc>
@@ -7513,8 +8275,8 @@
         <w:t xml:space="preserve">a Blutbad’s claws leave Deputy Ames Seriously wounded (two boxes). A revolver shot that gets through marks two more, but the track stops at three: Ames is Incapacitated and Dying, and a further 2-box hit would kill. Spending a Grit point on that revolver shot reduces it to one box, leaving Ames at three boxes but, because the hit only marked one, not Dying.</w:t>
       </w:r>
     </w:p>
-    <w:bookmarkEnd w:id="60"/>
-    <w:bookmarkStart w:id="61" w:name="guns-and-ammunition"/>
+    <w:bookmarkEnd w:id="61"/>
+    <w:bookmarkStart w:id="62" w:name="guns-and-ammunition"/>
     <w:p>
       <w:pPr>
         <w:pStyle w:val="Heading2"/>
@@ -7943,7 +8705,7 @@
               <w:rPr>
                 <w:sz w:val="19"/>
               </w:rPr>
-              <w:t xml:space="preserve">+2 to hit at close range</w:t>
+              <w:t xml:space="preserve">+2 to hit at Close range</w:t>
             </w:r>
           </w:p>
         </w:tc>
@@ -8100,9 +8862,9 @@
         <w:t xml:space="preserve">To take someone down without killing them, use fists, a club, a grapple, or knock-out drops from an Apothecary.</w:t>
       </w:r>
     </w:p>
-    <w:bookmarkEnd w:id="61"/>
     <w:bookmarkEnd w:id="62"/>
-    <w:bookmarkStart w:id="68" w:name="medical-care"/>
+    <w:bookmarkEnd w:id="63"/>
+    <w:bookmarkStart w:id="69" w:name="medical-care"/>
     <w:p>
       <w:pPr>
         <w:pStyle w:val="Heading1"/>
@@ -8119,7 +8881,7 @@
         <w:t xml:space="preserve">Frontier medicine in 1889 has chloroform, carbolic acid, laudanum and steady hands, and not much else. Wesen heal like humans, and some injuries need remedies from older traditions.</w:t>
       </w:r>
     </w:p>
-    <w:bookmarkStart w:id="63" w:name="diagnosis-and-stabilization"/>
+    <w:bookmarkStart w:id="64" w:name="diagnosis-and-stabilization"/>
     <w:p>
       <w:pPr>
         <w:pStyle w:val="Heading2"/>
@@ -8136,8 +8898,8 @@
         <w:t xml:space="preserve">Roll Medicine when the diagnosis is uncertain or an urgent treatment decision matters. Emergency stabilization takes one action and a successful Medicine roll with a doctor’s bag. It ends Dying and stops deterioration, but removes no boxes.</w:t>
       </w:r>
     </w:p>
-    <w:bookmarkEnd w:id="63"/>
-    <w:bookmarkStart w:id="64" w:name="field-treatment"/>
+    <w:bookmarkEnd w:id="64"/>
+    <w:bookmarkStart w:id="65" w:name="field-treatment"/>
     <w:p>
       <w:pPr>
         <w:pStyle w:val="Heading2"/>
@@ -8154,8 +8916,8 @@
         <w:t xml:space="preserve">With a doctor’s bag and several uninterrupted minutes, successful Medicine removes one injury box; success by 5 or more removes two. Each injury receives one field-treatment attempt; further attempts need changed circumstances.</w:t>
       </w:r>
     </w:p>
-    <w:bookmarkEnd w:id="64"/>
-    <w:bookmarkStart w:id="65" w:name="a-doctors-surgery"/>
+    <w:bookmarkEnd w:id="65"/>
+    <w:bookmarkStart w:id="66" w:name="a-doctors-surgery"/>
     <w:p>
       <w:pPr>
         <w:pStyle w:val="Heading2"/>
@@ -8172,8 +8934,8 @@
         <w:t xml:space="preserve">A proper surgery with instruments, chloroform and a clean table grants +2 to Medicine. A successful treatment removes two boxes; success by 5 or more removes three. Allow the time the operation requires.</w:t>
       </w:r>
     </w:p>
-    <w:bookmarkEnd w:id="65"/>
-    <w:bookmarkStart w:id="66" w:name="remedies-and-poisons"/>
+    <w:bookmarkEnd w:id="66"/>
+    <w:bookmarkStart w:id="67" w:name="remedies-and-poisons"/>
     <w:p>
       <w:pPr>
         <w:pStyle w:val="Heading2"/>
@@ -8190,8 +8952,8 @@
         <w:t xml:space="preserve">Apothecary treats what Medicine can’t: Wesen poisons, curses, magical sickness and Wesen-specific ailments. Finding the right remedy usually means first identifying the cause (Wesen Lore or Occult), then brewing it (Apothecary, with an apothecary kit). A remedy can substitute for field treatment against such harm.</w:t>
       </w:r>
     </w:p>
-    <w:bookmarkEnd w:id="66"/>
-    <w:bookmarkStart w:id="67" w:name="natural-recovery"/>
+    <w:bookmarkEnd w:id="67"/>
+    <w:bookmarkStart w:id="68" w:name="natural-recovery"/>
     <w:p>
       <w:pPr>
         <w:pStyle w:val="Heading2"/>
@@ -8224,9 +8986,9 @@
         <w:t xml:space="preserve">clear one injury box. Rest means no riding, no fighting, nothing strenuous. At three boxes, rest alone clears nothing: treatment must clear the first box.</w:t>
       </w:r>
     </w:p>
-    <w:bookmarkEnd w:id="67"/>
     <w:bookmarkEnd w:id="68"/>
-    <w:bookmarkStart w:id="72" w:name="grit-points-and-trouble"/>
+    <w:bookmarkEnd w:id="69"/>
+    <w:bookmarkStart w:id="73" w:name="grit-points-and-trouble"/>
     <w:p>
       <w:pPr>
         <w:pStyle w:val="Heading1"/>
@@ -8235,7 +8997,7 @@
         <w:t xml:space="preserve">Grit points and Trouble</w:t>
       </w:r>
     </w:p>
-    <w:bookmarkStart w:id="69" w:name="using-grit-points"/>
+    <w:bookmarkStart w:id="70" w:name="using-grit-points"/>
     <w:p>
       <w:pPr>
         <w:pStyle w:val="Heading2"/>
@@ -8420,8 +9182,8 @@
         <w:t xml:space="preserve">Gain one point when one of your complications creates a meaningful problem you accept, including a companion complication from a heritage advantage. You can decline the proposed complication without penalty.</w:t>
       </w:r>
     </w:p>
-    <w:bookmarkEnd w:id="69"/>
-    <w:bookmarkStart w:id="70" w:name="trouble"/>
+    <w:bookmarkEnd w:id="70"/>
+    <w:bookmarkStart w:id="71" w:name="trouble"/>
     <w:p>
       <w:pPr>
         <w:pStyle w:val="Heading2"/>
@@ -8722,8 +9484,8 @@
         <w:t xml:space="preserve">Lying low between cases, a good cover story (Deception), or doing the town a public good can clear a box per case.</w:t>
       </w:r>
     </w:p>
-    <w:bookmarkEnd w:id="70"/>
-    <w:bookmarkStart w:id="71" w:name="advancement"/>
+    <w:bookmarkEnd w:id="71"/>
+    <w:bookmarkStart w:id="72" w:name="advancement"/>
     <w:p>
       <w:pPr>
         <w:pStyle w:val="Heading2"/>
@@ -8740,9 +9502,9 @@
         <w:t xml:space="preserve">After a significant case, the GM may authorize one relevant skill to advance from Untrained to Trained or from Trained to Specialty, or allow revision of an advantage or complication. Only an Old hand’s starting skill is Expert; a skill raised later tops out at Specialty (+3) unless they broaden (see Step 3).</w:t>
       </w:r>
     </w:p>
-    <w:bookmarkEnd w:id="71"/>
     <w:bookmarkEnd w:id="72"/>
-    <w:bookmarkStart w:id="75" w:name="running-cases"/>
+    <w:bookmarkEnd w:id="73"/>
+    <w:bookmarkStart w:id="76" w:name="running-cases"/>
     <w:p>
       <w:pPr>
         <w:pStyle w:val="Heading1"/>
@@ -8751,7 +9513,7 @@
         <w:t xml:space="preserve">Running cases</w:t>
       </w:r>
     </w:p>
-    <w:bookmarkStart w:id="73" w:name="case-seeds"/>
+    <w:bookmarkStart w:id="74" w:name="case-seeds"/>
     <w:p>
       <w:pPr>
         <w:pStyle w:val="Heading2"/>
@@ -11067,8 +11829,8 @@
         </w:tc>
       </w:tr>
     </w:tbl>
-    <w:bookmarkEnd w:id="73"/>
-    <w:bookmarkStart w:id="74" w:name="the-case-journal"/>
+    <w:bookmarkEnd w:id="74"/>
+    <w:bookmarkStart w:id="75" w:name="the-case-journal"/>
     <w:p>
       <w:pPr>
         <w:pStyle w:val="Heading2"/>
@@ -11195,9 +11957,9 @@
         <w:t xml:space="preserve">After a significant case, the GM may authorize one skill step for each character.</w:t>
       </w:r>
     </w:p>
-    <w:bookmarkEnd w:id="74"/>
     <w:bookmarkEnd w:id="75"/>
-    <w:bookmarkStart w:id="82" w:name="ready-made-characters"/>
+    <w:bookmarkEnd w:id="76"/>
+    <w:bookmarkStart w:id="83" w:name="ready-made-characters"/>
     <w:p>
       <w:pPr>
         <w:pStyle w:val="Heading1"/>
@@ -11214,7 +11976,7 @@
         <w:t xml:space="preserve">Six characters ready to play. Each follows the creation rules exactly, Edges included, and their connections tie them together.</w:t>
       </w:r>
     </w:p>
-    <w:bookmarkStart w:id="76" w:name="eliza-kessler"/>
+    <w:bookmarkStart w:id="77" w:name="eliza-kessler"/>
     <w:p>
       <w:pPr>
         <w:pStyle w:val="Heading2"/>
@@ -11393,8 +12155,8 @@
         <w:t xml:space="preserve">Gus Brandt cut her down from a lynch mob’s rope before anyone knew what she was.</w:t>
       </w:r>
     </w:p>
-    <w:bookmarkEnd w:id="76"/>
-    <w:bookmarkStart w:id="77" w:name="gus-brandt"/>
+    <w:bookmarkEnd w:id="77"/>
+    <w:bookmarkStart w:id="78" w:name="gus-brandt"/>
     <w:p>
       <w:pPr>
         <w:pStyle w:val="Heading2"/>
@@ -11589,8 +12351,8 @@
         <w:t xml:space="preserve">Owes Roz Vey for the remedies that keep the urge quiet.</w:t>
       </w:r>
     </w:p>
-    <w:bookmarkEnd w:id="77"/>
-    <w:bookmarkStart w:id="78" w:name="roz-vey"/>
+    <w:bookmarkEnd w:id="78"/>
+    <w:bookmarkStart w:id="79" w:name="roz-vey"/>
     <w:p>
       <w:pPr>
         <w:pStyle w:val="Heading2"/>
@@ -11769,8 +12531,8 @@
         <w:t xml:space="preserve">Trades notes with Dr. Whitlock, who still won’t admit some of her remedies work better than his.</w:t>
       </w:r>
     </w:p>
-    <w:bookmarkEnd w:id="78"/>
-    <w:bookmarkStart w:id="79" w:name="dr.-thaddeus-whitlock"/>
+    <w:bookmarkEnd w:id="79"/>
+    <w:bookmarkStart w:id="80" w:name="dr.-thaddeus-whitlock"/>
     <w:p>
       <w:pPr>
         <w:pStyle w:val="Heading2"/>
@@ -11949,8 +12711,8 @@
         <w:t xml:space="preserve">Rode with Silas Thorne’s regiment in the war and has never trusted him since.</w:t>
       </w:r>
     </w:p>
-    <w:bookmarkEnd w:id="79"/>
-    <w:bookmarkStart w:id="80" w:name="cora-ridgeway"/>
+    <w:bookmarkEnd w:id="80"/>
+    <w:bookmarkStart w:id="81" w:name="cora-ridgeway"/>
     <w:p>
       <w:pPr>
         <w:pStyle w:val="Heading2"/>
@@ -12145,8 +12907,8 @@
         <w:t xml:space="preserve">Eliza Kessler taught her what she knows about the hidden world.</w:t>
       </w:r>
     </w:p>
-    <w:bookmarkEnd w:id="80"/>
-    <w:bookmarkStart w:id="81" w:name="silas-thorne"/>
+    <w:bookmarkEnd w:id="81"/>
+    <w:bookmarkStart w:id="82" w:name="silas-thorne"/>
     <w:p>
       <w:pPr>
         <w:pStyle w:val="Heading2"/>
@@ -12325,9 +13087,9 @@
         <w:t xml:space="preserve">Plays cards with Cora every Saturday; she’s the only one who can tell when he’s bluffing.</w:t>
       </w:r>
     </w:p>
-    <w:bookmarkEnd w:id="81"/>
     <w:bookmarkEnd w:id="82"/>
-    <w:bookmarkStart w:id="83" w:name="threats"/>
+    <w:bookmarkEnd w:id="83"/>
+    <w:bookmarkStart w:id="84" w:name="threats"/>
     <w:p>
       <w:pPr>
         <w:pStyle w:val="Heading1"/>
@@ -13598,8 +14360,8 @@
         <w:t xml:space="preserve">For a tougher version, add +1 to its targets and one box; for a weaker one, subtract.</w:t>
       </w:r>
     </w:p>
-    <w:bookmarkEnd w:id="83"/>
-    <w:bookmarkStart w:id="84" w:name="advantages"/>
+    <w:bookmarkEnd w:id="84"/>
+    <w:bookmarkStart w:id="85" w:name="advantages"/>
     <w:p>
       <w:pPr>
         <w:pStyle w:val="Heading1"/>
@@ -14355,8 +15117,8 @@
         <w:t xml:space="preserve">A badge is legal authority, not a magic word: Wesen, outlaws and the powers of the hidden world don’t care about it, and it carries a duty. Your superiors can give you orders, and abusing the badge or failing in your duty can cost you it. Law callings (Marshal, Deputy) usually take one, as their advantage or as a second advantage Edge. A Pinkerton detective takes Pinkerton Credentials instead: the agency’s reach and files, but no badge.</w:t>
       </w:r>
     </w:p>
-    <w:bookmarkEnd w:id="84"/>
-    <w:bookmarkStart w:id="106" w:name="heritages"/>
+    <w:bookmarkEnd w:id="85"/>
+    <w:bookmarkStart w:id="107" w:name="heritages"/>
     <w:p>
       <w:pPr>
         <w:pStyle w:val="Heading1"/>
@@ -15761,7 +16523,7 @@
         </w:tc>
       </w:tr>
     </w:tbl>
-    <w:bookmarkStart w:id="85" w:name="core-wesen-rules"/>
+    <w:bookmarkStart w:id="86" w:name="core-wesen-rules"/>
     <w:p>
       <w:pPr>
         <w:pStyle w:val="Heading2"/>
@@ -16073,8 +16835,8 @@
         <w:t xml:space="preserve">means each hit that marks 2 or more boxes marks one fewer, never below 1.</w:t>
       </w:r>
     </w:p>
-    <w:bookmarkEnd w:id="85"/>
-    <w:bookmarkStart w:id="86" w:name="human"/>
+    <w:bookmarkEnd w:id="86"/>
+    <w:bookmarkStart w:id="87" w:name="human"/>
     <w:p>
       <w:pPr>
         <w:pStyle w:val="Heading2"/>
@@ -16319,8 +17081,8 @@
         <w:t xml:space="preserve">Source: No template</w:t>
       </w:r>
     </w:p>
-    <w:bookmarkEnd w:id="86"/>
-    <w:bookmarkStart w:id="87" w:name="bauerschwein"/>
+    <w:bookmarkEnd w:id="87"/>
+    <w:bookmarkStart w:id="88" w:name="bauerschwein"/>
     <w:p>
       <w:pPr>
         <w:pStyle w:val="Heading2"/>
@@ -16625,8 +17387,8 @@
         <w:t xml:space="preserve">Source: No template; adapted from the show.</w:t>
       </w:r>
     </w:p>
-    <w:bookmarkEnd w:id="87"/>
-    <w:bookmarkStart w:id="88" w:name="coyotl"/>
+    <w:bookmarkEnd w:id="88"/>
+    <w:bookmarkStart w:id="89" w:name="coyotl"/>
     <w:p>
       <w:pPr>
         <w:pStyle w:val="Heading2"/>
@@ -16907,8 +17669,8 @@
         <w:t xml:space="preserve">Source: Coyotl template: DX +2, HT +1, ST +2. About 141 points.</w:t>
       </w:r>
     </w:p>
-    <w:bookmarkEnd w:id="88"/>
-    <w:bookmarkStart w:id="89" w:name="eisbiber"/>
+    <w:bookmarkEnd w:id="89"/>
+    <w:bookmarkStart w:id="90" w:name="eisbiber"/>
     <w:p>
       <w:pPr>
         <w:pStyle w:val="Heading2"/>
@@ -17189,8 +17951,8 @@
         <w:t xml:space="preserve">Source: No template; adapted from the show.</w:t>
       </w:r>
     </w:p>
-    <w:bookmarkEnd w:id="89"/>
-    <w:bookmarkStart w:id="90" w:name="fuchsbau"/>
+    <w:bookmarkEnd w:id="90"/>
+    <w:bookmarkStart w:id="91" w:name="fuchsbau"/>
     <w:p>
       <w:pPr>
         <w:pStyle w:val="Heading2"/>
@@ -17533,8 +18295,8 @@
         <w:t xml:space="preserve">Source: Fuchsbau template: IQ +2; Bad Reputation (disreputable among Wesen). About 132 points.</w:t>
       </w:r>
     </w:p>
-    <w:bookmarkEnd w:id="90"/>
-    <w:bookmarkStart w:id="91" w:name="mauzhertz"/>
+    <w:bookmarkEnd w:id="91"/>
+    <w:bookmarkStart w:id="92" w:name="mauzhertz"/>
     <w:p>
       <w:pPr>
         <w:pStyle w:val="Heading2"/>
@@ -17815,8 +18577,8 @@
         <w:t xml:space="preserve">Source: No template; adapted from the show.</w:t>
       </w:r>
     </w:p>
-    <w:bookmarkEnd w:id="91"/>
-    <w:bookmarkStart w:id="92" w:name="steinadler"/>
+    <w:bookmarkEnd w:id="92"/>
+    <w:bookmarkStart w:id="93" w:name="steinadler"/>
     <w:p>
       <w:pPr>
         <w:pStyle w:val="Heading2"/>
@@ -18097,8 +18859,8 @@
         <w:t xml:space="preserve">Source: No template; adapted from the show.</w:t>
       </w:r>
     </w:p>
-    <w:bookmarkEnd w:id="92"/>
-    <w:bookmarkStart w:id="93" w:name="taniwha"/>
+    <w:bookmarkEnd w:id="93"/>
+    <w:bookmarkStart w:id="94" w:name="taniwha"/>
     <w:p>
       <w:pPr>
         <w:pStyle w:val="Heading2"/>
@@ -18431,8 +19193,8 @@
         <w:t xml:space="preserve">Source: Taniwha template (150-point): poison resistance; Dependency (human flesh, seasonal). About 157 points.</w:t>
       </w:r>
     </w:p>
-    <w:bookmarkEnd w:id="93"/>
-    <w:bookmarkStart w:id="94" w:name="ziegevolk"/>
+    <w:bookmarkEnd w:id="94"/>
+    <w:bookmarkStart w:id="95" w:name="ziegevolk"/>
     <w:p>
       <w:pPr>
         <w:pStyle w:val="Heading2"/>
@@ -18713,8 +19475,8 @@
         <w:t xml:space="preserve">Source: No template; adapted from the show.</w:t>
       </w:r>
     </w:p>
-    <w:bookmarkEnd w:id="94"/>
-    <w:bookmarkStart w:id="95" w:name="blutbad"/>
+    <w:bookmarkEnd w:id="95"/>
+    <w:bookmarkStart w:id="96" w:name="blutbad"/>
     <w:p>
       <w:pPr>
         <w:pStyle w:val="Heading2"/>
@@ -19081,8 +19843,8 @@
         <w:t xml:space="preserve">Source: Blutbaad template: DX +3, HT +2, ST +2; Loner; Enemy (Bauerschwein). About 208 points.</w:t>
       </w:r>
     </w:p>
-    <w:bookmarkEnd w:id="95"/>
-    <w:bookmarkStart w:id="96" w:name="grimm"/>
+    <w:bookmarkEnd w:id="96"/>
+    <w:bookmarkStart w:id="97" w:name="grimm"/>
     <w:p>
       <w:pPr>
         <w:pStyle w:val="Heading2"/>
@@ -19999,8 +20761,8 @@
         <w:t xml:space="preserve">Source: Decapitare template: ST, DX, HT +1; Combat Reflexes; Detect (Wesen, Magic); Magic Resistance 7; Talent (Grimm); Reputation (Frightening Decapitare).</w:t>
       </w:r>
     </w:p>
-    <w:bookmarkEnd w:id="96"/>
-    <w:bookmarkStart w:id="97" w:name="incantare"/>
+    <w:bookmarkEnd w:id="97"/>
+    <w:bookmarkStart w:id="98" w:name="incantare"/>
     <w:p>
       <w:pPr>
         <w:pStyle w:val="Heading2"/>
@@ -20621,8 +21383,8 @@
         <w:t xml:space="preserve">Source: Incantare template: seven Lenses (Ritual Path Magic).</w:t>
       </w:r>
     </w:p>
-    <w:bookmarkEnd w:id="97"/>
-    <w:bookmarkStart w:id="98" w:name="jägerbär"/>
+    <w:bookmarkEnd w:id="98"/>
+    <w:bookmarkStart w:id="99" w:name="jägerbär"/>
     <w:p>
       <w:pPr>
         <w:pStyle w:val="Heading2"/>
@@ -20903,8 +21665,8 @@
         <w:t xml:space="preserve">Source: No template; adapted from the show.</w:t>
       </w:r>
     </w:p>
-    <w:bookmarkEnd w:id="98"/>
-    <w:bookmarkStart w:id="99" w:name="mauvais-dentes"/>
+    <w:bookmarkEnd w:id="99"/>
+    <w:bookmarkStart w:id="100" w:name="mauvais-dentes"/>
     <w:p>
       <w:pPr>
         <w:pStyle w:val="Heading2"/>
@@ -21209,8 +21971,8 @@
         <w:t xml:space="preserve">Source: Mauvais Dentes template: DX +2, HT +3, ST +3; Loner. About 213 points.</w:t>
       </w:r>
     </w:p>
-    <w:bookmarkEnd w:id="99"/>
-    <w:bookmarkStart w:id="100" w:name="naschazer"/>
+    <w:bookmarkEnd w:id="100"/>
+    <w:bookmarkStart w:id="101" w:name="naschazer"/>
     <w:p>
       <w:pPr>
         <w:pStyle w:val="Heading2"/>
@@ -21515,8 +22277,8 @@
         <w:t xml:space="preserve">Source: Naschazer template: HT +4; Dependency and Uncontrollable Appetite (human flesh); Greed; Proud. About 197 points.</w:t>
       </w:r>
     </w:p>
-    <w:bookmarkEnd w:id="100"/>
-    <w:bookmarkStart w:id="101" w:name="skalengeck"/>
+    <w:bookmarkEnd w:id="101"/>
+    <w:bookmarkStart w:id="102" w:name="skalengeck"/>
     <w:p>
       <w:pPr>
         <w:pStyle w:val="Heading2"/>
@@ -21797,8 +22559,8 @@
         <w:t xml:space="preserve">Source: Skalengeck template: no human-form changes. About 189 points.</w:t>
       </w:r>
     </w:p>
-    <w:bookmarkEnd w:id="101"/>
-    <w:bookmarkStart w:id="102" w:name="vallachi"/>
+    <w:bookmarkEnd w:id="102"/>
+    <w:bookmarkStart w:id="103" w:name="vallachi"/>
     <w:p>
       <w:pPr>
         <w:pStyle w:val="Heading2"/>
@@ -22139,8 +22901,8 @@
         <w:t xml:space="preserve">Source: Vallachi template: Attractive; Extended Lifespan; HT +2; Dependency and Uncontrollable Appetite (lifeforce); Weakness (sunlight); Lifebane. About 223 points.</w:t>
       </w:r>
     </w:p>
-    <w:bookmarkEnd w:id="102"/>
-    <w:bookmarkStart w:id="103" w:name="fuchsteufelwild"/>
+    <w:bookmarkEnd w:id="103"/>
+    <w:bookmarkStart w:id="104" w:name="fuchsteufelwild"/>
     <w:p>
       <w:pPr>
         <w:pStyle w:val="Heading2"/>
@@ -22473,8 +23235,8 @@
         <w:t xml:space="preserve">Source: Fuchsteurfelwild template: ST +1, HT +2, IQ +3, Super Jump 5; Obsession (Guess My Name); Bully; Callous; Sadism (now a companion). About 424 points; trimmed to Tier 3.</w:t>
       </w:r>
     </w:p>
-    <w:bookmarkEnd w:id="103"/>
-    <w:bookmarkStart w:id="104" w:name="hexenbiest-or-zauberbiest"/>
+    <w:bookmarkEnd w:id="104"/>
+    <w:bookmarkStart w:id="105" w:name="hexenbiest-or-zauberbiest"/>
     <w:p>
       <w:pPr>
         <w:pStyle w:val="Heading2"/>
@@ -22881,8 +23643,8 @@
         <w:t xml:space="preserve">Source: Hexenbiest and Zauberbiest template: Beautiful/Handsome; Sorcery 5; Ritual Adept 2; Vow (coven traditions). About 279 points.</w:t>
       </w:r>
     </w:p>
-    <w:bookmarkEnd w:id="104"/>
-    <w:bookmarkStart w:id="105" w:name="murcielago"/>
+    <w:bookmarkEnd w:id="105"/>
+    <w:bookmarkStart w:id="106" w:name="murcielago"/>
     <w:p>
       <w:pPr>
         <w:pStyle w:val="Heading2"/>
@@ -23187,9 +23949,9 @@
         <w:t xml:space="preserve">Source: Murcielago template: no human-form changes; Sonic Scream 6, Sonar. About 283 points.</w:t>
       </w:r>
     </w:p>
-    <w:bookmarkEnd w:id="105"/>
     <w:bookmarkEnd w:id="106"/>
-    <w:bookmarkStart w:id="117" w:name="making-your-own"/>
+    <w:bookmarkEnd w:id="107"/>
+    <w:bookmarkStart w:id="118" w:name="making-your-own"/>
     <w:p>
       <w:pPr>
         <w:pStyle w:val="Heading1"/>
@@ -23222,7 +23984,7 @@
         <w:t xml:space="preserve">option at the end of each list, and its checklist holds a custom choice to the same rules as everything else.</w:t>
       </w:r>
     </w:p>
-    <w:bookmarkStart w:id="107" w:name="a-custom-calling"/>
+    <w:bookmarkStart w:id="108" w:name="a-custom-calling"/>
     <w:p>
       <w:pPr>
         <w:pStyle w:val="Heading2"/>
@@ -23398,8 +24160,8 @@
         <w:t xml:space="preserve">.</w:t>
       </w:r>
     </w:p>
-    <w:bookmarkEnd w:id="107"/>
-    <w:bookmarkStart w:id="116" w:name="a-custom-heritage"/>
+    <w:bookmarkEnd w:id="108"/>
+    <w:bookmarkStart w:id="117" w:name="a-custom-heritage"/>
     <w:p>
       <w:pPr>
         <w:pStyle w:val="Heading2"/>
@@ -23416,7 +24178,7 @@
         <w:t xml:space="preserve">Build it with the GM, one step at a time.</w:t>
       </w:r>
     </w:p>
-    <w:bookmarkStart w:id="108" w:name="the-concept"/>
+    <w:bookmarkStart w:id="109" w:name="the-concept"/>
     <w:p>
       <w:pPr>
         <w:pStyle w:val="Heading3"/>
@@ -23433,8 +24195,8 @@
         <w:t xml:space="preserve">Two or three sentences: where they come from, what sets them apart, and how others see them. It should be something the heritages in this book don’t already cover.</w:t>
       </w:r>
     </w:p>
-    <w:bookmarkEnd w:id="108"/>
-    <w:bookmarkStart w:id="109" w:name="the-tier"/>
+    <w:bookmarkEnd w:id="109"/>
+    <w:bookmarkStart w:id="110" w:name="the-tier"/>
     <w:p>
       <w:pPr>
         <w:pStyle w:val="Heading3"/>
@@ -23731,8 +24493,8 @@
         <w:t xml:space="preserve">When in doubt, choose the higher tier.</w:t>
       </w:r>
     </w:p>
-    <w:bookmarkEnd w:id="109"/>
-    <w:bookmarkStart w:id="110" w:name="attribute-adjustments"/>
+    <w:bookmarkEnd w:id="110"/>
+    <w:bookmarkStart w:id="111" w:name="attribute-adjustments"/>
     <w:p>
       <w:pPr>
         <w:pStyle w:val="Heading3"/>
@@ -23778,8 +24540,8 @@
         <w:t xml:space="preserve">: a +2 needs a −2 or two −1s. The adjustments move the attribute’s base (+1 starts it at 11) and raise its starting maximum (13 plus the bonus). Most heritages change two to four attributes.</w:t>
       </w:r>
     </w:p>
-    <w:bookmarkEnd w:id="110"/>
-    <w:bookmarkStart w:id="111" w:name="core-rules-tier-1-and-up"/>
+    <w:bookmarkEnd w:id="111"/>
+    <w:bookmarkStart w:id="112" w:name="core-rules-tier-1-and-up"/>
     <w:p>
       <w:pPr>
         <w:pStyle w:val="Heading3"/>
@@ -23796,8 +24558,8 @@
         <w:t xml:space="preserve">One to three short rules that always apply: what they can do (see in the dark, resist cold, a free Trained skill) and what it costs (a weakness, a people’s distrust, a hazard they can’t abide). A strength with no drawback is worth more than it looks, so price it a tier higher.</w:t>
       </w:r>
     </w:p>
-    <w:bookmarkEnd w:id="111"/>
-    <w:bookmarkStart w:id="112" w:name="heritage-advantages"/>
+    <w:bookmarkEnd w:id="112"/>
+    <w:bookmarkStart w:id="113" w:name="heritage-advantages"/>
     <w:p>
       <w:pPr>
         <w:pStyle w:val="Heading3"/>
@@ -23852,8 +24614,8 @@
         <w:t xml:space="preserve">: a problem the trait causes, with a clear trigger and a real consequence, which earns a Grit point when it bites, like any complication. A character takes one advantage, general or heritage, so make them distinct choices.</w:t>
       </w:r>
     </w:p>
-    <w:bookmarkEnd w:id="112"/>
-    <w:bookmarkStart w:id="113" w:name="a-woge-optional-tier-2-or-3"/>
+    <w:bookmarkEnd w:id="113"/>
+    <w:bookmarkStart w:id="114" w:name="a-woge-optional-tier-2-or-3"/>
     <w:p>
       <w:pPr>
         <w:pStyle w:val="Heading3"/>
@@ -23886,8 +24648,8 @@
         <w:t xml:space="preserve">apply.</w:t>
       </w:r>
     </w:p>
-    <w:bookmarkEnd w:id="113"/>
-    <w:bookmarkStart w:id="114" w:name="in-the-creator"/>
+    <w:bookmarkEnd w:id="114"/>
+    <w:bookmarkStart w:id="115" w:name="in-the-creator"/>
     <w:p>
       <w:pPr>
         <w:pStyle w:val="Heading3"/>
@@ -23992,8 +24754,8 @@
         <w:t xml:space="preserve">and enter the advantage and its companion complication.</w:t>
       </w:r>
     </w:p>
-    <w:bookmarkEnd w:id="114"/>
-    <w:bookmarkStart w:id="115" w:name="example"/>
+    <w:bookmarkEnd w:id="115"/>
+    <w:bookmarkStart w:id="116" w:name="example"/>
     <w:p>
       <w:pPr>
         <w:pStyle w:val="Heading3"/>
@@ -24098,10 +24860,10 @@
         <w:t xml:space="preserve">: Wesen recognize their own, and some want you back in the fold; accept the visit at the worst time.</w:t>
       </w:r>
     </w:p>
-    <w:bookmarkEnd w:id="115"/>
     <w:bookmarkEnd w:id="116"/>
     <w:bookmarkEnd w:id="117"/>
-    <w:bookmarkStart w:id="118" w:name="complications"/>
+    <w:bookmarkEnd w:id="118"/>
+    <w:bookmarkStart w:id="119" w:name="complications"/>
     <w:p>
       <w:pPr>
         <w:pStyle w:val="Heading1"/>
@@ -24905,8 +25667,8 @@
         </w:tc>
       </w:tr>
     </w:tbl>
-    <w:bookmarkEnd w:id="118"/>
-    <w:bookmarkStart w:id="119" w:name="quick-reference"/>
+    <w:bookmarkEnd w:id="119"/>
+    <w:bookmarkStart w:id="120" w:name="quick-reference"/>
     <w:p>
       <w:pPr>
         <w:pStyle w:val="Heading1"/>
@@ -25113,7 +25875,7 @@
         <w:t xml:space="preserve">start each session with two (three with True grit). Reroll, reduce an injury by one box, or establish a small preparation. Earn one from an accepted complication.</w:t>
       </w:r>
     </w:p>
-    <w:bookmarkEnd w:id="119"/>
+    <w:bookmarkEnd w:id="120"/>
     <w:sectPr/>
   </w:body>
 </w:document>

</xml_diff>

<commit_message>
Dust & Damnation and Grimm: period ranges (revolver Close, rifle Medium, buffalo rifle Long, derringer out beyond Short)
Co-Authored-By: Claude Opus 5.5 <noreply@anthropic.com>
Claude-Session: https://claude.ai/code/session_015SADCFzhKijkC2foUmXrpC
</commit_message>
<xml_diff>
--- a/grimm-west/Grimm_Players_Guide.docx
+++ b/grimm-west/Grimm_Players_Guide.docx
@@ -7465,6 +7465,384 @@
               <w:rPr>
                 <w:sz w:val="19"/>
               </w:rPr>
+              <w:t xml:space="preserve">Short</w:t>
+            </w:r>
+          </w:p>
+        </w:tc>
+        <w:tc>
+          <w:tcPr/>
+          <w:p>
+            <w:pPr>
+              <w:pStyle w:val="Compact"/>
+              <w:jc w:val="left"/>
+            </w:pPr>
+            <w:r>
+              <w:rPr>
+                <w:sz w:val="19"/>
+              </w:rPr>
+              <w:t xml:space="preserve">1</w:t>
+            </w:r>
+          </w:p>
+        </w:tc>
+        <w:tc>
+          <w:tcPr/>
+          <w:p>
+            <w:pPr>
+              <w:pStyle w:val="Compact"/>
+              <w:jc w:val="left"/>
+            </w:pPr>
+            <w:r>
+              <w:rPr>
+                <w:sz w:val="19"/>
+              </w:rPr>
+              <w:t xml:space="preserve">A cut or stab wound that bleeds</w:t>
+            </w:r>
+          </w:p>
+        </w:tc>
+      </w:tr>
+      <w:tr>
+        <w:tc>
+          <w:tcPr/>
+          <w:p>
+            <w:pPr>
+              <w:pStyle w:val="Compact"/>
+              <w:jc w:val="left"/>
+            </w:pPr>
+            <w:r>
+              <w:rPr>
+                <w:b/>
+                <w:sz w:val="19"/>
+              </w:rPr>
+              <w:t xml:space="preserve">Axe, saber, or an old Grimm weapon</w:t>
+            </w:r>
+          </w:p>
+        </w:tc>
+        <w:tc>
+          <w:tcPr/>
+          <w:p>
+            <w:pPr>
+              <w:pStyle w:val="Compact"/>
+              <w:jc w:val="left"/>
+            </w:pPr>
+            <w:r>
+              <w:rPr>
+                <w:sz w:val="19"/>
+              </w:rPr>
+              <w:t xml:space="preserve">Melee</w:t>
+            </w:r>
+          </w:p>
+        </w:tc>
+        <w:tc>
+          <w:tcPr/>
+          <w:p>
+            <w:pPr>
+              <w:pStyle w:val="Compact"/>
+              <w:jc w:val="left"/>
+            </w:pPr>
+            <w:r>
+              <w:rPr>
+                <w:sz w:val="19"/>
+              </w:rPr>
+              <w:t xml:space="preserve">2</w:t>
+            </w:r>
+          </w:p>
+        </w:tc>
+        <w:tc>
+          <w:tcPr/>
+          <w:p>
+            <w:pPr>
+              <w:pStyle w:val="Compact"/>
+              <w:jc w:val="left"/>
+            </w:pPr>
+            <w:r>
+              <w:rPr>
+                <w:sz w:val="19"/>
+              </w:rPr>
+              <w:t xml:space="preserve">A deep wound or a broken bone</w:t>
+            </w:r>
+          </w:p>
+        </w:tc>
+      </w:tr>
+      <w:tr>
+        <w:tc>
+          <w:tcPr/>
+          <w:p>
+            <w:pPr>
+              <w:pStyle w:val="Compact"/>
+              <w:jc w:val="left"/>
+            </w:pPr>
+            <w:r>
+              <w:rPr>
+                <w:b/>
+                <w:sz w:val="19"/>
+              </w:rPr>
+              <w:t xml:space="preserve">Crossbow</w:t>
+            </w:r>
+          </w:p>
+        </w:tc>
+        <w:tc>
+          <w:tcPr/>
+          <w:p>
+            <w:pPr>
+              <w:pStyle w:val="Compact"/>
+              <w:jc w:val="left"/>
+            </w:pPr>
+            <w:r>
+              <w:rPr>
+                <w:sz w:val="19"/>
+              </w:rPr>
+              <w:t xml:space="preserve">Short</w:t>
+            </w:r>
+          </w:p>
+        </w:tc>
+        <w:tc>
+          <w:tcPr/>
+          <w:p>
+            <w:pPr>
+              <w:pStyle w:val="Compact"/>
+              <w:jc w:val="left"/>
+            </w:pPr>
+            <w:r>
+              <w:rPr>
+                <w:sz w:val="19"/>
+              </w:rPr>
+              <w:t xml:space="preserve">2</w:t>
+            </w:r>
+          </w:p>
+        </w:tc>
+        <w:tc>
+          <w:tcPr/>
+          <w:p>
+            <w:pPr>
+              <w:pStyle w:val="Compact"/>
+              <w:jc w:val="left"/>
+            </w:pPr>
+            <w:r>
+              <w:rPr>
+                <w:sz w:val="19"/>
+              </w:rPr>
+              <w:t xml:space="preserve">A bolt deep in the flesh</w:t>
+            </w:r>
+          </w:p>
+        </w:tc>
+      </w:tr>
+      <w:tr>
+        <w:tc>
+          <w:tcPr/>
+          <w:p>
+            <w:pPr>
+              <w:pStyle w:val="Compact"/>
+              <w:jc w:val="left"/>
+            </w:pPr>
+            <w:r>
+              <w:rPr>
+                <w:b/>
+                <w:sz w:val="19"/>
+              </w:rPr>
+              <w:t xml:space="preserve">Claws and fangs of a predator Wesen in full woge</w:t>
+            </w:r>
+          </w:p>
+        </w:tc>
+        <w:tc>
+          <w:tcPr/>
+          <w:p>
+            <w:pPr>
+              <w:pStyle w:val="Compact"/>
+              <w:jc w:val="left"/>
+            </w:pPr>
+            <w:r>
+              <w:rPr>
+                <w:sz w:val="19"/>
+              </w:rPr>
+              <w:t xml:space="preserve">Melee</w:t>
+            </w:r>
+          </w:p>
+        </w:tc>
+        <w:tc>
+          <w:tcPr/>
+          <w:p>
+            <w:pPr>
+              <w:pStyle w:val="Compact"/>
+              <w:jc w:val="left"/>
+            </w:pPr>
+            <w:r>
+              <w:rPr>
+                <w:sz w:val="19"/>
+              </w:rPr>
+              <w:t xml:space="preserve">2</w:t>
+            </w:r>
+          </w:p>
+        </w:tc>
+        <w:tc>
+          <w:tcPr/>
+          <w:p>
+            <w:pPr>
+              <w:pStyle w:val="Compact"/>
+              <w:jc w:val="left"/>
+            </w:pPr>
+            <w:r>
+              <w:rPr>
+                <w:sz w:val="19"/>
+              </w:rPr>
+              <w:t xml:space="preserve">Torn flesh</w:t>
+            </w:r>
+          </w:p>
+        </w:tc>
+      </w:tr>
+      <w:tr>
+        <w:tc>
+          <w:tcPr/>
+          <w:p>
+            <w:pPr>
+              <w:pStyle w:val="Compact"/>
+              <w:jc w:val="left"/>
+            </w:pPr>
+            <w:r>
+              <w:rPr>
+                <w:b/>
+                <w:sz w:val="19"/>
+              </w:rPr>
+              <w:t xml:space="preserve">Derringer</w:t>
+            </w:r>
+          </w:p>
+        </w:tc>
+        <w:tc>
+          <w:tcPr/>
+          <w:p>
+            <w:pPr>
+              <w:pStyle w:val="Compact"/>
+              <w:jc w:val="left"/>
+            </w:pPr>
+            <w:r>
+              <w:rPr>
+                <w:sz w:val="19"/>
+              </w:rPr>
+              <w:t xml:space="preserve">Close (out of range beyond Short)</w:t>
+            </w:r>
+          </w:p>
+        </w:tc>
+        <w:tc>
+          <w:tcPr/>
+          <w:p>
+            <w:pPr>
+              <w:pStyle w:val="Compact"/>
+              <w:jc w:val="left"/>
+            </w:pPr>
+            <w:r>
+              <w:rPr>
+                <w:sz w:val="19"/>
+              </w:rPr>
+              <w:t xml:space="preserve">2</w:t>
+            </w:r>
+          </w:p>
+        </w:tc>
+        <w:tc>
+          <w:tcPr/>
+          <w:p>
+            <w:pPr>
+              <w:pStyle w:val="Compact"/>
+              <w:jc w:val="left"/>
+            </w:pPr>
+            <w:r>
+              <w:rPr>
+                <w:sz w:val="19"/>
+              </w:rPr>
+              <w:t xml:space="preserve">A gunshot wound</w:t>
+            </w:r>
+          </w:p>
+        </w:tc>
+      </w:tr>
+      <w:tr>
+        <w:tc>
+          <w:tcPr/>
+          <w:p>
+            <w:pPr>
+              <w:pStyle w:val="Compact"/>
+              <w:jc w:val="left"/>
+            </w:pPr>
+            <w:r>
+              <w:rPr>
+                <w:b/>
+                <w:sz w:val="19"/>
+              </w:rPr>
+              <w:t xml:space="preserve">Revolver</w:t>
+            </w:r>
+          </w:p>
+        </w:tc>
+        <w:tc>
+          <w:tcPr/>
+          <w:p>
+            <w:pPr>
+              <w:pStyle w:val="Compact"/>
+              <w:jc w:val="left"/>
+            </w:pPr>
+            <w:r>
+              <w:rPr>
+                <w:sz w:val="19"/>
+              </w:rPr>
+              <w:t xml:space="preserve">Close</w:t>
+            </w:r>
+          </w:p>
+        </w:tc>
+        <w:tc>
+          <w:tcPr/>
+          <w:p>
+            <w:pPr>
+              <w:pStyle w:val="Compact"/>
+              <w:jc w:val="left"/>
+            </w:pPr>
+            <w:r>
+              <w:rPr>
+                <w:sz w:val="19"/>
+              </w:rPr>
+              <w:t xml:space="preserve">2</w:t>
+            </w:r>
+          </w:p>
+        </w:tc>
+        <w:tc>
+          <w:tcPr/>
+          <w:p>
+            <w:pPr>
+              <w:pStyle w:val="Compact"/>
+              <w:jc w:val="left"/>
+            </w:pPr>
+            <w:r>
+              <w:rPr>
+                <w:sz w:val="19"/>
+              </w:rPr>
+              <w:t xml:space="preserve">A gunshot wound</w:t>
+            </w:r>
+          </w:p>
+        </w:tc>
+      </w:tr>
+      <w:tr>
+        <w:tc>
+          <w:tcPr/>
+          <w:p>
+            <w:pPr>
+              <w:pStyle w:val="Compact"/>
+              <w:jc w:val="left"/>
+            </w:pPr>
+            <w:r>
+              <w:rPr>
+                <w:b/>
+                <w:sz w:val="19"/>
+              </w:rPr>
+              <w:t xml:space="preserve">Rifle</w:t>
+            </w:r>
+          </w:p>
+        </w:tc>
+        <w:tc>
+          <w:tcPr/>
+          <w:p>
+            <w:pPr>
+              <w:pStyle w:val="Compact"/>
+              <w:jc w:val="left"/>
+            </w:pPr>
+            <w:r>
+              <w:rPr>
+                <w:sz w:val="19"/>
+              </w:rPr>
               <w:t xml:space="preserve">Medium</w:t>
             </w:r>
           </w:p>
@@ -7480,6 +7858,132 @@
               <w:rPr>
                 <w:sz w:val="19"/>
               </w:rPr>
+              <w:t xml:space="preserve">2</w:t>
+            </w:r>
+          </w:p>
+        </w:tc>
+        <w:tc>
+          <w:tcPr/>
+          <w:p>
+            <w:pPr>
+              <w:pStyle w:val="Compact"/>
+              <w:jc w:val="left"/>
+            </w:pPr>
+            <w:r>
+              <w:rPr>
+                <w:sz w:val="19"/>
+              </w:rPr>
+              <w:t xml:space="preserve">A gunshot wound</w:t>
+            </w:r>
+          </w:p>
+        </w:tc>
+      </w:tr>
+      <w:tr>
+        <w:tc>
+          <w:tcPr/>
+          <w:p>
+            <w:pPr>
+              <w:pStyle w:val="Compact"/>
+              <w:jc w:val="left"/>
+            </w:pPr>
+            <w:r>
+              <w:rPr>
+                <w:b/>
+                <w:sz w:val="19"/>
+              </w:rPr>
+              <w:t xml:space="preserve">Shotgun, at Close range</w:t>
+            </w:r>
+          </w:p>
+        </w:tc>
+        <w:tc>
+          <w:tcPr/>
+          <w:p>
+            <w:pPr>
+              <w:pStyle w:val="Compact"/>
+              <w:jc w:val="left"/>
+            </w:pPr>
+            <w:r>
+              <w:rPr>
+                <w:sz w:val="19"/>
+              </w:rPr>
+              <w:t xml:space="preserve">Close</w:t>
+            </w:r>
+          </w:p>
+        </w:tc>
+        <w:tc>
+          <w:tcPr/>
+          <w:p>
+            <w:pPr>
+              <w:pStyle w:val="Compact"/>
+              <w:jc w:val="left"/>
+            </w:pPr>
+            <w:r>
+              <w:rPr>
+                <w:sz w:val="19"/>
+              </w:rPr>
+              <w:t xml:space="preserve">3, and Dying</w:t>
+            </w:r>
+          </w:p>
+        </w:tc>
+        <w:tc>
+          <w:tcPr/>
+          <w:p>
+            <w:pPr>
+              <w:pStyle w:val="Compact"/>
+              <w:jc w:val="left"/>
+            </w:pPr>
+            <w:r>
+              <w:rPr>
+                <w:sz w:val="19"/>
+              </w:rPr>
+              <w:t xml:space="preserve">A ruinous wound</w:t>
+            </w:r>
+          </w:p>
+        </w:tc>
+      </w:tr>
+      <w:tr>
+        <w:tc>
+          <w:tcPr/>
+          <w:p>
+            <w:pPr>
+              <w:pStyle w:val="Compact"/>
+              <w:jc w:val="left"/>
+            </w:pPr>
+            <w:r>
+              <w:rPr>
+                <w:b/>
+                <w:sz w:val="19"/>
+              </w:rPr>
+              <w:t xml:space="preserve">Shotgun, at Short range</w:t>
+            </w:r>
+          </w:p>
+        </w:tc>
+        <w:tc>
+          <w:tcPr/>
+          <w:p>
+            <w:pPr>
+              <w:pStyle w:val="Compact"/>
+              <w:jc w:val="left"/>
+            </w:pPr>
+            <w:r>
+              <w:rPr>
+                <w:sz w:val="19"/>
+              </w:rPr>
+              <w:t xml:space="preserve">Short (no effect beyond)</w:t>
+            </w:r>
+          </w:p>
+        </w:tc>
+        <w:tc>
+          <w:tcPr/>
+          <w:p>
+            <w:pPr>
+              <w:pStyle w:val="Compact"/>
+              <w:jc w:val="left"/>
+            </w:pPr>
+            <w:r>
+              <w:rPr>
+                <w:sz w:val="19"/>
+              </w:rPr>
               <w:t xml:space="preserve">1</w:t>
             </w:r>
           </w:p>
@@ -7495,340 +7999,25 @@
               <w:rPr>
                 <w:sz w:val="19"/>
               </w:rPr>
-              <w:t xml:space="preserve">A cut or stab wound that bleeds</w:t>
-            </w:r>
-          </w:p>
-        </w:tc>
-      </w:tr>
-      <w:tr>
-        <w:tc>
-          <w:tcPr/>
-          <w:p>
-            <w:pPr>
-              <w:pStyle w:val="Compact"/>
-              <w:jc w:val="left"/>
-            </w:pPr>
-            <w:r>
-              <w:rPr>
-                <w:b/>
-                <w:sz w:val="19"/>
-              </w:rPr>
-              <w:t xml:space="preserve">Axe, saber, or an old Grimm weapon</w:t>
-            </w:r>
-          </w:p>
-        </w:tc>
-        <w:tc>
-          <w:tcPr/>
-          <w:p>
-            <w:pPr>
-              <w:pStyle w:val="Compact"/>
-              <w:jc w:val="left"/>
-            </w:pPr>
-            <w:r>
-              <w:rPr>
-                <w:sz w:val="19"/>
-              </w:rPr>
-              <w:t xml:space="preserve">Melee</w:t>
-            </w:r>
-          </w:p>
-        </w:tc>
-        <w:tc>
-          <w:tcPr/>
-          <w:p>
-            <w:pPr>
-              <w:pStyle w:val="Compact"/>
-              <w:jc w:val="left"/>
-            </w:pPr>
-            <w:r>
-              <w:rPr>
-                <w:sz w:val="19"/>
-              </w:rPr>
-              <w:t xml:space="preserve">2</w:t>
-            </w:r>
-          </w:p>
-        </w:tc>
-        <w:tc>
-          <w:tcPr/>
-          <w:p>
-            <w:pPr>
-              <w:pStyle w:val="Compact"/>
-              <w:jc w:val="left"/>
-            </w:pPr>
-            <w:r>
-              <w:rPr>
-                <w:sz w:val="19"/>
-              </w:rPr>
-              <w:t xml:space="preserve">A deep wound or a broken bone</w:t>
-            </w:r>
-          </w:p>
-        </w:tc>
-      </w:tr>
-      <w:tr>
-        <w:tc>
-          <w:tcPr/>
-          <w:p>
-            <w:pPr>
-              <w:pStyle w:val="Compact"/>
-              <w:jc w:val="left"/>
-            </w:pPr>
-            <w:r>
-              <w:rPr>
-                <w:b/>
-                <w:sz w:val="19"/>
-              </w:rPr>
-              <w:t xml:space="preserve">Crossbow</w:t>
-            </w:r>
-          </w:p>
-        </w:tc>
-        <w:tc>
-          <w:tcPr/>
-          <w:p>
-            <w:pPr>
-              <w:pStyle w:val="Compact"/>
-              <w:jc w:val="left"/>
-            </w:pPr>
-            <w:r>
-              <w:rPr>
-                <w:sz w:val="19"/>
-              </w:rPr>
-              <w:t xml:space="preserve">Medium</w:t>
-            </w:r>
-          </w:p>
-        </w:tc>
-        <w:tc>
-          <w:tcPr/>
-          <w:p>
-            <w:pPr>
-              <w:pStyle w:val="Compact"/>
-              <w:jc w:val="left"/>
-            </w:pPr>
-            <w:r>
-              <w:rPr>
-                <w:sz w:val="19"/>
-              </w:rPr>
-              <w:t xml:space="preserve">2</w:t>
-            </w:r>
-          </w:p>
-        </w:tc>
-        <w:tc>
-          <w:tcPr/>
-          <w:p>
-            <w:pPr>
-              <w:pStyle w:val="Compact"/>
-              <w:jc w:val="left"/>
-            </w:pPr>
-            <w:r>
-              <w:rPr>
-                <w:sz w:val="19"/>
-              </w:rPr>
-              <w:t xml:space="preserve">A bolt deep in the flesh</w:t>
-            </w:r>
-          </w:p>
-        </w:tc>
-      </w:tr>
-      <w:tr>
-        <w:tc>
-          <w:tcPr/>
-          <w:p>
-            <w:pPr>
-              <w:pStyle w:val="Compact"/>
-              <w:jc w:val="left"/>
-            </w:pPr>
-            <w:r>
-              <w:rPr>
-                <w:b/>
-                <w:sz w:val="19"/>
-              </w:rPr>
-              <w:t xml:space="preserve">Claws and fangs of a predator Wesen in full woge</w:t>
-            </w:r>
-          </w:p>
-        </w:tc>
-        <w:tc>
-          <w:tcPr/>
-          <w:p>
-            <w:pPr>
-              <w:pStyle w:val="Compact"/>
-              <w:jc w:val="left"/>
-            </w:pPr>
-            <w:r>
-              <w:rPr>
-                <w:sz w:val="19"/>
-              </w:rPr>
-              <w:t xml:space="preserve">Melee</w:t>
-            </w:r>
-          </w:p>
-        </w:tc>
-        <w:tc>
-          <w:tcPr/>
-          <w:p>
-            <w:pPr>
-              <w:pStyle w:val="Compact"/>
-              <w:jc w:val="left"/>
-            </w:pPr>
-            <w:r>
-              <w:rPr>
-                <w:sz w:val="19"/>
-              </w:rPr>
-              <w:t xml:space="preserve">2</w:t>
-            </w:r>
-          </w:p>
-        </w:tc>
-        <w:tc>
-          <w:tcPr/>
-          <w:p>
-            <w:pPr>
-              <w:pStyle w:val="Compact"/>
-              <w:jc w:val="left"/>
-            </w:pPr>
-            <w:r>
-              <w:rPr>
-                <w:sz w:val="19"/>
-              </w:rPr>
-              <w:t xml:space="preserve">Torn flesh</w:t>
-            </w:r>
-          </w:p>
-        </w:tc>
-      </w:tr>
-      <w:tr>
-        <w:tc>
-          <w:tcPr/>
-          <w:p>
-            <w:pPr>
-              <w:pStyle w:val="Compact"/>
-              <w:jc w:val="left"/>
-            </w:pPr>
-            <w:r>
-              <w:rPr>
-                <w:b/>
-                <w:sz w:val="19"/>
-              </w:rPr>
-              <w:t xml:space="preserve">Derringer</w:t>
-            </w:r>
-          </w:p>
-        </w:tc>
-        <w:tc>
-          <w:tcPr/>
-          <w:p>
-            <w:pPr>
-              <w:pStyle w:val="Compact"/>
-              <w:jc w:val="left"/>
-            </w:pPr>
-            <w:r>
-              <w:rPr>
-                <w:sz w:val="19"/>
-              </w:rPr>
-              <w:t xml:space="preserve">Close</w:t>
-            </w:r>
-          </w:p>
-        </w:tc>
-        <w:tc>
-          <w:tcPr/>
-          <w:p>
-            <w:pPr>
-              <w:pStyle w:val="Compact"/>
-              <w:jc w:val="left"/>
-            </w:pPr>
-            <w:r>
-              <w:rPr>
-                <w:sz w:val="19"/>
-              </w:rPr>
-              <w:t xml:space="preserve">2</w:t>
-            </w:r>
-          </w:p>
-        </w:tc>
-        <w:tc>
-          <w:tcPr/>
-          <w:p>
-            <w:pPr>
-              <w:pStyle w:val="Compact"/>
-              <w:jc w:val="left"/>
-            </w:pPr>
-            <w:r>
-              <w:rPr>
-                <w:sz w:val="19"/>
-              </w:rPr>
-              <w:t xml:space="preserve">A gunshot wound</w:t>
-            </w:r>
-          </w:p>
-        </w:tc>
-      </w:tr>
-      <w:tr>
-        <w:tc>
-          <w:tcPr/>
-          <w:p>
-            <w:pPr>
-              <w:pStyle w:val="Compact"/>
-              <w:jc w:val="left"/>
-            </w:pPr>
-            <w:r>
-              <w:rPr>
-                <w:b/>
-                <w:sz w:val="19"/>
-              </w:rPr>
-              <w:t xml:space="preserve">Revolver</w:t>
-            </w:r>
-          </w:p>
-        </w:tc>
-        <w:tc>
-          <w:tcPr/>
-          <w:p>
-            <w:pPr>
-              <w:pStyle w:val="Compact"/>
-              <w:jc w:val="left"/>
-            </w:pPr>
-            <w:r>
-              <w:rPr>
-                <w:sz w:val="19"/>
-              </w:rPr>
-              <w:t xml:space="preserve">Short</w:t>
-            </w:r>
-          </w:p>
-        </w:tc>
-        <w:tc>
-          <w:tcPr/>
-          <w:p>
-            <w:pPr>
-              <w:pStyle w:val="Compact"/>
-              <w:jc w:val="left"/>
-            </w:pPr>
-            <w:r>
-              <w:rPr>
-                <w:sz w:val="19"/>
-              </w:rPr>
-              <w:t xml:space="preserve">2</w:t>
-            </w:r>
-          </w:p>
-        </w:tc>
-        <w:tc>
-          <w:tcPr/>
-          <w:p>
-            <w:pPr>
-              <w:pStyle w:val="Compact"/>
-              <w:jc w:val="left"/>
-            </w:pPr>
-            <w:r>
-              <w:rPr>
-                <w:sz w:val="19"/>
-              </w:rPr>
-              <w:t xml:space="preserve">A gunshot wound</w:t>
-            </w:r>
-          </w:p>
-        </w:tc>
-      </w:tr>
-      <w:tr>
-        <w:tc>
-          <w:tcPr/>
-          <w:p>
-            <w:pPr>
-              <w:pStyle w:val="Compact"/>
-              <w:jc w:val="left"/>
-            </w:pPr>
-            <w:r>
-              <w:rPr>
-                <w:b/>
-                <w:sz w:val="19"/>
-              </w:rPr>
-              <w:t xml:space="preserve">Rifle</w:t>
+              <w:t xml:space="preserve">Scattered pellets</w:t>
+            </w:r>
+          </w:p>
+        </w:tc>
+      </w:tr>
+      <w:tr>
+        <w:tc>
+          <w:tcPr/>
+          <w:p>
+            <w:pPr>
+              <w:pStyle w:val="Compact"/>
+              <w:jc w:val="left"/>
+            </w:pPr>
+            <w:r>
+              <w:rPr>
+                <w:b/>
+                <w:sz w:val="19"/>
+              </w:rPr>
+              <w:t xml:space="preserve">Buffalo rifle</w:t>
             </w:r>
           </w:p>
         </w:tc>
@@ -7858,69 +8047,6 @@
               <w:rPr>
                 <w:sz w:val="19"/>
               </w:rPr>
-              <w:t xml:space="preserve">2</w:t>
-            </w:r>
-          </w:p>
-        </w:tc>
-        <w:tc>
-          <w:tcPr/>
-          <w:p>
-            <w:pPr>
-              <w:pStyle w:val="Compact"/>
-              <w:jc w:val="left"/>
-            </w:pPr>
-            <w:r>
-              <w:rPr>
-                <w:sz w:val="19"/>
-              </w:rPr>
-              <w:t xml:space="preserve">A gunshot wound</w:t>
-            </w:r>
-          </w:p>
-        </w:tc>
-      </w:tr>
-      <w:tr>
-        <w:tc>
-          <w:tcPr/>
-          <w:p>
-            <w:pPr>
-              <w:pStyle w:val="Compact"/>
-              <w:jc w:val="left"/>
-            </w:pPr>
-            <w:r>
-              <w:rPr>
-                <w:b/>
-                <w:sz w:val="19"/>
-              </w:rPr>
-              <w:t xml:space="preserve">Shotgun, at Close range</w:t>
-            </w:r>
-          </w:p>
-        </w:tc>
-        <w:tc>
-          <w:tcPr/>
-          <w:p>
-            <w:pPr>
-              <w:pStyle w:val="Compact"/>
-              <w:jc w:val="left"/>
-            </w:pPr>
-            <w:r>
-              <w:rPr>
-                <w:sz w:val="19"/>
-              </w:rPr>
-              <w:t xml:space="preserve">Close</w:t>
-            </w:r>
-          </w:p>
-        </w:tc>
-        <w:tc>
-          <w:tcPr/>
-          <w:p>
-            <w:pPr>
-              <w:pStyle w:val="Compact"/>
-              <w:jc w:val="left"/>
-            </w:pPr>
-            <w:r>
-              <w:rPr>
-                <w:sz w:val="19"/>
-              </w:rPr>
               <w:t xml:space="preserve">3, and Dying</w:t>
             </w:r>
           </w:p>
@@ -7954,132 +8080,6 @@
                 <w:b/>
                 <w:sz w:val="19"/>
               </w:rPr>
-              <w:t xml:space="preserve">Shotgun, at Short range</w:t>
-            </w:r>
-          </w:p>
-        </w:tc>
-        <w:tc>
-          <w:tcPr/>
-          <w:p>
-            <w:pPr>
-              <w:pStyle w:val="Compact"/>
-              <w:jc w:val="left"/>
-            </w:pPr>
-            <w:r>
-              <w:rPr>
-                <w:sz w:val="19"/>
-              </w:rPr>
-              <w:t xml:space="preserve">Short (no effect beyond)</w:t>
-            </w:r>
-          </w:p>
-        </w:tc>
-        <w:tc>
-          <w:tcPr/>
-          <w:p>
-            <w:pPr>
-              <w:pStyle w:val="Compact"/>
-              <w:jc w:val="left"/>
-            </w:pPr>
-            <w:r>
-              <w:rPr>
-                <w:sz w:val="19"/>
-              </w:rPr>
-              <w:t xml:space="preserve">1</w:t>
-            </w:r>
-          </w:p>
-        </w:tc>
-        <w:tc>
-          <w:tcPr/>
-          <w:p>
-            <w:pPr>
-              <w:pStyle w:val="Compact"/>
-              <w:jc w:val="left"/>
-            </w:pPr>
-            <w:r>
-              <w:rPr>
-                <w:sz w:val="19"/>
-              </w:rPr>
-              <w:t xml:space="preserve">Scattered pellets</w:t>
-            </w:r>
-          </w:p>
-        </w:tc>
-      </w:tr>
-      <w:tr>
-        <w:tc>
-          <w:tcPr/>
-          <w:p>
-            <w:pPr>
-              <w:pStyle w:val="Compact"/>
-              <w:jc w:val="left"/>
-            </w:pPr>
-            <w:r>
-              <w:rPr>
-                <w:b/>
-                <w:sz w:val="19"/>
-              </w:rPr>
-              <w:t xml:space="preserve">Buffalo rifle</w:t>
-            </w:r>
-          </w:p>
-        </w:tc>
-        <w:tc>
-          <w:tcPr/>
-          <w:p>
-            <w:pPr>
-              <w:pStyle w:val="Compact"/>
-              <w:jc w:val="left"/>
-            </w:pPr>
-            <w:r>
-              <w:rPr>
-                <w:sz w:val="19"/>
-              </w:rPr>
-              <w:t xml:space="preserve">Extreme</w:t>
-            </w:r>
-          </w:p>
-        </w:tc>
-        <w:tc>
-          <w:tcPr/>
-          <w:p>
-            <w:pPr>
-              <w:pStyle w:val="Compact"/>
-              <w:jc w:val="left"/>
-            </w:pPr>
-            <w:r>
-              <w:rPr>
-                <w:sz w:val="19"/>
-              </w:rPr>
-              <w:t xml:space="preserve">3, and Dying</w:t>
-            </w:r>
-          </w:p>
-        </w:tc>
-        <w:tc>
-          <w:tcPr/>
-          <w:p>
-            <w:pPr>
-              <w:pStyle w:val="Compact"/>
-              <w:jc w:val="left"/>
-            </w:pPr>
-            <w:r>
-              <w:rPr>
-                <w:sz w:val="19"/>
-              </w:rPr>
-              <w:t xml:space="preserve">A ruinous wound</w:t>
-            </w:r>
-          </w:p>
-        </w:tc>
-      </w:tr>
-      <w:tr>
-        <w:tc>
-          <w:tcPr/>
-          <w:p>
-            <w:pPr>
-              <w:pStyle w:val="Compact"/>
-              <w:jc w:val="left"/>
-            </w:pPr>
-            <w:r>
-              <w:rPr>
-                <w:b/>
-                <w:sz w:val="19"/>
-              </w:rPr>
               <w:t xml:space="preserve">Dynamite</w:t>
             </w:r>
           </w:p>
@@ -8257,6 +8257,24 @@
         </w:tc>
       </w:tr>
     </w:tbl>
+    <w:p>
+      <w:pPr>
+        <w:pStyle w:val="BodyText"/>
+      </w:pPr>
+      <w:r>
+        <w:rPr>
+          <w:bCs/>
+          <w:b/>
+        </w:rPr>
+        <w:t xml:space="preserve">Period ranges.</w:t>
+      </w:r>
+      <w:r>
+        <w:t xml:space="preserve"> </w:t>
+      </w:r>
+      <w:r>
+        <w:t xml:space="preserve">These are 1870s guns: a revolver is a close-quarters weapon, and most gunfights happen across a room or a street. A derringer is useless beyond Short range, and a shotgun beyond it does nothing.</w:t>
+      </w:r>
+    </w:p>
     <w:p>
       <w:pPr>
         <w:pStyle w:val="BodyText"/>

</xml_diff>

<commit_message>
Grimm: period ranges for 1870s guns
Co-Authored-By: Claude Opus 5.5 <noreply@anthropic.com>
Claude-Session: https://claude.ai/code/session_015SADCFzhKijkC2foUmXrpC
</commit_message>
<xml_diff>
--- a/grimm-west/Grimm_Players_Guide.docx
+++ b/grimm-west/Grimm_Players_Guide.docx
@@ -7465,6 +7465,384 @@
               <w:rPr>
                 <w:sz w:val="19"/>
               </w:rPr>
+              <w:t xml:space="preserve">Short</w:t>
+            </w:r>
+          </w:p>
+        </w:tc>
+        <w:tc>
+          <w:tcPr/>
+          <w:p>
+            <w:pPr>
+              <w:pStyle w:val="Compact"/>
+              <w:jc w:val="left"/>
+            </w:pPr>
+            <w:r>
+              <w:rPr>
+                <w:sz w:val="19"/>
+              </w:rPr>
+              <w:t xml:space="preserve">1</w:t>
+            </w:r>
+          </w:p>
+        </w:tc>
+        <w:tc>
+          <w:tcPr/>
+          <w:p>
+            <w:pPr>
+              <w:pStyle w:val="Compact"/>
+              <w:jc w:val="left"/>
+            </w:pPr>
+            <w:r>
+              <w:rPr>
+                <w:sz w:val="19"/>
+              </w:rPr>
+              <w:t xml:space="preserve">A cut or stab wound that bleeds</w:t>
+            </w:r>
+          </w:p>
+        </w:tc>
+      </w:tr>
+      <w:tr>
+        <w:tc>
+          <w:tcPr/>
+          <w:p>
+            <w:pPr>
+              <w:pStyle w:val="Compact"/>
+              <w:jc w:val="left"/>
+            </w:pPr>
+            <w:r>
+              <w:rPr>
+                <w:b/>
+                <w:sz w:val="19"/>
+              </w:rPr>
+              <w:t xml:space="preserve">Axe, saber, or an old Grimm weapon</w:t>
+            </w:r>
+          </w:p>
+        </w:tc>
+        <w:tc>
+          <w:tcPr/>
+          <w:p>
+            <w:pPr>
+              <w:pStyle w:val="Compact"/>
+              <w:jc w:val="left"/>
+            </w:pPr>
+            <w:r>
+              <w:rPr>
+                <w:sz w:val="19"/>
+              </w:rPr>
+              <w:t xml:space="preserve">Melee</w:t>
+            </w:r>
+          </w:p>
+        </w:tc>
+        <w:tc>
+          <w:tcPr/>
+          <w:p>
+            <w:pPr>
+              <w:pStyle w:val="Compact"/>
+              <w:jc w:val="left"/>
+            </w:pPr>
+            <w:r>
+              <w:rPr>
+                <w:sz w:val="19"/>
+              </w:rPr>
+              <w:t xml:space="preserve">2</w:t>
+            </w:r>
+          </w:p>
+        </w:tc>
+        <w:tc>
+          <w:tcPr/>
+          <w:p>
+            <w:pPr>
+              <w:pStyle w:val="Compact"/>
+              <w:jc w:val="left"/>
+            </w:pPr>
+            <w:r>
+              <w:rPr>
+                <w:sz w:val="19"/>
+              </w:rPr>
+              <w:t xml:space="preserve">A deep wound or a broken bone</w:t>
+            </w:r>
+          </w:p>
+        </w:tc>
+      </w:tr>
+      <w:tr>
+        <w:tc>
+          <w:tcPr/>
+          <w:p>
+            <w:pPr>
+              <w:pStyle w:val="Compact"/>
+              <w:jc w:val="left"/>
+            </w:pPr>
+            <w:r>
+              <w:rPr>
+                <w:b/>
+                <w:sz w:val="19"/>
+              </w:rPr>
+              <w:t xml:space="preserve">Crossbow</w:t>
+            </w:r>
+          </w:p>
+        </w:tc>
+        <w:tc>
+          <w:tcPr/>
+          <w:p>
+            <w:pPr>
+              <w:pStyle w:val="Compact"/>
+              <w:jc w:val="left"/>
+            </w:pPr>
+            <w:r>
+              <w:rPr>
+                <w:sz w:val="19"/>
+              </w:rPr>
+              <w:t xml:space="preserve">Short</w:t>
+            </w:r>
+          </w:p>
+        </w:tc>
+        <w:tc>
+          <w:tcPr/>
+          <w:p>
+            <w:pPr>
+              <w:pStyle w:val="Compact"/>
+              <w:jc w:val="left"/>
+            </w:pPr>
+            <w:r>
+              <w:rPr>
+                <w:sz w:val="19"/>
+              </w:rPr>
+              <w:t xml:space="preserve">2</w:t>
+            </w:r>
+          </w:p>
+        </w:tc>
+        <w:tc>
+          <w:tcPr/>
+          <w:p>
+            <w:pPr>
+              <w:pStyle w:val="Compact"/>
+              <w:jc w:val="left"/>
+            </w:pPr>
+            <w:r>
+              <w:rPr>
+                <w:sz w:val="19"/>
+              </w:rPr>
+              <w:t xml:space="preserve">A bolt deep in the flesh</w:t>
+            </w:r>
+          </w:p>
+        </w:tc>
+      </w:tr>
+      <w:tr>
+        <w:tc>
+          <w:tcPr/>
+          <w:p>
+            <w:pPr>
+              <w:pStyle w:val="Compact"/>
+              <w:jc w:val="left"/>
+            </w:pPr>
+            <w:r>
+              <w:rPr>
+                <w:b/>
+                <w:sz w:val="19"/>
+              </w:rPr>
+              <w:t xml:space="preserve">Claws and fangs of a predator Wesen in full woge</w:t>
+            </w:r>
+          </w:p>
+        </w:tc>
+        <w:tc>
+          <w:tcPr/>
+          <w:p>
+            <w:pPr>
+              <w:pStyle w:val="Compact"/>
+              <w:jc w:val="left"/>
+            </w:pPr>
+            <w:r>
+              <w:rPr>
+                <w:sz w:val="19"/>
+              </w:rPr>
+              <w:t xml:space="preserve">Melee</w:t>
+            </w:r>
+          </w:p>
+        </w:tc>
+        <w:tc>
+          <w:tcPr/>
+          <w:p>
+            <w:pPr>
+              <w:pStyle w:val="Compact"/>
+              <w:jc w:val="left"/>
+            </w:pPr>
+            <w:r>
+              <w:rPr>
+                <w:sz w:val="19"/>
+              </w:rPr>
+              <w:t xml:space="preserve">2</w:t>
+            </w:r>
+          </w:p>
+        </w:tc>
+        <w:tc>
+          <w:tcPr/>
+          <w:p>
+            <w:pPr>
+              <w:pStyle w:val="Compact"/>
+              <w:jc w:val="left"/>
+            </w:pPr>
+            <w:r>
+              <w:rPr>
+                <w:sz w:val="19"/>
+              </w:rPr>
+              <w:t xml:space="preserve">Torn flesh</w:t>
+            </w:r>
+          </w:p>
+        </w:tc>
+      </w:tr>
+      <w:tr>
+        <w:tc>
+          <w:tcPr/>
+          <w:p>
+            <w:pPr>
+              <w:pStyle w:val="Compact"/>
+              <w:jc w:val="left"/>
+            </w:pPr>
+            <w:r>
+              <w:rPr>
+                <w:b/>
+                <w:sz w:val="19"/>
+              </w:rPr>
+              <w:t xml:space="preserve">Derringer</w:t>
+            </w:r>
+          </w:p>
+        </w:tc>
+        <w:tc>
+          <w:tcPr/>
+          <w:p>
+            <w:pPr>
+              <w:pStyle w:val="Compact"/>
+              <w:jc w:val="left"/>
+            </w:pPr>
+            <w:r>
+              <w:rPr>
+                <w:sz w:val="19"/>
+              </w:rPr>
+              <w:t xml:space="preserve">Close (out of range beyond Short)</w:t>
+            </w:r>
+          </w:p>
+        </w:tc>
+        <w:tc>
+          <w:tcPr/>
+          <w:p>
+            <w:pPr>
+              <w:pStyle w:val="Compact"/>
+              <w:jc w:val="left"/>
+            </w:pPr>
+            <w:r>
+              <w:rPr>
+                <w:sz w:val="19"/>
+              </w:rPr>
+              <w:t xml:space="preserve">2</w:t>
+            </w:r>
+          </w:p>
+        </w:tc>
+        <w:tc>
+          <w:tcPr/>
+          <w:p>
+            <w:pPr>
+              <w:pStyle w:val="Compact"/>
+              <w:jc w:val="left"/>
+            </w:pPr>
+            <w:r>
+              <w:rPr>
+                <w:sz w:val="19"/>
+              </w:rPr>
+              <w:t xml:space="preserve">A gunshot wound</w:t>
+            </w:r>
+          </w:p>
+        </w:tc>
+      </w:tr>
+      <w:tr>
+        <w:tc>
+          <w:tcPr/>
+          <w:p>
+            <w:pPr>
+              <w:pStyle w:val="Compact"/>
+              <w:jc w:val="left"/>
+            </w:pPr>
+            <w:r>
+              <w:rPr>
+                <w:b/>
+                <w:sz w:val="19"/>
+              </w:rPr>
+              <w:t xml:space="preserve">Revolver</w:t>
+            </w:r>
+          </w:p>
+        </w:tc>
+        <w:tc>
+          <w:tcPr/>
+          <w:p>
+            <w:pPr>
+              <w:pStyle w:val="Compact"/>
+              <w:jc w:val="left"/>
+            </w:pPr>
+            <w:r>
+              <w:rPr>
+                <w:sz w:val="19"/>
+              </w:rPr>
+              <w:t xml:space="preserve">Close</w:t>
+            </w:r>
+          </w:p>
+        </w:tc>
+        <w:tc>
+          <w:tcPr/>
+          <w:p>
+            <w:pPr>
+              <w:pStyle w:val="Compact"/>
+              <w:jc w:val="left"/>
+            </w:pPr>
+            <w:r>
+              <w:rPr>
+                <w:sz w:val="19"/>
+              </w:rPr>
+              <w:t xml:space="preserve">2</w:t>
+            </w:r>
+          </w:p>
+        </w:tc>
+        <w:tc>
+          <w:tcPr/>
+          <w:p>
+            <w:pPr>
+              <w:pStyle w:val="Compact"/>
+              <w:jc w:val="left"/>
+            </w:pPr>
+            <w:r>
+              <w:rPr>
+                <w:sz w:val="19"/>
+              </w:rPr>
+              <w:t xml:space="preserve">A gunshot wound</w:t>
+            </w:r>
+          </w:p>
+        </w:tc>
+      </w:tr>
+      <w:tr>
+        <w:tc>
+          <w:tcPr/>
+          <w:p>
+            <w:pPr>
+              <w:pStyle w:val="Compact"/>
+              <w:jc w:val="left"/>
+            </w:pPr>
+            <w:r>
+              <w:rPr>
+                <w:b/>
+                <w:sz w:val="19"/>
+              </w:rPr>
+              <w:t xml:space="preserve">Rifle</w:t>
+            </w:r>
+          </w:p>
+        </w:tc>
+        <w:tc>
+          <w:tcPr/>
+          <w:p>
+            <w:pPr>
+              <w:pStyle w:val="Compact"/>
+              <w:jc w:val="left"/>
+            </w:pPr>
+            <w:r>
+              <w:rPr>
+                <w:sz w:val="19"/>
+              </w:rPr>
               <w:t xml:space="preserve">Medium</w:t>
             </w:r>
           </w:p>
@@ -7480,6 +7858,132 @@
               <w:rPr>
                 <w:sz w:val="19"/>
               </w:rPr>
+              <w:t xml:space="preserve">2</w:t>
+            </w:r>
+          </w:p>
+        </w:tc>
+        <w:tc>
+          <w:tcPr/>
+          <w:p>
+            <w:pPr>
+              <w:pStyle w:val="Compact"/>
+              <w:jc w:val="left"/>
+            </w:pPr>
+            <w:r>
+              <w:rPr>
+                <w:sz w:val="19"/>
+              </w:rPr>
+              <w:t xml:space="preserve">A gunshot wound</w:t>
+            </w:r>
+          </w:p>
+        </w:tc>
+      </w:tr>
+      <w:tr>
+        <w:tc>
+          <w:tcPr/>
+          <w:p>
+            <w:pPr>
+              <w:pStyle w:val="Compact"/>
+              <w:jc w:val="left"/>
+            </w:pPr>
+            <w:r>
+              <w:rPr>
+                <w:b/>
+                <w:sz w:val="19"/>
+              </w:rPr>
+              <w:t xml:space="preserve">Shotgun, at Close range</w:t>
+            </w:r>
+          </w:p>
+        </w:tc>
+        <w:tc>
+          <w:tcPr/>
+          <w:p>
+            <w:pPr>
+              <w:pStyle w:val="Compact"/>
+              <w:jc w:val="left"/>
+            </w:pPr>
+            <w:r>
+              <w:rPr>
+                <w:sz w:val="19"/>
+              </w:rPr>
+              <w:t xml:space="preserve">Close</w:t>
+            </w:r>
+          </w:p>
+        </w:tc>
+        <w:tc>
+          <w:tcPr/>
+          <w:p>
+            <w:pPr>
+              <w:pStyle w:val="Compact"/>
+              <w:jc w:val="left"/>
+            </w:pPr>
+            <w:r>
+              <w:rPr>
+                <w:sz w:val="19"/>
+              </w:rPr>
+              <w:t xml:space="preserve">3, and Dying</w:t>
+            </w:r>
+          </w:p>
+        </w:tc>
+        <w:tc>
+          <w:tcPr/>
+          <w:p>
+            <w:pPr>
+              <w:pStyle w:val="Compact"/>
+              <w:jc w:val="left"/>
+            </w:pPr>
+            <w:r>
+              <w:rPr>
+                <w:sz w:val="19"/>
+              </w:rPr>
+              <w:t xml:space="preserve">A ruinous wound</w:t>
+            </w:r>
+          </w:p>
+        </w:tc>
+      </w:tr>
+      <w:tr>
+        <w:tc>
+          <w:tcPr/>
+          <w:p>
+            <w:pPr>
+              <w:pStyle w:val="Compact"/>
+              <w:jc w:val="left"/>
+            </w:pPr>
+            <w:r>
+              <w:rPr>
+                <w:b/>
+                <w:sz w:val="19"/>
+              </w:rPr>
+              <w:t xml:space="preserve">Shotgun, at Short range</w:t>
+            </w:r>
+          </w:p>
+        </w:tc>
+        <w:tc>
+          <w:tcPr/>
+          <w:p>
+            <w:pPr>
+              <w:pStyle w:val="Compact"/>
+              <w:jc w:val="left"/>
+            </w:pPr>
+            <w:r>
+              <w:rPr>
+                <w:sz w:val="19"/>
+              </w:rPr>
+              <w:t xml:space="preserve">Short (no effect beyond)</w:t>
+            </w:r>
+          </w:p>
+        </w:tc>
+        <w:tc>
+          <w:tcPr/>
+          <w:p>
+            <w:pPr>
+              <w:pStyle w:val="Compact"/>
+              <w:jc w:val="left"/>
+            </w:pPr>
+            <w:r>
+              <w:rPr>
+                <w:sz w:val="19"/>
+              </w:rPr>
               <w:t xml:space="preserve">1</w:t>
             </w:r>
           </w:p>
@@ -7495,340 +7999,25 @@
               <w:rPr>
                 <w:sz w:val="19"/>
               </w:rPr>
-              <w:t xml:space="preserve">A cut or stab wound that bleeds</w:t>
-            </w:r>
-          </w:p>
-        </w:tc>
-      </w:tr>
-      <w:tr>
-        <w:tc>
-          <w:tcPr/>
-          <w:p>
-            <w:pPr>
-              <w:pStyle w:val="Compact"/>
-              <w:jc w:val="left"/>
-            </w:pPr>
-            <w:r>
-              <w:rPr>
-                <w:b/>
-                <w:sz w:val="19"/>
-              </w:rPr>
-              <w:t xml:space="preserve">Axe, saber, or an old Grimm weapon</w:t>
-            </w:r>
-          </w:p>
-        </w:tc>
-        <w:tc>
-          <w:tcPr/>
-          <w:p>
-            <w:pPr>
-              <w:pStyle w:val="Compact"/>
-              <w:jc w:val="left"/>
-            </w:pPr>
-            <w:r>
-              <w:rPr>
-                <w:sz w:val="19"/>
-              </w:rPr>
-              <w:t xml:space="preserve">Melee</w:t>
-            </w:r>
-          </w:p>
-        </w:tc>
-        <w:tc>
-          <w:tcPr/>
-          <w:p>
-            <w:pPr>
-              <w:pStyle w:val="Compact"/>
-              <w:jc w:val="left"/>
-            </w:pPr>
-            <w:r>
-              <w:rPr>
-                <w:sz w:val="19"/>
-              </w:rPr>
-              <w:t xml:space="preserve">2</w:t>
-            </w:r>
-          </w:p>
-        </w:tc>
-        <w:tc>
-          <w:tcPr/>
-          <w:p>
-            <w:pPr>
-              <w:pStyle w:val="Compact"/>
-              <w:jc w:val="left"/>
-            </w:pPr>
-            <w:r>
-              <w:rPr>
-                <w:sz w:val="19"/>
-              </w:rPr>
-              <w:t xml:space="preserve">A deep wound or a broken bone</w:t>
-            </w:r>
-          </w:p>
-        </w:tc>
-      </w:tr>
-      <w:tr>
-        <w:tc>
-          <w:tcPr/>
-          <w:p>
-            <w:pPr>
-              <w:pStyle w:val="Compact"/>
-              <w:jc w:val="left"/>
-            </w:pPr>
-            <w:r>
-              <w:rPr>
-                <w:b/>
-                <w:sz w:val="19"/>
-              </w:rPr>
-              <w:t xml:space="preserve">Crossbow</w:t>
-            </w:r>
-          </w:p>
-        </w:tc>
-        <w:tc>
-          <w:tcPr/>
-          <w:p>
-            <w:pPr>
-              <w:pStyle w:val="Compact"/>
-              <w:jc w:val="left"/>
-            </w:pPr>
-            <w:r>
-              <w:rPr>
-                <w:sz w:val="19"/>
-              </w:rPr>
-              <w:t xml:space="preserve">Medium</w:t>
-            </w:r>
-          </w:p>
-        </w:tc>
-        <w:tc>
-          <w:tcPr/>
-          <w:p>
-            <w:pPr>
-              <w:pStyle w:val="Compact"/>
-              <w:jc w:val="left"/>
-            </w:pPr>
-            <w:r>
-              <w:rPr>
-                <w:sz w:val="19"/>
-              </w:rPr>
-              <w:t xml:space="preserve">2</w:t>
-            </w:r>
-          </w:p>
-        </w:tc>
-        <w:tc>
-          <w:tcPr/>
-          <w:p>
-            <w:pPr>
-              <w:pStyle w:val="Compact"/>
-              <w:jc w:val="left"/>
-            </w:pPr>
-            <w:r>
-              <w:rPr>
-                <w:sz w:val="19"/>
-              </w:rPr>
-              <w:t xml:space="preserve">A bolt deep in the flesh</w:t>
-            </w:r>
-          </w:p>
-        </w:tc>
-      </w:tr>
-      <w:tr>
-        <w:tc>
-          <w:tcPr/>
-          <w:p>
-            <w:pPr>
-              <w:pStyle w:val="Compact"/>
-              <w:jc w:val="left"/>
-            </w:pPr>
-            <w:r>
-              <w:rPr>
-                <w:b/>
-                <w:sz w:val="19"/>
-              </w:rPr>
-              <w:t xml:space="preserve">Claws and fangs of a predator Wesen in full woge</w:t>
-            </w:r>
-          </w:p>
-        </w:tc>
-        <w:tc>
-          <w:tcPr/>
-          <w:p>
-            <w:pPr>
-              <w:pStyle w:val="Compact"/>
-              <w:jc w:val="left"/>
-            </w:pPr>
-            <w:r>
-              <w:rPr>
-                <w:sz w:val="19"/>
-              </w:rPr>
-              <w:t xml:space="preserve">Melee</w:t>
-            </w:r>
-          </w:p>
-        </w:tc>
-        <w:tc>
-          <w:tcPr/>
-          <w:p>
-            <w:pPr>
-              <w:pStyle w:val="Compact"/>
-              <w:jc w:val="left"/>
-            </w:pPr>
-            <w:r>
-              <w:rPr>
-                <w:sz w:val="19"/>
-              </w:rPr>
-              <w:t xml:space="preserve">2</w:t>
-            </w:r>
-          </w:p>
-        </w:tc>
-        <w:tc>
-          <w:tcPr/>
-          <w:p>
-            <w:pPr>
-              <w:pStyle w:val="Compact"/>
-              <w:jc w:val="left"/>
-            </w:pPr>
-            <w:r>
-              <w:rPr>
-                <w:sz w:val="19"/>
-              </w:rPr>
-              <w:t xml:space="preserve">Torn flesh</w:t>
-            </w:r>
-          </w:p>
-        </w:tc>
-      </w:tr>
-      <w:tr>
-        <w:tc>
-          <w:tcPr/>
-          <w:p>
-            <w:pPr>
-              <w:pStyle w:val="Compact"/>
-              <w:jc w:val="left"/>
-            </w:pPr>
-            <w:r>
-              <w:rPr>
-                <w:b/>
-                <w:sz w:val="19"/>
-              </w:rPr>
-              <w:t xml:space="preserve">Derringer</w:t>
-            </w:r>
-          </w:p>
-        </w:tc>
-        <w:tc>
-          <w:tcPr/>
-          <w:p>
-            <w:pPr>
-              <w:pStyle w:val="Compact"/>
-              <w:jc w:val="left"/>
-            </w:pPr>
-            <w:r>
-              <w:rPr>
-                <w:sz w:val="19"/>
-              </w:rPr>
-              <w:t xml:space="preserve">Close</w:t>
-            </w:r>
-          </w:p>
-        </w:tc>
-        <w:tc>
-          <w:tcPr/>
-          <w:p>
-            <w:pPr>
-              <w:pStyle w:val="Compact"/>
-              <w:jc w:val="left"/>
-            </w:pPr>
-            <w:r>
-              <w:rPr>
-                <w:sz w:val="19"/>
-              </w:rPr>
-              <w:t xml:space="preserve">2</w:t>
-            </w:r>
-          </w:p>
-        </w:tc>
-        <w:tc>
-          <w:tcPr/>
-          <w:p>
-            <w:pPr>
-              <w:pStyle w:val="Compact"/>
-              <w:jc w:val="left"/>
-            </w:pPr>
-            <w:r>
-              <w:rPr>
-                <w:sz w:val="19"/>
-              </w:rPr>
-              <w:t xml:space="preserve">A gunshot wound</w:t>
-            </w:r>
-          </w:p>
-        </w:tc>
-      </w:tr>
-      <w:tr>
-        <w:tc>
-          <w:tcPr/>
-          <w:p>
-            <w:pPr>
-              <w:pStyle w:val="Compact"/>
-              <w:jc w:val="left"/>
-            </w:pPr>
-            <w:r>
-              <w:rPr>
-                <w:b/>
-                <w:sz w:val="19"/>
-              </w:rPr>
-              <w:t xml:space="preserve">Revolver</w:t>
-            </w:r>
-          </w:p>
-        </w:tc>
-        <w:tc>
-          <w:tcPr/>
-          <w:p>
-            <w:pPr>
-              <w:pStyle w:val="Compact"/>
-              <w:jc w:val="left"/>
-            </w:pPr>
-            <w:r>
-              <w:rPr>
-                <w:sz w:val="19"/>
-              </w:rPr>
-              <w:t xml:space="preserve">Short</w:t>
-            </w:r>
-          </w:p>
-        </w:tc>
-        <w:tc>
-          <w:tcPr/>
-          <w:p>
-            <w:pPr>
-              <w:pStyle w:val="Compact"/>
-              <w:jc w:val="left"/>
-            </w:pPr>
-            <w:r>
-              <w:rPr>
-                <w:sz w:val="19"/>
-              </w:rPr>
-              <w:t xml:space="preserve">2</w:t>
-            </w:r>
-          </w:p>
-        </w:tc>
-        <w:tc>
-          <w:tcPr/>
-          <w:p>
-            <w:pPr>
-              <w:pStyle w:val="Compact"/>
-              <w:jc w:val="left"/>
-            </w:pPr>
-            <w:r>
-              <w:rPr>
-                <w:sz w:val="19"/>
-              </w:rPr>
-              <w:t xml:space="preserve">A gunshot wound</w:t>
-            </w:r>
-          </w:p>
-        </w:tc>
-      </w:tr>
-      <w:tr>
-        <w:tc>
-          <w:tcPr/>
-          <w:p>
-            <w:pPr>
-              <w:pStyle w:val="Compact"/>
-              <w:jc w:val="left"/>
-            </w:pPr>
-            <w:r>
-              <w:rPr>
-                <w:b/>
-                <w:sz w:val="19"/>
-              </w:rPr>
-              <w:t xml:space="preserve">Rifle</w:t>
+              <w:t xml:space="preserve">Scattered pellets</w:t>
+            </w:r>
+          </w:p>
+        </w:tc>
+      </w:tr>
+      <w:tr>
+        <w:tc>
+          <w:tcPr/>
+          <w:p>
+            <w:pPr>
+              <w:pStyle w:val="Compact"/>
+              <w:jc w:val="left"/>
+            </w:pPr>
+            <w:r>
+              <w:rPr>
+                <w:b/>
+                <w:sz w:val="19"/>
+              </w:rPr>
+              <w:t xml:space="preserve">Buffalo rifle</w:t>
             </w:r>
           </w:p>
         </w:tc>
@@ -7858,69 +8047,6 @@
               <w:rPr>
                 <w:sz w:val="19"/>
               </w:rPr>
-              <w:t xml:space="preserve">2</w:t>
-            </w:r>
-          </w:p>
-        </w:tc>
-        <w:tc>
-          <w:tcPr/>
-          <w:p>
-            <w:pPr>
-              <w:pStyle w:val="Compact"/>
-              <w:jc w:val="left"/>
-            </w:pPr>
-            <w:r>
-              <w:rPr>
-                <w:sz w:val="19"/>
-              </w:rPr>
-              <w:t xml:space="preserve">A gunshot wound</w:t>
-            </w:r>
-          </w:p>
-        </w:tc>
-      </w:tr>
-      <w:tr>
-        <w:tc>
-          <w:tcPr/>
-          <w:p>
-            <w:pPr>
-              <w:pStyle w:val="Compact"/>
-              <w:jc w:val="left"/>
-            </w:pPr>
-            <w:r>
-              <w:rPr>
-                <w:b/>
-                <w:sz w:val="19"/>
-              </w:rPr>
-              <w:t xml:space="preserve">Shotgun, at Close range</w:t>
-            </w:r>
-          </w:p>
-        </w:tc>
-        <w:tc>
-          <w:tcPr/>
-          <w:p>
-            <w:pPr>
-              <w:pStyle w:val="Compact"/>
-              <w:jc w:val="left"/>
-            </w:pPr>
-            <w:r>
-              <w:rPr>
-                <w:sz w:val="19"/>
-              </w:rPr>
-              <w:t xml:space="preserve">Close</w:t>
-            </w:r>
-          </w:p>
-        </w:tc>
-        <w:tc>
-          <w:tcPr/>
-          <w:p>
-            <w:pPr>
-              <w:pStyle w:val="Compact"/>
-              <w:jc w:val="left"/>
-            </w:pPr>
-            <w:r>
-              <w:rPr>
-                <w:sz w:val="19"/>
-              </w:rPr>
               <w:t xml:space="preserve">3, and Dying</w:t>
             </w:r>
           </w:p>
@@ -7954,132 +8080,6 @@
                 <w:b/>
                 <w:sz w:val="19"/>
               </w:rPr>
-              <w:t xml:space="preserve">Shotgun, at Short range</w:t>
-            </w:r>
-          </w:p>
-        </w:tc>
-        <w:tc>
-          <w:tcPr/>
-          <w:p>
-            <w:pPr>
-              <w:pStyle w:val="Compact"/>
-              <w:jc w:val="left"/>
-            </w:pPr>
-            <w:r>
-              <w:rPr>
-                <w:sz w:val="19"/>
-              </w:rPr>
-              <w:t xml:space="preserve">Short (no effect beyond)</w:t>
-            </w:r>
-          </w:p>
-        </w:tc>
-        <w:tc>
-          <w:tcPr/>
-          <w:p>
-            <w:pPr>
-              <w:pStyle w:val="Compact"/>
-              <w:jc w:val="left"/>
-            </w:pPr>
-            <w:r>
-              <w:rPr>
-                <w:sz w:val="19"/>
-              </w:rPr>
-              <w:t xml:space="preserve">1</w:t>
-            </w:r>
-          </w:p>
-        </w:tc>
-        <w:tc>
-          <w:tcPr/>
-          <w:p>
-            <w:pPr>
-              <w:pStyle w:val="Compact"/>
-              <w:jc w:val="left"/>
-            </w:pPr>
-            <w:r>
-              <w:rPr>
-                <w:sz w:val="19"/>
-              </w:rPr>
-              <w:t xml:space="preserve">Scattered pellets</w:t>
-            </w:r>
-          </w:p>
-        </w:tc>
-      </w:tr>
-      <w:tr>
-        <w:tc>
-          <w:tcPr/>
-          <w:p>
-            <w:pPr>
-              <w:pStyle w:val="Compact"/>
-              <w:jc w:val="left"/>
-            </w:pPr>
-            <w:r>
-              <w:rPr>
-                <w:b/>
-                <w:sz w:val="19"/>
-              </w:rPr>
-              <w:t xml:space="preserve">Buffalo rifle</w:t>
-            </w:r>
-          </w:p>
-        </w:tc>
-        <w:tc>
-          <w:tcPr/>
-          <w:p>
-            <w:pPr>
-              <w:pStyle w:val="Compact"/>
-              <w:jc w:val="left"/>
-            </w:pPr>
-            <w:r>
-              <w:rPr>
-                <w:sz w:val="19"/>
-              </w:rPr>
-              <w:t xml:space="preserve">Extreme</w:t>
-            </w:r>
-          </w:p>
-        </w:tc>
-        <w:tc>
-          <w:tcPr/>
-          <w:p>
-            <w:pPr>
-              <w:pStyle w:val="Compact"/>
-              <w:jc w:val="left"/>
-            </w:pPr>
-            <w:r>
-              <w:rPr>
-                <w:sz w:val="19"/>
-              </w:rPr>
-              <w:t xml:space="preserve">3, and Dying</w:t>
-            </w:r>
-          </w:p>
-        </w:tc>
-        <w:tc>
-          <w:tcPr/>
-          <w:p>
-            <w:pPr>
-              <w:pStyle w:val="Compact"/>
-              <w:jc w:val="left"/>
-            </w:pPr>
-            <w:r>
-              <w:rPr>
-                <w:sz w:val="19"/>
-              </w:rPr>
-              <w:t xml:space="preserve">A ruinous wound</w:t>
-            </w:r>
-          </w:p>
-        </w:tc>
-      </w:tr>
-      <w:tr>
-        <w:tc>
-          <w:tcPr/>
-          <w:p>
-            <w:pPr>
-              <w:pStyle w:val="Compact"/>
-              <w:jc w:val="left"/>
-            </w:pPr>
-            <w:r>
-              <w:rPr>
-                <w:b/>
-                <w:sz w:val="19"/>
-              </w:rPr>
               <w:t xml:space="preserve">Dynamite</w:t>
             </w:r>
           </w:p>
@@ -8257,6 +8257,24 @@
         </w:tc>
       </w:tr>
     </w:tbl>
+    <w:p>
+      <w:pPr>
+        <w:pStyle w:val="BodyText"/>
+      </w:pPr>
+      <w:r>
+        <w:rPr>
+          <w:bCs/>
+          <w:b/>
+        </w:rPr>
+        <w:t xml:space="preserve">Period ranges.</w:t>
+      </w:r>
+      <w:r>
+        <w:t xml:space="preserve"> </w:t>
+      </w:r>
+      <w:r>
+        <w:t xml:space="preserve">These are 1870s guns: a revolver is a close-quarters weapon, and most gunfights happen across a room or a street. A derringer is useless beyond Short range, and a shotgun beyond it does nothing.</w:t>
+      </w:r>
+    </w:p>
     <w:p>
       <w:pPr>
         <w:pStyle w:val="BodyText"/>

</xml_diff>

<commit_message>
One magic system for every setting: bursts, workings and charms
A shared Magic chapter in the core rules: bursts (one action), workings
(ritual clocks) and charms (workings stored for later), with Boosts that
replace per-tier spell text (Harder, Wider, Longer, Farther; −1 each to the
roll) and one magic advancement list. Each setting sets its own dials:
Seals and talismans in The Shattered Crown, Circles and fetishes in Aurora,
hexes for Sorcerers and charms for every practitioner in Dust & Damnation,
and spells for the Veneficare Lens in Grimm.

Co-Authored-By: Claude Opus 5.5 <noreply@anthropic.com>
Claude-Session: https://claude.ai/code/session_015SADCFzhKijkC2foUmXrpC
</commit_message>
<xml_diff>
--- a/grimm-west/Grimm_Players_Guide.docx
+++ b/grimm-west/Grimm_Players_Guide.docx
@@ -5603,7 +5603,7 @@
     </w:p>
     <w:bookmarkEnd w:id="48"/>
     <w:bookmarkEnd w:id="49"/>
-    <w:bookmarkStart w:id="55" w:name="the-woge-and-the-hidden-world"/>
+    <w:bookmarkStart w:id="58" w:name="the-woge-and-the-hidden-world"/>
     <w:p>
       <w:pPr>
         <w:pStyle w:val="Heading1"/>
@@ -5991,13 +5991,13 @@
     </w:p>
     <w:bookmarkEnd w:id="51"/>
     <w:bookmarkEnd w:id="52"/>
-    <w:bookmarkStart w:id="53" w:name="incantare-and-rituals"/>
+    <w:bookmarkStart w:id="56" w:name="magic"/>
     <w:p>
       <w:pPr>
         <w:pStyle w:val="Heading2"/>
       </w:pPr>
       <w:r>
-        <w:t xml:space="preserve">Incantare and rituals</w:t>
+        <w:t xml:space="preserve">Magic</w:t>
       </w:r>
     </w:p>
     <w:p>
@@ -6005,7 +6005,7 @@
         <w:pStyle w:val="FirstParagraph"/>
       </w:pPr>
       <w:r>
-        <w:t xml:space="preserve">An Incantare’s</w:t>
+        <w:t xml:space="preserve">Magic works at two speeds, with a third tool that turns one into the other. An Incantare’s</w:t>
       </w:r>
       <w:r>
         <w:t xml:space="preserve"> </w:t>
@@ -6021,358 +6021,7 @@
         <w:t xml:space="preserve"> </w:t>
       </w:r>
       <w:r>
-        <w:t xml:space="preserve">is their heritage advantage. The Lens decides</w:t>
-      </w:r>
-      <w:r>
-        <w:t xml:space="preserve"> </w:t>
-      </w:r>
-      <w:r>
-        <w:rPr>
-          <w:iCs/>
-          <w:i/>
-        </w:rPr>
-        <w:t xml:space="preserve">how</w:t>
-      </w:r>
-      <w:r>
-        <w:t xml:space="preserve"> </w:t>
-      </w:r>
-      <w:r>
-        <w:t xml:space="preserve">magic is worked: how long it takes, what it needs, what it costs and what it’s best at. Any Lens can attempt any effect.</w:t>
-      </w:r>
-    </w:p>
-    <w:p>
-      <w:pPr>
-        <w:pStyle w:val="BodyText"/>
-      </w:pPr>
-      <w:r>
-        <w:rPr>
-          <w:bCs/>
-          <w:b/>
-        </w:rPr>
-        <w:t xml:space="preserve">Working a ritual.</w:t>
-      </w:r>
-    </w:p>
-    <w:p>
-      <w:pPr>
-        <w:numPr>
-          <w:ilvl w:val="0"/>
-          <w:numId w:val="1011"/>
-        </w:numPr>
-        <w:pStyle w:val="Compact"/>
-      </w:pPr>
-      <w:r>
-        <w:rPr>
-          <w:bCs/>
-          <w:b/>
-        </w:rPr>
-        <w:t xml:space="preserve">Describe the effect.</w:t>
-      </w:r>
-      <w:r>
-        <w:t xml:space="preserve"> </w:t>
-      </w:r>
-      <w:r>
-        <w:t xml:space="preserve">The GM sets its weight:</w:t>
-      </w:r>
-      <w:r>
-        <w:t xml:space="preserve"> </w:t>
-      </w:r>
-      <w:r>
-        <w:rPr>
-          <w:bCs/>
-          <w:b/>
-        </w:rPr>
-        <w:t xml:space="preserve">minor</w:t>
-      </w:r>
-      <w:r>
-        <w:t xml:space="preserve"> </w:t>
-      </w:r>
-      <w:r>
-        <w:t xml:space="preserve">(2 segments),</w:t>
-      </w:r>
-      <w:r>
-        <w:t xml:space="preserve"> </w:t>
-      </w:r>
-      <w:r>
-        <w:rPr>
-          <w:bCs/>
-          <w:b/>
-        </w:rPr>
-        <w:t xml:space="preserve">significant</w:t>
-      </w:r>
-      <w:r>
-        <w:t xml:space="preserve"> </w:t>
-      </w:r>
-      <w:r>
-        <w:t xml:space="preserve">(4) or</w:t>
-      </w:r>
-      <w:r>
-        <w:t xml:space="preserve"> </w:t>
-      </w:r>
-      <w:r>
-        <w:rPr>
-          <w:bCs/>
-          <w:b/>
-        </w:rPr>
-        <w:t xml:space="preserve">major</w:t>
-      </w:r>
-      <w:r>
-        <w:t xml:space="preserve"> </w:t>
-      </w:r>
-      <w:r>
-        <w:t xml:space="preserve">(6), and says what it can and can’t do before you start.</w:t>
-      </w:r>
-    </w:p>
-    <w:p>
-      <w:pPr>
-        <w:numPr>
-          <w:ilvl w:val="0"/>
-          <w:numId w:val="1011"/>
-        </w:numPr>
-        <w:pStyle w:val="Compact"/>
-      </w:pPr>
-      <w:r>
-        <w:rPr>
-          <w:bCs/>
-          <w:b/>
-        </w:rPr>
-        <w:t xml:space="preserve">Gather the energy.</w:t>
-      </w:r>
-      <w:r>
-        <w:t xml:space="preserve"> </w:t>
-      </w:r>
-      <w:r>
-        <w:t xml:space="preserve">Fill a progress clock of that size with</w:t>
-      </w:r>
-      <w:r>
-        <w:t xml:space="preserve"> </w:t>
-      </w:r>
-      <w:r>
-        <w:rPr>
-          <w:bCs/>
-          <w:b/>
-        </w:rPr>
-        <w:t xml:space="preserve">Occult</w:t>
-      </w:r>
-      <w:r>
-        <w:t xml:space="preserve"> </w:t>
-      </w:r>
-      <w:r>
-        <w:t xml:space="preserve">rolls. Each roll takes your Lens’s casting time (usually ten minutes; an hour for a Magi, one action for a Veneficare). Success fills one segment; success by 5 or more fills two. A failure costs time or ticks a danger clock.</w:t>
-      </w:r>
-    </w:p>
-    <w:p>
-      <w:pPr>
-        <w:numPr>
-          <w:ilvl w:val="0"/>
-          <w:numId w:val="1011"/>
-        </w:numPr>
-        <w:pStyle w:val="Compact"/>
-      </w:pPr>
-      <w:r>
-        <w:rPr>
-          <w:bCs/>
-          <w:b/>
-        </w:rPr>
-        <w:t xml:space="preserve">The effect happens</w:t>
-      </w:r>
-      <w:r>
-        <w:t xml:space="preserve"> </w:t>
-      </w:r>
-      <w:r>
-        <w:t xml:space="preserve">when the clock is full. A ritual interrupted with energy gathered may go wrong.</w:t>
-      </w:r>
-    </w:p>
-    <w:p>
-      <w:pPr>
-        <w:pStyle w:val="FirstParagraph"/>
-      </w:pPr>
-      <w:r>
-        <w:rPr>
-          <w:bCs/>
-          <w:b/>
-        </w:rPr>
-        <w:t xml:space="preserve">Trappings.</w:t>
-      </w:r>
-      <w:r>
-        <w:t xml:space="preserve"> </w:t>
-      </w:r>
-      <w:r>
-        <w:t xml:space="preserve">The right materials and correspondences (stones, herbs, stars, places) remove one segment from the clock.</w:t>
-      </w:r>
-    </w:p>
-    <w:p>
-      <w:pPr>
-        <w:pStyle w:val="BodyText"/>
-      </w:pPr>
-      <w:r>
-        <w:rPr>
-          <w:bCs/>
-          <w:b/>
-        </w:rPr>
-        <w:t xml:space="preserve">Charms.</w:t>
-      </w:r>
-      <w:r>
-        <w:t xml:space="preserve"> </w:t>
-      </w:r>
-      <w:r>
-        <w:t xml:space="preserve">A finished ritual can be stored in an object and released by breaking it: a bottle thrown, a pendant snapped, a bullet-charm fired. You can carry as many ready charms as your Occult training allows: Trained 2, Specialty 3, Expert 4.</w:t>
-      </w:r>
-    </w:p>
-    <w:p>
-      <w:pPr>
-        <w:pStyle w:val="BodyText"/>
-      </w:pPr>
-      <w:r>
-        <w:rPr>
-          <w:bCs/>
-          <w:b/>
-        </w:rPr>
-        <w:t xml:space="preserve">Elixirs and potions</w:t>
-      </w:r>
-      <w:r>
-        <w:t xml:space="preserve"> </w:t>
-      </w:r>
-      <w:r>
-        <w:t xml:space="preserve">spoil. They stay good until the end of the day, or a week on a success by 5 or more.</w:t>
-      </w:r>
-    </w:p>
-    <w:p>
-      <w:pPr>
-        <w:pStyle w:val="BodyText"/>
-      </w:pPr>
-      <w:r>
-        <w:rPr>
-          <w:bCs/>
-          <w:b/>
-        </w:rPr>
-        <w:t xml:space="preserve">Magic draws attention.</w:t>
-      </w:r>
-      <w:r>
-        <w:t xml:space="preserve"> </w:t>
-      </w:r>
-      <w:r>
-        <w:t xml:space="preserve">Using it openly can mark a box of</w:t>
-      </w:r>
-      <w:r>
-        <w:t xml:space="preserve"> </w:t>
-      </w:r>
-      <w:r>
-        <w:rPr>
-          <w:bCs/>
-          <w:b/>
-        </w:rPr>
-        <w:t xml:space="preserve">Exposure</w:t>
-      </w:r>
-      <w:r>
-        <w:t xml:space="preserve">, the Order of the Holy Knife hunts known Incantare, and a Grimm gets +1 to sense your magic for each charm or potion you carry.</w:t>
-      </w:r>
-    </w:p>
-    <w:p>
-      <w:pPr>
-        <w:pStyle w:val="BodyText"/>
-      </w:pPr>
-      <w:r>
-        <w:rPr>
-          <w:bCs/>
-          <w:b/>
-        </w:rPr>
-        <w:t xml:space="preserve">Hexenbiests and Zauberbiests</w:t>
-      </w:r>
-      <w:r>
-        <w:t xml:space="preserve"> </w:t>
-      </w:r>
-      <w:r>
-        <w:t xml:space="preserve">work rituals the same way, through their innate magic, in their own style (curses, potions and sendings).</w:t>
-      </w:r>
-    </w:p>
-    <w:bookmarkEnd w:id="53"/>
-    <w:bookmarkStart w:id="54" w:name="the-code-of-swabia"/>
-    <w:p>
-      <w:pPr>
-        <w:pStyle w:val="Heading2"/>
-      </w:pPr>
-      <w:r>
-        <w:t xml:space="preserve">The Code of Swabia</w:t>
-      </w:r>
-    </w:p>
-    <w:p>
-      <w:pPr>
-        <w:pStyle w:val="FirstParagraph"/>
-      </w:pPr>
-      <w:r>
-        <w:t xml:space="preserve">The Code of Swabia is the old law between Wesen and the rest of the world, and Grimms are its enforcers. At its heart, Wesen must not reveal themselves to humanity. How far it reaches beyond that, and how mercifully a Grimm enforces it, is a question your characters will answer for themselves.</w:t>
-      </w:r>
-    </w:p>
-    <w:bookmarkEnd w:id="54"/>
-    <w:bookmarkEnd w:id="55"/>
-    <w:bookmarkStart w:id="63" w:name="personal-combat"/>
-    <w:p>
-      <w:pPr>
-        <w:pStyle w:val="Heading1"/>
-      </w:pPr>
-      <w:r>
-        <w:t xml:space="preserve">Personal combat</w:t>
-      </w:r>
-    </w:p>
-    <w:bookmarkStart w:id="56" w:name="turn-order-and-actions"/>
-    <w:p>
-      <w:pPr>
-        <w:pStyle w:val="Heading2"/>
-      </w:pPr>
-      <w:r>
-        <w:t xml:space="preserve">Turn order and actions</w:t>
-      </w:r>
-    </w:p>
-    <w:p>
-      <w:pPr>
-        <w:pStyle w:val="FirstParagraph"/>
-      </w:pPr>
-      <w:r>
-        <w:t xml:space="preserve">Act in descending Agility order. Players choose the order of tied characters; the GM resolves other ties. A round lasts a few seconds. On your turn, move a short distance and take one meaningful action, such as shooting, reloading, helping, or attempting a task.</w:t>
-      </w:r>
-    </w:p>
-    <w:bookmarkEnd w:id="56"/>
-    <w:bookmarkStart w:id="57" w:name="attacking-and-defending"/>
-    <w:p>
-      <w:pPr>
-        <w:pStyle w:val="Heading2"/>
-      </w:pPr>
-      <w:r>
-        <w:t xml:space="preserve">Attacking and defending</w:t>
-      </w:r>
-    </w:p>
-    <w:p>
-      <w:pPr>
-        <w:pStyle w:val="FirstParagraph"/>
-      </w:pPr>
-      <w:r>
-        <w:t xml:space="preserve">Roll Shooting for a ranged attack, Melee for a weapon in hand, or Brawling for fists and grappling. If the attack succeeds, an aware target able to move may attempt Dodge. Dodge is Agility −2, with +1 for Trained Athletics or +2 for Athletics as a Specialty or Expert. Each target gets one Dodge attempt per round. A successful Dodge cancels the hit. Apply injury penalties to Dodge.</w:t>
-      </w:r>
-    </w:p>
-    <w:p>
-      <w:pPr>
-        <w:pStyle w:val="BodyText"/>
-      </w:pPr>
-      <w:r>
-        <w:t xml:space="preserve">Solid cover blocks a shot. Partial cover imposes −2 on the attack. Weapon effects apply after a hit survives any Dodge. Success margin does not increase damage.</w:t>
-      </w:r>
-    </w:p>
-    <w:bookmarkEnd w:id="57"/>
-    <w:bookmarkStart w:id="58" w:name="range"/>
-    <w:p>
-      <w:pPr>
-        <w:pStyle w:val="Heading2"/>
-      </w:pPr>
-      <w:r>
-        <w:t xml:space="preserve">Range</w:t>
-      </w:r>
-    </w:p>
-    <w:p>
-      <w:pPr>
-        <w:pStyle w:val="FirstParagraph"/>
-      </w:pPr>
-      <w:r>
-        <w:t xml:space="preserve">Distances fall into five bands:</w:t>
+        <w:t xml:space="preserve">decides which they use and how; any Lens can attempt any effect.</w:t>
       </w:r>
     </w:p>
     <w:tbl>
@@ -6413,7 +6062,7 @@
                 <w:b/>
                 <w:sz w:val="19"/>
               </w:rPr>
-              <w:t xml:space="preserve">Band</w:t>
+              <w:t xml:space="preserve">Tool</w:t>
             </w:r>
           </w:p>
         </w:tc>
@@ -6431,7 +6080,7 @@
                 <w:b/>
                 <w:sz w:val="19"/>
               </w:rPr>
-              <w:t xml:space="preserve">Distance</w:t>
+              <w:t xml:space="preserve">Speed</w:t>
             </w:r>
           </w:p>
         </w:tc>
@@ -6449,281 +6098,506 @@
                 <w:b/>
                 <w:sz w:val="19"/>
               </w:rPr>
-              <w:t xml:space="preserve">For example</w:t>
-            </w:r>
-          </w:p>
-        </w:tc>
-      </w:tr>
-      <w:tr>
-        <w:tc>
-          <w:tcPr/>
-          <w:p>
-            <w:pPr>
-              <w:pStyle w:val="Compact"/>
-              <w:jc w:val="left"/>
-            </w:pPr>
-            <w:r>
-              <w:rPr>
-                <w:b/>
-                <w:sz w:val="19"/>
-              </w:rPr>
-              <w:t xml:space="preserve">Close</w:t>
-            </w:r>
-          </w:p>
-        </w:tc>
-        <w:tc>
-          <w:tcPr/>
-          <w:p>
-            <w:pPr>
-              <w:pStyle w:val="Compact"/>
-              <w:jc w:val="left"/>
-            </w:pPr>
-            <w:r>
-              <w:rPr>
-                <w:sz w:val="19"/>
-              </w:rPr>
-              <w:t xml:space="preserve">Up to 10 yards</w:t>
-            </w:r>
-          </w:p>
-        </w:tc>
-        <w:tc>
-          <w:tcPr/>
-          <w:p>
-            <w:pPr>
-              <w:pStyle w:val="Compact"/>
-              <w:jc w:val="left"/>
-            </w:pPr>
-            <w:r>
-              <w:rPr>
-                <w:sz w:val="19"/>
-              </w:rPr>
-              <w:t xml:space="preserve">Across a room or a saloon; one move covers it</w:t>
-            </w:r>
-          </w:p>
-        </w:tc>
-      </w:tr>
-      <w:tr>
-        <w:tc>
-          <w:tcPr/>
-          <w:p>
-            <w:pPr>
-              <w:pStyle w:val="Compact"/>
-              <w:jc w:val="left"/>
-            </w:pPr>
-            <w:r>
-              <w:rPr>
-                <w:b/>
-                <w:sz w:val="19"/>
-              </w:rPr>
-              <w:t xml:space="preserve">Short</w:t>
-            </w:r>
-          </w:p>
-        </w:tc>
-        <w:tc>
-          <w:tcPr/>
-          <w:p>
-            <w:pPr>
-              <w:pStyle w:val="Compact"/>
-              <w:jc w:val="left"/>
-            </w:pPr>
-            <w:r>
-              <w:rPr>
-                <w:sz w:val="19"/>
-              </w:rPr>
-              <w:t xml:space="preserve">Up to 50 yards</w:t>
-            </w:r>
-          </w:p>
-        </w:tc>
-        <w:tc>
-          <w:tcPr/>
-          <w:p>
-            <w:pPr>
-              <w:pStyle w:val="Compact"/>
-              <w:jc w:val="left"/>
-            </w:pPr>
-            <w:r>
-              <w:rPr>
-                <w:sz w:val="19"/>
-              </w:rPr>
-              <w:t xml:space="preserve">Across a street or a corral</w:t>
-            </w:r>
-          </w:p>
-        </w:tc>
-      </w:tr>
-      <w:tr>
-        <w:tc>
-          <w:tcPr/>
-          <w:p>
-            <w:pPr>
-              <w:pStyle w:val="Compact"/>
-              <w:jc w:val="left"/>
-            </w:pPr>
-            <w:r>
-              <w:rPr>
-                <w:b/>
-                <w:sz w:val="19"/>
-              </w:rPr>
-              <w:t xml:space="preserve">Medium</w:t>
-            </w:r>
-          </w:p>
-        </w:tc>
-        <w:tc>
-          <w:tcPr/>
-          <w:p>
-            <w:pPr>
-              <w:pStyle w:val="Compact"/>
-              <w:jc w:val="left"/>
-            </w:pPr>
-            <w:r>
-              <w:rPr>
-                <w:sz w:val="19"/>
-              </w:rPr>
-              <w:t xml:space="preserve">Up to 150 yards</w:t>
-            </w:r>
-          </w:p>
-        </w:tc>
-        <w:tc>
-          <w:tcPr/>
-          <w:p>
-            <w:pPr>
-              <w:pStyle w:val="Compact"/>
-              <w:jc w:val="left"/>
-            </w:pPr>
-            <w:r>
-              <w:rPr>
-                <w:sz w:val="19"/>
-              </w:rPr>
-              <w:t xml:space="preserve">Down the length of a town</w:t>
-            </w:r>
-          </w:p>
-        </w:tc>
-      </w:tr>
-      <w:tr>
-        <w:tc>
-          <w:tcPr/>
-          <w:p>
-            <w:pPr>
-              <w:pStyle w:val="Compact"/>
-              <w:jc w:val="left"/>
-            </w:pPr>
-            <w:r>
-              <w:rPr>
-                <w:b/>
-                <w:sz w:val="19"/>
-              </w:rPr>
-              <w:t xml:space="preserve">Long</w:t>
-            </w:r>
-          </w:p>
-        </w:tc>
-        <w:tc>
-          <w:tcPr/>
-          <w:p>
-            <w:pPr>
-              <w:pStyle w:val="Compact"/>
-              <w:jc w:val="left"/>
-            </w:pPr>
-            <w:r>
-              <w:rPr>
-                <w:sz w:val="19"/>
-              </w:rPr>
-              <w:t xml:space="preserve">Up to 500 yards</w:t>
-            </w:r>
-          </w:p>
-        </w:tc>
-        <w:tc>
-          <w:tcPr/>
-          <w:p>
-            <w:pPr>
-              <w:pStyle w:val="Compact"/>
-              <w:jc w:val="left"/>
-            </w:pPr>
-            <w:r>
-              <w:rPr>
-                <w:sz w:val="19"/>
-              </w:rPr>
-              <w:t xml:space="preserve">Across a valley or a river crossing</w:t>
-            </w:r>
-          </w:p>
-        </w:tc>
-      </w:tr>
-      <w:tr>
-        <w:tc>
-          <w:tcPr/>
-          <w:p>
-            <w:pPr>
-              <w:pStyle w:val="Compact"/>
-              <w:jc w:val="left"/>
-            </w:pPr>
-            <w:r>
-              <w:rPr>
-                <w:b/>
-                <w:sz w:val="19"/>
-              </w:rPr>
-              <w:t xml:space="preserve">Extreme</w:t>
-            </w:r>
-          </w:p>
-        </w:tc>
-        <w:tc>
-          <w:tcPr/>
-          <w:p>
-            <w:pPr>
-              <w:pStyle w:val="Compact"/>
-              <w:jc w:val="left"/>
-            </w:pPr>
-            <w:r>
-              <w:rPr>
-                <w:sz w:val="19"/>
-              </w:rPr>
-              <w:t xml:space="preserve">Up to a mile, in line of sight</w:t>
-            </w:r>
-          </w:p>
-        </w:tc>
-        <w:tc>
-          <w:tcPr/>
-          <w:p>
-            <w:pPr>
-              <w:pStyle w:val="Compact"/>
-              <w:jc w:val="left"/>
-            </w:pPr>
-            <w:r>
-              <w:rPr>
-                <w:sz w:val="19"/>
-              </w:rPr>
-              <w:t xml:space="preserve">Ridge to ridge</w:t>
+              <w:t xml:space="preserve">How it works</w:t>
+            </w:r>
+          </w:p>
+        </w:tc>
+      </w:tr>
+      <w:tr>
+        <w:tc>
+          <w:tcPr/>
+          <w:p>
+            <w:pPr>
+              <w:pStyle w:val="Compact"/>
+              <w:jc w:val="left"/>
+            </w:pPr>
+            <w:r>
+              <w:rPr>
+                <w:bCs/>
+                <w:b/>
+                <w:sz w:val="19"/>
+              </w:rPr>
+              <w:t xml:space="preserve">Spells</w:t>
+            </w:r>
+          </w:p>
+        </w:tc>
+        <w:tc>
+          <w:tcPr/>
+          <w:p>
+            <w:pPr>
+              <w:pStyle w:val="Compact"/>
+              <w:jc w:val="left"/>
+            </w:pPr>
+            <w:r>
+              <w:rPr>
+                <w:sz w:val="19"/>
+              </w:rPr>
+              <w:t xml:space="preserve">One action</w:t>
+            </w:r>
+          </w:p>
+        </w:tc>
+        <w:tc>
+          <w:tcPr/>
+          <w:p>
+            <w:pPr>
+              <w:pStyle w:val="Compact"/>
+              <w:jc w:val="left"/>
+            </w:pPr>
+            <w:r>
+              <w:rPr>
+                <w:sz w:val="19"/>
+              </w:rPr>
+              <w:t xml:space="preserve">A quick spell you know. Roll Occult; on a success it happens. Veneficare only.</w:t>
+            </w:r>
+          </w:p>
+        </w:tc>
+      </w:tr>
+      <w:tr>
+        <w:tc>
+          <w:tcPr/>
+          <w:p>
+            <w:pPr>
+              <w:pStyle w:val="Compact"/>
+              <w:jc w:val="left"/>
+            </w:pPr>
+            <w:r>
+              <w:rPr>
+                <w:bCs/>
+                <w:b/>
+                <w:sz w:val="19"/>
+              </w:rPr>
+              <w:t xml:space="preserve">Rituals</w:t>
+            </w:r>
+          </w:p>
+        </w:tc>
+        <w:tc>
+          <w:tcPr/>
+          <w:p>
+            <w:pPr>
+              <w:pStyle w:val="Compact"/>
+              <w:jc w:val="left"/>
+            </w:pPr>
+            <w:r>
+              <w:rPr>
+                <w:sz w:val="19"/>
+              </w:rPr>
+              <w:t xml:space="preserve">Minutes to nights</w:t>
+            </w:r>
+          </w:p>
+        </w:tc>
+        <w:tc>
+          <w:tcPr/>
+          <w:p>
+            <w:pPr>
+              <w:pStyle w:val="Compact"/>
+              <w:jc w:val="left"/>
+            </w:pPr>
+            <w:r>
+              <w:rPr>
+                <w:sz w:val="19"/>
+              </w:rPr>
+              <w:t xml:space="preserve">Anything else. Describe the effect; the GM sets its weight; fill a progress clock.</w:t>
+            </w:r>
+          </w:p>
+        </w:tc>
+      </w:tr>
+      <w:tr>
+        <w:tc>
+          <w:tcPr/>
+          <w:p>
+            <w:pPr>
+              <w:pStyle w:val="Compact"/>
+              <w:jc w:val="left"/>
+            </w:pPr>
+            <w:r>
+              <w:rPr>
+                <w:bCs/>
+                <w:b/>
+                <w:sz w:val="19"/>
+              </w:rPr>
+              <w:t xml:space="preserve">Charms</w:t>
+            </w:r>
+          </w:p>
+        </w:tc>
+        <w:tc>
+          <w:tcPr/>
+          <w:p>
+            <w:pPr>
+              <w:pStyle w:val="Compact"/>
+              <w:jc w:val="left"/>
+            </w:pPr>
+            <w:r>
+              <w:rPr>
+                <w:sz w:val="19"/>
+              </w:rPr>
+              <w:t xml:space="preserve">One action, no roll</w:t>
+            </w:r>
+          </w:p>
+        </w:tc>
+        <w:tc>
+          <w:tcPr/>
+          <w:p>
+            <w:pPr>
+              <w:pStyle w:val="Compact"/>
+              <w:jc w:val="left"/>
+            </w:pPr>
+            <w:r>
+              <w:rPr>
+                <w:sz w:val="19"/>
+              </w:rPr>
+              <w:t xml:space="preserve">A finished ritual stored in an object, released by breaking it.</w:t>
             </w:r>
           </w:p>
         </w:tc>
       </w:tr>
     </w:tbl>
-    <w:p>
-      <w:pPr>
-        <w:pStyle w:val="BodyText"/>
-      </w:pPr>
-      <w:r>
-        <w:t xml:space="preserve">Every ranged weapon has an</w:t>
-      </w:r>
-      <w:r>
-        <w:t xml:space="preserve"> </w:t>
-      </w:r>
+    <w:bookmarkStart w:id="53" w:name="rituals"/>
+    <w:p>
+      <w:pPr>
+        <w:pStyle w:val="Heading3"/>
+      </w:pPr>
+      <w:r>
+        <w:t xml:space="preserve">Rituals</w:t>
+      </w:r>
+    </w:p>
+    <w:p>
+      <w:pPr>
+        <w:numPr>
+          <w:ilvl w:val="0"/>
+          <w:numId w:val="1011"/>
+        </w:numPr>
+        <w:pStyle w:val="Compact"/>
+      </w:pPr>
       <w:r>
         <w:rPr>
           <w:bCs/>
           <w:b/>
         </w:rPr>
-        <w:t xml:space="preserve">effective band</w:t>
-      </w:r>
-      <w:r>
-        <w:t xml:space="preserve">, shown in the weapons table. Attacks within it take no penalty. One band beyond it is −2, two bands beyond is −4, and anything farther is out of range. Weapons in hand, claws and fists reach only someone next to you. Your move each turn covers the Close band; give up your action to run and you cover Short.</w:t>
-      </w:r>
-    </w:p>
-    <w:bookmarkEnd w:id="58"/>
-    <w:bookmarkStart w:id="60" w:name="injury"/>
-    <w:p>
-      <w:pPr>
-        <w:pStyle w:val="Heading2"/>
-      </w:pPr>
-      <w:r>
-        <w:t xml:space="preserve">Injury</w:t>
+        <w:t xml:space="preserve">Describe the effect.</w:t>
+      </w:r>
+      <w:r>
+        <w:t xml:space="preserve"> </w:t>
+      </w:r>
+      <w:r>
+        <w:t xml:space="preserve">The GM sets its weight:</w:t>
+      </w:r>
+      <w:r>
+        <w:t xml:space="preserve"> </w:t>
+      </w:r>
+      <w:r>
+        <w:rPr>
+          <w:bCs/>
+          <w:b/>
+        </w:rPr>
+        <w:t xml:space="preserve">minor</w:t>
+      </w:r>
+      <w:r>
+        <w:t xml:space="preserve"> </w:t>
+      </w:r>
+      <w:r>
+        <w:t xml:space="preserve">(2 segments),</w:t>
+      </w:r>
+      <w:r>
+        <w:t xml:space="preserve"> </w:t>
+      </w:r>
+      <w:r>
+        <w:rPr>
+          <w:bCs/>
+          <w:b/>
+        </w:rPr>
+        <w:t xml:space="preserve">significant</w:t>
+      </w:r>
+      <w:r>
+        <w:t xml:space="preserve"> </w:t>
+      </w:r>
+      <w:r>
+        <w:t xml:space="preserve">(4) or</w:t>
+      </w:r>
+      <w:r>
+        <w:t xml:space="preserve"> </w:t>
+      </w:r>
+      <w:r>
+        <w:rPr>
+          <w:bCs/>
+          <w:b/>
+        </w:rPr>
+        <w:t xml:space="preserve">major</w:t>
+      </w:r>
+      <w:r>
+        <w:t xml:space="preserve"> </w:t>
+      </w:r>
+      <w:r>
+        <w:t xml:space="preserve">(6), and says what it can and can’t do before you start.</w:t>
+      </w:r>
+    </w:p>
+    <w:p>
+      <w:pPr>
+        <w:numPr>
+          <w:ilvl w:val="0"/>
+          <w:numId w:val="1011"/>
+        </w:numPr>
+        <w:pStyle w:val="Compact"/>
+      </w:pPr>
+      <w:r>
+        <w:rPr>
+          <w:bCs/>
+          <w:b/>
+        </w:rPr>
+        <w:t xml:space="preserve">Gather the energy.</w:t>
+      </w:r>
+      <w:r>
+        <w:t xml:space="preserve"> </w:t>
+      </w:r>
+      <w:r>
+        <w:t xml:space="preserve">Fill a progress clock of that size with</w:t>
+      </w:r>
+      <w:r>
+        <w:t xml:space="preserve"> </w:t>
+      </w:r>
+      <w:r>
+        <w:rPr>
+          <w:bCs/>
+          <w:b/>
+        </w:rPr>
+        <w:t xml:space="preserve">Occult</w:t>
+      </w:r>
+      <w:r>
+        <w:t xml:space="preserve"> </w:t>
+      </w:r>
+      <w:r>
+        <w:t xml:space="preserve">rolls. Each roll takes your Lens’s casting time (usually ten minutes; an hour for a Magi). Success fills one segment; success by 5 or more fills two. A failure costs time or ticks a danger clock.</w:t>
+      </w:r>
+    </w:p>
+    <w:p>
+      <w:pPr>
+        <w:numPr>
+          <w:ilvl w:val="0"/>
+          <w:numId w:val="1011"/>
+        </w:numPr>
+        <w:pStyle w:val="Compact"/>
+      </w:pPr>
+      <w:r>
+        <w:rPr>
+          <w:bCs/>
+          <w:b/>
+        </w:rPr>
+        <w:t xml:space="preserve">The effect happens</w:t>
+      </w:r>
+      <w:r>
+        <w:t xml:space="preserve"> </w:t>
+      </w:r>
+      <w:r>
+        <w:t xml:space="preserve">when the clock is full. A ritual interrupted with energy gathered may go wrong.</w:t>
+      </w:r>
+    </w:p>
+    <w:p>
+      <w:pPr>
+        <w:pStyle w:val="FirstParagraph"/>
+      </w:pPr>
+      <w:r>
+        <w:rPr>
+          <w:bCs/>
+          <w:b/>
+        </w:rPr>
+        <w:t xml:space="preserve">Trappings.</w:t>
+      </w:r>
+      <w:r>
+        <w:t xml:space="preserve"> </w:t>
+      </w:r>
+      <w:r>
+        <w:t xml:space="preserve">The right materials and correspondences (stones, herbs, stars, places) remove one segment from the clock.</w:t>
+      </w:r>
+    </w:p>
+    <w:bookmarkEnd w:id="53"/>
+    <w:bookmarkStart w:id="54" w:name="charms-elixirs-and-potions"/>
+    <w:p>
+      <w:pPr>
+        <w:pStyle w:val="Heading3"/>
+      </w:pPr>
+      <w:r>
+        <w:t xml:space="preserve">Charms, elixirs and potions</w:t>
+      </w:r>
+    </w:p>
+    <w:p>
+      <w:pPr>
+        <w:pStyle w:val="FirstParagraph"/>
+      </w:pPr>
+      <w:r>
+        <w:rPr>
+          <w:bCs/>
+          <w:b/>
+        </w:rPr>
+        <w:t xml:space="preserve">Charms.</w:t>
+      </w:r>
+      <w:r>
+        <w:t xml:space="preserve"> </w:t>
+      </w:r>
+      <w:r>
+        <w:t xml:space="preserve">A finished ritual can be stored in an object and released by breaking it: a bottle thrown, a pendant snapped, a bullet-charm fired. You can carry as many ready charms as your Occult training allows: Trained 2, Specialty 3, Expert 4. A Scaenarfex carries one more; a Veneficare only one. Preparation is how slow magic wins a fast fight.</w:t>
+      </w:r>
+    </w:p>
+    <w:p>
+      <w:pPr>
+        <w:pStyle w:val="BodyText"/>
+      </w:pPr>
+      <w:r>
+        <w:rPr>
+          <w:bCs/>
+          <w:b/>
+        </w:rPr>
+        <w:t xml:space="preserve">Elixirs and potions</w:t>
+      </w:r>
+      <w:r>
+        <w:t xml:space="preserve"> </w:t>
+      </w:r>
+      <w:r>
+        <w:t xml:space="preserve">spoil. They stay good until the end of the day, or a week on a success by 5 or more.</w:t>
+      </w:r>
+    </w:p>
+    <w:bookmarkEnd w:id="54"/>
+    <w:bookmarkStart w:id="55" w:name="spells-veneficare"/>
+    <w:p>
+      <w:pPr>
+        <w:pStyle w:val="Heading3"/>
+      </w:pPr>
+      <w:r>
+        <w:t xml:space="preserve">Spells (Veneficare)</w:t>
+      </w:r>
+    </w:p>
+    <w:p>
+      <w:pPr>
+        <w:pStyle w:val="FirstParagraph"/>
+      </w:pPr>
+      <w:r>
+        <w:t xml:space="preserve">A</w:t>
+      </w:r>
+      <w:r>
+        <w:t xml:space="preserve"> </w:t>
+      </w:r>
+      <w:r>
+        <w:rPr>
+          <w:bCs/>
+          <w:b/>
+        </w:rPr>
+        <w:t xml:space="preserve">Veneficare</w:t>
+      </w:r>
+      <w:r>
+        <w:t xml:space="preserve"> </w:t>
+      </w:r>
+      <w:r>
+        <w:t xml:space="preserve">trades preparation for speed: they know</w:t>
+      </w:r>
+      <w:r>
+        <w:t xml:space="preserve"> </w:t>
+      </w:r>
+      <w:r>
+        <w:rPr>
+          <w:bCs/>
+          <w:b/>
+        </w:rPr>
+        <w:t xml:space="preserve">spells</w:t>
+      </w:r>
+      <w:r>
+        <w:t xml:space="preserve">, cast with</w:t>
+      </w:r>
+      <w:r>
+        <w:t xml:space="preserve"> </w:t>
+      </w:r>
+      <w:r>
+        <w:rPr>
+          <w:bCs/>
+          <w:b/>
+        </w:rPr>
+        <w:t xml:space="preserve">one action and an Occult roll</w:t>
+      </w:r>
+      <w:r>
+        <w:t xml:space="preserve">, shaped by one or two Paths agreed with the GM. Spells known:</w:t>
+      </w:r>
+      <w:r>
+        <w:t xml:space="preserve"> </w:t>
+      </w:r>
+      <w:r>
+        <w:rPr>
+          <w:bCs/>
+          <w:b/>
+        </w:rPr>
+        <w:t xml:space="preserve">Trained 2, Specialty 3, Expert 4</w:t>
+      </w:r>
+      <w:r>
+        <w:t xml:space="preserve">.</w:t>
+      </w:r>
+    </w:p>
+    <w:p>
+      <w:pPr>
+        <w:pStyle w:val="BodyText"/>
+      </w:pPr>
+      <w:r>
+        <w:t xml:space="preserve">Each spell has a short</w:t>
+      </w:r>
+      <w:r>
+        <w:t xml:space="preserve"> </w:t>
+      </w:r>
+      <w:r>
+        <w:rPr>
+          <w:bCs/>
+          <w:b/>
+        </w:rPr>
+        <w:t xml:space="preserve">base effect</w:t>
+      </w:r>
+      <w:r>
+        <w:t xml:space="preserve">: one target, for one scene, at Close or Short range. Occult as a Specialty gives</w:t>
+      </w:r>
+      <w:r>
+        <w:t xml:space="preserve"> </w:t>
+      </w:r>
+      <w:r>
+        <w:rPr>
+          <w:bCs/>
+          <w:b/>
+        </w:rPr>
+        <w:t xml:space="preserve">1 Boost</w:t>
+      </w:r>
+      <w:r>
+        <w:t xml:space="preserve">, as Expert</w:t>
+      </w:r>
+      <w:r>
+        <w:t xml:space="preserve"> </w:t>
+      </w:r>
+      <w:r>
+        <w:rPr>
+          <w:bCs/>
+          <w:b/>
+        </w:rPr>
+        <w:t xml:space="preserve">2</w:t>
+      </w:r>
+      <w:r>
+        <w:t xml:space="preserve">, chosen</w:t>
+      </w:r>
+      <w:r>
+        <w:t xml:space="preserve"> </w:t>
+      </w:r>
+      <w:r>
+        <w:rPr>
+          <w:bCs/>
+          <w:b/>
+        </w:rPr>
+        <w:t xml:space="preserve">as you cast</w:t>
+      </w:r>
+      <w:r>
+        <w:t xml:space="preserve">; each Boost spent is</w:t>
+      </w:r>
+      <w:r>
+        <w:t xml:space="preserve"> </w:t>
+      </w:r>
+      <w:r>
+        <w:rPr>
+          <w:bCs/>
+          <w:b/>
+        </w:rPr>
+        <w:t xml:space="preserve">−1 to the roll</w:t>
+      </w:r>
+      <w:r>
+        <w:t xml:space="preserve">.</w:t>
       </w:r>
     </w:p>
     <w:tbl>
@@ -6764,7 +6638,7 @@
                 <w:b/>
                 <w:sz w:val="19"/>
               </w:rPr>
-              <w:t xml:space="preserve">Boxes marked</w:t>
+              <w:t xml:space="preserve">Boost</w:t>
             </w:r>
           </w:p>
         </w:tc>
@@ -6782,7 +6656,7 @@
                 <w:b/>
                 <w:sz w:val="19"/>
               </w:rPr>
-              <w:t xml:space="preserve">Condition</w:t>
+              <w:t xml:space="preserve">One Boost</w:t>
             </w:r>
           </w:p>
         </w:tc>
@@ -6800,6 +6674,1136 @@
                 <w:b/>
                 <w:sz w:val="19"/>
               </w:rPr>
+              <w:t xml:space="preserve">Two Boosts</w:t>
+            </w:r>
+          </w:p>
+        </w:tc>
+      </w:tr>
+      <w:tr>
+        <w:tc>
+          <w:tcPr/>
+          <w:p>
+            <w:pPr>
+              <w:pStyle w:val="Compact"/>
+              <w:jc w:val="left"/>
+            </w:pPr>
+            <w:r>
+              <w:rPr>
+                <w:bCs/>
+                <w:b/>
+                <w:sz w:val="19"/>
+              </w:rPr>
+              <w:t xml:space="preserve">Harder</w:t>
+            </w:r>
+          </w:p>
+        </w:tc>
+        <w:tc>
+          <w:tcPr/>
+          <w:p>
+            <w:pPr>
+              <w:pStyle w:val="Compact"/>
+              <w:jc w:val="left"/>
+            </w:pPr>
+            <w:r>
+              <w:rPr>
+                <w:sz w:val="19"/>
+              </w:rPr>
+              <w:t xml:space="preserve">+1 box, or the penalty becomes −3</w:t>
+            </w:r>
+          </w:p>
+        </w:tc>
+        <w:tc>
+          <w:tcPr/>
+          <w:p>
+            <w:pPr>
+              <w:pStyle w:val="Compact"/>
+              <w:jc w:val="left"/>
+            </w:pPr>
+            <w:r>
+              <w:rPr>
+                <w:sz w:val="19"/>
+              </w:rPr>
+              <w:t xml:space="preserve">+2 boxes, or −4</w:t>
+            </w:r>
+          </w:p>
+        </w:tc>
+      </w:tr>
+      <w:tr>
+        <w:tc>
+          <w:tcPr/>
+          <w:p>
+            <w:pPr>
+              <w:pStyle w:val="Compact"/>
+              <w:jc w:val="left"/>
+            </w:pPr>
+            <w:r>
+              <w:rPr>
+                <w:bCs/>
+                <w:b/>
+                <w:sz w:val="19"/>
+              </w:rPr>
+              <w:t xml:space="preserve">Wider</w:t>
+            </w:r>
+          </w:p>
+        </w:tc>
+        <w:tc>
+          <w:tcPr/>
+          <w:p>
+            <w:pPr>
+              <w:pStyle w:val="Compact"/>
+              <w:jc w:val="left"/>
+            </w:pPr>
+            <w:r>
+              <w:rPr>
+                <w:sz w:val="19"/>
+              </w:rPr>
+              <w:t xml:space="preserve">A handful of targets</w:t>
+            </w:r>
+          </w:p>
+        </w:tc>
+        <w:tc>
+          <w:tcPr/>
+          <w:p>
+            <w:pPr>
+              <w:pStyle w:val="Compact"/>
+              <w:jc w:val="left"/>
+            </w:pPr>
+            <w:r>
+              <w:rPr>
+                <w:sz w:val="19"/>
+              </w:rPr>
+              <w:t xml:space="preserve">A crowd, or an area</w:t>
+            </w:r>
+          </w:p>
+        </w:tc>
+      </w:tr>
+      <w:tr>
+        <w:tc>
+          <w:tcPr/>
+          <w:p>
+            <w:pPr>
+              <w:pStyle w:val="Compact"/>
+              <w:jc w:val="left"/>
+            </w:pPr>
+            <w:r>
+              <w:rPr>
+                <w:bCs/>
+                <w:b/>
+                <w:sz w:val="19"/>
+              </w:rPr>
+              <w:t xml:space="preserve">Longer</w:t>
+            </w:r>
+          </w:p>
+        </w:tc>
+        <w:tc>
+          <w:tcPr/>
+          <w:p>
+            <w:pPr>
+              <w:pStyle w:val="Compact"/>
+              <w:jc w:val="left"/>
+            </w:pPr>
+            <w:r>
+              <w:rPr>
+                <w:sz w:val="19"/>
+              </w:rPr>
+              <w:t xml:space="preserve">A day</w:t>
+            </w:r>
+          </w:p>
+        </w:tc>
+        <w:tc>
+          <w:tcPr/>
+          <w:p>
+            <w:pPr>
+              <w:pStyle w:val="Compact"/>
+              <w:jc w:val="left"/>
+            </w:pPr>
+            <w:r>
+              <w:rPr>
+                <w:sz w:val="19"/>
+              </w:rPr>
+              <w:t xml:space="preserve">Until it’s lifted</w:t>
+            </w:r>
+          </w:p>
+        </w:tc>
+      </w:tr>
+      <w:tr>
+        <w:tc>
+          <w:tcPr/>
+          <w:p>
+            <w:pPr>
+              <w:pStyle w:val="Compact"/>
+              <w:jc w:val="left"/>
+            </w:pPr>
+            <w:r>
+              <w:rPr>
+                <w:bCs/>
+                <w:b/>
+                <w:sz w:val="19"/>
+              </w:rPr>
+              <w:t xml:space="preserve">Farther</w:t>
+            </w:r>
+          </w:p>
+        </w:tc>
+        <w:tc>
+          <w:tcPr/>
+          <w:p>
+            <w:pPr>
+              <w:pStyle w:val="Compact"/>
+              <w:jc w:val="left"/>
+            </w:pPr>
+            <w:r>
+              <w:rPr>
+                <w:sz w:val="19"/>
+              </w:rPr>
+              <w:t xml:space="preserve">One range band farther</w:t>
+            </w:r>
+          </w:p>
+        </w:tc>
+        <w:tc>
+          <w:tcPr/>
+          <w:p>
+            <w:pPr>
+              <w:pStyle w:val="Compact"/>
+              <w:jc w:val="left"/>
+            </w:pPr>
+            <w:r>
+              <w:rPr>
+                <w:sz w:val="19"/>
+              </w:rPr>
+              <w:t xml:space="preserve">Two bands farther</w:t>
+            </w:r>
+          </w:p>
+        </w:tc>
+      </w:tr>
+    </w:tbl>
+    <w:p/>
+    <w:tbl>
+      <w:tblPr>
+        <w:tblStyle w:val="Table"/>
+        <w:tblW w:type="pct" w:w="5000"/>
+        <w:tblLook w:firstRow="1" w:lastRow="0" w:firstColumn="0" w:lastColumn="0" w:noHBand="0" w:noVBand="0" w:val="0020"/>
+        <w:jc w:val="start"/>
+        <w:tblBorders>
+          <w:top w:val="single" w:sz="4" w:color="B8C2D3"/>
+          <w:left w:val="single" w:sz="4" w:color="B8C2D3"/>
+          <w:bottom w:val="single" w:sz="4" w:color="B8C2D3"/>
+          <w:right w:val="single" w:sz="4" w:color="B8C2D3"/>
+          <w:insideH w:val="single" w:sz="4" w:color="B8C2D3"/>
+          <w:insideV w:val="single" w:sz="4" w:color="B8C2D3"/>
+        </w:tblBorders>
+      </w:tblPr>
+      <w:tblGrid>
+        <w:gridCol w:w="3960"/>
+        <w:gridCol w:w="3960"/>
+      </w:tblGrid>
+      <w:tr>
+        <w:trPr>
+          <w:tblHeader w:val="true"/>
+        </w:trPr>
+        <w:tc>
+          <w:tcPr>
+            <w:shd w:val="clear" w:fill="F1E6D2"/>
+          </w:tcPr>
+          <w:p>
+            <w:pPr>
+              <w:pStyle w:val="Compact"/>
+              <w:jc w:val="left"/>
+            </w:pPr>
+            <w:r>
+              <w:rPr>
+                <w:b/>
+                <w:sz w:val="19"/>
+              </w:rPr>
+              <w:t xml:space="preserve">Spell</w:t>
+            </w:r>
+          </w:p>
+        </w:tc>
+        <w:tc>
+          <w:tcPr>
+            <w:shd w:val="clear" w:fill="F1E6D2"/>
+          </w:tcPr>
+          <w:p>
+            <w:pPr>
+              <w:pStyle w:val="Compact"/>
+              <w:jc w:val="left"/>
+            </w:pPr>
+            <w:r>
+              <w:rPr>
+                <w:b/>
+                <w:sz w:val="19"/>
+              </w:rPr>
+              <w:t xml:space="preserve">Base effect</w:t>
+            </w:r>
+          </w:p>
+        </w:tc>
+      </w:tr>
+      <w:tr>
+        <w:tc>
+          <w:tcPr/>
+          <w:p>
+            <w:pPr>
+              <w:pStyle w:val="Compact"/>
+              <w:jc w:val="left"/>
+            </w:pPr>
+            <w:r>
+              <w:rPr>
+                <w:b/>
+                <w:sz w:val="19"/>
+              </w:rPr>
+              <w:t xml:space="preserve">Flame</w:t>
+            </w:r>
+          </w:p>
+        </w:tc>
+        <w:tc>
+          <w:tcPr/>
+          <w:p>
+            <w:pPr>
+              <w:pStyle w:val="Compact"/>
+              <w:jc w:val="left"/>
+            </w:pPr>
+            <w:r>
+              <w:rPr>
+                <w:sz w:val="19"/>
+              </w:rPr>
+              <w:t xml:space="preserve">A lash of fire at Short range; marks 2 boxes. Dodge applies.</w:t>
+            </w:r>
+          </w:p>
+        </w:tc>
+      </w:tr>
+      <w:tr>
+        <w:tc>
+          <w:tcPr/>
+          <w:p>
+            <w:pPr>
+              <w:pStyle w:val="Compact"/>
+              <w:jc w:val="left"/>
+            </w:pPr>
+            <w:r>
+              <w:rPr>
+                <w:b/>
+                <w:sz w:val="19"/>
+              </w:rPr>
+              <w:t xml:space="preserve">Force</w:t>
+            </w:r>
+          </w:p>
+        </w:tc>
+        <w:tc>
+          <w:tcPr/>
+          <w:p>
+            <w:pPr>
+              <w:pStyle w:val="Compact"/>
+              <w:jc w:val="left"/>
+            </w:pPr>
+            <w:r>
+              <w:rPr>
+                <w:sz w:val="19"/>
+              </w:rPr>
+              <w:t xml:space="preserve">Unseen force hurls the target down: 1 box, and they lose their next move (Body resists).</w:t>
+            </w:r>
+          </w:p>
+        </w:tc>
+      </w:tr>
+      <w:tr>
+        <w:tc>
+          <w:tcPr/>
+          <w:p>
+            <w:pPr>
+              <w:pStyle w:val="Compact"/>
+              <w:jc w:val="left"/>
+            </w:pPr>
+            <w:r>
+              <w:rPr>
+                <w:b/>
+                <w:sz w:val="19"/>
+              </w:rPr>
+              <w:t xml:space="preserve">Ward</w:t>
+            </w:r>
+          </w:p>
+        </w:tc>
+        <w:tc>
+          <w:tcPr/>
+          <w:p>
+            <w:pPr>
+              <w:pStyle w:val="Compact"/>
+              <w:jc w:val="left"/>
+            </w:pPr>
+            <w:r>
+              <w:rPr>
+                <w:sz w:val="19"/>
+              </w:rPr>
+              <w:t xml:space="preserve">Attacks against one ally are at −2 for the scene.</w:t>
+            </w:r>
+          </w:p>
+        </w:tc>
+      </w:tr>
+      <w:tr>
+        <w:tc>
+          <w:tcPr/>
+          <w:p>
+            <w:pPr>
+              <w:pStyle w:val="Compact"/>
+              <w:jc w:val="left"/>
+            </w:pPr>
+            <w:r>
+              <w:rPr>
+                <w:b/>
+                <w:sz w:val="19"/>
+              </w:rPr>
+              <w:t xml:space="preserve">Fluch</w:t>
+            </w:r>
+          </w:p>
+        </w:tc>
+        <w:tc>
+          <w:tcPr/>
+          <w:p>
+            <w:pPr>
+              <w:pStyle w:val="Compact"/>
+              <w:jc w:val="left"/>
+            </w:pPr>
+            <w:r>
+              <w:rPr>
+                <w:sz w:val="19"/>
+              </w:rPr>
+              <w:t xml:space="preserve">The target is at −2 on all rolls for the scene (Will resists).</w:t>
+            </w:r>
+          </w:p>
+        </w:tc>
+      </w:tr>
+      <w:tr>
+        <w:tc>
+          <w:tcPr/>
+          <w:p>
+            <w:pPr>
+              <w:pStyle w:val="Compact"/>
+              <w:jc w:val="left"/>
+            </w:pPr>
+            <w:r>
+              <w:rPr>
+                <w:b/>
+                <w:sz w:val="19"/>
+              </w:rPr>
+              <w:t xml:space="preserve">Bind</w:t>
+            </w:r>
+          </w:p>
+        </w:tc>
+        <w:tc>
+          <w:tcPr/>
+          <w:p>
+            <w:pPr>
+              <w:pStyle w:val="Compact"/>
+              <w:jc w:val="left"/>
+            </w:pPr>
+            <w:r>
+              <w:rPr>
+                <w:sz w:val="19"/>
+              </w:rPr>
+              <w:t xml:space="preserve">The target is held where they stand for the scene, or until they break free (Body resists).</w:t>
+            </w:r>
+          </w:p>
+        </w:tc>
+      </w:tr>
+      <w:tr>
+        <w:tc>
+          <w:tcPr/>
+          <w:p>
+            <w:pPr>
+              <w:pStyle w:val="Compact"/>
+              <w:jc w:val="left"/>
+            </w:pPr>
+            <w:r>
+              <w:rPr>
+                <w:b/>
+                <w:sz w:val="19"/>
+              </w:rPr>
+              <w:t xml:space="preserve">Snuff</w:t>
+            </w:r>
+          </w:p>
+        </w:tc>
+        <w:tc>
+          <w:tcPr/>
+          <w:p>
+            <w:pPr>
+              <w:pStyle w:val="Compact"/>
+              <w:jc w:val="left"/>
+            </w:pPr>
+            <w:r>
+              <w:rPr>
+                <w:sz w:val="19"/>
+              </w:rPr>
+              <w:t xml:space="preserve">Every lamp in a room goes out, or one gun jams; clearing a jam takes an action.</w:t>
+            </w:r>
+          </w:p>
+        </w:tc>
+      </w:tr>
+      <w:tr>
+        <w:tc>
+          <w:tcPr/>
+          <w:p>
+            <w:pPr>
+              <w:pStyle w:val="Compact"/>
+              <w:jc w:val="left"/>
+            </w:pPr>
+            <w:r>
+              <w:rPr>
+                <w:b/>
+                <w:sz w:val="19"/>
+              </w:rPr>
+              <w:t xml:space="preserve">Unmask</w:t>
+            </w:r>
+          </w:p>
+        </w:tc>
+        <w:tc>
+          <w:tcPr/>
+          <w:p>
+            <w:pPr>
+              <w:pStyle w:val="Compact"/>
+              <w:jc w:val="left"/>
+            </w:pPr>
+            <w:r>
+              <w:rPr>
+                <w:sz w:val="19"/>
+              </w:rPr>
+              <w:t xml:space="preserve">A Wesen in sight rolls Will or woges, there and then.</w:t>
+            </w:r>
+          </w:p>
+        </w:tc>
+      </w:tr>
+      <w:tr>
+        <w:tc>
+          <w:tcPr/>
+          <w:p>
+            <w:pPr>
+              <w:pStyle w:val="Compact"/>
+              <w:jc w:val="left"/>
+            </w:pPr>
+            <w:r>
+              <w:rPr>
+                <w:b/>
+                <w:sz w:val="19"/>
+              </w:rPr>
+              <w:t xml:space="preserve">Stanch</w:t>
+            </w:r>
+          </w:p>
+        </w:tc>
+        <w:tc>
+          <w:tcPr/>
+          <w:p>
+            <w:pPr>
+              <w:pStyle w:val="Compact"/>
+              <w:jc w:val="left"/>
+            </w:pPr>
+            <w:r>
+              <w:rPr>
+                <w:sz w:val="19"/>
+              </w:rPr>
+              <w:t xml:space="preserve">Stop the bleeding: clear one injury box, once per wound.</w:t>
+            </w:r>
+          </w:p>
+        </w:tc>
+      </w:tr>
+    </w:tbl>
+    <w:p>
+      <w:pPr>
+        <w:pStyle w:val="BodyText"/>
+      </w:pPr>
+      <w:r>
+        <w:t xml:space="preserve">A failed spell flares where people can see it: mark a box of</w:t>
+      </w:r>
+      <w:r>
+        <w:t xml:space="preserve"> </w:t>
+      </w:r>
+      <w:r>
+        <w:rPr>
+          <w:bCs/>
+          <w:b/>
+        </w:rPr>
+        <w:t xml:space="preserve">Exposure</w:t>
+      </w:r>
+      <w:r>
+        <w:t xml:space="preserve">. A natural 18 marks two, or something answers that shouldn’t.</w:t>
+      </w:r>
+    </w:p>
+    <w:p>
+      <w:pPr>
+        <w:pStyle w:val="BodyText"/>
+      </w:pPr>
+      <w:r>
+        <w:rPr>
+          <w:bCs/>
+          <w:b/>
+        </w:rPr>
+        <w:t xml:space="preserve">Hexenbiests and Zauberbiests</w:t>
+      </w:r>
+      <w:r>
+        <w:t xml:space="preserve"> </w:t>
+      </w:r>
+      <w:r>
+        <w:t xml:space="preserve">work rituals the same way, through their innate magic, in their own style (curses, potions and sendings). Their</w:t>
+      </w:r>
+      <w:r>
+        <w:t xml:space="preserve"> </w:t>
+      </w:r>
+      <w:r>
+        <w:rPr>
+          <w:bCs/>
+          <w:b/>
+        </w:rPr>
+        <w:t xml:space="preserve">telekinesis</w:t>
+      </w:r>
+      <w:r>
+        <w:t xml:space="preserve"> </w:t>
+      </w:r>
+      <w:r>
+        <w:t xml:space="preserve">is their quick magic.</w:t>
+      </w:r>
+    </w:p>
+    <w:p>
+      <w:pPr>
+        <w:pStyle w:val="BodyText"/>
+      </w:pPr>
+      <w:r>
+        <w:rPr>
+          <w:bCs/>
+          <w:b/>
+        </w:rPr>
+        <w:t xml:space="preserve">Magic draws attention.</w:t>
+      </w:r>
+      <w:r>
+        <w:t xml:space="preserve"> </w:t>
+      </w:r>
+      <w:r>
+        <w:t xml:space="preserve">Using it openly can mark a box of</w:t>
+      </w:r>
+      <w:r>
+        <w:t xml:space="preserve"> </w:t>
+      </w:r>
+      <w:r>
+        <w:rPr>
+          <w:bCs/>
+          <w:b/>
+        </w:rPr>
+        <w:t xml:space="preserve">Exposure</w:t>
+      </w:r>
+      <w:r>
+        <w:t xml:space="preserve">, the Order of the Holy Knife hunts known Incantare, and a Grimm gets +1 to sense your magic for each charm or potion you carry.</w:t>
+      </w:r>
+    </w:p>
+    <w:bookmarkEnd w:id="55"/>
+    <w:bookmarkEnd w:id="56"/>
+    <w:bookmarkStart w:id="57" w:name="the-code-of-swabia"/>
+    <w:p>
+      <w:pPr>
+        <w:pStyle w:val="Heading2"/>
+      </w:pPr>
+      <w:r>
+        <w:t xml:space="preserve">The Code of Swabia</w:t>
+      </w:r>
+    </w:p>
+    <w:p>
+      <w:pPr>
+        <w:pStyle w:val="FirstParagraph"/>
+      </w:pPr>
+      <w:r>
+        <w:t xml:space="preserve">The Code of Swabia is the old law between Wesen and the rest of the world, and Grimms are its enforcers. At its heart, Wesen must not reveal themselves to humanity. How far it reaches beyond that, and how mercifully a Grimm enforces it, is a question your characters will answer for themselves.</w:t>
+      </w:r>
+    </w:p>
+    <w:bookmarkEnd w:id="57"/>
+    <w:bookmarkEnd w:id="58"/>
+    <w:bookmarkStart w:id="66" w:name="personal-combat"/>
+    <w:p>
+      <w:pPr>
+        <w:pStyle w:val="Heading1"/>
+      </w:pPr>
+      <w:r>
+        <w:t xml:space="preserve">Personal combat</w:t>
+      </w:r>
+    </w:p>
+    <w:bookmarkStart w:id="59" w:name="turn-order-and-actions"/>
+    <w:p>
+      <w:pPr>
+        <w:pStyle w:val="Heading2"/>
+      </w:pPr>
+      <w:r>
+        <w:t xml:space="preserve">Turn order and actions</w:t>
+      </w:r>
+    </w:p>
+    <w:p>
+      <w:pPr>
+        <w:pStyle w:val="FirstParagraph"/>
+      </w:pPr>
+      <w:r>
+        <w:t xml:space="preserve">Act in descending Agility order. Players choose the order of tied characters; the GM resolves other ties. A round lasts a few seconds. On your turn, move a short distance and take one meaningful action, such as shooting, reloading, helping, or attempting a task.</w:t>
+      </w:r>
+    </w:p>
+    <w:bookmarkEnd w:id="59"/>
+    <w:bookmarkStart w:id="60" w:name="attacking-and-defending"/>
+    <w:p>
+      <w:pPr>
+        <w:pStyle w:val="Heading2"/>
+      </w:pPr>
+      <w:r>
+        <w:t xml:space="preserve">Attacking and defending</w:t>
+      </w:r>
+    </w:p>
+    <w:p>
+      <w:pPr>
+        <w:pStyle w:val="FirstParagraph"/>
+      </w:pPr>
+      <w:r>
+        <w:t xml:space="preserve">Roll Shooting for a ranged attack, Melee for a weapon in hand, or Brawling for fists and grappling. If the attack succeeds, an aware target able to move may attempt Dodge. Dodge is Agility −2, with +1 for Trained Athletics or +2 for Athletics as a Specialty or Expert. Each target gets one Dodge attempt per round. A successful Dodge cancels the hit. Apply injury penalties to Dodge.</w:t>
+      </w:r>
+    </w:p>
+    <w:p>
+      <w:pPr>
+        <w:pStyle w:val="BodyText"/>
+      </w:pPr>
+      <w:r>
+        <w:t xml:space="preserve">Solid cover blocks a shot. Partial cover imposes −2 on the attack. Weapon effects apply after a hit survives any Dodge. Success margin does not increase damage.</w:t>
+      </w:r>
+    </w:p>
+    <w:bookmarkEnd w:id="60"/>
+    <w:bookmarkStart w:id="61" w:name="range"/>
+    <w:p>
+      <w:pPr>
+        <w:pStyle w:val="Heading2"/>
+      </w:pPr>
+      <w:r>
+        <w:t xml:space="preserve">Range</w:t>
+      </w:r>
+    </w:p>
+    <w:p>
+      <w:pPr>
+        <w:pStyle w:val="FirstParagraph"/>
+      </w:pPr>
+      <w:r>
+        <w:t xml:space="preserve">Distances fall into five bands:</w:t>
+      </w:r>
+    </w:p>
+    <w:tbl>
+      <w:tblPr>
+        <w:tblStyle w:val="Table"/>
+        <w:tblW w:type="pct" w:w="5000"/>
+        <w:tblLook w:firstRow="1" w:lastRow="0" w:firstColumn="0" w:lastColumn="0" w:noHBand="0" w:noVBand="0" w:val="0020"/>
+        <w:jc w:val="start"/>
+        <w:tblBorders>
+          <w:top w:val="single" w:sz="4" w:color="B8C2D3"/>
+          <w:left w:val="single" w:sz="4" w:color="B8C2D3"/>
+          <w:bottom w:val="single" w:sz="4" w:color="B8C2D3"/>
+          <w:right w:val="single" w:sz="4" w:color="B8C2D3"/>
+          <w:insideH w:val="single" w:sz="4" w:color="B8C2D3"/>
+          <w:insideV w:val="single" w:sz="4" w:color="B8C2D3"/>
+        </w:tblBorders>
+      </w:tblPr>
+      <w:tblGrid>
+        <w:gridCol w:w="2640"/>
+        <w:gridCol w:w="2640"/>
+        <w:gridCol w:w="2640"/>
+      </w:tblGrid>
+      <w:tr>
+        <w:trPr>
+          <w:tblHeader w:val="true"/>
+        </w:trPr>
+        <w:tc>
+          <w:tcPr>
+            <w:shd w:val="clear" w:fill="F1E6D2"/>
+          </w:tcPr>
+          <w:p>
+            <w:pPr>
+              <w:pStyle w:val="Compact"/>
+              <w:jc w:val="left"/>
+            </w:pPr>
+            <w:r>
+              <w:rPr>
+                <w:b/>
+                <w:sz w:val="19"/>
+              </w:rPr>
+              <w:t xml:space="preserve">Band</w:t>
+            </w:r>
+          </w:p>
+        </w:tc>
+        <w:tc>
+          <w:tcPr>
+            <w:shd w:val="clear" w:fill="F1E6D2"/>
+          </w:tcPr>
+          <w:p>
+            <w:pPr>
+              <w:pStyle w:val="Compact"/>
+              <w:jc w:val="left"/>
+            </w:pPr>
+            <w:r>
+              <w:rPr>
+                <w:b/>
+                <w:sz w:val="19"/>
+              </w:rPr>
+              <w:t xml:space="preserve">Distance</w:t>
+            </w:r>
+          </w:p>
+        </w:tc>
+        <w:tc>
+          <w:tcPr>
+            <w:shd w:val="clear" w:fill="F1E6D2"/>
+          </w:tcPr>
+          <w:p>
+            <w:pPr>
+              <w:pStyle w:val="Compact"/>
+              <w:jc w:val="left"/>
+            </w:pPr>
+            <w:r>
+              <w:rPr>
+                <w:b/>
+                <w:sz w:val="19"/>
+              </w:rPr>
+              <w:t xml:space="preserve">For example</w:t>
+            </w:r>
+          </w:p>
+        </w:tc>
+      </w:tr>
+      <w:tr>
+        <w:tc>
+          <w:tcPr/>
+          <w:p>
+            <w:pPr>
+              <w:pStyle w:val="Compact"/>
+              <w:jc w:val="left"/>
+            </w:pPr>
+            <w:r>
+              <w:rPr>
+                <w:b/>
+                <w:sz w:val="19"/>
+              </w:rPr>
+              <w:t xml:space="preserve">Close</w:t>
+            </w:r>
+          </w:p>
+        </w:tc>
+        <w:tc>
+          <w:tcPr/>
+          <w:p>
+            <w:pPr>
+              <w:pStyle w:val="Compact"/>
+              <w:jc w:val="left"/>
+            </w:pPr>
+            <w:r>
+              <w:rPr>
+                <w:sz w:val="19"/>
+              </w:rPr>
+              <w:t xml:space="preserve">Up to 10 yards</w:t>
+            </w:r>
+          </w:p>
+        </w:tc>
+        <w:tc>
+          <w:tcPr/>
+          <w:p>
+            <w:pPr>
+              <w:pStyle w:val="Compact"/>
+              <w:jc w:val="left"/>
+            </w:pPr>
+            <w:r>
+              <w:rPr>
+                <w:sz w:val="19"/>
+              </w:rPr>
+              <w:t xml:space="preserve">Across a room or a saloon; one move covers it</w:t>
+            </w:r>
+          </w:p>
+        </w:tc>
+      </w:tr>
+      <w:tr>
+        <w:tc>
+          <w:tcPr/>
+          <w:p>
+            <w:pPr>
+              <w:pStyle w:val="Compact"/>
+              <w:jc w:val="left"/>
+            </w:pPr>
+            <w:r>
+              <w:rPr>
+                <w:b/>
+                <w:sz w:val="19"/>
+              </w:rPr>
+              <w:t xml:space="preserve">Short</w:t>
+            </w:r>
+          </w:p>
+        </w:tc>
+        <w:tc>
+          <w:tcPr/>
+          <w:p>
+            <w:pPr>
+              <w:pStyle w:val="Compact"/>
+              <w:jc w:val="left"/>
+            </w:pPr>
+            <w:r>
+              <w:rPr>
+                <w:sz w:val="19"/>
+              </w:rPr>
+              <w:t xml:space="preserve">Up to 50 yards</w:t>
+            </w:r>
+          </w:p>
+        </w:tc>
+        <w:tc>
+          <w:tcPr/>
+          <w:p>
+            <w:pPr>
+              <w:pStyle w:val="Compact"/>
+              <w:jc w:val="left"/>
+            </w:pPr>
+            <w:r>
+              <w:rPr>
+                <w:sz w:val="19"/>
+              </w:rPr>
+              <w:t xml:space="preserve">Across a street or a corral</w:t>
+            </w:r>
+          </w:p>
+        </w:tc>
+      </w:tr>
+      <w:tr>
+        <w:tc>
+          <w:tcPr/>
+          <w:p>
+            <w:pPr>
+              <w:pStyle w:val="Compact"/>
+              <w:jc w:val="left"/>
+            </w:pPr>
+            <w:r>
+              <w:rPr>
+                <w:b/>
+                <w:sz w:val="19"/>
+              </w:rPr>
+              <w:t xml:space="preserve">Medium</w:t>
+            </w:r>
+          </w:p>
+        </w:tc>
+        <w:tc>
+          <w:tcPr/>
+          <w:p>
+            <w:pPr>
+              <w:pStyle w:val="Compact"/>
+              <w:jc w:val="left"/>
+            </w:pPr>
+            <w:r>
+              <w:rPr>
+                <w:sz w:val="19"/>
+              </w:rPr>
+              <w:t xml:space="preserve">Up to 150 yards</w:t>
+            </w:r>
+          </w:p>
+        </w:tc>
+        <w:tc>
+          <w:tcPr/>
+          <w:p>
+            <w:pPr>
+              <w:pStyle w:val="Compact"/>
+              <w:jc w:val="left"/>
+            </w:pPr>
+            <w:r>
+              <w:rPr>
+                <w:sz w:val="19"/>
+              </w:rPr>
+              <w:t xml:space="preserve">Down the length of a town</w:t>
+            </w:r>
+          </w:p>
+        </w:tc>
+      </w:tr>
+      <w:tr>
+        <w:tc>
+          <w:tcPr/>
+          <w:p>
+            <w:pPr>
+              <w:pStyle w:val="Compact"/>
+              <w:jc w:val="left"/>
+            </w:pPr>
+            <w:r>
+              <w:rPr>
+                <w:b/>
+                <w:sz w:val="19"/>
+              </w:rPr>
+              <w:t xml:space="preserve">Long</w:t>
+            </w:r>
+          </w:p>
+        </w:tc>
+        <w:tc>
+          <w:tcPr/>
+          <w:p>
+            <w:pPr>
+              <w:pStyle w:val="Compact"/>
+              <w:jc w:val="left"/>
+            </w:pPr>
+            <w:r>
+              <w:rPr>
+                <w:sz w:val="19"/>
+              </w:rPr>
+              <w:t xml:space="preserve">Up to 500 yards</w:t>
+            </w:r>
+          </w:p>
+        </w:tc>
+        <w:tc>
+          <w:tcPr/>
+          <w:p>
+            <w:pPr>
+              <w:pStyle w:val="Compact"/>
+              <w:jc w:val="left"/>
+            </w:pPr>
+            <w:r>
+              <w:rPr>
+                <w:sz w:val="19"/>
+              </w:rPr>
+              <w:t xml:space="preserve">Across a valley or a river crossing</w:t>
+            </w:r>
+          </w:p>
+        </w:tc>
+      </w:tr>
+      <w:tr>
+        <w:tc>
+          <w:tcPr/>
+          <w:p>
+            <w:pPr>
+              <w:pStyle w:val="Compact"/>
+              <w:jc w:val="left"/>
+            </w:pPr>
+            <w:r>
+              <w:rPr>
+                <w:b/>
+                <w:sz w:val="19"/>
+              </w:rPr>
+              <w:t xml:space="preserve">Extreme</w:t>
+            </w:r>
+          </w:p>
+        </w:tc>
+        <w:tc>
+          <w:tcPr/>
+          <w:p>
+            <w:pPr>
+              <w:pStyle w:val="Compact"/>
+              <w:jc w:val="left"/>
+            </w:pPr>
+            <w:r>
+              <w:rPr>
+                <w:sz w:val="19"/>
+              </w:rPr>
+              <w:t xml:space="preserve">Up to a mile, in line of sight</w:t>
+            </w:r>
+          </w:p>
+        </w:tc>
+        <w:tc>
+          <w:tcPr/>
+          <w:p>
+            <w:pPr>
+              <w:pStyle w:val="Compact"/>
+              <w:jc w:val="left"/>
+            </w:pPr>
+            <w:r>
+              <w:rPr>
+                <w:sz w:val="19"/>
+              </w:rPr>
+              <w:t xml:space="preserve">Ridge to ridge</w:t>
+            </w:r>
+          </w:p>
+        </w:tc>
+      </w:tr>
+    </w:tbl>
+    <w:p>
+      <w:pPr>
+        <w:pStyle w:val="BodyText"/>
+      </w:pPr>
+      <w:r>
+        <w:t xml:space="preserve">Every ranged weapon has an</w:t>
+      </w:r>
+      <w:r>
+        <w:t xml:space="preserve"> </w:t>
+      </w:r>
+      <w:r>
+        <w:rPr>
+          <w:bCs/>
+          <w:b/>
+        </w:rPr>
+        <w:t xml:space="preserve">effective band</w:t>
+      </w:r>
+      <w:r>
+        <w:t xml:space="preserve">, shown in the weapons table. Attacks within it take no penalty. One band beyond it is −2, two bands beyond is −4, and anything farther is out of range. Weapons in hand, claws and fists reach only someone next to you. Your move each turn covers the Close band; give up your action to run and you cover Short.</w:t>
+      </w:r>
+    </w:p>
+    <w:bookmarkEnd w:id="61"/>
+    <w:bookmarkStart w:id="63" w:name="injury"/>
+    <w:p>
+      <w:pPr>
+        <w:pStyle w:val="Heading2"/>
+      </w:pPr>
+      <w:r>
+        <w:t xml:space="preserve">Injury</w:t>
+      </w:r>
+    </w:p>
+    <w:tbl>
+      <w:tblPr>
+        <w:tblStyle w:val="Table"/>
+        <w:tblW w:type="auto" w:w="0"/>
+        <w:tblLook w:firstRow="1" w:lastRow="0" w:firstColumn="0" w:lastColumn="0" w:noHBand="0" w:noVBand="0" w:val="0020"/>
+        <w:jc w:val="start"/>
+        <w:tblBorders>
+          <w:top w:val="single" w:sz="4" w:color="B8C2D3"/>
+          <w:left w:val="single" w:sz="4" w:color="B8C2D3"/>
+          <w:bottom w:val="single" w:sz="4" w:color="B8C2D3"/>
+          <w:right w:val="single" w:sz="4" w:color="B8C2D3"/>
+          <w:insideH w:val="single" w:sz="4" w:color="B8C2D3"/>
+          <w:insideV w:val="single" w:sz="4" w:color="B8C2D3"/>
+        </w:tblBorders>
+      </w:tblPr>
+      <w:tblGrid>
+        <w:gridCol w:w="2640"/>
+        <w:gridCol w:w="2640"/>
+        <w:gridCol w:w="2640"/>
+      </w:tblGrid>
+      <w:tr>
+        <w:trPr>
+          <w:tblHeader w:val="true"/>
+        </w:trPr>
+        <w:tc>
+          <w:tcPr>
+            <w:shd w:val="clear" w:fill="F1E6D2"/>
+          </w:tcPr>
+          <w:p>
+            <w:pPr>
+              <w:pStyle w:val="Compact"/>
+              <w:jc w:val="left"/>
+            </w:pPr>
+            <w:r>
+              <w:rPr>
+                <w:b/>
+                <w:sz w:val="19"/>
+              </w:rPr>
+              <w:t xml:space="preserve">Boxes marked</w:t>
+            </w:r>
+          </w:p>
+        </w:tc>
+        <w:tc>
+          <w:tcPr>
+            <w:shd w:val="clear" w:fill="F1E6D2"/>
+          </w:tcPr>
+          <w:p>
+            <w:pPr>
+              <w:pStyle w:val="Compact"/>
+              <w:jc w:val="left"/>
+            </w:pPr>
+            <w:r>
+              <w:rPr>
+                <w:b/>
+                <w:sz w:val="19"/>
+              </w:rPr>
+              <w:t xml:space="preserve">Condition</w:t>
+            </w:r>
+          </w:p>
+        </w:tc>
+        <w:tc>
+          <w:tcPr>
+            <w:shd w:val="clear" w:fill="F1E6D2"/>
+          </w:tcPr>
+          <w:p>
+            <w:pPr>
+              <w:pStyle w:val="Compact"/>
+              <w:jc w:val="left"/>
+            </w:pPr>
+            <w:r>
+              <w:rPr>
+                <w:b/>
+                <w:sz w:val="19"/>
+              </w:rPr>
               <w:t xml:space="preserve">Effect</w:t>
             </w:r>
           </w:p>
@@ -7006,7 +8010,7 @@
         <w:t xml:space="preserve">Injury penalties replace each other rather than stacking. They apply to movement, attacks, Dodge, and other tasks the injury physically hinders.</w:t>
       </w:r>
     </w:p>
-    <w:bookmarkStart w:id="59" w:name="dying-and-death"/>
+    <w:bookmarkStart w:id="62" w:name="dying-and-death"/>
     <w:p>
       <w:pPr>
         <w:pStyle w:val="Heading3"/>
@@ -7118,9 +8122,9 @@
         <w:t xml:space="preserve">Your protection is avoiding the hit: Dodge, cover, and a Grit point, which reduces a hit by one box.</w:t>
       </w:r>
     </w:p>
-    <w:bookmarkEnd w:id="59"/>
-    <w:bookmarkEnd w:id="60"/>
-    <w:bookmarkStart w:id="61" w:name="weapons-and-damage"/>
+    <w:bookmarkEnd w:id="62"/>
+    <w:bookmarkEnd w:id="63"/>
+    <w:bookmarkStart w:id="64" w:name="weapons-and-damage"/>
     <w:p>
       <w:pPr>
         <w:pStyle w:val="Heading2"/>
@@ -8293,8 +9297,8 @@
         <w:t xml:space="preserve">a Blutbad’s claws leave Deputy Ames Seriously wounded (two boxes). A revolver shot that gets through marks two more, but the track stops at three: Ames is Incapacitated and Dying, and a further 2-box hit would kill. Spending a Grit point on that revolver shot reduces it to one box, leaving Ames at three boxes but, because the hit only marked one, not Dying.</w:t>
       </w:r>
     </w:p>
-    <w:bookmarkEnd w:id="61"/>
-    <w:bookmarkStart w:id="62" w:name="guns-and-ammunition"/>
+    <w:bookmarkEnd w:id="64"/>
+    <w:bookmarkStart w:id="65" w:name="guns-and-ammunition"/>
     <w:p>
       <w:pPr>
         <w:pStyle w:val="Heading2"/>
@@ -8880,9 +9884,9 @@
         <w:t xml:space="preserve">To take someone down without killing them, use fists, a club, a grapple, or knock-out drops from an Apothecary.</w:t>
       </w:r>
     </w:p>
-    <w:bookmarkEnd w:id="62"/>
-    <w:bookmarkEnd w:id="63"/>
-    <w:bookmarkStart w:id="69" w:name="medical-care"/>
+    <w:bookmarkEnd w:id="65"/>
+    <w:bookmarkEnd w:id="66"/>
+    <w:bookmarkStart w:id="72" w:name="medical-care"/>
     <w:p>
       <w:pPr>
         <w:pStyle w:val="Heading1"/>
@@ -8899,7 +9903,7 @@
         <w:t xml:space="preserve">Frontier medicine in 1889 has chloroform, carbolic acid, laudanum and steady hands, and not much else. Wesen heal like humans, and some injuries need remedies from older traditions.</w:t>
       </w:r>
     </w:p>
-    <w:bookmarkStart w:id="64" w:name="diagnosis-and-stabilization"/>
+    <w:bookmarkStart w:id="67" w:name="diagnosis-and-stabilization"/>
     <w:p>
       <w:pPr>
         <w:pStyle w:val="Heading2"/>
@@ -8916,8 +9920,8 @@
         <w:t xml:space="preserve">Roll Medicine when the diagnosis is uncertain or an urgent treatment decision matters. Emergency stabilization takes one action and a successful Medicine roll with a doctor’s bag. It ends Dying and stops deterioration, but removes no boxes.</w:t>
       </w:r>
     </w:p>
-    <w:bookmarkEnd w:id="64"/>
-    <w:bookmarkStart w:id="65" w:name="field-treatment"/>
+    <w:bookmarkEnd w:id="67"/>
+    <w:bookmarkStart w:id="68" w:name="field-treatment"/>
     <w:p>
       <w:pPr>
         <w:pStyle w:val="Heading2"/>
@@ -8934,8 +9938,8 @@
         <w:t xml:space="preserve">With a doctor’s bag and several uninterrupted minutes, successful Medicine removes one injury box; success by 5 or more removes two. Each injury receives one field-treatment attempt; further attempts need changed circumstances.</w:t>
       </w:r>
     </w:p>
-    <w:bookmarkEnd w:id="65"/>
-    <w:bookmarkStart w:id="66" w:name="a-doctors-surgery"/>
+    <w:bookmarkEnd w:id="68"/>
+    <w:bookmarkStart w:id="69" w:name="a-doctors-surgery"/>
     <w:p>
       <w:pPr>
         <w:pStyle w:val="Heading2"/>
@@ -8952,8 +9956,8 @@
         <w:t xml:space="preserve">A proper surgery with instruments, chloroform and a clean table grants +2 to Medicine. A successful treatment removes two boxes; success by 5 or more removes three. Allow the time the operation requires.</w:t>
       </w:r>
     </w:p>
-    <w:bookmarkEnd w:id="66"/>
-    <w:bookmarkStart w:id="67" w:name="remedies-and-poisons"/>
+    <w:bookmarkEnd w:id="69"/>
+    <w:bookmarkStart w:id="70" w:name="remedies-and-poisons"/>
     <w:p>
       <w:pPr>
         <w:pStyle w:val="Heading2"/>
@@ -8970,8 +9974,8 @@
         <w:t xml:space="preserve">Apothecary treats what Medicine can’t: Wesen poisons, curses, magical sickness and Wesen-specific ailments. Finding the right remedy usually means first identifying the cause (Wesen Lore or Occult), then brewing it (Apothecary, with an apothecary kit). A remedy can substitute for field treatment against such harm.</w:t>
       </w:r>
     </w:p>
-    <w:bookmarkEnd w:id="67"/>
-    <w:bookmarkStart w:id="68" w:name="natural-recovery"/>
+    <w:bookmarkEnd w:id="70"/>
+    <w:bookmarkStart w:id="71" w:name="natural-recovery"/>
     <w:p>
       <w:pPr>
         <w:pStyle w:val="Heading2"/>
@@ -9004,9 +10008,9 @@
         <w:t xml:space="preserve">clear one injury box. Rest means no riding, no fighting, nothing strenuous. At three boxes, rest alone clears nothing: treatment must clear the first box.</w:t>
       </w:r>
     </w:p>
-    <w:bookmarkEnd w:id="68"/>
-    <w:bookmarkEnd w:id="69"/>
-    <w:bookmarkStart w:id="73" w:name="grit-points-and-trouble"/>
+    <w:bookmarkEnd w:id="71"/>
+    <w:bookmarkEnd w:id="72"/>
+    <w:bookmarkStart w:id="77" w:name="grit-points-and-trouble"/>
     <w:p>
       <w:pPr>
         <w:pStyle w:val="Heading1"/>
@@ -9015,7 +10019,7 @@
         <w:t xml:space="preserve">Grit points and Trouble</w:t>
       </w:r>
     </w:p>
-    <w:bookmarkStart w:id="70" w:name="using-grit-points"/>
+    <w:bookmarkStart w:id="73" w:name="using-grit-points"/>
     <w:p>
       <w:pPr>
         <w:pStyle w:val="Heading2"/>
@@ -9200,8 +10204,8 @@
         <w:t xml:space="preserve">Gain one point when one of your complications creates a meaningful problem you accept, including a companion complication from a heritage advantage. You can decline the proposed complication without penalty.</w:t>
       </w:r>
     </w:p>
-    <w:bookmarkEnd w:id="70"/>
-    <w:bookmarkStart w:id="71" w:name="trouble"/>
+    <w:bookmarkEnd w:id="73"/>
+    <w:bookmarkStart w:id="74" w:name="trouble"/>
     <w:p>
       <w:pPr>
         <w:pStyle w:val="Heading2"/>
@@ -9502,8 +10506,8 @@
         <w:t xml:space="preserve">Lying low between cases, a good cover story (Deception), or doing the town a public good can clear a box per case.</w:t>
       </w:r>
     </w:p>
-    <w:bookmarkEnd w:id="71"/>
-    <w:bookmarkStart w:id="72" w:name="advancement"/>
+    <w:bookmarkEnd w:id="74"/>
+    <w:bookmarkStart w:id="76" w:name="advancement"/>
     <w:p>
       <w:pPr>
         <w:pStyle w:val="Heading2"/>
@@ -9520,9 +10524,408 @@
         <w:t xml:space="preserve">After a significant case, the GM may authorize one relevant skill to advance from Untrained to Trained or from Trained to Specialty, or allow revision of an advantage or complication. Only an Old hand’s starting skill is Expert; a skill raised later tops out at Specialty (+3) unless they broaden (see Step 3).</w:t>
       </w:r>
     </w:p>
-    <w:bookmarkEnd w:id="72"/>
-    <w:bookmarkEnd w:id="73"/>
-    <w:bookmarkStart w:id="76" w:name="running-cases"/>
+    <w:bookmarkStart w:id="75" w:name="magic-advancement"/>
+    <w:p>
+      <w:pPr>
+        <w:pStyle w:val="Heading3"/>
+      </w:pPr>
+      <w:r>
+        <w:t xml:space="preserve">Magic advancement</w:t>
+      </w:r>
+    </w:p>
+    <w:p>
+      <w:pPr>
+        <w:pStyle w:val="FirstParagraph"/>
+      </w:pPr>
+      <w:r>
+        <w:t xml:space="preserve">After a significant case, an Incantare, Hexenbiest or Zauberbiest can take one of these</w:t>
+      </w:r>
+      <w:r>
+        <w:t xml:space="preserve"> </w:t>
+      </w:r>
+      <w:r>
+        <w:rPr>
+          <w:bCs/>
+          <w:b/>
+        </w:rPr>
+        <w:t xml:space="preserve">instead of a skill step</w:t>
+      </w:r>
+      <w:r>
+        <w:t xml:space="preserve">, with the GM’s approval and a reason from the story.</w:t>
+      </w:r>
+    </w:p>
+    <w:tbl>
+      <w:tblPr>
+        <w:tblStyle w:val="Table"/>
+        <w:tblW w:type="pct" w:w="5000"/>
+        <w:tblLook w:firstRow="1" w:lastRow="0" w:firstColumn="0" w:lastColumn="0" w:noHBand="0" w:noVBand="0" w:val="0020"/>
+        <w:jc w:val="start"/>
+        <w:tblBorders>
+          <w:top w:val="single" w:sz="4" w:color="B8C2D3"/>
+          <w:left w:val="single" w:sz="4" w:color="B8C2D3"/>
+          <w:bottom w:val="single" w:sz="4" w:color="B8C2D3"/>
+          <w:right w:val="single" w:sz="4" w:color="B8C2D3"/>
+          <w:insideH w:val="single" w:sz="4" w:color="B8C2D3"/>
+          <w:insideV w:val="single" w:sz="4" w:color="B8C2D3"/>
+        </w:tblBorders>
+      </w:tblPr>
+      <w:tblGrid>
+        <w:gridCol w:w="2640"/>
+        <w:gridCol w:w="2640"/>
+        <w:gridCol w:w="2640"/>
+      </w:tblGrid>
+      <w:tr>
+        <w:trPr>
+          <w:tblHeader w:val="true"/>
+        </w:trPr>
+        <w:tc>
+          <w:tcPr>
+            <w:shd w:val="clear" w:fill="F1E6D2"/>
+          </w:tcPr>
+          <w:p>
+            <w:pPr>
+              <w:pStyle w:val="Compact"/>
+              <w:jc w:val="left"/>
+            </w:pPr>
+            <w:r>
+              <w:rPr>
+                <w:b/>
+                <w:sz w:val="19"/>
+              </w:rPr>
+              <w:t xml:space="preserve">Option</w:t>
+            </w:r>
+          </w:p>
+        </w:tc>
+        <w:tc>
+          <w:tcPr>
+            <w:shd w:val="clear" w:fill="F1E6D2"/>
+          </w:tcPr>
+          <w:p>
+            <w:pPr>
+              <w:pStyle w:val="Compact"/>
+              <w:jc w:val="left"/>
+            </w:pPr>
+            <w:r>
+              <w:rPr>
+                <w:b/>
+                <w:sz w:val="19"/>
+              </w:rPr>
+              <w:t xml:space="preserve">Effect</w:t>
+            </w:r>
+          </w:p>
+        </w:tc>
+        <w:tc>
+          <w:tcPr>
+            <w:shd w:val="clear" w:fill="F1E6D2"/>
+          </w:tcPr>
+          <w:p>
+            <w:pPr>
+              <w:pStyle w:val="Compact"/>
+              <w:jc w:val="left"/>
+            </w:pPr>
+            <w:r>
+              <w:rPr>
+                <w:b/>
+                <w:sz w:val="19"/>
+              </w:rPr>
+              <w:t xml:space="preserve">Limit</w:t>
+            </w:r>
+          </w:p>
+        </w:tc>
+      </w:tr>
+      <w:tr>
+        <w:tc>
+          <w:tcPr/>
+          <w:p>
+            <w:pPr>
+              <w:pStyle w:val="Compact"/>
+              <w:jc w:val="left"/>
+            </w:pPr>
+            <w:r>
+              <w:rPr>
+                <w:b/>
+                <w:sz w:val="19"/>
+              </w:rPr>
+              <w:t xml:space="preserve">New spell</w:t>
+            </w:r>
+          </w:p>
+        </w:tc>
+        <w:tc>
+          <w:tcPr/>
+          <w:p>
+            <w:pPr>
+              <w:pStyle w:val="Compact"/>
+              <w:jc w:val="left"/>
+            </w:pPr>
+            <w:r>
+              <w:rPr>
+                <w:sz w:val="19"/>
+              </w:rPr>
+              <w:t xml:space="preserve">A Veneficare learns one spell beyond their limit</w:t>
+            </w:r>
+          </w:p>
+        </w:tc>
+        <w:tc>
+          <w:tcPr/>
+          <w:p>
+            <w:pPr>
+              <w:pStyle w:val="Compact"/>
+              <w:jc w:val="left"/>
+            </w:pPr>
+            <w:r>
+              <w:rPr>
+                <w:sz w:val="19"/>
+              </w:rPr>
+              <w:t xml:space="preserve">Up to 2 extra</w:t>
+            </w:r>
+          </w:p>
+        </w:tc>
+      </w:tr>
+      <w:tr>
+        <w:tc>
+          <w:tcPr/>
+          <w:p>
+            <w:pPr>
+              <w:pStyle w:val="Compact"/>
+              <w:jc w:val="left"/>
+            </w:pPr>
+            <w:r>
+              <w:rPr>
+                <w:b/>
+                <w:sz w:val="19"/>
+              </w:rPr>
+              <w:t xml:space="preserve">Deeper spell</w:t>
+            </w:r>
+          </w:p>
+        </w:tc>
+        <w:tc>
+          <w:tcPr/>
+          <w:p>
+            <w:pPr>
+              <w:pStyle w:val="Compact"/>
+              <w:jc w:val="left"/>
+            </w:pPr>
+            <w:r>
+              <w:rPr>
+                <w:sz w:val="19"/>
+              </w:rPr>
+              <w:t xml:space="preserve">One spell you know gets one more Boost</w:t>
+            </w:r>
+          </w:p>
+        </w:tc>
+        <w:tc>
+          <w:tcPr/>
+          <w:p>
+            <w:pPr>
+              <w:pStyle w:val="Compact"/>
+              <w:jc w:val="left"/>
+            </w:pPr>
+            <w:r>
+              <w:rPr>
+                <w:sz w:val="19"/>
+              </w:rPr>
+              <w:t xml:space="preserve">Each spell once</w:t>
+            </w:r>
+          </w:p>
+        </w:tc>
+      </w:tr>
+      <w:tr>
+        <w:tc>
+          <w:tcPr/>
+          <w:p>
+            <w:pPr>
+              <w:pStyle w:val="Compact"/>
+              <w:jc w:val="left"/>
+            </w:pPr>
+            <w:r>
+              <w:rPr>
+                <w:b/>
+                <w:sz w:val="19"/>
+              </w:rPr>
+              <w:t xml:space="preserve">Another charm</w:t>
+            </w:r>
+          </w:p>
+        </w:tc>
+        <w:tc>
+          <w:tcPr/>
+          <w:p>
+            <w:pPr>
+              <w:pStyle w:val="Compact"/>
+              <w:jc w:val="left"/>
+            </w:pPr>
+            <w:r>
+              <w:rPr>
+                <w:sz w:val="19"/>
+              </w:rPr>
+              <w:t xml:space="preserve">Carry one more ready charm</w:t>
+            </w:r>
+          </w:p>
+        </w:tc>
+        <w:tc>
+          <w:tcPr/>
+          <w:p>
+            <w:pPr>
+              <w:pStyle w:val="Compact"/>
+              <w:jc w:val="left"/>
+            </w:pPr>
+            <w:r>
+              <w:rPr>
+                <w:sz w:val="19"/>
+              </w:rPr>
+              <w:t xml:space="preserve">Up to 2 extra</w:t>
+            </w:r>
+          </w:p>
+        </w:tc>
+      </w:tr>
+      <w:tr>
+        <w:tc>
+          <w:tcPr/>
+          <w:p>
+            <w:pPr>
+              <w:pStyle w:val="Compact"/>
+              <w:jc w:val="left"/>
+            </w:pPr>
+            <w:r>
+              <w:rPr>
+                <w:b/>
+                <w:sz w:val="19"/>
+              </w:rPr>
+              <w:t xml:space="preserve">By heart</w:t>
+            </w:r>
+          </w:p>
+        </w:tc>
+        <w:tc>
+          <w:tcPr/>
+          <w:p>
+            <w:pPr>
+              <w:pStyle w:val="Compact"/>
+              <w:jc w:val="left"/>
+            </w:pPr>
+            <w:r>
+              <w:rPr>
+                <w:sz w:val="19"/>
+              </w:rPr>
+              <w:t xml:space="preserve">One kind of ritual takes one fewer segment (minimum 1)</w:t>
+            </w:r>
+          </w:p>
+        </w:tc>
+        <w:tc>
+          <w:tcPr/>
+          <w:p>
+            <w:pPr>
+              <w:pStyle w:val="Compact"/>
+              <w:jc w:val="left"/>
+            </w:pPr>
+            <w:r>
+              <w:rPr>
+                <w:sz w:val="19"/>
+              </w:rPr>
+              <w:t xml:space="preserve">Each kind once</w:t>
+            </w:r>
+          </w:p>
+        </w:tc>
+      </w:tr>
+      <w:tr>
+        <w:tc>
+          <w:tcPr/>
+          <w:p>
+            <w:pPr>
+              <w:pStyle w:val="Compact"/>
+              <w:jc w:val="left"/>
+            </w:pPr>
+            <w:r>
+              <w:rPr>
+                <w:b/>
+                <w:sz w:val="19"/>
+              </w:rPr>
+              <w:t xml:space="preserve">Quicker hand</w:t>
+            </w:r>
+          </w:p>
+        </w:tc>
+        <w:tc>
+          <w:tcPr/>
+          <w:p>
+            <w:pPr>
+              <w:pStyle w:val="Compact"/>
+              <w:jc w:val="left"/>
+            </w:pPr>
+            <w:r>
+              <w:rPr>
+                <w:sz w:val="19"/>
+              </w:rPr>
+              <w:t xml:space="preserve">One ritual you know goes one pace faster: an hour becomes ten minutes, ten minutes one action</w:t>
+            </w:r>
+          </w:p>
+        </w:tc>
+        <w:tc>
+          <w:tcPr/>
+          <w:p>
+            <w:pPr>
+              <w:pStyle w:val="Compact"/>
+              <w:jc w:val="left"/>
+            </w:pPr>
+            <w:r>
+              <w:rPr>
+                <w:sz w:val="19"/>
+              </w:rPr>
+              <w:t xml:space="preserve">Each ritual once</w:t>
+            </w:r>
+          </w:p>
+        </w:tc>
+      </w:tr>
+      <w:tr>
+        <w:tc>
+          <w:tcPr/>
+          <w:p>
+            <w:pPr>
+              <w:pStyle w:val="Compact"/>
+              <w:jc w:val="left"/>
+            </w:pPr>
+            <w:r>
+              <w:rPr>
+                <w:b/>
+                <w:sz w:val="19"/>
+              </w:rPr>
+              <w:t xml:space="preserve">Master of the Lens</w:t>
+            </w:r>
+          </w:p>
+        </w:tc>
+        <w:tc>
+          <w:tcPr/>
+          <w:p>
+            <w:pPr>
+              <w:pStyle w:val="Compact"/>
+              <w:jc w:val="left"/>
+            </w:pPr>
+            <w:r>
+              <w:rPr>
+                <w:sz w:val="19"/>
+              </w:rPr>
+              <w:t xml:space="preserve">Occult becomes Expert (+5)</w:t>
+            </w:r>
+          </w:p>
+        </w:tc>
+        <w:tc>
+          <w:tcPr/>
+          <w:p>
+            <w:pPr>
+              <w:pStyle w:val="Compact"/>
+              <w:jc w:val="left"/>
+            </w:pPr>
+            <w:r>
+              <w:rPr>
+                <w:sz w:val="19"/>
+              </w:rPr>
+              <w:t xml:space="preserve">Once, at the end of a long campaign</w:t>
+            </w:r>
+          </w:p>
+        </w:tc>
+      </w:tr>
+    </w:tbl>
+    <w:bookmarkEnd w:id="75"/>
+    <w:bookmarkEnd w:id="76"/>
+    <w:bookmarkEnd w:id="77"/>
+    <w:bookmarkStart w:id="80" w:name="running-cases"/>
     <w:p>
       <w:pPr>
         <w:pStyle w:val="Heading1"/>
@@ -9531,7 +10934,7 @@
         <w:t xml:space="preserve">Running cases</w:t>
       </w:r>
     </w:p>
-    <w:bookmarkStart w:id="74" w:name="case-seeds"/>
+    <w:bookmarkStart w:id="78" w:name="case-seeds"/>
     <w:p>
       <w:pPr>
         <w:pStyle w:val="Heading2"/>
@@ -11847,8 +13250,8 @@
         </w:tc>
       </w:tr>
     </w:tbl>
-    <w:bookmarkEnd w:id="74"/>
-    <w:bookmarkStart w:id="75" w:name="the-case-journal"/>
+    <w:bookmarkEnd w:id="78"/>
+    <w:bookmarkStart w:id="79" w:name="the-case-journal"/>
     <w:p>
       <w:pPr>
         <w:pStyle w:val="Heading2"/>
@@ -11975,9 +13378,9 @@
         <w:t xml:space="preserve">After a significant case, the GM may authorize one skill step for each character.</w:t>
       </w:r>
     </w:p>
-    <w:bookmarkEnd w:id="75"/>
-    <w:bookmarkEnd w:id="76"/>
-    <w:bookmarkStart w:id="83" w:name="ready-made-characters"/>
+    <w:bookmarkEnd w:id="79"/>
+    <w:bookmarkEnd w:id="80"/>
+    <w:bookmarkStart w:id="87" w:name="ready-made-characters"/>
     <w:p>
       <w:pPr>
         <w:pStyle w:val="Heading1"/>
@@ -11994,7 +13397,7 @@
         <w:t xml:space="preserve">Six characters ready to play. Each follows the creation rules exactly, Edges included, and their connections tie them together.</w:t>
       </w:r>
     </w:p>
-    <w:bookmarkStart w:id="77" w:name="eliza-kessler"/>
+    <w:bookmarkStart w:id="81" w:name="eliza-kessler"/>
     <w:p>
       <w:pPr>
         <w:pStyle w:val="Heading2"/>
@@ -12173,8 +13576,8 @@
         <w:t xml:space="preserve">Gus Brandt cut her down from a lynch mob’s rope before anyone knew what she was.</w:t>
       </w:r>
     </w:p>
-    <w:bookmarkEnd w:id="77"/>
-    <w:bookmarkStart w:id="78" w:name="gus-brandt"/>
+    <w:bookmarkEnd w:id="81"/>
+    <w:bookmarkStart w:id="82" w:name="gus-brandt"/>
     <w:p>
       <w:pPr>
         <w:pStyle w:val="Heading2"/>
@@ -12369,8 +13772,8 @@
         <w:t xml:space="preserve">Owes Roz Vey for the remedies that keep the urge quiet.</w:t>
       </w:r>
     </w:p>
-    <w:bookmarkEnd w:id="78"/>
-    <w:bookmarkStart w:id="79" w:name="roz-vey"/>
+    <w:bookmarkEnd w:id="82"/>
+    <w:bookmarkStart w:id="83" w:name="roz-vey"/>
     <w:p>
       <w:pPr>
         <w:pStyle w:val="Heading2"/>
@@ -12549,8 +13952,8 @@
         <w:t xml:space="preserve">Trades notes with Dr. Whitlock, who still won’t admit some of her remedies work better than his.</w:t>
       </w:r>
     </w:p>
-    <w:bookmarkEnd w:id="79"/>
-    <w:bookmarkStart w:id="80" w:name="dr.-thaddeus-whitlock"/>
+    <w:bookmarkEnd w:id="83"/>
+    <w:bookmarkStart w:id="84" w:name="dr.-thaddeus-whitlock"/>
     <w:p>
       <w:pPr>
         <w:pStyle w:val="Heading2"/>
@@ -12729,8 +14132,8 @@
         <w:t xml:space="preserve">Rode with Silas Thorne’s regiment in the war and has never trusted him since.</w:t>
       </w:r>
     </w:p>
-    <w:bookmarkEnd w:id="80"/>
-    <w:bookmarkStart w:id="81" w:name="cora-ridgeway"/>
+    <w:bookmarkEnd w:id="84"/>
+    <w:bookmarkStart w:id="85" w:name="cora-ridgeway"/>
     <w:p>
       <w:pPr>
         <w:pStyle w:val="Heading2"/>
@@ -12925,8 +14328,8 @@
         <w:t xml:space="preserve">Eliza Kessler taught her what she knows about the hidden world.</w:t>
       </w:r>
     </w:p>
-    <w:bookmarkEnd w:id="81"/>
-    <w:bookmarkStart w:id="82" w:name="silas-thorne"/>
+    <w:bookmarkEnd w:id="85"/>
+    <w:bookmarkStart w:id="86" w:name="silas-thorne"/>
     <w:p>
       <w:pPr>
         <w:pStyle w:val="Heading2"/>
@@ -13105,9 +14508,9 @@
         <w:t xml:space="preserve">Plays cards with Cora every Saturday; she’s the only one who can tell when he’s bluffing.</w:t>
       </w:r>
     </w:p>
-    <w:bookmarkEnd w:id="82"/>
-    <w:bookmarkEnd w:id="83"/>
-    <w:bookmarkStart w:id="84" w:name="threats"/>
+    <w:bookmarkEnd w:id="86"/>
+    <w:bookmarkEnd w:id="87"/>
+    <w:bookmarkStart w:id="88" w:name="threats"/>
     <w:p>
       <w:pPr>
         <w:pStyle w:val="Heading1"/>
@@ -14378,8 +15781,8 @@
         <w:t xml:space="preserve">For a tougher version, add +1 to its targets and one box; for a weaker one, subtract.</w:t>
       </w:r>
     </w:p>
-    <w:bookmarkEnd w:id="84"/>
-    <w:bookmarkStart w:id="85" w:name="advantages"/>
+    <w:bookmarkEnd w:id="88"/>
+    <w:bookmarkStart w:id="89" w:name="advantages"/>
     <w:p>
       <w:pPr>
         <w:pStyle w:val="Heading1"/>
@@ -15135,8 +16538,8 @@
         <w:t xml:space="preserve">A badge is legal authority, not a magic word: Wesen, outlaws and the powers of the hidden world don’t care about it, and it carries a duty. Your superiors can give you orders, and abusing the badge or failing in your duty can cost you it. Law callings (Marshal, Deputy) usually take one, as their advantage or as a second advantage Edge. A Pinkerton detective takes Pinkerton Credentials instead: the agency’s reach and files, but no badge.</w:t>
       </w:r>
     </w:p>
-    <w:bookmarkEnd w:id="85"/>
-    <w:bookmarkStart w:id="107" w:name="heritages"/>
+    <w:bookmarkEnd w:id="89"/>
+    <w:bookmarkStart w:id="111" w:name="heritages"/>
     <w:p>
       <w:pPr>
         <w:pStyle w:val="Heading1"/>
@@ -16541,7 +17944,7 @@
         </w:tc>
       </w:tr>
     </w:tbl>
-    <w:bookmarkStart w:id="86" w:name="core-wesen-rules"/>
+    <w:bookmarkStart w:id="90" w:name="core-wesen-rules"/>
     <w:p>
       <w:pPr>
         <w:pStyle w:val="Heading2"/>
@@ -16853,8 +18256,8 @@
         <w:t xml:space="preserve">means each hit that marks 2 or more boxes marks one fewer, never below 1.</w:t>
       </w:r>
     </w:p>
-    <w:bookmarkEnd w:id="86"/>
-    <w:bookmarkStart w:id="87" w:name="human"/>
+    <w:bookmarkEnd w:id="90"/>
+    <w:bookmarkStart w:id="91" w:name="human"/>
     <w:p>
       <w:pPr>
         <w:pStyle w:val="Heading2"/>
@@ -17099,8 +18502,8 @@
         <w:t xml:space="preserve">Source: No template</w:t>
       </w:r>
     </w:p>
-    <w:bookmarkEnd w:id="87"/>
-    <w:bookmarkStart w:id="88" w:name="bauerschwein"/>
+    <w:bookmarkEnd w:id="91"/>
+    <w:bookmarkStart w:id="92" w:name="bauerschwein"/>
     <w:p>
       <w:pPr>
         <w:pStyle w:val="Heading2"/>
@@ -17405,8 +18808,8 @@
         <w:t xml:space="preserve">Source: No template; adapted from the show.</w:t>
       </w:r>
     </w:p>
-    <w:bookmarkEnd w:id="88"/>
-    <w:bookmarkStart w:id="89" w:name="coyotl"/>
+    <w:bookmarkEnd w:id="92"/>
+    <w:bookmarkStart w:id="93" w:name="coyotl"/>
     <w:p>
       <w:pPr>
         <w:pStyle w:val="Heading2"/>
@@ -17687,8 +19090,8 @@
         <w:t xml:space="preserve">Source: Coyotl template: DX +2, HT +1, ST +2. About 141 points.</w:t>
       </w:r>
     </w:p>
-    <w:bookmarkEnd w:id="89"/>
-    <w:bookmarkStart w:id="90" w:name="eisbiber"/>
+    <w:bookmarkEnd w:id="93"/>
+    <w:bookmarkStart w:id="94" w:name="eisbiber"/>
     <w:p>
       <w:pPr>
         <w:pStyle w:val="Heading2"/>
@@ -17969,8 +19372,8 @@
         <w:t xml:space="preserve">Source: No template; adapted from the show.</w:t>
       </w:r>
     </w:p>
-    <w:bookmarkEnd w:id="90"/>
-    <w:bookmarkStart w:id="91" w:name="fuchsbau"/>
+    <w:bookmarkEnd w:id="94"/>
+    <w:bookmarkStart w:id="95" w:name="fuchsbau"/>
     <w:p>
       <w:pPr>
         <w:pStyle w:val="Heading2"/>
@@ -18313,8 +19716,8 @@
         <w:t xml:space="preserve">Source: Fuchsbau template: IQ +2; Bad Reputation (disreputable among Wesen). About 132 points.</w:t>
       </w:r>
     </w:p>
-    <w:bookmarkEnd w:id="91"/>
-    <w:bookmarkStart w:id="92" w:name="mauzhertz"/>
+    <w:bookmarkEnd w:id="95"/>
+    <w:bookmarkStart w:id="96" w:name="mauzhertz"/>
     <w:p>
       <w:pPr>
         <w:pStyle w:val="Heading2"/>
@@ -18595,8 +19998,8 @@
         <w:t xml:space="preserve">Source: No template; adapted from the show.</w:t>
       </w:r>
     </w:p>
-    <w:bookmarkEnd w:id="92"/>
-    <w:bookmarkStart w:id="93" w:name="steinadler"/>
+    <w:bookmarkEnd w:id="96"/>
+    <w:bookmarkStart w:id="97" w:name="steinadler"/>
     <w:p>
       <w:pPr>
         <w:pStyle w:val="Heading2"/>
@@ -18877,8 +20280,8 @@
         <w:t xml:space="preserve">Source: No template; adapted from the show.</w:t>
       </w:r>
     </w:p>
-    <w:bookmarkEnd w:id="93"/>
-    <w:bookmarkStart w:id="94" w:name="taniwha"/>
+    <w:bookmarkEnd w:id="97"/>
+    <w:bookmarkStart w:id="98" w:name="taniwha"/>
     <w:p>
       <w:pPr>
         <w:pStyle w:val="Heading2"/>
@@ -19211,8 +20614,8 @@
         <w:t xml:space="preserve">Source: Taniwha template (150-point): poison resistance; Dependency (human flesh, seasonal). About 157 points.</w:t>
       </w:r>
     </w:p>
-    <w:bookmarkEnd w:id="94"/>
-    <w:bookmarkStart w:id="95" w:name="ziegevolk"/>
+    <w:bookmarkEnd w:id="98"/>
+    <w:bookmarkStart w:id="99" w:name="ziegevolk"/>
     <w:p>
       <w:pPr>
         <w:pStyle w:val="Heading2"/>
@@ -19493,8 +20896,8 @@
         <w:t xml:space="preserve">Source: No template; adapted from the show.</w:t>
       </w:r>
     </w:p>
-    <w:bookmarkEnd w:id="95"/>
-    <w:bookmarkStart w:id="96" w:name="blutbad"/>
+    <w:bookmarkEnd w:id="99"/>
+    <w:bookmarkStart w:id="100" w:name="blutbad"/>
     <w:p>
       <w:pPr>
         <w:pStyle w:val="Heading2"/>
@@ -19861,8 +21264,8 @@
         <w:t xml:space="preserve">Source: Blutbaad template: DX +3, HT +2, ST +2; Loner; Enemy (Bauerschwein). About 208 points.</w:t>
       </w:r>
     </w:p>
-    <w:bookmarkEnd w:id="96"/>
-    <w:bookmarkStart w:id="97" w:name="grimm"/>
+    <w:bookmarkEnd w:id="100"/>
+    <w:bookmarkStart w:id="101" w:name="grimm"/>
     <w:p>
       <w:pPr>
         <w:pStyle w:val="Heading2"/>
@@ -20779,8 +22182,8 @@
         <w:t xml:space="preserve">Source: Decapitare template: ST, DX, HT +1; Combat Reflexes; Detect (Wesen, Magic); Magic Resistance 7; Talent (Grimm); Reputation (Frightening Decapitare).</w:t>
       </w:r>
     </w:p>
-    <w:bookmarkEnd w:id="97"/>
-    <w:bookmarkStart w:id="98" w:name="incantare"/>
+    <w:bookmarkEnd w:id="101"/>
+    <w:bookmarkStart w:id="102" w:name="incantare"/>
     <w:p>
       <w:pPr>
         <w:pStyle w:val="Heading2"/>
@@ -21354,7 +22757,7 @@
               <w:rPr>
                 <w:sz w:val="19"/>
               </w:rPr>
-              <w:t xml:space="preserve">Quick casting along one or two Paths agreed with the GM (fire and force, say): one roll per action, and each success fills two segments. You can carry only one charm.</w:t>
+              <w:t xml:space="preserve">Casts spells: quick magic in one action and an Occult roll, shaped by one or two Paths agreed with the GM (fire and force, say). Known: Trained 2, Specialty 3, Expert 4. You can carry only one charm.</w:t>
             </w:r>
           </w:p>
         </w:tc>
@@ -21401,8 +22804,8 @@
         <w:t xml:space="preserve">Source: Incantare template: seven Lenses (Ritual Path Magic).</w:t>
       </w:r>
     </w:p>
-    <w:bookmarkEnd w:id="98"/>
-    <w:bookmarkStart w:id="99" w:name="jägerbär"/>
+    <w:bookmarkEnd w:id="102"/>
+    <w:bookmarkStart w:id="103" w:name="jägerbär"/>
     <w:p>
       <w:pPr>
         <w:pStyle w:val="Heading2"/>
@@ -21683,8 +23086,8 @@
         <w:t xml:space="preserve">Source: No template; adapted from the show.</w:t>
       </w:r>
     </w:p>
-    <w:bookmarkEnd w:id="99"/>
-    <w:bookmarkStart w:id="100" w:name="mauvais-dentes"/>
+    <w:bookmarkEnd w:id="103"/>
+    <w:bookmarkStart w:id="104" w:name="mauvais-dentes"/>
     <w:p>
       <w:pPr>
         <w:pStyle w:val="Heading2"/>
@@ -21989,8 +23392,8 @@
         <w:t xml:space="preserve">Source: Mauvais Dentes template: DX +2, HT +3, ST +3; Loner. About 213 points.</w:t>
       </w:r>
     </w:p>
-    <w:bookmarkEnd w:id="100"/>
-    <w:bookmarkStart w:id="101" w:name="naschazer"/>
+    <w:bookmarkEnd w:id="104"/>
+    <w:bookmarkStart w:id="105" w:name="naschazer"/>
     <w:p>
       <w:pPr>
         <w:pStyle w:val="Heading2"/>
@@ -22295,8 +23698,8 @@
         <w:t xml:space="preserve">Source: Naschazer template: HT +4; Dependency and Uncontrollable Appetite (human flesh); Greed; Proud. About 197 points.</w:t>
       </w:r>
     </w:p>
-    <w:bookmarkEnd w:id="101"/>
-    <w:bookmarkStart w:id="102" w:name="skalengeck"/>
+    <w:bookmarkEnd w:id="105"/>
+    <w:bookmarkStart w:id="106" w:name="skalengeck"/>
     <w:p>
       <w:pPr>
         <w:pStyle w:val="Heading2"/>
@@ -22577,8 +23980,8 @@
         <w:t xml:space="preserve">Source: Skalengeck template: no human-form changes. About 189 points.</w:t>
       </w:r>
     </w:p>
-    <w:bookmarkEnd w:id="102"/>
-    <w:bookmarkStart w:id="103" w:name="vallachi"/>
+    <w:bookmarkEnd w:id="106"/>
+    <w:bookmarkStart w:id="107" w:name="vallachi"/>
     <w:p>
       <w:pPr>
         <w:pStyle w:val="Heading2"/>
@@ -22919,8 +24322,8 @@
         <w:t xml:space="preserve">Source: Vallachi template: Attractive; Extended Lifespan; HT +2; Dependency and Uncontrollable Appetite (lifeforce); Weakness (sunlight); Lifebane. About 223 points.</w:t>
       </w:r>
     </w:p>
-    <w:bookmarkEnd w:id="103"/>
-    <w:bookmarkStart w:id="104" w:name="fuchsteufelwild"/>
+    <w:bookmarkEnd w:id="107"/>
+    <w:bookmarkStart w:id="108" w:name="fuchsteufelwild"/>
     <w:p>
       <w:pPr>
         <w:pStyle w:val="Heading2"/>
@@ -23253,8 +24656,8 @@
         <w:t xml:space="preserve">Source: Fuchsteurfelwild template: ST +1, HT +2, IQ +3, Super Jump 5; Obsession (Guess My Name); Bully; Callous; Sadism (now a companion). About 424 points; trimmed to Tier 3.</w:t>
       </w:r>
     </w:p>
-    <w:bookmarkEnd w:id="104"/>
-    <w:bookmarkStart w:id="105" w:name="hexenbiest-or-zauberbiest"/>
+    <w:bookmarkEnd w:id="108"/>
+    <w:bookmarkStart w:id="109" w:name="hexenbiest-or-zauberbiest"/>
     <w:p>
       <w:pPr>
         <w:pStyle w:val="Heading2"/>
@@ -23661,8 +25064,8 @@
         <w:t xml:space="preserve">Source: Hexenbiest and Zauberbiest template: Beautiful/Handsome; Sorcery 5; Ritual Adept 2; Vow (coven traditions). About 279 points.</w:t>
       </w:r>
     </w:p>
-    <w:bookmarkEnd w:id="105"/>
-    <w:bookmarkStart w:id="106" w:name="murcielago"/>
+    <w:bookmarkEnd w:id="109"/>
+    <w:bookmarkStart w:id="110" w:name="murcielago"/>
     <w:p>
       <w:pPr>
         <w:pStyle w:val="Heading2"/>
@@ -23967,9 +25370,9 @@
         <w:t xml:space="preserve">Source: Murcielago template: no human-form changes; Sonic Scream 6, Sonar. About 283 points.</w:t>
       </w:r>
     </w:p>
-    <w:bookmarkEnd w:id="106"/>
-    <w:bookmarkEnd w:id="107"/>
-    <w:bookmarkStart w:id="118" w:name="making-your-own"/>
+    <w:bookmarkEnd w:id="110"/>
+    <w:bookmarkEnd w:id="111"/>
+    <w:bookmarkStart w:id="122" w:name="making-your-own"/>
     <w:p>
       <w:pPr>
         <w:pStyle w:val="Heading1"/>
@@ -24002,7 +25405,7 @@
         <w:t xml:space="preserve">option at the end of each list, and its checklist holds a custom choice to the same rules as everything else.</w:t>
       </w:r>
     </w:p>
-    <w:bookmarkStart w:id="108" w:name="a-custom-calling"/>
+    <w:bookmarkStart w:id="112" w:name="a-custom-calling"/>
     <w:p>
       <w:pPr>
         <w:pStyle w:val="Heading2"/>
@@ -24178,8 +25581,8 @@
         <w:t xml:space="preserve">.</w:t>
       </w:r>
     </w:p>
-    <w:bookmarkEnd w:id="108"/>
-    <w:bookmarkStart w:id="117" w:name="a-custom-heritage"/>
+    <w:bookmarkEnd w:id="112"/>
+    <w:bookmarkStart w:id="121" w:name="a-custom-heritage"/>
     <w:p>
       <w:pPr>
         <w:pStyle w:val="Heading2"/>
@@ -24196,7 +25599,7 @@
         <w:t xml:space="preserve">Build it with the GM, one step at a time.</w:t>
       </w:r>
     </w:p>
-    <w:bookmarkStart w:id="109" w:name="the-concept"/>
+    <w:bookmarkStart w:id="113" w:name="the-concept"/>
     <w:p>
       <w:pPr>
         <w:pStyle w:val="Heading3"/>
@@ -24213,8 +25616,8 @@
         <w:t xml:space="preserve">Two or three sentences: where they come from, what sets them apart, and how others see them. It should be something the heritages in this book don’t already cover.</w:t>
       </w:r>
     </w:p>
-    <w:bookmarkEnd w:id="109"/>
-    <w:bookmarkStart w:id="110" w:name="the-tier"/>
+    <w:bookmarkEnd w:id="113"/>
+    <w:bookmarkStart w:id="114" w:name="the-tier"/>
     <w:p>
       <w:pPr>
         <w:pStyle w:val="Heading3"/>
@@ -24511,8 +25914,8 @@
         <w:t xml:space="preserve">When in doubt, choose the higher tier.</w:t>
       </w:r>
     </w:p>
-    <w:bookmarkEnd w:id="110"/>
-    <w:bookmarkStart w:id="111" w:name="attribute-adjustments"/>
+    <w:bookmarkEnd w:id="114"/>
+    <w:bookmarkStart w:id="115" w:name="attribute-adjustments"/>
     <w:p>
       <w:pPr>
         <w:pStyle w:val="Heading3"/>
@@ -24558,8 +25961,8 @@
         <w:t xml:space="preserve">: a +2 needs a −2 or two −1s. The adjustments move the attribute’s base (+1 starts it at 11) and raise its starting maximum (13 plus the bonus). Most heritages change two to four attributes.</w:t>
       </w:r>
     </w:p>
-    <w:bookmarkEnd w:id="111"/>
-    <w:bookmarkStart w:id="112" w:name="core-rules-tier-1-and-up"/>
+    <w:bookmarkEnd w:id="115"/>
+    <w:bookmarkStart w:id="116" w:name="core-rules-tier-1-and-up"/>
     <w:p>
       <w:pPr>
         <w:pStyle w:val="Heading3"/>
@@ -24576,8 +25979,8 @@
         <w:t xml:space="preserve">One to three short rules that always apply: what they can do (see in the dark, resist cold, a free Trained skill) and what it costs (a weakness, a people’s distrust, a hazard they can’t abide). A strength with no drawback is worth more than it looks, so price it a tier higher.</w:t>
       </w:r>
     </w:p>
-    <w:bookmarkEnd w:id="112"/>
-    <w:bookmarkStart w:id="113" w:name="heritage-advantages"/>
+    <w:bookmarkEnd w:id="116"/>
+    <w:bookmarkStart w:id="117" w:name="heritage-advantages"/>
     <w:p>
       <w:pPr>
         <w:pStyle w:val="Heading3"/>
@@ -24632,8 +26035,8 @@
         <w:t xml:space="preserve">: a problem the trait causes, with a clear trigger and a real consequence, which earns a Grit point when it bites, like any complication. A character takes one advantage, general or heritage, so make them distinct choices.</w:t>
       </w:r>
     </w:p>
-    <w:bookmarkEnd w:id="113"/>
-    <w:bookmarkStart w:id="114" w:name="a-woge-optional-tier-2-or-3"/>
+    <w:bookmarkEnd w:id="117"/>
+    <w:bookmarkStart w:id="118" w:name="a-woge-optional-tier-2-or-3"/>
     <w:p>
       <w:pPr>
         <w:pStyle w:val="Heading3"/>
@@ -24666,8 +26069,8 @@
         <w:t xml:space="preserve">apply.</w:t>
       </w:r>
     </w:p>
-    <w:bookmarkEnd w:id="114"/>
-    <w:bookmarkStart w:id="115" w:name="in-the-creator"/>
+    <w:bookmarkEnd w:id="118"/>
+    <w:bookmarkStart w:id="119" w:name="in-the-creator"/>
     <w:p>
       <w:pPr>
         <w:pStyle w:val="Heading3"/>
@@ -24772,8 +26175,8 @@
         <w:t xml:space="preserve">and enter the advantage and its companion complication.</w:t>
       </w:r>
     </w:p>
-    <w:bookmarkEnd w:id="115"/>
-    <w:bookmarkStart w:id="116" w:name="example"/>
+    <w:bookmarkEnd w:id="119"/>
+    <w:bookmarkStart w:id="120" w:name="example"/>
     <w:p>
       <w:pPr>
         <w:pStyle w:val="Heading3"/>
@@ -24878,10 +26281,10 @@
         <w:t xml:space="preserve">: Wesen recognize their own, and some want you back in the fold; accept the visit at the worst time.</w:t>
       </w:r>
     </w:p>
-    <w:bookmarkEnd w:id="116"/>
-    <w:bookmarkEnd w:id="117"/>
-    <w:bookmarkEnd w:id="118"/>
-    <w:bookmarkStart w:id="119" w:name="complications"/>
+    <w:bookmarkEnd w:id="120"/>
+    <w:bookmarkEnd w:id="121"/>
+    <w:bookmarkEnd w:id="122"/>
+    <w:bookmarkStart w:id="123" w:name="complications"/>
     <w:p>
       <w:pPr>
         <w:pStyle w:val="Heading1"/>
@@ -25685,8 +27088,8 @@
         </w:tc>
       </w:tr>
     </w:tbl>
-    <w:bookmarkEnd w:id="119"/>
-    <w:bookmarkStart w:id="120" w:name="quick-reference"/>
+    <w:bookmarkEnd w:id="123"/>
+    <w:bookmarkStart w:id="124" w:name="quick-reference"/>
     <w:p>
       <w:pPr>
         <w:pStyle w:val="Heading1"/>
@@ -25893,7 +27296,7 @@
         <w:t xml:space="preserve">start each session with two (three with True grit). Reroll, reduce an injury by one box, or establish a small preparation. Earn one from an accepted complication.</w:t>
       </w:r>
     </w:p>
-    <w:bookmarkEnd w:id="120"/>
+    <w:bookmarkEnd w:id="124"/>
     <w:sectPr/>
   </w:body>
 </w:document>

</xml_diff>

<commit_message>
Grimm: one magic system: spells, rituals and charms
Veneficare now cast spells (one action, Boosts at Specialty and Expert)
instead of one-action rituals; rituals and charms work as before, and a
magic advancement list joins Advancement.

Co-Authored-By: Claude Opus 5.5 <noreply@anthropic.com>
Claude-Session: https://claude.ai/code/session_015SADCFzhKijkC2foUmXrpC
</commit_message>
<xml_diff>
--- a/grimm-west/Grimm_Players_Guide.docx
+++ b/grimm-west/Grimm_Players_Guide.docx
@@ -5603,7 +5603,7 @@
     </w:p>
     <w:bookmarkEnd w:id="48"/>
     <w:bookmarkEnd w:id="49"/>
-    <w:bookmarkStart w:id="55" w:name="the-woge-and-the-hidden-world"/>
+    <w:bookmarkStart w:id="58" w:name="the-woge-and-the-hidden-world"/>
     <w:p>
       <w:pPr>
         <w:pStyle w:val="Heading1"/>
@@ -5991,13 +5991,13 @@
     </w:p>
     <w:bookmarkEnd w:id="51"/>
     <w:bookmarkEnd w:id="52"/>
-    <w:bookmarkStart w:id="53" w:name="incantare-and-rituals"/>
+    <w:bookmarkStart w:id="56" w:name="magic"/>
     <w:p>
       <w:pPr>
         <w:pStyle w:val="Heading2"/>
       </w:pPr>
       <w:r>
-        <w:t xml:space="preserve">Incantare and rituals</w:t>
+        <w:t xml:space="preserve">Magic</w:t>
       </w:r>
     </w:p>
     <w:p>
@@ -6005,7 +6005,7 @@
         <w:pStyle w:val="FirstParagraph"/>
       </w:pPr>
       <w:r>
-        <w:t xml:space="preserve">An Incantare’s</w:t>
+        <w:t xml:space="preserve">Magic works at two speeds, with a third tool that turns one into the other. An Incantare’s</w:t>
       </w:r>
       <w:r>
         <w:t xml:space="preserve"> </w:t>
@@ -6021,358 +6021,7 @@
         <w:t xml:space="preserve"> </w:t>
       </w:r>
       <w:r>
-        <w:t xml:space="preserve">is their heritage advantage. The Lens decides</w:t>
-      </w:r>
-      <w:r>
-        <w:t xml:space="preserve"> </w:t>
-      </w:r>
-      <w:r>
-        <w:rPr>
-          <w:iCs/>
-          <w:i/>
-        </w:rPr>
-        <w:t xml:space="preserve">how</w:t>
-      </w:r>
-      <w:r>
-        <w:t xml:space="preserve"> </w:t>
-      </w:r>
-      <w:r>
-        <w:t xml:space="preserve">magic is worked: how long it takes, what it needs, what it costs and what it’s best at. Any Lens can attempt any effect.</w:t>
-      </w:r>
-    </w:p>
-    <w:p>
-      <w:pPr>
-        <w:pStyle w:val="BodyText"/>
-      </w:pPr>
-      <w:r>
-        <w:rPr>
-          <w:bCs/>
-          <w:b/>
-        </w:rPr>
-        <w:t xml:space="preserve">Working a ritual.</w:t>
-      </w:r>
-    </w:p>
-    <w:p>
-      <w:pPr>
-        <w:numPr>
-          <w:ilvl w:val="0"/>
-          <w:numId w:val="1011"/>
-        </w:numPr>
-        <w:pStyle w:val="Compact"/>
-      </w:pPr>
-      <w:r>
-        <w:rPr>
-          <w:bCs/>
-          <w:b/>
-        </w:rPr>
-        <w:t xml:space="preserve">Describe the effect.</w:t>
-      </w:r>
-      <w:r>
-        <w:t xml:space="preserve"> </w:t>
-      </w:r>
-      <w:r>
-        <w:t xml:space="preserve">The GM sets its weight:</w:t>
-      </w:r>
-      <w:r>
-        <w:t xml:space="preserve"> </w:t>
-      </w:r>
-      <w:r>
-        <w:rPr>
-          <w:bCs/>
-          <w:b/>
-        </w:rPr>
-        <w:t xml:space="preserve">minor</w:t>
-      </w:r>
-      <w:r>
-        <w:t xml:space="preserve"> </w:t>
-      </w:r>
-      <w:r>
-        <w:t xml:space="preserve">(2 segments),</w:t>
-      </w:r>
-      <w:r>
-        <w:t xml:space="preserve"> </w:t>
-      </w:r>
-      <w:r>
-        <w:rPr>
-          <w:bCs/>
-          <w:b/>
-        </w:rPr>
-        <w:t xml:space="preserve">significant</w:t>
-      </w:r>
-      <w:r>
-        <w:t xml:space="preserve"> </w:t>
-      </w:r>
-      <w:r>
-        <w:t xml:space="preserve">(4) or</w:t>
-      </w:r>
-      <w:r>
-        <w:t xml:space="preserve"> </w:t>
-      </w:r>
-      <w:r>
-        <w:rPr>
-          <w:bCs/>
-          <w:b/>
-        </w:rPr>
-        <w:t xml:space="preserve">major</w:t>
-      </w:r>
-      <w:r>
-        <w:t xml:space="preserve"> </w:t>
-      </w:r>
-      <w:r>
-        <w:t xml:space="preserve">(6), and says what it can and can’t do before you start.</w:t>
-      </w:r>
-    </w:p>
-    <w:p>
-      <w:pPr>
-        <w:numPr>
-          <w:ilvl w:val="0"/>
-          <w:numId w:val="1011"/>
-        </w:numPr>
-        <w:pStyle w:val="Compact"/>
-      </w:pPr>
-      <w:r>
-        <w:rPr>
-          <w:bCs/>
-          <w:b/>
-        </w:rPr>
-        <w:t xml:space="preserve">Gather the energy.</w:t>
-      </w:r>
-      <w:r>
-        <w:t xml:space="preserve"> </w:t>
-      </w:r>
-      <w:r>
-        <w:t xml:space="preserve">Fill a progress clock of that size with</w:t>
-      </w:r>
-      <w:r>
-        <w:t xml:space="preserve"> </w:t>
-      </w:r>
-      <w:r>
-        <w:rPr>
-          <w:bCs/>
-          <w:b/>
-        </w:rPr>
-        <w:t xml:space="preserve">Occult</w:t>
-      </w:r>
-      <w:r>
-        <w:t xml:space="preserve"> </w:t>
-      </w:r>
-      <w:r>
-        <w:t xml:space="preserve">rolls. Each roll takes your Lens’s casting time (usually ten minutes; an hour for a Magi, one action for a Veneficare). Success fills one segment; success by 5 or more fills two. A failure costs time or ticks a danger clock.</w:t>
-      </w:r>
-    </w:p>
-    <w:p>
-      <w:pPr>
-        <w:numPr>
-          <w:ilvl w:val="0"/>
-          <w:numId w:val="1011"/>
-        </w:numPr>
-        <w:pStyle w:val="Compact"/>
-      </w:pPr>
-      <w:r>
-        <w:rPr>
-          <w:bCs/>
-          <w:b/>
-        </w:rPr>
-        <w:t xml:space="preserve">The effect happens</w:t>
-      </w:r>
-      <w:r>
-        <w:t xml:space="preserve"> </w:t>
-      </w:r>
-      <w:r>
-        <w:t xml:space="preserve">when the clock is full. A ritual interrupted with energy gathered may go wrong.</w:t>
-      </w:r>
-    </w:p>
-    <w:p>
-      <w:pPr>
-        <w:pStyle w:val="FirstParagraph"/>
-      </w:pPr>
-      <w:r>
-        <w:rPr>
-          <w:bCs/>
-          <w:b/>
-        </w:rPr>
-        <w:t xml:space="preserve">Trappings.</w:t>
-      </w:r>
-      <w:r>
-        <w:t xml:space="preserve"> </w:t>
-      </w:r>
-      <w:r>
-        <w:t xml:space="preserve">The right materials and correspondences (stones, herbs, stars, places) remove one segment from the clock.</w:t>
-      </w:r>
-    </w:p>
-    <w:p>
-      <w:pPr>
-        <w:pStyle w:val="BodyText"/>
-      </w:pPr>
-      <w:r>
-        <w:rPr>
-          <w:bCs/>
-          <w:b/>
-        </w:rPr>
-        <w:t xml:space="preserve">Charms.</w:t>
-      </w:r>
-      <w:r>
-        <w:t xml:space="preserve"> </w:t>
-      </w:r>
-      <w:r>
-        <w:t xml:space="preserve">A finished ritual can be stored in an object and released by breaking it: a bottle thrown, a pendant snapped, a bullet-charm fired. You can carry as many ready charms as your Occult training allows: Trained 2, Specialty 3, Expert 4.</w:t>
-      </w:r>
-    </w:p>
-    <w:p>
-      <w:pPr>
-        <w:pStyle w:val="BodyText"/>
-      </w:pPr>
-      <w:r>
-        <w:rPr>
-          <w:bCs/>
-          <w:b/>
-        </w:rPr>
-        <w:t xml:space="preserve">Elixirs and potions</w:t>
-      </w:r>
-      <w:r>
-        <w:t xml:space="preserve"> </w:t>
-      </w:r>
-      <w:r>
-        <w:t xml:space="preserve">spoil. They stay good until the end of the day, or a week on a success by 5 or more.</w:t>
-      </w:r>
-    </w:p>
-    <w:p>
-      <w:pPr>
-        <w:pStyle w:val="BodyText"/>
-      </w:pPr>
-      <w:r>
-        <w:rPr>
-          <w:bCs/>
-          <w:b/>
-        </w:rPr>
-        <w:t xml:space="preserve">Magic draws attention.</w:t>
-      </w:r>
-      <w:r>
-        <w:t xml:space="preserve"> </w:t>
-      </w:r>
-      <w:r>
-        <w:t xml:space="preserve">Using it openly can mark a box of</w:t>
-      </w:r>
-      <w:r>
-        <w:t xml:space="preserve"> </w:t>
-      </w:r>
-      <w:r>
-        <w:rPr>
-          <w:bCs/>
-          <w:b/>
-        </w:rPr>
-        <w:t xml:space="preserve">Exposure</w:t>
-      </w:r>
-      <w:r>
-        <w:t xml:space="preserve">, the Order of the Holy Knife hunts known Incantare, and a Grimm gets +1 to sense your magic for each charm or potion you carry.</w:t>
-      </w:r>
-    </w:p>
-    <w:p>
-      <w:pPr>
-        <w:pStyle w:val="BodyText"/>
-      </w:pPr>
-      <w:r>
-        <w:rPr>
-          <w:bCs/>
-          <w:b/>
-        </w:rPr>
-        <w:t xml:space="preserve">Hexenbiests and Zauberbiests</w:t>
-      </w:r>
-      <w:r>
-        <w:t xml:space="preserve"> </w:t>
-      </w:r>
-      <w:r>
-        <w:t xml:space="preserve">work rituals the same way, through their innate magic, in their own style (curses, potions and sendings).</w:t>
-      </w:r>
-    </w:p>
-    <w:bookmarkEnd w:id="53"/>
-    <w:bookmarkStart w:id="54" w:name="the-code-of-swabia"/>
-    <w:p>
-      <w:pPr>
-        <w:pStyle w:val="Heading2"/>
-      </w:pPr>
-      <w:r>
-        <w:t xml:space="preserve">The Code of Swabia</w:t>
-      </w:r>
-    </w:p>
-    <w:p>
-      <w:pPr>
-        <w:pStyle w:val="FirstParagraph"/>
-      </w:pPr>
-      <w:r>
-        <w:t xml:space="preserve">The Code of Swabia is the old law between Wesen and the rest of the world, and Grimms are its enforcers. At its heart, Wesen must not reveal themselves to humanity. How far it reaches beyond that, and how mercifully a Grimm enforces it, is a question your characters will answer for themselves.</w:t>
-      </w:r>
-    </w:p>
-    <w:bookmarkEnd w:id="54"/>
-    <w:bookmarkEnd w:id="55"/>
-    <w:bookmarkStart w:id="63" w:name="personal-combat"/>
-    <w:p>
-      <w:pPr>
-        <w:pStyle w:val="Heading1"/>
-      </w:pPr>
-      <w:r>
-        <w:t xml:space="preserve">Personal combat</w:t>
-      </w:r>
-    </w:p>
-    <w:bookmarkStart w:id="56" w:name="turn-order-and-actions"/>
-    <w:p>
-      <w:pPr>
-        <w:pStyle w:val="Heading2"/>
-      </w:pPr>
-      <w:r>
-        <w:t xml:space="preserve">Turn order and actions</w:t>
-      </w:r>
-    </w:p>
-    <w:p>
-      <w:pPr>
-        <w:pStyle w:val="FirstParagraph"/>
-      </w:pPr>
-      <w:r>
-        <w:t xml:space="preserve">Act in descending Agility order. Players choose the order of tied characters; the GM resolves other ties. A round lasts a few seconds. On your turn, move a short distance and take one meaningful action, such as shooting, reloading, helping, or attempting a task.</w:t>
-      </w:r>
-    </w:p>
-    <w:bookmarkEnd w:id="56"/>
-    <w:bookmarkStart w:id="57" w:name="attacking-and-defending"/>
-    <w:p>
-      <w:pPr>
-        <w:pStyle w:val="Heading2"/>
-      </w:pPr>
-      <w:r>
-        <w:t xml:space="preserve">Attacking and defending</w:t>
-      </w:r>
-    </w:p>
-    <w:p>
-      <w:pPr>
-        <w:pStyle w:val="FirstParagraph"/>
-      </w:pPr>
-      <w:r>
-        <w:t xml:space="preserve">Roll Shooting for a ranged attack, Melee for a weapon in hand, or Brawling for fists and grappling. If the attack succeeds, an aware target able to move may attempt Dodge. Dodge is Agility −2, with +1 for Trained Athletics or +2 for Athletics as a Specialty or Expert. Each target gets one Dodge attempt per round. A successful Dodge cancels the hit. Apply injury penalties to Dodge.</w:t>
-      </w:r>
-    </w:p>
-    <w:p>
-      <w:pPr>
-        <w:pStyle w:val="BodyText"/>
-      </w:pPr>
-      <w:r>
-        <w:t xml:space="preserve">Solid cover blocks a shot. Partial cover imposes −2 on the attack. Weapon effects apply after a hit survives any Dodge. Success margin does not increase damage.</w:t>
-      </w:r>
-    </w:p>
-    <w:bookmarkEnd w:id="57"/>
-    <w:bookmarkStart w:id="58" w:name="range"/>
-    <w:p>
-      <w:pPr>
-        <w:pStyle w:val="Heading2"/>
-      </w:pPr>
-      <w:r>
-        <w:t xml:space="preserve">Range</w:t>
-      </w:r>
-    </w:p>
-    <w:p>
-      <w:pPr>
-        <w:pStyle w:val="FirstParagraph"/>
-      </w:pPr>
-      <w:r>
-        <w:t xml:space="preserve">Distances fall into five bands:</w:t>
+        <w:t xml:space="preserve">decides which they use and how; any Lens can attempt any effect.</w:t>
       </w:r>
     </w:p>
     <w:tbl>
@@ -6413,7 +6062,7 @@
                 <w:b/>
                 <w:sz w:val="19"/>
               </w:rPr>
-              <w:t xml:space="preserve">Band</w:t>
+              <w:t xml:space="preserve">Tool</w:t>
             </w:r>
           </w:p>
         </w:tc>
@@ -6431,7 +6080,7 @@
                 <w:b/>
                 <w:sz w:val="19"/>
               </w:rPr>
-              <w:t xml:space="preserve">Distance</w:t>
+              <w:t xml:space="preserve">Speed</w:t>
             </w:r>
           </w:p>
         </w:tc>
@@ -6449,281 +6098,506 @@
                 <w:b/>
                 <w:sz w:val="19"/>
               </w:rPr>
-              <w:t xml:space="preserve">For example</w:t>
-            </w:r>
-          </w:p>
-        </w:tc>
-      </w:tr>
-      <w:tr>
-        <w:tc>
-          <w:tcPr/>
-          <w:p>
-            <w:pPr>
-              <w:pStyle w:val="Compact"/>
-              <w:jc w:val="left"/>
-            </w:pPr>
-            <w:r>
-              <w:rPr>
-                <w:b/>
-                <w:sz w:val="19"/>
-              </w:rPr>
-              <w:t xml:space="preserve">Close</w:t>
-            </w:r>
-          </w:p>
-        </w:tc>
-        <w:tc>
-          <w:tcPr/>
-          <w:p>
-            <w:pPr>
-              <w:pStyle w:val="Compact"/>
-              <w:jc w:val="left"/>
-            </w:pPr>
-            <w:r>
-              <w:rPr>
-                <w:sz w:val="19"/>
-              </w:rPr>
-              <w:t xml:space="preserve">Up to 10 yards</w:t>
-            </w:r>
-          </w:p>
-        </w:tc>
-        <w:tc>
-          <w:tcPr/>
-          <w:p>
-            <w:pPr>
-              <w:pStyle w:val="Compact"/>
-              <w:jc w:val="left"/>
-            </w:pPr>
-            <w:r>
-              <w:rPr>
-                <w:sz w:val="19"/>
-              </w:rPr>
-              <w:t xml:space="preserve">Across a room or a saloon; one move covers it</w:t>
-            </w:r>
-          </w:p>
-        </w:tc>
-      </w:tr>
-      <w:tr>
-        <w:tc>
-          <w:tcPr/>
-          <w:p>
-            <w:pPr>
-              <w:pStyle w:val="Compact"/>
-              <w:jc w:val="left"/>
-            </w:pPr>
-            <w:r>
-              <w:rPr>
-                <w:b/>
-                <w:sz w:val="19"/>
-              </w:rPr>
-              <w:t xml:space="preserve">Short</w:t>
-            </w:r>
-          </w:p>
-        </w:tc>
-        <w:tc>
-          <w:tcPr/>
-          <w:p>
-            <w:pPr>
-              <w:pStyle w:val="Compact"/>
-              <w:jc w:val="left"/>
-            </w:pPr>
-            <w:r>
-              <w:rPr>
-                <w:sz w:val="19"/>
-              </w:rPr>
-              <w:t xml:space="preserve">Up to 50 yards</w:t>
-            </w:r>
-          </w:p>
-        </w:tc>
-        <w:tc>
-          <w:tcPr/>
-          <w:p>
-            <w:pPr>
-              <w:pStyle w:val="Compact"/>
-              <w:jc w:val="left"/>
-            </w:pPr>
-            <w:r>
-              <w:rPr>
-                <w:sz w:val="19"/>
-              </w:rPr>
-              <w:t xml:space="preserve">Across a street or a corral</w:t>
-            </w:r>
-          </w:p>
-        </w:tc>
-      </w:tr>
-      <w:tr>
-        <w:tc>
-          <w:tcPr/>
-          <w:p>
-            <w:pPr>
-              <w:pStyle w:val="Compact"/>
-              <w:jc w:val="left"/>
-            </w:pPr>
-            <w:r>
-              <w:rPr>
-                <w:b/>
-                <w:sz w:val="19"/>
-              </w:rPr>
-              <w:t xml:space="preserve">Medium</w:t>
-            </w:r>
-          </w:p>
-        </w:tc>
-        <w:tc>
-          <w:tcPr/>
-          <w:p>
-            <w:pPr>
-              <w:pStyle w:val="Compact"/>
-              <w:jc w:val="left"/>
-            </w:pPr>
-            <w:r>
-              <w:rPr>
-                <w:sz w:val="19"/>
-              </w:rPr>
-              <w:t xml:space="preserve">Up to 150 yards</w:t>
-            </w:r>
-          </w:p>
-        </w:tc>
-        <w:tc>
-          <w:tcPr/>
-          <w:p>
-            <w:pPr>
-              <w:pStyle w:val="Compact"/>
-              <w:jc w:val="left"/>
-            </w:pPr>
-            <w:r>
-              <w:rPr>
-                <w:sz w:val="19"/>
-              </w:rPr>
-              <w:t xml:space="preserve">Down the length of a town</w:t>
-            </w:r>
-          </w:p>
-        </w:tc>
-      </w:tr>
-      <w:tr>
-        <w:tc>
-          <w:tcPr/>
-          <w:p>
-            <w:pPr>
-              <w:pStyle w:val="Compact"/>
-              <w:jc w:val="left"/>
-            </w:pPr>
-            <w:r>
-              <w:rPr>
-                <w:b/>
-                <w:sz w:val="19"/>
-              </w:rPr>
-              <w:t xml:space="preserve">Long</w:t>
-            </w:r>
-          </w:p>
-        </w:tc>
-        <w:tc>
-          <w:tcPr/>
-          <w:p>
-            <w:pPr>
-              <w:pStyle w:val="Compact"/>
-              <w:jc w:val="left"/>
-            </w:pPr>
-            <w:r>
-              <w:rPr>
-                <w:sz w:val="19"/>
-              </w:rPr>
-              <w:t xml:space="preserve">Up to 500 yards</w:t>
-            </w:r>
-          </w:p>
-        </w:tc>
-        <w:tc>
-          <w:tcPr/>
-          <w:p>
-            <w:pPr>
-              <w:pStyle w:val="Compact"/>
-              <w:jc w:val="left"/>
-            </w:pPr>
-            <w:r>
-              <w:rPr>
-                <w:sz w:val="19"/>
-              </w:rPr>
-              <w:t xml:space="preserve">Across a valley or a river crossing</w:t>
-            </w:r>
-          </w:p>
-        </w:tc>
-      </w:tr>
-      <w:tr>
-        <w:tc>
-          <w:tcPr/>
-          <w:p>
-            <w:pPr>
-              <w:pStyle w:val="Compact"/>
-              <w:jc w:val="left"/>
-            </w:pPr>
-            <w:r>
-              <w:rPr>
-                <w:b/>
-                <w:sz w:val="19"/>
-              </w:rPr>
-              <w:t xml:space="preserve">Extreme</w:t>
-            </w:r>
-          </w:p>
-        </w:tc>
-        <w:tc>
-          <w:tcPr/>
-          <w:p>
-            <w:pPr>
-              <w:pStyle w:val="Compact"/>
-              <w:jc w:val="left"/>
-            </w:pPr>
-            <w:r>
-              <w:rPr>
-                <w:sz w:val="19"/>
-              </w:rPr>
-              <w:t xml:space="preserve">Up to a mile, in line of sight</w:t>
-            </w:r>
-          </w:p>
-        </w:tc>
-        <w:tc>
-          <w:tcPr/>
-          <w:p>
-            <w:pPr>
-              <w:pStyle w:val="Compact"/>
-              <w:jc w:val="left"/>
-            </w:pPr>
-            <w:r>
-              <w:rPr>
-                <w:sz w:val="19"/>
-              </w:rPr>
-              <w:t xml:space="preserve">Ridge to ridge</w:t>
+              <w:t xml:space="preserve">How it works</w:t>
+            </w:r>
+          </w:p>
+        </w:tc>
+      </w:tr>
+      <w:tr>
+        <w:tc>
+          <w:tcPr/>
+          <w:p>
+            <w:pPr>
+              <w:pStyle w:val="Compact"/>
+              <w:jc w:val="left"/>
+            </w:pPr>
+            <w:r>
+              <w:rPr>
+                <w:bCs/>
+                <w:b/>
+                <w:sz w:val="19"/>
+              </w:rPr>
+              <w:t xml:space="preserve">Spells</w:t>
+            </w:r>
+          </w:p>
+        </w:tc>
+        <w:tc>
+          <w:tcPr/>
+          <w:p>
+            <w:pPr>
+              <w:pStyle w:val="Compact"/>
+              <w:jc w:val="left"/>
+            </w:pPr>
+            <w:r>
+              <w:rPr>
+                <w:sz w:val="19"/>
+              </w:rPr>
+              <w:t xml:space="preserve">One action</w:t>
+            </w:r>
+          </w:p>
+        </w:tc>
+        <w:tc>
+          <w:tcPr/>
+          <w:p>
+            <w:pPr>
+              <w:pStyle w:val="Compact"/>
+              <w:jc w:val="left"/>
+            </w:pPr>
+            <w:r>
+              <w:rPr>
+                <w:sz w:val="19"/>
+              </w:rPr>
+              <w:t xml:space="preserve">A quick spell you know. Roll Occult; on a success it happens. Veneficare only.</w:t>
+            </w:r>
+          </w:p>
+        </w:tc>
+      </w:tr>
+      <w:tr>
+        <w:tc>
+          <w:tcPr/>
+          <w:p>
+            <w:pPr>
+              <w:pStyle w:val="Compact"/>
+              <w:jc w:val="left"/>
+            </w:pPr>
+            <w:r>
+              <w:rPr>
+                <w:bCs/>
+                <w:b/>
+                <w:sz w:val="19"/>
+              </w:rPr>
+              <w:t xml:space="preserve">Rituals</w:t>
+            </w:r>
+          </w:p>
+        </w:tc>
+        <w:tc>
+          <w:tcPr/>
+          <w:p>
+            <w:pPr>
+              <w:pStyle w:val="Compact"/>
+              <w:jc w:val="left"/>
+            </w:pPr>
+            <w:r>
+              <w:rPr>
+                <w:sz w:val="19"/>
+              </w:rPr>
+              <w:t xml:space="preserve">Minutes to nights</w:t>
+            </w:r>
+          </w:p>
+        </w:tc>
+        <w:tc>
+          <w:tcPr/>
+          <w:p>
+            <w:pPr>
+              <w:pStyle w:val="Compact"/>
+              <w:jc w:val="left"/>
+            </w:pPr>
+            <w:r>
+              <w:rPr>
+                <w:sz w:val="19"/>
+              </w:rPr>
+              <w:t xml:space="preserve">Anything else. Describe the effect; the GM sets its weight; fill a progress clock.</w:t>
+            </w:r>
+          </w:p>
+        </w:tc>
+      </w:tr>
+      <w:tr>
+        <w:tc>
+          <w:tcPr/>
+          <w:p>
+            <w:pPr>
+              <w:pStyle w:val="Compact"/>
+              <w:jc w:val="left"/>
+            </w:pPr>
+            <w:r>
+              <w:rPr>
+                <w:bCs/>
+                <w:b/>
+                <w:sz w:val="19"/>
+              </w:rPr>
+              <w:t xml:space="preserve">Charms</w:t>
+            </w:r>
+          </w:p>
+        </w:tc>
+        <w:tc>
+          <w:tcPr/>
+          <w:p>
+            <w:pPr>
+              <w:pStyle w:val="Compact"/>
+              <w:jc w:val="left"/>
+            </w:pPr>
+            <w:r>
+              <w:rPr>
+                <w:sz w:val="19"/>
+              </w:rPr>
+              <w:t xml:space="preserve">One action, no roll</w:t>
+            </w:r>
+          </w:p>
+        </w:tc>
+        <w:tc>
+          <w:tcPr/>
+          <w:p>
+            <w:pPr>
+              <w:pStyle w:val="Compact"/>
+              <w:jc w:val="left"/>
+            </w:pPr>
+            <w:r>
+              <w:rPr>
+                <w:sz w:val="19"/>
+              </w:rPr>
+              <w:t xml:space="preserve">A finished ritual stored in an object, released by breaking it.</w:t>
             </w:r>
           </w:p>
         </w:tc>
       </w:tr>
     </w:tbl>
-    <w:p>
-      <w:pPr>
-        <w:pStyle w:val="BodyText"/>
-      </w:pPr>
-      <w:r>
-        <w:t xml:space="preserve">Every ranged weapon has an</w:t>
-      </w:r>
-      <w:r>
-        <w:t xml:space="preserve"> </w:t>
-      </w:r>
+    <w:bookmarkStart w:id="53" w:name="rituals"/>
+    <w:p>
+      <w:pPr>
+        <w:pStyle w:val="Heading3"/>
+      </w:pPr>
+      <w:r>
+        <w:t xml:space="preserve">Rituals</w:t>
+      </w:r>
+    </w:p>
+    <w:p>
+      <w:pPr>
+        <w:numPr>
+          <w:ilvl w:val="0"/>
+          <w:numId w:val="1011"/>
+        </w:numPr>
+        <w:pStyle w:val="Compact"/>
+      </w:pPr>
       <w:r>
         <w:rPr>
           <w:bCs/>
           <w:b/>
         </w:rPr>
-        <w:t xml:space="preserve">effective band</w:t>
-      </w:r>
-      <w:r>
-        <w:t xml:space="preserve">, shown in the weapons table. Attacks within it take no penalty. One band beyond it is −2, two bands beyond is −4, and anything farther is out of range. Weapons in hand, claws and fists reach only someone next to you. Your move each turn covers the Close band; give up your action to run and you cover Short.</w:t>
-      </w:r>
-    </w:p>
-    <w:bookmarkEnd w:id="58"/>
-    <w:bookmarkStart w:id="60" w:name="injury"/>
-    <w:p>
-      <w:pPr>
-        <w:pStyle w:val="Heading2"/>
-      </w:pPr>
-      <w:r>
-        <w:t xml:space="preserve">Injury</w:t>
+        <w:t xml:space="preserve">Describe the effect.</w:t>
+      </w:r>
+      <w:r>
+        <w:t xml:space="preserve"> </w:t>
+      </w:r>
+      <w:r>
+        <w:t xml:space="preserve">The GM sets its weight:</w:t>
+      </w:r>
+      <w:r>
+        <w:t xml:space="preserve"> </w:t>
+      </w:r>
+      <w:r>
+        <w:rPr>
+          <w:bCs/>
+          <w:b/>
+        </w:rPr>
+        <w:t xml:space="preserve">minor</w:t>
+      </w:r>
+      <w:r>
+        <w:t xml:space="preserve"> </w:t>
+      </w:r>
+      <w:r>
+        <w:t xml:space="preserve">(2 segments),</w:t>
+      </w:r>
+      <w:r>
+        <w:t xml:space="preserve"> </w:t>
+      </w:r>
+      <w:r>
+        <w:rPr>
+          <w:bCs/>
+          <w:b/>
+        </w:rPr>
+        <w:t xml:space="preserve">significant</w:t>
+      </w:r>
+      <w:r>
+        <w:t xml:space="preserve"> </w:t>
+      </w:r>
+      <w:r>
+        <w:t xml:space="preserve">(4) or</w:t>
+      </w:r>
+      <w:r>
+        <w:t xml:space="preserve"> </w:t>
+      </w:r>
+      <w:r>
+        <w:rPr>
+          <w:bCs/>
+          <w:b/>
+        </w:rPr>
+        <w:t xml:space="preserve">major</w:t>
+      </w:r>
+      <w:r>
+        <w:t xml:space="preserve"> </w:t>
+      </w:r>
+      <w:r>
+        <w:t xml:space="preserve">(6), and says what it can and can’t do before you start.</w:t>
+      </w:r>
+    </w:p>
+    <w:p>
+      <w:pPr>
+        <w:numPr>
+          <w:ilvl w:val="0"/>
+          <w:numId w:val="1011"/>
+        </w:numPr>
+        <w:pStyle w:val="Compact"/>
+      </w:pPr>
+      <w:r>
+        <w:rPr>
+          <w:bCs/>
+          <w:b/>
+        </w:rPr>
+        <w:t xml:space="preserve">Gather the energy.</w:t>
+      </w:r>
+      <w:r>
+        <w:t xml:space="preserve"> </w:t>
+      </w:r>
+      <w:r>
+        <w:t xml:space="preserve">Fill a progress clock of that size with</w:t>
+      </w:r>
+      <w:r>
+        <w:t xml:space="preserve"> </w:t>
+      </w:r>
+      <w:r>
+        <w:rPr>
+          <w:bCs/>
+          <w:b/>
+        </w:rPr>
+        <w:t xml:space="preserve">Occult</w:t>
+      </w:r>
+      <w:r>
+        <w:t xml:space="preserve"> </w:t>
+      </w:r>
+      <w:r>
+        <w:t xml:space="preserve">rolls. Each roll takes your Lens’s casting time (usually ten minutes; an hour for a Magi). Success fills one segment; success by 5 or more fills two. A failure costs time or ticks a danger clock.</w:t>
+      </w:r>
+    </w:p>
+    <w:p>
+      <w:pPr>
+        <w:numPr>
+          <w:ilvl w:val="0"/>
+          <w:numId w:val="1011"/>
+        </w:numPr>
+        <w:pStyle w:val="Compact"/>
+      </w:pPr>
+      <w:r>
+        <w:rPr>
+          <w:bCs/>
+          <w:b/>
+        </w:rPr>
+        <w:t xml:space="preserve">The effect happens</w:t>
+      </w:r>
+      <w:r>
+        <w:t xml:space="preserve"> </w:t>
+      </w:r>
+      <w:r>
+        <w:t xml:space="preserve">when the clock is full. A ritual interrupted with energy gathered may go wrong.</w:t>
+      </w:r>
+    </w:p>
+    <w:p>
+      <w:pPr>
+        <w:pStyle w:val="FirstParagraph"/>
+      </w:pPr>
+      <w:r>
+        <w:rPr>
+          <w:bCs/>
+          <w:b/>
+        </w:rPr>
+        <w:t xml:space="preserve">Trappings.</w:t>
+      </w:r>
+      <w:r>
+        <w:t xml:space="preserve"> </w:t>
+      </w:r>
+      <w:r>
+        <w:t xml:space="preserve">The right materials and correspondences (stones, herbs, stars, places) remove one segment from the clock.</w:t>
+      </w:r>
+    </w:p>
+    <w:bookmarkEnd w:id="53"/>
+    <w:bookmarkStart w:id="54" w:name="charms-elixirs-and-potions"/>
+    <w:p>
+      <w:pPr>
+        <w:pStyle w:val="Heading3"/>
+      </w:pPr>
+      <w:r>
+        <w:t xml:space="preserve">Charms, elixirs and potions</w:t>
+      </w:r>
+    </w:p>
+    <w:p>
+      <w:pPr>
+        <w:pStyle w:val="FirstParagraph"/>
+      </w:pPr>
+      <w:r>
+        <w:rPr>
+          <w:bCs/>
+          <w:b/>
+        </w:rPr>
+        <w:t xml:space="preserve">Charms.</w:t>
+      </w:r>
+      <w:r>
+        <w:t xml:space="preserve"> </w:t>
+      </w:r>
+      <w:r>
+        <w:t xml:space="preserve">A finished ritual can be stored in an object and released by breaking it: a bottle thrown, a pendant snapped, a bullet-charm fired. You can carry as many ready charms as your Occult training allows: Trained 2, Specialty 3, Expert 4. A Scaenarfex carries one more; a Veneficare only one. Preparation is how slow magic wins a fast fight.</w:t>
+      </w:r>
+    </w:p>
+    <w:p>
+      <w:pPr>
+        <w:pStyle w:val="BodyText"/>
+      </w:pPr>
+      <w:r>
+        <w:rPr>
+          <w:bCs/>
+          <w:b/>
+        </w:rPr>
+        <w:t xml:space="preserve">Elixirs and potions</w:t>
+      </w:r>
+      <w:r>
+        <w:t xml:space="preserve"> </w:t>
+      </w:r>
+      <w:r>
+        <w:t xml:space="preserve">spoil. They stay good until the end of the day, or a week on a success by 5 or more.</w:t>
+      </w:r>
+    </w:p>
+    <w:bookmarkEnd w:id="54"/>
+    <w:bookmarkStart w:id="55" w:name="spells-veneficare"/>
+    <w:p>
+      <w:pPr>
+        <w:pStyle w:val="Heading3"/>
+      </w:pPr>
+      <w:r>
+        <w:t xml:space="preserve">Spells (Veneficare)</w:t>
+      </w:r>
+    </w:p>
+    <w:p>
+      <w:pPr>
+        <w:pStyle w:val="FirstParagraph"/>
+      </w:pPr>
+      <w:r>
+        <w:t xml:space="preserve">A</w:t>
+      </w:r>
+      <w:r>
+        <w:t xml:space="preserve"> </w:t>
+      </w:r>
+      <w:r>
+        <w:rPr>
+          <w:bCs/>
+          <w:b/>
+        </w:rPr>
+        <w:t xml:space="preserve">Veneficare</w:t>
+      </w:r>
+      <w:r>
+        <w:t xml:space="preserve"> </w:t>
+      </w:r>
+      <w:r>
+        <w:t xml:space="preserve">trades preparation for speed: they know</w:t>
+      </w:r>
+      <w:r>
+        <w:t xml:space="preserve"> </w:t>
+      </w:r>
+      <w:r>
+        <w:rPr>
+          <w:bCs/>
+          <w:b/>
+        </w:rPr>
+        <w:t xml:space="preserve">spells</w:t>
+      </w:r>
+      <w:r>
+        <w:t xml:space="preserve">, cast with</w:t>
+      </w:r>
+      <w:r>
+        <w:t xml:space="preserve"> </w:t>
+      </w:r>
+      <w:r>
+        <w:rPr>
+          <w:bCs/>
+          <w:b/>
+        </w:rPr>
+        <w:t xml:space="preserve">one action and an Occult roll</w:t>
+      </w:r>
+      <w:r>
+        <w:t xml:space="preserve">, shaped by one or two Paths agreed with the GM. Spells known:</w:t>
+      </w:r>
+      <w:r>
+        <w:t xml:space="preserve"> </w:t>
+      </w:r>
+      <w:r>
+        <w:rPr>
+          <w:bCs/>
+          <w:b/>
+        </w:rPr>
+        <w:t xml:space="preserve">Trained 2, Specialty 3, Expert 4</w:t>
+      </w:r>
+      <w:r>
+        <w:t xml:space="preserve">.</w:t>
+      </w:r>
+    </w:p>
+    <w:p>
+      <w:pPr>
+        <w:pStyle w:val="BodyText"/>
+      </w:pPr>
+      <w:r>
+        <w:t xml:space="preserve">Each spell has a short</w:t>
+      </w:r>
+      <w:r>
+        <w:t xml:space="preserve"> </w:t>
+      </w:r>
+      <w:r>
+        <w:rPr>
+          <w:bCs/>
+          <w:b/>
+        </w:rPr>
+        <w:t xml:space="preserve">base effect</w:t>
+      </w:r>
+      <w:r>
+        <w:t xml:space="preserve">: one target, for one scene, at Close or Short range. Occult as a Specialty gives</w:t>
+      </w:r>
+      <w:r>
+        <w:t xml:space="preserve"> </w:t>
+      </w:r>
+      <w:r>
+        <w:rPr>
+          <w:bCs/>
+          <w:b/>
+        </w:rPr>
+        <w:t xml:space="preserve">1 Boost</w:t>
+      </w:r>
+      <w:r>
+        <w:t xml:space="preserve">, as Expert</w:t>
+      </w:r>
+      <w:r>
+        <w:t xml:space="preserve"> </w:t>
+      </w:r>
+      <w:r>
+        <w:rPr>
+          <w:bCs/>
+          <w:b/>
+        </w:rPr>
+        <w:t xml:space="preserve">2</w:t>
+      </w:r>
+      <w:r>
+        <w:t xml:space="preserve">, chosen</w:t>
+      </w:r>
+      <w:r>
+        <w:t xml:space="preserve"> </w:t>
+      </w:r>
+      <w:r>
+        <w:rPr>
+          <w:bCs/>
+          <w:b/>
+        </w:rPr>
+        <w:t xml:space="preserve">as you cast</w:t>
+      </w:r>
+      <w:r>
+        <w:t xml:space="preserve">; each Boost spent is</w:t>
+      </w:r>
+      <w:r>
+        <w:t xml:space="preserve"> </w:t>
+      </w:r>
+      <w:r>
+        <w:rPr>
+          <w:bCs/>
+          <w:b/>
+        </w:rPr>
+        <w:t xml:space="preserve">−1 to the roll</w:t>
+      </w:r>
+      <w:r>
+        <w:t xml:space="preserve">.</w:t>
       </w:r>
     </w:p>
     <w:tbl>
@@ -6764,7 +6638,7 @@
                 <w:b/>
                 <w:sz w:val="19"/>
               </w:rPr>
-              <w:t xml:space="preserve">Boxes marked</w:t>
+              <w:t xml:space="preserve">Boost</w:t>
             </w:r>
           </w:p>
         </w:tc>
@@ -6782,7 +6656,7 @@
                 <w:b/>
                 <w:sz w:val="19"/>
               </w:rPr>
-              <w:t xml:space="preserve">Condition</w:t>
+              <w:t xml:space="preserve">One Boost</w:t>
             </w:r>
           </w:p>
         </w:tc>
@@ -6800,6 +6674,1136 @@
                 <w:b/>
                 <w:sz w:val="19"/>
               </w:rPr>
+              <w:t xml:space="preserve">Two Boosts</w:t>
+            </w:r>
+          </w:p>
+        </w:tc>
+      </w:tr>
+      <w:tr>
+        <w:tc>
+          <w:tcPr/>
+          <w:p>
+            <w:pPr>
+              <w:pStyle w:val="Compact"/>
+              <w:jc w:val="left"/>
+            </w:pPr>
+            <w:r>
+              <w:rPr>
+                <w:bCs/>
+                <w:b/>
+                <w:sz w:val="19"/>
+              </w:rPr>
+              <w:t xml:space="preserve">Harder</w:t>
+            </w:r>
+          </w:p>
+        </w:tc>
+        <w:tc>
+          <w:tcPr/>
+          <w:p>
+            <w:pPr>
+              <w:pStyle w:val="Compact"/>
+              <w:jc w:val="left"/>
+            </w:pPr>
+            <w:r>
+              <w:rPr>
+                <w:sz w:val="19"/>
+              </w:rPr>
+              <w:t xml:space="preserve">+1 box, or the penalty becomes −3</w:t>
+            </w:r>
+          </w:p>
+        </w:tc>
+        <w:tc>
+          <w:tcPr/>
+          <w:p>
+            <w:pPr>
+              <w:pStyle w:val="Compact"/>
+              <w:jc w:val="left"/>
+            </w:pPr>
+            <w:r>
+              <w:rPr>
+                <w:sz w:val="19"/>
+              </w:rPr>
+              <w:t xml:space="preserve">+2 boxes, or −4</w:t>
+            </w:r>
+          </w:p>
+        </w:tc>
+      </w:tr>
+      <w:tr>
+        <w:tc>
+          <w:tcPr/>
+          <w:p>
+            <w:pPr>
+              <w:pStyle w:val="Compact"/>
+              <w:jc w:val="left"/>
+            </w:pPr>
+            <w:r>
+              <w:rPr>
+                <w:bCs/>
+                <w:b/>
+                <w:sz w:val="19"/>
+              </w:rPr>
+              <w:t xml:space="preserve">Wider</w:t>
+            </w:r>
+          </w:p>
+        </w:tc>
+        <w:tc>
+          <w:tcPr/>
+          <w:p>
+            <w:pPr>
+              <w:pStyle w:val="Compact"/>
+              <w:jc w:val="left"/>
+            </w:pPr>
+            <w:r>
+              <w:rPr>
+                <w:sz w:val="19"/>
+              </w:rPr>
+              <w:t xml:space="preserve">A handful of targets</w:t>
+            </w:r>
+          </w:p>
+        </w:tc>
+        <w:tc>
+          <w:tcPr/>
+          <w:p>
+            <w:pPr>
+              <w:pStyle w:val="Compact"/>
+              <w:jc w:val="left"/>
+            </w:pPr>
+            <w:r>
+              <w:rPr>
+                <w:sz w:val="19"/>
+              </w:rPr>
+              <w:t xml:space="preserve">A crowd, or an area</w:t>
+            </w:r>
+          </w:p>
+        </w:tc>
+      </w:tr>
+      <w:tr>
+        <w:tc>
+          <w:tcPr/>
+          <w:p>
+            <w:pPr>
+              <w:pStyle w:val="Compact"/>
+              <w:jc w:val="left"/>
+            </w:pPr>
+            <w:r>
+              <w:rPr>
+                <w:bCs/>
+                <w:b/>
+                <w:sz w:val="19"/>
+              </w:rPr>
+              <w:t xml:space="preserve">Longer</w:t>
+            </w:r>
+          </w:p>
+        </w:tc>
+        <w:tc>
+          <w:tcPr/>
+          <w:p>
+            <w:pPr>
+              <w:pStyle w:val="Compact"/>
+              <w:jc w:val="left"/>
+            </w:pPr>
+            <w:r>
+              <w:rPr>
+                <w:sz w:val="19"/>
+              </w:rPr>
+              <w:t xml:space="preserve">A day</w:t>
+            </w:r>
+          </w:p>
+        </w:tc>
+        <w:tc>
+          <w:tcPr/>
+          <w:p>
+            <w:pPr>
+              <w:pStyle w:val="Compact"/>
+              <w:jc w:val="left"/>
+            </w:pPr>
+            <w:r>
+              <w:rPr>
+                <w:sz w:val="19"/>
+              </w:rPr>
+              <w:t xml:space="preserve">Until it’s lifted</w:t>
+            </w:r>
+          </w:p>
+        </w:tc>
+      </w:tr>
+      <w:tr>
+        <w:tc>
+          <w:tcPr/>
+          <w:p>
+            <w:pPr>
+              <w:pStyle w:val="Compact"/>
+              <w:jc w:val="left"/>
+            </w:pPr>
+            <w:r>
+              <w:rPr>
+                <w:bCs/>
+                <w:b/>
+                <w:sz w:val="19"/>
+              </w:rPr>
+              <w:t xml:space="preserve">Farther</w:t>
+            </w:r>
+          </w:p>
+        </w:tc>
+        <w:tc>
+          <w:tcPr/>
+          <w:p>
+            <w:pPr>
+              <w:pStyle w:val="Compact"/>
+              <w:jc w:val="left"/>
+            </w:pPr>
+            <w:r>
+              <w:rPr>
+                <w:sz w:val="19"/>
+              </w:rPr>
+              <w:t xml:space="preserve">One range band farther</w:t>
+            </w:r>
+          </w:p>
+        </w:tc>
+        <w:tc>
+          <w:tcPr/>
+          <w:p>
+            <w:pPr>
+              <w:pStyle w:val="Compact"/>
+              <w:jc w:val="left"/>
+            </w:pPr>
+            <w:r>
+              <w:rPr>
+                <w:sz w:val="19"/>
+              </w:rPr>
+              <w:t xml:space="preserve">Two bands farther</w:t>
+            </w:r>
+          </w:p>
+        </w:tc>
+      </w:tr>
+    </w:tbl>
+    <w:p/>
+    <w:tbl>
+      <w:tblPr>
+        <w:tblStyle w:val="Table"/>
+        <w:tblW w:type="pct" w:w="5000"/>
+        <w:tblLook w:firstRow="1" w:lastRow="0" w:firstColumn="0" w:lastColumn="0" w:noHBand="0" w:noVBand="0" w:val="0020"/>
+        <w:jc w:val="start"/>
+        <w:tblBorders>
+          <w:top w:val="single" w:sz="4" w:color="B8C2D3"/>
+          <w:left w:val="single" w:sz="4" w:color="B8C2D3"/>
+          <w:bottom w:val="single" w:sz="4" w:color="B8C2D3"/>
+          <w:right w:val="single" w:sz="4" w:color="B8C2D3"/>
+          <w:insideH w:val="single" w:sz="4" w:color="B8C2D3"/>
+          <w:insideV w:val="single" w:sz="4" w:color="B8C2D3"/>
+        </w:tblBorders>
+      </w:tblPr>
+      <w:tblGrid>
+        <w:gridCol w:w="3960"/>
+        <w:gridCol w:w="3960"/>
+      </w:tblGrid>
+      <w:tr>
+        <w:trPr>
+          <w:tblHeader w:val="true"/>
+        </w:trPr>
+        <w:tc>
+          <w:tcPr>
+            <w:shd w:val="clear" w:fill="F1E6D2"/>
+          </w:tcPr>
+          <w:p>
+            <w:pPr>
+              <w:pStyle w:val="Compact"/>
+              <w:jc w:val="left"/>
+            </w:pPr>
+            <w:r>
+              <w:rPr>
+                <w:b/>
+                <w:sz w:val="19"/>
+              </w:rPr>
+              <w:t xml:space="preserve">Spell</w:t>
+            </w:r>
+          </w:p>
+        </w:tc>
+        <w:tc>
+          <w:tcPr>
+            <w:shd w:val="clear" w:fill="F1E6D2"/>
+          </w:tcPr>
+          <w:p>
+            <w:pPr>
+              <w:pStyle w:val="Compact"/>
+              <w:jc w:val="left"/>
+            </w:pPr>
+            <w:r>
+              <w:rPr>
+                <w:b/>
+                <w:sz w:val="19"/>
+              </w:rPr>
+              <w:t xml:space="preserve">Base effect</w:t>
+            </w:r>
+          </w:p>
+        </w:tc>
+      </w:tr>
+      <w:tr>
+        <w:tc>
+          <w:tcPr/>
+          <w:p>
+            <w:pPr>
+              <w:pStyle w:val="Compact"/>
+              <w:jc w:val="left"/>
+            </w:pPr>
+            <w:r>
+              <w:rPr>
+                <w:b/>
+                <w:sz w:val="19"/>
+              </w:rPr>
+              <w:t xml:space="preserve">Flame</w:t>
+            </w:r>
+          </w:p>
+        </w:tc>
+        <w:tc>
+          <w:tcPr/>
+          <w:p>
+            <w:pPr>
+              <w:pStyle w:val="Compact"/>
+              <w:jc w:val="left"/>
+            </w:pPr>
+            <w:r>
+              <w:rPr>
+                <w:sz w:val="19"/>
+              </w:rPr>
+              <w:t xml:space="preserve">A lash of fire at Short range; marks 2 boxes. Dodge applies.</w:t>
+            </w:r>
+          </w:p>
+        </w:tc>
+      </w:tr>
+      <w:tr>
+        <w:tc>
+          <w:tcPr/>
+          <w:p>
+            <w:pPr>
+              <w:pStyle w:val="Compact"/>
+              <w:jc w:val="left"/>
+            </w:pPr>
+            <w:r>
+              <w:rPr>
+                <w:b/>
+                <w:sz w:val="19"/>
+              </w:rPr>
+              <w:t xml:space="preserve">Force</w:t>
+            </w:r>
+          </w:p>
+        </w:tc>
+        <w:tc>
+          <w:tcPr/>
+          <w:p>
+            <w:pPr>
+              <w:pStyle w:val="Compact"/>
+              <w:jc w:val="left"/>
+            </w:pPr>
+            <w:r>
+              <w:rPr>
+                <w:sz w:val="19"/>
+              </w:rPr>
+              <w:t xml:space="preserve">Unseen force hurls the target down: 1 box, and they lose their next move (Body resists).</w:t>
+            </w:r>
+          </w:p>
+        </w:tc>
+      </w:tr>
+      <w:tr>
+        <w:tc>
+          <w:tcPr/>
+          <w:p>
+            <w:pPr>
+              <w:pStyle w:val="Compact"/>
+              <w:jc w:val="left"/>
+            </w:pPr>
+            <w:r>
+              <w:rPr>
+                <w:b/>
+                <w:sz w:val="19"/>
+              </w:rPr>
+              <w:t xml:space="preserve">Ward</w:t>
+            </w:r>
+          </w:p>
+        </w:tc>
+        <w:tc>
+          <w:tcPr/>
+          <w:p>
+            <w:pPr>
+              <w:pStyle w:val="Compact"/>
+              <w:jc w:val="left"/>
+            </w:pPr>
+            <w:r>
+              <w:rPr>
+                <w:sz w:val="19"/>
+              </w:rPr>
+              <w:t xml:space="preserve">Attacks against one ally are at −2 for the scene.</w:t>
+            </w:r>
+          </w:p>
+        </w:tc>
+      </w:tr>
+      <w:tr>
+        <w:tc>
+          <w:tcPr/>
+          <w:p>
+            <w:pPr>
+              <w:pStyle w:val="Compact"/>
+              <w:jc w:val="left"/>
+            </w:pPr>
+            <w:r>
+              <w:rPr>
+                <w:b/>
+                <w:sz w:val="19"/>
+              </w:rPr>
+              <w:t xml:space="preserve">Fluch</w:t>
+            </w:r>
+          </w:p>
+        </w:tc>
+        <w:tc>
+          <w:tcPr/>
+          <w:p>
+            <w:pPr>
+              <w:pStyle w:val="Compact"/>
+              <w:jc w:val="left"/>
+            </w:pPr>
+            <w:r>
+              <w:rPr>
+                <w:sz w:val="19"/>
+              </w:rPr>
+              <w:t xml:space="preserve">The target is at −2 on all rolls for the scene (Will resists).</w:t>
+            </w:r>
+          </w:p>
+        </w:tc>
+      </w:tr>
+      <w:tr>
+        <w:tc>
+          <w:tcPr/>
+          <w:p>
+            <w:pPr>
+              <w:pStyle w:val="Compact"/>
+              <w:jc w:val="left"/>
+            </w:pPr>
+            <w:r>
+              <w:rPr>
+                <w:b/>
+                <w:sz w:val="19"/>
+              </w:rPr>
+              <w:t xml:space="preserve">Bind</w:t>
+            </w:r>
+          </w:p>
+        </w:tc>
+        <w:tc>
+          <w:tcPr/>
+          <w:p>
+            <w:pPr>
+              <w:pStyle w:val="Compact"/>
+              <w:jc w:val="left"/>
+            </w:pPr>
+            <w:r>
+              <w:rPr>
+                <w:sz w:val="19"/>
+              </w:rPr>
+              <w:t xml:space="preserve">The target is held where they stand for the scene, or until they break free (Body resists).</w:t>
+            </w:r>
+          </w:p>
+        </w:tc>
+      </w:tr>
+      <w:tr>
+        <w:tc>
+          <w:tcPr/>
+          <w:p>
+            <w:pPr>
+              <w:pStyle w:val="Compact"/>
+              <w:jc w:val="left"/>
+            </w:pPr>
+            <w:r>
+              <w:rPr>
+                <w:b/>
+                <w:sz w:val="19"/>
+              </w:rPr>
+              <w:t xml:space="preserve">Snuff</w:t>
+            </w:r>
+          </w:p>
+        </w:tc>
+        <w:tc>
+          <w:tcPr/>
+          <w:p>
+            <w:pPr>
+              <w:pStyle w:val="Compact"/>
+              <w:jc w:val="left"/>
+            </w:pPr>
+            <w:r>
+              <w:rPr>
+                <w:sz w:val="19"/>
+              </w:rPr>
+              <w:t xml:space="preserve">Every lamp in a room goes out, or one gun jams; clearing a jam takes an action.</w:t>
+            </w:r>
+          </w:p>
+        </w:tc>
+      </w:tr>
+      <w:tr>
+        <w:tc>
+          <w:tcPr/>
+          <w:p>
+            <w:pPr>
+              <w:pStyle w:val="Compact"/>
+              <w:jc w:val="left"/>
+            </w:pPr>
+            <w:r>
+              <w:rPr>
+                <w:b/>
+                <w:sz w:val="19"/>
+              </w:rPr>
+              <w:t xml:space="preserve">Unmask</w:t>
+            </w:r>
+          </w:p>
+        </w:tc>
+        <w:tc>
+          <w:tcPr/>
+          <w:p>
+            <w:pPr>
+              <w:pStyle w:val="Compact"/>
+              <w:jc w:val="left"/>
+            </w:pPr>
+            <w:r>
+              <w:rPr>
+                <w:sz w:val="19"/>
+              </w:rPr>
+              <w:t xml:space="preserve">A Wesen in sight rolls Will or woges, there and then.</w:t>
+            </w:r>
+          </w:p>
+        </w:tc>
+      </w:tr>
+      <w:tr>
+        <w:tc>
+          <w:tcPr/>
+          <w:p>
+            <w:pPr>
+              <w:pStyle w:val="Compact"/>
+              <w:jc w:val="left"/>
+            </w:pPr>
+            <w:r>
+              <w:rPr>
+                <w:b/>
+                <w:sz w:val="19"/>
+              </w:rPr>
+              <w:t xml:space="preserve">Stanch</w:t>
+            </w:r>
+          </w:p>
+        </w:tc>
+        <w:tc>
+          <w:tcPr/>
+          <w:p>
+            <w:pPr>
+              <w:pStyle w:val="Compact"/>
+              <w:jc w:val="left"/>
+            </w:pPr>
+            <w:r>
+              <w:rPr>
+                <w:sz w:val="19"/>
+              </w:rPr>
+              <w:t xml:space="preserve">Stop the bleeding: clear one injury box, once per wound.</w:t>
+            </w:r>
+          </w:p>
+        </w:tc>
+      </w:tr>
+    </w:tbl>
+    <w:p>
+      <w:pPr>
+        <w:pStyle w:val="BodyText"/>
+      </w:pPr>
+      <w:r>
+        <w:t xml:space="preserve">A failed spell flares where people can see it: mark a box of</w:t>
+      </w:r>
+      <w:r>
+        <w:t xml:space="preserve"> </w:t>
+      </w:r>
+      <w:r>
+        <w:rPr>
+          <w:bCs/>
+          <w:b/>
+        </w:rPr>
+        <w:t xml:space="preserve">Exposure</w:t>
+      </w:r>
+      <w:r>
+        <w:t xml:space="preserve">. A natural 18 marks two, or something answers that shouldn’t.</w:t>
+      </w:r>
+    </w:p>
+    <w:p>
+      <w:pPr>
+        <w:pStyle w:val="BodyText"/>
+      </w:pPr>
+      <w:r>
+        <w:rPr>
+          <w:bCs/>
+          <w:b/>
+        </w:rPr>
+        <w:t xml:space="preserve">Hexenbiests and Zauberbiests</w:t>
+      </w:r>
+      <w:r>
+        <w:t xml:space="preserve"> </w:t>
+      </w:r>
+      <w:r>
+        <w:t xml:space="preserve">work rituals the same way, through their innate magic, in their own style (curses, potions and sendings). Their</w:t>
+      </w:r>
+      <w:r>
+        <w:t xml:space="preserve"> </w:t>
+      </w:r>
+      <w:r>
+        <w:rPr>
+          <w:bCs/>
+          <w:b/>
+        </w:rPr>
+        <w:t xml:space="preserve">telekinesis</w:t>
+      </w:r>
+      <w:r>
+        <w:t xml:space="preserve"> </w:t>
+      </w:r>
+      <w:r>
+        <w:t xml:space="preserve">is their quick magic.</w:t>
+      </w:r>
+    </w:p>
+    <w:p>
+      <w:pPr>
+        <w:pStyle w:val="BodyText"/>
+      </w:pPr>
+      <w:r>
+        <w:rPr>
+          <w:bCs/>
+          <w:b/>
+        </w:rPr>
+        <w:t xml:space="preserve">Magic draws attention.</w:t>
+      </w:r>
+      <w:r>
+        <w:t xml:space="preserve"> </w:t>
+      </w:r>
+      <w:r>
+        <w:t xml:space="preserve">Using it openly can mark a box of</w:t>
+      </w:r>
+      <w:r>
+        <w:t xml:space="preserve"> </w:t>
+      </w:r>
+      <w:r>
+        <w:rPr>
+          <w:bCs/>
+          <w:b/>
+        </w:rPr>
+        <w:t xml:space="preserve">Exposure</w:t>
+      </w:r>
+      <w:r>
+        <w:t xml:space="preserve">, the Order of the Holy Knife hunts known Incantare, and a Grimm gets +1 to sense your magic for each charm or potion you carry.</w:t>
+      </w:r>
+    </w:p>
+    <w:bookmarkEnd w:id="55"/>
+    <w:bookmarkEnd w:id="56"/>
+    <w:bookmarkStart w:id="57" w:name="the-code-of-swabia"/>
+    <w:p>
+      <w:pPr>
+        <w:pStyle w:val="Heading2"/>
+      </w:pPr>
+      <w:r>
+        <w:t xml:space="preserve">The Code of Swabia</w:t>
+      </w:r>
+    </w:p>
+    <w:p>
+      <w:pPr>
+        <w:pStyle w:val="FirstParagraph"/>
+      </w:pPr>
+      <w:r>
+        <w:t xml:space="preserve">The Code of Swabia is the old law between Wesen and the rest of the world, and Grimms are its enforcers. At its heart, Wesen must not reveal themselves to humanity. How far it reaches beyond that, and how mercifully a Grimm enforces it, is a question your characters will answer for themselves.</w:t>
+      </w:r>
+    </w:p>
+    <w:bookmarkEnd w:id="57"/>
+    <w:bookmarkEnd w:id="58"/>
+    <w:bookmarkStart w:id="66" w:name="personal-combat"/>
+    <w:p>
+      <w:pPr>
+        <w:pStyle w:val="Heading1"/>
+      </w:pPr>
+      <w:r>
+        <w:t xml:space="preserve">Personal combat</w:t>
+      </w:r>
+    </w:p>
+    <w:bookmarkStart w:id="59" w:name="turn-order-and-actions"/>
+    <w:p>
+      <w:pPr>
+        <w:pStyle w:val="Heading2"/>
+      </w:pPr>
+      <w:r>
+        <w:t xml:space="preserve">Turn order and actions</w:t>
+      </w:r>
+    </w:p>
+    <w:p>
+      <w:pPr>
+        <w:pStyle w:val="FirstParagraph"/>
+      </w:pPr>
+      <w:r>
+        <w:t xml:space="preserve">Act in descending Agility order. Players choose the order of tied characters; the GM resolves other ties. A round lasts a few seconds. On your turn, move a short distance and take one meaningful action, such as shooting, reloading, helping, or attempting a task.</w:t>
+      </w:r>
+    </w:p>
+    <w:bookmarkEnd w:id="59"/>
+    <w:bookmarkStart w:id="60" w:name="attacking-and-defending"/>
+    <w:p>
+      <w:pPr>
+        <w:pStyle w:val="Heading2"/>
+      </w:pPr>
+      <w:r>
+        <w:t xml:space="preserve">Attacking and defending</w:t>
+      </w:r>
+    </w:p>
+    <w:p>
+      <w:pPr>
+        <w:pStyle w:val="FirstParagraph"/>
+      </w:pPr>
+      <w:r>
+        <w:t xml:space="preserve">Roll Shooting for a ranged attack, Melee for a weapon in hand, or Brawling for fists and grappling. If the attack succeeds, an aware target able to move may attempt Dodge. Dodge is Agility −2, with +1 for Trained Athletics or +2 for Athletics as a Specialty or Expert. Each target gets one Dodge attempt per round. A successful Dodge cancels the hit. Apply injury penalties to Dodge.</w:t>
+      </w:r>
+    </w:p>
+    <w:p>
+      <w:pPr>
+        <w:pStyle w:val="BodyText"/>
+      </w:pPr>
+      <w:r>
+        <w:t xml:space="preserve">Solid cover blocks a shot. Partial cover imposes −2 on the attack. Weapon effects apply after a hit survives any Dodge. Success margin does not increase damage.</w:t>
+      </w:r>
+    </w:p>
+    <w:bookmarkEnd w:id="60"/>
+    <w:bookmarkStart w:id="61" w:name="range"/>
+    <w:p>
+      <w:pPr>
+        <w:pStyle w:val="Heading2"/>
+      </w:pPr>
+      <w:r>
+        <w:t xml:space="preserve">Range</w:t>
+      </w:r>
+    </w:p>
+    <w:p>
+      <w:pPr>
+        <w:pStyle w:val="FirstParagraph"/>
+      </w:pPr>
+      <w:r>
+        <w:t xml:space="preserve">Distances fall into five bands:</w:t>
+      </w:r>
+    </w:p>
+    <w:tbl>
+      <w:tblPr>
+        <w:tblStyle w:val="Table"/>
+        <w:tblW w:type="pct" w:w="5000"/>
+        <w:tblLook w:firstRow="1" w:lastRow="0" w:firstColumn="0" w:lastColumn="0" w:noHBand="0" w:noVBand="0" w:val="0020"/>
+        <w:jc w:val="start"/>
+        <w:tblBorders>
+          <w:top w:val="single" w:sz="4" w:color="B8C2D3"/>
+          <w:left w:val="single" w:sz="4" w:color="B8C2D3"/>
+          <w:bottom w:val="single" w:sz="4" w:color="B8C2D3"/>
+          <w:right w:val="single" w:sz="4" w:color="B8C2D3"/>
+          <w:insideH w:val="single" w:sz="4" w:color="B8C2D3"/>
+          <w:insideV w:val="single" w:sz="4" w:color="B8C2D3"/>
+        </w:tblBorders>
+      </w:tblPr>
+      <w:tblGrid>
+        <w:gridCol w:w="2640"/>
+        <w:gridCol w:w="2640"/>
+        <w:gridCol w:w="2640"/>
+      </w:tblGrid>
+      <w:tr>
+        <w:trPr>
+          <w:tblHeader w:val="true"/>
+        </w:trPr>
+        <w:tc>
+          <w:tcPr>
+            <w:shd w:val="clear" w:fill="F1E6D2"/>
+          </w:tcPr>
+          <w:p>
+            <w:pPr>
+              <w:pStyle w:val="Compact"/>
+              <w:jc w:val="left"/>
+            </w:pPr>
+            <w:r>
+              <w:rPr>
+                <w:b/>
+                <w:sz w:val="19"/>
+              </w:rPr>
+              <w:t xml:space="preserve">Band</w:t>
+            </w:r>
+          </w:p>
+        </w:tc>
+        <w:tc>
+          <w:tcPr>
+            <w:shd w:val="clear" w:fill="F1E6D2"/>
+          </w:tcPr>
+          <w:p>
+            <w:pPr>
+              <w:pStyle w:val="Compact"/>
+              <w:jc w:val="left"/>
+            </w:pPr>
+            <w:r>
+              <w:rPr>
+                <w:b/>
+                <w:sz w:val="19"/>
+              </w:rPr>
+              <w:t xml:space="preserve">Distance</w:t>
+            </w:r>
+          </w:p>
+        </w:tc>
+        <w:tc>
+          <w:tcPr>
+            <w:shd w:val="clear" w:fill="F1E6D2"/>
+          </w:tcPr>
+          <w:p>
+            <w:pPr>
+              <w:pStyle w:val="Compact"/>
+              <w:jc w:val="left"/>
+            </w:pPr>
+            <w:r>
+              <w:rPr>
+                <w:b/>
+                <w:sz w:val="19"/>
+              </w:rPr>
+              <w:t xml:space="preserve">For example</w:t>
+            </w:r>
+          </w:p>
+        </w:tc>
+      </w:tr>
+      <w:tr>
+        <w:tc>
+          <w:tcPr/>
+          <w:p>
+            <w:pPr>
+              <w:pStyle w:val="Compact"/>
+              <w:jc w:val="left"/>
+            </w:pPr>
+            <w:r>
+              <w:rPr>
+                <w:b/>
+                <w:sz w:val="19"/>
+              </w:rPr>
+              <w:t xml:space="preserve">Close</w:t>
+            </w:r>
+          </w:p>
+        </w:tc>
+        <w:tc>
+          <w:tcPr/>
+          <w:p>
+            <w:pPr>
+              <w:pStyle w:val="Compact"/>
+              <w:jc w:val="left"/>
+            </w:pPr>
+            <w:r>
+              <w:rPr>
+                <w:sz w:val="19"/>
+              </w:rPr>
+              <w:t xml:space="preserve">Up to 10 yards</w:t>
+            </w:r>
+          </w:p>
+        </w:tc>
+        <w:tc>
+          <w:tcPr/>
+          <w:p>
+            <w:pPr>
+              <w:pStyle w:val="Compact"/>
+              <w:jc w:val="left"/>
+            </w:pPr>
+            <w:r>
+              <w:rPr>
+                <w:sz w:val="19"/>
+              </w:rPr>
+              <w:t xml:space="preserve">Across a room or a saloon; one move covers it</w:t>
+            </w:r>
+          </w:p>
+        </w:tc>
+      </w:tr>
+      <w:tr>
+        <w:tc>
+          <w:tcPr/>
+          <w:p>
+            <w:pPr>
+              <w:pStyle w:val="Compact"/>
+              <w:jc w:val="left"/>
+            </w:pPr>
+            <w:r>
+              <w:rPr>
+                <w:b/>
+                <w:sz w:val="19"/>
+              </w:rPr>
+              <w:t xml:space="preserve">Short</w:t>
+            </w:r>
+          </w:p>
+        </w:tc>
+        <w:tc>
+          <w:tcPr/>
+          <w:p>
+            <w:pPr>
+              <w:pStyle w:val="Compact"/>
+              <w:jc w:val="left"/>
+            </w:pPr>
+            <w:r>
+              <w:rPr>
+                <w:sz w:val="19"/>
+              </w:rPr>
+              <w:t xml:space="preserve">Up to 50 yards</w:t>
+            </w:r>
+          </w:p>
+        </w:tc>
+        <w:tc>
+          <w:tcPr/>
+          <w:p>
+            <w:pPr>
+              <w:pStyle w:val="Compact"/>
+              <w:jc w:val="left"/>
+            </w:pPr>
+            <w:r>
+              <w:rPr>
+                <w:sz w:val="19"/>
+              </w:rPr>
+              <w:t xml:space="preserve">Across a street or a corral</w:t>
+            </w:r>
+          </w:p>
+        </w:tc>
+      </w:tr>
+      <w:tr>
+        <w:tc>
+          <w:tcPr/>
+          <w:p>
+            <w:pPr>
+              <w:pStyle w:val="Compact"/>
+              <w:jc w:val="left"/>
+            </w:pPr>
+            <w:r>
+              <w:rPr>
+                <w:b/>
+                <w:sz w:val="19"/>
+              </w:rPr>
+              <w:t xml:space="preserve">Medium</w:t>
+            </w:r>
+          </w:p>
+        </w:tc>
+        <w:tc>
+          <w:tcPr/>
+          <w:p>
+            <w:pPr>
+              <w:pStyle w:val="Compact"/>
+              <w:jc w:val="left"/>
+            </w:pPr>
+            <w:r>
+              <w:rPr>
+                <w:sz w:val="19"/>
+              </w:rPr>
+              <w:t xml:space="preserve">Up to 150 yards</w:t>
+            </w:r>
+          </w:p>
+        </w:tc>
+        <w:tc>
+          <w:tcPr/>
+          <w:p>
+            <w:pPr>
+              <w:pStyle w:val="Compact"/>
+              <w:jc w:val="left"/>
+            </w:pPr>
+            <w:r>
+              <w:rPr>
+                <w:sz w:val="19"/>
+              </w:rPr>
+              <w:t xml:space="preserve">Down the length of a town</w:t>
+            </w:r>
+          </w:p>
+        </w:tc>
+      </w:tr>
+      <w:tr>
+        <w:tc>
+          <w:tcPr/>
+          <w:p>
+            <w:pPr>
+              <w:pStyle w:val="Compact"/>
+              <w:jc w:val="left"/>
+            </w:pPr>
+            <w:r>
+              <w:rPr>
+                <w:b/>
+                <w:sz w:val="19"/>
+              </w:rPr>
+              <w:t xml:space="preserve">Long</w:t>
+            </w:r>
+          </w:p>
+        </w:tc>
+        <w:tc>
+          <w:tcPr/>
+          <w:p>
+            <w:pPr>
+              <w:pStyle w:val="Compact"/>
+              <w:jc w:val="left"/>
+            </w:pPr>
+            <w:r>
+              <w:rPr>
+                <w:sz w:val="19"/>
+              </w:rPr>
+              <w:t xml:space="preserve">Up to 500 yards</w:t>
+            </w:r>
+          </w:p>
+        </w:tc>
+        <w:tc>
+          <w:tcPr/>
+          <w:p>
+            <w:pPr>
+              <w:pStyle w:val="Compact"/>
+              <w:jc w:val="left"/>
+            </w:pPr>
+            <w:r>
+              <w:rPr>
+                <w:sz w:val="19"/>
+              </w:rPr>
+              <w:t xml:space="preserve">Across a valley or a river crossing</w:t>
+            </w:r>
+          </w:p>
+        </w:tc>
+      </w:tr>
+      <w:tr>
+        <w:tc>
+          <w:tcPr/>
+          <w:p>
+            <w:pPr>
+              <w:pStyle w:val="Compact"/>
+              <w:jc w:val="left"/>
+            </w:pPr>
+            <w:r>
+              <w:rPr>
+                <w:b/>
+                <w:sz w:val="19"/>
+              </w:rPr>
+              <w:t xml:space="preserve">Extreme</w:t>
+            </w:r>
+          </w:p>
+        </w:tc>
+        <w:tc>
+          <w:tcPr/>
+          <w:p>
+            <w:pPr>
+              <w:pStyle w:val="Compact"/>
+              <w:jc w:val="left"/>
+            </w:pPr>
+            <w:r>
+              <w:rPr>
+                <w:sz w:val="19"/>
+              </w:rPr>
+              <w:t xml:space="preserve">Up to a mile, in line of sight</w:t>
+            </w:r>
+          </w:p>
+        </w:tc>
+        <w:tc>
+          <w:tcPr/>
+          <w:p>
+            <w:pPr>
+              <w:pStyle w:val="Compact"/>
+              <w:jc w:val="left"/>
+            </w:pPr>
+            <w:r>
+              <w:rPr>
+                <w:sz w:val="19"/>
+              </w:rPr>
+              <w:t xml:space="preserve">Ridge to ridge</w:t>
+            </w:r>
+          </w:p>
+        </w:tc>
+      </w:tr>
+    </w:tbl>
+    <w:p>
+      <w:pPr>
+        <w:pStyle w:val="BodyText"/>
+      </w:pPr>
+      <w:r>
+        <w:t xml:space="preserve">Every ranged weapon has an</w:t>
+      </w:r>
+      <w:r>
+        <w:t xml:space="preserve"> </w:t>
+      </w:r>
+      <w:r>
+        <w:rPr>
+          <w:bCs/>
+          <w:b/>
+        </w:rPr>
+        <w:t xml:space="preserve">effective band</w:t>
+      </w:r>
+      <w:r>
+        <w:t xml:space="preserve">, shown in the weapons table. Attacks within it take no penalty. One band beyond it is −2, two bands beyond is −4, and anything farther is out of range. Weapons in hand, claws and fists reach only someone next to you. Your move each turn covers the Close band; give up your action to run and you cover Short.</w:t>
+      </w:r>
+    </w:p>
+    <w:bookmarkEnd w:id="61"/>
+    <w:bookmarkStart w:id="63" w:name="injury"/>
+    <w:p>
+      <w:pPr>
+        <w:pStyle w:val="Heading2"/>
+      </w:pPr>
+      <w:r>
+        <w:t xml:space="preserve">Injury</w:t>
+      </w:r>
+    </w:p>
+    <w:tbl>
+      <w:tblPr>
+        <w:tblStyle w:val="Table"/>
+        <w:tblW w:type="auto" w:w="0"/>
+        <w:tblLook w:firstRow="1" w:lastRow="0" w:firstColumn="0" w:lastColumn="0" w:noHBand="0" w:noVBand="0" w:val="0020"/>
+        <w:jc w:val="start"/>
+        <w:tblBorders>
+          <w:top w:val="single" w:sz="4" w:color="B8C2D3"/>
+          <w:left w:val="single" w:sz="4" w:color="B8C2D3"/>
+          <w:bottom w:val="single" w:sz="4" w:color="B8C2D3"/>
+          <w:right w:val="single" w:sz="4" w:color="B8C2D3"/>
+          <w:insideH w:val="single" w:sz="4" w:color="B8C2D3"/>
+          <w:insideV w:val="single" w:sz="4" w:color="B8C2D3"/>
+        </w:tblBorders>
+      </w:tblPr>
+      <w:tblGrid>
+        <w:gridCol w:w="2640"/>
+        <w:gridCol w:w="2640"/>
+        <w:gridCol w:w="2640"/>
+      </w:tblGrid>
+      <w:tr>
+        <w:trPr>
+          <w:tblHeader w:val="true"/>
+        </w:trPr>
+        <w:tc>
+          <w:tcPr>
+            <w:shd w:val="clear" w:fill="F1E6D2"/>
+          </w:tcPr>
+          <w:p>
+            <w:pPr>
+              <w:pStyle w:val="Compact"/>
+              <w:jc w:val="left"/>
+            </w:pPr>
+            <w:r>
+              <w:rPr>
+                <w:b/>
+                <w:sz w:val="19"/>
+              </w:rPr>
+              <w:t xml:space="preserve">Boxes marked</w:t>
+            </w:r>
+          </w:p>
+        </w:tc>
+        <w:tc>
+          <w:tcPr>
+            <w:shd w:val="clear" w:fill="F1E6D2"/>
+          </w:tcPr>
+          <w:p>
+            <w:pPr>
+              <w:pStyle w:val="Compact"/>
+              <w:jc w:val="left"/>
+            </w:pPr>
+            <w:r>
+              <w:rPr>
+                <w:b/>
+                <w:sz w:val="19"/>
+              </w:rPr>
+              <w:t xml:space="preserve">Condition</w:t>
+            </w:r>
+          </w:p>
+        </w:tc>
+        <w:tc>
+          <w:tcPr>
+            <w:shd w:val="clear" w:fill="F1E6D2"/>
+          </w:tcPr>
+          <w:p>
+            <w:pPr>
+              <w:pStyle w:val="Compact"/>
+              <w:jc w:val="left"/>
+            </w:pPr>
+            <w:r>
+              <w:rPr>
+                <w:b/>
+                <w:sz w:val="19"/>
+              </w:rPr>
               <w:t xml:space="preserve">Effect</w:t>
             </w:r>
           </w:p>
@@ -7006,7 +8010,7 @@
         <w:t xml:space="preserve">Injury penalties replace each other rather than stacking. They apply to movement, attacks, Dodge, and other tasks the injury physically hinders.</w:t>
       </w:r>
     </w:p>
-    <w:bookmarkStart w:id="59" w:name="dying-and-death"/>
+    <w:bookmarkStart w:id="62" w:name="dying-and-death"/>
     <w:p>
       <w:pPr>
         <w:pStyle w:val="Heading3"/>
@@ -7118,9 +8122,9 @@
         <w:t xml:space="preserve">Your protection is avoiding the hit: Dodge, cover, and a Grit point, which reduces a hit by one box.</w:t>
       </w:r>
     </w:p>
-    <w:bookmarkEnd w:id="59"/>
-    <w:bookmarkEnd w:id="60"/>
-    <w:bookmarkStart w:id="61" w:name="weapons-and-damage"/>
+    <w:bookmarkEnd w:id="62"/>
+    <w:bookmarkEnd w:id="63"/>
+    <w:bookmarkStart w:id="64" w:name="weapons-and-damage"/>
     <w:p>
       <w:pPr>
         <w:pStyle w:val="Heading2"/>
@@ -8293,8 +9297,8 @@
         <w:t xml:space="preserve">a Blutbad’s claws leave Deputy Ames Seriously wounded (two boxes). A revolver shot that gets through marks two more, but the track stops at three: Ames is Incapacitated and Dying, and a further 2-box hit would kill. Spending a Grit point on that revolver shot reduces it to one box, leaving Ames at three boxes but, because the hit only marked one, not Dying.</w:t>
       </w:r>
     </w:p>
-    <w:bookmarkEnd w:id="61"/>
-    <w:bookmarkStart w:id="62" w:name="guns-and-ammunition"/>
+    <w:bookmarkEnd w:id="64"/>
+    <w:bookmarkStart w:id="65" w:name="guns-and-ammunition"/>
     <w:p>
       <w:pPr>
         <w:pStyle w:val="Heading2"/>
@@ -8880,9 +9884,9 @@
         <w:t xml:space="preserve">To take someone down without killing them, use fists, a club, a grapple, or knock-out drops from an Apothecary.</w:t>
       </w:r>
     </w:p>
-    <w:bookmarkEnd w:id="62"/>
-    <w:bookmarkEnd w:id="63"/>
-    <w:bookmarkStart w:id="69" w:name="medical-care"/>
+    <w:bookmarkEnd w:id="65"/>
+    <w:bookmarkEnd w:id="66"/>
+    <w:bookmarkStart w:id="72" w:name="medical-care"/>
     <w:p>
       <w:pPr>
         <w:pStyle w:val="Heading1"/>
@@ -8899,7 +9903,7 @@
         <w:t xml:space="preserve">Frontier medicine in 1889 has chloroform, carbolic acid, laudanum and steady hands, and not much else. Wesen heal like humans, and some injuries need remedies from older traditions.</w:t>
       </w:r>
     </w:p>
-    <w:bookmarkStart w:id="64" w:name="diagnosis-and-stabilization"/>
+    <w:bookmarkStart w:id="67" w:name="diagnosis-and-stabilization"/>
     <w:p>
       <w:pPr>
         <w:pStyle w:val="Heading2"/>
@@ -8916,8 +9920,8 @@
         <w:t xml:space="preserve">Roll Medicine when the diagnosis is uncertain or an urgent treatment decision matters. Emergency stabilization takes one action and a successful Medicine roll with a doctor’s bag. It ends Dying and stops deterioration, but removes no boxes.</w:t>
       </w:r>
     </w:p>
-    <w:bookmarkEnd w:id="64"/>
-    <w:bookmarkStart w:id="65" w:name="field-treatment"/>
+    <w:bookmarkEnd w:id="67"/>
+    <w:bookmarkStart w:id="68" w:name="field-treatment"/>
     <w:p>
       <w:pPr>
         <w:pStyle w:val="Heading2"/>
@@ -8934,8 +9938,8 @@
         <w:t xml:space="preserve">With a doctor’s bag and several uninterrupted minutes, successful Medicine removes one injury box; success by 5 or more removes two. Each injury receives one field-treatment attempt; further attempts need changed circumstances.</w:t>
       </w:r>
     </w:p>
-    <w:bookmarkEnd w:id="65"/>
-    <w:bookmarkStart w:id="66" w:name="a-doctors-surgery"/>
+    <w:bookmarkEnd w:id="68"/>
+    <w:bookmarkStart w:id="69" w:name="a-doctors-surgery"/>
     <w:p>
       <w:pPr>
         <w:pStyle w:val="Heading2"/>
@@ -8952,8 +9956,8 @@
         <w:t xml:space="preserve">A proper surgery with instruments, chloroform and a clean table grants +2 to Medicine. A successful treatment removes two boxes; success by 5 or more removes three. Allow the time the operation requires.</w:t>
       </w:r>
     </w:p>
-    <w:bookmarkEnd w:id="66"/>
-    <w:bookmarkStart w:id="67" w:name="remedies-and-poisons"/>
+    <w:bookmarkEnd w:id="69"/>
+    <w:bookmarkStart w:id="70" w:name="remedies-and-poisons"/>
     <w:p>
       <w:pPr>
         <w:pStyle w:val="Heading2"/>
@@ -8970,8 +9974,8 @@
         <w:t xml:space="preserve">Apothecary treats what Medicine can’t: Wesen poisons, curses, magical sickness and Wesen-specific ailments. Finding the right remedy usually means first identifying the cause (Wesen Lore or Occult), then brewing it (Apothecary, with an apothecary kit). A remedy can substitute for field treatment against such harm.</w:t>
       </w:r>
     </w:p>
-    <w:bookmarkEnd w:id="67"/>
-    <w:bookmarkStart w:id="68" w:name="natural-recovery"/>
+    <w:bookmarkEnd w:id="70"/>
+    <w:bookmarkStart w:id="71" w:name="natural-recovery"/>
     <w:p>
       <w:pPr>
         <w:pStyle w:val="Heading2"/>
@@ -9004,9 +10008,9 @@
         <w:t xml:space="preserve">clear one injury box. Rest means no riding, no fighting, nothing strenuous. At three boxes, rest alone clears nothing: treatment must clear the first box.</w:t>
       </w:r>
     </w:p>
-    <w:bookmarkEnd w:id="68"/>
-    <w:bookmarkEnd w:id="69"/>
-    <w:bookmarkStart w:id="73" w:name="grit-points-and-trouble"/>
+    <w:bookmarkEnd w:id="71"/>
+    <w:bookmarkEnd w:id="72"/>
+    <w:bookmarkStart w:id="77" w:name="grit-points-and-trouble"/>
     <w:p>
       <w:pPr>
         <w:pStyle w:val="Heading1"/>
@@ -9015,7 +10019,7 @@
         <w:t xml:space="preserve">Grit points and Trouble</w:t>
       </w:r>
     </w:p>
-    <w:bookmarkStart w:id="70" w:name="using-grit-points"/>
+    <w:bookmarkStart w:id="73" w:name="using-grit-points"/>
     <w:p>
       <w:pPr>
         <w:pStyle w:val="Heading2"/>
@@ -9200,8 +10204,8 @@
         <w:t xml:space="preserve">Gain one point when one of your complications creates a meaningful problem you accept, including a companion complication from a heritage advantage. You can decline the proposed complication without penalty.</w:t>
       </w:r>
     </w:p>
-    <w:bookmarkEnd w:id="70"/>
-    <w:bookmarkStart w:id="71" w:name="trouble"/>
+    <w:bookmarkEnd w:id="73"/>
+    <w:bookmarkStart w:id="74" w:name="trouble"/>
     <w:p>
       <w:pPr>
         <w:pStyle w:val="Heading2"/>
@@ -9502,8 +10506,8 @@
         <w:t xml:space="preserve">Lying low between cases, a good cover story (Deception), or doing the town a public good can clear a box per case.</w:t>
       </w:r>
     </w:p>
-    <w:bookmarkEnd w:id="71"/>
-    <w:bookmarkStart w:id="72" w:name="advancement"/>
+    <w:bookmarkEnd w:id="74"/>
+    <w:bookmarkStart w:id="76" w:name="advancement"/>
     <w:p>
       <w:pPr>
         <w:pStyle w:val="Heading2"/>
@@ -9520,9 +10524,408 @@
         <w:t xml:space="preserve">After a significant case, the GM may authorize one relevant skill to advance from Untrained to Trained or from Trained to Specialty, or allow revision of an advantage or complication. Only an Old hand’s starting skill is Expert; a skill raised later tops out at Specialty (+3) unless they broaden (see Step 3).</w:t>
       </w:r>
     </w:p>
-    <w:bookmarkEnd w:id="72"/>
-    <w:bookmarkEnd w:id="73"/>
-    <w:bookmarkStart w:id="76" w:name="running-cases"/>
+    <w:bookmarkStart w:id="75" w:name="magic-advancement"/>
+    <w:p>
+      <w:pPr>
+        <w:pStyle w:val="Heading3"/>
+      </w:pPr>
+      <w:r>
+        <w:t xml:space="preserve">Magic advancement</w:t>
+      </w:r>
+    </w:p>
+    <w:p>
+      <w:pPr>
+        <w:pStyle w:val="FirstParagraph"/>
+      </w:pPr>
+      <w:r>
+        <w:t xml:space="preserve">After a significant case, an Incantare, Hexenbiest or Zauberbiest can take one of these</w:t>
+      </w:r>
+      <w:r>
+        <w:t xml:space="preserve"> </w:t>
+      </w:r>
+      <w:r>
+        <w:rPr>
+          <w:bCs/>
+          <w:b/>
+        </w:rPr>
+        <w:t xml:space="preserve">instead of a skill step</w:t>
+      </w:r>
+      <w:r>
+        <w:t xml:space="preserve">, with the GM’s approval and a reason from the story.</w:t>
+      </w:r>
+    </w:p>
+    <w:tbl>
+      <w:tblPr>
+        <w:tblStyle w:val="Table"/>
+        <w:tblW w:type="pct" w:w="5000"/>
+        <w:tblLook w:firstRow="1" w:lastRow="0" w:firstColumn="0" w:lastColumn="0" w:noHBand="0" w:noVBand="0" w:val="0020"/>
+        <w:jc w:val="start"/>
+        <w:tblBorders>
+          <w:top w:val="single" w:sz="4" w:color="B8C2D3"/>
+          <w:left w:val="single" w:sz="4" w:color="B8C2D3"/>
+          <w:bottom w:val="single" w:sz="4" w:color="B8C2D3"/>
+          <w:right w:val="single" w:sz="4" w:color="B8C2D3"/>
+          <w:insideH w:val="single" w:sz="4" w:color="B8C2D3"/>
+          <w:insideV w:val="single" w:sz="4" w:color="B8C2D3"/>
+        </w:tblBorders>
+      </w:tblPr>
+      <w:tblGrid>
+        <w:gridCol w:w="2640"/>
+        <w:gridCol w:w="2640"/>
+        <w:gridCol w:w="2640"/>
+      </w:tblGrid>
+      <w:tr>
+        <w:trPr>
+          <w:tblHeader w:val="true"/>
+        </w:trPr>
+        <w:tc>
+          <w:tcPr>
+            <w:shd w:val="clear" w:fill="F1E6D2"/>
+          </w:tcPr>
+          <w:p>
+            <w:pPr>
+              <w:pStyle w:val="Compact"/>
+              <w:jc w:val="left"/>
+            </w:pPr>
+            <w:r>
+              <w:rPr>
+                <w:b/>
+                <w:sz w:val="19"/>
+              </w:rPr>
+              <w:t xml:space="preserve">Option</w:t>
+            </w:r>
+          </w:p>
+        </w:tc>
+        <w:tc>
+          <w:tcPr>
+            <w:shd w:val="clear" w:fill="F1E6D2"/>
+          </w:tcPr>
+          <w:p>
+            <w:pPr>
+              <w:pStyle w:val="Compact"/>
+              <w:jc w:val="left"/>
+            </w:pPr>
+            <w:r>
+              <w:rPr>
+                <w:b/>
+                <w:sz w:val="19"/>
+              </w:rPr>
+              <w:t xml:space="preserve">Effect</w:t>
+            </w:r>
+          </w:p>
+        </w:tc>
+        <w:tc>
+          <w:tcPr>
+            <w:shd w:val="clear" w:fill="F1E6D2"/>
+          </w:tcPr>
+          <w:p>
+            <w:pPr>
+              <w:pStyle w:val="Compact"/>
+              <w:jc w:val="left"/>
+            </w:pPr>
+            <w:r>
+              <w:rPr>
+                <w:b/>
+                <w:sz w:val="19"/>
+              </w:rPr>
+              <w:t xml:space="preserve">Limit</w:t>
+            </w:r>
+          </w:p>
+        </w:tc>
+      </w:tr>
+      <w:tr>
+        <w:tc>
+          <w:tcPr/>
+          <w:p>
+            <w:pPr>
+              <w:pStyle w:val="Compact"/>
+              <w:jc w:val="left"/>
+            </w:pPr>
+            <w:r>
+              <w:rPr>
+                <w:b/>
+                <w:sz w:val="19"/>
+              </w:rPr>
+              <w:t xml:space="preserve">New spell</w:t>
+            </w:r>
+          </w:p>
+        </w:tc>
+        <w:tc>
+          <w:tcPr/>
+          <w:p>
+            <w:pPr>
+              <w:pStyle w:val="Compact"/>
+              <w:jc w:val="left"/>
+            </w:pPr>
+            <w:r>
+              <w:rPr>
+                <w:sz w:val="19"/>
+              </w:rPr>
+              <w:t xml:space="preserve">A Veneficare learns one spell beyond their limit</w:t>
+            </w:r>
+          </w:p>
+        </w:tc>
+        <w:tc>
+          <w:tcPr/>
+          <w:p>
+            <w:pPr>
+              <w:pStyle w:val="Compact"/>
+              <w:jc w:val="left"/>
+            </w:pPr>
+            <w:r>
+              <w:rPr>
+                <w:sz w:val="19"/>
+              </w:rPr>
+              <w:t xml:space="preserve">Up to 2 extra</w:t>
+            </w:r>
+          </w:p>
+        </w:tc>
+      </w:tr>
+      <w:tr>
+        <w:tc>
+          <w:tcPr/>
+          <w:p>
+            <w:pPr>
+              <w:pStyle w:val="Compact"/>
+              <w:jc w:val="left"/>
+            </w:pPr>
+            <w:r>
+              <w:rPr>
+                <w:b/>
+                <w:sz w:val="19"/>
+              </w:rPr>
+              <w:t xml:space="preserve">Deeper spell</w:t>
+            </w:r>
+          </w:p>
+        </w:tc>
+        <w:tc>
+          <w:tcPr/>
+          <w:p>
+            <w:pPr>
+              <w:pStyle w:val="Compact"/>
+              <w:jc w:val="left"/>
+            </w:pPr>
+            <w:r>
+              <w:rPr>
+                <w:sz w:val="19"/>
+              </w:rPr>
+              <w:t xml:space="preserve">One spell you know gets one more Boost</w:t>
+            </w:r>
+          </w:p>
+        </w:tc>
+        <w:tc>
+          <w:tcPr/>
+          <w:p>
+            <w:pPr>
+              <w:pStyle w:val="Compact"/>
+              <w:jc w:val="left"/>
+            </w:pPr>
+            <w:r>
+              <w:rPr>
+                <w:sz w:val="19"/>
+              </w:rPr>
+              <w:t xml:space="preserve">Each spell once</w:t>
+            </w:r>
+          </w:p>
+        </w:tc>
+      </w:tr>
+      <w:tr>
+        <w:tc>
+          <w:tcPr/>
+          <w:p>
+            <w:pPr>
+              <w:pStyle w:val="Compact"/>
+              <w:jc w:val="left"/>
+            </w:pPr>
+            <w:r>
+              <w:rPr>
+                <w:b/>
+                <w:sz w:val="19"/>
+              </w:rPr>
+              <w:t xml:space="preserve">Another charm</w:t>
+            </w:r>
+          </w:p>
+        </w:tc>
+        <w:tc>
+          <w:tcPr/>
+          <w:p>
+            <w:pPr>
+              <w:pStyle w:val="Compact"/>
+              <w:jc w:val="left"/>
+            </w:pPr>
+            <w:r>
+              <w:rPr>
+                <w:sz w:val="19"/>
+              </w:rPr>
+              <w:t xml:space="preserve">Carry one more ready charm</w:t>
+            </w:r>
+          </w:p>
+        </w:tc>
+        <w:tc>
+          <w:tcPr/>
+          <w:p>
+            <w:pPr>
+              <w:pStyle w:val="Compact"/>
+              <w:jc w:val="left"/>
+            </w:pPr>
+            <w:r>
+              <w:rPr>
+                <w:sz w:val="19"/>
+              </w:rPr>
+              <w:t xml:space="preserve">Up to 2 extra</w:t>
+            </w:r>
+          </w:p>
+        </w:tc>
+      </w:tr>
+      <w:tr>
+        <w:tc>
+          <w:tcPr/>
+          <w:p>
+            <w:pPr>
+              <w:pStyle w:val="Compact"/>
+              <w:jc w:val="left"/>
+            </w:pPr>
+            <w:r>
+              <w:rPr>
+                <w:b/>
+                <w:sz w:val="19"/>
+              </w:rPr>
+              <w:t xml:space="preserve">By heart</w:t>
+            </w:r>
+          </w:p>
+        </w:tc>
+        <w:tc>
+          <w:tcPr/>
+          <w:p>
+            <w:pPr>
+              <w:pStyle w:val="Compact"/>
+              <w:jc w:val="left"/>
+            </w:pPr>
+            <w:r>
+              <w:rPr>
+                <w:sz w:val="19"/>
+              </w:rPr>
+              <w:t xml:space="preserve">One kind of ritual takes one fewer segment (minimum 1)</w:t>
+            </w:r>
+          </w:p>
+        </w:tc>
+        <w:tc>
+          <w:tcPr/>
+          <w:p>
+            <w:pPr>
+              <w:pStyle w:val="Compact"/>
+              <w:jc w:val="left"/>
+            </w:pPr>
+            <w:r>
+              <w:rPr>
+                <w:sz w:val="19"/>
+              </w:rPr>
+              <w:t xml:space="preserve">Each kind once</w:t>
+            </w:r>
+          </w:p>
+        </w:tc>
+      </w:tr>
+      <w:tr>
+        <w:tc>
+          <w:tcPr/>
+          <w:p>
+            <w:pPr>
+              <w:pStyle w:val="Compact"/>
+              <w:jc w:val="left"/>
+            </w:pPr>
+            <w:r>
+              <w:rPr>
+                <w:b/>
+                <w:sz w:val="19"/>
+              </w:rPr>
+              <w:t xml:space="preserve">Quicker hand</w:t>
+            </w:r>
+          </w:p>
+        </w:tc>
+        <w:tc>
+          <w:tcPr/>
+          <w:p>
+            <w:pPr>
+              <w:pStyle w:val="Compact"/>
+              <w:jc w:val="left"/>
+            </w:pPr>
+            <w:r>
+              <w:rPr>
+                <w:sz w:val="19"/>
+              </w:rPr>
+              <w:t xml:space="preserve">One ritual you know goes one pace faster: an hour becomes ten minutes, ten minutes one action</w:t>
+            </w:r>
+          </w:p>
+        </w:tc>
+        <w:tc>
+          <w:tcPr/>
+          <w:p>
+            <w:pPr>
+              <w:pStyle w:val="Compact"/>
+              <w:jc w:val="left"/>
+            </w:pPr>
+            <w:r>
+              <w:rPr>
+                <w:sz w:val="19"/>
+              </w:rPr>
+              <w:t xml:space="preserve">Each ritual once</w:t>
+            </w:r>
+          </w:p>
+        </w:tc>
+      </w:tr>
+      <w:tr>
+        <w:tc>
+          <w:tcPr/>
+          <w:p>
+            <w:pPr>
+              <w:pStyle w:val="Compact"/>
+              <w:jc w:val="left"/>
+            </w:pPr>
+            <w:r>
+              <w:rPr>
+                <w:b/>
+                <w:sz w:val="19"/>
+              </w:rPr>
+              <w:t xml:space="preserve">Master of the Lens</w:t>
+            </w:r>
+          </w:p>
+        </w:tc>
+        <w:tc>
+          <w:tcPr/>
+          <w:p>
+            <w:pPr>
+              <w:pStyle w:val="Compact"/>
+              <w:jc w:val="left"/>
+            </w:pPr>
+            <w:r>
+              <w:rPr>
+                <w:sz w:val="19"/>
+              </w:rPr>
+              <w:t xml:space="preserve">Occult becomes Expert (+5)</w:t>
+            </w:r>
+          </w:p>
+        </w:tc>
+        <w:tc>
+          <w:tcPr/>
+          <w:p>
+            <w:pPr>
+              <w:pStyle w:val="Compact"/>
+              <w:jc w:val="left"/>
+            </w:pPr>
+            <w:r>
+              <w:rPr>
+                <w:sz w:val="19"/>
+              </w:rPr>
+              <w:t xml:space="preserve">Once, at the end of a long campaign</w:t>
+            </w:r>
+          </w:p>
+        </w:tc>
+      </w:tr>
+    </w:tbl>
+    <w:bookmarkEnd w:id="75"/>
+    <w:bookmarkEnd w:id="76"/>
+    <w:bookmarkEnd w:id="77"/>
+    <w:bookmarkStart w:id="80" w:name="running-cases"/>
     <w:p>
       <w:pPr>
         <w:pStyle w:val="Heading1"/>
@@ -9531,7 +10934,7 @@
         <w:t xml:space="preserve">Running cases</w:t>
       </w:r>
     </w:p>
-    <w:bookmarkStart w:id="74" w:name="case-seeds"/>
+    <w:bookmarkStart w:id="78" w:name="case-seeds"/>
     <w:p>
       <w:pPr>
         <w:pStyle w:val="Heading2"/>
@@ -11847,8 +13250,8 @@
         </w:tc>
       </w:tr>
     </w:tbl>
-    <w:bookmarkEnd w:id="74"/>
-    <w:bookmarkStart w:id="75" w:name="the-case-journal"/>
+    <w:bookmarkEnd w:id="78"/>
+    <w:bookmarkStart w:id="79" w:name="the-case-journal"/>
     <w:p>
       <w:pPr>
         <w:pStyle w:val="Heading2"/>
@@ -11975,9 +13378,9 @@
         <w:t xml:space="preserve">After a significant case, the GM may authorize one skill step for each character.</w:t>
       </w:r>
     </w:p>
-    <w:bookmarkEnd w:id="75"/>
-    <w:bookmarkEnd w:id="76"/>
-    <w:bookmarkStart w:id="83" w:name="ready-made-characters"/>
+    <w:bookmarkEnd w:id="79"/>
+    <w:bookmarkEnd w:id="80"/>
+    <w:bookmarkStart w:id="87" w:name="ready-made-characters"/>
     <w:p>
       <w:pPr>
         <w:pStyle w:val="Heading1"/>
@@ -11994,7 +13397,7 @@
         <w:t xml:space="preserve">Six characters ready to play. Each follows the creation rules exactly, Edges included, and their connections tie them together.</w:t>
       </w:r>
     </w:p>
-    <w:bookmarkStart w:id="77" w:name="eliza-kessler"/>
+    <w:bookmarkStart w:id="81" w:name="eliza-kessler"/>
     <w:p>
       <w:pPr>
         <w:pStyle w:val="Heading2"/>
@@ -12173,8 +13576,8 @@
         <w:t xml:space="preserve">Gus Brandt cut her down from a lynch mob’s rope before anyone knew what she was.</w:t>
       </w:r>
     </w:p>
-    <w:bookmarkEnd w:id="77"/>
-    <w:bookmarkStart w:id="78" w:name="gus-brandt"/>
+    <w:bookmarkEnd w:id="81"/>
+    <w:bookmarkStart w:id="82" w:name="gus-brandt"/>
     <w:p>
       <w:pPr>
         <w:pStyle w:val="Heading2"/>
@@ -12369,8 +13772,8 @@
         <w:t xml:space="preserve">Owes Roz Vey for the remedies that keep the urge quiet.</w:t>
       </w:r>
     </w:p>
-    <w:bookmarkEnd w:id="78"/>
-    <w:bookmarkStart w:id="79" w:name="roz-vey"/>
+    <w:bookmarkEnd w:id="82"/>
+    <w:bookmarkStart w:id="83" w:name="roz-vey"/>
     <w:p>
       <w:pPr>
         <w:pStyle w:val="Heading2"/>
@@ -12549,8 +13952,8 @@
         <w:t xml:space="preserve">Trades notes with Dr. Whitlock, who still won’t admit some of her remedies work better than his.</w:t>
       </w:r>
     </w:p>
-    <w:bookmarkEnd w:id="79"/>
-    <w:bookmarkStart w:id="80" w:name="dr.-thaddeus-whitlock"/>
+    <w:bookmarkEnd w:id="83"/>
+    <w:bookmarkStart w:id="84" w:name="dr.-thaddeus-whitlock"/>
     <w:p>
       <w:pPr>
         <w:pStyle w:val="Heading2"/>
@@ -12729,8 +14132,8 @@
         <w:t xml:space="preserve">Rode with Silas Thorne’s regiment in the war and has never trusted him since.</w:t>
       </w:r>
     </w:p>
-    <w:bookmarkEnd w:id="80"/>
-    <w:bookmarkStart w:id="81" w:name="cora-ridgeway"/>
+    <w:bookmarkEnd w:id="84"/>
+    <w:bookmarkStart w:id="85" w:name="cora-ridgeway"/>
     <w:p>
       <w:pPr>
         <w:pStyle w:val="Heading2"/>
@@ -12925,8 +14328,8 @@
         <w:t xml:space="preserve">Eliza Kessler taught her what she knows about the hidden world.</w:t>
       </w:r>
     </w:p>
-    <w:bookmarkEnd w:id="81"/>
-    <w:bookmarkStart w:id="82" w:name="silas-thorne"/>
+    <w:bookmarkEnd w:id="85"/>
+    <w:bookmarkStart w:id="86" w:name="silas-thorne"/>
     <w:p>
       <w:pPr>
         <w:pStyle w:val="Heading2"/>
@@ -13105,9 +14508,9 @@
         <w:t xml:space="preserve">Plays cards with Cora every Saturday; she’s the only one who can tell when he’s bluffing.</w:t>
       </w:r>
     </w:p>
-    <w:bookmarkEnd w:id="82"/>
-    <w:bookmarkEnd w:id="83"/>
-    <w:bookmarkStart w:id="84" w:name="threats"/>
+    <w:bookmarkEnd w:id="86"/>
+    <w:bookmarkEnd w:id="87"/>
+    <w:bookmarkStart w:id="88" w:name="threats"/>
     <w:p>
       <w:pPr>
         <w:pStyle w:val="Heading1"/>
@@ -14378,8 +15781,8 @@
         <w:t xml:space="preserve">For a tougher version, add +1 to its targets and one box; for a weaker one, subtract.</w:t>
       </w:r>
     </w:p>
-    <w:bookmarkEnd w:id="84"/>
-    <w:bookmarkStart w:id="85" w:name="advantages"/>
+    <w:bookmarkEnd w:id="88"/>
+    <w:bookmarkStart w:id="89" w:name="advantages"/>
     <w:p>
       <w:pPr>
         <w:pStyle w:val="Heading1"/>
@@ -15135,8 +16538,8 @@
         <w:t xml:space="preserve">A badge is legal authority, not a magic word: Wesen, outlaws and the powers of the hidden world don’t care about it, and it carries a duty. Your superiors can give you orders, and abusing the badge or failing in your duty can cost you it. Law callings (Marshal, Deputy) usually take one, as their advantage or as a second advantage Edge. A Pinkerton detective takes Pinkerton Credentials instead: the agency’s reach and files, but no badge.</w:t>
       </w:r>
     </w:p>
-    <w:bookmarkEnd w:id="85"/>
-    <w:bookmarkStart w:id="107" w:name="heritages"/>
+    <w:bookmarkEnd w:id="89"/>
+    <w:bookmarkStart w:id="111" w:name="heritages"/>
     <w:p>
       <w:pPr>
         <w:pStyle w:val="Heading1"/>
@@ -16541,7 +17944,7 @@
         </w:tc>
       </w:tr>
     </w:tbl>
-    <w:bookmarkStart w:id="86" w:name="core-wesen-rules"/>
+    <w:bookmarkStart w:id="90" w:name="core-wesen-rules"/>
     <w:p>
       <w:pPr>
         <w:pStyle w:val="Heading2"/>
@@ -16853,8 +18256,8 @@
         <w:t xml:space="preserve">means each hit that marks 2 or more boxes marks one fewer, never below 1.</w:t>
       </w:r>
     </w:p>
-    <w:bookmarkEnd w:id="86"/>
-    <w:bookmarkStart w:id="87" w:name="human"/>
+    <w:bookmarkEnd w:id="90"/>
+    <w:bookmarkStart w:id="91" w:name="human"/>
     <w:p>
       <w:pPr>
         <w:pStyle w:val="Heading2"/>
@@ -17099,8 +18502,8 @@
         <w:t xml:space="preserve">Source: No template</w:t>
       </w:r>
     </w:p>
-    <w:bookmarkEnd w:id="87"/>
-    <w:bookmarkStart w:id="88" w:name="bauerschwein"/>
+    <w:bookmarkEnd w:id="91"/>
+    <w:bookmarkStart w:id="92" w:name="bauerschwein"/>
     <w:p>
       <w:pPr>
         <w:pStyle w:val="Heading2"/>
@@ -17405,8 +18808,8 @@
         <w:t xml:space="preserve">Source: No template; adapted from the show.</w:t>
       </w:r>
     </w:p>
-    <w:bookmarkEnd w:id="88"/>
-    <w:bookmarkStart w:id="89" w:name="coyotl"/>
+    <w:bookmarkEnd w:id="92"/>
+    <w:bookmarkStart w:id="93" w:name="coyotl"/>
     <w:p>
       <w:pPr>
         <w:pStyle w:val="Heading2"/>
@@ -17687,8 +19090,8 @@
         <w:t xml:space="preserve">Source: Coyotl template: DX +2, HT +1, ST +2. About 141 points.</w:t>
       </w:r>
     </w:p>
-    <w:bookmarkEnd w:id="89"/>
-    <w:bookmarkStart w:id="90" w:name="eisbiber"/>
+    <w:bookmarkEnd w:id="93"/>
+    <w:bookmarkStart w:id="94" w:name="eisbiber"/>
     <w:p>
       <w:pPr>
         <w:pStyle w:val="Heading2"/>
@@ -17969,8 +19372,8 @@
         <w:t xml:space="preserve">Source: No template; adapted from the show.</w:t>
       </w:r>
     </w:p>
-    <w:bookmarkEnd w:id="90"/>
-    <w:bookmarkStart w:id="91" w:name="fuchsbau"/>
+    <w:bookmarkEnd w:id="94"/>
+    <w:bookmarkStart w:id="95" w:name="fuchsbau"/>
     <w:p>
       <w:pPr>
         <w:pStyle w:val="Heading2"/>
@@ -18313,8 +19716,8 @@
         <w:t xml:space="preserve">Source: Fuchsbau template: IQ +2; Bad Reputation (disreputable among Wesen). About 132 points.</w:t>
       </w:r>
     </w:p>
-    <w:bookmarkEnd w:id="91"/>
-    <w:bookmarkStart w:id="92" w:name="mauzhertz"/>
+    <w:bookmarkEnd w:id="95"/>
+    <w:bookmarkStart w:id="96" w:name="mauzhertz"/>
     <w:p>
       <w:pPr>
         <w:pStyle w:val="Heading2"/>
@@ -18595,8 +19998,8 @@
         <w:t xml:space="preserve">Source: No template; adapted from the show.</w:t>
       </w:r>
     </w:p>
-    <w:bookmarkEnd w:id="92"/>
-    <w:bookmarkStart w:id="93" w:name="steinadler"/>
+    <w:bookmarkEnd w:id="96"/>
+    <w:bookmarkStart w:id="97" w:name="steinadler"/>
     <w:p>
       <w:pPr>
         <w:pStyle w:val="Heading2"/>
@@ -18877,8 +20280,8 @@
         <w:t xml:space="preserve">Source: No template; adapted from the show.</w:t>
       </w:r>
     </w:p>
-    <w:bookmarkEnd w:id="93"/>
-    <w:bookmarkStart w:id="94" w:name="taniwha"/>
+    <w:bookmarkEnd w:id="97"/>
+    <w:bookmarkStart w:id="98" w:name="taniwha"/>
     <w:p>
       <w:pPr>
         <w:pStyle w:val="Heading2"/>
@@ -19211,8 +20614,8 @@
         <w:t xml:space="preserve">Source: Taniwha template (150-point): poison resistance; Dependency (human flesh, seasonal). About 157 points.</w:t>
       </w:r>
     </w:p>
-    <w:bookmarkEnd w:id="94"/>
-    <w:bookmarkStart w:id="95" w:name="ziegevolk"/>
+    <w:bookmarkEnd w:id="98"/>
+    <w:bookmarkStart w:id="99" w:name="ziegevolk"/>
     <w:p>
       <w:pPr>
         <w:pStyle w:val="Heading2"/>
@@ -19493,8 +20896,8 @@
         <w:t xml:space="preserve">Source: No template; adapted from the show.</w:t>
       </w:r>
     </w:p>
-    <w:bookmarkEnd w:id="95"/>
-    <w:bookmarkStart w:id="96" w:name="blutbad"/>
+    <w:bookmarkEnd w:id="99"/>
+    <w:bookmarkStart w:id="100" w:name="blutbad"/>
     <w:p>
       <w:pPr>
         <w:pStyle w:val="Heading2"/>
@@ -19861,8 +21264,8 @@
         <w:t xml:space="preserve">Source: Blutbaad template: DX +3, HT +2, ST +2; Loner; Enemy (Bauerschwein). About 208 points.</w:t>
       </w:r>
     </w:p>
-    <w:bookmarkEnd w:id="96"/>
-    <w:bookmarkStart w:id="97" w:name="grimm"/>
+    <w:bookmarkEnd w:id="100"/>
+    <w:bookmarkStart w:id="101" w:name="grimm"/>
     <w:p>
       <w:pPr>
         <w:pStyle w:val="Heading2"/>
@@ -20779,8 +22182,8 @@
         <w:t xml:space="preserve">Source: Decapitare template: ST, DX, HT +1; Combat Reflexes; Detect (Wesen, Magic); Magic Resistance 7; Talent (Grimm); Reputation (Frightening Decapitare).</w:t>
       </w:r>
     </w:p>
-    <w:bookmarkEnd w:id="97"/>
-    <w:bookmarkStart w:id="98" w:name="incantare"/>
+    <w:bookmarkEnd w:id="101"/>
+    <w:bookmarkStart w:id="102" w:name="incantare"/>
     <w:p>
       <w:pPr>
         <w:pStyle w:val="Heading2"/>
@@ -21354,7 +22757,7 @@
               <w:rPr>
                 <w:sz w:val="19"/>
               </w:rPr>
-              <w:t xml:space="preserve">Quick casting along one or two Paths agreed with the GM (fire and force, say): one roll per action, and each success fills two segments. You can carry only one charm.</w:t>
+              <w:t xml:space="preserve">Casts spells: quick magic in one action and an Occult roll, shaped by one or two Paths agreed with the GM (fire and force, say). Known: Trained 2, Specialty 3, Expert 4. You can carry only one charm.</w:t>
             </w:r>
           </w:p>
         </w:tc>
@@ -21401,8 +22804,8 @@
         <w:t xml:space="preserve">Source: Incantare template: seven Lenses (Ritual Path Magic).</w:t>
       </w:r>
     </w:p>
-    <w:bookmarkEnd w:id="98"/>
-    <w:bookmarkStart w:id="99" w:name="jägerbär"/>
+    <w:bookmarkEnd w:id="102"/>
+    <w:bookmarkStart w:id="103" w:name="jägerbär"/>
     <w:p>
       <w:pPr>
         <w:pStyle w:val="Heading2"/>
@@ -21683,8 +23086,8 @@
         <w:t xml:space="preserve">Source: No template; adapted from the show.</w:t>
       </w:r>
     </w:p>
-    <w:bookmarkEnd w:id="99"/>
-    <w:bookmarkStart w:id="100" w:name="mauvais-dentes"/>
+    <w:bookmarkEnd w:id="103"/>
+    <w:bookmarkStart w:id="104" w:name="mauvais-dentes"/>
     <w:p>
       <w:pPr>
         <w:pStyle w:val="Heading2"/>
@@ -21989,8 +23392,8 @@
         <w:t xml:space="preserve">Source: Mauvais Dentes template: DX +2, HT +3, ST +3; Loner. About 213 points.</w:t>
       </w:r>
     </w:p>
-    <w:bookmarkEnd w:id="100"/>
-    <w:bookmarkStart w:id="101" w:name="naschazer"/>
+    <w:bookmarkEnd w:id="104"/>
+    <w:bookmarkStart w:id="105" w:name="naschazer"/>
     <w:p>
       <w:pPr>
         <w:pStyle w:val="Heading2"/>
@@ -22295,8 +23698,8 @@
         <w:t xml:space="preserve">Source: Naschazer template: HT +4; Dependency and Uncontrollable Appetite (human flesh); Greed; Proud. About 197 points.</w:t>
       </w:r>
     </w:p>
-    <w:bookmarkEnd w:id="101"/>
-    <w:bookmarkStart w:id="102" w:name="skalengeck"/>
+    <w:bookmarkEnd w:id="105"/>
+    <w:bookmarkStart w:id="106" w:name="skalengeck"/>
     <w:p>
       <w:pPr>
         <w:pStyle w:val="Heading2"/>
@@ -22577,8 +23980,8 @@
         <w:t xml:space="preserve">Source: Skalengeck template: no human-form changes. About 189 points.</w:t>
       </w:r>
     </w:p>
-    <w:bookmarkEnd w:id="102"/>
-    <w:bookmarkStart w:id="103" w:name="vallachi"/>
+    <w:bookmarkEnd w:id="106"/>
+    <w:bookmarkStart w:id="107" w:name="vallachi"/>
     <w:p>
       <w:pPr>
         <w:pStyle w:val="Heading2"/>
@@ -22919,8 +24322,8 @@
         <w:t xml:space="preserve">Source: Vallachi template: Attractive; Extended Lifespan; HT +2; Dependency and Uncontrollable Appetite (lifeforce); Weakness (sunlight); Lifebane. About 223 points.</w:t>
       </w:r>
     </w:p>
-    <w:bookmarkEnd w:id="103"/>
-    <w:bookmarkStart w:id="104" w:name="fuchsteufelwild"/>
+    <w:bookmarkEnd w:id="107"/>
+    <w:bookmarkStart w:id="108" w:name="fuchsteufelwild"/>
     <w:p>
       <w:pPr>
         <w:pStyle w:val="Heading2"/>
@@ -23253,8 +24656,8 @@
         <w:t xml:space="preserve">Source: Fuchsteurfelwild template: ST +1, HT +2, IQ +3, Super Jump 5; Obsession (Guess My Name); Bully; Callous; Sadism (now a companion). About 424 points; trimmed to Tier 3.</w:t>
       </w:r>
     </w:p>
-    <w:bookmarkEnd w:id="104"/>
-    <w:bookmarkStart w:id="105" w:name="hexenbiest-or-zauberbiest"/>
+    <w:bookmarkEnd w:id="108"/>
+    <w:bookmarkStart w:id="109" w:name="hexenbiest-or-zauberbiest"/>
     <w:p>
       <w:pPr>
         <w:pStyle w:val="Heading2"/>
@@ -23661,8 +25064,8 @@
         <w:t xml:space="preserve">Source: Hexenbiest and Zauberbiest template: Beautiful/Handsome; Sorcery 5; Ritual Adept 2; Vow (coven traditions). About 279 points.</w:t>
       </w:r>
     </w:p>
-    <w:bookmarkEnd w:id="105"/>
-    <w:bookmarkStart w:id="106" w:name="murcielago"/>
+    <w:bookmarkEnd w:id="109"/>
+    <w:bookmarkStart w:id="110" w:name="murcielago"/>
     <w:p>
       <w:pPr>
         <w:pStyle w:val="Heading2"/>
@@ -23967,9 +25370,9 @@
         <w:t xml:space="preserve">Source: Murcielago template: no human-form changes; Sonic Scream 6, Sonar. About 283 points.</w:t>
       </w:r>
     </w:p>
-    <w:bookmarkEnd w:id="106"/>
-    <w:bookmarkEnd w:id="107"/>
-    <w:bookmarkStart w:id="118" w:name="making-your-own"/>
+    <w:bookmarkEnd w:id="110"/>
+    <w:bookmarkEnd w:id="111"/>
+    <w:bookmarkStart w:id="122" w:name="making-your-own"/>
     <w:p>
       <w:pPr>
         <w:pStyle w:val="Heading1"/>
@@ -24002,7 +25405,7 @@
         <w:t xml:space="preserve">option at the end of each list, and its checklist holds a custom choice to the same rules as everything else.</w:t>
       </w:r>
     </w:p>
-    <w:bookmarkStart w:id="108" w:name="a-custom-calling"/>
+    <w:bookmarkStart w:id="112" w:name="a-custom-calling"/>
     <w:p>
       <w:pPr>
         <w:pStyle w:val="Heading2"/>
@@ -24178,8 +25581,8 @@
         <w:t xml:space="preserve">.</w:t>
       </w:r>
     </w:p>
-    <w:bookmarkEnd w:id="108"/>
-    <w:bookmarkStart w:id="117" w:name="a-custom-heritage"/>
+    <w:bookmarkEnd w:id="112"/>
+    <w:bookmarkStart w:id="121" w:name="a-custom-heritage"/>
     <w:p>
       <w:pPr>
         <w:pStyle w:val="Heading2"/>
@@ -24196,7 +25599,7 @@
         <w:t xml:space="preserve">Build it with the GM, one step at a time.</w:t>
       </w:r>
     </w:p>
-    <w:bookmarkStart w:id="109" w:name="the-concept"/>
+    <w:bookmarkStart w:id="113" w:name="the-concept"/>
     <w:p>
       <w:pPr>
         <w:pStyle w:val="Heading3"/>
@@ -24213,8 +25616,8 @@
         <w:t xml:space="preserve">Two or three sentences: where they come from, what sets them apart, and how others see them. It should be something the heritages in this book don’t already cover.</w:t>
       </w:r>
     </w:p>
-    <w:bookmarkEnd w:id="109"/>
-    <w:bookmarkStart w:id="110" w:name="the-tier"/>
+    <w:bookmarkEnd w:id="113"/>
+    <w:bookmarkStart w:id="114" w:name="the-tier"/>
     <w:p>
       <w:pPr>
         <w:pStyle w:val="Heading3"/>
@@ -24511,8 +25914,8 @@
         <w:t xml:space="preserve">When in doubt, choose the higher tier.</w:t>
       </w:r>
     </w:p>
-    <w:bookmarkEnd w:id="110"/>
-    <w:bookmarkStart w:id="111" w:name="attribute-adjustments"/>
+    <w:bookmarkEnd w:id="114"/>
+    <w:bookmarkStart w:id="115" w:name="attribute-adjustments"/>
     <w:p>
       <w:pPr>
         <w:pStyle w:val="Heading3"/>
@@ -24558,8 +25961,8 @@
         <w:t xml:space="preserve">: a +2 needs a −2 or two −1s. The adjustments move the attribute’s base (+1 starts it at 11) and raise its starting maximum (13 plus the bonus). Most heritages change two to four attributes.</w:t>
       </w:r>
     </w:p>
-    <w:bookmarkEnd w:id="111"/>
-    <w:bookmarkStart w:id="112" w:name="core-rules-tier-1-and-up"/>
+    <w:bookmarkEnd w:id="115"/>
+    <w:bookmarkStart w:id="116" w:name="core-rules-tier-1-and-up"/>
     <w:p>
       <w:pPr>
         <w:pStyle w:val="Heading3"/>
@@ -24576,8 +25979,8 @@
         <w:t xml:space="preserve">One to three short rules that always apply: what they can do (see in the dark, resist cold, a free Trained skill) and what it costs (a weakness, a people’s distrust, a hazard they can’t abide). A strength with no drawback is worth more than it looks, so price it a tier higher.</w:t>
       </w:r>
     </w:p>
-    <w:bookmarkEnd w:id="112"/>
-    <w:bookmarkStart w:id="113" w:name="heritage-advantages"/>
+    <w:bookmarkEnd w:id="116"/>
+    <w:bookmarkStart w:id="117" w:name="heritage-advantages"/>
     <w:p>
       <w:pPr>
         <w:pStyle w:val="Heading3"/>
@@ -24632,8 +26035,8 @@
         <w:t xml:space="preserve">: a problem the trait causes, with a clear trigger and a real consequence, which earns a Grit point when it bites, like any complication. A character takes one advantage, general or heritage, so make them distinct choices.</w:t>
       </w:r>
     </w:p>
-    <w:bookmarkEnd w:id="113"/>
-    <w:bookmarkStart w:id="114" w:name="a-woge-optional-tier-2-or-3"/>
+    <w:bookmarkEnd w:id="117"/>
+    <w:bookmarkStart w:id="118" w:name="a-woge-optional-tier-2-or-3"/>
     <w:p>
       <w:pPr>
         <w:pStyle w:val="Heading3"/>
@@ -24666,8 +26069,8 @@
         <w:t xml:space="preserve">apply.</w:t>
       </w:r>
     </w:p>
-    <w:bookmarkEnd w:id="114"/>
-    <w:bookmarkStart w:id="115" w:name="in-the-creator"/>
+    <w:bookmarkEnd w:id="118"/>
+    <w:bookmarkStart w:id="119" w:name="in-the-creator"/>
     <w:p>
       <w:pPr>
         <w:pStyle w:val="Heading3"/>
@@ -24772,8 +26175,8 @@
         <w:t xml:space="preserve">and enter the advantage and its companion complication.</w:t>
       </w:r>
     </w:p>
-    <w:bookmarkEnd w:id="115"/>
-    <w:bookmarkStart w:id="116" w:name="example"/>
+    <w:bookmarkEnd w:id="119"/>
+    <w:bookmarkStart w:id="120" w:name="example"/>
     <w:p>
       <w:pPr>
         <w:pStyle w:val="Heading3"/>
@@ -24878,10 +26281,10 @@
         <w:t xml:space="preserve">: Wesen recognize their own, and some want you back in the fold; accept the visit at the worst time.</w:t>
       </w:r>
     </w:p>
-    <w:bookmarkEnd w:id="116"/>
-    <w:bookmarkEnd w:id="117"/>
-    <w:bookmarkEnd w:id="118"/>
-    <w:bookmarkStart w:id="119" w:name="complications"/>
+    <w:bookmarkEnd w:id="120"/>
+    <w:bookmarkEnd w:id="121"/>
+    <w:bookmarkEnd w:id="122"/>
+    <w:bookmarkStart w:id="123" w:name="complications"/>
     <w:p>
       <w:pPr>
         <w:pStyle w:val="Heading1"/>
@@ -25685,8 +27088,8 @@
         </w:tc>
       </w:tr>
     </w:tbl>
-    <w:bookmarkEnd w:id="119"/>
-    <w:bookmarkStart w:id="120" w:name="quick-reference"/>
+    <w:bookmarkEnd w:id="123"/>
+    <w:bookmarkStart w:id="124" w:name="quick-reference"/>
     <w:p>
       <w:pPr>
         <w:pStyle w:val="Heading1"/>
@@ -25893,7 +27296,7 @@
         <w:t xml:space="preserve">start each session with two (three with True grit). Reroll, reduce an injury by one box, or establish a small preparation. Earn one from an accepted complication.</w:t>
       </w:r>
     </w:p>
-    <w:bookmarkEnd w:id="120"/>
+    <w:bookmarkEnd w:id="124"/>
     <w:sectPr/>
   </w:body>
 </w:document>

</xml_diff>

<commit_message>
Grimm: Occultist calling, Braucher Lens, and old-country magic
- Occultist joins The Learned (Occult, Wesen Lore, Apothecary, Read People);
  magic still comes from the Incantare heritage, and the creator says so.
- Lenses relabelled: Magi (Scholar-Mage), Phitonissa (Druid), Malifica
  (Hexenmeister), leaving witch and warlock to the Hexenbiest.
- New Braucher Lens (Pow-wow Doctor): healing, protection and hex-breaking,
  with the No Payment complication.
- Himmelsbrief joins the gear list, and the guide gains a section on
  German-American folk magic.

Co-Authored-By: Claude Opus 5.5 <noreply@anthropic.com>
Claude-Session: https://claude.ai/code/session_015SADCFzhKijkC2foUmXrpC
</commit_message>
<xml_diff>
--- a/grimm-west/Grimm_Players_Guide.docx
+++ b/grimm-west/Grimm_Players_Guide.docx
@@ -995,6 +995,69 @@
                 <w:b/>
                 <w:sz w:val="19"/>
               </w:rPr>
+              <w:t xml:space="preserve">Occultist</w:t>
+            </w:r>
+          </w:p>
+        </w:tc>
+        <w:tc>
+          <w:tcPr/>
+          <w:p>
+            <w:pPr>
+              <w:pStyle w:val="Compact"/>
+              <w:jc w:val="left"/>
+            </w:pPr>
+            <w:r>
+              <w:rPr>
+                <w:sz w:val="19"/>
+              </w:rPr>
+              <w:t xml:space="preserve">The Learned</w:t>
+            </w:r>
+          </w:p>
+        </w:tc>
+        <w:tc>
+          <w:tcPr/>
+          <w:p>
+            <w:pPr>
+              <w:pStyle w:val="Compact"/>
+              <w:jc w:val="left"/>
+            </w:pPr>
+            <w:r>
+              <w:rPr>
+                <w:sz w:val="19"/>
+              </w:rPr>
+              <w:t xml:space="preserve">Work the old arts, and know what’s out there</w:t>
+            </w:r>
+          </w:p>
+        </w:tc>
+        <w:tc>
+          <w:tcPr/>
+          <w:p>
+            <w:pPr>
+              <w:pStyle w:val="Compact"/>
+              <w:jc w:val="left"/>
+            </w:pPr>
+            <w:r>
+              <w:rPr>
+                <w:sz w:val="19"/>
+              </w:rPr>
+              <w:t xml:space="preserve">Occult, Wesen Lore, Apothecary, Read People</w:t>
+            </w:r>
+          </w:p>
+        </w:tc>
+      </w:tr>
+      <w:tr>
+        <w:tc>
+          <w:tcPr/>
+          <w:p>
+            <w:pPr>
+              <w:pStyle w:val="Compact"/>
+              <w:jc w:val="left"/>
+            </w:pPr>
+            <w:r>
+              <w:rPr>
+                <w:b/>
+                <w:sz w:val="19"/>
+              </w:rPr>
               <w:t xml:space="preserve">Preacher</w:t>
             </w:r>
           </w:p>
@@ -1298,6 +1361,40 @@
         </w:tc>
       </w:tr>
     </w:tbl>
+    <w:p>
+      <w:pPr>
+        <w:pStyle w:val="BodyText"/>
+      </w:pPr>
+      <w:r>
+        <w:rPr>
+          <w:bCs/>
+          <w:b/>
+        </w:rPr>
+        <w:t xml:space="preserve">Occultists and magic.</w:t>
+      </w:r>
+      <w:r>
+        <w:t xml:space="preserve"> </w:t>
+      </w:r>
+      <w:r>
+        <w:t xml:space="preserve">Magic comes from your heritage, not your calling: an Occultist who is an</w:t>
+      </w:r>
+      <w:r>
+        <w:t xml:space="preserve"> </w:t>
+      </w:r>
+      <w:r>
+        <w:rPr>
+          <w:bCs/>
+          <w:b/>
+        </w:rPr>
+        <w:t xml:space="preserve">Incantare</w:t>
+      </w:r>
+      <w:r>
+        <w:t xml:space="preserve"> </w:t>
+      </w:r>
+      <w:r>
+        <w:t xml:space="preserve">works real magic through their Lens. With any other heritage, an Occultist knows the lore but can’t work the art: a scholar of the occult, a charlatan, or someone still searching for a teacher.</w:t>
+      </w:r>
+    </w:p>
     <w:p>
       <w:pPr>
         <w:pStyle w:val="BodyText"/>
@@ -4977,6 +5074,69 @@
                 <w:b/>
                 <w:sz w:val="19"/>
               </w:rPr>
+              <w:t xml:space="preserve">Himmelsbrief</w:t>
+            </w:r>
+          </w:p>
+        </w:tc>
+        <w:tc>
+          <w:tcPr/>
+          <w:p>
+            <w:pPr>
+              <w:pStyle w:val="Compact"/>
+              <w:jc w:val="left"/>
+            </w:pPr>
+            <w:r>
+              <w:rPr>
+                <w:sz w:val="19"/>
+              </w:rPr>
+              <w:t xml:space="preserve">A</w:t>
+            </w:r>
+            <w:r>
+              <w:rPr>
+                <w:sz w:val="19"/>
+              </w:rPr>
+              <w:t xml:space="preserve"> </w:t>
+            </w:r>
+            <w:r>
+              <w:rPr>
+                <w:sz w:val="19"/>
+              </w:rPr>
+              <w:t xml:space="preserve">“</w:t>
+            </w:r>
+            <w:r>
+              <w:rPr>
+                <w:sz w:val="19"/>
+              </w:rPr>
+              <w:t xml:space="preserve">letter from Heaven</w:t>
+            </w:r>
+            <w:r>
+              <w:rPr>
+                <w:sz w:val="19"/>
+              </w:rPr>
+              <w:t xml:space="preserve">”</w:t>
+            </w:r>
+            <w:r>
+              <w:rPr>
+                <w:sz w:val="19"/>
+              </w:rPr>
+              <w:t xml:space="preserve">, folded small and carried on the body. Once per case, when a bullet hits you, mark one box fewer. Whether it’s the letter or the faith, nobody can say.</w:t>
+            </w:r>
+          </w:p>
+        </w:tc>
+      </w:tr>
+      <w:tr>
+        <w:tc>
+          <w:tcPr/>
+          <w:p>
+            <w:pPr>
+              <w:pStyle w:val="Compact"/>
+              <w:jc w:val="left"/>
+            </w:pPr>
+            <w:r>
+              <w:rPr>
+                <w:b/>
+                <w:sz w:val="19"/>
+              </w:rPr>
               <w:t xml:space="preserve">Grimm’s journals</w:t>
             </w:r>
           </w:p>
@@ -5603,7 +5763,7 @@
     </w:p>
     <w:bookmarkEnd w:id="48"/>
     <w:bookmarkEnd w:id="49"/>
-    <w:bookmarkStart w:id="58" w:name="the-woge-and-the-hidden-world"/>
+    <w:bookmarkStart w:id="59" w:name="the-woge-and-the-hidden-world"/>
     <w:p>
       <w:pPr>
         <w:pStyle w:val="Heading1"/>
@@ -5991,7 +6151,7 @@
     </w:p>
     <w:bookmarkEnd w:id="51"/>
     <w:bookmarkEnd w:id="52"/>
-    <w:bookmarkStart w:id="56" w:name="magic"/>
+    <w:bookmarkStart w:id="57" w:name="magic"/>
     <w:p>
       <w:pPr>
         <w:pStyle w:val="Heading2"/>
@@ -7257,40 +7417,283 @@
         <w:t xml:space="preserve">is their quick magic.</w:t>
       </w:r>
     </w:p>
-    <w:p>
-      <w:pPr>
-        <w:pStyle w:val="BodyText"/>
+    <w:bookmarkEnd w:id="55"/>
+    <w:bookmarkStart w:id="56" w:name="old-country-magic-in-america"/>
+    <w:p>
+      <w:pPr>
+        <w:pStyle w:val="Heading3"/>
+      </w:pPr>
+      <w:r>
+        <w:t xml:space="preserve">Old-country magic in America</w:t>
+      </w:r>
+    </w:p>
+    <w:p>
+      <w:pPr>
+        <w:pStyle w:val="FirstParagraph"/>
+      </w:pPr>
+      <w:r>
+        <w:t xml:space="preserve">The old traditions crossed the ocean with the people who kept them, and many of the Lenses wear American clothes:</w:t>
+      </w:r>
+    </w:p>
+    <w:p>
+      <w:pPr>
+        <w:numPr>
+          <w:ilvl w:val="0"/>
+          <w:numId w:val="1012"/>
+        </w:numPr>
+        <w:pStyle w:val="Compact"/>
       </w:pPr>
       <w:r>
         <w:rPr>
           <w:bCs/>
           <w:b/>
         </w:rPr>
-        <w:t xml:space="preserve">Magic draws attention.</w:t>
-      </w:r>
-      <w:r>
-        <w:t xml:space="preserve"> </w:t>
-      </w:r>
-      <w:r>
-        <w:t xml:space="preserve">Using it openly can mark a box of</w:t>
-      </w:r>
-      <w:r>
-        <w:t xml:space="preserve"> </w:t>
-      </w:r>
+        <w:t xml:space="preserve">Braucherei</w:t>
+      </w:r>
+      <w:r>
+        <w:t xml:space="preserve">, or</w:t>
+      </w:r>
+      <w:r>
+        <w:t xml:space="preserve"> </w:t>
+      </w:r>
+      <w:r>
+        <w:rPr>
+          <w:iCs/>
+          <w:i/>
+        </w:rPr>
+        <w:t xml:space="preserve">pow-wow</w:t>
+      </w:r>
+      <w:r>
+        <w:t xml:space="preserve">: the Pennsylvania Dutch healing craft of spoken charms, prayers and blessed objects, from Hohman’s</w:t>
+      </w:r>
+      <w:r>
+        <w:t xml:space="preserve"> </w:t>
+      </w:r>
+      <w:r>
+        <w:rPr>
+          <w:iCs/>
+          <w:i/>
+        </w:rPr>
+        <w:t xml:space="preserve">The Long Lost Friend</w:t>
+      </w:r>
+      <w:r>
+        <w:t xml:space="preserve"> </w:t>
+      </w:r>
+      <w:r>
+        <w:t xml:space="preserve">(1820). A Braucher heals, protects and breaks hexes, takes no money for it, and passes the craft man to woman and woman to man. It is a Christian craft, and its practitioners would be insulted to be called witches.</w:t>
+      </w:r>
+    </w:p>
+    <w:p>
+      <w:pPr>
+        <w:numPr>
+          <w:ilvl w:val="0"/>
+          <w:numId w:val="1012"/>
+        </w:numPr>
+        <w:pStyle w:val="Compact"/>
+      </w:pPr>
       <w:r>
         <w:rPr>
           <w:bCs/>
           <w:b/>
         </w:rPr>
+        <w:t xml:space="preserve">Hexerei</w:t>
+      </w:r>
+      <w:r>
+        <w:t xml:space="preserve">: Braucherei’s dark mirror. A</w:t>
+      </w:r>
+      <w:r>
+        <w:t xml:space="preserve"> </w:t>
+      </w:r>
+      <w:r>
+        <w:rPr>
+          <w:iCs/>
+          <w:i/>
+        </w:rPr>
+        <w:t xml:space="preserve">Hexenmeister</w:t>
+      </w:r>
+      <w:r>
+        <w:t xml:space="preserve"> </w:t>
+      </w:r>
+      <w:r>
+        <w:t xml:space="preserve">lays curses, or is hired to find and break someone else’s, which makes them both feared and needed. The Malifica Lens.</w:t>
+      </w:r>
+    </w:p>
+    <w:p>
+      <w:pPr>
+        <w:numPr>
+          <w:ilvl w:val="0"/>
+          <w:numId w:val="1012"/>
+        </w:numPr>
+        <w:pStyle w:val="Compact"/>
+      </w:pPr>
+      <w:r>
+        <w:rPr>
+          <w:bCs/>
+          <w:b/>
+        </w:rPr>
+        <w:t xml:space="preserve">The Himmelsbrief</w:t>
+      </w:r>
+      <w:r>
+        <w:t xml:space="preserve">, a</w:t>
+      </w:r>
+      <w:r>
+        <w:t xml:space="preserve"> </w:t>
+      </w:r>
+      <w:r>
+        <w:t xml:space="preserve">“</w:t>
+      </w:r>
+      <w:r>
+        <w:t xml:space="preserve">letter from Heaven</w:t>
+      </w:r>
+      <w:r>
+        <w:t xml:space="preserve">”</w:t>
+      </w:r>
+      <w:r>
+        <w:t xml:space="preserve">: a protective letter carried on the body. Union and Confederate soldiers of German stock carried them against bullets.</w:t>
+      </w:r>
+    </w:p>
+    <w:p>
+      <w:pPr>
+        <w:numPr>
+          <w:ilvl w:val="0"/>
+          <w:numId w:val="1012"/>
+        </w:numPr>
+        <w:pStyle w:val="Compact"/>
+      </w:pPr>
+      <w:r>
+        <w:rPr>
+          <w:bCs/>
+          <w:b/>
+        </w:rPr>
+        <w:t xml:space="preserve">Grimoires</w:t>
+      </w:r>
+      <w:r>
+        <w:t xml:space="preserve">: the</w:t>
+      </w:r>
+      <w:r>
+        <w:t xml:space="preserve"> </w:t>
+      </w:r>
+      <w:r>
+        <w:rPr>
+          <w:iCs/>
+          <w:i/>
+        </w:rPr>
+        <w:t xml:space="preserve">Sixth and Seventh Books of Moses</w:t>
+      </w:r>
+      <w:r>
+        <w:t xml:space="preserve"> </w:t>
+      </w:r>
+      <w:r>
+        <w:t xml:space="preserve">and the</w:t>
+      </w:r>
+      <w:r>
+        <w:t xml:space="preserve"> </w:t>
+      </w:r>
+      <w:r>
+        <w:rPr>
+          <w:iCs/>
+          <w:i/>
+        </w:rPr>
+        <w:t xml:space="preserve">Egyptian Secrets of Albertus Magnus</w:t>
+      </w:r>
+      <w:r>
+        <w:t xml:space="preserve"> </w:t>
+      </w:r>
+      <w:r>
+        <w:t xml:space="preserve">pass from hand to hand in German print. A Magi would kill for a good copy; some have.</w:t>
+      </w:r>
+    </w:p>
+    <w:p>
+      <w:pPr>
+        <w:numPr>
+          <w:ilvl w:val="0"/>
+          <w:numId w:val="1012"/>
+        </w:numPr>
+        <w:pStyle w:val="Compact"/>
+      </w:pPr>
+      <w:r>
+        <w:rPr>
+          <w:bCs/>
+          <w:b/>
+        </w:rPr>
+        <w:t xml:space="preserve">The Pennsylvania mystics</w:t>
+      </w:r>
+      <w:r>
+        <w:t xml:space="preserve">: the Hermits of the Wissahickon and the Ephrata Cloister kept astrology, alchemy and stranger things alive in the last century. A Magi or Chymiater may claim their teacher’s teacher studied there.</w:t>
+      </w:r>
+    </w:p>
+    <w:p>
+      <w:pPr>
+        <w:numPr>
+          <w:ilvl w:val="0"/>
+          <w:numId w:val="1012"/>
+        </w:numPr>
+        <w:pStyle w:val="Compact"/>
+      </w:pPr>
+      <w:r>
+        <w:rPr>
+          <w:bCs/>
+          <w:b/>
+        </w:rPr>
+        <w:t xml:space="preserve">The Druid lodges</w:t>
+      </w:r>
+      <w:r>
+        <w:t xml:space="preserve">: the United Ancient Order of Druids keeps lodges across the West, California most of all. Most members are only there for the fellowship. Not all.</w:t>
+      </w:r>
+    </w:p>
+    <w:p>
+      <w:pPr>
+        <w:numPr>
+          <w:ilvl w:val="0"/>
+          <w:numId w:val="1012"/>
+        </w:numPr>
+        <w:pStyle w:val="Compact"/>
+      </w:pPr>
+      <w:r>
+        <w:rPr>
+          <w:bCs/>
+          <w:b/>
+        </w:rPr>
+        <w:t xml:space="preserve">New arrivals</w:t>
+      </w:r>
+      <w:r>
+        <w:t xml:space="preserve">: German colonists from Russia have been settling Kansas and Nebraska since 1874, and brought their own healers and charm-workers with them.</w:t>
+      </w:r>
+    </w:p>
+    <w:p>
+      <w:pPr>
+        <w:pStyle w:val="FirstParagraph"/>
+      </w:pPr>
+      <w:r>
+        <w:rPr>
+          <w:bCs/>
+          <w:b/>
+        </w:rPr>
+        <w:t xml:space="preserve">Magic draws attention.</w:t>
+      </w:r>
+      <w:r>
+        <w:t xml:space="preserve"> </w:t>
+      </w:r>
+      <w:r>
+        <w:t xml:space="preserve">Using it openly can mark a box of</w:t>
+      </w:r>
+      <w:r>
+        <w:t xml:space="preserve"> </w:t>
+      </w:r>
+      <w:r>
+        <w:rPr>
+          <w:bCs/>
+          <w:b/>
+        </w:rPr>
         <w:t xml:space="preserve">Exposure</w:t>
       </w:r>
       <w:r>
         <w:t xml:space="preserve">, the Order of the Holy Knife hunts known Incantare, and a Grimm gets +1 to sense your magic for each charm or potion you carry.</w:t>
       </w:r>
     </w:p>
-    <w:bookmarkEnd w:id="55"/>
     <w:bookmarkEnd w:id="56"/>
-    <w:bookmarkStart w:id="57" w:name="the-code-of-swabia"/>
+    <w:bookmarkEnd w:id="57"/>
+    <w:bookmarkStart w:id="58" w:name="the-code-of-swabia"/>
     <w:p>
       <w:pPr>
         <w:pStyle w:val="Heading2"/>
@@ -7307,9 +7710,9 @@
         <w:t xml:space="preserve">The Code of Swabia is the old law between Wesen and the rest of the world, and Grimms are its enforcers. At its heart, Wesen must not reveal themselves to humanity. How far it reaches beyond that, and how mercifully a Grimm enforces it, is a question your characters will answer for themselves.</w:t>
       </w:r>
     </w:p>
-    <w:bookmarkEnd w:id="57"/>
     <w:bookmarkEnd w:id="58"/>
-    <w:bookmarkStart w:id="66" w:name="personal-combat"/>
+    <w:bookmarkEnd w:id="59"/>
+    <w:bookmarkStart w:id="67" w:name="personal-combat"/>
     <w:p>
       <w:pPr>
         <w:pStyle w:val="Heading1"/>
@@ -7318,7 +7721,7 @@
         <w:t xml:space="preserve">Personal combat</w:t>
       </w:r>
     </w:p>
-    <w:bookmarkStart w:id="59" w:name="turn-order-and-actions"/>
+    <w:bookmarkStart w:id="60" w:name="turn-order-and-actions"/>
     <w:p>
       <w:pPr>
         <w:pStyle w:val="Heading2"/>
@@ -7335,8 +7738,8 @@
         <w:t xml:space="preserve">Act in descending Agility order. Players choose the order of tied characters; the GM resolves other ties. A round lasts a few seconds. On your turn, move a short distance and take one meaningful action, such as shooting, reloading, helping, or attempting a task.</w:t>
       </w:r>
     </w:p>
-    <w:bookmarkEnd w:id="59"/>
-    <w:bookmarkStart w:id="60" w:name="attacking-and-defending"/>
+    <w:bookmarkEnd w:id="60"/>
+    <w:bookmarkStart w:id="61" w:name="attacking-and-defending"/>
     <w:p>
       <w:pPr>
         <w:pStyle w:val="Heading2"/>
@@ -7361,8 +7764,8 @@
         <w:t xml:space="preserve">Solid cover blocks a shot. Partial cover imposes −2 on the attack. Weapon effects apply after a hit survives any Dodge. Success margin does not increase damage.</w:t>
       </w:r>
     </w:p>
-    <w:bookmarkEnd w:id="60"/>
-    <w:bookmarkStart w:id="61" w:name="range"/>
+    <w:bookmarkEnd w:id="61"/>
+    <w:bookmarkStart w:id="62" w:name="range"/>
     <w:p>
       <w:pPr>
         <w:pStyle w:val="Heading2"/>
@@ -7720,8 +8123,8 @@
         <w:t xml:space="preserve">, shown in the weapons table. Attacks within it take no penalty. One band beyond it is −2, two bands beyond is −4, and anything farther is out of range. Weapons in hand, claws and fists reach only someone next to you. Your move each turn covers the Close band; give up your action to run and you cover Short.</w:t>
       </w:r>
     </w:p>
-    <w:bookmarkEnd w:id="61"/>
-    <w:bookmarkStart w:id="63" w:name="injury"/>
+    <w:bookmarkEnd w:id="62"/>
+    <w:bookmarkStart w:id="64" w:name="injury"/>
     <w:p>
       <w:pPr>
         <w:pStyle w:val="Heading2"/>
@@ -8010,7 +8413,7 @@
         <w:t xml:space="preserve">Injury penalties replace each other rather than stacking. They apply to movement, attacks, Dodge, and other tasks the injury physically hinders.</w:t>
       </w:r>
     </w:p>
-    <w:bookmarkStart w:id="62" w:name="dying-and-death"/>
+    <w:bookmarkStart w:id="63" w:name="dying-and-death"/>
     <w:p>
       <w:pPr>
         <w:pStyle w:val="Heading3"/>
@@ -8023,7 +8426,7 @@
       <w:pPr>
         <w:numPr>
           <w:ilvl w:val="0"/>
-          <w:numId w:val="1012"/>
+          <w:numId w:val="1013"/>
         </w:numPr>
         <w:pStyle w:val="Compact"/>
       </w:pPr>
@@ -8074,7 +8477,7 @@
       <w:pPr>
         <w:numPr>
           <w:ilvl w:val="0"/>
-          <w:numId w:val="1012"/>
+          <w:numId w:val="1013"/>
         </w:numPr>
         <w:pStyle w:val="Compact"/>
       </w:pPr>
@@ -8096,7 +8499,7 @@
       <w:pPr>
         <w:numPr>
           <w:ilvl w:val="0"/>
-          <w:numId w:val="1012"/>
+          <w:numId w:val="1013"/>
         </w:numPr>
         <w:pStyle w:val="Compact"/>
       </w:pPr>
@@ -8122,9 +8525,9 @@
         <w:t xml:space="preserve">Your protection is avoiding the hit: Dodge, cover, and a Grit point, which reduces a hit by one box.</w:t>
       </w:r>
     </w:p>
-    <w:bookmarkEnd w:id="62"/>
     <w:bookmarkEnd w:id="63"/>
-    <w:bookmarkStart w:id="64" w:name="weapons-and-damage"/>
+    <w:bookmarkEnd w:id="64"/>
+    <w:bookmarkStart w:id="65" w:name="weapons-and-damage"/>
     <w:p>
       <w:pPr>
         <w:pStyle w:val="Heading2"/>
@@ -9297,8 +9700,8 @@
         <w:t xml:space="preserve">a Blutbad’s claws leave Deputy Ames Seriously wounded (two boxes). A revolver shot that gets through marks two more, but the track stops at three: Ames is Incapacitated and Dying, and a further 2-box hit would kill. Spending a Grit point on that revolver shot reduces it to one box, leaving Ames at three boxes but, because the hit only marked one, not Dying.</w:t>
       </w:r>
     </w:p>
-    <w:bookmarkEnd w:id="64"/>
-    <w:bookmarkStart w:id="65" w:name="guns-and-ammunition"/>
+    <w:bookmarkEnd w:id="65"/>
+    <w:bookmarkStart w:id="66" w:name="guns-and-ammunition"/>
     <w:p>
       <w:pPr>
         <w:pStyle w:val="Heading2"/>
@@ -9785,7 +10188,7 @@
       <w:pPr>
         <w:numPr>
           <w:ilvl w:val="0"/>
-          <w:numId w:val="1013"/>
+          <w:numId w:val="1014"/>
         </w:numPr>
         <w:pStyle w:val="Compact"/>
       </w:pPr>
@@ -9807,7 +10210,7 @@
       <w:pPr>
         <w:numPr>
           <w:ilvl w:val="0"/>
-          <w:numId w:val="1013"/>
+          <w:numId w:val="1014"/>
         </w:numPr>
         <w:pStyle w:val="Compact"/>
       </w:pPr>
@@ -9858,7 +10261,7 @@
       <w:pPr>
         <w:numPr>
           <w:ilvl w:val="0"/>
-          <w:numId w:val="1013"/>
+          <w:numId w:val="1014"/>
         </w:numPr>
         <w:pStyle w:val="Compact"/>
       </w:pPr>
@@ -9884,9 +10287,9 @@
         <w:t xml:space="preserve">To take someone down without killing them, use fists, a club, a grapple, or knock-out drops from an Apothecary.</w:t>
       </w:r>
     </w:p>
-    <w:bookmarkEnd w:id="65"/>
     <w:bookmarkEnd w:id="66"/>
-    <w:bookmarkStart w:id="72" w:name="medical-care"/>
+    <w:bookmarkEnd w:id="67"/>
+    <w:bookmarkStart w:id="73" w:name="medical-care"/>
     <w:p>
       <w:pPr>
         <w:pStyle w:val="Heading1"/>
@@ -9903,7 +10306,7 @@
         <w:t xml:space="preserve">Frontier medicine in 1889 has chloroform, carbolic acid, laudanum and steady hands, and not much else. Wesen heal like humans, and some injuries need remedies from older traditions.</w:t>
       </w:r>
     </w:p>
-    <w:bookmarkStart w:id="67" w:name="diagnosis-and-stabilization"/>
+    <w:bookmarkStart w:id="68" w:name="diagnosis-and-stabilization"/>
     <w:p>
       <w:pPr>
         <w:pStyle w:val="Heading2"/>
@@ -9920,8 +10323,8 @@
         <w:t xml:space="preserve">Roll Medicine when the diagnosis is uncertain or an urgent treatment decision matters. Emergency stabilization takes one action and a successful Medicine roll with a doctor’s bag. It ends Dying and stops deterioration, but removes no boxes.</w:t>
       </w:r>
     </w:p>
-    <w:bookmarkEnd w:id="67"/>
-    <w:bookmarkStart w:id="68" w:name="field-treatment"/>
+    <w:bookmarkEnd w:id="68"/>
+    <w:bookmarkStart w:id="69" w:name="field-treatment"/>
     <w:p>
       <w:pPr>
         <w:pStyle w:val="Heading2"/>
@@ -9938,8 +10341,8 @@
         <w:t xml:space="preserve">With a doctor’s bag and several uninterrupted minutes, successful Medicine removes one injury box; success by 5 or more removes two. Each injury receives one field-treatment attempt; further attempts need changed circumstances.</w:t>
       </w:r>
     </w:p>
-    <w:bookmarkEnd w:id="68"/>
-    <w:bookmarkStart w:id="69" w:name="a-doctors-surgery"/>
+    <w:bookmarkEnd w:id="69"/>
+    <w:bookmarkStart w:id="70" w:name="a-doctors-surgery"/>
     <w:p>
       <w:pPr>
         <w:pStyle w:val="Heading2"/>
@@ -9956,8 +10359,8 @@
         <w:t xml:space="preserve">A proper surgery with instruments, chloroform and a clean table grants +2 to Medicine. A successful treatment removes two boxes; success by 5 or more removes three. Allow the time the operation requires.</w:t>
       </w:r>
     </w:p>
-    <w:bookmarkEnd w:id="69"/>
-    <w:bookmarkStart w:id="70" w:name="remedies-and-poisons"/>
+    <w:bookmarkEnd w:id="70"/>
+    <w:bookmarkStart w:id="71" w:name="remedies-and-poisons"/>
     <w:p>
       <w:pPr>
         <w:pStyle w:val="Heading2"/>
@@ -9974,8 +10377,8 @@
         <w:t xml:space="preserve">Apothecary treats what Medicine can’t: Wesen poisons, curses, magical sickness and Wesen-specific ailments. Finding the right remedy usually means first identifying the cause (Wesen Lore or Occult), then brewing it (Apothecary, with an apothecary kit). A remedy can substitute for field treatment against such harm.</w:t>
       </w:r>
     </w:p>
-    <w:bookmarkEnd w:id="70"/>
-    <w:bookmarkStart w:id="71" w:name="natural-recovery"/>
+    <w:bookmarkEnd w:id="71"/>
+    <w:bookmarkStart w:id="72" w:name="natural-recovery"/>
     <w:p>
       <w:pPr>
         <w:pStyle w:val="Heading2"/>
@@ -10008,9 +10411,9 @@
         <w:t xml:space="preserve">clear one injury box. Rest means no riding, no fighting, nothing strenuous. At three boxes, rest alone clears nothing: treatment must clear the first box.</w:t>
       </w:r>
     </w:p>
-    <w:bookmarkEnd w:id="71"/>
     <w:bookmarkEnd w:id="72"/>
-    <w:bookmarkStart w:id="77" w:name="grit-points-and-trouble"/>
+    <w:bookmarkEnd w:id="73"/>
+    <w:bookmarkStart w:id="78" w:name="grit-points-and-trouble"/>
     <w:p>
       <w:pPr>
         <w:pStyle w:val="Heading1"/>
@@ -10019,7 +10422,7 @@
         <w:t xml:space="preserve">Grit points and Trouble</w:t>
       </w:r>
     </w:p>
-    <w:bookmarkStart w:id="73" w:name="using-grit-points"/>
+    <w:bookmarkStart w:id="74" w:name="using-grit-points"/>
     <w:p>
       <w:pPr>
         <w:pStyle w:val="Heading2"/>
@@ -10204,8 +10607,8 @@
         <w:t xml:space="preserve">Gain one point when one of your complications creates a meaningful problem you accept, including a companion complication from a heritage advantage. You can decline the proposed complication without penalty.</w:t>
       </w:r>
     </w:p>
-    <w:bookmarkEnd w:id="73"/>
-    <w:bookmarkStart w:id="74" w:name="trouble"/>
+    <w:bookmarkEnd w:id="74"/>
+    <w:bookmarkStart w:id="75" w:name="trouble"/>
     <w:p>
       <w:pPr>
         <w:pStyle w:val="Heading2"/>
@@ -10506,8 +10909,8 @@
         <w:t xml:space="preserve">Lying low between cases, a good cover story (Deception), or doing the town a public good can clear a box per case.</w:t>
       </w:r>
     </w:p>
-    <w:bookmarkEnd w:id="74"/>
-    <w:bookmarkStart w:id="76" w:name="advancement"/>
+    <w:bookmarkEnd w:id="75"/>
+    <w:bookmarkStart w:id="77" w:name="advancement"/>
     <w:p>
       <w:pPr>
         <w:pStyle w:val="Heading2"/>
@@ -10524,7 +10927,7 @@
         <w:t xml:space="preserve">After a significant case, the GM may authorize one relevant skill to advance from Untrained to Trained or from Trained to Specialty, or allow revision of an advantage or complication. Only an Old hand’s starting skill is Expert; a skill raised later tops out at Specialty (+3) unless they broaden (see Step 3).</w:t>
       </w:r>
     </w:p>
-    <w:bookmarkStart w:id="75" w:name="magic-advancement"/>
+    <w:bookmarkStart w:id="76" w:name="magic-advancement"/>
     <w:p>
       <w:pPr>
         <w:pStyle w:val="Heading3"/>
@@ -10922,10 +11325,10 @@
         </w:tc>
       </w:tr>
     </w:tbl>
-    <w:bookmarkEnd w:id="75"/>
     <w:bookmarkEnd w:id="76"/>
     <w:bookmarkEnd w:id="77"/>
-    <w:bookmarkStart w:id="80" w:name="running-cases"/>
+    <w:bookmarkEnd w:id="78"/>
+    <w:bookmarkStart w:id="81" w:name="running-cases"/>
     <w:p>
       <w:pPr>
         <w:pStyle w:val="Heading1"/>
@@ -10934,7 +11337,7 @@
         <w:t xml:space="preserve">Running cases</w:t>
       </w:r>
     </w:p>
-    <w:bookmarkStart w:id="78" w:name="case-seeds"/>
+    <w:bookmarkStart w:id="79" w:name="case-seeds"/>
     <w:p>
       <w:pPr>
         <w:pStyle w:val="Heading2"/>
@@ -13250,8 +13653,8 @@
         </w:tc>
       </w:tr>
     </w:tbl>
-    <w:bookmarkEnd w:id="78"/>
-    <w:bookmarkStart w:id="79" w:name="the-case-journal"/>
+    <w:bookmarkEnd w:id="79"/>
+    <w:bookmarkStart w:id="80" w:name="the-case-journal"/>
     <w:p>
       <w:pPr>
         <w:pStyle w:val="Heading2"/>
@@ -13266,162 +13669,6 @@
       </w:pPr>
       <w:r>
         <w:t xml:space="preserve">End each case with a short journal entry, written together, as the Grimms have always kept their books:</w:t>
-      </w:r>
-    </w:p>
-    <w:p>
-      <w:pPr>
-        <w:numPr>
-          <w:ilvl w:val="0"/>
-          <w:numId w:val="1014"/>
-        </w:numPr>
-        <w:pStyle w:val="Compact"/>
-      </w:pPr>
-      <w:r>
-        <w:rPr>
-          <w:bCs/>
-          <w:b/>
-        </w:rPr>
-        <w:t xml:space="preserve">The case.</w:t>
-      </w:r>
-      <w:r>
-        <w:t xml:space="preserve"> </w:t>
-      </w:r>
-      <w:r>
-        <w:t xml:space="preserve">What happened, and did we resolve it: closed, partly, or failed?</w:t>
-      </w:r>
-    </w:p>
-    <w:p>
-      <w:pPr>
-        <w:numPr>
-          <w:ilvl w:val="0"/>
-          <w:numId w:val="1014"/>
-        </w:numPr>
-        <w:pStyle w:val="Compact"/>
-      </w:pPr>
-      <w:r>
-        <w:rPr>
-          <w:bCs/>
-          <w:b/>
-        </w:rPr>
-        <w:t xml:space="preserve">Who stood out?</w:t>
-      </w:r>
-      <w:r>
-        <w:t xml:space="preserve"> </w:t>
-      </w:r>
-      <w:r>
-        <w:t xml:space="preserve">A moment worth remembering.</w:t>
-      </w:r>
-    </w:p>
-    <w:p>
-      <w:pPr>
-        <w:numPr>
-          <w:ilvl w:val="0"/>
-          <w:numId w:val="1014"/>
-        </w:numPr>
-        <w:pStyle w:val="Compact"/>
-      </w:pPr>
-      <w:r>
-        <w:rPr>
-          <w:bCs/>
-          <w:b/>
-        </w:rPr>
-        <w:t xml:space="preserve">Complications.</w:t>
-      </w:r>
-      <w:r>
-        <w:t xml:space="preserve"> </w:t>
-      </w:r>
-      <w:r>
-        <w:t xml:space="preserve">Which ones came into play, and what did they cost?</w:t>
-      </w:r>
-    </w:p>
-    <w:p>
-      <w:pPr>
-        <w:numPr>
-          <w:ilvl w:val="0"/>
-          <w:numId w:val="1014"/>
-        </w:numPr>
-        <w:pStyle w:val="Compact"/>
-      </w:pPr>
-      <w:r>
-        <w:rPr>
-          <w:bCs/>
-          <w:b/>
-        </w:rPr>
-        <w:t xml:space="preserve">For the books.</w:t>
-      </w:r>
-      <w:r>
-        <w:t xml:space="preserve"> </w:t>
-      </w:r>
-      <w:r>
-        <w:t xml:space="preserve">A new Wesen kind, weakness or custom worth recording.</w:t>
-      </w:r>
-    </w:p>
-    <w:p>
-      <w:pPr>
-        <w:numPr>
-          <w:ilvl w:val="0"/>
-          <w:numId w:val="1014"/>
-        </w:numPr>
-        <w:pStyle w:val="Compact"/>
-      </w:pPr>
-      <w:r>
-        <w:rPr>
-          <w:bCs/>
-          <w:b/>
-        </w:rPr>
-        <w:t xml:space="preserve">Advancement.</w:t>
-      </w:r>
-      <w:r>
-        <w:t xml:space="preserve"> </w:t>
-      </w:r>
-      <w:r>
-        <w:t xml:space="preserve">After a significant case, the GM may authorize one skill step for each character.</w:t>
-      </w:r>
-    </w:p>
-    <w:bookmarkEnd w:id="79"/>
-    <w:bookmarkEnd w:id="80"/>
-    <w:bookmarkStart w:id="87" w:name="ready-made-characters"/>
-    <w:p>
-      <w:pPr>
-        <w:pStyle w:val="Heading1"/>
-      </w:pPr>
-      <w:r>
-        <w:t xml:space="preserve">Ready-made characters</w:t>
-      </w:r>
-    </w:p>
-    <w:p>
-      <w:pPr>
-        <w:pStyle w:val="FirstParagraph"/>
-      </w:pPr>
-      <w:r>
-        <w:t xml:space="preserve">Six characters ready to play. Each follows the creation rules exactly, Edges included, and their connections tie them together.</w:t>
-      </w:r>
-    </w:p>
-    <w:bookmarkStart w:id="81" w:name="eliza-kessler"/>
-    <w:p>
-      <w:pPr>
-        <w:pStyle w:val="Heading2"/>
-      </w:pPr>
-      <w:r>
-        <w:t xml:space="preserve">Eliza Kessler</w:t>
-      </w:r>
-    </w:p>
-    <w:p>
-      <w:pPr>
-        <w:pStyle w:val="FirstParagraph"/>
-      </w:pPr>
-      <w:r>
-        <w:rPr>
-          <w:iCs/>
-          <w:i/>
-        </w:rPr>
-        <w:t xml:space="preserve">Deputy U.S. Marshal, Marshal. Grimm (Tier 2).</w:t>
-      </w:r>
-      <w:r>
-        <w:t xml:space="preserve"> </w:t>
-      </w:r>
-      <w:r>
-        <w:t xml:space="preserve">Wears the badge: the law, and the Code, in one person.</w:t>
       </w:r>
     </w:p>
     <w:p>
@@ -13437,29 +13684,13 @@
           <w:bCs/>
           <w:b/>
         </w:rPr>
-        <w:t xml:space="preserve">Attributes:</w:t>
-      </w:r>
-      <w:r>
-        <w:t xml:space="preserve"> </w:t>
-      </w:r>
-      <w:r>
-        <w:t xml:space="preserve">Body 12, Agility 13, Intellect 10, Presence 8, Will 12.</w:t>
-      </w:r>
-      <w:r>
-        <w:t xml:space="preserve"> </w:t>
-      </w:r>
-      <w:r>
-        <w:rPr>
-          <w:bCs/>
-          <w:b/>
-        </w:rPr>
-        <w:t xml:space="preserve">Dodge</w:t>
-      </w:r>
-      <w:r>
-        <w:t xml:space="preserve"> </w:t>
-      </w:r>
-      <w:r>
-        <w:t xml:space="preserve">12.</w:t>
+        <w:t xml:space="preserve">The case.</w:t>
+      </w:r>
+      <w:r>
+        <w:t xml:space="preserve"> </w:t>
+      </w:r>
+      <w:r>
+        <w:t xml:space="preserve">What happened, and did we resolve it: closed, partly, or failed?</w:t>
       </w:r>
     </w:p>
     <w:p>
@@ -13475,13 +13706,13 @@
           <w:bCs/>
           <w:b/>
         </w:rPr>
-        <w:t xml:space="preserve">Skills:</w:t>
-      </w:r>
-      <w:r>
-        <w:t xml:space="preserve"> </w:t>
-      </w:r>
-      <w:r>
-        <w:t xml:space="preserve">Shooting 16 (Specialty). Trained: Riding 14, Melee 14, Brawling 14, Athletics 13, Investigation 11, Tracking 11, Read People 11, Survival 11, Leadership 9; Wesen Lore 11 (free).</w:t>
+        <w:t xml:space="preserve">Who stood out?</w:t>
+      </w:r>
+      <w:r>
+        <w:t xml:space="preserve"> </w:t>
+      </w:r>
+      <w:r>
+        <w:t xml:space="preserve">A moment worth remembering.</w:t>
       </w:r>
     </w:p>
     <w:p>
@@ -13497,45 +13728,13 @@
           <w:bCs/>
           <w:b/>
         </w:rPr>
-        <w:t xml:space="preserve">Edge:</w:t>
-      </w:r>
-      <w:r>
-        <w:t xml:space="preserve"> </w:t>
-      </w:r>
-      <w:r>
-        <w:t xml:space="preserve">Second advantage: Badge: Deputy U.S. Marshal.</w:t>
-      </w:r>
-      <w:r>
-        <w:t xml:space="preserve"> </w:t>
-      </w:r>
-      <w:r>
-        <w:rPr>
-          <w:bCs/>
-          <w:b/>
-        </w:rPr>
-        <w:t xml:space="preserve">Grimm gift:</w:t>
-      </w:r>
-      <w:r>
-        <w:t xml:space="preserve"> </w:t>
-      </w:r>
-      <w:r>
-        <w:t xml:space="preserve">Keeper of the Books (companion: The Books Must Be Kept).</w:t>
-      </w:r>
-      <w:r>
-        <w:t xml:space="preserve"> </w:t>
-      </w:r>
-      <w:r>
-        <w:rPr>
-          <w:bCs/>
-          <w:b/>
-        </w:rPr>
-        <w:t xml:space="preserve">Complication:</w:t>
-      </w:r>
-      <w:r>
-        <w:t xml:space="preserve"> </w:t>
-      </w:r>
-      <w:r>
-        <w:t xml:space="preserve">Law and Order; trigger: a Wesen suspect could be killed instead of arrested.</w:t>
+        <w:t xml:space="preserve">Complications.</w:t>
+      </w:r>
+      <w:r>
+        <w:t xml:space="preserve"> </w:t>
+      </w:r>
+      <w:r>
+        <w:t xml:space="preserve">Which ones came into play, and what did they cost?</w:t>
       </w:r>
     </w:p>
     <w:p>
@@ -13551,39 +13750,63 @@
           <w:bCs/>
           <w:b/>
         </w:rPr>
-        <w:t xml:space="preserve">Why I stand against the dark:</w:t>
-      </w:r>
-      <w:r>
-        <w:t xml:space="preserve"> </w:t>
-      </w:r>
-      <w:r>
-        <w:t xml:space="preserve">The Grimm blood woke in me, and it came with a duty.</w:t>
-      </w:r>
-      <w:r>
-        <w:t xml:space="preserve"> </w:t>
-      </w:r>
+        <w:t xml:space="preserve">For the books.</w:t>
+      </w:r>
+      <w:r>
+        <w:t xml:space="preserve"> </w:t>
+      </w:r>
+      <w:r>
+        <w:t xml:space="preserve">A new Wesen kind, weakness or custom worth recording.</w:t>
+      </w:r>
+    </w:p>
+    <w:p>
+      <w:pPr>
+        <w:numPr>
+          <w:ilvl w:val="0"/>
+          <w:numId w:val="1015"/>
+        </w:numPr>
+        <w:pStyle w:val="Compact"/>
+      </w:pPr>
       <w:r>
         <w:rPr>
           <w:bCs/>
           <w:b/>
         </w:rPr>
-        <w:t xml:space="preserve">Connection:</w:t>
-      </w:r>
-      <w:r>
-        <w:t xml:space="preserve"> </w:t>
-      </w:r>
-      <w:r>
-        <w:t xml:space="preserve">Gus Brandt cut her down from a lynch mob’s rope before anyone knew what she was.</w:t>
-      </w:r>
-    </w:p>
+        <w:t xml:space="preserve">Advancement.</w:t>
+      </w:r>
+      <w:r>
+        <w:t xml:space="preserve"> </w:t>
+      </w:r>
+      <w:r>
+        <w:t xml:space="preserve">After a significant case, the GM may authorize one skill step for each character.</w:t>
+      </w:r>
+    </w:p>
+    <w:bookmarkEnd w:id="80"/>
     <w:bookmarkEnd w:id="81"/>
-    <w:bookmarkStart w:id="82" w:name="gus-brandt"/>
+    <w:bookmarkStart w:id="88" w:name="ready-made-characters"/>
+    <w:p>
+      <w:pPr>
+        <w:pStyle w:val="Heading1"/>
+      </w:pPr>
+      <w:r>
+        <w:t xml:space="preserve">Ready-made characters</w:t>
+      </w:r>
+    </w:p>
+    <w:p>
+      <w:pPr>
+        <w:pStyle w:val="FirstParagraph"/>
+      </w:pPr>
+      <w:r>
+        <w:t xml:space="preserve">Six characters ready to play. Each follows the creation rules exactly, Edges included, and their connections tie them together.</w:t>
+      </w:r>
+    </w:p>
+    <w:bookmarkStart w:id="82" w:name="eliza-kessler"/>
     <w:p>
       <w:pPr>
         <w:pStyle w:val="Heading2"/>
       </w:pPr>
       <w:r>
-        <w:t xml:space="preserve">Gus Brandt</w:t>
+        <w:t xml:space="preserve">Eliza Kessler</w:t>
       </w:r>
     </w:p>
     <w:p>
@@ -13595,13 +13818,13 @@
           <w:iCs/>
           <w:i/>
         </w:rPr>
-        <w:t xml:space="preserve">Blacksmith and gunsmith, Tinker. Blutbad (Tier 2).</w:t>
-      </w:r>
-      <w:r>
-        <w:t xml:space="preserve"> </w:t>
-      </w:r>
-      <w:r>
-        <w:t xml:space="preserve">Shoes the horses, fixes the guns, and hasn’t hunted in eleven years.</w:t>
+        <w:t xml:space="preserve">Deputy U.S. Marshal, Marshal. Grimm (Tier 2).</w:t>
+      </w:r>
+      <w:r>
+        <w:t xml:space="preserve"> </w:t>
+      </w:r>
+      <w:r>
+        <w:t xml:space="preserve">Wears the badge: the law, and the Code, in one person.</w:t>
       </w:r>
     </w:p>
     <w:p>
@@ -13623,7 +13846,7 @@
         <w:t xml:space="preserve"> </w:t>
       </w:r>
       <w:r>
-        <w:t xml:space="preserve">Body 11, Agility 11, Intellect 13, Presence 10, Will 10.</w:t>
+        <w:t xml:space="preserve">Body 12, Agility 13, Intellect 10, Presence 8, Will 12.</w:t>
       </w:r>
       <w:r>
         <w:t xml:space="preserve"> </w:t>
@@ -13639,23 +13862,7 @@
         <w:t xml:space="preserve"> </w:t>
       </w:r>
       <w:r>
-        <w:t xml:space="preserve">10.</w:t>
-      </w:r>
-      <w:r>
-        <w:t xml:space="preserve"> </w:t>
-      </w:r>
-      <w:r>
-        <w:rPr>
-          <w:bCs/>
-          <w:b/>
-        </w:rPr>
-        <w:t xml:space="preserve">In woge:</w:t>
-      </w:r>
-      <w:r>
-        <w:t xml:space="preserve"> </w:t>
-      </w:r>
-      <w:r>
-        <w:t xml:space="preserve">Body 13, Agility 12; claws and fangs mark 2 boxes.</w:t>
+        <w:t xml:space="preserve">12.</w:t>
       </w:r>
     </w:p>
     <w:p>
@@ -13677,7 +13884,7 @@
         <w:t xml:space="preserve"> </w:t>
       </w:r>
       <w:r>
-        <w:t xml:space="preserve">Tinkering 16 (Specialty). Trained: Tracking 14, Wesen Lore 14, Investigation 14, Survival 14, Read People 14, Brawling 12, Melee 12, Athletics 12, Persuasion 11.</w:t>
+        <w:t xml:space="preserve">Shooting 16 (Specialty). Trained: Riding 14, Melee 14, Brawling 14, Athletics 13, Investigation 11, Tracking 11, Read People 11, Survival 11, Leadership 9; Wesen Lore 11 (free).</w:t>
       </w:r>
     </w:p>
     <w:p>
@@ -13699,7 +13906,7 @@
         <w:t xml:space="preserve"> </w:t>
       </w:r>
       <w:r>
-        <w:t xml:space="preserve">A fine tool: a master gunsmith’s tools (+2 Tinkering).</w:t>
+        <w:t xml:space="preserve">Second advantage: Badge: Deputy U.S. Marshal.</w:t>
       </w:r>
       <w:r>
         <w:t xml:space="preserve"> </w:t>
@@ -13709,13 +13916,13 @@
           <w:bCs/>
           <w:b/>
         </w:rPr>
-        <w:t xml:space="preserve">Advantage:</w:t>
-      </w:r>
-      <w:r>
-        <w:t xml:space="preserve"> </w:t>
-      </w:r>
-      <w:r>
-        <w:t xml:space="preserve">Blutbad Nose (companion: The Bloodlust).</w:t>
+        <w:t xml:space="preserve">Grimm gift:</w:t>
+      </w:r>
+      <w:r>
+        <w:t xml:space="preserve"> </w:t>
+      </w:r>
+      <w:r>
+        <w:t xml:space="preserve">Keeper of the Books (companion: The Books Must Be Kept).</w:t>
       </w:r>
       <w:r>
         <w:t xml:space="preserve"> </w:t>
@@ -13731,7 +13938,7 @@
         <w:t xml:space="preserve"> </w:t>
       </w:r>
       <w:r>
-        <w:t xml:space="preserve">Keeps a Dangerous Secret; trigger: someone from his old pack turns up.</w:t>
+        <w:t xml:space="preserve">Law and Order; trigger: a Wesen suspect could be killed instead of arrested.</w:t>
       </w:r>
     </w:p>
     <w:p>
@@ -13753,7 +13960,7 @@
         <w:t xml:space="preserve"> </w:t>
       </w:r>
       <w:r>
-        <w:t xml:space="preserve">I did harm once. I mean to balance the ledger.</w:t>
+        <w:t xml:space="preserve">The Grimm blood woke in me, and it came with a duty.</w:t>
       </w:r>
       <w:r>
         <w:t xml:space="preserve"> </w:t>
@@ -13769,17 +13976,17 @@
         <w:t xml:space="preserve"> </w:t>
       </w:r>
       <w:r>
-        <w:t xml:space="preserve">Owes Roz Vey for the remedies that keep the urge quiet.</w:t>
+        <w:t xml:space="preserve">Gus Brandt cut her down from a lynch mob’s rope before anyone knew what she was.</w:t>
       </w:r>
     </w:p>
     <w:bookmarkEnd w:id="82"/>
-    <w:bookmarkStart w:id="83" w:name="roz-vey"/>
+    <w:bookmarkStart w:id="83" w:name="gus-brandt"/>
     <w:p>
       <w:pPr>
         <w:pStyle w:val="Heading2"/>
       </w:pPr>
       <w:r>
-        <w:t xml:space="preserve">Roz Vey</w:t>
+        <w:t xml:space="preserve">Gus Brandt</w:t>
       </w:r>
     </w:p>
     <w:p>
@@ -13791,13 +13998,13 @@
           <w:iCs/>
           <w:i/>
         </w:rPr>
-        <w:t xml:space="preserve">Spice and tea merchant, Apothecary. Fuchsbau (Tier 1).</w:t>
-      </w:r>
-      <w:r>
-        <w:t xml:space="preserve"> </w:t>
-      </w:r>
-      <w:r>
-        <w:t xml:space="preserve">Sells tea out front, and other things in the back.</w:t>
+        <w:t xml:space="preserve">Blacksmith and gunsmith, Tinker. Blutbad (Tier 2).</w:t>
+      </w:r>
+      <w:r>
+        <w:t xml:space="preserve"> </w:t>
+      </w:r>
+      <w:r>
+        <w:t xml:space="preserve">Shoes the horses, fixes the guns, and hasn’t hunted in eleven years.</w:t>
       </w:r>
     </w:p>
     <w:p>
@@ -13819,7 +14026,7 @@
         <w:t xml:space="preserve"> </w:t>
       </w:r>
       <w:r>
-        <w:t xml:space="preserve">Body 9, Agility 11, Intellect 13, Presence 12, Will 10.</w:t>
+        <w:t xml:space="preserve">Body 11, Agility 11, Intellect 13, Presence 10, Will 10.</w:t>
       </w:r>
       <w:r>
         <w:t xml:space="preserve"> </w:t>
@@ -13835,7 +14042,23 @@
         <w:t xml:space="preserve"> </w:t>
       </w:r>
       <w:r>
-        <w:t xml:space="preserve">9.</w:t>
+        <w:t xml:space="preserve">10.</w:t>
+      </w:r>
+      <w:r>
+        <w:t xml:space="preserve"> </w:t>
+      </w:r>
+      <w:r>
+        <w:rPr>
+          <w:bCs/>
+          <w:b/>
+        </w:rPr>
+        <w:t xml:space="preserve">In woge:</w:t>
+      </w:r>
+      <w:r>
+        <w:t xml:space="preserve"> </w:t>
+      </w:r>
+      <w:r>
+        <w:t xml:space="preserve">Body 13, Agility 12; claws and fangs mark 2 boxes.</w:t>
       </w:r>
     </w:p>
     <w:p>
@@ -13857,7 +14080,7 @@
         <w:t xml:space="preserve"> </w:t>
       </w:r>
       <w:r>
-        <w:t xml:space="preserve">Apothecary 16 (Specialty). Trained: Medicine 14, Wesen Lore 14, Read People 14, Investigation 14, Gambling 14, Survival 14, Occult 14, Persuasion 13, Deception 13, Stealth 12.</w:t>
+        <w:t xml:space="preserve">Tinkering 16 (Specialty). Trained: Tracking 14, Wesen Lore 14, Investigation 14, Survival 14, Read People 14, Brawling 12, Melee 12, Athletics 12, Persuasion 11.</w:t>
       </w:r>
     </w:p>
     <w:p>
@@ -13873,13 +14096,13 @@
           <w:bCs/>
           <w:b/>
         </w:rPr>
-        <w:t xml:space="preserve">Edges:</w:t>
-      </w:r>
-      <w:r>
-        <w:t xml:space="preserve"> </w:t>
-      </w:r>
-      <w:r>
-        <w:t xml:space="preserve">Extra Trained skill; a friend in town: her cousin Ambrose, a Fuchsbau smuggler on the river docks who can find any ingredient, for a price.</w:t>
+        <w:t xml:space="preserve">Edge:</w:t>
+      </w:r>
+      <w:r>
+        <w:t xml:space="preserve"> </w:t>
+      </w:r>
+      <w:r>
+        <w:t xml:space="preserve">A fine tool: a master gunsmith’s tools (+2 Tinkering).</w:t>
       </w:r>
       <w:r>
         <w:t xml:space="preserve"> </w:t>
@@ -13895,7 +14118,7 @@
         <w:t xml:space="preserve"> </w:t>
       </w:r>
       <w:r>
-        <w:t xml:space="preserve">Fuchsbau Remedies (companion: Criminal Kin).</w:t>
+        <w:t xml:space="preserve">Blutbad Nose (companion: The Bloodlust).</w:t>
       </w:r>
       <w:r>
         <w:t xml:space="preserve"> </w:t>
@@ -13911,7 +14134,7 @@
         <w:t xml:space="preserve"> </w:t>
       </w:r>
       <w:r>
-        <w:t xml:space="preserve">Protects Others at Personal Risk; trigger: a sick or hurt stranger turns up at the shop.</w:t>
+        <w:t xml:space="preserve">Keeps a Dangerous Secret; trigger: someone from his old pack turns up.</w:t>
       </w:r>
     </w:p>
     <w:p>
@@ -13933,7 +14156,7 @@
         <w:t xml:space="preserve"> </w:t>
       </w:r>
       <w:r>
-        <w:t xml:space="preserve">Wesen and humans can live side by side, and I mean to prove it.</w:t>
+        <w:t xml:space="preserve">I did harm once. I mean to balance the ledger.</w:t>
       </w:r>
       <w:r>
         <w:t xml:space="preserve"> </w:t>
@@ -13949,17 +14172,17 @@
         <w:t xml:space="preserve"> </w:t>
       </w:r>
       <w:r>
-        <w:t xml:space="preserve">Trades notes with Dr. Whitlock, who still won’t admit some of her remedies work better than his.</w:t>
+        <w:t xml:space="preserve">Owes Roz Vey for the remedies that keep the urge quiet.</w:t>
       </w:r>
     </w:p>
     <w:bookmarkEnd w:id="83"/>
-    <w:bookmarkStart w:id="84" w:name="dr.-thaddeus-whitlock"/>
+    <w:bookmarkStart w:id="84" w:name="roz-vey"/>
     <w:p>
       <w:pPr>
         <w:pStyle w:val="Heading2"/>
       </w:pPr>
       <w:r>
-        <w:t xml:space="preserve">Dr. Thaddeus Whitlock</w:t>
+        <w:t xml:space="preserve">Roz Vey</w:t>
       </w:r>
     </w:p>
     <w:p>
@@ -13971,13 +14194,13 @@
           <w:iCs/>
           <w:i/>
         </w:rPr>
-        <w:t xml:space="preserve">Town physician, Doctor. Human (Tier 0).</w:t>
-      </w:r>
-      <w:r>
-        <w:t xml:space="preserve"> </w:t>
-      </w:r>
-      <w:r>
-        <w:t xml:space="preserve">Army surgeon in the war; now he digs bullets out of his friends and asks too many questions about what made the other wounds.</w:t>
+        <w:t xml:space="preserve">Spice and tea merchant, Apothecary. Fuchsbau (Tier 1).</w:t>
+      </w:r>
+      <w:r>
+        <w:t xml:space="preserve"> </w:t>
+      </w:r>
+      <w:r>
+        <w:t xml:space="preserve">Sells tea out front, and other things in the back.</w:t>
       </w:r>
     </w:p>
     <w:p>
@@ -13999,7 +14222,7 @@
         <w:t xml:space="preserve"> </w:t>
       </w:r>
       <w:r>
-        <w:t xml:space="preserve">Body 10, Agility 10, Intellect 13, Presence 12, Will 11.</w:t>
+        <w:t xml:space="preserve">Body 9, Agility 11, Intellect 13, Presence 12, Will 10.</w:t>
       </w:r>
       <w:r>
         <w:t xml:space="preserve"> </w:t>
@@ -14015,7 +14238,7 @@
         <w:t xml:space="preserve"> </w:t>
       </w:r>
       <w:r>
-        <w:t xml:space="preserve">8.</w:t>
+        <w:t xml:space="preserve">9.</w:t>
       </w:r>
     </w:p>
     <w:p>
@@ -14037,7 +14260,7 @@
         <w:t xml:space="preserve"> </w:t>
       </w:r>
       <w:r>
-        <w:t xml:space="preserve">Medicine 16 (Specialty). Trained: Apothecary 14, Read People 14, Investigation 14, Wesen Lore 14, Occult 14, Persuasion 13, Leadership 13, Riding 11, Shooting 11.</w:t>
+        <w:t xml:space="preserve">Apothecary 16 (Specialty). Trained: Medicine 14, Wesen Lore 14, Read People 14, Investigation 14, Gambling 14, Survival 14, Occult 14, Persuasion 13, Deception 13, Stealth 12.</w:t>
       </w:r>
     </w:p>
     <w:p>
@@ -14059,7 +14282,7 @@
         <w:t xml:space="preserve"> </w:t>
       </w:r>
       <w:r>
-        <w:t xml:space="preserve">+1 attribute point; second advantage: Battlefield Surgeon; a fine tool: his army surgeon’s instruments (+2 Medicine).</w:t>
+        <w:t xml:space="preserve">Extra Trained skill; a friend in town: her cousin Ambrose, a Fuchsbau smuggler on the river docks who can find any ingredient, for a price.</w:t>
       </w:r>
       <w:r>
         <w:t xml:space="preserve"> </w:t>
@@ -14075,7 +14298,7 @@
         <w:t xml:space="preserve"> </w:t>
       </w:r>
       <w:r>
-        <w:t xml:space="preserve">Steady Hands.</w:t>
+        <w:t xml:space="preserve">Fuchsbau Remedies (companion: Criminal Kin).</w:t>
       </w:r>
       <w:r>
         <w:t xml:space="preserve"> </w:t>
@@ -14091,7 +14314,7 @@
         <w:t xml:space="preserve"> </w:t>
       </w:r>
       <w:r>
-        <w:t xml:space="preserve">Haunted by the War; trigger: gunfire in the dark.</w:t>
+        <w:t xml:space="preserve">Protects Others at Personal Risk; trigger: a sick or hurt stranger turns up at the shop.</w:t>
       </w:r>
     </w:p>
     <w:p>
@@ -14113,7 +14336,7 @@
         <w:t xml:space="preserve"> </w:t>
       </w:r>
       <w:r>
-        <w:t xml:space="preserve">I saw what I saw, and no one else believes me.</w:t>
+        <w:t xml:space="preserve">Wesen and humans can live side by side, and I mean to prove it.</w:t>
       </w:r>
       <w:r>
         <w:t xml:space="preserve"> </w:t>
@@ -14129,17 +14352,17 @@
         <w:t xml:space="preserve"> </w:t>
       </w:r>
       <w:r>
-        <w:t xml:space="preserve">Rode with Silas Thorne’s regiment in the war and has never trusted him since.</w:t>
+        <w:t xml:space="preserve">Trades notes with Dr. Whitlock, who still won’t admit some of her remedies work better than his.</w:t>
       </w:r>
     </w:p>
     <w:bookmarkEnd w:id="84"/>
-    <w:bookmarkStart w:id="85" w:name="cora-ridgeway"/>
+    <w:bookmarkStart w:id="85" w:name="dr.-thaddeus-whitlock"/>
     <w:p>
       <w:pPr>
         <w:pStyle w:val="Heading2"/>
       </w:pPr>
       <w:r>
-        <w:t xml:space="preserve">Cora Ridgeway</w:t>
+        <w:t xml:space="preserve">Dr. Thaddeus Whitlock</w:t>
       </w:r>
     </w:p>
     <w:p>
@@ -14151,13 +14374,13 @@
           <w:iCs/>
           <w:i/>
         </w:rPr>
-        <w:t xml:space="preserve">Scout and sharpshooter, Scout. Coyotl (Tier 1).</w:t>
-      </w:r>
-      <w:r>
-        <w:t xml:space="preserve"> </w:t>
-      </w:r>
-      <w:r>
-        <w:t xml:space="preserve">Knows the plains and the high country, and keeps her clan’s ways close.</w:t>
+        <w:t xml:space="preserve">Town physician, Doctor. Human (Tier 0).</w:t>
+      </w:r>
+      <w:r>
+        <w:t xml:space="preserve"> </w:t>
+      </w:r>
+      <w:r>
+        <w:t xml:space="preserve">Army surgeon in the war; now he digs bullets out of his friends and asks too many questions about what made the other wounds.</w:t>
       </w:r>
     </w:p>
     <w:p>
@@ -14179,7 +14402,7 @@
         <w:t xml:space="preserve"> </w:t>
       </w:r>
       <w:r>
-        <w:t xml:space="preserve">Body 11, Agility 14, Intellect 10, Presence 11, Will 9.</w:t>
+        <w:t xml:space="preserve">Body 10, Agility 10, Intellect 13, Presence 12, Will 11.</w:t>
       </w:r>
       <w:r>
         <w:t xml:space="preserve"> </w:t>
@@ -14195,23 +14418,7 @@
         <w:t xml:space="preserve"> </w:t>
       </w:r>
       <w:r>
-        <w:t xml:space="preserve">13.</w:t>
-      </w:r>
-      <w:r>
-        <w:t xml:space="preserve"> </w:t>
-      </w:r>
-      <w:r>
-        <w:rPr>
-          <w:bCs/>
-          <w:b/>
-        </w:rPr>
-        <w:t xml:space="preserve">In woge:</w:t>
-      </w:r>
-      <w:r>
-        <w:t xml:space="preserve"> </w:t>
-      </w:r>
-      <w:r>
-        <w:t xml:space="preserve">Body 12, Agility 15, Dodge 15; claws mark 2 boxes.</w:t>
+        <w:t xml:space="preserve">8.</w:t>
       </w:r>
     </w:p>
     <w:p>
@@ -14233,7 +14440,7 @@
         <w:t xml:space="preserve"> </w:t>
       </w:r>
       <w:r>
-        <w:t xml:space="preserve">Shooting 17 (Specialty). Trained: Riding 15, Stealth 15, Brawling 15, Melee 15, Persuasion 12, Athletics 12, Tracking 11, Survival 11, Read People 11, Gambling 11.</w:t>
+        <w:t xml:space="preserve">Medicine 16 (Specialty). Trained: Apothecary 14, Read People 14, Investigation 14, Wesen Lore 14, Occult 14, Persuasion 13, Leadership 13, Riding 11, Shooting 11.</w:t>
       </w:r>
     </w:p>
     <w:p>
@@ -14255,7 +14462,7 @@
         <w:t xml:space="preserve"> </w:t>
       </w:r>
       <w:r>
-        <w:t xml:space="preserve">Extra Trained skill; True grit.</w:t>
+        <w:t xml:space="preserve">+1 attribute point; second advantage: Battlefield Surgeon; a fine tool: his army surgeon’s instruments (+2 Medicine).</w:t>
       </w:r>
       <w:r>
         <w:t xml:space="preserve"> </w:t>
@@ -14271,7 +14478,7 @@
         <w:t xml:space="preserve"> </w:t>
       </w:r>
       <w:r>
-        <w:t xml:space="preserve">Plains Wanderer (companion: Restless).</w:t>
+        <w:t xml:space="preserve">Steady Hands.</w:t>
       </w:r>
       <w:r>
         <w:t xml:space="preserve"> </w:t>
@@ -14287,7 +14494,7 @@
         <w:t xml:space="preserve"> </w:t>
       </w:r>
       <w:r>
-        <w:t xml:space="preserve">Sworn Vengeance; trigger: word of the men who burned her clan’s camp.</w:t>
+        <w:t xml:space="preserve">Haunted by the War; trigger: gunfire in the dark.</w:t>
       </w:r>
     </w:p>
     <w:p>
@@ -14309,7 +14516,7 @@
         <w:t xml:space="preserve"> </w:t>
       </w:r>
       <w:r>
-        <w:t xml:space="preserve">Something that wore a human face killed someone I loved.</w:t>
+        <w:t xml:space="preserve">I saw what I saw, and no one else believes me.</w:t>
       </w:r>
       <w:r>
         <w:t xml:space="preserve"> </w:t>
@@ -14325,17 +14532,17 @@
         <w:t xml:space="preserve"> </w:t>
       </w:r>
       <w:r>
-        <w:t xml:space="preserve">Eliza Kessler taught her what she knows about the hidden world.</w:t>
+        <w:t xml:space="preserve">Rode with Silas Thorne’s regiment in the war and has never trusted him since.</w:t>
       </w:r>
     </w:p>
     <w:bookmarkEnd w:id="85"/>
-    <w:bookmarkStart w:id="86" w:name="silas-thorne"/>
+    <w:bookmarkStart w:id="86" w:name="cora-ridgeway"/>
     <w:p>
       <w:pPr>
         <w:pStyle w:val="Heading2"/>
       </w:pPr>
       <w:r>
-        <w:t xml:space="preserve">Silas Thorne</w:t>
+        <w:t xml:space="preserve">Cora Ridgeway</w:t>
       </w:r>
     </w:p>
     <w:p>
@@ -14347,13 +14554,13 @@
           <w:iCs/>
           <w:i/>
         </w:rPr>
-        <w:t xml:space="preserve">Professional gambler, Gambler. Ziegevolk (Tier 1); Old hand.</w:t>
-      </w:r>
-      <w:r>
-        <w:t xml:space="preserve"> </w:t>
-      </w:r>
-      <w:r>
-        <w:t xml:space="preserve">Charming, well-dressed, and in debt to the wrong people.</w:t>
+        <w:t xml:space="preserve">Scout and sharpshooter, Scout. Coyotl (Tier 1).</w:t>
+      </w:r>
+      <w:r>
+        <w:t xml:space="preserve"> </w:t>
+      </w:r>
+      <w:r>
+        <w:t xml:space="preserve">Knows the plains and the high country, and keeps her clan’s ways close.</w:t>
       </w:r>
     </w:p>
     <w:p>
@@ -14375,7 +14582,7 @@
         <w:t xml:space="preserve"> </w:t>
       </w:r>
       <w:r>
-        <w:t xml:space="preserve">Body 10, Agility 10, Intellect 13, Presence 13, Will 9.</w:t>
+        <w:t xml:space="preserve">Body 11, Agility 14, Intellect 10, Presence 11, Will 9.</w:t>
       </w:r>
       <w:r>
         <w:t xml:space="preserve"> </w:t>
@@ -14391,7 +14598,23 @@
         <w:t xml:space="preserve"> </w:t>
       </w:r>
       <w:r>
-        <w:t xml:space="preserve">8.</w:t>
+        <w:t xml:space="preserve">13.</w:t>
+      </w:r>
+      <w:r>
+        <w:t xml:space="preserve"> </w:t>
+      </w:r>
+      <w:r>
+        <w:rPr>
+          <w:bCs/>
+          <w:b/>
+        </w:rPr>
+        <w:t xml:space="preserve">In woge:</w:t>
+      </w:r>
+      <w:r>
+        <w:t xml:space="preserve"> </w:t>
+      </w:r>
+      <w:r>
+        <w:t xml:space="preserve">Body 12, Agility 15, Dodge 15; claws mark 2 boxes.</w:t>
       </w:r>
     </w:p>
     <w:p>
@@ -14413,7 +14636,7 @@
         <w:t xml:space="preserve"> </w:t>
       </w:r>
       <w:r>
-        <w:t xml:space="preserve">Gambling 18 (Expert). Trained: Deception 14, Persuasion 14, Read People 14, Investigation 14, Shooting 11, Stealth 11, Riding 11.</w:t>
+        <w:t xml:space="preserve">Shooting 17 (Specialty). Trained: Riding 15, Stealth 15, Brawling 15, Melee 15, Persuasion 12, Athletics 12, Tracking 11, Survival 11, Read People 11, Gambling 11.</w:t>
       </w:r>
     </w:p>
     <w:p>
@@ -14435,7 +14658,7 @@
         <w:t xml:space="preserve"> </w:t>
       </w:r>
       <w:r>
-        <w:t xml:space="preserve">Second advantage: Poker Face; a friend in town: Mae Lin, a faro dealer who hears everything said at her table.</w:t>
+        <w:t xml:space="preserve">Extra Trained skill; True grit.</w:t>
       </w:r>
       <w:r>
         <w:t xml:space="preserve"> </w:t>
@@ -14451,7 +14674,7 @@
         <w:t xml:space="preserve"> </w:t>
       </w:r>
       <w:r>
-        <w:t xml:space="preserve">Ziegevolk Pheromones (companion: Pheromone Suspicion).</w:t>
+        <w:t xml:space="preserve">Plains Wanderer (companion: Restless).</w:t>
       </w:r>
       <w:r>
         <w:t xml:space="preserve"> </w:t>
@@ -14467,7 +14690,7 @@
         <w:t xml:space="preserve"> </w:t>
       </w:r>
       <w:r>
-        <w:t xml:space="preserve">Owes the Wrong People; trigger: a debt collector arrives.</w:t>
+        <w:t xml:space="preserve">Sworn Vengeance; trigger: word of the men who burned her clan’s camp.</w:t>
       </w:r>
     </w:p>
     <w:p>
@@ -14489,7 +14712,7 @@
         <w:t xml:space="preserve"> </w:t>
       </w:r>
       <w:r>
-        <w:t xml:space="preserve">The pay’s good, and nobody else will take these jobs.</w:t>
+        <w:t xml:space="preserve">Something that wore a human face killed someone I loved.</w:t>
       </w:r>
       <w:r>
         <w:t xml:space="preserve"> </w:t>
@@ -14505,12 +14728,192 @@
         <w:t xml:space="preserve"> </w:t>
       </w:r>
       <w:r>
+        <w:t xml:space="preserve">Eliza Kessler taught her what she knows about the hidden world.</w:t>
+      </w:r>
+    </w:p>
+    <w:bookmarkEnd w:id="86"/>
+    <w:bookmarkStart w:id="87" w:name="silas-thorne"/>
+    <w:p>
+      <w:pPr>
+        <w:pStyle w:val="Heading2"/>
+      </w:pPr>
+      <w:r>
+        <w:t xml:space="preserve">Silas Thorne</w:t>
+      </w:r>
+    </w:p>
+    <w:p>
+      <w:pPr>
+        <w:pStyle w:val="FirstParagraph"/>
+      </w:pPr>
+      <w:r>
+        <w:rPr>
+          <w:iCs/>
+          <w:i/>
+        </w:rPr>
+        <w:t xml:space="preserve">Professional gambler, Gambler. Ziegevolk (Tier 1); Old hand.</w:t>
+      </w:r>
+      <w:r>
+        <w:t xml:space="preserve"> </w:t>
+      </w:r>
+      <w:r>
+        <w:t xml:space="preserve">Charming, well-dressed, and in debt to the wrong people.</w:t>
+      </w:r>
+    </w:p>
+    <w:p>
+      <w:pPr>
+        <w:numPr>
+          <w:ilvl w:val="0"/>
+          <w:numId w:val="1021"/>
+        </w:numPr>
+        <w:pStyle w:val="Compact"/>
+      </w:pPr>
+      <w:r>
+        <w:rPr>
+          <w:bCs/>
+          <w:b/>
+        </w:rPr>
+        <w:t xml:space="preserve">Attributes:</w:t>
+      </w:r>
+      <w:r>
+        <w:t xml:space="preserve"> </w:t>
+      </w:r>
+      <w:r>
+        <w:t xml:space="preserve">Body 10, Agility 10, Intellect 13, Presence 13, Will 9.</w:t>
+      </w:r>
+      <w:r>
+        <w:t xml:space="preserve"> </w:t>
+      </w:r>
+      <w:r>
+        <w:rPr>
+          <w:bCs/>
+          <w:b/>
+        </w:rPr>
+        <w:t xml:space="preserve">Dodge</w:t>
+      </w:r>
+      <w:r>
+        <w:t xml:space="preserve"> </w:t>
+      </w:r>
+      <w:r>
+        <w:t xml:space="preserve">8.</w:t>
+      </w:r>
+    </w:p>
+    <w:p>
+      <w:pPr>
+        <w:numPr>
+          <w:ilvl w:val="0"/>
+          <w:numId w:val="1021"/>
+        </w:numPr>
+        <w:pStyle w:val="Compact"/>
+      </w:pPr>
+      <w:r>
+        <w:rPr>
+          <w:bCs/>
+          <w:b/>
+        </w:rPr>
+        <w:t xml:space="preserve">Skills:</w:t>
+      </w:r>
+      <w:r>
+        <w:t xml:space="preserve"> </w:t>
+      </w:r>
+      <w:r>
+        <w:t xml:space="preserve">Gambling 18 (Expert). Trained: Deception 14, Persuasion 14, Read People 14, Investigation 14, Shooting 11, Stealth 11, Riding 11.</w:t>
+      </w:r>
+    </w:p>
+    <w:p>
+      <w:pPr>
+        <w:numPr>
+          <w:ilvl w:val="0"/>
+          <w:numId w:val="1021"/>
+        </w:numPr>
+        <w:pStyle w:val="Compact"/>
+      </w:pPr>
+      <w:r>
+        <w:rPr>
+          <w:bCs/>
+          <w:b/>
+        </w:rPr>
+        <w:t xml:space="preserve">Edges:</w:t>
+      </w:r>
+      <w:r>
+        <w:t xml:space="preserve"> </w:t>
+      </w:r>
+      <w:r>
+        <w:t xml:space="preserve">Second advantage: Poker Face; a friend in town: Mae Lin, a faro dealer who hears everything said at her table.</w:t>
+      </w:r>
+      <w:r>
+        <w:t xml:space="preserve"> </w:t>
+      </w:r>
+      <w:r>
+        <w:rPr>
+          <w:bCs/>
+          <w:b/>
+        </w:rPr>
+        <w:t xml:space="preserve">Advantage:</w:t>
+      </w:r>
+      <w:r>
+        <w:t xml:space="preserve"> </w:t>
+      </w:r>
+      <w:r>
+        <w:t xml:space="preserve">Ziegevolk Pheromones (companion: Pheromone Suspicion).</w:t>
+      </w:r>
+      <w:r>
+        <w:t xml:space="preserve"> </w:t>
+      </w:r>
+      <w:r>
+        <w:rPr>
+          <w:bCs/>
+          <w:b/>
+        </w:rPr>
+        <w:t xml:space="preserve">Complication:</w:t>
+      </w:r>
+      <w:r>
+        <w:t xml:space="preserve"> </w:t>
+      </w:r>
+      <w:r>
+        <w:t xml:space="preserve">Owes the Wrong People; trigger: a debt collector arrives.</w:t>
+      </w:r>
+    </w:p>
+    <w:p>
+      <w:pPr>
+        <w:numPr>
+          <w:ilvl w:val="0"/>
+          <w:numId w:val="1021"/>
+        </w:numPr>
+        <w:pStyle w:val="Compact"/>
+      </w:pPr>
+      <w:r>
+        <w:rPr>
+          <w:bCs/>
+          <w:b/>
+        </w:rPr>
+        <w:t xml:space="preserve">Why I stand against the dark:</w:t>
+      </w:r>
+      <w:r>
+        <w:t xml:space="preserve"> </w:t>
+      </w:r>
+      <w:r>
+        <w:t xml:space="preserve">The pay’s good, and nobody else will take these jobs.</w:t>
+      </w:r>
+      <w:r>
+        <w:t xml:space="preserve"> </w:t>
+      </w:r>
+      <w:r>
+        <w:rPr>
+          <w:bCs/>
+          <w:b/>
+        </w:rPr>
+        <w:t xml:space="preserve">Connection:</w:t>
+      </w:r>
+      <w:r>
+        <w:t xml:space="preserve"> </w:t>
+      </w:r>
+      <w:r>
         <w:t xml:space="preserve">Plays cards with Cora every Saturday; she’s the only one who can tell when he’s bluffing.</w:t>
       </w:r>
     </w:p>
-    <w:bookmarkEnd w:id="86"/>
     <w:bookmarkEnd w:id="87"/>
-    <w:bookmarkStart w:id="88" w:name="threats"/>
+    <w:bookmarkEnd w:id="88"/>
+    <w:bookmarkStart w:id="89" w:name="threats"/>
     <w:p>
       <w:pPr>
         <w:pStyle w:val="Heading1"/>
@@ -15781,8 +16184,8 @@
         <w:t xml:space="preserve">For a tougher version, add +1 to its targets and one box; for a weaker one, subtract.</w:t>
       </w:r>
     </w:p>
-    <w:bookmarkEnd w:id="88"/>
-    <w:bookmarkStart w:id="89" w:name="advantages"/>
+    <w:bookmarkEnd w:id="89"/>
+    <w:bookmarkStart w:id="90" w:name="advantages"/>
     <w:p>
       <w:pPr>
         <w:pStyle w:val="Heading1"/>
@@ -16538,8 +16941,8 @@
         <w:t xml:space="preserve">A badge is legal authority, not a magic word: Wesen, outlaws and the powers of the hidden world don’t care about it, and it carries a duty. Your superiors can give you orders, and abusing the badge or failing in your duty can cost you it. Law callings (Marshal, Deputy) usually take one, as their advantage or as a second advantage Edge. A Pinkerton detective takes Pinkerton Credentials instead: the agency’s reach and files, but no badge.</w:t>
       </w:r>
     </w:p>
-    <w:bookmarkEnd w:id="89"/>
-    <w:bookmarkStart w:id="111" w:name="heritages"/>
+    <w:bookmarkEnd w:id="90"/>
+    <w:bookmarkStart w:id="112" w:name="heritages"/>
     <w:p>
       <w:pPr>
         <w:pStyle w:val="Heading1"/>
@@ -17944,7 +18347,7 @@
         </w:tc>
       </w:tr>
     </w:tbl>
-    <w:bookmarkStart w:id="90" w:name="core-wesen-rules"/>
+    <w:bookmarkStart w:id="91" w:name="core-wesen-rules"/>
     <w:p>
       <w:pPr>
         <w:pStyle w:val="Heading2"/>
@@ -18256,8 +18659,8 @@
         <w:t xml:space="preserve">means each hit that marks 2 or more boxes marks one fewer, never below 1.</w:t>
       </w:r>
     </w:p>
-    <w:bookmarkEnd w:id="90"/>
-    <w:bookmarkStart w:id="91" w:name="human"/>
+    <w:bookmarkEnd w:id="91"/>
+    <w:bookmarkStart w:id="92" w:name="human"/>
     <w:p>
       <w:pPr>
         <w:pStyle w:val="Heading2"/>
@@ -18502,8 +18905,8 @@
         <w:t xml:space="preserve">Source: No template</w:t>
       </w:r>
     </w:p>
-    <w:bookmarkEnd w:id="91"/>
-    <w:bookmarkStart w:id="92" w:name="bauerschwein"/>
+    <w:bookmarkEnd w:id="92"/>
+    <w:bookmarkStart w:id="93" w:name="bauerschwein"/>
     <w:p>
       <w:pPr>
         <w:pStyle w:val="Heading2"/>
@@ -18548,7 +18951,7 @@
       <w:pPr>
         <w:numPr>
           <w:ilvl w:val="0"/>
-          <w:numId w:val="1021"/>
+          <w:numId w:val="1022"/>
         </w:numPr>
         <w:pStyle w:val="Compact"/>
       </w:pPr>
@@ -18808,8 +19211,8 @@
         <w:t xml:space="preserve">Source: No template; adapted from the show.</w:t>
       </w:r>
     </w:p>
-    <w:bookmarkEnd w:id="92"/>
-    <w:bookmarkStart w:id="93" w:name="coyotl"/>
+    <w:bookmarkEnd w:id="93"/>
+    <w:bookmarkStart w:id="94" w:name="coyotl"/>
     <w:p>
       <w:pPr>
         <w:pStyle w:val="Heading2"/>
@@ -19090,8 +19493,8 @@
         <w:t xml:space="preserve">Source: Coyotl template: DX +2, HT +1, ST +2. About 141 points.</w:t>
       </w:r>
     </w:p>
-    <w:bookmarkEnd w:id="93"/>
-    <w:bookmarkStart w:id="94" w:name="eisbiber"/>
+    <w:bookmarkEnd w:id="94"/>
+    <w:bookmarkStart w:id="95" w:name="eisbiber"/>
     <w:p>
       <w:pPr>
         <w:pStyle w:val="Heading2"/>
@@ -19372,8 +19775,8 @@
         <w:t xml:space="preserve">Source: No template; adapted from the show.</w:t>
       </w:r>
     </w:p>
-    <w:bookmarkEnd w:id="94"/>
-    <w:bookmarkStart w:id="95" w:name="fuchsbau"/>
+    <w:bookmarkEnd w:id="95"/>
+    <w:bookmarkStart w:id="96" w:name="fuchsbau"/>
     <w:p>
       <w:pPr>
         <w:pStyle w:val="Heading2"/>
@@ -19716,8 +20119,8 @@
         <w:t xml:space="preserve">Source: Fuchsbau template: IQ +2; Bad Reputation (disreputable among Wesen). About 132 points.</w:t>
       </w:r>
     </w:p>
-    <w:bookmarkEnd w:id="95"/>
-    <w:bookmarkStart w:id="96" w:name="mauzhertz"/>
+    <w:bookmarkEnd w:id="96"/>
+    <w:bookmarkStart w:id="97" w:name="mauzhertz"/>
     <w:p>
       <w:pPr>
         <w:pStyle w:val="Heading2"/>
@@ -19998,8 +20401,8 @@
         <w:t xml:space="preserve">Source: No template; adapted from the show.</w:t>
       </w:r>
     </w:p>
-    <w:bookmarkEnd w:id="96"/>
-    <w:bookmarkStart w:id="97" w:name="steinadler"/>
+    <w:bookmarkEnd w:id="97"/>
+    <w:bookmarkStart w:id="98" w:name="steinadler"/>
     <w:p>
       <w:pPr>
         <w:pStyle w:val="Heading2"/>
@@ -20280,8 +20683,8 @@
         <w:t xml:space="preserve">Source: No template; adapted from the show.</w:t>
       </w:r>
     </w:p>
-    <w:bookmarkEnd w:id="97"/>
-    <w:bookmarkStart w:id="98" w:name="taniwha"/>
+    <w:bookmarkEnd w:id="98"/>
+    <w:bookmarkStart w:id="99" w:name="taniwha"/>
     <w:p>
       <w:pPr>
         <w:pStyle w:val="Heading2"/>
@@ -20326,7 +20729,7 @@
       <w:pPr>
         <w:numPr>
           <w:ilvl w:val="0"/>
-          <w:numId w:val="1022"/>
+          <w:numId w:val="1023"/>
         </w:numPr>
         <w:pStyle w:val="Compact"/>
       </w:pPr>
@@ -20338,7 +20741,7 @@
       <w:pPr>
         <w:numPr>
           <w:ilvl w:val="0"/>
-          <w:numId w:val="1022"/>
+          <w:numId w:val="1023"/>
         </w:numPr>
         <w:pStyle w:val="Compact"/>
       </w:pPr>
@@ -20614,8 +21017,8 @@
         <w:t xml:space="preserve">Source: Taniwha template (150-point): poison resistance; Dependency (human flesh, seasonal). About 157 points.</w:t>
       </w:r>
     </w:p>
-    <w:bookmarkEnd w:id="98"/>
-    <w:bookmarkStart w:id="99" w:name="ziegevolk"/>
+    <w:bookmarkEnd w:id="99"/>
+    <w:bookmarkStart w:id="100" w:name="ziegevolk"/>
     <w:p>
       <w:pPr>
         <w:pStyle w:val="Heading2"/>
@@ -20896,8 +21299,8 @@
         <w:t xml:space="preserve">Source: No template; adapted from the show.</w:t>
       </w:r>
     </w:p>
-    <w:bookmarkEnd w:id="99"/>
-    <w:bookmarkStart w:id="100" w:name="blutbad"/>
+    <w:bookmarkEnd w:id="100"/>
+    <w:bookmarkStart w:id="101" w:name="blutbad"/>
     <w:p>
       <w:pPr>
         <w:pStyle w:val="Heading2"/>
@@ -20942,7 +21345,7 @@
       <w:pPr>
         <w:numPr>
           <w:ilvl w:val="0"/>
-          <w:numId w:val="1023"/>
+          <w:numId w:val="1024"/>
         </w:numPr>
         <w:pStyle w:val="Compact"/>
       </w:pPr>
@@ -21264,8 +21667,8 @@
         <w:t xml:space="preserve">Source: Blutbaad template: DX +3, HT +2, ST +2; Loner; Enemy (Bauerschwein). About 208 points.</w:t>
       </w:r>
     </w:p>
-    <w:bookmarkEnd w:id="100"/>
-    <w:bookmarkStart w:id="101" w:name="grimm"/>
+    <w:bookmarkEnd w:id="101"/>
+    <w:bookmarkStart w:id="102" w:name="grimm"/>
     <w:p>
       <w:pPr>
         <w:pStyle w:val="Heading2"/>
@@ -21310,7 +21713,7 @@
       <w:pPr>
         <w:numPr>
           <w:ilvl w:val="0"/>
-          <w:numId w:val="1024"/>
+          <w:numId w:val="1025"/>
         </w:numPr>
         <w:pStyle w:val="Compact"/>
       </w:pPr>
@@ -21322,7 +21725,7 @@
       <w:pPr>
         <w:numPr>
           <w:ilvl w:val="0"/>
-          <w:numId w:val="1024"/>
+          <w:numId w:val="1025"/>
         </w:numPr>
         <w:pStyle w:val="Compact"/>
       </w:pPr>
@@ -21334,7 +21737,7 @@
       <w:pPr>
         <w:numPr>
           <w:ilvl w:val="0"/>
-          <w:numId w:val="1024"/>
+          <w:numId w:val="1025"/>
         </w:numPr>
         <w:pStyle w:val="Compact"/>
       </w:pPr>
@@ -21346,7 +21749,7 @@
       <w:pPr>
         <w:numPr>
           <w:ilvl w:val="0"/>
-          <w:numId w:val="1024"/>
+          <w:numId w:val="1025"/>
         </w:numPr>
         <w:pStyle w:val="Compact"/>
       </w:pPr>
@@ -21358,7 +21761,7 @@
       <w:pPr>
         <w:numPr>
           <w:ilvl w:val="0"/>
-          <w:numId w:val="1024"/>
+          <w:numId w:val="1025"/>
         </w:numPr>
         <w:pStyle w:val="Compact"/>
       </w:pPr>
@@ -21370,7 +21773,7 @@
       <w:pPr>
         <w:numPr>
           <w:ilvl w:val="0"/>
-          <w:numId w:val="1024"/>
+          <w:numId w:val="1025"/>
         </w:numPr>
         <w:pStyle w:val="Compact"/>
       </w:pPr>
@@ -21382,7 +21785,7 @@
       <w:pPr>
         <w:numPr>
           <w:ilvl w:val="0"/>
-          <w:numId w:val="1024"/>
+          <w:numId w:val="1025"/>
         </w:numPr>
         <w:pStyle w:val="Compact"/>
       </w:pPr>
@@ -22182,8 +22585,8 @@
         <w:t xml:space="preserve">Source: Decapitare template: ST, DX, HT +1; Combat Reflexes; Detect (Wesen, Magic); Magic Resistance 7; Talent (Grimm); Reputation (Frightening Decapitare).</w:t>
       </w:r>
     </w:p>
-    <w:bookmarkEnd w:id="101"/>
-    <w:bookmarkStart w:id="102" w:name="incantare"/>
+    <w:bookmarkEnd w:id="102"/>
+    <w:bookmarkStart w:id="103" w:name="incantare"/>
     <w:p>
       <w:pPr>
         <w:pStyle w:val="Heading2"/>
@@ -22228,7 +22631,7 @@
       <w:pPr>
         <w:numPr>
           <w:ilvl w:val="0"/>
-          <w:numId w:val="1025"/>
+          <w:numId w:val="1026"/>
         </w:numPr>
         <w:pStyle w:val="Compact"/>
       </w:pPr>
@@ -22240,7 +22643,7 @@
       <w:pPr>
         <w:numPr>
           <w:ilvl w:val="0"/>
-          <w:numId w:val="1025"/>
+          <w:numId w:val="1026"/>
         </w:numPr>
         <w:pStyle w:val="Compact"/>
       </w:pPr>
@@ -22252,7 +22655,7 @@
       <w:pPr>
         <w:numPr>
           <w:ilvl w:val="0"/>
-          <w:numId w:val="1025"/>
+          <w:numId w:val="1026"/>
         </w:numPr>
         <w:pStyle w:val="Compact"/>
       </w:pPr>
@@ -22494,22 +22897,22 @@
                 <w:b/>
                 <w:sz w:val="19"/>
               </w:rPr>
-              <w:t xml:space="preserve">Magi Lens (Wizard)</w:t>
-            </w:r>
-          </w:p>
-        </w:tc>
-        <w:tc>
-          <w:tcPr/>
-          <w:p>
-            <w:pPr>
-              <w:pStyle w:val="Compact"/>
-              <w:jc w:val="left"/>
-            </w:pPr>
-            <w:r>
-              <w:rPr>
-                <w:sz w:val="19"/>
-              </w:rPr>
-              <w:t xml:space="preserve">Scholarly ritual from grimoires: any kind of effect, but an hour per roll, and it needs books. +2 to Occult for divination and wards.</w:t>
+              <w:t xml:space="preserve">Magi Lens (Scholar-Mage)</w:t>
+            </w:r>
+          </w:p>
+        </w:tc>
+        <w:tc>
+          <w:tcPr/>
+          <w:p>
+            <w:pPr>
+              <w:pStyle w:val="Compact"/>
+              <w:jc w:val="left"/>
+            </w:pPr>
+            <w:r>
+              <w:rPr>
+                <w:sz w:val="19"/>
+              </w:rPr>
+              <w:t xml:space="preserve">Scholarly ritual from grimoires, the Sixth and Seventh Books of Moses among them: any kind of effect, but an hour per roll, and it needs books. +2 to Occult for divination and wards.</w:t>
             </w:r>
           </w:p>
         </w:tc>
@@ -22556,22 +22959,22 @@
                 <w:b/>
                 <w:sz w:val="19"/>
               </w:rPr>
-              <w:t xml:space="preserve">Malifica Lens (Witch or Warlock)</w:t>
-            </w:r>
-          </w:p>
-        </w:tc>
-        <w:tc>
-          <w:tcPr/>
-          <w:p>
-            <w:pPr>
-              <w:pStyle w:val="Compact"/>
-              <w:jc w:val="left"/>
-            </w:pPr>
-            <w:r>
-              <w:rPr>
-                <w:sz w:val="19"/>
-              </w:rPr>
-              <w:t xml:space="preserve">Curses and hexes worked through a link: blood, hair or a treasured object; −4 without one. +2 to Occult for curses with a link.</w:t>
+              <w:t xml:space="preserve">Malifica Lens (Hexenmeister)</w:t>
+            </w:r>
+          </w:p>
+        </w:tc>
+        <w:tc>
+          <w:tcPr/>
+          <w:p>
+            <w:pPr>
+              <w:pStyle w:val="Compact"/>
+              <w:jc w:val="left"/>
+            </w:pPr>
+            <w:r>
+              <w:rPr>
+                <w:sz w:val="19"/>
+              </w:rPr>
+              <w:t xml:space="preserve">Hexerei: curses and hexes, and the breaking of them, worked through a link: blood, hair or a treasured object; −4 without one. +2 to Occult for curses with a link.</w:t>
             </w:r>
           </w:p>
         </w:tc>
@@ -22600,40 +23003,40 @@
               <w:rPr>
                 <w:sz w:val="19"/>
               </w:rPr>
-              <w:t xml:space="preserve">People whisper that you’re a witch, and the Order of the Holy Knife listens. Accept the suspicion.</w:t>
-            </w:r>
-          </w:p>
-        </w:tc>
-      </w:tr>
-      <w:tr>
-        <w:tc>
-          <w:tcPr/>
-          <w:p>
-            <w:pPr>
-              <w:pStyle w:val="Compact"/>
-              <w:jc w:val="left"/>
-            </w:pPr>
-            <w:r>
-              <w:rPr>
-                <w:b/>
-                <w:sz w:val="19"/>
-              </w:rPr>
-              <w:t xml:space="preserve">Phitonissa Lens (Pagan)</w:t>
-            </w:r>
-          </w:p>
-        </w:tc>
-        <w:tc>
-          <w:tcPr/>
-          <w:p>
-            <w:pPr>
-              <w:pStyle w:val="Compact"/>
-              <w:jc w:val="left"/>
-            </w:pPr>
-            <w:r>
-              <w:rPr>
-                <w:sz w:val="19"/>
-              </w:rPr>
-              <w:t xml:space="preserve">Cunning-folk rites of the seasons, nature and the old gods, worked outdoors. +2 to Occult for nature and folk magic.</w:t>
+              <w:t xml:space="preserve">People whisper that you’re a hexer, and the Order of the Holy Knife listens. Accept the suspicion.</w:t>
+            </w:r>
+          </w:p>
+        </w:tc>
+      </w:tr>
+      <w:tr>
+        <w:tc>
+          <w:tcPr/>
+          <w:p>
+            <w:pPr>
+              <w:pStyle w:val="Compact"/>
+              <w:jc w:val="left"/>
+            </w:pPr>
+            <w:r>
+              <w:rPr>
+                <w:b/>
+                <w:sz w:val="19"/>
+              </w:rPr>
+              <w:t xml:space="preserve">Phitonissa Lens (Druid)</w:t>
+            </w:r>
+          </w:p>
+        </w:tc>
+        <w:tc>
+          <w:tcPr/>
+          <w:p>
+            <w:pPr>
+              <w:pStyle w:val="Compact"/>
+              <w:jc w:val="left"/>
+            </w:pPr>
+            <w:r>
+              <w:rPr>
+                <w:sz w:val="19"/>
+              </w:rPr>
+              <w:t xml:space="preserve">Rites of the seasons, nature and the old gods, worked outdoors; in America, often behind the doors of a Druid lodge. +2 to Occult for nature and folk magic.</w:t>
             </w:r>
           </w:p>
         </w:tc>
@@ -22663,6 +23066,68 @@
                 <w:sz w:val="19"/>
               </w:rPr>
               <w:t xml:space="preserve">The old observances bind you: festivals, offerings, taboos. Accept the delay or cost of keeping them.</w:t>
+            </w:r>
+          </w:p>
+        </w:tc>
+      </w:tr>
+      <w:tr>
+        <w:tc>
+          <w:tcPr/>
+          <w:p>
+            <w:pPr>
+              <w:pStyle w:val="Compact"/>
+              <w:jc w:val="left"/>
+            </w:pPr>
+            <w:r>
+              <w:rPr>
+                <w:b/>
+                <w:sz w:val="19"/>
+              </w:rPr>
+              <w:t xml:space="preserve">Braucher Lens (Pow-wow Doctor)</w:t>
+            </w:r>
+          </w:p>
+        </w:tc>
+        <w:tc>
+          <w:tcPr/>
+          <w:p>
+            <w:pPr>
+              <w:pStyle w:val="Compact"/>
+              <w:jc w:val="left"/>
+            </w:pPr>
+            <w:r>
+              <w:rPr>
+                <w:sz w:val="19"/>
+              </w:rPr>
+              <w:t xml:space="preserve">Braucherei, the Pennsylvania Dutch healing craft: spoken charms, prayers and blessed objects, from The Long Lost Friend. +2 to Occult to heal, protect, or break a hex.</w:t>
+            </w:r>
+          </w:p>
+        </w:tc>
+        <w:tc>
+          <w:tcPr/>
+          <w:p>
+            <w:pPr>
+              <w:pStyle w:val="Compact"/>
+              <w:jc w:val="left"/>
+            </w:pPr>
+            <w:r>
+              <w:rPr>
+                <w:bCs/>
+                <w:b/>
+                <w:sz w:val="19"/>
+              </w:rPr>
+              <w:t xml:space="preserve">No Payment.</w:t>
+            </w:r>
+            <w:r>
+              <w:rPr>
+                <w:sz w:val="19"/>
+              </w:rPr>
+              <w:t xml:space="preserve"> </w:t>
+            </w:r>
+            <w:r>
+              <w:rPr>
+                <w:sz w:val="19"/>
+              </w:rPr>
+              <w:t xml:space="preserve">A Braucher takes no money for healing, only gifts. Accept the cost when the need is great and the purse is empty.</w:t>
             </w:r>
           </w:p>
         </w:tc>
@@ -22801,11 +23266,11 @@
           <w:iCs/>
           <w:i/>
         </w:rPr>
-        <w:t xml:space="preserve">Source: Incantare template: seven Lenses (Ritual Path Magic).</w:t>
-      </w:r>
-    </w:p>
-    <w:bookmarkEnd w:id="102"/>
-    <w:bookmarkStart w:id="103" w:name="jägerbär"/>
+        <w:t xml:space="preserve">Source: Incantare template: seven Lenses (Ritual Path Magic), plus the Braucher.</w:t>
+      </w:r>
+    </w:p>
+    <w:bookmarkEnd w:id="103"/>
+    <w:bookmarkStart w:id="104" w:name="jägerbär"/>
     <w:p>
       <w:pPr>
         <w:pStyle w:val="Heading2"/>
@@ -23086,8 +23551,8 @@
         <w:t xml:space="preserve">Source: No template; adapted from the show.</w:t>
       </w:r>
     </w:p>
-    <w:bookmarkEnd w:id="103"/>
-    <w:bookmarkStart w:id="104" w:name="mauvais-dentes"/>
+    <w:bookmarkEnd w:id="104"/>
+    <w:bookmarkStart w:id="105" w:name="mauvais-dentes"/>
     <w:p>
       <w:pPr>
         <w:pStyle w:val="Heading2"/>
@@ -23132,7 +23597,7 @@
       <w:pPr>
         <w:numPr>
           <w:ilvl w:val="0"/>
-          <w:numId w:val="1026"/>
+          <w:numId w:val="1027"/>
         </w:numPr>
         <w:pStyle w:val="Compact"/>
       </w:pPr>
@@ -23392,8 +23857,8 @@
         <w:t xml:space="preserve">Source: Mauvais Dentes template: DX +2, HT +3, ST +3; Loner. About 213 points.</w:t>
       </w:r>
     </w:p>
-    <w:bookmarkEnd w:id="104"/>
-    <w:bookmarkStart w:id="105" w:name="naschazer"/>
+    <w:bookmarkEnd w:id="105"/>
+    <w:bookmarkStart w:id="106" w:name="naschazer"/>
     <w:p>
       <w:pPr>
         <w:pStyle w:val="Heading2"/>
@@ -23438,7 +23903,7 @@
       <w:pPr>
         <w:numPr>
           <w:ilvl w:val="0"/>
-          <w:numId w:val="1027"/>
+          <w:numId w:val="1028"/>
         </w:numPr>
         <w:pStyle w:val="Compact"/>
       </w:pPr>
@@ -23698,8 +24163,8 @@
         <w:t xml:space="preserve">Source: Naschazer template: HT +4; Dependency and Uncontrollable Appetite (human flesh); Greed; Proud. About 197 points.</w:t>
       </w:r>
     </w:p>
-    <w:bookmarkEnd w:id="105"/>
-    <w:bookmarkStart w:id="106" w:name="skalengeck"/>
+    <w:bookmarkEnd w:id="106"/>
+    <w:bookmarkStart w:id="107" w:name="skalengeck"/>
     <w:p>
       <w:pPr>
         <w:pStyle w:val="Heading2"/>
@@ -23980,8 +24445,8 @@
         <w:t xml:space="preserve">Source: Skalengeck template: no human-form changes. About 189 points.</w:t>
       </w:r>
     </w:p>
-    <w:bookmarkEnd w:id="106"/>
-    <w:bookmarkStart w:id="107" w:name="vallachi"/>
+    <w:bookmarkEnd w:id="107"/>
+    <w:bookmarkStart w:id="108" w:name="vallachi"/>
     <w:p>
       <w:pPr>
         <w:pStyle w:val="Heading2"/>
@@ -24026,7 +24491,7 @@
       <w:pPr>
         <w:numPr>
           <w:ilvl w:val="0"/>
-          <w:numId w:val="1028"/>
+          <w:numId w:val="1029"/>
         </w:numPr>
         <w:pStyle w:val="Compact"/>
       </w:pPr>
@@ -24038,7 +24503,7 @@
       <w:pPr>
         <w:numPr>
           <w:ilvl w:val="0"/>
-          <w:numId w:val="1028"/>
+          <w:numId w:val="1029"/>
         </w:numPr>
         <w:pStyle w:val="Compact"/>
       </w:pPr>
@@ -24050,7 +24515,7 @@
       <w:pPr>
         <w:numPr>
           <w:ilvl w:val="0"/>
-          <w:numId w:val="1028"/>
+          <w:numId w:val="1029"/>
         </w:numPr>
         <w:pStyle w:val="Compact"/>
       </w:pPr>
@@ -24062,7 +24527,7 @@
       <w:pPr>
         <w:numPr>
           <w:ilvl w:val="0"/>
-          <w:numId w:val="1028"/>
+          <w:numId w:val="1029"/>
         </w:numPr>
         <w:pStyle w:val="Compact"/>
       </w:pPr>
@@ -24322,8 +24787,8 @@
         <w:t xml:space="preserve">Source: Vallachi template: Attractive; Extended Lifespan; HT +2; Dependency and Uncontrollable Appetite (lifeforce); Weakness (sunlight); Lifebane. About 223 points.</w:t>
       </w:r>
     </w:p>
-    <w:bookmarkEnd w:id="107"/>
-    <w:bookmarkStart w:id="108" w:name="fuchsteufelwild"/>
+    <w:bookmarkEnd w:id="108"/>
+    <w:bookmarkStart w:id="109" w:name="fuchsteufelwild"/>
     <w:p>
       <w:pPr>
         <w:pStyle w:val="Heading2"/>
@@ -24368,7 +24833,7 @@
       <w:pPr>
         <w:numPr>
           <w:ilvl w:val="0"/>
-          <w:numId w:val="1029"/>
+          <w:numId w:val="1030"/>
         </w:numPr>
         <w:pStyle w:val="Compact"/>
       </w:pPr>
@@ -24380,7 +24845,7 @@
       <w:pPr>
         <w:numPr>
           <w:ilvl w:val="0"/>
-          <w:numId w:val="1029"/>
+          <w:numId w:val="1030"/>
         </w:numPr>
         <w:pStyle w:val="Compact"/>
       </w:pPr>
@@ -24656,8 +25121,8 @@
         <w:t xml:space="preserve">Source: Fuchsteurfelwild template: ST +1, HT +2, IQ +3, Super Jump 5; Obsession (Guess My Name); Bully; Callous; Sadism (now a companion). About 424 points; trimmed to Tier 3.</w:t>
       </w:r>
     </w:p>
-    <w:bookmarkEnd w:id="108"/>
-    <w:bookmarkStart w:id="109" w:name="hexenbiest-or-zauberbiest"/>
+    <w:bookmarkEnd w:id="109"/>
+    <w:bookmarkStart w:id="110" w:name="hexenbiest-or-zauberbiest"/>
     <w:p>
       <w:pPr>
         <w:pStyle w:val="Heading2"/>
@@ -24702,7 +25167,7 @@
       <w:pPr>
         <w:numPr>
           <w:ilvl w:val="0"/>
-          <w:numId w:val="1030"/>
+          <w:numId w:val="1031"/>
         </w:numPr>
         <w:pStyle w:val="Compact"/>
       </w:pPr>
@@ -24714,7 +25179,7 @@
       <w:pPr>
         <w:numPr>
           <w:ilvl w:val="0"/>
-          <w:numId w:val="1030"/>
+          <w:numId w:val="1031"/>
         </w:numPr>
         <w:pStyle w:val="Compact"/>
       </w:pPr>
@@ -24726,7 +25191,7 @@
       <w:pPr>
         <w:numPr>
           <w:ilvl w:val="0"/>
-          <w:numId w:val="1030"/>
+          <w:numId w:val="1031"/>
         </w:numPr>
         <w:pStyle w:val="Compact"/>
       </w:pPr>
@@ -25064,8 +25529,8 @@
         <w:t xml:space="preserve">Source: Hexenbiest and Zauberbiest template: Beautiful/Handsome; Sorcery 5; Ritual Adept 2; Vow (coven traditions). About 279 points.</w:t>
       </w:r>
     </w:p>
-    <w:bookmarkEnd w:id="109"/>
-    <w:bookmarkStart w:id="110" w:name="murcielago"/>
+    <w:bookmarkEnd w:id="110"/>
+    <w:bookmarkStart w:id="111" w:name="murcielago"/>
     <w:p>
       <w:pPr>
         <w:pStyle w:val="Heading2"/>
@@ -25110,7 +25575,7 @@
       <w:pPr>
         <w:numPr>
           <w:ilvl w:val="0"/>
-          <w:numId w:val="1031"/>
+          <w:numId w:val="1032"/>
         </w:numPr>
         <w:pStyle w:val="Compact"/>
       </w:pPr>
@@ -25370,9 +25835,9 @@
         <w:t xml:space="preserve">Source: Murcielago template: no human-form changes; Sonic Scream 6, Sonar. About 283 points.</w:t>
       </w:r>
     </w:p>
-    <w:bookmarkEnd w:id="110"/>
     <w:bookmarkEnd w:id="111"/>
-    <w:bookmarkStart w:id="122" w:name="making-your-own"/>
+    <w:bookmarkEnd w:id="112"/>
+    <w:bookmarkStart w:id="123" w:name="making-your-own"/>
     <w:p>
       <w:pPr>
         <w:pStyle w:val="Heading1"/>
@@ -25405,7 +25870,7 @@
         <w:t xml:space="preserve">option at the end of each list, and its checklist holds a custom choice to the same rules as everything else.</w:t>
       </w:r>
     </w:p>
-    <w:bookmarkStart w:id="112" w:name="a-custom-calling"/>
+    <w:bookmarkStart w:id="113" w:name="a-custom-calling"/>
     <w:p>
       <w:pPr>
         <w:pStyle w:val="Heading2"/>
@@ -25426,7 +25891,7 @@
       <w:pPr>
         <w:numPr>
           <w:ilvl w:val="0"/>
-          <w:numId w:val="1032"/>
+          <w:numId w:val="1033"/>
         </w:numPr>
         <w:pStyle w:val="Compact"/>
       </w:pPr>
@@ -25472,7 +25937,7 @@
       <w:pPr>
         <w:numPr>
           <w:ilvl w:val="0"/>
-          <w:numId w:val="1032"/>
+          <w:numId w:val="1033"/>
         </w:numPr>
         <w:pStyle w:val="Compact"/>
       </w:pPr>
@@ -25494,7 +25959,7 @@
       <w:pPr>
         <w:numPr>
           <w:ilvl w:val="0"/>
-          <w:numId w:val="1032"/>
+          <w:numId w:val="1033"/>
         </w:numPr>
         <w:pStyle w:val="Compact"/>
       </w:pPr>
@@ -25516,7 +25981,7 @@
       <w:pPr>
         <w:numPr>
           <w:ilvl w:val="0"/>
-          <w:numId w:val="1032"/>
+          <w:numId w:val="1033"/>
         </w:numPr>
         <w:pStyle w:val="Compact"/>
       </w:pPr>
@@ -25581,8 +26046,8 @@
         <w:t xml:space="preserve">.</w:t>
       </w:r>
     </w:p>
-    <w:bookmarkEnd w:id="112"/>
-    <w:bookmarkStart w:id="121" w:name="a-custom-heritage"/>
+    <w:bookmarkEnd w:id="113"/>
+    <w:bookmarkStart w:id="122" w:name="a-custom-heritage"/>
     <w:p>
       <w:pPr>
         <w:pStyle w:val="Heading2"/>
@@ -25599,7 +26064,7 @@
         <w:t xml:space="preserve">Build it with the GM, one step at a time.</w:t>
       </w:r>
     </w:p>
-    <w:bookmarkStart w:id="113" w:name="the-concept"/>
+    <w:bookmarkStart w:id="114" w:name="the-concept"/>
     <w:p>
       <w:pPr>
         <w:pStyle w:val="Heading3"/>
@@ -25616,8 +26081,8 @@
         <w:t xml:space="preserve">Two or three sentences: where they come from, what sets them apart, and how others see them. It should be something the heritages in this book don’t already cover.</w:t>
       </w:r>
     </w:p>
-    <w:bookmarkEnd w:id="113"/>
-    <w:bookmarkStart w:id="114" w:name="the-tier"/>
+    <w:bookmarkEnd w:id="114"/>
+    <w:bookmarkStart w:id="115" w:name="the-tier"/>
     <w:p>
       <w:pPr>
         <w:pStyle w:val="Heading3"/>
@@ -25914,8 +26379,8 @@
         <w:t xml:space="preserve">When in doubt, choose the higher tier.</w:t>
       </w:r>
     </w:p>
-    <w:bookmarkEnd w:id="114"/>
-    <w:bookmarkStart w:id="115" w:name="attribute-adjustments"/>
+    <w:bookmarkEnd w:id="115"/>
+    <w:bookmarkStart w:id="116" w:name="attribute-adjustments"/>
     <w:p>
       <w:pPr>
         <w:pStyle w:val="Heading3"/>
@@ -25961,8 +26426,8 @@
         <w:t xml:space="preserve">: a +2 needs a −2 or two −1s. The adjustments move the attribute’s base (+1 starts it at 11) and raise its starting maximum (13 plus the bonus). Most heritages change two to four attributes.</w:t>
       </w:r>
     </w:p>
-    <w:bookmarkEnd w:id="115"/>
-    <w:bookmarkStart w:id="116" w:name="core-rules-tier-1-and-up"/>
+    <w:bookmarkEnd w:id="116"/>
+    <w:bookmarkStart w:id="117" w:name="core-rules-tier-1-and-up"/>
     <w:p>
       <w:pPr>
         <w:pStyle w:val="Heading3"/>
@@ -25979,8 +26444,8 @@
         <w:t xml:space="preserve">One to three short rules that always apply: what they can do (see in the dark, resist cold, a free Trained skill) and what it costs (a weakness, a people’s distrust, a hazard they can’t abide). A strength with no drawback is worth more than it looks, so price it a tier higher.</w:t>
       </w:r>
     </w:p>
-    <w:bookmarkEnd w:id="116"/>
-    <w:bookmarkStart w:id="117" w:name="heritage-advantages"/>
+    <w:bookmarkEnd w:id="117"/>
+    <w:bookmarkStart w:id="118" w:name="heritage-advantages"/>
     <w:p>
       <w:pPr>
         <w:pStyle w:val="Heading3"/>
@@ -26035,8 +26500,8 @@
         <w:t xml:space="preserve">: a problem the trait causes, with a clear trigger and a real consequence, which earns a Grit point when it bites, like any complication. A character takes one advantage, general or heritage, so make them distinct choices.</w:t>
       </w:r>
     </w:p>
-    <w:bookmarkEnd w:id="117"/>
-    <w:bookmarkStart w:id="118" w:name="a-woge-optional-tier-2-or-3"/>
+    <w:bookmarkEnd w:id="118"/>
+    <w:bookmarkStart w:id="119" w:name="a-woge-optional-tier-2-or-3"/>
     <w:p>
       <w:pPr>
         <w:pStyle w:val="Heading3"/>
@@ -26069,8 +26534,8 @@
         <w:t xml:space="preserve">apply.</w:t>
       </w:r>
     </w:p>
-    <w:bookmarkEnd w:id="118"/>
-    <w:bookmarkStart w:id="119" w:name="in-the-creator"/>
+    <w:bookmarkEnd w:id="119"/>
+    <w:bookmarkStart w:id="120" w:name="in-the-creator"/>
     <w:p>
       <w:pPr>
         <w:pStyle w:val="Heading3"/>
@@ -26083,7 +26548,7 @@
       <w:pPr>
         <w:numPr>
           <w:ilvl w:val="0"/>
-          <w:numId w:val="1033"/>
+          <w:numId w:val="1034"/>
         </w:numPr>
         <w:pStyle w:val="Compact"/>
       </w:pPr>
@@ -26111,7 +26576,7 @@
       <w:pPr>
         <w:numPr>
           <w:ilvl w:val="0"/>
-          <w:numId w:val="1033"/>
+          <w:numId w:val="1034"/>
         </w:numPr>
         <w:pStyle w:val="Compact"/>
       </w:pPr>
@@ -26123,7 +26588,7 @@
       <w:pPr>
         <w:numPr>
           <w:ilvl w:val="0"/>
-          <w:numId w:val="1033"/>
+          <w:numId w:val="1034"/>
         </w:numPr>
         <w:pStyle w:val="Compact"/>
       </w:pPr>
@@ -26151,7 +26616,7 @@
       <w:pPr>
         <w:numPr>
           <w:ilvl w:val="0"/>
-          <w:numId w:val="1033"/>
+          <w:numId w:val="1034"/>
         </w:numPr>
         <w:pStyle w:val="Compact"/>
       </w:pPr>
@@ -26175,8 +26640,8 @@
         <w:t xml:space="preserve">and enter the advantage and its companion complication.</w:t>
       </w:r>
     </w:p>
-    <w:bookmarkEnd w:id="119"/>
-    <w:bookmarkStart w:id="120" w:name="example"/>
+    <w:bookmarkEnd w:id="120"/>
+    <w:bookmarkStart w:id="121" w:name="example"/>
     <w:p>
       <w:pPr>
         <w:pStyle w:val="Heading3"/>
@@ -26281,10 +26746,10 @@
         <w:t xml:space="preserve">: Wesen recognize their own, and some want you back in the fold; accept the visit at the worst time.</w:t>
       </w:r>
     </w:p>
-    <w:bookmarkEnd w:id="120"/>
     <w:bookmarkEnd w:id="121"/>
     <w:bookmarkEnd w:id="122"/>
-    <w:bookmarkStart w:id="123" w:name="complications"/>
+    <w:bookmarkEnd w:id="123"/>
+    <w:bookmarkStart w:id="124" w:name="complications"/>
     <w:p>
       <w:pPr>
         <w:pStyle w:val="Heading1"/>
@@ -27088,8 +27553,8 @@
         </w:tc>
       </w:tr>
     </w:tbl>
-    <w:bookmarkEnd w:id="123"/>
-    <w:bookmarkStart w:id="124" w:name="quick-reference"/>
+    <w:bookmarkEnd w:id="124"/>
+    <w:bookmarkStart w:id="125" w:name="quick-reference"/>
     <w:p>
       <w:pPr>
         <w:pStyle w:val="Heading1"/>
@@ -27296,7 +27761,7 @@
         <w:t xml:space="preserve">start each session with two (three with True grit). Reroll, reduce an injury by one box, or establish a small preparation. Earn one from an accepted complication.</w:t>
       </w:r>
     </w:p>
-    <w:bookmarkEnd w:id="124"/>
+    <w:bookmarkEnd w:id="125"/>
     <w:sectPr/>
   </w:body>
 </w:document>
@@ -27688,6 +28153,9 @@
     <w:abstractNumId w:val="991"/>
   </w:num>
   <w:num w:numId="1014">
+    <w:abstractNumId w:val="991"/>
+  </w:num>
+  <w:num w:numId="1015">
     <w:abstractNumId w:val="99411"/>
     <w:lvlOverride w:ilvl="0">
       <w:startOverride w:val="1"/>
@@ -27716,9 +28184,6 @@
     <w:lvlOverride w:ilvl="8">
       <w:startOverride w:val="1"/>
     </w:lvlOverride>
-  </w:num>
-  <w:num w:numId="1015">
-    <w:abstractNumId w:val="991"/>
   </w:num>
   <w:num w:numId="1016">
     <w:abstractNumId w:val="991"/>
@@ -27769,6 +28234,9 @@
     <w:abstractNumId w:val="991"/>
   </w:num>
   <w:num w:numId="1032">
+    <w:abstractNumId w:val="991"/>
+  </w:num>
+  <w:num w:numId="1033">
     <w:abstractNumId w:val="99411"/>
     <w:lvlOverride w:ilvl="0">
       <w:startOverride w:val="1"/>
@@ -27798,7 +28266,7 @@
       <w:startOverride w:val="1"/>
     </w:lvlOverride>
   </w:num>
-  <w:num w:numId="1033">
+  <w:num w:numId="1034">
     <w:abstractNumId w:val="99411"/>
     <w:lvlOverride w:ilvl="0">
       <w:startOverride w:val="1"/>

</xml_diff>

<commit_message>
Grimm: Lena Baer, a Braucher Occultist, joins the ready-made characters
Co-Authored-By: Claude Opus 5.5 <noreply@anthropic.com>
Claude-Session: https://claude.ai/code/session_015SADCFzhKijkC2foUmXrpC
</commit_message>
<xml_diff>
--- a/grimm-west/Grimm_Players_Guide.docx
+++ b/grimm-west/Grimm_Players_Guide.docx
@@ -13783,7 +13783,7 @@
     </w:p>
     <w:bookmarkEnd w:id="80"/>
     <w:bookmarkEnd w:id="81"/>
-    <w:bookmarkStart w:id="88" w:name="ready-made-characters"/>
+    <w:bookmarkStart w:id="89" w:name="ready-made-characters"/>
     <w:p>
       <w:pPr>
         <w:pStyle w:val="Heading1"/>
@@ -13797,7 +13797,7 @@
         <w:pStyle w:val="FirstParagraph"/>
       </w:pPr>
       <w:r>
-        <w:t xml:space="preserve">Six characters ready to play. Each follows the creation rules exactly, Edges included, and their connections tie them together.</w:t>
+        <w:t xml:space="preserve">Seven characters ready to play. Each follows the creation rules exactly, Edges included, and their connections tie them together.</w:t>
       </w:r>
     </w:p>
     <w:bookmarkStart w:id="82" w:name="eliza-kessler"/>
@@ -14912,14 +14912,242 @@
       </w:r>
     </w:p>
     <w:bookmarkEnd w:id="87"/>
-    <w:bookmarkEnd w:id="88"/>
-    <w:bookmarkStart w:id="89" w:name="threats"/>
-    <w:p>
-      <w:pPr>
-        <w:pStyle w:val="Heading1"/>
-      </w:pPr>
-      <w:r>
-        <w:t xml:space="preserve">Threats</w:t>
+    <w:bookmarkStart w:id="88" w:name="magdalena-lena-baer"/>
+    <w:p>
+      <w:pPr>
+        <w:pStyle w:val="Heading2"/>
+      </w:pPr>
+      <w:r>
+        <w:t xml:space="preserve">Magdalena</w:t>
+      </w:r>
+      <w:r>
+        <w:t xml:space="preserve"> </w:t>
+      </w:r>
+      <w:r>
+        <w:t xml:space="preserve">“</w:t>
+      </w:r>
+      <w:r>
+        <w:t xml:space="preserve">Lena</w:t>
+      </w:r>
+      <w:r>
+        <w:t xml:space="preserve">”</w:t>
+      </w:r>
+      <w:r>
+        <w:t xml:space="preserve"> </w:t>
+      </w:r>
+      <w:r>
+        <w:t xml:space="preserve">Baer</w:t>
+      </w:r>
+    </w:p>
+    <w:p>
+      <w:pPr>
+        <w:pStyle w:val="FirstParagraph"/>
+      </w:pPr>
+      <w:r>
+        <w:rPr>
+          <w:iCs/>
+          <w:i/>
+        </w:rPr>
+        <w:t xml:space="preserve">Pow-wow doctor, Occultist. Incantare (Tier 2).</w:t>
+      </w:r>
+      <w:r>
+        <w:t xml:space="preserve"> </w:t>
+      </w:r>
+      <w:r>
+        <w:t xml:space="preserve">Came west from Lancaster County with a wagon, a Bible and her grandmother’s</w:t>
+      </w:r>
+      <w:r>
+        <w:t xml:space="preserve"> </w:t>
+      </w:r>
+      <w:r>
+        <w:rPr>
+          <w:iCs/>
+          <w:i/>
+        </w:rPr>
+        <w:t xml:space="preserve">Long Lost Friend</w:t>
+      </w:r>
+      <w:r>
+        <w:t xml:space="preserve">. Heals for gifts, and breaks hexes for no one’s money.</w:t>
+      </w:r>
+    </w:p>
+    <w:p>
+      <w:pPr>
+        <w:numPr>
+          <w:ilvl w:val="0"/>
+          <w:numId w:val="1022"/>
+        </w:numPr>
+        <w:pStyle w:val="Compact"/>
+      </w:pPr>
+      <w:r>
+        <w:rPr>
+          <w:bCs/>
+          <w:b/>
+        </w:rPr>
+        <w:t xml:space="preserve">Attributes:</w:t>
+      </w:r>
+      <w:r>
+        <w:t xml:space="preserve"> </w:t>
+      </w:r>
+      <w:r>
+        <w:t xml:space="preserve">Body 9, Agility 10, Intellect 13, Presence 11, Will 12.</w:t>
+      </w:r>
+      <w:r>
+        <w:t xml:space="preserve"> </w:t>
+      </w:r>
+      <w:r>
+        <w:rPr>
+          <w:bCs/>
+          <w:b/>
+        </w:rPr>
+        <w:t xml:space="preserve">Dodge</w:t>
+      </w:r>
+      <w:r>
+        <w:t xml:space="preserve"> </w:t>
+      </w:r>
+      <w:r>
+        <w:t xml:space="preserve">8.</w:t>
+      </w:r>
+    </w:p>
+    <w:p>
+      <w:pPr>
+        <w:numPr>
+          <w:ilvl w:val="0"/>
+          <w:numId w:val="1022"/>
+        </w:numPr>
+        <w:pStyle w:val="Compact"/>
+      </w:pPr>
+      <w:r>
+        <w:rPr>
+          <w:bCs/>
+          <w:b/>
+        </w:rPr>
+        <w:t xml:space="preserve">Skills:</w:t>
+      </w:r>
+      <w:r>
+        <w:t xml:space="preserve"> </w:t>
+      </w:r>
+      <w:r>
+        <w:t xml:space="preserve">Occult 16 (Specialty). Trained: Wesen Lore 14, Apothecary 14, Read People 14, Medicine 14, Investigation 14, Survival 14, Persuasion 12, Riding 11, Shooting 11.</w:t>
+      </w:r>
+    </w:p>
+    <w:p>
+      <w:pPr>
+        <w:numPr>
+          <w:ilvl w:val="0"/>
+          <w:numId w:val="1022"/>
+        </w:numPr>
+        <w:pStyle w:val="Compact"/>
+      </w:pPr>
+      <w:r>
+        <w:rPr>
+          <w:bCs/>
+          <w:b/>
+        </w:rPr>
+        <w:t xml:space="preserve">Edge:</w:t>
+      </w:r>
+      <w:r>
+        <w:t xml:space="preserve"> </w:t>
+      </w:r>
+      <w:r>
+        <w:t xml:space="preserve">A friend in town: Pastor Jakob Unruh of the Volga German colony east of town, who brings her the cases his people won’t take to a doctor.</w:t>
+      </w:r>
+      <w:r>
+        <w:t xml:space="preserve"> </w:t>
+      </w:r>
+      <w:r>
+        <w:rPr>
+          <w:bCs/>
+          <w:b/>
+        </w:rPr>
+        <w:t xml:space="preserve">Lens:</w:t>
+      </w:r>
+      <w:r>
+        <w:t xml:space="preserve"> </w:t>
+      </w:r>
+      <w:r>
+        <w:t xml:space="preserve">Braucher (companion: No Payment).</w:t>
+      </w:r>
+      <w:r>
+        <w:t xml:space="preserve"> </w:t>
+      </w:r>
+      <w:r>
+        <w:rPr>
+          <w:bCs/>
+          <w:b/>
+        </w:rPr>
+        <w:t xml:space="preserve">Complication:</w:t>
+      </w:r>
+      <w:r>
+        <w:t xml:space="preserve"> </w:t>
+      </w:r>
+      <w:r>
+        <w:t xml:space="preserve">Reluctant to Kill; trigger: an enemy lies wounded and helpless in front of her.</w:t>
+      </w:r>
+    </w:p>
+    <w:p>
+      <w:pPr>
+        <w:numPr>
+          <w:ilvl w:val="0"/>
+          <w:numId w:val="1022"/>
+        </w:numPr>
+        <w:pStyle w:val="Compact"/>
+      </w:pPr>
+      <w:r>
+        <w:rPr>
+          <w:bCs/>
+          <w:b/>
+        </w:rPr>
+        <w:t xml:space="preserve">Magic:</w:t>
+      </w:r>
+      <w:r>
+        <w:t xml:space="preserve"> </w:t>
+      </w:r>
+      <w:r>
+        <w:t xml:space="preserve">works rituals with Occult at ten minutes a roll, +2 to heal, protect or break a hex; carries 3 ready charms (Occult as her Specialty). Carries a Himmelsbrief, and writes them for others.</w:t>
+      </w:r>
+    </w:p>
+    <w:p>
+      <w:pPr>
+        <w:numPr>
+          <w:ilvl w:val="0"/>
+          <w:numId w:val="1022"/>
+        </w:numPr>
+        <w:pStyle w:val="Compact"/>
+      </w:pPr>
+      <w:r>
+        <w:rPr>
+          <w:bCs/>
+          <w:b/>
+        </w:rPr>
+        <w:t xml:space="preserve">Why I stand against the dark:</w:t>
+      </w:r>
+      <w:r>
+        <w:t xml:space="preserve"> </w:t>
+      </w:r>
+      <w:r>
+        <w:t xml:space="preserve">My grandmother taught me the words, and the words are for using.</w:t>
+      </w:r>
+      <w:r>
+        <w:t xml:space="preserve"> </w:t>
+      </w:r>
+      <w:r>
+        <w:rPr>
+          <w:bCs/>
+          <w:b/>
+        </w:rPr>
+        <w:t xml:space="preserve">Connection:</w:t>
+      </w:r>
+      <w:r>
+        <w:t xml:space="preserve"> </w:t>
+      </w:r>
+      <w:r>
+        <w:t xml:space="preserve">Dr. Whitlock calls her a superstitious old woman, and sends his hopeless cases to her door after dark.</w:t>
+      </w:r>
+      <w:r>
+        <w:t xml:space="preserve"> </w:t>
+      </w:r>
+      <w:r>
+        <w:t xml:space="preserve"># Threats</w:t>
       </w:r>
     </w:p>
     <w:p>
@@ -16184,6 +16412,7 @@
         <w:t xml:space="preserve">For a tougher version, add +1 to its targets and one box; for a weaker one, subtract.</w:t>
       </w:r>
     </w:p>
+    <w:bookmarkEnd w:id="88"/>
     <w:bookmarkEnd w:id="89"/>
     <w:bookmarkStart w:id="90" w:name="advantages"/>
     <w:p>
@@ -18951,7 +19180,7 @@
       <w:pPr>
         <w:numPr>
           <w:ilvl w:val="0"/>
-          <w:numId w:val="1022"/>
+          <w:numId w:val="1023"/>
         </w:numPr>
         <w:pStyle w:val="Compact"/>
       </w:pPr>
@@ -20729,7 +20958,7 @@
       <w:pPr>
         <w:numPr>
           <w:ilvl w:val="0"/>
-          <w:numId w:val="1023"/>
+          <w:numId w:val="1024"/>
         </w:numPr>
         <w:pStyle w:val="Compact"/>
       </w:pPr>
@@ -20741,7 +20970,7 @@
       <w:pPr>
         <w:numPr>
           <w:ilvl w:val="0"/>
-          <w:numId w:val="1023"/>
+          <w:numId w:val="1024"/>
         </w:numPr>
         <w:pStyle w:val="Compact"/>
       </w:pPr>
@@ -21345,7 +21574,7 @@
       <w:pPr>
         <w:numPr>
           <w:ilvl w:val="0"/>
-          <w:numId w:val="1024"/>
+          <w:numId w:val="1025"/>
         </w:numPr>
         <w:pStyle w:val="Compact"/>
       </w:pPr>
@@ -21713,7 +21942,7 @@
       <w:pPr>
         <w:numPr>
           <w:ilvl w:val="0"/>
-          <w:numId w:val="1025"/>
+          <w:numId w:val="1026"/>
         </w:numPr>
         <w:pStyle w:val="Compact"/>
       </w:pPr>
@@ -21725,7 +21954,7 @@
       <w:pPr>
         <w:numPr>
           <w:ilvl w:val="0"/>
-          <w:numId w:val="1025"/>
+          <w:numId w:val="1026"/>
         </w:numPr>
         <w:pStyle w:val="Compact"/>
       </w:pPr>
@@ -21737,7 +21966,7 @@
       <w:pPr>
         <w:numPr>
           <w:ilvl w:val="0"/>
-          <w:numId w:val="1025"/>
+          <w:numId w:val="1026"/>
         </w:numPr>
         <w:pStyle w:val="Compact"/>
       </w:pPr>
@@ -21749,7 +21978,7 @@
       <w:pPr>
         <w:numPr>
           <w:ilvl w:val="0"/>
-          <w:numId w:val="1025"/>
+          <w:numId w:val="1026"/>
         </w:numPr>
         <w:pStyle w:val="Compact"/>
       </w:pPr>
@@ -21761,7 +21990,7 @@
       <w:pPr>
         <w:numPr>
           <w:ilvl w:val="0"/>
-          <w:numId w:val="1025"/>
+          <w:numId w:val="1026"/>
         </w:numPr>
         <w:pStyle w:val="Compact"/>
       </w:pPr>
@@ -21773,7 +22002,7 @@
       <w:pPr>
         <w:numPr>
           <w:ilvl w:val="0"/>
-          <w:numId w:val="1025"/>
+          <w:numId w:val="1026"/>
         </w:numPr>
         <w:pStyle w:val="Compact"/>
       </w:pPr>
@@ -21785,7 +22014,7 @@
       <w:pPr>
         <w:numPr>
           <w:ilvl w:val="0"/>
-          <w:numId w:val="1025"/>
+          <w:numId w:val="1026"/>
         </w:numPr>
         <w:pStyle w:val="Compact"/>
       </w:pPr>
@@ -22631,7 +22860,7 @@
       <w:pPr>
         <w:numPr>
           <w:ilvl w:val="0"/>
-          <w:numId w:val="1026"/>
+          <w:numId w:val="1027"/>
         </w:numPr>
         <w:pStyle w:val="Compact"/>
       </w:pPr>
@@ -22643,7 +22872,7 @@
       <w:pPr>
         <w:numPr>
           <w:ilvl w:val="0"/>
-          <w:numId w:val="1026"/>
+          <w:numId w:val="1027"/>
         </w:numPr>
         <w:pStyle w:val="Compact"/>
       </w:pPr>
@@ -22655,7 +22884,7 @@
       <w:pPr>
         <w:numPr>
           <w:ilvl w:val="0"/>
-          <w:numId w:val="1026"/>
+          <w:numId w:val="1027"/>
         </w:numPr>
         <w:pStyle w:val="Compact"/>
       </w:pPr>
@@ -23597,7 +23826,7 @@
       <w:pPr>
         <w:numPr>
           <w:ilvl w:val="0"/>
-          <w:numId w:val="1027"/>
+          <w:numId w:val="1028"/>
         </w:numPr>
         <w:pStyle w:val="Compact"/>
       </w:pPr>
@@ -23903,7 +24132,7 @@
       <w:pPr>
         <w:numPr>
           <w:ilvl w:val="0"/>
-          <w:numId w:val="1028"/>
+          <w:numId w:val="1029"/>
         </w:numPr>
         <w:pStyle w:val="Compact"/>
       </w:pPr>
@@ -24491,7 +24720,7 @@
       <w:pPr>
         <w:numPr>
           <w:ilvl w:val="0"/>
-          <w:numId w:val="1029"/>
+          <w:numId w:val="1030"/>
         </w:numPr>
         <w:pStyle w:val="Compact"/>
       </w:pPr>
@@ -24503,7 +24732,7 @@
       <w:pPr>
         <w:numPr>
           <w:ilvl w:val="0"/>
-          <w:numId w:val="1029"/>
+          <w:numId w:val="1030"/>
         </w:numPr>
         <w:pStyle w:val="Compact"/>
       </w:pPr>
@@ -24515,7 +24744,7 @@
       <w:pPr>
         <w:numPr>
           <w:ilvl w:val="0"/>
-          <w:numId w:val="1029"/>
+          <w:numId w:val="1030"/>
         </w:numPr>
         <w:pStyle w:val="Compact"/>
       </w:pPr>
@@ -24527,7 +24756,7 @@
       <w:pPr>
         <w:numPr>
           <w:ilvl w:val="0"/>
-          <w:numId w:val="1029"/>
+          <w:numId w:val="1030"/>
         </w:numPr>
         <w:pStyle w:val="Compact"/>
       </w:pPr>
@@ -24833,7 +25062,7 @@
       <w:pPr>
         <w:numPr>
           <w:ilvl w:val="0"/>
-          <w:numId w:val="1030"/>
+          <w:numId w:val="1031"/>
         </w:numPr>
         <w:pStyle w:val="Compact"/>
       </w:pPr>
@@ -24845,7 +25074,7 @@
       <w:pPr>
         <w:numPr>
           <w:ilvl w:val="0"/>
-          <w:numId w:val="1030"/>
+          <w:numId w:val="1031"/>
         </w:numPr>
         <w:pStyle w:val="Compact"/>
       </w:pPr>
@@ -25167,7 +25396,7 @@
       <w:pPr>
         <w:numPr>
           <w:ilvl w:val="0"/>
-          <w:numId w:val="1031"/>
+          <w:numId w:val="1032"/>
         </w:numPr>
         <w:pStyle w:val="Compact"/>
       </w:pPr>
@@ -25179,7 +25408,7 @@
       <w:pPr>
         <w:numPr>
           <w:ilvl w:val="0"/>
-          <w:numId w:val="1031"/>
+          <w:numId w:val="1032"/>
         </w:numPr>
         <w:pStyle w:val="Compact"/>
       </w:pPr>
@@ -25191,7 +25420,7 @@
       <w:pPr>
         <w:numPr>
           <w:ilvl w:val="0"/>
-          <w:numId w:val="1031"/>
+          <w:numId w:val="1032"/>
         </w:numPr>
         <w:pStyle w:val="Compact"/>
       </w:pPr>
@@ -25575,7 +25804,7 @@
       <w:pPr>
         <w:numPr>
           <w:ilvl w:val="0"/>
-          <w:numId w:val="1032"/>
+          <w:numId w:val="1033"/>
         </w:numPr>
         <w:pStyle w:val="Compact"/>
       </w:pPr>
@@ -25891,7 +26120,7 @@
       <w:pPr>
         <w:numPr>
           <w:ilvl w:val="0"/>
-          <w:numId w:val="1033"/>
+          <w:numId w:val="1034"/>
         </w:numPr>
         <w:pStyle w:val="Compact"/>
       </w:pPr>
@@ -25937,7 +26166,7 @@
       <w:pPr>
         <w:numPr>
           <w:ilvl w:val="0"/>
-          <w:numId w:val="1033"/>
+          <w:numId w:val="1034"/>
         </w:numPr>
         <w:pStyle w:val="Compact"/>
       </w:pPr>
@@ -25959,7 +26188,7 @@
       <w:pPr>
         <w:numPr>
           <w:ilvl w:val="0"/>
-          <w:numId w:val="1033"/>
+          <w:numId w:val="1034"/>
         </w:numPr>
         <w:pStyle w:val="Compact"/>
       </w:pPr>
@@ -25981,7 +26210,7 @@
       <w:pPr>
         <w:numPr>
           <w:ilvl w:val="0"/>
-          <w:numId w:val="1033"/>
+          <w:numId w:val="1034"/>
         </w:numPr>
         <w:pStyle w:val="Compact"/>
       </w:pPr>
@@ -26548,7 +26777,7 @@
       <w:pPr>
         <w:numPr>
           <w:ilvl w:val="0"/>
-          <w:numId w:val="1034"/>
+          <w:numId w:val="1035"/>
         </w:numPr>
         <w:pStyle w:val="Compact"/>
       </w:pPr>
@@ -26576,7 +26805,7 @@
       <w:pPr>
         <w:numPr>
           <w:ilvl w:val="0"/>
-          <w:numId w:val="1034"/>
+          <w:numId w:val="1035"/>
         </w:numPr>
         <w:pStyle w:val="Compact"/>
       </w:pPr>
@@ -26588,7 +26817,7 @@
       <w:pPr>
         <w:numPr>
           <w:ilvl w:val="0"/>
-          <w:numId w:val="1034"/>
+          <w:numId w:val="1035"/>
         </w:numPr>
         <w:pStyle w:val="Compact"/>
       </w:pPr>
@@ -26616,7 +26845,7 @@
       <w:pPr>
         <w:numPr>
           <w:ilvl w:val="0"/>
-          <w:numId w:val="1034"/>
+          <w:numId w:val="1035"/>
         </w:numPr>
         <w:pStyle w:val="Compact"/>
       </w:pPr>
@@ -28237,6 +28466,9 @@
     <w:abstractNumId w:val="991"/>
   </w:num>
   <w:num w:numId="1033">
+    <w:abstractNumId w:val="991"/>
+  </w:num>
+  <w:num w:numId="1034">
     <w:abstractNumId w:val="99411"/>
     <w:lvlOverride w:ilvl="0">
       <w:startOverride w:val="1"/>
@@ -28266,7 +28498,7 @@
       <w:startOverride w:val="1"/>
     </w:lvlOverride>
   </w:num>
-  <w:num w:numId="1034">
+  <w:num w:numId="1035">
     <w:abstractNumId w:val="99411"/>
     <w:lvlOverride w:ilvl="0">
       <w:startOverride w:val="1"/>

</xml_diff>

<commit_message>
Grimm: remove GURPS template source notes
Drops the per-heritage source lines (template names, point totals) from the
data, the creator and the Players' Guide, the conversion plan document, and
the README's pointer to it.

Co-Authored-By: Claude Opus 5.5 <noreply@anthropic.com>
Claude-Session: https://claude.ai/code/session_015SADCFzhKijkC2foUmXrpC
</commit_message>
<xml_diff>
--- a/grimm-west/Grimm_Players_Guide.docx
+++ b/grimm-west/Grimm_Players_Guide.docx
@@ -19122,18 +19122,6 @@
         </w:tc>
       </w:tr>
     </w:tbl>
-    <w:p>
-      <w:pPr>
-        <w:pStyle w:val="BodyText"/>
-      </w:pPr>
-      <w:r>
-        <w:rPr>
-          <w:iCs/>
-          <w:i/>
-        </w:rPr>
-        <w:t xml:space="preserve">Source: No template</w:t>
-      </w:r>
-    </w:p>
     <w:bookmarkEnd w:id="92"/>
     <w:bookmarkStart w:id="93" w:name="bauerschwein"/>
     <w:p>
@@ -19428,18 +19416,6 @@
         </w:tc>
       </w:tr>
     </w:tbl>
-    <w:p>
-      <w:pPr>
-        <w:pStyle w:val="BodyText"/>
-      </w:pPr>
-      <w:r>
-        <w:rPr>
-          <w:iCs/>
-          <w:i/>
-        </w:rPr>
-        <w:t xml:space="preserve">Source: No template; adapted from the show.</w:t>
-      </w:r>
-    </w:p>
     <w:bookmarkEnd w:id="93"/>
     <w:bookmarkStart w:id="94" w:name="coyotl"/>
     <w:p>
@@ -19710,18 +19686,6 @@
         </w:tc>
       </w:tr>
     </w:tbl>
-    <w:p>
-      <w:pPr>
-        <w:pStyle w:val="BodyText"/>
-      </w:pPr>
-      <w:r>
-        <w:rPr>
-          <w:iCs/>
-          <w:i/>
-        </w:rPr>
-        <w:t xml:space="preserve">Source: Coyotl template: DX +2, HT +1, ST +2. About 141 points.</w:t>
-      </w:r>
-    </w:p>
     <w:bookmarkEnd w:id="94"/>
     <w:bookmarkStart w:id="95" w:name="eisbiber"/>
     <w:p>
@@ -19992,18 +19956,6 @@
         </w:tc>
       </w:tr>
     </w:tbl>
-    <w:p>
-      <w:pPr>
-        <w:pStyle w:val="BodyText"/>
-      </w:pPr>
-      <w:r>
-        <w:rPr>
-          <w:iCs/>
-          <w:i/>
-        </w:rPr>
-        <w:t xml:space="preserve">Source: No template; adapted from the show.</w:t>
-      </w:r>
-    </w:p>
     <w:bookmarkEnd w:id="95"/>
     <w:bookmarkStart w:id="96" w:name="fuchsbau"/>
     <w:p>
@@ -20336,18 +20288,6 @@
         </w:tc>
       </w:tr>
     </w:tbl>
-    <w:p>
-      <w:pPr>
-        <w:pStyle w:val="BodyText"/>
-      </w:pPr>
-      <w:r>
-        <w:rPr>
-          <w:iCs/>
-          <w:i/>
-        </w:rPr>
-        <w:t xml:space="preserve">Source: Fuchsbau template: IQ +2; Bad Reputation (disreputable among Wesen). About 132 points.</w:t>
-      </w:r>
-    </w:p>
     <w:bookmarkEnd w:id="96"/>
     <w:bookmarkStart w:id="97" w:name="mauzhertz"/>
     <w:p>
@@ -20618,18 +20558,6 @@
         </w:tc>
       </w:tr>
     </w:tbl>
-    <w:p>
-      <w:pPr>
-        <w:pStyle w:val="BodyText"/>
-      </w:pPr>
-      <w:r>
-        <w:rPr>
-          <w:iCs/>
-          <w:i/>
-        </w:rPr>
-        <w:t xml:space="preserve">Source: No template; adapted from the show.</w:t>
-      </w:r>
-    </w:p>
     <w:bookmarkEnd w:id="97"/>
     <w:bookmarkStart w:id="98" w:name="steinadler"/>
     <w:p>
@@ -20900,18 +20828,6 @@
         </w:tc>
       </w:tr>
     </w:tbl>
-    <w:p>
-      <w:pPr>
-        <w:pStyle w:val="BodyText"/>
-      </w:pPr>
-      <w:r>
-        <w:rPr>
-          <w:iCs/>
-          <w:i/>
-        </w:rPr>
-        <w:t xml:space="preserve">Source: No template; adapted from the show.</w:t>
-      </w:r>
-    </w:p>
     <w:bookmarkEnd w:id="98"/>
     <w:bookmarkStart w:id="99" w:name="taniwha"/>
     <w:p>
@@ -21234,18 +21150,6 @@
         </w:tc>
       </w:tr>
     </w:tbl>
-    <w:p>
-      <w:pPr>
-        <w:pStyle w:val="BodyText"/>
-      </w:pPr>
-      <w:r>
-        <w:rPr>
-          <w:iCs/>
-          <w:i/>
-        </w:rPr>
-        <w:t xml:space="preserve">Source: Taniwha template (150-point): poison resistance; Dependency (human flesh, seasonal). About 157 points.</w:t>
-      </w:r>
-    </w:p>
     <w:bookmarkEnd w:id="99"/>
     <w:bookmarkStart w:id="100" w:name="ziegevolk"/>
     <w:p>
@@ -21516,18 +21420,6 @@
         </w:tc>
       </w:tr>
     </w:tbl>
-    <w:p>
-      <w:pPr>
-        <w:pStyle w:val="BodyText"/>
-      </w:pPr>
-      <w:r>
-        <w:rPr>
-          <w:iCs/>
-          <w:i/>
-        </w:rPr>
-        <w:t xml:space="preserve">Source: No template; adapted from the show.</w:t>
-      </w:r>
-    </w:p>
     <w:bookmarkEnd w:id="100"/>
     <w:bookmarkStart w:id="101" w:name="blutbad"/>
     <w:p>
@@ -21884,18 +21776,6 @@
         </w:tc>
       </w:tr>
     </w:tbl>
-    <w:p>
-      <w:pPr>
-        <w:pStyle w:val="BodyText"/>
-      </w:pPr>
-      <w:r>
-        <w:rPr>
-          <w:iCs/>
-          <w:i/>
-        </w:rPr>
-        <w:t xml:space="preserve">Source: Blutbaad template: DX +3, HT +2, ST +2; Loner; Enemy (Bauerschwein). About 208 points.</w:t>
-      </w:r>
-    </w:p>
     <w:bookmarkEnd w:id="101"/>
     <w:bookmarkStart w:id="102" w:name="grimm"/>
     <w:p>
@@ -22802,18 +22682,6 @@
         </w:tc>
       </w:tr>
     </w:tbl>
-    <w:p>
-      <w:pPr>
-        <w:pStyle w:val="BodyText"/>
-      </w:pPr>
-      <w:r>
-        <w:rPr>
-          <w:iCs/>
-          <w:i/>
-        </w:rPr>
-        <w:t xml:space="preserve">Source: Decapitare template: ST, DX, HT +1; Combat Reflexes; Detect (Wesen, Magic); Magic Resistance 7; Talent (Grimm); Reputation (Frightening Decapitare).</w:t>
-      </w:r>
-    </w:p>
     <w:bookmarkEnd w:id="102"/>
     <w:bookmarkStart w:id="103" w:name="incantare"/>
     <w:p>
@@ -23486,18 +23354,6 @@
         </w:tc>
       </w:tr>
     </w:tbl>
-    <w:p>
-      <w:pPr>
-        <w:pStyle w:val="BodyText"/>
-      </w:pPr>
-      <w:r>
-        <w:rPr>
-          <w:iCs/>
-          <w:i/>
-        </w:rPr>
-        <w:t xml:space="preserve">Source: Incantare template: seven Lenses (Ritual Path Magic), plus the Braucher.</w:t>
-      </w:r>
-    </w:p>
     <w:bookmarkEnd w:id="103"/>
     <w:bookmarkStart w:id="104" w:name="jägerbär"/>
     <w:p>
@@ -23768,18 +23624,6 @@
         </w:tc>
       </w:tr>
     </w:tbl>
-    <w:p>
-      <w:pPr>
-        <w:pStyle w:val="BodyText"/>
-      </w:pPr>
-      <w:r>
-        <w:rPr>
-          <w:iCs/>
-          <w:i/>
-        </w:rPr>
-        <w:t xml:space="preserve">Source: No template; adapted from the show.</w:t>
-      </w:r>
-    </w:p>
     <w:bookmarkEnd w:id="104"/>
     <w:bookmarkStart w:id="105" w:name="mauvais-dentes"/>
     <w:p>
@@ -24074,18 +23918,6 @@
         </w:tc>
       </w:tr>
     </w:tbl>
-    <w:p>
-      <w:pPr>
-        <w:pStyle w:val="BodyText"/>
-      </w:pPr>
-      <w:r>
-        <w:rPr>
-          <w:iCs/>
-          <w:i/>
-        </w:rPr>
-        <w:t xml:space="preserve">Source: Mauvais Dentes template: DX +2, HT +3, ST +3; Loner. About 213 points.</w:t>
-      </w:r>
-    </w:p>
     <w:bookmarkEnd w:id="105"/>
     <w:bookmarkStart w:id="106" w:name="naschazer"/>
     <w:p>
@@ -24380,18 +24212,6 @@
         </w:tc>
       </w:tr>
     </w:tbl>
-    <w:p>
-      <w:pPr>
-        <w:pStyle w:val="BodyText"/>
-      </w:pPr>
-      <w:r>
-        <w:rPr>
-          <w:iCs/>
-          <w:i/>
-        </w:rPr>
-        <w:t xml:space="preserve">Source: Naschazer template: HT +4; Dependency and Uncontrollable Appetite (human flesh); Greed; Proud. About 197 points.</w:t>
-      </w:r>
-    </w:p>
     <w:bookmarkEnd w:id="106"/>
     <w:bookmarkStart w:id="107" w:name="skalengeck"/>
     <w:p>
@@ -24662,18 +24482,6 @@
         </w:tc>
       </w:tr>
     </w:tbl>
-    <w:p>
-      <w:pPr>
-        <w:pStyle w:val="BodyText"/>
-      </w:pPr>
-      <w:r>
-        <w:rPr>
-          <w:iCs/>
-          <w:i/>
-        </w:rPr>
-        <w:t xml:space="preserve">Source: Skalengeck template: no human-form changes. About 189 points.</w:t>
-      </w:r>
-    </w:p>
     <w:bookmarkEnd w:id="107"/>
     <w:bookmarkStart w:id="108" w:name="vallachi"/>
     <w:p>
@@ -25004,18 +24812,6 @@
         </w:tc>
       </w:tr>
     </w:tbl>
-    <w:p>
-      <w:pPr>
-        <w:pStyle w:val="BodyText"/>
-      </w:pPr>
-      <w:r>
-        <w:rPr>
-          <w:iCs/>
-          <w:i/>
-        </w:rPr>
-        <w:t xml:space="preserve">Source: Vallachi template: Attractive; Extended Lifespan; HT +2; Dependency and Uncontrollable Appetite (lifeforce); Weakness (sunlight); Lifebane. About 223 points.</w:t>
-      </w:r>
-    </w:p>
     <w:bookmarkEnd w:id="108"/>
     <w:bookmarkStart w:id="109" w:name="fuchsteufelwild"/>
     <w:p>
@@ -25338,18 +25134,6 @@
         </w:tc>
       </w:tr>
     </w:tbl>
-    <w:p>
-      <w:pPr>
-        <w:pStyle w:val="BodyText"/>
-      </w:pPr>
-      <w:r>
-        <w:rPr>
-          <w:iCs/>
-          <w:i/>
-        </w:rPr>
-        <w:t xml:space="preserve">Source: Fuchsteurfelwild template: ST +1, HT +2, IQ +3, Super Jump 5; Obsession (Guess My Name); Bully; Callous; Sadism (now a companion). About 424 points; trimmed to Tier 3.</w:t>
-      </w:r>
-    </w:p>
     <w:bookmarkEnd w:id="109"/>
     <w:bookmarkStart w:id="110" w:name="hexenbiest-or-zauberbiest"/>
     <w:p>
@@ -25746,18 +25530,6 @@
         </w:tc>
       </w:tr>
     </w:tbl>
-    <w:p>
-      <w:pPr>
-        <w:pStyle w:val="BodyText"/>
-      </w:pPr>
-      <w:r>
-        <w:rPr>
-          <w:iCs/>
-          <w:i/>
-        </w:rPr>
-        <w:t xml:space="preserve">Source: Hexenbiest and Zauberbiest template: Beautiful/Handsome; Sorcery 5; Ritual Adept 2; Vow (coven traditions). About 279 points.</w:t>
-      </w:r>
-    </w:p>
     <w:bookmarkEnd w:id="110"/>
     <w:bookmarkStart w:id="111" w:name="murcielago"/>
     <w:p>
@@ -26052,18 +25824,6 @@
         </w:tc>
       </w:tr>
     </w:tbl>
-    <w:p>
-      <w:pPr>
-        <w:pStyle w:val="BodyText"/>
-      </w:pPr>
-      <w:r>
-        <w:rPr>
-          <w:iCs/>
-          <w:i/>
-        </w:rPr>
-        <w:t xml:space="preserve">Source: Murcielago template: no human-form changes; Sonic Scream 6, Sonar. About 283 points.</w:t>
-      </w:r>
-    </w:p>
     <w:bookmarkEnd w:id="111"/>
     <w:bookmarkEnd w:id="112"/>
     <w:bookmarkStart w:id="123" w:name="making-your-own"/>

</xml_diff>

<commit_message>
Grimm: Block, with a shield or whatever comes to hand
- Block: once a round, as well as your one Dodge, against a blade, club,
  claws, fangs, fists or an arrow: Melee -2, or -1 with a real shield.
  Never a bullet. An improvised shield (a chair, a wooden slat, a crate
  lid, a saddle) breaks the first time it blocks a hit of 2+ boxes.
- Shield (gear): a hide shield or an iron-bound buckler; some Grimm
  families keep one with the old weapons.
- Creator: Block options in the roller (woge bonuses apply), the quick
  reference, and the guide.

Co-Authored-By: Claude Opus 5.5 <noreply@anthropic.com>
Claude-Session: https://claude.ai/code/session_015SADCFzhKijkC2foUmXrpC
</commit_message>
<xml_diff>
--- a/grimm-west/Grimm_Players_Guide.docx
+++ b/grimm-west/Grimm_Players_Guide.docx
@@ -5008,6 +5008,39 @@
                 <w:b/>
                 <w:sz w:val="19"/>
               </w:rPr>
+              <w:t xml:space="preserve">Shield</w:t>
+            </w:r>
+          </w:p>
+        </w:tc>
+        <w:tc>
+          <w:tcPr/>
+          <w:p>
+            <w:pPr>
+              <w:pStyle w:val="Compact"/>
+              <w:jc w:val="left"/>
+            </w:pPr>
+            <w:r>
+              <w:rPr>
+                <w:sz w:val="19"/>
+              </w:rPr>
+              <w:t xml:space="preserve">A hide shield or an iron-bound buckler, rare in the West; some Grimm families keep one with the old weapons. You Block at +1.</w:t>
+            </w:r>
+          </w:p>
+        </w:tc>
+      </w:tr>
+      <w:tr>
+        <w:tc>
+          <w:tcPr/>
+          <w:p>
+            <w:pPr>
+              <w:pStyle w:val="Compact"/>
+              <w:jc w:val="left"/>
+            </w:pPr>
+            <w:r>
+              <w:rPr>
+                <w:b/>
+                <w:sz w:val="19"/>
+              </w:rPr>
               <w:t xml:space="preserve">Trail kit</w:t>
             </w:r>
           </w:p>
@@ -7764,6 +7797,24 @@
         <w:t xml:space="preserve">Solid cover blocks a shot. Partial cover imposes −2 on the attack. Weapon effects apply after a hit survives any Dodge. Success margin does not increase damage.</w:t>
       </w:r>
     </w:p>
+    <w:p>
+      <w:pPr>
+        <w:pStyle w:val="BodyText"/>
+      </w:pPr>
+      <w:r>
+        <w:rPr>
+          <w:bCs/>
+          <w:b/>
+        </w:rPr>
+        <w:t xml:space="preserve">Block.</w:t>
+      </w:r>
+      <w:r>
+        <w:t xml:space="preserve"> </w:t>
+      </w:r>
+      <w:r>
+        <w:t xml:space="preserve">With a shield, or anything that can stand in for one (a chair, a wooden slat, a crate lid, a saddle), you can block a blade, a club, claws, fangs, fists or an arrow instead of Dodging: roll Melee −2, or Melee −1 with a real shield. You can Block once a round, as well as your one Dodge. Nothing you can lift blocks a bullet. An improvised shield breaks the first time it blocks a hit of 2 or more boxes: a chair stops one swipe of a Blutbad’s claws, and then it’s kindling.</w:t>
+      </w:r>
+    </w:p>
     <w:bookmarkEnd w:id="61"/>
     <w:bookmarkStart w:id="62" w:name="range"/>
     <w:p>
@@ -8522,7 +8573,7 @@
         <w:pStyle w:val="FirstParagraph"/>
       </w:pPr>
       <w:r>
-        <w:t xml:space="preserve">Your protection is avoiding the hit: Dodge, cover, and a Grit point, which reduces a hit by one box.</w:t>
+        <w:t xml:space="preserve">Your protection is avoiding the hit: Dodge, a Block, cover, and a Grit point, which reduces a hit by one box.</w:t>
       </w:r>
     </w:p>
     <w:bookmarkEnd w:id="63"/>

</xml_diff>

<commit_message>
Grimm: one defense a round; Additional Defense Edge
- A target gets one defense a round: a Dodge or a Block. Block no longer
  comes on top of the Dodge.
- Additional Defense (1 Edge): defend twice a round, in any mix.
- Sheet note, quick reference and guide updated.

Co-Authored-By: Claude Opus 5.5 <noreply@anthropic.com>
Claude-Session: https://claude.ai/code/session_015SADCFzhKijkC2foUmXrpC
</commit_message>
<xml_diff>
--- a/grimm-west/Grimm_Players_Guide.docx
+++ b/grimm-west/Grimm_Players_Guide.docx
@@ -2229,6 +2229,54 @@
           </w:p>
         </w:tc>
       </w:tr>
+      <w:tr>
+        <w:tc>
+          <w:tcPr/>
+          <w:p>
+            <w:pPr>
+              <w:pStyle w:val="Compact"/>
+              <w:jc w:val="left"/>
+            </w:pPr>
+            <w:r>
+              <w:rPr>
+                <w:b/>
+                <w:sz w:val="19"/>
+              </w:rPr>
+              <w:t xml:space="preserve">Additional Defense</w:t>
+            </w:r>
+          </w:p>
+        </w:tc>
+        <w:tc>
+          <w:tcPr/>
+          <w:p>
+            <w:pPr>
+              <w:pStyle w:val="Compact"/>
+              <w:jc w:val="left"/>
+            </w:pPr>
+            <w:r>
+              <w:rPr>
+                <w:sz w:val="19"/>
+              </w:rPr>
+              <w:t xml:space="preserve">Defend twice a round instead of once: Dodge or Block, in any mix.</w:t>
+            </w:r>
+          </w:p>
+        </w:tc>
+        <w:tc>
+          <w:tcPr/>
+          <w:p>
+            <w:pPr>
+              <w:pStyle w:val="Compact"/>
+              <w:jc w:val="left"/>
+            </w:pPr>
+            <w:r>
+              <w:rPr>
+                <w:sz w:val="19"/>
+              </w:rPr>
+              <w:t xml:space="preserve">1</w:t>
+            </w:r>
+          </w:p>
+        </w:tc>
+      </w:tr>
     </w:tbl>
     <w:bookmarkEnd w:id="26"/>
     <w:bookmarkStart w:id="27" w:name="spending-points"/>
@@ -7786,7 +7834,7 @@
         <w:pStyle w:val="FirstParagraph"/>
       </w:pPr>
       <w:r>
-        <w:t xml:space="preserve">Roll Shooting for a ranged attack, Melee for a weapon in hand, or Brawling for fists and grappling. If the attack succeeds, an aware target able to move may attempt Dodge. Dodge is Agility −2, with +1 for Trained Athletics or +2 for Athletics as a Specialty or Expert. Each target gets one Dodge attempt per round. A successful Dodge cancels the hit. Apply injury penalties to Dodge.</w:t>
+        <w:t xml:space="preserve">Roll Shooting for a ranged attack, Melee for a weapon in hand, or Brawling for fists and grappling. If the attack succeeds, an aware target able to move may attempt Dodge. Dodge is Agility −2, with +1 for Trained Athletics or +2 for Athletics as a Specialty or Expert. Each target gets one defense per round: a Dodge, or a Block (below). The Additional Defense Edge gives a second. A successful Dodge cancels the hit. Apply injury penalties to Dodge.</w:t>
       </w:r>
     </w:p>
     <w:p>
@@ -7812,7 +7860,7 @@
         <w:t xml:space="preserve"> </w:t>
       </w:r>
       <w:r>
-        <w:t xml:space="preserve">With a shield, or anything that can stand in for one (a chair, a wooden slat, a crate lid, a saddle), you can block a blade, a club, claws, fangs, fists or an arrow instead of Dodging: roll Melee −2, or Melee −1 with a real shield. You can Block once a round, as well as your one Dodge. Nothing you can lift blocks a bullet. An improvised shield breaks the first time it blocks a hit of 2 or more boxes: a chair stops one swipe of a Blutbad’s claws, and then it’s kindling.</w:t>
+        <w:t xml:space="preserve">With a shield, or anything that can stand in for one (a chair, a wooden slat, a crate lid, a saddle), you can block a blade, a club, claws, fangs, fists or an arrow instead of Dodging: roll Melee −2, or Melee −1 with a real shield. A Block is your one defense for the round. Nothing you can lift blocks a bullet. An improvised shield breaks the first time it blocks a hit of 2 or more boxes: a chair stops one swipe of a Blutbad’s claws, and then it’s kindling.</w:t>
       </w:r>
     </w:p>
     <w:bookmarkEnd w:id="61"/>

</xml_diff>

<commit_message>
Grimm: the core attack and defense rules, Grimm's way
- Parry: Melee -3 with a weapon in hand, against fists, claws, fangs and
  blades; Brawling -3 bare-handed against fists only. A second parry -2.
- Attack quality: succeeded by 3-4, defense -1; 5-6, -2; 7+, -3.
- Aim: +1; Careful Marksman and Hunter's Eye add their +2; a Gunslinger
  doesn't need to aim.
- One defense a round now covers Dodge, Parry and Block; Additional Defense
  gives a second. No heavy coat.
- Creator: Parry in the roller and on the sheet, the attack-quality and
  second-parry penalties, an Aimed box, a Defending quick reference line.
  Guide example with a Blutbad.

Co-Authored-By: Claude Opus 5.5 <noreply@anthropic.com>
Claude-Session: https://claude.ai/code/session_015SADCFzhKijkC2foUmXrpC
</commit_message>
<xml_diff>
--- a/grimm-west/Grimm_Players_Guide.docx
+++ b/grimm-west/Grimm_Players_Guide.docx
@@ -2257,7 +2257,7 @@
               <w:rPr>
                 <w:sz w:val="19"/>
               </w:rPr>
-              <w:t xml:space="preserve">Defend twice a round instead of once: Dodge or Block, in any mix.</w:t>
+              <w:t xml:space="preserve">A second defense each round: Dodge, Parry or Block, in any mix. A second parry is still −2.</w:t>
             </w:r>
           </w:p>
         </w:tc>
@@ -7834,33 +7834,242 @@
         <w:pStyle w:val="FirstParagraph"/>
       </w:pPr>
       <w:r>
-        <w:t xml:space="preserve">Roll Shooting for a ranged attack, Melee for a weapon in hand, or Brawling for fists and grappling. If the attack succeeds, an aware target able to move may attempt Dodge. Dodge is Agility −2, with +1 for Trained Athletics or +2 for Athletics as a Specialty or Expert. Each target gets one defense per round: a Dodge, or a Block (below). The Additional Defense Edge gives a second. A successful Dodge cancels the hit. Apply injury penalties to Dodge.</w:t>
-      </w:r>
-    </w:p>
-    <w:p>
-      <w:pPr>
-        <w:pStyle w:val="BodyText"/>
-      </w:pPr>
-      <w:r>
-        <w:t xml:space="preserve">Solid cover blocks a shot. Partial cover imposes −2 on the attack. Weapon effects apply after a hit survives any Dodge. Success margin does not increase damage.</w:t>
-      </w:r>
-    </w:p>
-    <w:p>
-      <w:pPr>
-        <w:pStyle w:val="BodyText"/>
-      </w:pPr>
+        <w:t xml:space="preserve">Roll Shooting for a ranged attack, Melee for a weapon in hand, or Brawling for fists and grappling. If the attack succeeds, an aware target able to move may</w:t>
+      </w:r>
+      <w:r>
+        <w:t xml:space="preserve"> </w:t>
+      </w:r>
       <w:r>
         <w:rPr>
           <w:bCs/>
           <w:b/>
         </w:rPr>
+        <w:t xml:space="preserve">defend</w:t>
+      </w:r>
+      <w:r>
+        <w:t xml:space="preserve">: Dodge, Parry or Block. A successful defense cancels the hit. Apply injury penalties to every defense.</w:t>
+      </w:r>
+    </w:p>
+    <w:p>
+      <w:pPr>
+        <w:numPr>
+          <w:ilvl w:val="0"/>
+          <w:numId w:val="1013"/>
+        </w:numPr>
+        <w:pStyle w:val="Compact"/>
+      </w:pPr>
+      <w:r>
+        <w:rPr>
+          <w:bCs/>
+          <w:b/>
+        </w:rPr>
+        <w:t xml:space="preserve">One defense a round.</w:t>
+      </w:r>
+      <w:r>
+        <w:t xml:space="preserve"> </w:t>
+      </w:r>
+      <w:r>
+        <w:t xml:space="preserve">A target gets one defense a round, between its turns, and chooses which when an attack hits. The</w:t>
+      </w:r>
+      <w:r>
+        <w:t xml:space="preserve"> </w:t>
+      </w:r>
+      <w:r>
+        <w:rPr>
+          <w:bCs/>
+          <w:b/>
+        </w:rPr>
+        <w:t xml:space="preserve">Additional Defense</w:t>
+      </w:r>
+      <w:r>
+        <w:t xml:space="preserve"> </w:t>
+      </w:r>
+      <w:r>
+        <w:t xml:space="preserve">Edge gives a second.</w:t>
+      </w:r>
+    </w:p>
+    <w:p>
+      <w:pPr>
+        <w:numPr>
+          <w:ilvl w:val="0"/>
+          <w:numId w:val="1013"/>
+        </w:numPr>
+        <w:pStyle w:val="Compact"/>
+      </w:pPr>
+      <w:r>
+        <w:rPr>
+          <w:bCs/>
+          <w:b/>
+        </w:rPr>
+        <w:t xml:space="preserve">Dodge</w:t>
+      </w:r>
+      <w:r>
+        <w:t xml:space="preserve"> </w:t>
+      </w:r>
+      <w:r>
+        <w:t xml:space="preserve">is Agility −2, with +1 for Trained Athletics or +2 for Athletics as a Specialty or Expert.</w:t>
+      </w:r>
+    </w:p>
+    <w:p>
+      <w:pPr>
+        <w:numPr>
+          <w:ilvl w:val="0"/>
+          <w:numId w:val="1013"/>
+        </w:numPr>
+        <w:pStyle w:val="Compact"/>
+      </w:pPr>
+      <w:r>
+        <w:rPr>
+          <w:bCs/>
+          <w:b/>
+        </w:rPr>
+        <w:t xml:space="preserve">Parry.</w:t>
+      </w:r>
+      <w:r>
+        <w:t xml:space="preserve"> </w:t>
+      </w:r>
+      <w:r>
+        <w:t xml:space="preserve">Against a weapon in hand, fists, claws or fangs, roll Melee −3 with a weapon in hand. Bare-handed, Brawling −3 parries fists only: nobody turns a Blutbad’s claws with an open hand. A second parry in the same round (with Additional Defense) is a further −2. Nobody parries a bullet or an arrow.</w:t>
+      </w:r>
+    </w:p>
+    <w:p>
+      <w:pPr>
+        <w:numPr>
+          <w:ilvl w:val="0"/>
+          <w:numId w:val="1013"/>
+        </w:numPr>
+        <w:pStyle w:val="Compact"/>
+      </w:pPr>
+      <w:r>
+        <w:rPr>
+          <w:bCs/>
+          <w:b/>
+        </w:rPr>
         <w:t xml:space="preserve">Block.</w:t>
       </w:r>
       <w:r>
         <w:t xml:space="preserve"> </w:t>
       </w:r>
       <w:r>
-        <w:t xml:space="preserve">With a shield, or anything that can stand in for one (a chair, a wooden slat, a crate lid, a saddle), you can block a blade, a club, claws, fangs, fists or an arrow instead of Dodging: roll Melee −2, or Melee −1 with a real shield. A Block is your one defense for the round. Nothing you can lift blocks a bullet. An improvised shield breaks the first time it blocks a hit of 2 or more boxes: a chair stops one swipe of a Blutbad’s claws, and then it’s kindling.</w:t>
+        <w:t xml:space="preserve">With a shield, or anything that can stand in for one (a chair, a wooden slat, a crate lid, a saddle), you can block a blade, a club, claws, fangs, fists or an arrow: roll Melee −2, or Melee −1 with a real shield. Nothing you can lift blocks a bullet. An improvised shield breaks the first time it blocks a hit of 2 or more boxes: a chair stops one swipe of a Blutbad’s claws, and then it’s kindling.</w:t>
+      </w:r>
+    </w:p>
+    <w:p>
+      <w:pPr>
+        <w:numPr>
+          <w:ilvl w:val="0"/>
+          <w:numId w:val="1013"/>
+        </w:numPr>
+        <w:pStyle w:val="Compact"/>
+      </w:pPr>
+      <w:r>
+        <w:rPr>
+          <w:bCs/>
+          <w:b/>
+        </w:rPr>
+        <w:t xml:space="preserve">Attack quality.</w:t>
+      </w:r>
+      <w:r>
+        <w:t xml:space="preserve"> </w:t>
+      </w:r>
+      <w:r>
+        <w:t xml:space="preserve">A clean hit is harder to escape. When an attack succeeds by 3 or 4, the defense is at −1; by 5 or 6, −2; by 7 or more, −3. A Wesen in full woge often strikes that cleanly.</w:t>
+      </w:r>
+    </w:p>
+    <w:p>
+      <w:pPr>
+        <w:numPr>
+          <w:ilvl w:val="0"/>
+          <w:numId w:val="1013"/>
+        </w:numPr>
+        <w:pStyle w:val="Compact"/>
+      </w:pPr>
+      <w:r>
+        <w:rPr>
+          <w:bCs/>
+          <w:b/>
+        </w:rPr>
+        <w:t xml:space="preserve">Aim.</w:t>
+      </w:r>
+      <w:r>
+        <w:t xml:space="preserve"> </w:t>
+      </w:r>
+      <w:r>
+        <w:t xml:space="preserve">Spend your action aiming at a target you can see: +1 to your next attack against it.</w:t>
+      </w:r>
+      <w:r>
+        <w:t xml:space="preserve"> </w:t>
+      </w:r>
+      <w:r>
+        <w:rPr>
+          <w:bCs/>
+          <w:b/>
+        </w:rPr>
+        <w:t xml:space="preserve">Careful Marksman</w:t>
+      </w:r>
+      <w:r>
+        <w:t xml:space="preserve"> </w:t>
+      </w:r>
+      <w:r>
+        <w:t xml:space="preserve">and</w:t>
+      </w:r>
+      <w:r>
+        <w:t xml:space="preserve"> </w:t>
+      </w:r>
+      <w:r>
+        <w:rPr>
+          <w:bCs/>
+          <w:b/>
+        </w:rPr>
+        <w:t xml:space="preserve">Hunter’s Eye</w:t>
+      </w:r>
+      <w:r>
+        <w:t xml:space="preserve"> </w:t>
+      </w:r>
+      <w:r>
+        <w:t xml:space="preserve">add their +2 to this; a</w:t>
+      </w:r>
+      <w:r>
+        <w:t xml:space="preserve"> </w:t>
+      </w:r>
+      <w:r>
+        <w:rPr>
+          <w:bCs/>
+          <w:b/>
+        </w:rPr>
+        <w:t xml:space="preserve">Gunslinger</w:t>
+      </w:r>
+      <w:r>
+        <w:t xml:space="preserve"> </w:t>
+      </w:r>
+      <w:r>
+        <w:t xml:space="preserve">doesn’t need to aim.</w:t>
+      </w:r>
+    </w:p>
+    <w:p>
+      <w:pPr>
+        <w:pStyle w:val="FirstParagraph"/>
+      </w:pPr>
+      <w:r>
+        <w:t xml:space="preserve">Solid cover blocks a shot. Partial cover imposes −2 on the attack. Weapon effects apply after a hit survives any defense. Success margin does not increase damage.</w:t>
+      </w:r>
+    </w:p>
+    <w:p>
+      <w:pPr>
+        <w:pStyle w:val="BodyText"/>
+      </w:pPr>
+      <w:r>
+        <w:rPr>
+          <w:iCs/>
+          <w:i/>
+        </w:rPr>
+        <w:t xml:space="preserve">Example:</w:t>
+      </w:r>
+      <w:r>
+        <w:t xml:space="preserve"> </w:t>
+      </w:r>
+      <w:r>
+        <w:t xml:space="preserve">a Blutbad in full woge claws at Deputy Ames and succeeds by 5. Ames hasn’t defended yet this round: Dodge 11, −2 for the clean hit, needs a 9 or less. Ames has a saber in hand, so a parry is possible too: Melee 14 −3 −2 = 9, no better. Ames dodges. When the second Blutbad lunges before Ames’s next turn, there’s no defense left, unless Ames has Additional Defense.</w:t>
       </w:r>
     </w:p>
     <w:bookmarkEnd w:id="61"/>
@@ -8525,7 +8734,7 @@
       <w:pPr>
         <w:numPr>
           <w:ilvl w:val="0"/>
-          <w:numId w:val="1013"/>
+          <w:numId w:val="1014"/>
         </w:numPr>
         <w:pStyle w:val="Compact"/>
       </w:pPr>
@@ -8576,7 +8785,7 @@
       <w:pPr>
         <w:numPr>
           <w:ilvl w:val="0"/>
-          <w:numId w:val="1013"/>
+          <w:numId w:val="1014"/>
         </w:numPr>
         <w:pStyle w:val="Compact"/>
       </w:pPr>
@@ -8598,7 +8807,7 @@
       <w:pPr>
         <w:numPr>
           <w:ilvl w:val="0"/>
-          <w:numId w:val="1013"/>
+          <w:numId w:val="1014"/>
         </w:numPr>
         <w:pStyle w:val="Compact"/>
       </w:pPr>
@@ -8621,7 +8830,7 @@
         <w:pStyle w:val="FirstParagraph"/>
       </w:pPr>
       <w:r>
-        <w:t xml:space="preserve">Your protection is avoiding the hit: Dodge, a Block, cover, and a Grit point, which reduces a hit by one box.</w:t>
+        <w:t xml:space="preserve">Your protection is avoiding the hit: a defense (Dodge, Parry or Block), cover, and a Grit point, which reduces a hit by one box.</w:t>
       </w:r>
     </w:p>
     <w:bookmarkEnd w:id="63"/>
@@ -10287,7 +10496,7 @@
       <w:pPr>
         <w:numPr>
           <w:ilvl w:val="0"/>
-          <w:numId w:val="1014"/>
+          <w:numId w:val="1015"/>
         </w:numPr>
         <w:pStyle w:val="Compact"/>
       </w:pPr>
@@ -10309,7 +10518,7 @@
       <w:pPr>
         <w:numPr>
           <w:ilvl w:val="0"/>
-          <w:numId w:val="1014"/>
+          <w:numId w:val="1015"/>
         </w:numPr>
         <w:pStyle w:val="Compact"/>
       </w:pPr>
@@ -10360,7 +10569,7 @@
       <w:pPr>
         <w:numPr>
           <w:ilvl w:val="0"/>
-          <w:numId w:val="1014"/>
+          <w:numId w:val="1015"/>
         </w:numPr>
         <w:pStyle w:val="Compact"/>
       </w:pPr>
@@ -13774,7 +13983,7 @@
       <w:pPr>
         <w:numPr>
           <w:ilvl w:val="0"/>
-          <w:numId w:val="1015"/>
+          <w:numId w:val="1016"/>
         </w:numPr>
         <w:pStyle w:val="Compact"/>
       </w:pPr>
@@ -13790,140 +13999,6 @@
       </w:r>
       <w:r>
         <w:t xml:space="preserve">What happened, and did we resolve it: closed, partly, or failed?</w:t>
-      </w:r>
-    </w:p>
-    <w:p>
-      <w:pPr>
-        <w:numPr>
-          <w:ilvl w:val="0"/>
-          <w:numId w:val="1015"/>
-        </w:numPr>
-        <w:pStyle w:val="Compact"/>
-      </w:pPr>
-      <w:r>
-        <w:rPr>
-          <w:bCs/>
-          <w:b/>
-        </w:rPr>
-        <w:t xml:space="preserve">Who stood out?</w:t>
-      </w:r>
-      <w:r>
-        <w:t xml:space="preserve"> </w:t>
-      </w:r>
-      <w:r>
-        <w:t xml:space="preserve">A moment worth remembering.</w:t>
-      </w:r>
-    </w:p>
-    <w:p>
-      <w:pPr>
-        <w:numPr>
-          <w:ilvl w:val="0"/>
-          <w:numId w:val="1015"/>
-        </w:numPr>
-        <w:pStyle w:val="Compact"/>
-      </w:pPr>
-      <w:r>
-        <w:rPr>
-          <w:bCs/>
-          <w:b/>
-        </w:rPr>
-        <w:t xml:space="preserve">Complications.</w:t>
-      </w:r>
-      <w:r>
-        <w:t xml:space="preserve"> </w:t>
-      </w:r>
-      <w:r>
-        <w:t xml:space="preserve">Which ones came into play, and what did they cost?</w:t>
-      </w:r>
-    </w:p>
-    <w:p>
-      <w:pPr>
-        <w:numPr>
-          <w:ilvl w:val="0"/>
-          <w:numId w:val="1015"/>
-        </w:numPr>
-        <w:pStyle w:val="Compact"/>
-      </w:pPr>
-      <w:r>
-        <w:rPr>
-          <w:bCs/>
-          <w:b/>
-        </w:rPr>
-        <w:t xml:space="preserve">For the books.</w:t>
-      </w:r>
-      <w:r>
-        <w:t xml:space="preserve"> </w:t>
-      </w:r>
-      <w:r>
-        <w:t xml:space="preserve">A new Wesen kind, weakness or custom worth recording.</w:t>
-      </w:r>
-    </w:p>
-    <w:p>
-      <w:pPr>
-        <w:numPr>
-          <w:ilvl w:val="0"/>
-          <w:numId w:val="1015"/>
-        </w:numPr>
-        <w:pStyle w:val="Compact"/>
-      </w:pPr>
-      <w:r>
-        <w:rPr>
-          <w:bCs/>
-          <w:b/>
-        </w:rPr>
-        <w:t xml:space="preserve">Advancement.</w:t>
-      </w:r>
-      <w:r>
-        <w:t xml:space="preserve"> </w:t>
-      </w:r>
-      <w:r>
-        <w:t xml:space="preserve">After a significant case, the GM may authorize one skill step for each character.</w:t>
-      </w:r>
-    </w:p>
-    <w:bookmarkEnd w:id="80"/>
-    <w:bookmarkEnd w:id="81"/>
-    <w:bookmarkStart w:id="89" w:name="ready-made-characters"/>
-    <w:p>
-      <w:pPr>
-        <w:pStyle w:val="Heading1"/>
-      </w:pPr>
-      <w:r>
-        <w:t xml:space="preserve">Ready-made characters</w:t>
-      </w:r>
-    </w:p>
-    <w:p>
-      <w:pPr>
-        <w:pStyle w:val="FirstParagraph"/>
-      </w:pPr>
-      <w:r>
-        <w:t xml:space="preserve">Seven characters ready to play. Each follows the creation rules exactly, Edges included, and their connections tie them together.</w:t>
-      </w:r>
-    </w:p>
-    <w:bookmarkStart w:id="82" w:name="eliza-kessler"/>
-    <w:p>
-      <w:pPr>
-        <w:pStyle w:val="Heading2"/>
-      </w:pPr>
-      <w:r>
-        <w:t xml:space="preserve">Eliza Kessler</w:t>
-      </w:r>
-    </w:p>
-    <w:p>
-      <w:pPr>
-        <w:pStyle w:val="FirstParagraph"/>
-      </w:pPr>
-      <w:r>
-        <w:rPr>
-          <w:iCs/>
-          <w:i/>
-        </w:rPr>
-        <w:t xml:space="preserve">Deputy U.S. Marshal, Marshal. Grimm (Tier 2).</w:t>
-      </w:r>
-      <w:r>
-        <w:t xml:space="preserve"> </w:t>
-      </w:r>
-      <w:r>
-        <w:t xml:space="preserve">Wears the badge: the law, and the Code, in one person.</w:t>
       </w:r>
     </w:p>
     <w:p>
@@ -13939,29 +14014,13 @@
           <w:bCs/>
           <w:b/>
         </w:rPr>
-        <w:t xml:space="preserve">Attributes:</w:t>
-      </w:r>
-      <w:r>
-        <w:t xml:space="preserve"> </w:t>
-      </w:r>
-      <w:r>
-        <w:t xml:space="preserve">Body 12, Agility 13, Intellect 10, Presence 8, Will 12.</w:t>
-      </w:r>
-      <w:r>
-        <w:t xml:space="preserve"> </w:t>
-      </w:r>
-      <w:r>
-        <w:rPr>
-          <w:bCs/>
-          <w:b/>
-        </w:rPr>
-        <w:t xml:space="preserve">Dodge</w:t>
-      </w:r>
-      <w:r>
-        <w:t xml:space="preserve"> </w:t>
-      </w:r>
-      <w:r>
-        <w:t xml:space="preserve">12.</w:t>
+        <w:t xml:space="preserve">Who stood out?</w:t>
+      </w:r>
+      <w:r>
+        <w:t xml:space="preserve"> </w:t>
+      </w:r>
+      <w:r>
+        <w:t xml:space="preserve">A moment worth remembering.</w:t>
       </w:r>
     </w:p>
     <w:p>
@@ -13977,13 +14036,13 @@
           <w:bCs/>
           <w:b/>
         </w:rPr>
-        <w:t xml:space="preserve">Skills:</w:t>
-      </w:r>
-      <w:r>
-        <w:t xml:space="preserve"> </w:t>
-      </w:r>
-      <w:r>
-        <w:t xml:space="preserve">Shooting 16 (Specialty). Trained: Riding 14, Melee 14, Brawling 14, Athletics 13, Investigation 11, Tracking 11, Read People 11, Survival 11, Leadership 9; Wesen Lore 11 (free).</w:t>
+        <w:t xml:space="preserve">Complications.</w:t>
+      </w:r>
+      <w:r>
+        <w:t xml:space="preserve"> </w:t>
+      </w:r>
+      <w:r>
+        <w:t xml:space="preserve">Which ones came into play, and what did they cost?</w:t>
       </w:r>
     </w:p>
     <w:p>
@@ -13999,45 +14058,13 @@
           <w:bCs/>
           <w:b/>
         </w:rPr>
-        <w:t xml:space="preserve">Edge:</w:t>
-      </w:r>
-      <w:r>
-        <w:t xml:space="preserve"> </w:t>
-      </w:r>
-      <w:r>
-        <w:t xml:space="preserve">Second advantage: Badge: Deputy U.S. Marshal.</w:t>
-      </w:r>
-      <w:r>
-        <w:t xml:space="preserve"> </w:t>
-      </w:r>
-      <w:r>
-        <w:rPr>
-          <w:bCs/>
-          <w:b/>
-        </w:rPr>
-        <w:t xml:space="preserve">Grimm gift:</w:t>
-      </w:r>
-      <w:r>
-        <w:t xml:space="preserve"> </w:t>
-      </w:r>
-      <w:r>
-        <w:t xml:space="preserve">Keeper of the Books (companion: The Books Must Be Kept).</w:t>
-      </w:r>
-      <w:r>
-        <w:t xml:space="preserve"> </w:t>
-      </w:r>
-      <w:r>
-        <w:rPr>
-          <w:bCs/>
-          <w:b/>
-        </w:rPr>
-        <w:t xml:space="preserve">Complication:</w:t>
-      </w:r>
-      <w:r>
-        <w:t xml:space="preserve"> </w:t>
-      </w:r>
-      <w:r>
-        <w:t xml:space="preserve">Law and Order; trigger: a Wesen suspect could be killed instead of arrested.</w:t>
+        <w:t xml:space="preserve">For the books.</w:t>
+      </w:r>
+      <w:r>
+        <w:t xml:space="preserve"> </w:t>
+      </w:r>
+      <w:r>
+        <w:t xml:space="preserve">A new Wesen kind, weakness or custom worth recording.</w:t>
       </w:r>
     </w:p>
     <w:p>
@@ -14053,39 +14080,41 @@
           <w:bCs/>
           <w:b/>
         </w:rPr>
-        <w:t xml:space="preserve">Why I stand against the dark:</w:t>
-      </w:r>
-      <w:r>
-        <w:t xml:space="preserve"> </w:t>
-      </w:r>
-      <w:r>
-        <w:t xml:space="preserve">The Grimm blood woke in me, and it came with a duty.</w:t>
-      </w:r>
-      <w:r>
-        <w:t xml:space="preserve"> </w:t>
-      </w:r>
-      <w:r>
-        <w:rPr>
-          <w:bCs/>
-          <w:b/>
-        </w:rPr>
-        <w:t xml:space="preserve">Connection:</w:t>
-      </w:r>
-      <w:r>
-        <w:t xml:space="preserve"> </w:t>
-      </w:r>
-      <w:r>
-        <w:t xml:space="preserve">Gus Brandt cut her down from a lynch mob’s rope before anyone knew what she was.</w:t>
-      </w:r>
-    </w:p>
-    <w:bookmarkEnd w:id="82"/>
-    <w:bookmarkStart w:id="83" w:name="gus-brandt"/>
+        <w:t xml:space="preserve">Advancement.</w:t>
+      </w:r>
+      <w:r>
+        <w:t xml:space="preserve"> </w:t>
+      </w:r>
+      <w:r>
+        <w:t xml:space="preserve">After a significant case, the GM may authorize one skill step for each character.</w:t>
+      </w:r>
+    </w:p>
+    <w:bookmarkEnd w:id="80"/>
+    <w:bookmarkEnd w:id="81"/>
+    <w:bookmarkStart w:id="89" w:name="ready-made-characters"/>
+    <w:p>
+      <w:pPr>
+        <w:pStyle w:val="Heading1"/>
+      </w:pPr>
+      <w:r>
+        <w:t xml:space="preserve">Ready-made characters</w:t>
+      </w:r>
+    </w:p>
+    <w:p>
+      <w:pPr>
+        <w:pStyle w:val="FirstParagraph"/>
+      </w:pPr>
+      <w:r>
+        <w:t xml:space="preserve">Seven characters ready to play. Each follows the creation rules exactly, Edges included, and their connections tie them together.</w:t>
+      </w:r>
+    </w:p>
+    <w:bookmarkStart w:id="82" w:name="eliza-kessler"/>
     <w:p>
       <w:pPr>
         <w:pStyle w:val="Heading2"/>
       </w:pPr>
       <w:r>
-        <w:t xml:space="preserve">Gus Brandt</w:t>
+        <w:t xml:space="preserve">Eliza Kessler</w:t>
       </w:r>
     </w:p>
     <w:p>
@@ -14097,13 +14126,13 @@
           <w:iCs/>
           <w:i/>
         </w:rPr>
-        <w:t xml:space="preserve">Blacksmith and gunsmith, Tinker. Blutbad (Tier 2).</w:t>
-      </w:r>
-      <w:r>
-        <w:t xml:space="preserve"> </w:t>
-      </w:r>
-      <w:r>
-        <w:t xml:space="preserve">Shoes the horses, fixes the guns, and hasn’t hunted in eleven years.</w:t>
+        <w:t xml:space="preserve">Deputy U.S. Marshal, Marshal. Grimm (Tier 2).</w:t>
+      </w:r>
+      <w:r>
+        <w:t xml:space="preserve"> </w:t>
+      </w:r>
+      <w:r>
+        <w:t xml:space="preserve">Wears the badge: the law, and the Code, in one person.</w:t>
       </w:r>
     </w:p>
     <w:p>
@@ -14125,7 +14154,7 @@
         <w:t xml:space="preserve"> </w:t>
       </w:r>
       <w:r>
-        <w:t xml:space="preserve">Body 11, Agility 11, Intellect 13, Presence 10, Will 10.</w:t>
+        <w:t xml:space="preserve">Body 12, Agility 13, Intellect 10, Presence 8, Will 12.</w:t>
       </w:r>
       <w:r>
         <w:t xml:space="preserve"> </w:t>
@@ -14141,23 +14170,7 @@
         <w:t xml:space="preserve"> </w:t>
       </w:r>
       <w:r>
-        <w:t xml:space="preserve">10.</w:t>
-      </w:r>
-      <w:r>
-        <w:t xml:space="preserve"> </w:t>
-      </w:r>
-      <w:r>
-        <w:rPr>
-          <w:bCs/>
-          <w:b/>
-        </w:rPr>
-        <w:t xml:space="preserve">In woge:</w:t>
-      </w:r>
-      <w:r>
-        <w:t xml:space="preserve"> </w:t>
-      </w:r>
-      <w:r>
-        <w:t xml:space="preserve">Body 13, Agility 12; claws and fangs mark 2 boxes.</w:t>
+        <w:t xml:space="preserve">12.</w:t>
       </w:r>
     </w:p>
     <w:p>
@@ -14179,7 +14192,7 @@
         <w:t xml:space="preserve"> </w:t>
       </w:r>
       <w:r>
-        <w:t xml:space="preserve">Tinkering 16 (Specialty). Trained: Tracking 14, Wesen Lore 14, Investigation 14, Survival 14, Read People 14, Brawling 12, Melee 12, Athletics 12, Persuasion 11.</w:t>
+        <w:t xml:space="preserve">Shooting 16 (Specialty). Trained: Riding 14, Melee 14, Brawling 14, Athletics 13, Investigation 11, Tracking 11, Read People 11, Survival 11, Leadership 9; Wesen Lore 11 (free).</w:t>
       </w:r>
     </w:p>
     <w:p>
@@ -14201,7 +14214,7 @@
         <w:t xml:space="preserve"> </w:t>
       </w:r>
       <w:r>
-        <w:t xml:space="preserve">A fine tool: a master gunsmith’s tools (+2 Tinkering).</w:t>
+        <w:t xml:space="preserve">Second advantage: Badge: Deputy U.S. Marshal.</w:t>
       </w:r>
       <w:r>
         <w:t xml:space="preserve"> </w:t>
@@ -14211,13 +14224,13 @@
           <w:bCs/>
           <w:b/>
         </w:rPr>
-        <w:t xml:space="preserve">Advantage:</w:t>
-      </w:r>
-      <w:r>
-        <w:t xml:space="preserve"> </w:t>
-      </w:r>
-      <w:r>
-        <w:t xml:space="preserve">Blutbad Nose (companion: The Bloodlust).</w:t>
+        <w:t xml:space="preserve">Grimm gift:</w:t>
+      </w:r>
+      <w:r>
+        <w:t xml:space="preserve"> </w:t>
+      </w:r>
+      <w:r>
+        <w:t xml:space="preserve">Keeper of the Books (companion: The Books Must Be Kept).</w:t>
       </w:r>
       <w:r>
         <w:t xml:space="preserve"> </w:t>
@@ -14233,7 +14246,7 @@
         <w:t xml:space="preserve"> </w:t>
       </w:r>
       <w:r>
-        <w:t xml:space="preserve">Keeps a Dangerous Secret; trigger: someone from his old pack turns up.</w:t>
+        <w:t xml:space="preserve">Law and Order; trigger: a Wesen suspect could be killed instead of arrested.</w:t>
       </w:r>
     </w:p>
     <w:p>
@@ -14255,7 +14268,7 @@
         <w:t xml:space="preserve"> </w:t>
       </w:r>
       <w:r>
-        <w:t xml:space="preserve">I did harm once. I mean to balance the ledger.</w:t>
+        <w:t xml:space="preserve">The Grimm blood woke in me, and it came with a duty.</w:t>
       </w:r>
       <w:r>
         <w:t xml:space="preserve"> </w:t>
@@ -14271,17 +14284,17 @@
         <w:t xml:space="preserve"> </w:t>
       </w:r>
       <w:r>
-        <w:t xml:space="preserve">Owes Roz Vey for the remedies that keep the urge quiet.</w:t>
-      </w:r>
-    </w:p>
-    <w:bookmarkEnd w:id="83"/>
-    <w:bookmarkStart w:id="84" w:name="roz-vey"/>
+        <w:t xml:space="preserve">Gus Brandt cut her down from a lynch mob’s rope before anyone knew what she was.</w:t>
+      </w:r>
+    </w:p>
+    <w:bookmarkEnd w:id="82"/>
+    <w:bookmarkStart w:id="83" w:name="gus-brandt"/>
     <w:p>
       <w:pPr>
         <w:pStyle w:val="Heading2"/>
       </w:pPr>
       <w:r>
-        <w:t xml:space="preserve">Roz Vey</w:t>
+        <w:t xml:space="preserve">Gus Brandt</w:t>
       </w:r>
     </w:p>
     <w:p>
@@ -14293,13 +14306,13 @@
           <w:iCs/>
           <w:i/>
         </w:rPr>
-        <w:t xml:space="preserve">Spice and tea merchant, Apothecary. Fuchsbau (Tier 1).</w:t>
-      </w:r>
-      <w:r>
-        <w:t xml:space="preserve"> </w:t>
-      </w:r>
-      <w:r>
-        <w:t xml:space="preserve">Sells tea out front, and other things in the back.</w:t>
+        <w:t xml:space="preserve">Blacksmith and gunsmith, Tinker. Blutbad (Tier 2).</w:t>
+      </w:r>
+      <w:r>
+        <w:t xml:space="preserve"> </w:t>
+      </w:r>
+      <w:r>
+        <w:t xml:space="preserve">Shoes the horses, fixes the guns, and hasn’t hunted in eleven years.</w:t>
       </w:r>
     </w:p>
     <w:p>
@@ -14321,7 +14334,7 @@
         <w:t xml:space="preserve"> </w:t>
       </w:r>
       <w:r>
-        <w:t xml:space="preserve">Body 9, Agility 11, Intellect 13, Presence 12, Will 10.</w:t>
+        <w:t xml:space="preserve">Body 11, Agility 11, Intellect 13, Presence 10, Will 10.</w:t>
       </w:r>
       <w:r>
         <w:t xml:space="preserve"> </w:t>
@@ -14337,7 +14350,23 @@
         <w:t xml:space="preserve"> </w:t>
       </w:r>
       <w:r>
-        <w:t xml:space="preserve">9.</w:t>
+        <w:t xml:space="preserve">10.</w:t>
+      </w:r>
+      <w:r>
+        <w:t xml:space="preserve"> </w:t>
+      </w:r>
+      <w:r>
+        <w:rPr>
+          <w:bCs/>
+          <w:b/>
+        </w:rPr>
+        <w:t xml:space="preserve">In woge:</w:t>
+      </w:r>
+      <w:r>
+        <w:t xml:space="preserve"> </w:t>
+      </w:r>
+      <w:r>
+        <w:t xml:space="preserve">Body 13, Agility 12; claws and fangs mark 2 boxes.</w:t>
       </w:r>
     </w:p>
     <w:p>
@@ -14359,7 +14388,7 @@
         <w:t xml:space="preserve"> </w:t>
       </w:r>
       <w:r>
-        <w:t xml:space="preserve">Apothecary 16 (Specialty). Trained: Medicine 14, Wesen Lore 14, Read People 14, Investigation 14, Gambling 14, Survival 14, Occult 14, Persuasion 13, Deception 13, Stealth 12.</w:t>
+        <w:t xml:space="preserve">Tinkering 16 (Specialty). Trained: Tracking 14, Wesen Lore 14, Investigation 14, Survival 14, Read People 14, Brawling 12, Melee 12, Athletics 12, Persuasion 11.</w:t>
       </w:r>
     </w:p>
     <w:p>
@@ -14375,13 +14404,13 @@
           <w:bCs/>
           <w:b/>
         </w:rPr>
-        <w:t xml:space="preserve">Edges:</w:t>
-      </w:r>
-      <w:r>
-        <w:t xml:space="preserve"> </w:t>
-      </w:r>
-      <w:r>
-        <w:t xml:space="preserve">Extra Trained skill; a friend in town: her cousin Ambrose, a Fuchsbau smuggler on the river docks who can find any ingredient, for a price.</w:t>
+        <w:t xml:space="preserve">Edge:</w:t>
+      </w:r>
+      <w:r>
+        <w:t xml:space="preserve"> </w:t>
+      </w:r>
+      <w:r>
+        <w:t xml:space="preserve">A fine tool: a master gunsmith’s tools (+2 Tinkering).</w:t>
       </w:r>
       <w:r>
         <w:t xml:space="preserve"> </w:t>
@@ -14397,7 +14426,7 @@
         <w:t xml:space="preserve"> </w:t>
       </w:r>
       <w:r>
-        <w:t xml:space="preserve">Fuchsbau Remedies (companion: Criminal Kin).</w:t>
+        <w:t xml:space="preserve">Blutbad Nose (companion: The Bloodlust).</w:t>
       </w:r>
       <w:r>
         <w:t xml:space="preserve"> </w:t>
@@ -14413,7 +14442,7 @@
         <w:t xml:space="preserve"> </w:t>
       </w:r>
       <w:r>
-        <w:t xml:space="preserve">Protects Others at Personal Risk; trigger: a sick or hurt stranger turns up at the shop.</w:t>
+        <w:t xml:space="preserve">Keeps a Dangerous Secret; trigger: someone from his old pack turns up.</w:t>
       </w:r>
     </w:p>
     <w:p>
@@ -14435,7 +14464,7 @@
         <w:t xml:space="preserve"> </w:t>
       </w:r>
       <w:r>
-        <w:t xml:space="preserve">Wesen and humans can live side by side, and I mean to prove it.</w:t>
+        <w:t xml:space="preserve">I did harm once. I mean to balance the ledger.</w:t>
       </w:r>
       <w:r>
         <w:t xml:space="preserve"> </w:t>
@@ -14451,17 +14480,17 @@
         <w:t xml:space="preserve"> </w:t>
       </w:r>
       <w:r>
-        <w:t xml:space="preserve">Trades notes with Dr. Whitlock, who still won’t admit some of her remedies work better than his.</w:t>
-      </w:r>
-    </w:p>
-    <w:bookmarkEnd w:id="84"/>
-    <w:bookmarkStart w:id="85" w:name="dr.-thaddeus-whitlock"/>
+        <w:t xml:space="preserve">Owes Roz Vey for the remedies that keep the urge quiet.</w:t>
+      </w:r>
+    </w:p>
+    <w:bookmarkEnd w:id="83"/>
+    <w:bookmarkStart w:id="84" w:name="roz-vey"/>
     <w:p>
       <w:pPr>
         <w:pStyle w:val="Heading2"/>
       </w:pPr>
       <w:r>
-        <w:t xml:space="preserve">Dr. Thaddeus Whitlock</w:t>
+        <w:t xml:space="preserve">Roz Vey</w:t>
       </w:r>
     </w:p>
     <w:p>
@@ -14473,13 +14502,13 @@
           <w:iCs/>
           <w:i/>
         </w:rPr>
-        <w:t xml:space="preserve">Town physician, Doctor. Human (Tier 0).</w:t>
-      </w:r>
-      <w:r>
-        <w:t xml:space="preserve"> </w:t>
-      </w:r>
-      <w:r>
-        <w:t xml:space="preserve">Army surgeon in the war; now he digs bullets out of his friends and asks too many questions about what made the other wounds.</w:t>
+        <w:t xml:space="preserve">Spice and tea merchant, Apothecary. Fuchsbau (Tier 1).</w:t>
+      </w:r>
+      <w:r>
+        <w:t xml:space="preserve"> </w:t>
+      </w:r>
+      <w:r>
+        <w:t xml:space="preserve">Sells tea out front, and other things in the back.</w:t>
       </w:r>
     </w:p>
     <w:p>
@@ -14501,7 +14530,7 @@
         <w:t xml:space="preserve"> </w:t>
       </w:r>
       <w:r>
-        <w:t xml:space="preserve">Body 10, Agility 10, Intellect 13, Presence 12, Will 11.</w:t>
+        <w:t xml:space="preserve">Body 9, Agility 11, Intellect 13, Presence 12, Will 10.</w:t>
       </w:r>
       <w:r>
         <w:t xml:space="preserve"> </w:t>
@@ -14517,7 +14546,7 @@
         <w:t xml:space="preserve"> </w:t>
       </w:r>
       <w:r>
-        <w:t xml:space="preserve">8.</w:t>
+        <w:t xml:space="preserve">9.</w:t>
       </w:r>
     </w:p>
     <w:p>
@@ -14539,7 +14568,7 @@
         <w:t xml:space="preserve"> </w:t>
       </w:r>
       <w:r>
-        <w:t xml:space="preserve">Medicine 16 (Specialty). Trained: Apothecary 14, Read People 14, Investigation 14, Wesen Lore 14, Occult 14, Persuasion 13, Leadership 13, Riding 11, Shooting 11.</w:t>
+        <w:t xml:space="preserve">Apothecary 16 (Specialty). Trained: Medicine 14, Wesen Lore 14, Read People 14, Investigation 14, Gambling 14, Survival 14, Occult 14, Persuasion 13, Deception 13, Stealth 12.</w:t>
       </w:r>
     </w:p>
     <w:p>
@@ -14561,7 +14590,7 @@
         <w:t xml:space="preserve"> </w:t>
       </w:r>
       <w:r>
-        <w:t xml:space="preserve">+1 attribute point; second advantage: Battlefield Surgeon; a fine tool: his army surgeon’s instruments (+2 Medicine).</w:t>
+        <w:t xml:space="preserve">Extra Trained skill; a friend in town: her cousin Ambrose, a Fuchsbau smuggler on the river docks who can find any ingredient, for a price.</w:t>
       </w:r>
       <w:r>
         <w:t xml:space="preserve"> </w:t>
@@ -14577,7 +14606,7 @@
         <w:t xml:space="preserve"> </w:t>
       </w:r>
       <w:r>
-        <w:t xml:space="preserve">Steady Hands.</w:t>
+        <w:t xml:space="preserve">Fuchsbau Remedies (companion: Criminal Kin).</w:t>
       </w:r>
       <w:r>
         <w:t xml:space="preserve"> </w:t>
@@ -14593,7 +14622,7 @@
         <w:t xml:space="preserve"> </w:t>
       </w:r>
       <w:r>
-        <w:t xml:space="preserve">Haunted by the War; trigger: gunfire in the dark.</w:t>
+        <w:t xml:space="preserve">Protects Others at Personal Risk; trigger: a sick or hurt stranger turns up at the shop.</w:t>
       </w:r>
     </w:p>
     <w:p>
@@ -14615,7 +14644,7 @@
         <w:t xml:space="preserve"> </w:t>
       </w:r>
       <w:r>
-        <w:t xml:space="preserve">I saw what I saw, and no one else believes me.</w:t>
+        <w:t xml:space="preserve">Wesen and humans can live side by side, and I mean to prove it.</w:t>
       </w:r>
       <w:r>
         <w:t xml:space="preserve"> </w:t>
@@ -14631,17 +14660,17 @@
         <w:t xml:space="preserve"> </w:t>
       </w:r>
       <w:r>
-        <w:t xml:space="preserve">Rode with Silas Thorne’s regiment in the war and has never trusted him since.</w:t>
-      </w:r>
-    </w:p>
-    <w:bookmarkEnd w:id="85"/>
-    <w:bookmarkStart w:id="86" w:name="cora-ridgeway"/>
+        <w:t xml:space="preserve">Trades notes with Dr. Whitlock, who still won’t admit some of her remedies work better than his.</w:t>
+      </w:r>
+    </w:p>
+    <w:bookmarkEnd w:id="84"/>
+    <w:bookmarkStart w:id="85" w:name="dr.-thaddeus-whitlock"/>
     <w:p>
       <w:pPr>
         <w:pStyle w:val="Heading2"/>
       </w:pPr>
       <w:r>
-        <w:t xml:space="preserve">Cora Ridgeway</w:t>
+        <w:t xml:space="preserve">Dr. Thaddeus Whitlock</w:t>
       </w:r>
     </w:p>
     <w:p>
@@ -14653,13 +14682,13 @@
           <w:iCs/>
           <w:i/>
         </w:rPr>
-        <w:t xml:space="preserve">Scout and sharpshooter, Scout. Coyotl (Tier 1).</w:t>
-      </w:r>
-      <w:r>
-        <w:t xml:space="preserve"> </w:t>
-      </w:r>
-      <w:r>
-        <w:t xml:space="preserve">Knows the plains and the high country, and keeps her clan’s ways close.</w:t>
+        <w:t xml:space="preserve">Town physician, Doctor. Human (Tier 0).</w:t>
+      </w:r>
+      <w:r>
+        <w:t xml:space="preserve"> </w:t>
+      </w:r>
+      <w:r>
+        <w:t xml:space="preserve">Army surgeon in the war; now he digs bullets out of his friends and asks too many questions about what made the other wounds.</w:t>
       </w:r>
     </w:p>
     <w:p>
@@ -14681,7 +14710,7 @@
         <w:t xml:space="preserve"> </w:t>
       </w:r>
       <w:r>
-        <w:t xml:space="preserve">Body 11, Agility 14, Intellect 10, Presence 11, Will 9.</w:t>
+        <w:t xml:space="preserve">Body 10, Agility 10, Intellect 13, Presence 12, Will 11.</w:t>
       </w:r>
       <w:r>
         <w:t xml:space="preserve"> </w:t>
@@ -14697,23 +14726,7 @@
         <w:t xml:space="preserve"> </w:t>
       </w:r>
       <w:r>
-        <w:t xml:space="preserve">13.</w:t>
-      </w:r>
-      <w:r>
-        <w:t xml:space="preserve"> </w:t>
-      </w:r>
-      <w:r>
-        <w:rPr>
-          <w:bCs/>
-          <w:b/>
-        </w:rPr>
-        <w:t xml:space="preserve">In woge:</w:t>
-      </w:r>
-      <w:r>
-        <w:t xml:space="preserve"> </w:t>
-      </w:r>
-      <w:r>
-        <w:t xml:space="preserve">Body 12, Agility 15, Dodge 15; claws mark 2 boxes.</w:t>
+        <w:t xml:space="preserve">8.</w:t>
       </w:r>
     </w:p>
     <w:p>
@@ -14735,7 +14748,7 @@
         <w:t xml:space="preserve"> </w:t>
       </w:r>
       <w:r>
-        <w:t xml:space="preserve">Shooting 17 (Specialty). Trained: Riding 15, Stealth 15, Brawling 15, Melee 15, Persuasion 12, Athletics 12, Tracking 11, Survival 11, Read People 11, Gambling 11.</w:t>
+        <w:t xml:space="preserve">Medicine 16 (Specialty). Trained: Apothecary 14, Read People 14, Investigation 14, Wesen Lore 14, Occult 14, Persuasion 13, Leadership 13, Riding 11, Shooting 11.</w:t>
       </w:r>
     </w:p>
     <w:p>
@@ -14757,7 +14770,7 @@
         <w:t xml:space="preserve"> </w:t>
       </w:r>
       <w:r>
-        <w:t xml:space="preserve">Extra Trained skill; True grit.</w:t>
+        <w:t xml:space="preserve">+1 attribute point; second advantage: Battlefield Surgeon; a fine tool: his army surgeon’s instruments (+2 Medicine).</w:t>
       </w:r>
       <w:r>
         <w:t xml:space="preserve"> </w:t>
@@ -14773,7 +14786,7 @@
         <w:t xml:space="preserve"> </w:t>
       </w:r>
       <w:r>
-        <w:t xml:space="preserve">Plains Wanderer (companion: Restless).</w:t>
+        <w:t xml:space="preserve">Steady Hands.</w:t>
       </w:r>
       <w:r>
         <w:t xml:space="preserve"> </w:t>
@@ -14789,7 +14802,7 @@
         <w:t xml:space="preserve"> </w:t>
       </w:r>
       <w:r>
-        <w:t xml:space="preserve">Sworn Vengeance; trigger: word of the men who burned her clan’s camp.</w:t>
+        <w:t xml:space="preserve">Haunted by the War; trigger: gunfire in the dark.</w:t>
       </w:r>
     </w:p>
     <w:p>
@@ -14811,7 +14824,7 @@
         <w:t xml:space="preserve"> </w:t>
       </w:r>
       <w:r>
-        <w:t xml:space="preserve">Something that wore a human face killed someone I loved.</w:t>
+        <w:t xml:space="preserve">I saw what I saw, and no one else believes me.</w:t>
       </w:r>
       <w:r>
         <w:t xml:space="preserve"> </w:t>
@@ -14827,17 +14840,17 @@
         <w:t xml:space="preserve"> </w:t>
       </w:r>
       <w:r>
-        <w:t xml:space="preserve">Eliza Kessler taught her what she knows about the hidden world.</w:t>
-      </w:r>
-    </w:p>
-    <w:bookmarkEnd w:id="86"/>
-    <w:bookmarkStart w:id="87" w:name="silas-thorne"/>
+        <w:t xml:space="preserve">Rode with Silas Thorne’s regiment in the war and has never trusted him since.</w:t>
+      </w:r>
+    </w:p>
+    <w:bookmarkEnd w:id="85"/>
+    <w:bookmarkStart w:id="86" w:name="cora-ridgeway"/>
     <w:p>
       <w:pPr>
         <w:pStyle w:val="Heading2"/>
       </w:pPr>
       <w:r>
-        <w:t xml:space="preserve">Silas Thorne</w:t>
+        <w:t xml:space="preserve">Cora Ridgeway</w:t>
       </w:r>
     </w:p>
     <w:p>
@@ -14849,13 +14862,13 @@
           <w:iCs/>
           <w:i/>
         </w:rPr>
-        <w:t xml:space="preserve">Professional gambler, Gambler. Ziegevolk (Tier 1); Old hand.</w:t>
-      </w:r>
-      <w:r>
-        <w:t xml:space="preserve"> </w:t>
-      </w:r>
-      <w:r>
-        <w:t xml:space="preserve">Charming, well-dressed, and in debt to the wrong people.</w:t>
+        <w:t xml:space="preserve">Scout and sharpshooter, Scout. Coyotl (Tier 1).</w:t>
+      </w:r>
+      <w:r>
+        <w:t xml:space="preserve"> </w:t>
+      </w:r>
+      <w:r>
+        <w:t xml:space="preserve">Knows the plains and the high country, and keeps her clan’s ways close.</w:t>
       </w:r>
     </w:p>
     <w:p>
@@ -14877,7 +14890,7 @@
         <w:t xml:space="preserve"> </w:t>
       </w:r>
       <w:r>
-        <w:t xml:space="preserve">Body 10, Agility 10, Intellect 13, Presence 13, Will 9.</w:t>
+        <w:t xml:space="preserve">Body 11, Agility 14, Intellect 10, Presence 11, Will 9.</w:t>
       </w:r>
       <w:r>
         <w:t xml:space="preserve"> </w:t>
@@ -14893,7 +14906,23 @@
         <w:t xml:space="preserve"> </w:t>
       </w:r>
       <w:r>
-        <w:t xml:space="preserve">8.</w:t>
+        <w:t xml:space="preserve">13.</w:t>
+      </w:r>
+      <w:r>
+        <w:t xml:space="preserve"> </w:t>
+      </w:r>
+      <w:r>
+        <w:rPr>
+          <w:bCs/>
+          <w:b/>
+        </w:rPr>
+        <w:t xml:space="preserve">In woge:</w:t>
+      </w:r>
+      <w:r>
+        <w:t xml:space="preserve"> </w:t>
+      </w:r>
+      <w:r>
+        <w:t xml:space="preserve">Body 12, Agility 15, Dodge 15; claws mark 2 boxes.</w:t>
       </w:r>
     </w:p>
     <w:p>
@@ -14915,7 +14944,7 @@
         <w:t xml:space="preserve"> </w:t>
       </w:r>
       <w:r>
-        <w:t xml:space="preserve">Gambling 18 (Expert). Trained: Deception 14, Persuasion 14, Read People 14, Investigation 14, Shooting 11, Stealth 11, Riding 11.</w:t>
+        <w:t xml:space="preserve">Shooting 17 (Specialty). Trained: Riding 15, Stealth 15, Brawling 15, Melee 15, Persuasion 12, Athletics 12, Tracking 11, Survival 11, Read People 11, Gambling 11.</w:t>
       </w:r>
     </w:p>
     <w:p>
@@ -14937,7 +14966,7 @@
         <w:t xml:space="preserve"> </w:t>
       </w:r>
       <w:r>
-        <w:t xml:space="preserve">Second advantage: Poker Face; a friend in town: Mae Lin, a faro dealer who hears everything said at her table.</w:t>
+        <w:t xml:space="preserve">Extra Trained skill; True grit.</w:t>
       </w:r>
       <w:r>
         <w:t xml:space="preserve"> </w:t>
@@ -14953,7 +14982,7 @@
         <w:t xml:space="preserve"> </w:t>
       </w:r>
       <w:r>
-        <w:t xml:space="preserve">Ziegevolk Pheromones (companion: Pheromone Suspicion).</w:t>
+        <w:t xml:space="preserve">Plains Wanderer (companion: Restless).</w:t>
       </w:r>
       <w:r>
         <w:t xml:space="preserve"> </w:t>
@@ -14969,7 +14998,7 @@
         <w:t xml:space="preserve"> </w:t>
       </w:r>
       <w:r>
-        <w:t xml:space="preserve">Owes the Wrong People; trigger: a debt collector arrives.</w:t>
+        <w:t xml:space="preserve">Sworn Vengeance; trigger: word of the men who burned her clan’s camp.</w:t>
       </w:r>
     </w:p>
     <w:p>
@@ -14991,7 +15020,7 @@
         <w:t xml:space="preserve"> </w:t>
       </w:r>
       <w:r>
-        <w:t xml:space="preserve">The pay’s good, and nobody else will take these jobs.</w:t>
+        <w:t xml:space="preserve">Something that wore a human face killed someone I loved.</w:t>
       </w:r>
       <w:r>
         <w:t xml:space="preserve"> </w:t>
@@ -15007,35 +15036,17 @@
         <w:t xml:space="preserve"> </w:t>
       </w:r>
       <w:r>
-        <w:t xml:space="preserve">Plays cards with Cora every Saturday; she’s the only one who can tell when he’s bluffing.</w:t>
-      </w:r>
-    </w:p>
-    <w:bookmarkEnd w:id="87"/>
-    <w:bookmarkStart w:id="88" w:name="magdalena-lena-baer"/>
+        <w:t xml:space="preserve">Eliza Kessler taught her what she knows about the hidden world.</w:t>
+      </w:r>
+    </w:p>
+    <w:bookmarkEnd w:id="86"/>
+    <w:bookmarkStart w:id="87" w:name="silas-thorne"/>
     <w:p>
       <w:pPr>
         <w:pStyle w:val="Heading2"/>
       </w:pPr>
       <w:r>
-        <w:t xml:space="preserve">Magdalena</w:t>
-      </w:r>
-      <w:r>
-        <w:t xml:space="preserve"> </w:t>
-      </w:r>
-      <w:r>
-        <w:t xml:space="preserve">“</w:t>
-      </w:r>
-      <w:r>
-        <w:t xml:space="preserve">Lena</w:t>
-      </w:r>
-      <w:r>
-        <w:t xml:space="preserve">”</w:t>
-      </w:r>
-      <w:r>
-        <w:t xml:space="preserve"> </w:t>
-      </w:r>
-      <w:r>
-        <w:t xml:space="preserve">Baer</w:t>
+        <w:t xml:space="preserve">Silas Thorne</w:t>
       </w:r>
     </w:p>
     <w:p>
@@ -15047,26 +15058,13 @@
           <w:iCs/>
           <w:i/>
         </w:rPr>
-        <w:t xml:space="preserve">Pow-wow doctor, Occultist. Incantare (Tier 2).</w:t>
-      </w:r>
-      <w:r>
-        <w:t xml:space="preserve"> </w:t>
-      </w:r>
-      <w:r>
-        <w:t xml:space="preserve">Came west from Lancaster County with a wagon, a Bible and her grandmother’s</w:t>
-      </w:r>
-      <w:r>
-        <w:t xml:space="preserve"> </w:t>
-      </w:r>
-      <w:r>
-        <w:rPr>
-          <w:iCs/>
-          <w:i/>
-        </w:rPr>
-        <w:t xml:space="preserve">Long Lost Friend</w:t>
-      </w:r>
-      <w:r>
-        <w:t xml:space="preserve">. Heals for gifts, and breaks hexes for no one’s money.</w:t>
+        <w:t xml:space="preserve">Professional gambler, Gambler. Ziegevolk (Tier 1); Old hand.</w:t>
+      </w:r>
+      <w:r>
+        <w:t xml:space="preserve"> </w:t>
+      </w:r>
+      <w:r>
+        <w:t xml:space="preserve">Charming, well-dressed, and in debt to the wrong people.</w:t>
       </w:r>
     </w:p>
     <w:p>
@@ -15088,7 +15086,7 @@
         <w:t xml:space="preserve"> </w:t>
       </w:r>
       <w:r>
-        <w:t xml:space="preserve">Body 9, Agility 10, Intellect 13, Presence 11, Will 12.</w:t>
+        <w:t xml:space="preserve">Body 10, Agility 10, Intellect 13, Presence 13, Will 9.</w:t>
       </w:r>
       <w:r>
         <w:t xml:space="preserve"> </w:t>
@@ -15126,7 +15124,7 @@
         <w:t xml:space="preserve"> </w:t>
       </w:r>
       <w:r>
-        <w:t xml:space="preserve">Occult 16 (Specialty). Trained: Wesen Lore 14, Apothecary 14, Read People 14, Medicine 14, Investigation 14, Survival 14, Persuasion 12, Riding 11, Shooting 11.</w:t>
+        <w:t xml:space="preserve">Gambling 18 (Expert). Trained: Deception 14, Persuasion 14, Read People 14, Investigation 14, Shooting 11, Stealth 11, Riding 11.</w:t>
       </w:r>
     </w:p>
     <w:p>
@@ -15142,13 +15140,13 @@
           <w:bCs/>
           <w:b/>
         </w:rPr>
-        <w:t xml:space="preserve">Edge:</w:t>
-      </w:r>
-      <w:r>
-        <w:t xml:space="preserve"> </w:t>
-      </w:r>
-      <w:r>
-        <w:t xml:space="preserve">A friend in town: Pastor Jakob Unruh of the Volga German colony east of town, who brings her the cases his people won’t take to a doctor.</w:t>
+        <w:t xml:space="preserve">Edges:</w:t>
+      </w:r>
+      <w:r>
+        <w:t xml:space="preserve"> </w:t>
+      </w:r>
+      <w:r>
+        <w:t xml:space="preserve">Second advantage: Poker Face; a friend in town: Mae Lin, a faro dealer who hears everything said at her table.</w:t>
       </w:r>
       <w:r>
         <w:t xml:space="preserve"> </w:t>
@@ -15158,13 +15156,13 @@
           <w:bCs/>
           <w:b/>
         </w:rPr>
-        <w:t xml:space="preserve">Lens:</w:t>
-      </w:r>
-      <w:r>
-        <w:t xml:space="preserve"> </w:t>
-      </w:r>
-      <w:r>
-        <w:t xml:space="preserve">Braucher (companion: No Payment).</w:t>
+        <w:t xml:space="preserve">Advantage:</w:t>
+      </w:r>
+      <w:r>
+        <w:t xml:space="preserve"> </w:t>
+      </w:r>
+      <w:r>
+        <w:t xml:space="preserve">Ziegevolk Pheromones (companion: Pheromone Suspicion).</w:t>
       </w:r>
       <w:r>
         <w:t xml:space="preserve"> </w:t>
@@ -15180,7 +15178,7 @@
         <w:t xml:space="preserve"> </w:t>
       </w:r>
       <w:r>
-        <w:t xml:space="preserve">Reluctant to Kill; trigger: an enemy lies wounded and helpless in front of her.</w:t>
+        <w:t xml:space="preserve">Owes the Wrong People; trigger: a debt collector arrives.</w:t>
       </w:r>
     </w:p>
     <w:p>
@@ -15196,20 +15194,231 @@
           <w:bCs/>
           <w:b/>
         </w:rPr>
-        <w:t xml:space="preserve">Magic:</w:t>
-      </w:r>
-      <w:r>
-        <w:t xml:space="preserve"> </w:t>
-      </w:r>
-      <w:r>
-        <w:t xml:space="preserve">works rituals with Occult at ten minutes a roll, +2 to heal, protect or break a hex; carries 3 ready charms (Occult as her Specialty). Carries a Himmelsbrief, and writes them for others.</w:t>
+        <w:t xml:space="preserve">Why I stand against the dark:</w:t>
+      </w:r>
+      <w:r>
+        <w:t xml:space="preserve"> </w:t>
+      </w:r>
+      <w:r>
+        <w:t xml:space="preserve">The pay’s good, and nobody else will take these jobs.</w:t>
+      </w:r>
+      <w:r>
+        <w:t xml:space="preserve"> </w:t>
+      </w:r>
+      <w:r>
+        <w:rPr>
+          <w:bCs/>
+          <w:b/>
+        </w:rPr>
+        <w:t xml:space="preserve">Connection:</w:t>
+      </w:r>
+      <w:r>
+        <w:t xml:space="preserve"> </w:t>
+      </w:r>
+      <w:r>
+        <w:t xml:space="preserve">Plays cards with Cora every Saturday; she’s the only one who can tell when he’s bluffing.</w:t>
+      </w:r>
+    </w:p>
+    <w:bookmarkEnd w:id="87"/>
+    <w:bookmarkStart w:id="88" w:name="magdalena-lena-baer"/>
+    <w:p>
+      <w:pPr>
+        <w:pStyle w:val="Heading2"/>
+      </w:pPr>
+      <w:r>
+        <w:t xml:space="preserve">Magdalena</w:t>
+      </w:r>
+      <w:r>
+        <w:t xml:space="preserve"> </w:t>
+      </w:r>
+      <w:r>
+        <w:t xml:space="preserve">“</w:t>
+      </w:r>
+      <w:r>
+        <w:t xml:space="preserve">Lena</w:t>
+      </w:r>
+      <w:r>
+        <w:t xml:space="preserve">”</w:t>
+      </w:r>
+      <w:r>
+        <w:t xml:space="preserve"> </w:t>
+      </w:r>
+      <w:r>
+        <w:t xml:space="preserve">Baer</w:t>
+      </w:r>
+    </w:p>
+    <w:p>
+      <w:pPr>
+        <w:pStyle w:val="FirstParagraph"/>
+      </w:pPr>
+      <w:r>
+        <w:rPr>
+          <w:iCs/>
+          <w:i/>
+        </w:rPr>
+        <w:t xml:space="preserve">Pow-wow doctor, Occultist. Incantare (Tier 2).</w:t>
+      </w:r>
+      <w:r>
+        <w:t xml:space="preserve"> </w:t>
+      </w:r>
+      <w:r>
+        <w:t xml:space="preserve">Came west from Lancaster County with a wagon, a Bible and her grandmother’s</w:t>
+      </w:r>
+      <w:r>
+        <w:t xml:space="preserve"> </w:t>
+      </w:r>
+      <w:r>
+        <w:rPr>
+          <w:iCs/>
+          <w:i/>
+        </w:rPr>
+        <w:t xml:space="preserve">Long Lost Friend</w:t>
+      </w:r>
+      <w:r>
+        <w:t xml:space="preserve">. Heals for gifts, and breaks hexes for no one’s money.</w:t>
       </w:r>
     </w:p>
     <w:p>
       <w:pPr>
         <w:numPr>
           <w:ilvl w:val="0"/>
-          <w:numId w:val="1022"/>
+          <w:numId w:val="1023"/>
+        </w:numPr>
+        <w:pStyle w:val="Compact"/>
+      </w:pPr>
+      <w:r>
+        <w:rPr>
+          <w:bCs/>
+          <w:b/>
+        </w:rPr>
+        <w:t xml:space="preserve">Attributes:</w:t>
+      </w:r>
+      <w:r>
+        <w:t xml:space="preserve"> </w:t>
+      </w:r>
+      <w:r>
+        <w:t xml:space="preserve">Body 9, Agility 10, Intellect 13, Presence 11, Will 12.</w:t>
+      </w:r>
+      <w:r>
+        <w:t xml:space="preserve"> </w:t>
+      </w:r>
+      <w:r>
+        <w:rPr>
+          <w:bCs/>
+          <w:b/>
+        </w:rPr>
+        <w:t xml:space="preserve">Dodge</w:t>
+      </w:r>
+      <w:r>
+        <w:t xml:space="preserve"> </w:t>
+      </w:r>
+      <w:r>
+        <w:t xml:space="preserve">8.</w:t>
+      </w:r>
+    </w:p>
+    <w:p>
+      <w:pPr>
+        <w:numPr>
+          <w:ilvl w:val="0"/>
+          <w:numId w:val="1023"/>
+        </w:numPr>
+        <w:pStyle w:val="Compact"/>
+      </w:pPr>
+      <w:r>
+        <w:rPr>
+          <w:bCs/>
+          <w:b/>
+        </w:rPr>
+        <w:t xml:space="preserve">Skills:</w:t>
+      </w:r>
+      <w:r>
+        <w:t xml:space="preserve"> </w:t>
+      </w:r>
+      <w:r>
+        <w:t xml:space="preserve">Occult 16 (Specialty). Trained: Wesen Lore 14, Apothecary 14, Read People 14, Medicine 14, Investigation 14, Survival 14, Persuasion 12, Riding 11, Shooting 11.</w:t>
+      </w:r>
+    </w:p>
+    <w:p>
+      <w:pPr>
+        <w:numPr>
+          <w:ilvl w:val="0"/>
+          <w:numId w:val="1023"/>
+        </w:numPr>
+        <w:pStyle w:val="Compact"/>
+      </w:pPr>
+      <w:r>
+        <w:rPr>
+          <w:bCs/>
+          <w:b/>
+        </w:rPr>
+        <w:t xml:space="preserve">Edge:</w:t>
+      </w:r>
+      <w:r>
+        <w:t xml:space="preserve"> </w:t>
+      </w:r>
+      <w:r>
+        <w:t xml:space="preserve">A friend in town: Pastor Jakob Unruh of the Volga German colony east of town, who brings her the cases his people won’t take to a doctor.</w:t>
+      </w:r>
+      <w:r>
+        <w:t xml:space="preserve"> </w:t>
+      </w:r>
+      <w:r>
+        <w:rPr>
+          <w:bCs/>
+          <w:b/>
+        </w:rPr>
+        <w:t xml:space="preserve">Lens:</w:t>
+      </w:r>
+      <w:r>
+        <w:t xml:space="preserve"> </w:t>
+      </w:r>
+      <w:r>
+        <w:t xml:space="preserve">Braucher (companion: No Payment).</w:t>
+      </w:r>
+      <w:r>
+        <w:t xml:space="preserve"> </w:t>
+      </w:r>
+      <w:r>
+        <w:rPr>
+          <w:bCs/>
+          <w:b/>
+        </w:rPr>
+        <w:t xml:space="preserve">Complication:</w:t>
+      </w:r>
+      <w:r>
+        <w:t xml:space="preserve"> </w:t>
+      </w:r>
+      <w:r>
+        <w:t xml:space="preserve">Reluctant to Kill; trigger: an enemy lies wounded and helpless in front of her.</w:t>
+      </w:r>
+    </w:p>
+    <w:p>
+      <w:pPr>
+        <w:numPr>
+          <w:ilvl w:val="0"/>
+          <w:numId w:val="1023"/>
+        </w:numPr>
+        <w:pStyle w:val="Compact"/>
+      </w:pPr>
+      <w:r>
+        <w:rPr>
+          <w:bCs/>
+          <w:b/>
+        </w:rPr>
+        <w:t xml:space="preserve">Magic:</w:t>
+      </w:r>
+      <w:r>
+        <w:t xml:space="preserve"> </w:t>
+      </w:r>
+      <w:r>
+        <w:t xml:space="preserve">works rituals with Occult at ten minutes a roll, +2 to heal, protect or break a hex; carries 3 ready charms (Occult as her Specialty). Carries a Himmelsbrief, and writes them for others.</w:t>
+      </w:r>
+    </w:p>
+    <w:p>
+      <w:pPr>
+        <w:numPr>
+          <w:ilvl w:val="0"/>
+          <w:numId w:val="1023"/>
         </w:numPr>
         <w:pStyle w:val="Compact"/>
       </w:pPr>
@@ -19267,7 +19476,7 @@
       <w:pPr>
         <w:numPr>
           <w:ilvl w:val="0"/>
-          <w:numId w:val="1023"/>
+          <w:numId w:val="1024"/>
         </w:numPr>
         <w:pStyle w:val="Compact"/>
       </w:pPr>
@@ -20973,7 +21182,7 @@
       <w:pPr>
         <w:numPr>
           <w:ilvl w:val="0"/>
-          <w:numId w:val="1024"/>
+          <w:numId w:val="1025"/>
         </w:numPr>
         <w:pStyle w:val="Compact"/>
       </w:pPr>
@@ -20985,7 +21194,7 @@
       <w:pPr>
         <w:numPr>
           <w:ilvl w:val="0"/>
-          <w:numId w:val="1024"/>
+          <w:numId w:val="1025"/>
         </w:numPr>
         <w:pStyle w:val="Compact"/>
       </w:pPr>
@@ -21565,7 +21774,7 @@
       <w:pPr>
         <w:numPr>
           <w:ilvl w:val="0"/>
-          <w:numId w:val="1025"/>
+          <w:numId w:val="1026"/>
         </w:numPr>
         <w:pStyle w:val="Compact"/>
       </w:pPr>
@@ -21921,7 +22130,7 @@
       <w:pPr>
         <w:numPr>
           <w:ilvl w:val="0"/>
-          <w:numId w:val="1026"/>
+          <w:numId w:val="1027"/>
         </w:numPr>
         <w:pStyle w:val="Compact"/>
       </w:pPr>
@@ -21933,7 +22142,7 @@
       <w:pPr>
         <w:numPr>
           <w:ilvl w:val="0"/>
-          <w:numId w:val="1026"/>
+          <w:numId w:val="1027"/>
         </w:numPr>
         <w:pStyle w:val="Compact"/>
       </w:pPr>
@@ -21945,7 +22154,7 @@
       <w:pPr>
         <w:numPr>
           <w:ilvl w:val="0"/>
-          <w:numId w:val="1026"/>
+          <w:numId w:val="1027"/>
         </w:numPr>
         <w:pStyle w:val="Compact"/>
       </w:pPr>
@@ -21957,7 +22166,7 @@
       <w:pPr>
         <w:numPr>
           <w:ilvl w:val="0"/>
-          <w:numId w:val="1026"/>
+          <w:numId w:val="1027"/>
         </w:numPr>
         <w:pStyle w:val="Compact"/>
       </w:pPr>
@@ -21969,7 +22178,7 @@
       <w:pPr>
         <w:numPr>
           <w:ilvl w:val="0"/>
-          <w:numId w:val="1026"/>
+          <w:numId w:val="1027"/>
         </w:numPr>
         <w:pStyle w:val="Compact"/>
       </w:pPr>
@@ -21981,7 +22190,7 @@
       <w:pPr>
         <w:numPr>
           <w:ilvl w:val="0"/>
-          <w:numId w:val="1026"/>
+          <w:numId w:val="1027"/>
         </w:numPr>
         <w:pStyle w:val="Compact"/>
       </w:pPr>
@@ -21993,7 +22202,7 @@
       <w:pPr>
         <w:numPr>
           <w:ilvl w:val="0"/>
-          <w:numId w:val="1026"/>
+          <w:numId w:val="1027"/>
         </w:numPr>
         <w:pStyle w:val="Compact"/>
       </w:pPr>
@@ -22827,7 +23036,7 @@
       <w:pPr>
         <w:numPr>
           <w:ilvl w:val="0"/>
-          <w:numId w:val="1027"/>
+          <w:numId w:val="1028"/>
         </w:numPr>
         <w:pStyle w:val="Compact"/>
       </w:pPr>
@@ -22839,7 +23048,7 @@
       <w:pPr>
         <w:numPr>
           <w:ilvl w:val="0"/>
-          <w:numId w:val="1027"/>
+          <w:numId w:val="1028"/>
         </w:numPr>
         <w:pStyle w:val="Compact"/>
       </w:pPr>
@@ -22851,7 +23060,7 @@
       <w:pPr>
         <w:numPr>
           <w:ilvl w:val="0"/>
-          <w:numId w:val="1027"/>
+          <w:numId w:val="1028"/>
         </w:numPr>
         <w:pStyle w:val="Compact"/>
       </w:pPr>
@@ -23769,7 +23978,7 @@
       <w:pPr>
         <w:numPr>
           <w:ilvl w:val="0"/>
-          <w:numId w:val="1028"/>
+          <w:numId w:val="1029"/>
         </w:numPr>
         <w:pStyle w:val="Compact"/>
       </w:pPr>
@@ -24063,7 +24272,7 @@
       <w:pPr>
         <w:numPr>
           <w:ilvl w:val="0"/>
-          <w:numId w:val="1029"/>
+          <w:numId w:val="1030"/>
         </w:numPr>
         <w:pStyle w:val="Compact"/>
       </w:pPr>
@@ -24627,7 +24836,7 @@
       <w:pPr>
         <w:numPr>
           <w:ilvl w:val="0"/>
-          <w:numId w:val="1030"/>
+          <w:numId w:val="1031"/>
         </w:numPr>
         <w:pStyle w:val="Compact"/>
       </w:pPr>
@@ -24639,7 +24848,7 @@
       <w:pPr>
         <w:numPr>
           <w:ilvl w:val="0"/>
-          <w:numId w:val="1030"/>
+          <w:numId w:val="1031"/>
         </w:numPr>
         <w:pStyle w:val="Compact"/>
       </w:pPr>
@@ -24651,7 +24860,7 @@
       <w:pPr>
         <w:numPr>
           <w:ilvl w:val="0"/>
-          <w:numId w:val="1030"/>
+          <w:numId w:val="1031"/>
         </w:numPr>
         <w:pStyle w:val="Compact"/>
       </w:pPr>
@@ -24663,7 +24872,7 @@
       <w:pPr>
         <w:numPr>
           <w:ilvl w:val="0"/>
-          <w:numId w:val="1030"/>
+          <w:numId w:val="1031"/>
         </w:numPr>
         <w:pStyle w:val="Compact"/>
       </w:pPr>
@@ -24957,7 +25166,7 @@
       <w:pPr>
         <w:numPr>
           <w:ilvl w:val="0"/>
-          <w:numId w:val="1031"/>
+          <w:numId w:val="1032"/>
         </w:numPr>
         <w:pStyle w:val="Compact"/>
       </w:pPr>
@@ -24969,7 +25178,7 @@
       <w:pPr>
         <w:numPr>
           <w:ilvl w:val="0"/>
-          <w:numId w:val="1031"/>
+          <w:numId w:val="1032"/>
         </w:numPr>
         <w:pStyle w:val="Compact"/>
       </w:pPr>
@@ -25279,7 +25488,7 @@
       <w:pPr>
         <w:numPr>
           <w:ilvl w:val="0"/>
-          <w:numId w:val="1032"/>
+          <w:numId w:val="1033"/>
         </w:numPr>
         <w:pStyle w:val="Compact"/>
       </w:pPr>
@@ -25291,7 +25500,7 @@
       <w:pPr>
         <w:numPr>
           <w:ilvl w:val="0"/>
-          <w:numId w:val="1032"/>
+          <w:numId w:val="1033"/>
         </w:numPr>
         <w:pStyle w:val="Compact"/>
       </w:pPr>
@@ -25303,7 +25512,7 @@
       <w:pPr>
         <w:numPr>
           <w:ilvl w:val="0"/>
-          <w:numId w:val="1032"/>
+          <w:numId w:val="1033"/>
         </w:numPr>
         <w:pStyle w:val="Compact"/>
       </w:pPr>
@@ -25675,7 +25884,7 @@
       <w:pPr>
         <w:numPr>
           <w:ilvl w:val="0"/>
-          <w:numId w:val="1033"/>
+          <w:numId w:val="1034"/>
         </w:numPr>
         <w:pStyle w:val="Compact"/>
       </w:pPr>
@@ -25979,7 +26188,7 @@
       <w:pPr>
         <w:numPr>
           <w:ilvl w:val="0"/>
-          <w:numId w:val="1034"/>
+          <w:numId w:val="1035"/>
         </w:numPr>
         <w:pStyle w:val="Compact"/>
       </w:pPr>
@@ -26025,7 +26234,7 @@
       <w:pPr>
         <w:numPr>
           <w:ilvl w:val="0"/>
-          <w:numId w:val="1034"/>
+          <w:numId w:val="1035"/>
         </w:numPr>
         <w:pStyle w:val="Compact"/>
       </w:pPr>
@@ -26047,7 +26256,7 @@
       <w:pPr>
         <w:numPr>
           <w:ilvl w:val="0"/>
-          <w:numId w:val="1034"/>
+          <w:numId w:val="1035"/>
         </w:numPr>
         <w:pStyle w:val="Compact"/>
       </w:pPr>
@@ -26069,7 +26278,7 @@
       <w:pPr>
         <w:numPr>
           <w:ilvl w:val="0"/>
-          <w:numId w:val="1034"/>
+          <w:numId w:val="1035"/>
         </w:numPr>
         <w:pStyle w:val="Compact"/>
       </w:pPr>
@@ -26636,7 +26845,7 @@
       <w:pPr>
         <w:numPr>
           <w:ilvl w:val="0"/>
-          <w:numId w:val="1035"/>
+          <w:numId w:val="1036"/>
         </w:numPr>
         <w:pStyle w:val="Compact"/>
       </w:pPr>
@@ -26664,7 +26873,7 @@
       <w:pPr>
         <w:numPr>
           <w:ilvl w:val="0"/>
-          <w:numId w:val="1035"/>
+          <w:numId w:val="1036"/>
         </w:numPr>
         <w:pStyle w:val="Compact"/>
       </w:pPr>
@@ -26676,7 +26885,7 @@
       <w:pPr>
         <w:numPr>
           <w:ilvl w:val="0"/>
-          <w:numId w:val="1035"/>
+          <w:numId w:val="1036"/>
         </w:numPr>
         <w:pStyle w:val="Compact"/>
       </w:pPr>
@@ -26704,7 +26913,7 @@
       <w:pPr>
         <w:numPr>
           <w:ilvl w:val="0"/>
-          <w:numId w:val="1035"/>
+          <w:numId w:val="1036"/>
         </w:numPr>
         <w:pStyle w:val="Compact"/>
       </w:pPr>
@@ -28244,6 +28453,9 @@
     <w:abstractNumId w:val="991"/>
   </w:num>
   <w:num w:numId="1015">
+    <w:abstractNumId w:val="991"/>
+  </w:num>
+  <w:num w:numId="1016">
     <w:abstractNumId w:val="99411"/>
     <w:lvlOverride w:ilvl="0">
       <w:startOverride w:val="1"/>
@@ -28272,9 +28484,6 @@
     <w:lvlOverride w:ilvl="8">
       <w:startOverride w:val="1"/>
     </w:lvlOverride>
-  </w:num>
-  <w:num w:numId="1016">
-    <w:abstractNumId w:val="991"/>
   </w:num>
   <w:num w:numId="1017">
     <w:abstractNumId w:val="991"/>
@@ -28328,6 +28537,9 @@
     <w:abstractNumId w:val="991"/>
   </w:num>
   <w:num w:numId="1034">
+    <w:abstractNumId w:val="991"/>
+  </w:num>
+  <w:num w:numId="1035">
     <w:abstractNumId w:val="99411"/>
     <w:lvlOverride w:ilvl="0">
       <w:startOverride w:val="1"/>
@@ -28357,7 +28569,7 @@
       <w:startOverride w:val="1"/>
     </w:lvlOverride>
   </w:num>
-  <w:num w:numId="1035">
+  <w:num w:numId="1036">
     <w:abstractNumId w:val="99411"/>
     <w:lvlOverride w:ilvl="0">
       <w:startOverride w:val="1"/>

</xml_diff>

<commit_message>
Grimm: law allegiances; campaign and custom allegiances
- The U.S. Marshals, A County Sheriff's Office, A City Police Department
  (where some fellow officers are Wesen) and The Pinkerton National
  Detective Agency.
- GM view: Campaign allegiances, added on the fly; saved in the posse file
  and in an allegiances file players open in their creator. Characters
  keep a copy, so it travels with their file.
- "Another allegiance": written with the GM; checklist and sheet support.

Co-Authored-By: Claude Opus 5.5 <noreply@anthropic.com>
Claude-Session: https://claude.ai/code/session_015SADCFzhKijkC2foUmXrpC
</commit_message>
<xml_diff>
--- a/grimm-west/Grimm_Players_Guide.docx
+++ b/grimm-west/Grimm_Players_Guide.docx
@@ -2957,7 +2957,47 @@
         <w:pStyle w:val="FirstParagraph"/>
       </w:pPr>
       <w:r>
-        <w:t xml:space="preserve">Anyone can owe allegiance to one of the powers of the hidden world. It’s a benefit paired with a burden; the burden works like a complication and earns Grit when it causes you a real problem.</w:t>
+        <w:t xml:space="preserve">Anyone can owe allegiance to one of the powers of the hidden world, or of the law. It’s a benefit paired with a burden; the burden works like a complication and earns Grit when it causes you a real problem.</w:t>
+      </w:r>
+    </w:p>
+    <w:p>
+      <w:pPr>
+        <w:pStyle w:val="BodyText"/>
+      </w:pPr>
+      <w:r>
+        <w:t xml:space="preserve">The GM can add others met in play (the creator’s GM view has a</w:t>
+      </w:r>
+      <w:r>
+        <w:t xml:space="preserve"> </w:t>
+      </w:r>
+      <w:r>
+        <w:rPr>
+          <w:bCs/>
+          <w:b/>
+        </w:rPr>
+        <w:t xml:space="preserve">Campaign allegiances</w:t>
+      </w:r>
+      <w:r>
+        <w:t xml:space="preserve"> </w:t>
+      </w:r>
+      <w:r>
+        <w:t xml:space="preserve">list), and a player can write one with the GM: choose</w:t>
+      </w:r>
+      <w:r>
+        <w:t xml:space="preserve"> </w:t>
+      </w:r>
+      <w:r>
+        <w:rPr>
+          <w:iCs/>
+          <w:i/>
+        </w:rPr>
+        <w:t xml:space="preserve">Another allegiance</w:t>
+      </w:r>
+      <w:r>
+        <w:t xml:space="preserve"> </w:t>
+      </w:r>
+      <w:r>
+        <w:t xml:space="preserve">and give it a name, a benefit and a burden.</w:t>
       </w:r>
     </w:p>
     <w:tbl>
@@ -3131,6 +3171,198 @@
                 <w:sz w:val="19"/>
               </w:rPr>
               <w:t xml:space="preserve">Duty: an involuntary call to serve, and the family’s rivals hunt you</w:t>
+            </w:r>
+          </w:p>
+        </w:tc>
+      </w:tr>
+      <w:tr>
+        <w:tc>
+          <w:tcPr/>
+          <w:p>
+            <w:pPr>
+              <w:pStyle w:val="Compact"/>
+              <w:jc w:val="left"/>
+            </w:pPr>
+            <w:r>
+              <w:rPr>
+                <w:b/>
+                <w:sz w:val="19"/>
+              </w:rPr>
+              <w:t xml:space="preserve">The U.S. Marshals</w:t>
+            </w:r>
+          </w:p>
+        </w:tc>
+        <w:tc>
+          <w:tcPr/>
+          <w:p>
+            <w:pPr>
+              <w:pStyle w:val="Compact"/>
+              <w:jc w:val="left"/>
+            </w:pPr>
+            <w:r>
+              <w:rPr>
+                <w:sz w:val="19"/>
+              </w:rPr>
+              <w:t xml:space="preserve">Once per case, a federal warrant, a posse sworn in on the spot, or a telegram to the district marshal</w:t>
+            </w:r>
+          </w:p>
+        </w:tc>
+        <w:tc>
+          <w:tcPr/>
+          <w:p>
+            <w:pPr>
+              <w:pStyle w:val="Compact"/>
+              <w:jc w:val="left"/>
+            </w:pPr>
+            <w:r>
+              <w:rPr>
+                <w:sz w:val="19"/>
+              </w:rPr>
+              <w:t xml:space="preserve">Duty: the marshal sends you after federal fugitives, and the men you’ve jailed have friends</w:t>
+            </w:r>
+          </w:p>
+        </w:tc>
+      </w:tr>
+      <w:tr>
+        <w:tc>
+          <w:tcPr/>
+          <w:p>
+            <w:pPr>
+              <w:pStyle w:val="Compact"/>
+              <w:jc w:val="left"/>
+            </w:pPr>
+            <w:r>
+              <w:rPr>
+                <w:b/>
+                <w:sz w:val="19"/>
+              </w:rPr>
+              <w:t xml:space="preserve">A County Sheriff’s Office</w:t>
+            </w:r>
+          </w:p>
+        </w:tc>
+        <w:tc>
+          <w:tcPr/>
+          <w:p>
+            <w:pPr>
+              <w:pStyle w:val="Compact"/>
+              <w:jc w:val="left"/>
+            </w:pPr>
+            <w:r>
+              <w:rPr>
+                <w:sz w:val="19"/>
+              </w:rPr>
+              <w:t xml:space="preserve">Once per case, a deputy’s help, the county jail, or the county records and wanted posters</w:t>
+            </w:r>
+          </w:p>
+        </w:tc>
+        <w:tc>
+          <w:tcPr/>
+          <w:p>
+            <w:pPr>
+              <w:pStyle w:val="Compact"/>
+              <w:jc w:val="left"/>
+            </w:pPr>
+            <w:r>
+              <w:rPr>
+                <w:sz w:val="19"/>
+              </w:rPr>
+              <w:t xml:space="preserve">Duty: the sheriff calls on you, and the county’s feuds and elections become yours</w:t>
+            </w:r>
+          </w:p>
+        </w:tc>
+      </w:tr>
+      <w:tr>
+        <w:tc>
+          <w:tcPr/>
+          <w:p>
+            <w:pPr>
+              <w:pStyle w:val="Compact"/>
+              <w:jc w:val="left"/>
+            </w:pPr>
+            <w:r>
+              <w:rPr>
+                <w:b/>
+                <w:sz w:val="19"/>
+              </w:rPr>
+              <w:t xml:space="preserve">A City Police Department</w:t>
+            </w:r>
+          </w:p>
+        </w:tc>
+        <w:tc>
+          <w:tcPr/>
+          <w:p>
+            <w:pPr>
+              <w:pStyle w:val="Compact"/>
+              <w:jc w:val="left"/>
+            </w:pPr>
+            <w:r>
+              <w:rPr>
+                <w:sz w:val="19"/>
+              </w:rPr>
+              <w:t xml:space="preserve">Once per case, a patrolman’s help, a night in the cells for someone, or the station’s files</w:t>
+            </w:r>
+          </w:p>
+        </w:tc>
+        <w:tc>
+          <w:tcPr/>
+          <w:p>
+            <w:pPr>
+              <w:pStyle w:val="Compact"/>
+              <w:jc w:val="left"/>
+            </w:pPr>
+            <w:r>
+              <w:rPr>
+                <w:sz w:val="19"/>
+              </w:rPr>
+              <w:t xml:space="preserve">Duty: the captain gives the orders, and some of your fellow officers are Wesen with loyalties of their own</w:t>
+            </w:r>
+          </w:p>
+        </w:tc>
+      </w:tr>
+      <w:tr>
+        <w:tc>
+          <w:tcPr/>
+          <w:p>
+            <w:pPr>
+              <w:pStyle w:val="Compact"/>
+              <w:jc w:val="left"/>
+            </w:pPr>
+            <w:r>
+              <w:rPr>
+                <w:b/>
+                <w:sz w:val="19"/>
+              </w:rPr>
+              <w:t xml:space="preserve">The Pinkerton National Detective Agency</w:t>
+            </w:r>
+          </w:p>
+        </w:tc>
+        <w:tc>
+          <w:tcPr/>
+          <w:p>
+            <w:pPr>
+              <w:pStyle w:val="Compact"/>
+              <w:jc w:val="left"/>
+            </w:pPr>
+            <w:r>
+              <w:rPr>
+                <w:sz w:val="19"/>
+              </w:rPr>
+              <w:t xml:space="preserve">Once per case, an agency file on someone, an operative’s help, or a client’s money for the work</w:t>
+            </w:r>
+          </w:p>
+        </w:tc>
+        <w:tc>
+          <w:tcPr/>
+          <w:p>
+            <w:pPr>
+              <w:pStyle w:val="Compact"/>
+              <w:jc w:val="left"/>
+            </w:pPr>
+            <w:r>
+              <w:rPr>
+                <w:sz w:val="19"/>
+              </w:rPr>
+              <w:t xml:space="preserve">Duty: the client comes first, even a railroad or a mine owner breaking a strike, and working folk hate the name</w:t>
             </w:r>
           </w:p>
         </w:tc>

</xml_diff>

<commit_message>
Grimm: The Texas Rangers allegiance
Co-Authored-By: Claude Opus 5.5 <noreply@anthropic.com>
Claude-Session: https://claude.ai/code/session_015SADCFzhKijkC2foUmXrpC
</commit_message>
<xml_diff>
--- a/grimm-west/Grimm_Players_Guide.docx
+++ b/grimm-west/Grimm_Players_Guide.docx
@@ -3219,6 +3219,54 @@
                 <w:sz w:val="19"/>
               </w:rPr>
               <w:t xml:space="preserve">Duty: the marshal sends you after federal fugitives, and the men you’ve jailed have friends</w:t>
+            </w:r>
+          </w:p>
+        </w:tc>
+      </w:tr>
+      <w:tr>
+        <w:tc>
+          <w:tcPr/>
+          <w:p>
+            <w:pPr>
+              <w:pStyle w:val="Compact"/>
+              <w:jc w:val="left"/>
+            </w:pPr>
+            <w:r>
+              <w:rPr>
+                <w:b/>
+                <w:sz w:val="19"/>
+              </w:rPr>
+              <w:t xml:space="preserve">The Texas Rangers</w:t>
+            </w:r>
+          </w:p>
+        </w:tc>
+        <w:tc>
+          <w:tcPr/>
+          <w:p>
+            <w:pPr>
+              <w:pStyle w:val="Compact"/>
+              <w:jc w:val="left"/>
+            </w:pPr>
+            <w:r>
+              <w:rPr>
+                <w:sz w:val="19"/>
+              </w:rPr>
+              <w:t xml:space="preserve">Once per case, a Ranger company riding with you, a warrant good anywhere in Texas, or word from a frontier post</w:t>
+            </w:r>
+          </w:p>
+        </w:tc>
+        <w:tc>
+          <w:tcPr/>
+          <w:p>
+            <w:pPr>
+              <w:pStyle w:val="Compact"/>
+              <w:jc w:val="left"/>
+            </w:pPr>
+            <w:r>
+              <w:rPr>
+                <w:sz w:val="19"/>
+              </w:rPr>
+              <w:t xml:space="preserve">Duty: the Captain sends you wherever Texas is in trouble, and the Rangers’ hard reputation rides with you</w:t>
             </w:r>
           </w:p>
         </w:tc>

</xml_diff>

<commit_message>
Grimm: one Lawman calling
- Marshal, Deputy and Detective become Lawman; the Allegiance says which
  force (Marshals, Rangers, sheriff, police, Pinkertons), and a Badge or
  Pinkerton Credentials advantage gives its authority. Core skills:
  Shooting, Investigation, Read People, Riding.
- Saved characters with the old callings open as Lawman.
- Eliza Kessler serves The U.S. Marshals; the example lawman, Josephine
  Hale, the Pinkertons.

Co-Authored-By: Claude Opus 5.5 <noreply@anthropic.com>
Claude-Session: https://claude.ai/code/session_015SADCFzhKijkC2foUmXrpC
</commit_message>
<xml_diff>
--- a/grimm-west/Grimm_Players_Guide.docx
+++ b/grimm-west/Grimm_Players_Guide.docx
@@ -554,7 +554,7 @@
                 <w:b/>
                 <w:sz w:val="19"/>
               </w:rPr>
-              <w:t xml:space="preserve">Marshal</w:t>
+              <w:t xml:space="preserve">Lawman</w:t>
             </w:r>
           </w:p>
         </w:tc>
@@ -584,148 +584,22 @@
               <w:rPr>
                 <w:sz w:val="19"/>
               </w:rPr>
-              <w:t xml:space="preserve">Lead others and carry what authority there is</w:t>
-            </w:r>
-          </w:p>
-        </w:tc>
-        <w:tc>
-          <w:tcPr/>
-          <w:p>
-            <w:pPr>
-              <w:pStyle w:val="Compact"/>
-              <w:jc w:val="left"/>
-            </w:pPr>
-            <w:r>
-              <w:rPr>
-                <w:sz w:val="19"/>
-              </w:rPr>
-              <w:t xml:space="preserve">Leadership, Shooting, Riding, Read People</w:t>
-            </w:r>
-          </w:p>
-        </w:tc>
-      </w:tr>
-      <w:tr>
-        <w:tc>
-          <w:tcPr/>
-          <w:p>
-            <w:pPr>
-              <w:pStyle w:val="Compact"/>
-              <w:jc w:val="left"/>
-            </w:pPr>
-            <w:r>
-              <w:rPr>
-                <w:b/>
-                <w:sz w:val="19"/>
-              </w:rPr>
-              <w:t xml:space="preserve">Deputy</w:t>
-            </w:r>
-          </w:p>
-        </w:tc>
-        <w:tc>
-          <w:tcPr/>
-          <w:p>
-            <w:pPr>
-              <w:pStyle w:val="Compact"/>
-              <w:jc w:val="left"/>
-            </w:pPr>
-            <w:r>
-              <w:rPr>
-                <w:sz w:val="19"/>
-              </w:rPr>
-              <w:t xml:space="preserve">The Law</w:t>
-            </w:r>
-          </w:p>
-        </w:tc>
-        <w:tc>
-          <w:tcPr/>
-          <w:p>
-            <w:pPr>
-              <w:pStyle w:val="Compact"/>
-              <w:jc w:val="left"/>
-            </w:pPr>
-            <w:r>
-              <w:rPr>
-                <w:sz w:val="19"/>
-              </w:rPr>
-              <w:t xml:space="preserve">Keep order, guard prisoners, back up the marshal</w:t>
-            </w:r>
-          </w:p>
-        </w:tc>
-        <w:tc>
-          <w:tcPr/>
-          <w:p>
-            <w:pPr>
-              <w:pStyle w:val="Compact"/>
-              <w:jc w:val="left"/>
-            </w:pPr>
-            <w:r>
-              <w:rPr>
-                <w:sz w:val="19"/>
-              </w:rPr>
-              <w:t xml:space="preserve">Shooting, Brawling, Riding, Read People</w:t>
-            </w:r>
-          </w:p>
-        </w:tc>
-      </w:tr>
-      <w:tr>
-        <w:tc>
-          <w:tcPr/>
-          <w:p>
-            <w:pPr>
-              <w:pStyle w:val="Compact"/>
-              <w:jc w:val="left"/>
-            </w:pPr>
-            <w:r>
-              <w:rPr>
-                <w:b/>
-                <w:sz w:val="19"/>
-              </w:rPr>
-              <w:t xml:space="preserve">Detective</w:t>
-            </w:r>
-          </w:p>
-        </w:tc>
-        <w:tc>
-          <w:tcPr/>
-          <w:p>
-            <w:pPr>
-              <w:pStyle w:val="Compact"/>
-              <w:jc w:val="left"/>
-            </w:pPr>
-            <w:r>
-              <w:rPr>
-                <w:sz w:val="19"/>
-              </w:rPr>
-              <w:t xml:space="preserve">The Law</w:t>
-            </w:r>
-          </w:p>
-        </w:tc>
-        <w:tc>
-          <w:tcPr/>
-          <w:p>
-            <w:pPr>
-              <w:pStyle w:val="Compact"/>
-              <w:jc w:val="left"/>
-            </w:pPr>
-            <w:r>
-              <w:rPr>
-                <w:sz w:val="19"/>
-              </w:rPr>
-              <w:t xml:space="preserve">Investigate crimes for the Pinkertons or a private client</w:t>
-            </w:r>
-          </w:p>
-        </w:tc>
-        <w:tc>
-          <w:tcPr/>
-          <w:p>
-            <w:pPr>
-              <w:pStyle w:val="Compact"/>
-              <w:jc w:val="left"/>
-            </w:pPr>
-            <w:r>
-              <w:rPr>
-                <w:sz w:val="19"/>
-              </w:rPr>
-              <w:t xml:space="preserve">Investigation, Read People, Deception, Stealth</w:t>
+              <w:t xml:space="preserve">Wear a badge or carry credentials and bring the guilty in: a marshal, a Ranger, a sheriff or deputy, a city policeman, a Pinkerton. Your Allegiance says which force; a Badge or Pinkerton Credentials advantage gives its authority</w:t>
+            </w:r>
+          </w:p>
+        </w:tc>
+        <w:tc>
+          <w:tcPr/>
+          <w:p>
+            <w:pPr>
+              <w:pStyle w:val="Compact"/>
+              <w:jc w:val="left"/>
+            </w:pPr>
+            <w:r>
+              <w:rPr>
+                <w:sz w:val="19"/>
+              </w:rPr>
+              <w:t xml:space="preserve">Shooting, Investigation, Read People, Riding</w:t>
             </w:r>
           </w:p>
         </w:tc>
@@ -3810,13 +3684,13 @@
     </w:p>
     <w:bookmarkEnd w:id="34"/>
     <w:bookmarkEnd w:id="35"/>
-    <w:bookmarkStart w:id="36" w:name="example-detective"/>
+    <w:bookmarkStart w:id="36" w:name="example-lawman"/>
     <w:p>
       <w:pPr>
         <w:pStyle w:val="Heading2"/>
       </w:pPr>
       <w:r>
-        <w:t xml:space="preserve">Example detective</w:t>
+        <w:t xml:space="preserve">Example lawman</w:t>
       </w:r>
     </w:p>
     <w:p>
@@ -3951,6 +3825,28 @@
       </w:r>
       <w:r>
         <w:t xml:space="preserve">a clerk in the Pinkertons’ regional office who’ll pull a file, quietly.</w:t>
+      </w:r>
+    </w:p>
+    <w:p>
+      <w:pPr>
+        <w:numPr>
+          <w:ilvl w:val="0"/>
+          <w:numId w:val="1007"/>
+        </w:numPr>
+        <w:pStyle w:val="Compact"/>
+      </w:pPr>
+      <w:r>
+        <w:rPr>
+          <w:bCs/>
+          <w:b/>
+        </w:rPr>
+        <w:t xml:space="preserve">Allegiance:</w:t>
+      </w:r>
+      <w:r>
+        <w:t xml:space="preserve"> </w:t>
+      </w:r>
+      <w:r>
+        <w:t xml:space="preserve">The Pinkerton National Detective Agency.</w:t>
       </w:r>
     </w:p>
     <w:bookmarkEnd w:id="36"/>
@@ -14406,7 +14302,7 @@
           <w:iCs/>
           <w:i/>
         </w:rPr>
-        <w:t xml:space="preserve">Deputy U.S. Marshal, Marshal. Grimm (Tier 2).</w:t>
+        <w:t xml:space="preserve">Deputy U.S. Marshal, Lawman. Grimm (Tier 2).</w:t>
       </w:r>
       <w:r>
         <w:t xml:space="preserve"> </w:t>
@@ -14527,6 +14423,22 @@
       </w:r>
       <w:r>
         <w:t xml:space="preserve">Law and Order; trigger: a Wesen suspect could be killed instead of arrested.</w:t>
+      </w:r>
+      <w:r>
+        <w:t xml:space="preserve"> </w:t>
+      </w:r>
+      <w:r>
+        <w:rPr>
+          <w:bCs/>
+          <w:b/>
+        </w:rPr>
+        <w:t xml:space="preserve">Allegiance:</w:t>
+      </w:r>
+      <w:r>
+        <w:t xml:space="preserve"> </w:t>
+      </w:r>
+      <w:r>
+        <w:t xml:space="preserve">The U.S. Marshals.</w:t>
       </w:r>
     </w:p>
     <w:p>

</xml_diff>

<commit_message>
Grimm: drop the term pow-wow (Braucher Lens; Lena Baer is a Braucher)
Co-Authored-By: Claude Opus 5.5 <noreply@anthropic.com>
Claude-Session: https://claude.ai/code/session_015SADCFzhKijkC2foUmXrpC
</commit_message>
<xml_diff>
--- a/grimm-west/Grimm_Players_Guide.docx
+++ b/grimm-west/Grimm_Players_Guide.docx
@@ -7706,19 +7706,6 @@
           <w:b/>
         </w:rPr>
         <w:t xml:space="preserve">Braucherei</w:t>
-      </w:r>
-      <w:r>
-        <w:t xml:space="preserve">, or</w:t>
-      </w:r>
-      <w:r>
-        <w:t xml:space="preserve"> </w:t>
-      </w:r>
-      <w:r>
-        <w:rPr>
-          <w:iCs/>
-          <w:i/>
-        </w:rPr>
-        <w:t xml:space="preserve">pow-wow</w:t>
       </w:r>
       <w:r>
         <w:t xml:space="preserve">: the Pennsylvania Dutch healing craft of spoken charms, prayers and blessed objects, from Hohman’s</w:t>
@@ -15448,7 +15435,7 @@
           <w:iCs/>
           <w:i/>
         </w:rPr>
-        <w:t xml:space="preserve">Pow-wow doctor, Occultist. Incantare (Tier 2).</w:t>
+        <w:t xml:space="preserve">Braucher, Occultist. Incantare (Tier 2).</w:t>
       </w:r>
       <w:r>
         <w:t xml:space="preserve"> </w:t>
@@ -23680,7 +23667,7 @@
                 <w:b/>
                 <w:sz w:val="19"/>
               </w:rPr>
-              <w:t xml:space="preserve">Braucher Lens (Pow-wow Doctor)</w:t>
+              <w:t xml:space="preserve">Braucher Lens</w:t>
             </w:r>
           </w:p>
         </w:tc>

</xml_diff>

<commit_message>
Grimm: telling hits, called shots and Hard to put down
Co-Authored-By: Claude Opus 5.5 <noreply@anthropic.com>
Claude-Session: https://claude.ai/code/session_015SADCFzhKijkC2foUmXrpC
</commit_message>
<xml_diff>
--- a/grimm-west/Grimm_Players_Guide.docx
+++ b/grimm-west/Grimm_Players_Guide.docx
@@ -2151,6 +2151,74 @@
           </w:p>
         </w:tc>
       </w:tr>
+      <w:tr>
+        <w:tc>
+          <w:tcPr/>
+          <w:p>
+            <w:pPr>
+              <w:pStyle w:val="Compact"/>
+              <w:jc w:val="left"/>
+            </w:pPr>
+            <w:r>
+              <w:rPr>
+                <w:b/>
+                <w:sz w:val="19"/>
+              </w:rPr>
+              <w:t xml:space="preserve">Hard to put down</w:t>
+            </w:r>
+          </w:p>
+        </w:tc>
+        <w:tc>
+          <w:tcPr/>
+          <w:p>
+            <w:pPr>
+              <w:pStyle w:val="Compact"/>
+              <w:jc w:val="left"/>
+            </w:pPr>
+            <w:r>
+              <w:rPr>
+                <w:sz w:val="19"/>
+              </w:rPr>
+              <w:t xml:space="preserve">Once per fight, shrug off a telling hit’s effect: you still take its boxes (see</w:t>
+            </w:r>
+            <w:r>
+              <w:rPr>
+                <w:sz w:val="19"/>
+              </w:rPr>
+              <w:t xml:space="preserve"> </w:t>
+            </w:r>
+            <w:r>
+              <w:rPr>
+                <w:iCs/>
+                <w:i/>
+                <w:sz w:val="19"/>
+              </w:rPr>
+              <w:t xml:space="preserve">Telling hits</w:t>
+            </w:r>
+            <w:r>
+              <w:rPr>
+                <w:sz w:val="19"/>
+              </w:rPr>
+              <w:t xml:space="preserve">)</w:t>
+            </w:r>
+          </w:p>
+        </w:tc>
+        <w:tc>
+          <w:tcPr/>
+          <w:p>
+            <w:pPr>
+              <w:pStyle w:val="Compact"/>
+              <w:jc w:val="left"/>
+            </w:pPr>
+            <w:r>
+              <w:rPr>
+                <w:sz w:val="19"/>
+              </w:rPr>
+              <w:t xml:space="preserve">1</w:t>
+            </w:r>
+          </w:p>
+        </w:tc>
+      </w:tr>
     </w:tbl>
     <w:bookmarkEnd w:id="26"/>
     <w:bookmarkStart w:id="27" w:name="spending-points"/>
@@ -7956,7 +8024,7 @@
     </w:p>
     <w:bookmarkEnd w:id="58"/>
     <w:bookmarkEnd w:id="59"/>
-    <w:bookmarkStart w:id="67" w:name="personal-combat"/>
+    <w:bookmarkStart w:id="68" w:name="personal-combat"/>
     <w:p>
       <w:pPr>
         <w:pStyle w:val="Heading1"/>
@@ -8214,18 +8282,523 @@
         <w:pStyle w:val="FirstParagraph"/>
       </w:pPr>
       <w:r>
-        <w:t xml:space="preserve">Solid cover blocks a shot. Partial cover imposes −2 on the attack. Weapon effects apply after a hit survives any defense. Success margin does not increase damage.</w:t>
-      </w:r>
-    </w:p>
-    <w:p>
-      <w:pPr>
-        <w:pStyle w:val="BodyText"/>
-      </w:pPr>
+        <w:t xml:space="preserve">Solid cover blocks a shot. Partial cover imposes −2 on the attack. Weapon effects apply after a hit survives any defense. Success margin does not increase damage: a great hit decides</w:t>
+      </w:r>
+      <w:r>
+        <w:t xml:space="preserve"> </w:t>
+      </w:r>
       <w:r>
         <w:rPr>
           <w:iCs/>
           <w:i/>
         </w:rPr>
+        <w:t xml:space="preserve">what</w:t>
+      </w:r>
+      <w:r>
+        <w:t xml:space="preserve"> </w:t>
+      </w:r>
+      <w:r>
+        <w:t xml:space="preserve">happens instead.</w:t>
+      </w:r>
+    </w:p>
+    <w:bookmarkEnd w:id="61"/>
+    <w:bookmarkStart w:id="62" w:name="telling-hits"/>
+    <w:p>
+      <w:pPr>
+        <w:pStyle w:val="Heading2"/>
+      </w:pPr>
+      <w:r>
+        <w:t xml:space="preserve">Telling hits</w:t>
+      </w:r>
+    </w:p>
+    <w:p>
+      <w:pPr>
+        <w:pStyle w:val="FirstParagraph"/>
+      </w:pPr>
+      <w:r>
+        <w:t xml:space="preserve">A really good shot, or a blow that lands exactly where it was meant to, lets the attacker say what it does.</w:t>
+      </w:r>
+    </w:p>
+    <w:p>
+      <w:pPr>
+        <w:numPr>
+          <w:ilvl w:val="0"/>
+          <w:numId w:val="1014"/>
+        </w:numPr>
+        <w:pStyle w:val="Compact"/>
+      </w:pPr>
+      <w:r>
+        <w:rPr>
+          <w:bCs/>
+          <w:b/>
+        </w:rPr>
+        <w:t xml:space="preserve">A telling hit</w:t>
+      </w:r>
+      <w:r>
+        <w:t xml:space="preserve"> </w:t>
+      </w:r>
+      <w:r>
+        <w:t xml:space="preserve">is an attack that succeeds by</w:t>
+      </w:r>
+      <w:r>
+        <w:t xml:space="preserve"> </w:t>
+      </w:r>
+      <w:r>
+        <w:rPr>
+          <w:bCs/>
+          <w:b/>
+        </w:rPr>
+        <w:t xml:space="preserve">5 or more</w:t>
+      </w:r>
+      <w:r>
+        <w:t xml:space="preserve">, or on a natural 3 or 4, and isn’t stopped by a defense. The attacker picks</w:t>
+      </w:r>
+      <w:r>
+        <w:t xml:space="preserve"> </w:t>
+      </w:r>
+      <w:r>
+        <w:rPr>
+          <w:bCs/>
+          <w:b/>
+        </w:rPr>
+        <w:t xml:space="preserve">one effect</w:t>
+      </w:r>
+      <w:r>
+        <w:t xml:space="preserve"> </w:t>
+      </w:r>
+      <w:r>
+        <w:t xml:space="preserve">below and describes it. The weapon still marks its usual boxes.</w:t>
+      </w:r>
+    </w:p>
+    <w:p>
+      <w:pPr>
+        <w:numPr>
+          <w:ilvl w:val="0"/>
+          <w:numId w:val="1014"/>
+        </w:numPr>
+        <w:pStyle w:val="Compact"/>
+      </w:pPr>
+      <w:r>
+        <w:rPr>
+          <w:bCs/>
+          <w:b/>
+        </w:rPr>
+        <w:t xml:space="preserve">A called shot.</w:t>
+      </w:r>
+      <w:r>
+        <w:t xml:space="preserve"> </w:t>
+      </w:r>
+      <w:r>
+        <w:t xml:space="preserve">Before rolling, name the effect you want and take −2 on the attack, or −4 for a small target (a hand, an eye, a rope, a lock). If the attack hits at all, the effect happens, whatever the margin.</w:t>
+      </w:r>
+      <w:r>
+        <w:t xml:space="preserve"> </w:t>
+      </w:r>
+      <w:r>
+        <w:rPr>
+          <w:bCs/>
+          <w:b/>
+        </w:rPr>
+        <w:t xml:space="preserve">Careful Marksman</w:t>
+      </w:r>
+      <w:r>
+        <w:t xml:space="preserve"> </w:t>
+      </w:r>
+      <w:r>
+        <w:t xml:space="preserve">and</w:t>
+      </w:r>
+      <w:r>
+        <w:t xml:space="preserve"> </w:t>
+      </w:r>
+      <w:r>
+        <w:rPr>
+          <w:bCs/>
+          <w:b/>
+        </w:rPr>
+        <w:t xml:space="preserve">Hunter’s Eye</w:t>
+      </w:r>
+      <w:r>
+        <w:t xml:space="preserve"> </w:t>
+      </w:r>
+      <w:r>
+        <w:t xml:space="preserve">cut this penalty by 1.</w:t>
+      </w:r>
+    </w:p>
+    <w:p>
+      <w:pPr>
+        <w:numPr>
+          <w:ilvl w:val="0"/>
+          <w:numId w:val="1014"/>
+        </w:numPr>
+        <w:pStyle w:val="Compact"/>
+      </w:pPr>
+      <w:r>
+        <w:rPr>
+          <w:bCs/>
+          <w:b/>
+        </w:rPr>
+        <w:t xml:space="preserve">Both ways.</w:t>
+      </w:r>
+      <w:r>
+        <w:t xml:space="preserve"> </w:t>
+      </w:r>
+      <w:r>
+        <w:t xml:space="preserve">Wesen, outlaws and worse land telling hits on characters too.</w:t>
+      </w:r>
+    </w:p>
+    <w:tbl>
+      <w:tblPr>
+        <w:tblStyle w:val="Table"/>
+        <w:tblW w:type="pct" w:w="5000"/>
+        <w:tblLook w:firstRow="1" w:lastRow="0" w:firstColumn="0" w:lastColumn="0" w:noHBand="0" w:noVBand="0" w:val="0020"/>
+        <w:jc w:val="start"/>
+        <w:tblBorders>
+          <w:top w:val="single" w:sz="4" w:color="B8C2D3"/>
+          <w:left w:val="single" w:sz="4" w:color="B8C2D3"/>
+          <w:bottom w:val="single" w:sz="4" w:color="B8C2D3"/>
+          <w:right w:val="single" w:sz="4" w:color="B8C2D3"/>
+          <w:insideH w:val="single" w:sz="4" w:color="B8C2D3"/>
+          <w:insideV w:val="single" w:sz="4" w:color="B8C2D3"/>
+        </w:tblBorders>
+      </w:tblPr>
+      <w:tblGrid>
+        <w:gridCol w:w="3960"/>
+        <w:gridCol w:w="3960"/>
+      </w:tblGrid>
+      <w:tr>
+        <w:trPr>
+          <w:tblHeader w:val="true"/>
+        </w:trPr>
+        <w:tc>
+          <w:tcPr>
+            <w:shd w:val="clear" w:fill="F1E6D2"/>
+          </w:tcPr>
+          <w:p>
+            <w:pPr>
+              <w:pStyle w:val="Compact"/>
+              <w:jc w:val="left"/>
+            </w:pPr>
+            <w:r>
+              <w:rPr>
+                <w:b/>
+                <w:sz w:val="19"/>
+              </w:rPr>
+              <w:t xml:space="preserve">Effect</w:t>
+            </w:r>
+          </w:p>
+        </w:tc>
+        <w:tc>
+          <w:tcPr>
+            <w:shd w:val="clear" w:fill="F1E6D2"/>
+          </w:tcPr>
+          <w:p>
+            <w:pPr>
+              <w:pStyle w:val="Compact"/>
+              <w:jc w:val="left"/>
+            </w:pPr>
+            <w:r>
+              <w:rPr>
+                <w:b/>
+                <w:sz w:val="19"/>
+              </w:rPr>
+              <w:t xml:space="preserve">What happens</w:t>
+            </w:r>
+          </w:p>
+        </w:tc>
+      </w:tr>
+      <w:tr>
+        <w:tc>
+          <w:tcPr/>
+          <w:p>
+            <w:pPr>
+              <w:pStyle w:val="Compact"/>
+              <w:jc w:val="left"/>
+            </w:pPr>
+            <w:r>
+              <w:rPr>
+                <w:b/>
+                <w:sz w:val="19"/>
+              </w:rPr>
+              <w:t xml:space="preserve">Disarm</w:t>
+            </w:r>
+          </w:p>
+        </w:tc>
+        <w:tc>
+          <w:tcPr/>
+          <w:p>
+            <w:pPr>
+              <w:pStyle w:val="Compact"/>
+              <w:jc w:val="left"/>
+            </w:pPr>
+            <w:r>
+              <w:rPr>
+                <w:sz w:val="19"/>
+              </w:rPr>
+              <w:t xml:space="preserve">The weapon or held item drops, or flies a few yards away</w:t>
+            </w:r>
+          </w:p>
+        </w:tc>
+      </w:tr>
+      <w:tr>
+        <w:tc>
+          <w:tcPr/>
+          <w:p>
+            <w:pPr>
+              <w:pStyle w:val="Compact"/>
+              <w:jc w:val="left"/>
+            </w:pPr>
+            <w:r>
+              <w:rPr>
+                <w:b/>
+                <w:sz w:val="19"/>
+              </w:rPr>
+              <w:t xml:space="preserve">Knock down</w:t>
+            </w:r>
+          </w:p>
+        </w:tc>
+        <w:tc>
+          <w:tcPr/>
+          <w:p>
+            <w:pPr>
+              <w:pStyle w:val="Compact"/>
+              <w:jc w:val="left"/>
+            </w:pPr>
+            <w:r>
+              <w:rPr>
+                <w:sz w:val="19"/>
+              </w:rPr>
+              <w:t xml:space="preserve">The target falls prone, or is driven back a few steps</w:t>
+            </w:r>
+          </w:p>
+        </w:tc>
+      </w:tr>
+      <w:tr>
+        <w:tc>
+          <w:tcPr/>
+          <w:p>
+            <w:pPr>
+              <w:pStyle w:val="Compact"/>
+              <w:jc w:val="left"/>
+            </w:pPr>
+            <w:r>
+              <w:rPr>
+                <w:b/>
+                <w:sz w:val="19"/>
+              </w:rPr>
+              <w:t xml:space="preserve">Pin</w:t>
+            </w:r>
+          </w:p>
+        </w:tc>
+        <w:tc>
+          <w:tcPr/>
+          <w:p>
+            <w:pPr>
+              <w:pStyle w:val="Compact"/>
+              <w:jc w:val="left"/>
+            </w:pPr>
+            <w:r>
+              <w:rPr>
+                <w:sz w:val="19"/>
+              </w:rPr>
+              <w:t xml:space="preserve">The target is held, tangled or pinned down: their next action goes to getting free</w:t>
+            </w:r>
+          </w:p>
+        </w:tc>
+      </w:tr>
+      <w:tr>
+        <w:tc>
+          <w:tcPr/>
+          <w:p>
+            <w:pPr>
+              <w:pStyle w:val="Compact"/>
+              <w:jc w:val="left"/>
+            </w:pPr>
+            <w:r>
+              <w:rPr>
+                <w:b/>
+                <w:sz w:val="19"/>
+              </w:rPr>
+              <w:t xml:space="preserve">Rattle</w:t>
+            </w:r>
+          </w:p>
+        </w:tc>
+        <w:tc>
+          <w:tcPr/>
+          <w:p>
+            <w:pPr>
+              <w:pStyle w:val="Compact"/>
+              <w:jc w:val="left"/>
+            </w:pPr>
+            <w:r>
+              <w:rPr>
+                <w:sz w:val="19"/>
+              </w:rPr>
+              <w:t xml:space="preserve">−2 to the target’s next roll</w:t>
+            </w:r>
+          </w:p>
+        </w:tc>
+      </w:tr>
+      <w:tr>
+        <w:tc>
+          <w:tcPr/>
+          <w:p>
+            <w:pPr>
+              <w:pStyle w:val="Compact"/>
+              <w:jc w:val="left"/>
+            </w:pPr>
+            <w:r>
+              <w:rPr>
+                <w:b/>
+                <w:sz w:val="19"/>
+              </w:rPr>
+              <w:t xml:space="preserve">Break gear</w:t>
+            </w:r>
+          </w:p>
+        </w:tc>
+        <w:tc>
+          <w:tcPr/>
+          <w:p>
+            <w:pPr>
+              <w:pStyle w:val="Compact"/>
+              <w:jc w:val="left"/>
+            </w:pPr>
+            <w:r>
+              <w:rPr>
+                <w:sz w:val="19"/>
+              </w:rPr>
+              <w:t xml:space="preserve">A shield, weapon or tool breaks</w:t>
+            </w:r>
+          </w:p>
+        </w:tc>
+      </w:tr>
+      <w:tr>
+        <w:tc>
+          <w:tcPr/>
+          <w:p>
+            <w:pPr>
+              <w:pStyle w:val="Compact"/>
+              <w:jc w:val="left"/>
+            </w:pPr>
+            <w:r>
+              <w:rPr>
+                <w:b/>
+                <w:sz w:val="19"/>
+              </w:rPr>
+              <w:t xml:space="preserve">Open them up</w:t>
+            </w:r>
+          </w:p>
+        </w:tc>
+        <w:tc>
+          <w:tcPr/>
+          <w:p>
+            <w:pPr>
+              <w:pStyle w:val="Compact"/>
+              <w:jc w:val="left"/>
+            </w:pPr>
+            <w:r>
+              <w:rPr>
+                <w:sz w:val="19"/>
+              </w:rPr>
+              <w:t xml:space="preserve">The next attack on this target this round gets +2</w:t>
+            </w:r>
+          </w:p>
+        </w:tc>
+      </w:tr>
+      <w:tr>
+        <w:tc>
+          <w:tcPr/>
+          <w:p>
+            <w:pPr>
+              <w:pStyle w:val="Compact"/>
+              <w:jc w:val="left"/>
+            </w:pPr>
+            <w:r>
+              <w:rPr>
+                <w:b/>
+                <w:sz w:val="19"/>
+              </w:rPr>
+              <w:t xml:space="preserve">Precise</w:t>
+            </w:r>
+          </w:p>
+        </w:tc>
+        <w:tc>
+          <w:tcPr/>
+          <w:p>
+            <w:pPr>
+              <w:pStyle w:val="Compact"/>
+              <w:jc w:val="left"/>
+            </w:pPr>
+            <w:r>
+              <w:rPr>
+                <w:sz w:val="19"/>
+              </w:rPr>
+              <w:t xml:space="preserve">You hit exactly what you aimed at: the lantern, the rope, the hand on the trigger</w:t>
+            </w:r>
+          </w:p>
+        </w:tc>
+      </w:tr>
+    </w:tbl>
+    <w:p>
+      <w:pPr>
+        <w:pStyle w:val="BodyText"/>
+      </w:pPr>
+      <w:r>
+        <w:rPr>
+          <w:bCs/>
+          <w:b/>
+        </w:rPr>
+        <w:t xml:space="preserve">Limits.</w:t>
+      </w:r>
+      <w:r>
+        <w:t xml:space="preserve"> </w:t>
+      </w:r>
+      <w:r>
+        <w:t xml:space="preserve">A telling hit never adds boxes and never gets past a defense. The effect has to make sense: nobody disarms a Blutbad of its claws or knocks down a stagecoach, and the GM can rule an effect out. Opponents who drop from one hit are already down, so a telling hit against them sets up what comes next.</w:t>
+      </w:r>
+    </w:p>
+    <w:p>
+      <w:pPr>
+        <w:pStyle w:val="BodyText"/>
+      </w:pPr>
+      <w:r>
+        <w:rPr>
+          <w:bCs/>
+          <w:b/>
+        </w:rPr>
+        <w:t xml:space="preserve">Staying alive.</w:t>
+      </w:r>
+      <w:r>
+        <w:t xml:space="preserve"> </w:t>
+      </w:r>
+      <w:r>
+        <w:t xml:space="preserve">A character on the receiving end can shrug off a telling hit’s effect with</w:t>
+      </w:r>
+      <w:r>
+        <w:t xml:space="preserve"> </w:t>
+      </w:r>
+      <w:r>
+        <w:rPr>
+          <w:bCs/>
+          <w:b/>
+        </w:rPr>
+        <w:t xml:space="preserve">Hard to put down</w:t>
+      </w:r>
+      <w:r>
+        <w:t xml:space="preserve"> </w:t>
+      </w:r>
+      <w:r>
+        <w:t xml:space="preserve">(once per fight) or by spending a Grit point. Either way, they still take the boxes.</w:t>
+      </w:r>
+    </w:p>
+    <w:p>
+      <w:pPr>
+        <w:pStyle w:val="BodyText"/>
+      </w:pPr>
+      <w:r>
+        <w:rPr>
+          <w:iCs/>
+          <w:i/>
+        </w:rPr>
         <w:t xml:space="preserve">Example:</w:t>
       </w:r>
       <w:r>
@@ -8235,8 +8808,8 @@
         <w:t xml:space="preserve">a Blutbad in full woge claws at Deputy Ames and succeeds by 5. Ames hasn’t defended yet this round: Dodge 11, −2 for the clean hit, needs a 9 or less. Ames has a saber in hand, so a parry is possible too: Melee 14 −3 −2 = 9, no better. Ames dodges. When the second Blutbad lunges before Ames’s next turn, there’s no defense left, unless Ames has Additional Defense.</w:t>
       </w:r>
     </w:p>
-    <w:bookmarkEnd w:id="61"/>
-    <w:bookmarkStart w:id="62" w:name="range"/>
+    <w:bookmarkEnd w:id="62"/>
+    <w:bookmarkStart w:id="63" w:name="range"/>
     <w:p>
       <w:pPr>
         <w:pStyle w:val="Heading2"/>
@@ -8594,8 +9167,8 @@
         <w:t xml:space="preserve">, shown in the weapons table. Attacks within it take no penalty. One band beyond it is −2, two bands beyond is −4, and anything farther is out of range. Weapons in hand, claws and fists reach only someone next to you. Your move each turn covers the Close band; give up your action to run and you cover Short.</w:t>
       </w:r>
     </w:p>
-    <w:bookmarkEnd w:id="62"/>
-    <w:bookmarkStart w:id="64" w:name="injury"/>
+    <w:bookmarkEnd w:id="63"/>
+    <w:bookmarkStart w:id="65" w:name="injury"/>
     <w:p>
       <w:pPr>
         <w:pStyle w:val="Heading2"/>
@@ -8884,7 +9457,7 @@
         <w:t xml:space="preserve">Injury penalties replace each other rather than stacking. They apply to movement, attacks, Dodge, and other tasks the injury physically hinders.</w:t>
       </w:r>
     </w:p>
-    <w:bookmarkStart w:id="63" w:name="dying-and-death"/>
+    <w:bookmarkStart w:id="64" w:name="dying-and-death"/>
     <w:p>
       <w:pPr>
         <w:pStyle w:val="Heading3"/>
@@ -8897,7 +9470,7 @@
       <w:pPr>
         <w:numPr>
           <w:ilvl w:val="0"/>
-          <w:numId w:val="1014"/>
+          <w:numId w:val="1015"/>
         </w:numPr>
         <w:pStyle w:val="Compact"/>
       </w:pPr>
@@ -8948,7 +9521,7 @@
       <w:pPr>
         <w:numPr>
           <w:ilvl w:val="0"/>
-          <w:numId w:val="1014"/>
+          <w:numId w:val="1015"/>
         </w:numPr>
         <w:pStyle w:val="Compact"/>
       </w:pPr>
@@ -8970,7 +9543,7 @@
       <w:pPr>
         <w:numPr>
           <w:ilvl w:val="0"/>
-          <w:numId w:val="1014"/>
+          <w:numId w:val="1015"/>
         </w:numPr>
         <w:pStyle w:val="Compact"/>
       </w:pPr>
@@ -8996,9 +9569,9 @@
         <w:t xml:space="preserve">Your protection is avoiding the hit: a defense (Dodge, Parry or Block), cover, and a Grit point, which reduces a hit by one box.</w:t>
       </w:r>
     </w:p>
-    <w:bookmarkEnd w:id="63"/>
     <w:bookmarkEnd w:id="64"/>
-    <w:bookmarkStart w:id="65" w:name="weapons-and-damage"/>
+    <w:bookmarkEnd w:id="65"/>
+    <w:bookmarkStart w:id="66" w:name="weapons-and-damage"/>
     <w:p>
       <w:pPr>
         <w:pStyle w:val="Heading2"/>
@@ -10171,8 +10744,8 @@
         <w:t xml:space="preserve">a Blutbad’s claws leave Deputy Ames Seriously wounded (two boxes). A revolver shot that gets through marks two more, but the track stops at three: Ames is Incapacitated and Dying, and a further 2-box hit would kill. Spending a Grit point on that revolver shot reduces it to one box, leaving Ames at three boxes but, because the hit only marked one, not Dying.</w:t>
       </w:r>
     </w:p>
-    <w:bookmarkEnd w:id="65"/>
-    <w:bookmarkStart w:id="66" w:name="guns-and-ammunition"/>
+    <w:bookmarkEnd w:id="66"/>
+    <w:bookmarkStart w:id="67" w:name="guns-and-ammunition"/>
     <w:p>
       <w:pPr>
         <w:pStyle w:val="Heading2"/>
@@ -10659,7 +11232,7 @@
       <w:pPr>
         <w:numPr>
           <w:ilvl w:val="0"/>
-          <w:numId w:val="1015"/>
+          <w:numId w:val="1016"/>
         </w:numPr>
         <w:pStyle w:val="Compact"/>
       </w:pPr>
@@ -10681,7 +11254,7 @@
       <w:pPr>
         <w:numPr>
           <w:ilvl w:val="0"/>
-          <w:numId w:val="1015"/>
+          <w:numId w:val="1016"/>
         </w:numPr>
         <w:pStyle w:val="Compact"/>
       </w:pPr>
@@ -10732,7 +11305,7 @@
       <w:pPr>
         <w:numPr>
           <w:ilvl w:val="0"/>
-          <w:numId w:val="1015"/>
+          <w:numId w:val="1016"/>
         </w:numPr>
         <w:pStyle w:val="Compact"/>
       </w:pPr>
@@ -10758,9 +11331,9 @@
         <w:t xml:space="preserve">To take someone down without killing them, use fists, a club, a grapple, or knock-out drops from an Apothecary.</w:t>
       </w:r>
     </w:p>
-    <w:bookmarkEnd w:id="66"/>
     <w:bookmarkEnd w:id="67"/>
-    <w:bookmarkStart w:id="73" w:name="medical-care"/>
+    <w:bookmarkEnd w:id="68"/>
+    <w:bookmarkStart w:id="74" w:name="medical-care"/>
     <w:p>
       <w:pPr>
         <w:pStyle w:val="Heading1"/>
@@ -10777,7 +11350,7 @@
         <w:t xml:space="preserve">Frontier medicine in 1889 has chloroform, carbolic acid, laudanum and steady hands, and not much else. Wesen heal like humans, and some injuries need remedies from older traditions.</w:t>
       </w:r>
     </w:p>
-    <w:bookmarkStart w:id="68" w:name="diagnosis-and-stabilization"/>
+    <w:bookmarkStart w:id="69" w:name="diagnosis-and-stabilization"/>
     <w:p>
       <w:pPr>
         <w:pStyle w:val="Heading2"/>
@@ -10794,8 +11367,8 @@
         <w:t xml:space="preserve">Roll Medicine when the diagnosis is uncertain or an urgent treatment decision matters. Emergency stabilization takes one action and a successful Medicine roll with a doctor’s bag. It ends Dying and stops deterioration, but removes no boxes.</w:t>
       </w:r>
     </w:p>
-    <w:bookmarkEnd w:id="68"/>
-    <w:bookmarkStart w:id="69" w:name="field-treatment"/>
+    <w:bookmarkEnd w:id="69"/>
+    <w:bookmarkStart w:id="70" w:name="field-treatment"/>
     <w:p>
       <w:pPr>
         <w:pStyle w:val="Heading2"/>
@@ -10812,8 +11385,8 @@
         <w:t xml:space="preserve">With a doctor’s bag and several uninterrupted minutes, successful Medicine removes one injury box; success by 5 or more removes two. Each injury receives one field-treatment attempt; further attempts need changed circumstances.</w:t>
       </w:r>
     </w:p>
-    <w:bookmarkEnd w:id="69"/>
-    <w:bookmarkStart w:id="70" w:name="a-doctors-surgery"/>
+    <w:bookmarkEnd w:id="70"/>
+    <w:bookmarkStart w:id="71" w:name="a-doctors-surgery"/>
     <w:p>
       <w:pPr>
         <w:pStyle w:val="Heading2"/>
@@ -10830,8 +11403,8 @@
         <w:t xml:space="preserve">A proper surgery with instruments, chloroform and a clean table grants +2 to Medicine. A successful treatment removes two boxes; success by 5 or more removes three. Allow the time the operation requires.</w:t>
       </w:r>
     </w:p>
-    <w:bookmarkEnd w:id="70"/>
-    <w:bookmarkStart w:id="71" w:name="remedies-and-poisons"/>
+    <w:bookmarkEnd w:id="71"/>
+    <w:bookmarkStart w:id="72" w:name="remedies-and-poisons"/>
     <w:p>
       <w:pPr>
         <w:pStyle w:val="Heading2"/>
@@ -10848,8 +11421,8 @@
         <w:t xml:space="preserve">Apothecary treats what Medicine can’t: Wesen poisons, curses, magical sickness and Wesen-specific ailments. Finding the right remedy usually means first identifying the cause (Wesen Lore or Occult), then brewing it (Apothecary, with an apothecary kit). A remedy can substitute for field treatment against such harm.</w:t>
       </w:r>
     </w:p>
-    <w:bookmarkEnd w:id="71"/>
-    <w:bookmarkStart w:id="72" w:name="natural-recovery"/>
+    <w:bookmarkEnd w:id="72"/>
+    <w:bookmarkStart w:id="73" w:name="natural-recovery"/>
     <w:p>
       <w:pPr>
         <w:pStyle w:val="Heading2"/>
@@ -10882,9 +11455,9 @@
         <w:t xml:space="preserve">clear one injury box. Rest means no riding, no fighting, nothing strenuous. At three boxes, rest alone clears nothing: treatment must clear the first box.</w:t>
       </w:r>
     </w:p>
-    <w:bookmarkEnd w:id="72"/>
     <w:bookmarkEnd w:id="73"/>
-    <w:bookmarkStart w:id="78" w:name="grit-points-and-trouble"/>
+    <w:bookmarkEnd w:id="74"/>
+    <w:bookmarkStart w:id="79" w:name="grit-points-and-trouble"/>
     <w:p>
       <w:pPr>
         <w:pStyle w:val="Heading1"/>
@@ -10893,7 +11466,7 @@
         <w:t xml:space="preserve">Grit points and Trouble</w:t>
       </w:r>
     </w:p>
-    <w:bookmarkStart w:id="74" w:name="using-grit-points"/>
+    <w:bookmarkStart w:id="75" w:name="using-grit-points"/>
     <w:p>
       <w:pPr>
         <w:pStyle w:val="Heading2"/>
@@ -11049,6 +11622,39 @@
                 <w:b/>
                 <w:sz w:val="19"/>
               </w:rPr>
+              <w:t xml:space="preserve">Shrug off a telling hit</w:t>
+            </w:r>
+          </w:p>
+        </w:tc>
+        <w:tc>
+          <w:tcPr/>
+          <w:p>
+            <w:pPr>
+              <w:pStyle w:val="Compact"/>
+              <w:jc w:val="left"/>
+            </w:pPr>
+            <w:r>
+              <w:rPr>
+                <w:sz w:val="19"/>
+              </w:rPr>
+              <w:t xml:space="preserve">Cancel the effect an attacker picked against you; you still take the boxes.</w:t>
+            </w:r>
+          </w:p>
+        </w:tc>
+      </w:tr>
+      <w:tr>
+        <w:tc>
+          <w:tcPr/>
+          <w:p>
+            <w:pPr>
+              <w:pStyle w:val="Compact"/>
+              <w:jc w:val="left"/>
+            </w:pPr>
+            <w:r>
+              <w:rPr>
+                <w:b/>
+                <w:sz w:val="19"/>
+              </w:rPr>
               <w:t xml:space="preserve">Establish a small preparation</w:t>
             </w:r>
           </w:p>
@@ -11078,8 +11684,8 @@
         <w:t xml:space="preserve">Gain one point when one of your complications creates a meaningful problem you accept, including a companion complication from a heritage advantage. You can decline the proposed complication without penalty.</w:t>
       </w:r>
     </w:p>
-    <w:bookmarkEnd w:id="74"/>
-    <w:bookmarkStart w:id="75" w:name="trouble"/>
+    <w:bookmarkEnd w:id="75"/>
+    <w:bookmarkStart w:id="76" w:name="trouble"/>
     <w:p>
       <w:pPr>
         <w:pStyle w:val="Heading2"/>
@@ -11380,8 +11986,8 @@
         <w:t xml:space="preserve">Lying low between cases, a good cover story (Deception), or doing the town a public good can clear a box per case.</w:t>
       </w:r>
     </w:p>
-    <w:bookmarkEnd w:id="75"/>
-    <w:bookmarkStart w:id="77" w:name="advancement"/>
+    <w:bookmarkEnd w:id="76"/>
+    <w:bookmarkStart w:id="78" w:name="advancement"/>
     <w:p>
       <w:pPr>
         <w:pStyle w:val="Heading2"/>
@@ -11418,7 +12024,7 @@
       <w:pPr>
         <w:numPr>
           <w:ilvl w:val="0"/>
-          <w:numId w:val="1016"/>
+          <w:numId w:val="1017"/>
         </w:numPr>
         <w:pStyle w:val="Compact"/>
       </w:pPr>
@@ -11479,7 +12085,7 @@
       <w:pPr>
         <w:numPr>
           <w:ilvl w:val="0"/>
-          <w:numId w:val="1016"/>
+          <w:numId w:val="1017"/>
         </w:numPr>
         <w:pStyle w:val="Compact"/>
       </w:pPr>
@@ -11825,7 +12431,7 @@
         <w:t xml:space="preserve">The creator keeps the ledger: award points in the advancement box under the skills (or from the GM journal), then spend them there.</w:t>
       </w:r>
     </w:p>
-    <w:bookmarkStart w:id="76" w:name="magic-advancement"/>
+    <w:bookmarkStart w:id="77" w:name="magic-advancement"/>
     <w:p>
       <w:pPr>
         <w:pStyle w:val="Heading3"/>
@@ -12319,10 +12925,10 @@
         </w:tc>
       </w:tr>
     </w:tbl>
-    <w:bookmarkEnd w:id="76"/>
     <w:bookmarkEnd w:id="77"/>
     <w:bookmarkEnd w:id="78"/>
-    <w:bookmarkStart w:id="81" w:name="running-cases"/>
+    <w:bookmarkEnd w:id="79"/>
+    <w:bookmarkStart w:id="82" w:name="running-cases"/>
     <w:p>
       <w:pPr>
         <w:pStyle w:val="Heading1"/>
@@ -12331,7 +12937,7 @@
         <w:t xml:space="preserve">Running cases</w:t>
       </w:r>
     </w:p>
-    <w:bookmarkStart w:id="79" w:name="case-seeds"/>
+    <w:bookmarkStart w:id="80" w:name="case-seeds"/>
     <w:p>
       <w:pPr>
         <w:pStyle w:val="Heading2"/>
@@ -14647,8 +15253,8 @@
         </w:tc>
       </w:tr>
     </w:tbl>
-    <w:bookmarkEnd w:id="79"/>
-    <w:bookmarkStart w:id="80" w:name="the-case-journal"/>
+    <w:bookmarkEnd w:id="80"/>
+    <w:bookmarkStart w:id="81" w:name="the-case-journal"/>
     <w:p>
       <w:pPr>
         <w:pStyle w:val="Heading2"/>
@@ -14663,162 +15269,6 @@
       </w:pPr>
       <w:r>
         <w:t xml:space="preserve">End each case with a short journal entry, written together, as the Grimms have always kept their books:</w:t>
-      </w:r>
-    </w:p>
-    <w:p>
-      <w:pPr>
-        <w:numPr>
-          <w:ilvl w:val="0"/>
-          <w:numId w:val="1017"/>
-        </w:numPr>
-        <w:pStyle w:val="Compact"/>
-      </w:pPr>
-      <w:r>
-        <w:rPr>
-          <w:bCs/>
-          <w:b/>
-        </w:rPr>
-        <w:t xml:space="preserve">The case.</w:t>
-      </w:r>
-      <w:r>
-        <w:t xml:space="preserve"> </w:t>
-      </w:r>
-      <w:r>
-        <w:t xml:space="preserve">What happened, and did we resolve it: closed, partly, or failed?</w:t>
-      </w:r>
-    </w:p>
-    <w:p>
-      <w:pPr>
-        <w:numPr>
-          <w:ilvl w:val="0"/>
-          <w:numId w:val="1017"/>
-        </w:numPr>
-        <w:pStyle w:val="Compact"/>
-      </w:pPr>
-      <w:r>
-        <w:rPr>
-          <w:bCs/>
-          <w:b/>
-        </w:rPr>
-        <w:t xml:space="preserve">Who stood out?</w:t>
-      </w:r>
-      <w:r>
-        <w:t xml:space="preserve"> </w:t>
-      </w:r>
-      <w:r>
-        <w:t xml:space="preserve">A moment worth remembering.</w:t>
-      </w:r>
-    </w:p>
-    <w:p>
-      <w:pPr>
-        <w:numPr>
-          <w:ilvl w:val="0"/>
-          <w:numId w:val="1017"/>
-        </w:numPr>
-        <w:pStyle w:val="Compact"/>
-      </w:pPr>
-      <w:r>
-        <w:rPr>
-          <w:bCs/>
-          <w:b/>
-        </w:rPr>
-        <w:t xml:space="preserve">Complications.</w:t>
-      </w:r>
-      <w:r>
-        <w:t xml:space="preserve"> </w:t>
-      </w:r>
-      <w:r>
-        <w:t xml:space="preserve">Which ones came into play, and what did they cost?</w:t>
-      </w:r>
-    </w:p>
-    <w:p>
-      <w:pPr>
-        <w:numPr>
-          <w:ilvl w:val="0"/>
-          <w:numId w:val="1017"/>
-        </w:numPr>
-        <w:pStyle w:val="Compact"/>
-      </w:pPr>
-      <w:r>
-        <w:rPr>
-          <w:bCs/>
-          <w:b/>
-        </w:rPr>
-        <w:t xml:space="preserve">For the books.</w:t>
-      </w:r>
-      <w:r>
-        <w:t xml:space="preserve"> </w:t>
-      </w:r>
-      <w:r>
-        <w:t xml:space="preserve">A new Wesen kind, weakness or custom worth recording.</w:t>
-      </w:r>
-    </w:p>
-    <w:p>
-      <w:pPr>
-        <w:numPr>
-          <w:ilvl w:val="0"/>
-          <w:numId w:val="1017"/>
-        </w:numPr>
-        <w:pStyle w:val="Compact"/>
-      </w:pPr>
-      <w:r>
-        <w:rPr>
-          <w:bCs/>
-          <w:b/>
-        </w:rPr>
-        <w:t xml:space="preserve">Advancement.</w:t>
-      </w:r>
-      <w:r>
-        <w:t xml:space="preserve"> </w:t>
-      </w:r>
-      <w:r>
-        <w:t xml:space="preserve">After a significant case, each character earns 1 advancement point; at a milestone, 2 more.</w:t>
-      </w:r>
-    </w:p>
-    <w:bookmarkEnd w:id="80"/>
-    <w:bookmarkEnd w:id="81"/>
-    <w:bookmarkStart w:id="89" w:name="ready-made-characters"/>
-    <w:p>
-      <w:pPr>
-        <w:pStyle w:val="Heading1"/>
-      </w:pPr>
-      <w:r>
-        <w:t xml:space="preserve">Ready-made characters</w:t>
-      </w:r>
-    </w:p>
-    <w:p>
-      <w:pPr>
-        <w:pStyle w:val="FirstParagraph"/>
-      </w:pPr>
-      <w:r>
-        <w:t xml:space="preserve">Seven characters ready to play. Each follows the creation rules exactly, Edges included, and their connections tie them together.</w:t>
-      </w:r>
-    </w:p>
-    <w:bookmarkStart w:id="82" w:name="eliza-kessler"/>
-    <w:p>
-      <w:pPr>
-        <w:pStyle w:val="Heading2"/>
-      </w:pPr>
-      <w:r>
-        <w:t xml:space="preserve">Eliza Kessler</w:t>
-      </w:r>
-    </w:p>
-    <w:p>
-      <w:pPr>
-        <w:pStyle w:val="FirstParagraph"/>
-      </w:pPr>
-      <w:r>
-        <w:rPr>
-          <w:iCs/>
-          <w:i/>
-        </w:rPr>
-        <w:t xml:space="preserve">Deputy U.S. Marshal, Lawman. Grimm (Tier 2).</w:t>
-      </w:r>
-      <w:r>
-        <w:t xml:space="preserve"> </w:t>
-      </w:r>
-      <w:r>
-        <w:t xml:space="preserve">Wears the badge: the law, and the Code, in one person.</w:t>
       </w:r>
     </w:p>
     <w:p>
@@ -14834,29 +15284,13 @@
           <w:bCs/>
           <w:b/>
         </w:rPr>
-        <w:t xml:space="preserve">Attributes:</w:t>
-      </w:r>
-      <w:r>
-        <w:t xml:space="preserve"> </w:t>
-      </w:r>
-      <w:r>
-        <w:t xml:space="preserve">Body 12, Agility 13, Intellect 10, Presence 8, Will 12.</w:t>
-      </w:r>
-      <w:r>
-        <w:t xml:space="preserve"> </w:t>
-      </w:r>
-      <w:r>
-        <w:rPr>
-          <w:bCs/>
-          <w:b/>
-        </w:rPr>
-        <w:t xml:space="preserve">Dodge</w:t>
-      </w:r>
-      <w:r>
-        <w:t xml:space="preserve"> </w:t>
-      </w:r>
-      <w:r>
-        <w:t xml:space="preserve">12.</w:t>
+        <w:t xml:space="preserve">The case.</w:t>
+      </w:r>
+      <w:r>
+        <w:t xml:space="preserve"> </w:t>
+      </w:r>
+      <w:r>
+        <w:t xml:space="preserve">What happened, and did we resolve it: closed, partly, or failed?</w:t>
       </w:r>
     </w:p>
     <w:p>
@@ -14872,13 +15306,13 @@
           <w:bCs/>
           <w:b/>
         </w:rPr>
-        <w:t xml:space="preserve">Skills:</w:t>
-      </w:r>
-      <w:r>
-        <w:t xml:space="preserve"> </w:t>
-      </w:r>
-      <w:r>
-        <w:t xml:space="preserve">Shooting 16 (Specialty). Trained: Riding 14, Melee 14, Brawling 14, Athletics 13, Investigation 11, Tracking 11, Read People 11, Survival 11, Leadership 9; Wesen Lore 11 (free).</w:t>
+        <w:t xml:space="preserve">Who stood out?</w:t>
+      </w:r>
+      <w:r>
+        <w:t xml:space="preserve"> </w:t>
+      </w:r>
+      <w:r>
+        <w:t xml:space="preserve">A moment worth remembering.</w:t>
       </w:r>
     </w:p>
     <w:p>
@@ -14894,61 +15328,13 @@
           <w:bCs/>
           <w:b/>
         </w:rPr>
-        <w:t xml:space="preserve">Edge:</w:t>
-      </w:r>
-      <w:r>
-        <w:t xml:space="preserve"> </w:t>
-      </w:r>
-      <w:r>
-        <w:t xml:space="preserve">Second advantage: Badge: Deputy U.S. Marshal.</w:t>
-      </w:r>
-      <w:r>
-        <w:t xml:space="preserve"> </w:t>
-      </w:r>
-      <w:r>
-        <w:rPr>
-          <w:bCs/>
-          <w:b/>
-        </w:rPr>
-        <w:t xml:space="preserve">Grimm gift:</w:t>
-      </w:r>
-      <w:r>
-        <w:t xml:space="preserve"> </w:t>
-      </w:r>
-      <w:r>
-        <w:t xml:space="preserve">Keeper of the Books (companion: The Books Must Be Kept).</w:t>
-      </w:r>
-      <w:r>
-        <w:t xml:space="preserve"> </w:t>
-      </w:r>
-      <w:r>
-        <w:rPr>
-          <w:bCs/>
-          <w:b/>
-        </w:rPr>
-        <w:t xml:space="preserve">Complication:</w:t>
-      </w:r>
-      <w:r>
-        <w:t xml:space="preserve"> </w:t>
-      </w:r>
-      <w:r>
-        <w:t xml:space="preserve">Law and Order; trigger: a Wesen suspect could be killed instead of arrested.</w:t>
-      </w:r>
-      <w:r>
-        <w:t xml:space="preserve"> </w:t>
-      </w:r>
-      <w:r>
-        <w:rPr>
-          <w:bCs/>
-          <w:b/>
-        </w:rPr>
-        <w:t xml:space="preserve">Allegiance:</w:t>
-      </w:r>
-      <w:r>
-        <w:t xml:space="preserve"> </w:t>
-      </w:r>
-      <w:r>
-        <w:t xml:space="preserve">The U.S. Marshals.</w:t>
+        <w:t xml:space="preserve">Complications.</w:t>
+      </w:r>
+      <w:r>
+        <w:t xml:space="preserve"> </w:t>
+      </w:r>
+      <w:r>
+        <w:t xml:space="preserve">Which ones came into play, and what did they cost?</w:t>
       </w:r>
     </w:p>
     <w:p>
@@ -14964,39 +15350,63 @@
           <w:bCs/>
           <w:b/>
         </w:rPr>
-        <w:t xml:space="preserve">Why I stand against the dark:</w:t>
-      </w:r>
-      <w:r>
-        <w:t xml:space="preserve"> </w:t>
-      </w:r>
-      <w:r>
-        <w:t xml:space="preserve">The Grimm blood woke in me, and it came with a duty.</w:t>
-      </w:r>
-      <w:r>
-        <w:t xml:space="preserve"> </w:t>
-      </w:r>
-      <w:r>
-        <w:rPr>
-          <w:bCs/>
-          <w:b/>
-        </w:rPr>
-        <w:t xml:space="preserve">Connection:</w:t>
-      </w:r>
-      <w:r>
-        <w:t xml:space="preserve"> </w:t>
-      </w:r>
-      <w:r>
-        <w:t xml:space="preserve">Gus Brandt cut her down from a lynch mob’s rope before anyone knew what she was.</w:t>
-      </w:r>
-    </w:p>
+        <w:t xml:space="preserve">For the books.</w:t>
+      </w:r>
+      <w:r>
+        <w:t xml:space="preserve"> </w:t>
+      </w:r>
+      <w:r>
+        <w:t xml:space="preserve">A new Wesen kind, weakness or custom worth recording.</w:t>
+      </w:r>
+    </w:p>
+    <w:p>
+      <w:pPr>
+        <w:numPr>
+          <w:ilvl w:val="0"/>
+          <w:numId w:val="1018"/>
+        </w:numPr>
+        <w:pStyle w:val="Compact"/>
+      </w:pPr>
+      <w:r>
+        <w:rPr>
+          <w:bCs/>
+          <w:b/>
+        </w:rPr>
+        <w:t xml:space="preserve">Advancement.</w:t>
+      </w:r>
+      <w:r>
+        <w:t xml:space="preserve"> </w:t>
+      </w:r>
+      <w:r>
+        <w:t xml:space="preserve">After a significant case, each character earns 1 advancement point; at a milestone, 2 more.</w:t>
+      </w:r>
+    </w:p>
+    <w:bookmarkEnd w:id="81"/>
     <w:bookmarkEnd w:id="82"/>
-    <w:bookmarkStart w:id="83" w:name="gus-brandt"/>
+    <w:bookmarkStart w:id="90" w:name="ready-made-characters"/>
+    <w:p>
+      <w:pPr>
+        <w:pStyle w:val="Heading1"/>
+      </w:pPr>
+      <w:r>
+        <w:t xml:space="preserve">Ready-made characters</w:t>
+      </w:r>
+    </w:p>
+    <w:p>
+      <w:pPr>
+        <w:pStyle w:val="FirstParagraph"/>
+      </w:pPr>
+      <w:r>
+        <w:t xml:space="preserve">Seven characters ready to play. Each follows the creation rules exactly, Edges included, and their connections tie them together.</w:t>
+      </w:r>
+    </w:p>
+    <w:bookmarkStart w:id="83" w:name="eliza-kessler"/>
     <w:p>
       <w:pPr>
         <w:pStyle w:val="Heading2"/>
       </w:pPr>
       <w:r>
-        <w:t xml:space="preserve">Gus Brandt</w:t>
+        <w:t xml:space="preserve">Eliza Kessler</w:t>
       </w:r>
     </w:p>
     <w:p>
@@ -15008,13 +15418,13 @@
           <w:iCs/>
           <w:i/>
         </w:rPr>
-        <w:t xml:space="preserve">Blacksmith and gunsmith, Tinker. Blutbad (Tier 2).</w:t>
-      </w:r>
-      <w:r>
-        <w:t xml:space="preserve"> </w:t>
-      </w:r>
-      <w:r>
-        <w:t xml:space="preserve">Shoes the horses, fixes the guns, and hasn’t hunted in eleven years.</w:t>
+        <w:t xml:space="preserve">Deputy U.S. Marshal, Lawman. Grimm (Tier 2).</w:t>
+      </w:r>
+      <w:r>
+        <w:t xml:space="preserve"> </w:t>
+      </w:r>
+      <w:r>
+        <w:t xml:space="preserve">Wears the badge: the law, and the Code, in one person.</w:t>
       </w:r>
     </w:p>
     <w:p>
@@ -15036,7 +15446,7 @@
         <w:t xml:space="preserve"> </w:t>
       </w:r>
       <w:r>
-        <w:t xml:space="preserve">Body 11, Agility 11, Intellect 13, Presence 10, Will 10.</w:t>
+        <w:t xml:space="preserve">Body 12, Agility 13, Intellect 10, Presence 8, Will 12.</w:t>
       </w:r>
       <w:r>
         <w:t xml:space="preserve"> </w:t>
@@ -15052,23 +15462,7 @@
         <w:t xml:space="preserve"> </w:t>
       </w:r>
       <w:r>
-        <w:t xml:space="preserve">10.</w:t>
-      </w:r>
-      <w:r>
-        <w:t xml:space="preserve"> </w:t>
-      </w:r>
-      <w:r>
-        <w:rPr>
-          <w:bCs/>
-          <w:b/>
-        </w:rPr>
-        <w:t xml:space="preserve">In woge:</w:t>
-      </w:r>
-      <w:r>
-        <w:t xml:space="preserve"> </w:t>
-      </w:r>
-      <w:r>
-        <w:t xml:space="preserve">Body 13, Agility 12; claws and fangs mark 2 boxes.</w:t>
+        <w:t xml:space="preserve">12.</w:t>
       </w:r>
     </w:p>
     <w:p>
@@ -15090,7 +15484,7 @@
         <w:t xml:space="preserve"> </w:t>
       </w:r>
       <w:r>
-        <w:t xml:space="preserve">Tinkering 16 (Specialty). Trained: Tracking 14, Wesen Lore 14, Investigation 14, Survival 14, Read People 14, Brawling 12, Melee 12, Athletics 12, Persuasion 11.</w:t>
+        <w:t xml:space="preserve">Shooting 16 (Specialty). Trained: Riding 14, Melee 14, Brawling 14, Athletics 13, Investigation 11, Tracking 11, Read People 11, Survival 11, Leadership 9; Wesen Lore 11 (free).</w:t>
       </w:r>
     </w:p>
     <w:p>
@@ -15112,23 +15506,23 @@
         <w:t xml:space="preserve"> </w:t>
       </w:r>
       <w:r>
-        <w:t xml:space="preserve">A fine tool: a master gunsmith’s tools (+2 Tinkering).</w:t>
-      </w:r>
-      <w:r>
-        <w:t xml:space="preserve"> </w:t>
-      </w:r>
-      <w:r>
-        <w:rPr>
-          <w:bCs/>
-          <w:b/>
-        </w:rPr>
-        <w:t xml:space="preserve">Advantage:</w:t>
-      </w:r>
-      <w:r>
-        <w:t xml:space="preserve"> </w:t>
-      </w:r>
-      <w:r>
-        <w:t xml:space="preserve">Blutbad Nose (companion: The Bloodlust).</w:t>
+        <w:t xml:space="preserve">Second advantage: Badge: Deputy U.S. Marshal.</w:t>
+      </w:r>
+      <w:r>
+        <w:t xml:space="preserve"> </w:t>
+      </w:r>
+      <w:r>
+        <w:rPr>
+          <w:bCs/>
+          <w:b/>
+        </w:rPr>
+        <w:t xml:space="preserve">Grimm gift:</w:t>
+      </w:r>
+      <w:r>
+        <w:t xml:space="preserve"> </w:t>
+      </w:r>
+      <w:r>
+        <w:t xml:space="preserve">Keeper of the Books (companion: The Books Must Be Kept).</w:t>
       </w:r>
       <w:r>
         <w:t xml:space="preserve"> </w:t>
@@ -15144,7 +15538,23 @@
         <w:t xml:space="preserve"> </w:t>
       </w:r>
       <w:r>
-        <w:t xml:space="preserve">Keeps a Dangerous Secret; trigger: someone from his old pack turns up.</w:t>
+        <w:t xml:space="preserve">Law and Order; trigger: a Wesen suspect could be killed instead of arrested.</w:t>
+      </w:r>
+      <w:r>
+        <w:t xml:space="preserve"> </w:t>
+      </w:r>
+      <w:r>
+        <w:rPr>
+          <w:bCs/>
+          <w:b/>
+        </w:rPr>
+        <w:t xml:space="preserve">Allegiance:</w:t>
+      </w:r>
+      <w:r>
+        <w:t xml:space="preserve"> </w:t>
+      </w:r>
+      <w:r>
+        <w:t xml:space="preserve">The U.S. Marshals.</w:t>
       </w:r>
     </w:p>
     <w:p>
@@ -15166,7 +15576,7 @@
         <w:t xml:space="preserve"> </w:t>
       </w:r>
       <w:r>
-        <w:t xml:space="preserve">I did harm once. I mean to balance the ledger.</w:t>
+        <w:t xml:space="preserve">The Grimm blood woke in me, and it came with a duty.</w:t>
       </w:r>
       <w:r>
         <w:t xml:space="preserve"> </w:t>
@@ -15182,17 +15592,17 @@
         <w:t xml:space="preserve"> </w:t>
       </w:r>
       <w:r>
-        <w:t xml:space="preserve">Owes Roz Vey for the remedies that keep the urge quiet.</w:t>
+        <w:t xml:space="preserve">Gus Brandt cut her down from a lynch mob’s rope before anyone knew what she was.</w:t>
       </w:r>
     </w:p>
     <w:bookmarkEnd w:id="83"/>
-    <w:bookmarkStart w:id="84" w:name="roz-vey"/>
+    <w:bookmarkStart w:id="84" w:name="gus-brandt"/>
     <w:p>
       <w:pPr>
         <w:pStyle w:val="Heading2"/>
       </w:pPr>
       <w:r>
-        <w:t xml:space="preserve">Roz Vey</w:t>
+        <w:t xml:space="preserve">Gus Brandt</w:t>
       </w:r>
     </w:p>
     <w:p>
@@ -15204,13 +15614,13 @@
           <w:iCs/>
           <w:i/>
         </w:rPr>
-        <w:t xml:space="preserve">Spice and tea merchant, Apothecary. Fuchsbau (Tier 1).</w:t>
-      </w:r>
-      <w:r>
-        <w:t xml:space="preserve"> </w:t>
-      </w:r>
-      <w:r>
-        <w:t xml:space="preserve">Sells tea out front, and other things in the back.</w:t>
+        <w:t xml:space="preserve">Blacksmith and gunsmith, Tinker. Blutbad (Tier 2).</w:t>
+      </w:r>
+      <w:r>
+        <w:t xml:space="preserve"> </w:t>
+      </w:r>
+      <w:r>
+        <w:t xml:space="preserve">Shoes the horses, fixes the guns, and hasn’t hunted in eleven years.</w:t>
       </w:r>
     </w:p>
     <w:p>
@@ -15232,7 +15642,7 @@
         <w:t xml:space="preserve"> </w:t>
       </w:r>
       <w:r>
-        <w:t xml:space="preserve">Body 9, Agility 11, Intellect 13, Presence 12, Will 10.</w:t>
+        <w:t xml:space="preserve">Body 11, Agility 11, Intellect 13, Presence 10, Will 10.</w:t>
       </w:r>
       <w:r>
         <w:t xml:space="preserve"> </w:t>
@@ -15248,7 +15658,23 @@
         <w:t xml:space="preserve"> </w:t>
       </w:r>
       <w:r>
-        <w:t xml:space="preserve">9.</w:t>
+        <w:t xml:space="preserve">10.</w:t>
+      </w:r>
+      <w:r>
+        <w:t xml:space="preserve"> </w:t>
+      </w:r>
+      <w:r>
+        <w:rPr>
+          <w:bCs/>
+          <w:b/>
+        </w:rPr>
+        <w:t xml:space="preserve">In woge:</w:t>
+      </w:r>
+      <w:r>
+        <w:t xml:space="preserve"> </w:t>
+      </w:r>
+      <w:r>
+        <w:t xml:space="preserve">Body 13, Agility 12; claws and fangs mark 2 boxes.</w:t>
       </w:r>
     </w:p>
     <w:p>
@@ -15270,7 +15696,7 @@
         <w:t xml:space="preserve"> </w:t>
       </w:r>
       <w:r>
-        <w:t xml:space="preserve">Apothecary 16 (Specialty). Trained: Medicine 14, Wesen Lore 14, Read People 14, Investigation 14, Gambling 14, Survival 14, Occult 14, Persuasion 13, Deception 13, Stealth 12.</w:t>
+        <w:t xml:space="preserve">Tinkering 16 (Specialty). Trained: Tracking 14, Wesen Lore 14, Investigation 14, Survival 14, Read People 14, Brawling 12, Melee 12, Athletics 12, Persuasion 11.</w:t>
       </w:r>
     </w:p>
     <w:p>
@@ -15286,13 +15712,13 @@
           <w:bCs/>
           <w:b/>
         </w:rPr>
-        <w:t xml:space="preserve">Edges:</w:t>
-      </w:r>
-      <w:r>
-        <w:t xml:space="preserve"> </w:t>
-      </w:r>
-      <w:r>
-        <w:t xml:space="preserve">Extra Trained skill; a friend in town: her cousin Ambrose, a Fuchsbau smuggler on the river docks who can find any ingredient, for a price.</w:t>
+        <w:t xml:space="preserve">Edge:</w:t>
+      </w:r>
+      <w:r>
+        <w:t xml:space="preserve"> </w:t>
+      </w:r>
+      <w:r>
+        <w:t xml:space="preserve">A fine tool: a master gunsmith’s tools (+2 Tinkering).</w:t>
       </w:r>
       <w:r>
         <w:t xml:space="preserve"> </w:t>
@@ -15308,7 +15734,7 @@
         <w:t xml:space="preserve"> </w:t>
       </w:r>
       <w:r>
-        <w:t xml:space="preserve">Fuchsbau Remedies (companion: Criminal Kin).</w:t>
+        <w:t xml:space="preserve">Blutbad Nose (companion: The Bloodlust).</w:t>
       </w:r>
       <w:r>
         <w:t xml:space="preserve"> </w:t>
@@ -15324,7 +15750,7 @@
         <w:t xml:space="preserve"> </w:t>
       </w:r>
       <w:r>
-        <w:t xml:space="preserve">Protects Others at Personal Risk; trigger: a sick or hurt stranger turns up at the shop.</w:t>
+        <w:t xml:space="preserve">Keeps a Dangerous Secret; trigger: someone from his old pack turns up.</w:t>
       </w:r>
     </w:p>
     <w:p>
@@ -15346,7 +15772,7 @@
         <w:t xml:space="preserve"> </w:t>
       </w:r>
       <w:r>
-        <w:t xml:space="preserve">Wesen and humans can live side by side, and I mean to prove it.</w:t>
+        <w:t xml:space="preserve">I did harm once. I mean to balance the ledger.</w:t>
       </w:r>
       <w:r>
         <w:t xml:space="preserve"> </w:t>
@@ -15362,17 +15788,17 @@
         <w:t xml:space="preserve"> </w:t>
       </w:r>
       <w:r>
-        <w:t xml:space="preserve">Trades notes with Dr. Whitlock, who still won’t admit some of her remedies work better than his.</w:t>
+        <w:t xml:space="preserve">Owes Roz Vey for the remedies that keep the urge quiet.</w:t>
       </w:r>
     </w:p>
     <w:bookmarkEnd w:id="84"/>
-    <w:bookmarkStart w:id="85" w:name="dr.-thaddeus-whitlock"/>
+    <w:bookmarkStart w:id="85" w:name="roz-vey"/>
     <w:p>
       <w:pPr>
         <w:pStyle w:val="Heading2"/>
       </w:pPr>
       <w:r>
-        <w:t xml:space="preserve">Dr. Thaddeus Whitlock</w:t>
+        <w:t xml:space="preserve">Roz Vey</w:t>
       </w:r>
     </w:p>
     <w:p>
@@ -15384,13 +15810,13 @@
           <w:iCs/>
           <w:i/>
         </w:rPr>
-        <w:t xml:space="preserve">Town physician, Doctor. Human (Tier 0).</w:t>
-      </w:r>
-      <w:r>
-        <w:t xml:space="preserve"> </w:t>
-      </w:r>
-      <w:r>
-        <w:t xml:space="preserve">Army surgeon in the war; now he digs bullets out of his friends and asks too many questions about what made the other wounds.</w:t>
+        <w:t xml:space="preserve">Spice and tea merchant, Apothecary. Fuchsbau (Tier 1).</w:t>
+      </w:r>
+      <w:r>
+        <w:t xml:space="preserve"> </w:t>
+      </w:r>
+      <w:r>
+        <w:t xml:space="preserve">Sells tea out front, and other things in the back.</w:t>
       </w:r>
     </w:p>
     <w:p>
@@ -15412,7 +15838,7 @@
         <w:t xml:space="preserve"> </w:t>
       </w:r>
       <w:r>
-        <w:t xml:space="preserve">Body 10, Agility 10, Intellect 13, Presence 12, Will 11.</w:t>
+        <w:t xml:space="preserve">Body 9, Agility 11, Intellect 13, Presence 12, Will 10.</w:t>
       </w:r>
       <w:r>
         <w:t xml:space="preserve"> </w:t>
@@ -15428,7 +15854,7 @@
         <w:t xml:space="preserve"> </w:t>
       </w:r>
       <w:r>
-        <w:t xml:space="preserve">8.</w:t>
+        <w:t xml:space="preserve">9.</w:t>
       </w:r>
     </w:p>
     <w:p>
@@ -15450,7 +15876,7 @@
         <w:t xml:space="preserve"> </w:t>
       </w:r>
       <w:r>
-        <w:t xml:space="preserve">Medicine 16 (Specialty). Trained: Apothecary 14, Read People 14, Investigation 14, Wesen Lore 14, Occult 14, Persuasion 13, Leadership 13, Riding 11, Shooting 11.</w:t>
+        <w:t xml:space="preserve">Apothecary 16 (Specialty). Trained: Medicine 14, Wesen Lore 14, Read People 14, Investigation 14, Gambling 14, Survival 14, Occult 14, Persuasion 13, Deception 13, Stealth 12.</w:t>
       </w:r>
     </w:p>
     <w:p>
@@ -15472,7 +15898,7 @@
         <w:t xml:space="preserve"> </w:t>
       </w:r>
       <w:r>
-        <w:t xml:space="preserve">+1 attribute point; second advantage: Battlefield Surgeon; a fine tool: his army surgeon’s instruments (+2 Medicine).</w:t>
+        <w:t xml:space="preserve">Extra Trained skill; a friend in town: her cousin Ambrose, a Fuchsbau smuggler on the river docks who can find any ingredient, for a price.</w:t>
       </w:r>
       <w:r>
         <w:t xml:space="preserve"> </w:t>
@@ -15488,7 +15914,7 @@
         <w:t xml:space="preserve"> </w:t>
       </w:r>
       <w:r>
-        <w:t xml:space="preserve">Steady Hands.</w:t>
+        <w:t xml:space="preserve">Fuchsbau Remedies (companion: Criminal Kin).</w:t>
       </w:r>
       <w:r>
         <w:t xml:space="preserve"> </w:t>
@@ -15504,7 +15930,7 @@
         <w:t xml:space="preserve"> </w:t>
       </w:r>
       <w:r>
-        <w:t xml:space="preserve">Haunted by the War; trigger: gunfire in the dark.</w:t>
+        <w:t xml:space="preserve">Protects Others at Personal Risk; trigger: a sick or hurt stranger turns up at the shop.</w:t>
       </w:r>
     </w:p>
     <w:p>
@@ -15526,7 +15952,7 @@
         <w:t xml:space="preserve"> </w:t>
       </w:r>
       <w:r>
-        <w:t xml:space="preserve">I saw what I saw, and no one else believes me.</w:t>
+        <w:t xml:space="preserve">Wesen and humans can live side by side, and I mean to prove it.</w:t>
       </w:r>
       <w:r>
         <w:t xml:space="preserve"> </w:t>
@@ -15542,17 +15968,17 @@
         <w:t xml:space="preserve"> </w:t>
       </w:r>
       <w:r>
-        <w:t xml:space="preserve">Rode with Silas Thorne’s regiment in the war and has never trusted him since.</w:t>
+        <w:t xml:space="preserve">Trades notes with Dr. Whitlock, who still won’t admit some of her remedies work better than his.</w:t>
       </w:r>
     </w:p>
     <w:bookmarkEnd w:id="85"/>
-    <w:bookmarkStart w:id="86" w:name="cora-ridgeway"/>
+    <w:bookmarkStart w:id="86" w:name="dr.-thaddeus-whitlock"/>
     <w:p>
       <w:pPr>
         <w:pStyle w:val="Heading2"/>
       </w:pPr>
       <w:r>
-        <w:t xml:space="preserve">Cora Ridgeway</w:t>
+        <w:t xml:space="preserve">Dr. Thaddeus Whitlock</w:t>
       </w:r>
     </w:p>
     <w:p>
@@ -15564,13 +15990,13 @@
           <w:iCs/>
           <w:i/>
         </w:rPr>
-        <w:t xml:space="preserve">Scout and sharpshooter, Scout. Coyotl (Tier 1).</w:t>
-      </w:r>
-      <w:r>
-        <w:t xml:space="preserve"> </w:t>
-      </w:r>
-      <w:r>
-        <w:t xml:space="preserve">Knows the plains and the high country, and keeps her clan’s ways close.</w:t>
+        <w:t xml:space="preserve">Town physician, Doctor. Human (Tier 0).</w:t>
+      </w:r>
+      <w:r>
+        <w:t xml:space="preserve"> </w:t>
+      </w:r>
+      <w:r>
+        <w:t xml:space="preserve">Army surgeon in the war; now he digs bullets out of his friends and asks too many questions about what made the other wounds.</w:t>
       </w:r>
     </w:p>
     <w:p>
@@ -15592,7 +16018,7 @@
         <w:t xml:space="preserve"> </w:t>
       </w:r>
       <w:r>
-        <w:t xml:space="preserve">Body 11, Agility 14, Intellect 10, Presence 11, Will 9.</w:t>
+        <w:t xml:space="preserve">Body 10, Agility 10, Intellect 13, Presence 12, Will 11.</w:t>
       </w:r>
       <w:r>
         <w:t xml:space="preserve"> </w:t>
@@ -15608,23 +16034,7 @@
         <w:t xml:space="preserve"> </w:t>
       </w:r>
       <w:r>
-        <w:t xml:space="preserve">13.</w:t>
-      </w:r>
-      <w:r>
-        <w:t xml:space="preserve"> </w:t>
-      </w:r>
-      <w:r>
-        <w:rPr>
-          <w:bCs/>
-          <w:b/>
-        </w:rPr>
-        <w:t xml:space="preserve">In woge:</w:t>
-      </w:r>
-      <w:r>
-        <w:t xml:space="preserve"> </w:t>
-      </w:r>
-      <w:r>
-        <w:t xml:space="preserve">Body 12, Agility 15, Dodge 15; claws mark 2 boxes.</w:t>
+        <w:t xml:space="preserve">8.</w:t>
       </w:r>
     </w:p>
     <w:p>
@@ -15646,7 +16056,7 @@
         <w:t xml:space="preserve"> </w:t>
       </w:r>
       <w:r>
-        <w:t xml:space="preserve">Shooting 17 (Specialty). Trained: Riding 15, Stealth 15, Brawling 15, Melee 15, Persuasion 12, Athletics 12, Tracking 11, Survival 11, Read People 11, Gambling 11.</w:t>
+        <w:t xml:space="preserve">Medicine 16 (Specialty). Trained: Apothecary 14, Read People 14, Investigation 14, Wesen Lore 14, Occult 14, Persuasion 13, Leadership 13, Riding 11, Shooting 11.</w:t>
       </w:r>
     </w:p>
     <w:p>
@@ -15668,7 +16078,7 @@
         <w:t xml:space="preserve"> </w:t>
       </w:r>
       <w:r>
-        <w:t xml:space="preserve">Extra Trained skill; True grit.</w:t>
+        <w:t xml:space="preserve">+1 attribute point; second advantage: Battlefield Surgeon; a fine tool: his army surgeon’s instruments (+2 Medicine).</w:t>
       </w:r>
       <w:r>
         <w:t xml:space="preserve"> </w:t>
@@ -15684,7 +16094,7 @@
         <w:t xml:space="preserve"> </w:t>
       </w:r>
       <w:r>
-        <w:t xml:space="preserve">Plains Wanderer (companion: Restless).</w:t>
+        <w:t xml:space="preserve">Steady Hands.</w:t>
       </w:r>
       <w:r>
         <w:t xml:space="preserve"> </w:t>
@@ -15700,7 +16110,7 @@
         <w:t xml:space="preserve"> </w:t>
       </w:r>
       <w:r>
-        <w:t xml:space="preserve">Sworn Vengeance; trigger: word of the men who burned her clan’s camp.</w:t>
+        <w:t xml:space="preserve">Haunted by the War; trigger: gunfire in the dark.</w:t>
       </w:r>
     </w:p>
     <w:p>
@@ -15722,7 +16132,7 @@
         <w:t xml:space="preserve"> </w:t>
       </w:r>
       <w:r>
-        <w:t xml:space="preserve">Something that wore a human face killed someone I loved.</w:t>
+        <w:t xml:space="preserve">I saw what I saw, and no one else believes me.</w:t>
       </w:r>
       <w:r>
         <w:t xml:space="preserve"> </w:t>
@@ -15738,17 +16148,17 @@
         <w:t xml:space="preserve"> </w:t>
       </w:r>
       <w:r>
-        <w:t xml:space="preserve">Eliza Kessler taught her what she knows about the hidden world.</w:t>
+        <w:t xml:space="preserve">Rode with Silas Thorne’s regiment in the war and has never trusted him since.</w:t>
       </w:r>
     </w:p>
     <w:bookmarkEnd w:id="86"/>
-    <w:bookmarkStart w:id="87" w:name="silas-thorne"/>
+    <w:bookmarkStart w:id="87" w:name="cora-ridgeway"/>
     <w:p>
       <w:pPr>
         <w:pStyle w:val="Heading2"/>
       </w:pPr>
       <w:r>
-        <w:t xml:space="preserve">Silas Thorne</w:t>
+        <w:t xml:space="preserve">Cora Ridgeway</w:t>
       </w:r>
     </w:p>
     <w:p>
@@ -15760,13 +16170,13 @@
           <w:iCs/>
           <w:i/>
         </w:rPr>
-        <w:t xml:space="preserve">Professional gambler, Gambler. Ziegevolk (Tier 1); Old hand.</w:t>
-      </w:r>
-      <w:r>
-        <w:t xml:space="preserve"> </w:t>
-      </w:r>
-      <w:r>
-        <w:t xml:space="preserve">Charming, well-dressed, and in debt to the wrong people.</w:t>
+        <w:t xml:space="preserve">Scout and sharpshooter, Scout. Coyotl (Tier 1).</w:t>
+      </w:r>
+      <w:r>
+        <w:t xml:space="preserve"> </w:t>
+      </w:r>
+      <w:r>
+        <w:t xml:space="preserve">Knows the plains and the high country, and keeps her clan’s ways close.</w:t>
       </w:r>
     </w:p>
     <w:p>
@@ -15788,7 +16198,7 @@
         <w:t xml:space="preserve"> </w:t>
       </w:r>
       <w:r>
-        <w:t xml:space="preserve">Body 10, Agility 10, Intellect 13, Presence 13, Will 9.</w:t>
+        <w:t xml:space="preserve">Body 11, Agility 14, Intellect 10, Presence 11, Will 9.</w:t>
       </w:r>
       <w:r>
         <w:t xml:space="preserve"> </w:t>
@@ -15804,7 +16214,23 @@
         <w:t xml:space="preserve"> </w:t>
       </w:r>
       <w:r>
-        <w:t xml:space="preserve">8.</w:t>
+        <w:t xml:space="preserve">13.</w:t>
+      </w:r>
+      <w:r>
+        <w:t xml:space="preserve"> </w:t>
+      </w:r>
+      <w:r>
+        <w:rPr>
+          <w:bCs/>
+          <w:b/>
+        </w:rPr>
+        <w:t xml:space="preserve">In woge:</w:t>
+      </w:r>
+      <w:r>
+        <w:t xml:space="preserve"> </w:t>
+      </w:r>
+      <w:r>
+        <w:t xml:space="preserve">Body 12, Agility 15, Dodge 15; claws mark 2 boxes.</w:t>
       </w:r>
     </w:p>
     <w:p>
@@ -15826,7 +16252,7 @@
         <w:t xml:space="preserve"> </w:t>
       </w:r>
       <w:r>
-        <w:t xml:space="preserve">Gambling 18 (Expert). Trained: Deception 14, Persuasion 14, Read People 14, Investigation 14, Shooting 11, Stealth 11, Riding 11.</w:t>
+        <w:t xml:space="preserve">Shooting 17 (Specialty). Trained: Riding 15, Stealth 15, Brawling 15, Melee 15, Persuasion 12, Athletics 12, Tracking 11, Survival 11, Read People 11, Gambling 11.</w:t>
       </w:r>
     </w:p>
     <w:p>
@@ -15848,7 +16274,7 @@
         <w:t xml:space="preserve"> </w:t>
       </w:r>
       <w:r>
-        <w:t xml:space="preserve">Second advantage: Poker Face; a friend in town: Mae Lin, a faro dealer who hears everything said at her table.</w:t>
+        <w:t xml:space="preserve">Extra Trained skill; True grit.</w:t>
       </w:r>
       <w:r>
         <w:t xml:space="preserve"> </w:t>
@@ -15864,7 +16290,7 @@
         <w:t xml:space="preserve"> </w:t>
       </w:r>
       <w:r>
-        <w:t xml:space="preserve">Ziegevolk Pheromones (companion: Pheromone Suspicion).</w:t>
+        <w:t xml:space="preserve">Plains Wanderer (companion: Restless).</w:t>
       </w:r>
       <w:r>
         <w:t xml:space="preserve"> </w:t>
@@ -15880,7 +16306,7 @@
         <w:t xml:space="preserve"> </w:t>
       </w:r>
       <w:r>
-        <w:t xml:space="preserve">Owes the Wrong People; trigger: a debt collector arrives.</w:t>
+        <w:t xml:space="preserve">Sworn Vengeance; trigger: word of the men who burned her clan’s camp.</w:t>
       </w:r>
     </w:p>
     <w:p>
@@ -15902,7 +16328,7 @@
         <w:t xml:space="preserve"> </w:t>
       </w:r>
       <w:r>
-        <w:t xml:space="preserve">The pay’s good, and nobody else will take these jobs.</w:t>
+        <w:t xml:space="preserve">Something that wore a human face killed someone I loved.</w:t>
       </w:r>
       <w:r>
         <w:t xml:space="preserve"> </w:t>
@@ -15918,35 +16344,17 @@
         <w:t xml:space="preserve"> </w:t>
       </w:r>
       <w:r>
-        <w:t xml:space="preserve">Plays cards with Cora every Saturday; she’s the only one who can tell when he’s bluffing.</w:t>
+        <w:t xml:space="preserve">Eliza Kessler taught her what she knows about the hidden world.</w:t>
       </w:r>
     </w:p>
     <w:bookmarkEnd w:id="87"/>
-    <w:bookmarkStart w:id="88" w:name="magdalena-lena-baer"/>
+    <w:bookmarkStart w:id="88" w:name="silas-thorne"/>
     <w:p>
       <w:pPr>
         <w:pStyle w:val="Heading2"/>
       </w:pPr>
       <w:r>
-        <w:t xml:space="preserve">Magdalena</w:t>
-      </w:r>
-      <w:r>
-        <w:t xml:space="preserve"> </w:t>
-      </w:r>
-      <w:r>
-        <w:t xml:space="preserve">“</w:t>
-      </w:r>
-      <w:r>
-        <w:t xml:space="preserve">Lena</w:t>
-      </w:r>
-      <w:r>
-        <w:t xml:space="preserve">”</w:t>
-      </w:r>
-      <w:r>
-        <w:t xml:space="preserve"> </w:t>
-      </w:r>
-      <w:r>
-        <w:t xml:space="preserve">Baer</w:t>
+        <w:t xml:space="preserve">Silas Thorne</w:t>
       </w:r>
     </w:p>
     <w:p>
@@ -15958,26 +16366,13 @@
           <w:iCs/>
           <w:i/>
         </w:rPr>
-        <w:t xml:space="preserve">Braucher, Occultist. Incantare (Tier 2).</w:t>
-      </w:r>
-      <w:r>
-        <w:t xml:space="preserve"> </w:t>
-      </w:r>
-      <w:r>
-        <w:t xml:space="preserve">Came west from Lancaster County with a wagon, a Bible and her grandmother’s</w:t>
-      </w:r>
-      <w:r>
-        <w:t xml:space="preserve"> </w:t>
-      </w:r>
-      <w:r>
-        <w:rPr>
-          <w:iCs/>
-          <w:i/>
-        </w:rPr>
-        <w:t xml:space="preserve">Long Lost Friend</w:t>
-      </w:r>
-      <w:r>
-        <w:t xml:space="preserve">. Heals for gifts, and breaks hexes for no one’s money.</w:t>
+        <w:t xml:space="preserve">Professional gambler, Gambler. Ziegevolk (Tier 1); Old hand.</w:t>
+      </w:r>
+      <w:r>
+        <w:t xml:space="preserve"> </w:t>
+      </w:r>
+      <w:r>
+        <w:t xml:space="preserve">Charming, well-dressed, and in debt to the wrong people.</w:t>
       </w:r>
     </w:p>
     <w:p>
@@ -15999,7 +16394,7 @@
         <w:t xml:space="preserve"> </w:t>
       </w:r>
       <w:r>
-        <w:t xml:space="preserve">Body 9, Agility 10, Intellect 13, Presence 11, Will 12.</w:t>
+        <w:t xml:space="preserve">Body 10, Agility 10, Intellect 13, Presence 13, Will 9.</w:t>
       </w:r>
       <w:r>
         <w:t xml:space="preserve"> </w:t>
@@ -16037,7 +16432,7 @@
         <w:t xml:space="preserve"> </w:t>
       </w:r>
       <w:r>
-        <w:t xml:space="preserve">Occult 16 (Specialty). Trained: Wesen Lore 14, Apothecary 14, Read People 14, Medicine 14, Investigation 14, Survival 14, Persuasion 12, Riding 11, Shooting 11.</w:t>
+        <w:t xml:space="preserve">Gambling 18 (Expert). Trained: Deception 14, Persuasion 14, Read People 14, Investigation 14, Shooting 11, Stealth 11, Riding 11.</w:t>
       </w:r>
     </w:p>
     <w:p>
@@ -16053,29 +16448,29 @@
           <w:bCs/>
           <w:b/>
         </w:rPr>
-        <w:t xml:space="preserve">Edge:</w:t>
-      </w:r>
-      <w:r>
-        <w:t xml:space="preserve"> </w:t>
-      </w:r>
-      <w:r>
-        <w:t xml:space="preserve">A friend in town: Pastor Jakob Unruh of the Volga German colony east of town, who brings her the cases his people won’t take to a doctor.</w:t>
-      </w:r>
-      <w:r>
-        <w:t xml:space="preserve"> </w:t>
-      </w:r>
-      <w:r>
-        <w:rPr>
-          <w:bCs/>
-          <w:b/>
-        </w:rPr>
-        <w:t xml:space="preserve">Lens:</w:t>
-      </w:r>
-      <w:r>
-        <w:t xml:space="preserve"> </w:t>
-      </w:r>
-      <w:r>
-        <w:t xml:space="preserve">Braucher (companion: No Payment).</w:t>
+        <w:t xml:space="preserve">Edges:</w:t>
+      </w:r>
+      <w:r>
+        <w:t xml:space="preserve"> </w:t>
+      </w:r>
+      <w:r>
+        <w:t xml:space="preserve">Second advantage: Poker Face; a friend in town: Mae Lin, a faro dealer who hears everything said at her table.</w:t>
+      </w:r>
+      <w:r>
+        <w:t xml:space="preserve"> </w:t>
+      </w:r>
+      <w:r>
+        <w:rPr>
+          <w:bCs/>
+          <w:b/>
+        </w:rPr>
+        <w:t xml:space="preserve">Advantage:</w:t>
+      </w:r>
+      <w:r>
+        <w:t xml:space="preserve"> </w:t>
+      </w:r>
+      <w:r>
+        <w:t xml:space="preserve">Ziegevolk Pheromones (companion: Pheromone Suspicion).</w:t>
       </w:r>
       <w:r>
         <w:t xml:space="preserve"> </w:t>
@@ -16091,7 +16486,7 @@
         <w:t xml:space="preserve"> </w:t>
       </w:r>
       <w:r>
-        <w:t xml:space="preserve">Reluctant to Kill; trigger: an enemy lies wounded and helpless in front of her.</w:t>
+        <w:t xml:space="preserve">Owes the Wrong People; trigger: a debt collector arrives.</w:t>
       </w:r>
     </w:p>
     <w:p>
@@ -16107,20 +16502,231 @@
           <w:bCs/>
           <w:b/>
         </w:rPr>
-        <w:t xml:space="preserve">Magic:</w:t>
-      </w:r>
-      <w:r>
-        <w:t xml:space="preserve"> </w:t>
-      </w:r>
-      <w:r>
-        <w:t xml:space="preserve">works rituals with Occult at ten minutes a roll, +2 to heal, protect or break a hex; carries 3 ready charms (Occult as her Specialty). Carries a Himmelsbrief, and writes them for others.</w:t>
+        <w:t xml:space="preserve">Why I stand against the dark:</w:t>
+      </w:r>
+      <w:r>
+        <w:t xml:space="preserve"> </w:t>
+      </w:r>
+      <w:r>
+        <w:t xml:space="preserve">The pay’s good, and nobody else will take these jobs.</w:t>
+      </w:r>
+      <w:r>
+        <w:t xml:space="preserve"> </w:t>
+      </w:r>
+      <w:r>
+        <w:rPr>
+          <w:bCs/>
+          <w:b/>
+        </w:rPr>
+        <w:t xml:space="preserve">Connection:</w:t>
+      </w:r>
+      <w:r>
+        <w:t xml:space="preserve"> </w:t>
+      </w:r>
+      <w:r>
+        <w:t xml:space="preserve">Plays cards with Cora every Saturday; she’s the only one who can tell when he’s bluffing.</w:t>
+      </w:r>
+    </w:p>
+    <w:bookmarkEnd w:id="88"/>
+    <w:bookmarkStart w:id="89" w:name="magdalena-lena-baer"/>
+    <w:p>
+      <w:pPr>
+        <w:pStyle w:val="Heading2"/>
+      </w:pPr>
+      <w:r>
+        <w:t xml:space="preserve">Magdalena</w:t>
+      </w:r>
+      <w:r>
+        <w:t xml:space="preserve"> </w:t>
+      </w:r>
+      <w:r>
+        <w:t xml:space="preserve">“</w:t>
+      </w:r>
+      <w:r>
+        <w:t xml:space="preserve">Lena</w:t>
+      </w:r>
+      <w:r>
+        <w:t xml:space="preserve">”</w:t>
+      </w:r>
+      <w:r>
+        <w:t xml:space="preserve"> </w:t>
+      </w:r>
+      <w:r>
+        <w:t xml:space="preserve">Baer</w:t>
+      </w:r>
+    </w:p>
+    <w:p>
+      <w:pPr>
+        <w:pStyle w:val="FirstParagraph"/>
+      </w:pPr>
+      <w:r>
+        <w:rPr>
+          <w:iCs/>
+          <w:i/>
+        </w:rPr>
+        <w:t xml:space="preserve">Braucher, Occultist. Incantare (Tier 2).</w:t>
+      </w:r>
+      <w:r>
+        <w:t xml:space="preserve"> </w:t>
+      </w:r>
+      <w:r>
+        <w:t xml:space="preserve">Came west from Lancaster County with a wagon, a Bible and her grandmother’s</w:t>
+      </w:r>
+      <w:r>
+        <w:t xml:space="preserve"> </w:t>
+      </w:r>
+      <w:r>
+        <w:rPr>
+          <w:iCs/>
+          <w:i/>
+        </w:rPr>
+        <w:t xml:space="preserve">Long Lost Friend</w:t>
+      </w:r>
+      <w:r>
+        <w:t xml:space="preserve">. Heals for gifts, and breaks hexes for no one’s money.</w:t>
       </w:r>
     </w:p>
     <w:p>
       <w:pPr>
         <w:numPr>
           <w:ilvl w:val="0"/>
-          <w:numId w:val="1024"/>
+          <w:numId w:val="1025"/>
+        </w:numPr>
+        <w:pStyle w:val="Compact"/>
+      </w:pPr>
+      <w:r>
+        <w:rPr>
+          <w:bCs/>
+          <w:b/>
+        </w:rPr>
+        <w:t xml:space="preserve">Attributes:</w:t>
+      </w:r>
+      <w:r>
+        <w:t xml:space="preserve"> </w:t>
+      </w:r>
+      <w:r>
+        <w:t xml:space="preserve">Body 9, Agility 10, Intellect 13, Presence 11, Will 12.</w:t>
+      </w:r>
+      <w:r>
+        <w:t xml:space="preserve"> </w:t>
+      </w:r>
+      <w:r>
+        <w:rPr>
+          <w:bCs/>
+          <w:b/>
+        </w:rPr>
+        <w:t xml:space="preserve">Dodge</w:t>
+      </w:r>
+      <w:r>
+        <w:t xml:space="preserve"> </w:t>
+      </w:r>
+      <w:r>
+        <w:t xml:space="preserve">8.</w:t>
+      </w:r>
+    </w:p>
+    <w:p>
+      <w:pPr>
+        <w:numPr>
+          <w:ilvl w:val="0"/>
+          <w:numId w:val="1025"/>
+        </w:numPr>
+        <w:pStyle w:val="Compact"/>
+      </w:pPr>
+      <w:r>
+        <w:rPr>
+          <w:bCs/>
+          <w:b/>
+        </w:rPr>
+        <w:t xml:space="preserve">Skills:</w:t>
+      </w:r>
+      <w:r>
+        <w:t xml:space="preserve"> </w:t>
+      </w:r>
+      <w:r>
+        <w:t xml:space="preserve">Occult 16 (Specialty). Trained: Wesen Lore 14, Apothecary 14, Read People 14, Medicine 14, Investigation 14, Survival 14, Persuasion 12, Riding 11, Shooting 11.</w:t>
+      </w:r>
+    </w:p>
+    <w:p>
+      <w:pPr>
+        <w:numPr>
+          <w:ilvl w:val="0"/>
+          <w:numId w:val="1025"/>
+        </w:numPr>
+        <w:pStyle w:val="Compact"/>
+      </w:pPr>
+      <w:r>
+        <w:rPr>
+          <w:bCs/>
+          <w:b/>
+        </w:rPr>
+        <w:t xml:space="preserve">Edge:</w:t>
+      </w:r>
+      <w:r>
+        <w:t xml:space="preserve"> </w:t>
+      </w:r>
+      <w:r>
+        <w:t xml:space="preserve">A friend in town: Pastor Jakob Unruh of the Volga German colony east of town, who brings her the cases his people won’t take to a doctor.</w:t>
+      </w:r>
+      <w:r>
+        <w:t xml:space="preserve"> </w:t>
+      </w:r>
+      <w:r>
+        <w:rPr>
+          <w:bCs/>
+          <w:b/>
+        </w:rPr>
+        <w:t xml:space="preserve">Lens:</w:t>
+      </w:r>
+      <w:r>
+        <w:t xml:space="preserve"> </w:t>
+      </w:r>
+      <w:r>
+        <w:t xml:space="preserve">Braucher (companion: No Payment).</w:t>
+      </w:r>
+      <w:r>
+        <w:t xml:space="preserve"> </w:t>
+      </w:r>
+      <w:r>
+        <w:rPr>
+          <w:bCs/>
+          <w:b/>
+        </w:rPr>
+        <w:t xml:space="preserve">Complication:</w:t>
+      </w:r>
+      <w:r>
+        <w:t xml:space="preserve"> </w:t>
+      </w:r>
+      <w:r>
+        <w:t xml:space="preserve">Reluctant to Kill; trigger: an enemy lies wounded and helpless in front of her.</w:t>
+      </w:r>
+    </w:p>
+    <w:p>
+      <w:pPr>
+        <w:numPr>
+          <w:ilvl w:val="0"/>
+          <w:numId w:val="1025"/>
+        </w:numPr>
+        <w:pStyle w:val="Compact"/>
+      </w:pPr>
+      <w:r>
+        <w:rPr>
+          <w:bCs/>
+          <w:b/>
+        </w:rPr>
+        <w:t xml:space="preserve">Magic:</w:t>
+      </w:r>
+      <w:r>
+        <w:t xml:space="preserve"> </w:t>
+      </w:r>
+      <w:r>
+        <w:t xml:space="preserve">works rituals with Occult at ten minutes a roll, +2 to heal, protect or break a hex; carries 3 ready charms (Occult as her Specialty). Carries a Himmelsbrief, and writes them for others.</w:t>
+      </w:r>
+    </w:p>
+    <w:p>
+      <w:pPr>
+        <w:numPr>
+          <w:ilvl w:val="0"/>
+          <w:numId w:val="1025"/>
         </w:numPr>
         <w:pStyle w:val="Compact"/>
       </w:pPr>
@@ -17422,9 +18028,9 @@
         <w:t xml:space="preserve">For a tougher version, add +1 to its targets and one box; for a weaker one, subtract.</w:t>
       </w:r>
     </w:p>
-    <w:bookmarkEnd w:id="88"/>
     <w:bookmarkEnd w:id="89"/>
-    <w:bookmarkStart w:id="90" w:name="advantages"/>
+    <w:bookmarkEnd w:id="90"/>
+    <w:bookmarkStart w:id="91" w:name="advantages"/>
     <w:p>
       <w:pPr>
         <w:pStyle w:val="Heading1"/>
@@ -18180,8 +18786,8 @@
         <w:t xml:space="preserve">A badge is legal authority, not a magic word: Wesen, outlaws and the powers of the hidden world don’t care about it, and it carries a duty. Your superiors can give you orders, and abusing the badge or failing in your duty can cost you it. Law callings (Marshal, Deputy) usually take one, as their advantage or as a second advantage Edge. A Pinkerton detective takes Pinkerton Credentials instead: the agency’s reach and files, but no badge.</w:t>
       </w:r>
     </w:p>
-    <w:bookmarkEnd w:id="90"/>
-    <w:bookmarkStart w:id="112" w:name="heritages"/>
+    <w:bookmarkEnd w:id="91"/>
+    <w:bookmarkStart w:id="113" w:name="heritages"/>
     <w:p>
       <w:pPr>
         <w:pStyle w:val="Heading1"/>
@@ -19586,7 +20192,7 @@
         </w:tc>
       </w:tr>
     </w:tbl>
-    <w:bookmarkStart w:id="91" w:name="core-wesen-rules"/>
+    <w:bookmarkStart w:id="92" w:name="core-wesen-rules"/>
     <w:p>
       <w:pPr>
         <w:pStyle w:val="Heading2"/>
@@ -19898,8 +20504,8 @@
         <w:t xml:space="preserve">means each hit that marks 2 or more boxes marks one fewer, never below 1.</w:t>
       </w:r>
     </w:p>
-    <w:bookmarkEnd w:id="91"/>
-    <w:bookmarkStart w:id="92" w:name="human"/>
+    <w:bookmarkEnd w:id="92"/>
+    <w:bookmarkStart w:id="93" w:name="human"/>
     <w:p>
       <w:pPr>
         <w:pStyle w:val="Heading2"/>
@@ -20132,8 +20738,8 @@
         </w:tc>
       </w:tr>
     </w:tbl>
-    <w:bookmarkEnd w:id="92"/>
-    <w:bookmarkStart w:id="93" w:name="bauerschwein"/>
+    <w:bookmarkEnd w:id="93"/>
+    <w:bookmarkStart w:id="94" w:name="bauerschwein"/>
     <w:p>
       <w:pPr>
         <w:pStyle w:val="Heading2"/>
@@ -20178,7 +20784,7 @@
       <w:pPr>
         <w:numPr>
           <w:ilvl w:val="0"/>
-          <w:numId w:val="1025"/>
+          <w:numId w:val="1026"/>
         </w:numPr>
         <w:pStyle w:val="Compact"/>
       </w:pPr>
@@ -20426,8 +21032,8 @@
         </w:tc>
       </w:tr>
     </w:tbl>
-    <w:bookmarkEnd w:id="93"/>
-    <w:bookmarkStart w:id="94" w:name="coyotl"/>
+    <w:bookmarkEnd w:id="94"/>
+    <w:bookmarkStart w:id="95" w:name="coyotl"/>
     <w:p>
       <w:pPr>
         <w:pStyle w:val="Heading2"/>
@@ -20696,8 +21302,8 @@
         </w:tc>
       </w:tr>
     </w:tbl>
-    <w:bookmarkEnd w:id="94"/>
-    <w:bookmarkStart w:id="95" w:name="eisbiber"/>
+    <w:bookmarkEnd w:id="95"/>
+    <w:bookmarkStart w:id="96" w:name="eisbiber"/>
     <w:p>
       <w:pPr>
         <w:pStyle w:val="Heading2"/>
@@ -20966,8 +21572,8 @@
         </w:tc>
       </w:tr>
     </w:tbl>
-    <w:bookmarkEnd w:id="95"/>
-    <w:bookmarkStart w:id="96" w:name="fuchsbau"/>
+    <w:bookmarkEnd w:id="96"/>
+    <w:bookmarkStart w:id="97" w:name="fuchsbau"/>
     <w:p>
       <w:pPr>
         <w:pStyle w:val="Heading2"/>
@@ -21298,8 +21904,8 @@
         </w:tc>
       </w:tr>
     </w:tbl>
-    <w:bookmarkEnd w:id="96"/>
-    <w:bookmarkStart w:id="97" w:name="mauzhertz"/>
+    <w:bookmarkEnd w:id="97"/>
+    <w:bookmarkStart w:id="98" w:name="mauzhertz"/>
     <w:p>
       <w:pPr>
         <w:pStyle w:val="Heading2"/>
@@ -21568,8 +22174,8 @@
         </w:tc>
       </w:tr>
     </w:tbl>
-    <w:bookmarkEnd w:id="97"/>
-    <w:bookmarkStart w:id="98" w:name="steinadler"/>
+    <w:bookmarkEnd w:id="98"/>
+    <w:bookmarkStart w:id="99" w:name="steinadler"/>
     <w:p>
       <w:pPr>
         <w:pStyle w:val="Heading2"/>
@@ -21838,8 +22444,8 @@
         </w:tc>
       </w:tr>
     </w:tbl>
-    <w:bookmarkEnd w:id="98"/>
-    <w:bookmarkStart w:id="99" w:name="taniwha"/>
+    <w:bookmarkEnd w:id="99"/>
+    <w:bookmarkStart w:id="100" w:name="taniwha"/>
     <w:p>
       <w:pPr>
         <w:pStyle w:val="Heading2"/>
@@ -21884,7 +22490,7 @@
       <w:pPr>
         <w:numPr>
           <w:ilvl w:val="0"/>
-          <w:numId w:val="1026"/>
+          <w:numId w:val="1027"/>
         </w:numPr>
         <w:pStyle w:val="Compact"/>
       </w:pPr>
@@ -21896,7 +22502,7 @@
       <w:pPr>
         <w:numPr>
           <w:ilvl w:val="0"/>
-          <w:numId w:val="1026"/>
+          <w:numId w:val="1027"/>
         </w:numPr>
         <w:pStyle w:val="Compact"/>
       </w:pPr>
@@ -22160,8 +22766,8 @@
         </w:tc>
       </w:tr>
     </w:tbl>
-    <w:bookmarkEnd w:id="99"/>
-    <w:bookmarkStart w:id="100" w:name="ziegevolk"/>
+    <w:bookmarkEnd w:id="100"/>
+    <w:bookmarkStart w:id="101" w:name="ziegevolk"/>
     <w:p>
       <w:pPr>
         <w:pStyle w:val="Heading2"/>
@@ -22430,8 +23036,8 @@
         </w:tc>
       </w:tr>
     </w:tbl>
-    <w:bookmarkEnd w:id="100"/>
-    <w:bookmarkStart w:id="101" w:name="blutbad"/>
+    <w:bookmarkEnd w:id="101"/>
+    <w:bookmarkStart w:id="102" w:name="blutbad"/>
     <w:p>
       <w:pPr>
         <w:pStyle w:val="Heading2"/>
@@ -22476,7 +23082,7 @@
       <w:pPr>
         <w:numPr>
           <w:ilvl w:val="0"/>
-          <w:numId w:val="1027"/>
+          <w:numId w:val="1028"/>
         </w:numPr>
         <w:pStyle w:val="Compact"/>
       </w:pPr>
@@ -22786,8 +23392,8 @@
         </w:tc>
       </w:tr>
     </w:tbl>
-    <w:bookmarkEnd w:id="101"/>
-    <w:bookmarkStart w:id="102" w:name="grimm"/>
+    <w:bookmarkEnd w:id="102"/>
+    <w:bookmarkStart w:id="103" w:name="grimm"/>
     <w:p>
       <w:pPr>
         <w:pStyle w:val="Heading2"/>
@@ -22832,7 +23438,7 @@
       <w:pPr>
         <w:numPr>
           <w:ilvl w:val="0"/>
-          <w:numId w:val="1028"/>
+          <w:numId w:val="1029"/>
         </w:numPr>
         <w:pStyle w:val="Compact"/>
       </w:pPr>
@@ -22844,7 +23450,7 @@
       <w:pPr>
         <w:numPr>
           <w:ilvl w:val="0"/>
-          <w:numId w:val="1028"/>
+          <w:numId w:val="1029"/>
         </w:numPr>
         <w:pStyle w:val="Compact"/>
       </w:pPr>
@@ -22856,7 +23462,7 @@
       <w:pPr>
         <w:numPr>
           <w:ilvl w:val="0"/>
-          <w:numId w:val="1028"/>
+          <w:numId w:val="1029"/>
         </w:numPr>
         <w:pStyle w:val="Compact"/>
       </w:pPr>
@@ -22868,7 +23474,7 @@
       <w:pPr>
         <w:numPr>
           <w:ilvl w:val="0"/>
-          <w:numId w:val="1028"/>
+          <w:numId w:val="1029"/>
         </w:numPr>
         <w:pStyle w:val="Compact"/>
       </w:pPr>
@@ -22880,7 +23486,7 @@
       <w:pPr>
         <w:numPr>
           <w:ilvl w:val="0"/>
-          <w:numId w:val="1028"/>
+          <w:numId w:val="1029"/>
         </w:numPr>
         <w:pStyle w:val="Compact"/>
       </w:pPr>
@@ -22892,7 +23498,7 @@
       <w:pPr>
         <w:numPr>
           <w:ilvl w:val="0"/>
-          <w:numId w:val="1028"/>
+          <w:numId w:val="1029"/>
         </w:numPr>
         <w:pStyle w:val="Compact"/>
       </w:pPr>
@@ -22904,7 +23510,7 @@
       <w:pPr>
         <w:numPr>
           <w:ilvl w:val="0"/>
-          <w:numId w:val="1028"/>
+          <w:numId w:val="1029"/>
         </w:numPr>
         <w:pStyle w:val="Compact"/>
       </w:pPr>
@@ -23692,8 +24298,8 @@
         </w:tc>
       </w:tr>
     </w:tbl>
-    <w:bookmarkEnd w:id="102"/>
-    <w:bookmarkStart w:id="103" w:name="incantare"/>
+    <w:bookmarkEnd w:id="103"/>
+    <w:bookmarkStart w:id="104" w:name="incantare"/>
     <w:p>
       <w:pPr>
         <w:pStyle w:val="Heading2"/>
@@ -23738,7 +24344,7 @@
       <w:pPr>
         <w:numPr>
           <w:ilvl w:val="0"/>
-          <w:numId w:val="1029"/>
+          <w:numId w:val="1030"/>
         </w:numPr>
         <w:pStyle w:val="Compact"/>
       </w:pPr>
@@ -23750,7 +24356,7 @@
       <w:pPr>
         <w:numPr>
           <w:ilvl w:val="0"/>
-          <w:numId w:val="1029"/>
+          <w:numId w:val="1030"/>
         </w:numPr>
         <w:pStyle w:val="Compact"/>
       </w:pPr>
@@ -23762,7 +24368,7 @@
       <w:pPr>
         <w:numPr>
           <w:ilvl w:val="0"/>
-          <w:numId w:val="1029"/>
+          <w:numId w:val="1030"/>
         </w:numPr>
         <w:pStyle w:val="Compact"/>
       </w:pPr>
@@ -24364,8 +24970,8 @@
         </w:tc>
       </w:tr>
     </w:tbl>
-    <w:bookmarkEnd w:id="103"/>
-    <w:bookmarkStart w:id="104" w:name="jägerbär"/>
+    <w:bookmarkEnd w:id="104"/>
+    <w:bookmarkStart w:id="105" w:name="jägerbär"/>
     <w:p>
       <w:pPr>
         <w:pStyle w:val="Heading2"/>
@@ -24634,8 +25240,8 @@
         </w:tc>
       </w:tr>
     </w:tbl>
-    <w:bookmarkEnd w:id="104"/>
-    <w:bookmarkStart w:id="105" w:name="mauvais-dentes"/>
+    <w:bookmarkEnd w:id="105"/>
+    <w:bookmarkStart w:id="106" w:name="mauvais-dentes"/>
     <w:p>
       <w:pPr>
         <w:pStyle w:val="Heading2"/>
@@ -24680,7 +25286,7 @@
       <w:pPr>
         <w:numPr>
           <w:ilvl w:val="0"/>
-          <w:numId w:val="1030"/>
+          <w:numId w:val="1031"/>
         </w:numPr>
         <w:pStyle w:val="Compact"/>
       </w:pPr>
@@ -24928,8 +25534,8 @@
         </w:tc>
       </w:tr>
     </w:tbl>
-    <w:bookmarkEnd w:id="105"/>
-    <w:bookmarkStart w:id="106" w:name="naschazer"/>
+    <w:bookmarkEnd w:id="106"/>
+    <w:bookmarkStart w:id="107" w:name="naschazer"/>
     <w:p>
       <w:pPr>
         <w:pStyle w:val="Heading2"/>
@@ -24974,7 +25580,7 @@
       <w:pPr>
         <w:numPr>
           <w:ilvl w:val="0"/>
-          <w:numId w:val="1031"/>
+          <w:numId w:val="1032"/>
         </w:numPr>
         <w:pStyle w:val="Compact"/>
       </w:pPr>
@@ -25222,8 +25828,8 @@
         </w:tc>
       </w:tr>
     </w:tbl>
-    <w:bookmarkEnd w:id="106"/>
-    <w:bookmarkStart w:id="107" w:name="skalengeck"/>
+    <w:bookmarkEnd w:id="107"/>
+    <w:bookmarkStart w:id="108" w:name="skalengeck"/>
     <w:p>
       <w:pPr>
         <w:pStyle w:val="Heading2"/>
@@ -25492,8 +26098,8 @@
         </w:tc>
       </w:tr>
     </w:tbl>
-    <w:bookmarkEnd w:id="107"/>
-    <w:bookmarkStart w:id="108" w:name="vallachi"/>
+    <w:bookmarkEnd w:id="108"/>
+    <w:bookmarkStart w:id="109" w:name="vallachi"/>
     <w:p>
       <w:pPr>
         <w:pStyle w:val="Heading2"/>
@@ -25538,7 +26144,7 @@
       <w:pPr>
         <w:numPr>
           <w:ilvl w:val="0"/>
-          <w:numId w:val="1032"/>
+          <w:numId w:val="1033"/>
         </w:numPr>
         <w:pStyle w:val="Compact"/>
       </w:pPr>
@@ -25550,7 +26156,7 @@
       <w:pPr>
         <w:numPr>
           <w:ilvl w:val="0"/>
-          <w:numId w:val="1032"/>
+          <w:numId w:val="1033"/>
         </w:numPr>
         <w:pStyle w:val="Compact"/>
       </w:pPr>
@@ -25562,7 +26168,7 @@
       <w:pPr>
         <w:numPr>
           <w:ilvl w:val="0"/>
-          <w:numId w:val="1032"/>
+          <w:numId w:val="1033"/>
         </w:numPr>
         <w:pStyle w:val="Compact"/>
       </w:pPr>
@@ -25574,7 +26180,7 @@
       <w:pPr>
         <w:numPr>
           <w:ilvl w:val="0"/>
-          <w:numId w:val="1032"/>
+          <w:numId w:val="1033"/>
         </w:numPr>
         <w:pStyle w:val="Compact"/>
       </w:pPr>
@@ -25822,8 +26428,8 @@
         </w:tc>
       </w:tr>
     </w:tbl>
-    <w:bookmarkEnd w:id="108"/>
-    <w:bookmarkStart w:id="109" w:name="fuchsteufelwild"/>
+    <w:bookmarkEnd w:id="109"/>
+    <w:bookmarkStart w:id="110" w:name="fuchsteufelwild"/>
     <w:p>
       <w:pPr>
         <w:pStyle w:val="Heading2"/>
@@ -25868,7 +26474,7 @@
       <w:pPr>
         <w:numPr>
           <w:ilvl w:val="0"/>
-          <w:numId w:val="1033"/>
+          <w:numId w:val="1034"/>
         </w:numPr>
         <w:pStyle w:val="Compact"/>
       </w:pPr>
@@ -25880,7 +26486,7 @@
       <w:pPr>
         <w:numPr>
           <w:ilvl w:val="0"/>
-          <w:numId w:val="1033"/>
+          <w:numId w:val="1034"/>
         </w:numPr>
         <w:pStyle w:val="Compact"/>
       </w:pPr>
@@ -26144,8 +26750,8 @@
         </w:tc>
       </w:tr>
     </w:tbl>
-    <w:bookmarkEnd w:id="109"/>
-    <w:bookmarkStart w:id="110" w:name="hexenbiest-or-zauberbiest"/>
+    <w:bookmarkEnd w:id="110"/>
+    <w:bookmarkStart w:id="111" w:name="hexenbiest-or-zauberbiest"/>
     <w:p>
       <w:pPr>
         <w:pStyle w:val="Heading2"/>
@@ -26190,7 +26796,7 @@
       <w:pPr>
         <w:numPr>
           <w:ilvl w:val="0"/>
-          <w:numId w:val="1034"/>
+          <w:numId w:val="1035"/>
         </w:numPr>
         <w:pStyle w:val="Compact"/>
       </w:pPr>
@@ -26202,7 +26808,7 @@
       <w:pPr>
         <w:numPr>
           <w:ilvl w:val="0"/>
-          <w:numId w:val="1034"/>
+          <w:numId w:val="1035"/>
         </w:numPr>
         <w:pStyle w:val="Compact"/>
       </w:pPr>
@@ -26214,7 +26820,7 @@
       <w:pPr>
         <w:numPr>
           <w:ilvl w:val="0"/>
-          <w:numId w:val="1034"/>
+          <w:numId w:val="1035"/>
         </w:numPr>
         <w:pStyle w:val="Compact"/>
       </w:pPr>
@@ -26540,8 +27146,8 @@
         </w:tc>
       </w:tr>
     </w:tbl>
-    <w:bookmarkEnd w:id="110"/>
-    <w:bookmarkStart w:id="111" w:name="murcielago"/>
+    <w:bookmarkEnd w:id="111"/>
+    <w:bookmarkStart w:id="112" w:name="murcielago"/>
     <w:p>
       <w:pPr>
         <w:pStyle w:val="Heading2"/>
@@ -26586,7 +27192,7 @@
       <w:pPr>
         <w:numPr>
           <w:ilvl w:val="0"/>
-          <w:numId w:val="1035"/>
+          <w:numId w:val="1036"/>
         </w:numPr>
         <w:pStyle w:val="Compact"/>
       </w:pPr>
@@ -26834,9 +27440,9 @@
         </w:tc>
       </w:tr>
     </w:tbl>
-    <w:bookmarkEnd w:id="111"/>
     <w:bookmarkEnd w:id="112"/>
-    <w:bookmarkStart w:id="123" w:name="making-your-own"/>
+    <w:bookmarkEnd w:id="113"/>
+    <w:bookmarkStart w:id="124" w:name="making-your-own"/>
     <w:p>
       <w:pPr>
         <w:pStyle w:val="Heading1"/>
@@ -26869,7 +27475,7 @@
         <w:t xml:space="preserve">option at the end of each list, and its checklist holds a custom choice to the same rules as everything else.</w:t>
       </w:r>
     </w:p>
-    <w:bookmarkStart w:id="113" w:name="a-custom-calling"/>
+    <w:bookmarkStart w:id="114" w:name="a-custom-calling"/>
     <w:p>
       <w:pPr>
         <w:pStyle w:val="Heading2"/>
@@ -26890,7 +27496,7 @@
       <w:pPr>
         <w:numPr>
           <w:ilvl w:val="0"/>
-          <w:numId w:val="1036"/>
+          <w:numId w:val="1037"/>
         </w:numPr>
         <w:pStyle w:val="Compact"/>
       </w:pPr>
@@ -26936,7 +27542,7 @@
       <w:pPr>
         <w:numPr>
           <w:ilvl w:val="0"/>
-          <w:numId w:val="1036"/>
+          <w:numId w:val="1037"/>
         </w:numPr>
         <w:pStyle w:val="Compact"/>
       </w:pPr>
@@ -26958,7 +27564,7 @@
       <w:pPr>
         <w:numPr>
           <w:ilvl w:val="0"/>
-          <w:numId w:val="1036"/>
+          <w:numId w:val="1037"/>
         </w:numPr>
         <w:pStyle w:val="Compact"/>
       </w:pPr>
@@ -26980,7 +27586,7 @@
       <w:pPr>
         <w:numPr>
           <w:ilvl w:val="0"/>
-          <w:numId w:val="1036"/>
+          <w:numId w:val="1037"/>
         </w:numPr>
         <w:pStyle w:val="Compact"/>
       </w:pPr>
@@ -27045,8 +27651,8 @@
         <w:t xml:space="preserve">.</w:t>
       </w:r>
     </w:p>
-    <w:bookmarkEnd w:id="113"/>
-    <w:bookmarkStart w:id="122" w:name="a-custom-heritage"/>
+    <w:bookmarkEnd w:id="114"/>
+    <w:bookmarkStart w:id="123" w:name="a-custom-heritage"/>
     <w:p>
       <w:pPr>
         <w:pStyle w:val="Heading2"/>
@@ -27063,7 +27669,7 @@
         <w:t xml:space="preserve">Build it with the GM, one step at a time.</w:t>
       </w:r>
     </w:p>
-    <w:bookmarkStart w:id="114" w:name="the-concept"/>
+    <w:bookmarkStart w:id="115" w:name="the-concept"/>
     <w:p>
       <w:pPr>
         <w:pStyle w:val="Heading3"/>
@@ -27080,8 +27686,8 @@
         <w:t xml:space="preserve">Two or three sentences: where they come from, what sets them apart, and how others see them. It should be something the heritages in this book don’t already cover.</w:t>
       </w:r>
     </w:p>
-    <w:bookmarkEnd w:id="114"/>
-    <w:bookmarkStart w:id="115" w:name="the-tier"/>
+    <w:bookmarkEnd w:id="115"/>
+    <w:bookmarkStart w:id="116" w:name="the-tier"/>
     <w:p>
       <w:pPr>
         <w:pStyle w:val="Heading3"/>
@@ -27378,8 +27984,8 @@
         <w:t xml:space="preserve">When in doubt, choose the higher tier.</w:t>
       </w:r>
     </w:p>
-    <w:bookmarkEnd w:id="115"/>
-    <w:bookmarkStart w:id="116" w:name="attribute-adjustments"/>
+    <w:bookmarkEnd w:id="116"/>
+    <w:bookmarkStart w:id="117" w:name="attribute-adjustments"/>
     <w:p>
       <w:pPr>
         <w:pStyle w:val="Heading3"/>
@@ -27425,8 +28031,8 @@
         <w:t xml:space="preserve">: a +2 needs a −2 or two −1s. The adjustments move the attribute’s base (+1 starts it at 11) and raise its starting maximum (13 plus the bonus). Most heritages change two to four attributes.</w:t>
       </w:r>
     </w:p>
-    <w:bookmarkEnd w:id="116"/>
-    <w:bookmarkStart w:id="117" w:name="core-rules-tier-1-and-up"/>
+    <w:bookmarkEnd w:id="117"/>
+    <w:bookmarkStart w:id="118" w:name="core-rules-tier-1-and-up"/>
     <w:p>
       <w:pPr>
         <w:pStyle w:val="Heading3"/>
@@ -27443,8 +28049,8 @@
         <w:t xml:space="preserve">One to three short rules that always apply: what they can do (see in the dark, resist cold, a free Trained skill) and what it costs (a weakness, a people’s distrust, a hazard they can’t abide). A strength with no drawback is worth more than it looks, so price it a tier higher.</w:t>
       </w:r>
     </w:p>
-    <w:bookmarkEnd w:id="117"/>
-    <w:bookmarkStart w:id="118" w:name="heritage-advantages"/>
+    <w:bookmarkEnd w:id="118"/>
+    <w:bookmarkStart w:id="119" w:name="heritage-advantages"/>
     <w:p>
       <w:pPr>
         <w:pStyle w:val="Heading3"/>
@@ -27499,8 +28105,8 @@
         <w:t xml:space="preserve">: a problem the trait causes, with a clear trigger and a real consequence, which earns a Grit point when it bites, like any complication. A character takes one advantage, general or heritage, so make them distinct choices.</w:t>
       </w:r>
     </w:p>
-    <w:bookmarkEnd w:id="118"/>
-    <w:bookmarkStart w:id="119" w:name="a-woge-optional-tier-2-or-3"/>
+    <w:bookmarkEnd w:id="119"/>
+    <w:bookmarkStart w:id="120" w:name="a-woge-optional-tier-2-or-3"/>
     <w:p>
       <w:pPr>
         <w:pStyle w:val="Heading3"/>
@@ -27533,8 +28139,8 @@
         <w:t xml:space="preserve">apply.</w:t>
       </w:r>
     </w:p>
-    <w:bookmarkEnd w:id="119"/>
-    <w:bookmarkStart w:id="120" w:name="in-the-creator"/>
+    <w:bookmarkEnd w:id="120"/>
+    <w:bookmarkStart w:id="121" w:name="in-the-creator"/>
     <w:p>
       <w:pPr>
         <w:pStyle w:val="Heading3"/>
@@ -27547,7 +28153,7 @@
       <w:pPr>
         <w:numPr>
           <w:ilvl w:val="0"/>
-          <w:numId w:val="1037"/>
+          <w:numId w:val="1038"/>
         </w:numPr>
         <w:pStyle w:val="Compact"/>
       </w:pPr>
@@ -27575,7 +28181,7 @@
       <w:pPr>
         <w:numPr>
           <w:ilvl w:val="0"/>
-          <w:numId w:val="1037"/>
+          <w:numId w:val="1038"/>
         </w:numPr>
         <w:pStyle w:val="Compact"/>
       </w:pPr>
@@ -27587,7 +28193,7 @@
       <w:pPr>
         <w:numPr>
           <w:ilvl w:val="0"/>
-          <w:numId w:val="1037"/>
+          <w:numId w:val="1038"/>
         </w:numPr>
         <w:pStyle w:val="Compact"/>
       </w:pPr>
@@ -27615,7 +28221,7 @@
       <w:pPr>
         <w:numPr>
           <w:ilvl w:val="0"/>
-          <w:numId w:val="1037"/>
+          <w:numId w:val="1038"/>
         </w:numPr>
         <w:pStyle w:val="Compact"/>
       </w:pPr>
@@ -27639,8 +28245,8 @@
         <w:t xml:space="preserve">and enter the advantage and its companion complication.</w:t>
       </w:r>
     </w:p>
-    <w:bookmarkEnd w:id="120"/>
-    <w:bookmarkStart w:id="121" w:name="example"/>
+    <w:bookmarkEnd w:id="121"/>
+    <w:bookmarkStart w:id="122" w:name="example"/>
     <w:p>
       <w:pPr>
         <w:pStyle w:val="Heading3"/>
@@ -27745,10 +28351,10 @@
         <w:t xml:space="preserve">: Wesen recognize their own, and some want you back in the fold; accept the visit at the worst time.</w:t>
       </w:r>
     </w:p>
-    <w:bookmarkEnd w:id="121"/>
     <w:bookmarkEnd w:id="122"/>
     <w:bookmarkEnd w:id="123"/>
-    <w:bookmarkStart w:id="124" w:name="complications"/>
+    <w:bookmarkEnd w:id="124"/>
+    <w:bookmarkStart w:id="125" w:name="complications"/>
     <w:p>
       <w:pPr>
         <w:pStyle w:val="Heading1"/>
@@ -28552,8 +29158,8 @@
         </w:tc>
       </w:tr>
     </w:tbl>
-    <w:bookmarkEnd w:id="124"/>
-    <w:bookmarkStart w:id="125" w:name="quick-reference"/>
+    <w:bookmarkEnd w:id="125"/>
+    <w:bookmarkStart w:id="126" w:name="quick-reference"/>
     <w:p>
       <w:pPr>
         <w:pStyle w:val="Heading1"/>
@@ -28649,7 +29255,7 @@
         <w:t xml:space="preserve"> </w:t>
       </w:r>
       <w:r>
-        <w:t xml:space="preserve">move plus one action. Hit → optional Dodge → weapon effect. Dodge = Agility −2 plus Athletics training (+0, +1, +2).</w:t>
+        <w:t xml:space="preserve">move plus one action. Hit → one defense a round (Dodge, Parry or Block; −1 to −3 against a clean hit) → weapon effect. Dodge = Agility −2 plus Athletics training (+0, +1, +2). Telling hit (by 5+ or natural 3–4): the attacker picks an effect; called shot −2 (small target −4).</w:t>
       </w:r>
     </w:p>
     <w:p>
@@ -28757,10 +29363,10 @@
         <w:t xml:space="preserve"> </w:t>
       </w:r>
       <w:r>
-        <w:t xml:space="preserve">start each session with two (three with True grit). Reroll, reduce an injury by one box, or establish a small preparation. Earn one from an accepted complication.</w:t>
-      </w:r>
-    </w:p>
-    <w:bookmarkEnd w:id="125"/>
+        <w:t xml:space="preserve">start each session with two (three with True grit). Reroll, reduce an injury by one box, shrug off a telling hit, or establish a small preparation. Earn one from an accepted complication.</w:t>
+      </w:r>
+    </w:p>
+    <w:bookmarkEnd w:id="126"/>
     <w:sectPr/>
   </w:body>
 </w:document>
@@ -29161,6 +29767,9 @@
     <w:abstractNumId w:val="991"/>
   </w:num>
   <w:num w:numId="1017">
+    <w:abstractNumId w:val="991"/>
+  </w:num>
+  <w:num w:numId="1018">
     <w:abstractNumId w:val="99411"/>
     <w:lvlOverride w:ilvl="0">
       <w:startOverride w:val="1"/>
@@ -29189,9 +29798,6 @@
     <w:lvlOverride w:ilvl="8">
       <w:startOverride w:val="1"/>
     </w:lvlOverride>
-  </w:num>
-  <w:num w:numId="1018">
-    <w:abstractNumId w:val="991"/>
   </w:num>
   <w:num w:numId="1019">
     <w:abstractNumId w:val="991"/>
@@ -29245,6 +29851,9 @@
     <w:abstractNumId w:val="991"/>
   </w:num>
   <w:num w:numId="1036">
+    <w:abstractNumId w:val="991"/>
+  </w:num>
+  <w:num w:numId="1037">
     <w:abstractNumId w:val="99411"/>
     <w:lvlOverride w:ilvl="0">
       <w:startOverride w:val="1"/>
@@ -29274,7 +29883,7 @@
       <w:startOverride w:val="1"/>
     </w:lvlOverride>
   </w:num>
-  <w:num w:numId="1037">
+  <w:num w:numId="1038">
     <w:abstractNumId w:val="99411"/>
     <w:lvlOverride w:ilvl="0">
       <w:startOverride w:val="1"/>

</xml_diff>

<commit_message>
Grimm: rest takes longer the worse you're hurt
A day at 1 box, at least three days at 2, a week at 3 in someone's care.
Quick to Heal and the Heals fast woge trait clear a box a day at any level.

Co-Authored-By: Claude Opus 5.5 <noreply@anthropic.com>
Claude-Session: https://claude.ai/code/session_015SADCFzhKijkC2foUmXrpC
</commit_message>
<xml_diff>
--- a/grimm-west/Grimm_Players_Guide.docx
+++ b/grimm-west/Grimm_Players_Guide.docx
@@ -11436,23 +11436,175 @@
         <w:pStyle w:val="FirstParagraph"/>
       </w:pPr>
       <w:r>
-        <w:t xml:space="preserve">Each</w:t>
-      </w:r>
-      <w:r>
-        <w:t xml:space="preserve"> </w:t>
-      </w:r>
-      <w:r>
-        <w:rPr>
-          <w:bCs/>
-          <w:b/>
-        </w:rPr>
-        <w:t xml:space="preserve">two full days of rest</w:t>
-      </w:r>
-      <w:r>
-        <w:t xml:space="preserve"> </w:t>
-      </w:r>
-      <w:r>
-        <w:t xml:space="preserve">clear one injury box. Rest means no riding, no fighting, nothing strenuous. At three boxes, rest alone clears nothing: treatment must clear the first box.</w:t>
+        <w:t xml:space="preserve">Rest clears injury one box at a time, and the worse you’re hurt, the longer each box takes. Rest means no riding, no fighting, nothing strenuous.</w:t>
+      </w:r>
+    </w:p>
+    <w:tbl>
+      <w:tblPr>
+        <w:tblStyle w:val="Table"/>
+        <w:tblW w:type="auto" w:w="0"/>
+        <w:tblLook w:firstRow="1" w:lastRow="0" w:firstColumn="0" w:lastColumn="0" w:noHBand="0" w:noVBand="0" w:val="0020"/>
+        <w:jc w:val="start"/>
+        <w:tblBorders>
+          <w:top w:val="single" w:sz="4" w:color="B8C2D3"/>
+          <w:left w:val="single" w:sz="4" w:color="B8C2D3"/>
+          <w:bottom w:val="single" w:sz="4" w:color="B8C2D3"/>
+          <w:right w:val="single" w:sz="4" w:color="B8C2D3"/>
+          <w:insideH w:val="single" w:sz="4" w:color="B8C2D3"/>
+          <w:insideV w:val="single" w:sz="4" w:color="B8C2D3"/>
+        </w:tblBorders>
+      </w:tblPr>
+      <w:tblGrid>
+        <w:gridCol w:w="3960"/>
+        <w:gridCol w:w="3960"/>
+      </w:tblGrid>
+      <w:tr>
+        <w:trPr>
+          <w:tblHeader w:val="true"/>
+        </w:trPr>
+        <w:tc>
+          <w:tcPr>
+            <w:shd w:val="clear" w:fill="F1E6D2"/>
+          </w:tcPr>
+          <w:p>
+            <w:pPr>
+              <w:pStyle w:val="Compact"/>
+              <w:jc w:val="left"/>
+            </w:pPr>
+            <w:r>
+              <w:rPr>
+                <w:b/>
+                <w:sz w:val="19"/>
+              </w:rPr>
+              <w:t xml:space="preserve">Boxes marked</w:t>
+            </w:r>
+          </w:p>
+        </w:tc>
+        <w:tc>
+          <w:tcPr>
+            <w:shd w:val="clear" w:fill="F1E6D2"/>
+          </w:tcPr>
+          <w:p>
+            <w:pPr>
+              <w:pStyle w:val="Compact"/>
+              <w:jc w:val="left"/>
+            </w:pPr>
+            <w:r>
+              <w:rPr>
+                <w:b/>
+                <w:sz w:val="19"/>
+              </w:rPr>
+              <w:t xml:space="preserve">Rest to clear one box</w:t>
+            </w:r>
+          </w:p>
+        </w:tc>
+      </w:tr>
+      <w:tr>
+        <w:tc>
+          <w:tcPr/>
+          <w:p>
+            <w:pPr>
+              <w:pStyle w:val="Compact"/>
+              <w:jc w:val="left"/>
+            </w:pPr>
+            <w:r>
+              <w:rPr>
+                <w:b/>
+                <w:sz w:val="19"/>
+              </w:rPr>
+              <w:t xml:space="preserve">1</w:t>
+            </w:r>
+          </w:p>
+        </w:tc>
+        <w:tc>
+          <w:tcPr/>
+          <w:p>
+            <w:pPr>
+              <w:pStyle w:val="Compact"/>
+              <w:jc w:val="left"/>
+            </w:pPr>
+            <w:r>
+              <w:rPr>
+                <w:sz w:val="19"/>
+              </w:rPr>
+              <w:t xml:space="preserve">A full day</w:t>
+            </w:r>
+          </w:p>
+        </w:tc>
+      </w:tr>
+      <w:tr>
+        <w:tc>
+          <w:tcPr/>
+          <w:p>
+            <w:pPr>
+              <w:pStyle w:val="Compact"/>
+              <w:jc w:val="left"/>
+            </w:pPr>
+            <w:r>
+              <w:rPr>
+                <w:b/>
+                <w:sz w:val="19"/>
+              </w:rPr>
+              <w:t xml:space="preserve">2</w:t>
+            </w:r>
+          </w:p>
+        </w:tc>
+        <w:tc>
+          <w:tcPr/>
+          <w:p>
+            <w:pPr>
+              <w:pStyle w:val="Compact"/>
+              <w:jc w:val="left"/>
+            </w:pPr>
+            <w:r>
+              <w:rPr>
+                <w:sz w:val="19"/>
+              </w:rPr>
+              <w:t xml:space="preserve">At least three days</w:t>
+            </w:r>
+          </w:p>
+        </w:tc>
+      </w:tr>
+      <w:tr>
+        <w:tc>
+          <w:tcPr/>
+          <w:p>
+            <w:pPr>
+              <w:pStyle w:val="Compact"/>
+              <w:jc w:val="left"/>
+            </w:pPr>
+            <w:r>
+              <w:rPr>
+                <w:b/>
+                <w:sz w:val="19"/>
+              </w:rPr>
+              <w:t xml:space="preserve">3</w:t>
+            </w:r>
+          </w:p>
+        </w:tc>
+        <w:tc>
+          <w:tcPr/>
+          <w:p>
+            <w:pPr>
+              <w:pStyle w:val="Compact"/>
+              <w:jc w:val="left"/>
+            </w:pPr>
+            <w:r>
+              <w:rPr>
+                <w:sz w:val="19"/>
+              </w:rPr>
+              <w:t xml:space="preserve">A week, and only in someone’s care</w:t>
+            </w:r>
+          </w:p>
+        </w:tc>
+      </w:tr>
+    </w:tbl>
+    <w:p>
+      <w:pPr>
+        <w:pStyle w:val="BodyText"/>
+      </w:pPr>
+      <w:r>
+        <w:t xml:space="preserve">At three boxes, rest alone does nothing until someone has stabilized or treated you; after that, a week of rest in their care clears the first box. A doctor’s treatment is faster. The times add up: from three boxes, rest alone takes about a week and a half to heal completely (a week, then three days, then a day).</w:t>
       </w:r>
     </w:p>
     <w:bookmarkEnd w:id="73"/>
@@ -23767,7 +23919,7 @@
               <w:rPr>
                 <w:sz w:val="19"/>
               </w:rPr>
-              <w:t xml:space="preserve">Ability: rest clears a box every day, not every two, and works even at three boxes.</w:t>
+              <w:t xml:space="preserve">Ability: each day of rest clears a box, however hurt you are, and rest works at three boxes even with nobody tending you.</w:t>
             </w:r>
           </w:p>
         </w:tc>
@@ -25603,7 +25755,7 @@
         <w:t xml:space="preserve"> </w:t>
       </w:r>
       <w:r>
-        <w:t xml:space="preserve">Body +2; Huge strength: fists and fangs mark 2 boxes; Tough: hits of 2+ boxes mark one fewer; Feels no pain: ignore the Wounded penalty; Heals fast: rest clears a box every day; Dark sight.</w:t>
+        <w:t xml:space="preserve">Body +2; Huge strength: fists and fangs mark 2 boxes; Tough: hits of 2+ boxes mark one fewer; Feels no pain: ignore the Wounded penalty; Heals fast: each day of rest clears a box, however hurt you are; Dark sight.</w:t>
       </w:r>
     </w:p>
     <w:p>
@@ -29309,7 +29461,7 @@
         <w:t xml:space="preserve"> </w:t>
       </w:r>
       <w:r>
-        <w:t xml:space="preserve">stabilize in one action. Field care clears 1 box (2 on margin 5+). A surgery gives +2 and clears 2 (3 on margin 5+). Rest: one box per two days, not from three.</w:t>
+        <w:t xml:space="preserve">stabilize in one action. Field care clears 1 box (2 on margin 5+). A surgery gives +2 and clears 2 (3 on margin 5+). Rest clears a box in a day at 1 box, three days at 2, a week at 3 (in someone’s care).</w:t>
       </w:r>
     </w:p>
     <w:p>

</xml_diff>

<commit_message>
Grimm: gritty combat as an optional campaign rule
A switch on the Condition card and in the GM view (carried in the posse
file). With it on, a 2+ box hit by 7+, a natural 3-4 or one that leaves you
Dying is grievous: characters roll the 3d6 table (lost limb, lost eye,
broken bone, torn muscle, concussion, internal injury) and can downgrade it
with Grit; a Dying character can trade a limb for their life; lasting
wounds are tracked and printed. The roller flags grievous hits and the GM
view describes opponents taken out.

Co-Authored-By: Claude Opus 5.5 <noreply@anthropic.com>
Claude-Session: https://claude.ai/code/session_015SADCFzhKijkC2foUmXrpC
</commit_message>
<xml_diff>
--- a/grimm-west/Grimm_Players_Guide.docx
+++ b/grimm-west/Grimm_Players_Guide.docx
@@ -8024,7 +8024,7 @@
     </w:p>
     <w:bookmarkEnd w:id="58"/>
     <w:bookmarkEnd w:id="59"/>
-    <w:bookmarkStart w:id="68" w:name="personal-combat"/>
+    <w:bookmarkStart w:id="69" w:name="personal-combat"/>
     <w:p>
       <w:pPr>
         <w:pStyle w:val="Heading1"/>
@@ -9168,7 +9168,7 @@
       </w:r>
     </w:p>
     <w:bookmarkEnd w:id="63"/>
-    <w:bookmarkStart w:id="65" w:name="injury"/>
+    <w:bookmarkStart w:id="66" w:name="injury"/>
     <w:p>
       <w:pPr>
         <w:pStyle w:val="Heading2"/>
@@ -9570,14 +9570,13 @@
       </w:r>
     </w:p>
     <w:bookmarkEnd w:id="64"/>
-    <w:bookmarkEnd w:id="65"/>
-    <w:bookmarkStart w:id="66" w:name="weapons-and-damage"/>
-    <w:p>
-      <w:pPr>
-        <w:pStyle w:val="Heading2"/>
-      </w:pPr>
-      <w:r>
-        <w:t xml:space="preserve">Weapons and damage</w:t>
+    <w:bookmarkStart w:id="65" w:name="optional-rule-gritty-combat"/>
+    <w:p>
+      <w:pPr>
+        <w:pStyle w:val="Heading3"/>
+      </w:pPr>
+      <w:r>
+        <w:t xml:space="preserve">Optional rule: gritty combat</w:t>
       </w:r>
     </w:p>
     <w:p>
@@ -9585,20 +9584,178 @@
         <w:pStyle w:val="FirstParagraph"/>
       </w:pPr>
       <w:r>
-        <w:t xml:space="preserve">How many boxes a hit marks depends on the</w:t>
-      </w:r>
-      <w:r>
-        <w:t xml:space="preserve"> </w:t>
-      </w:r>
-      <w:r>
-        <w:rPr>
-          <w:bCs/>
-          <w:b/>
-        </w:rPr>
-        <w:t xml:space="preserve">weapon</w:t>
-      </w:r>
-      <w:r>
-        <w:t xml:space="preserve">, not on how well the attack succeeded.</w:t>
+        <w:t xml:space="preserve">For a harder, bloodier game, the GM can turn on</w:t>
+      </w:r>
+      <w:r>
+        <w:t xml:space="preserve"> </w:t>
+      </w:r>
+      <w:r>
+        <w:rPr>
+          <w:bCs/>
+          <w:b/>
+        </w:rPr>
+        <w:t xml:space="preserve">gritty combat</w:t>
+      </w:r>
+      <w:r>
+        <w:t xml:space="preserve"> </w:t>
+      </w:r>
+      <w:r>
+        <w:t xml:space="preserve">for the campaign (the creator has a switch on the Condition card and in the GM view). The rest of the rules stay the same.</w:t>
+      </w:r>
+    </w:p>
+    <w:p>
+      <w:pPr>
+        <w:pStyle w:val="BodyText"/>
+      </w:pPr>
+      <w:r>
+        <w:rPr>
+          <w:bCs/>
+          <w:b/>
+        </w:rPr>
+        <w:t xml:space="preserve">Grievous hits.</w:t>
+      </w:r>
+      <w:r>
+        <w:t xml:space="preserve"> </w:t>
+      </w:r>
+      <w:r>
+        <w:t xml:space="preserve">A hit that marks</w:t>
+      </w:r>
+      <w:r>
+        <w:t xml:space="preserve"> </w:t>
+      </w:r>
+      <w:r>
+        <w:rPr>
+          <w:bCs/>
+          <w:b/>
+        </w:rPr>
+        <w:t xml:space="preserve">2 or more boxes</w:t>
+      </w:r>
+      <w:r>
+        <w:t xml:space="preserve"> </w:t>
+      </w:r>
+      <w:r>
+        <w:t xml:space="preserve">is</w:t>
+      </w:r>
+      <w:r>
+        <w:t xml:space="preserve"> </w:t>
+      </w:r>
+      <w:r>
+        <w:rPr>
+          <w:bCs/>
+          <w:b/>
+        </w:rPr>
+        <w:t xml:space="preserve">grievous</w:t>
+      </w:r>
+      <w:r>
+        <w:t xml:space="preserve"> </w:t>
+      </w:r>
+      <w:r>
+        <w:t xml:space="preserve">when the attack succeeded by</w:t>
+      </w:r>
+      <w:r>
+        <w:t xml:space="preserve"> </w:t>
+      </w:r>
+      <w:r>
+        <w:rPr>
+          <w:bCs/>
+          <w:b/>
+        </w:rPr>
+        <w:t xml:space="preserve">7 or more</w:t>
+      </w:r>
+      <w:r>
+        <w:t xml:space="preserve">, rolled a</w:t>
+      </w:r>
+      <w:r>
+        <w:t xml:space="preserve"> </w:t>
+      </w:r>
+      <w:r>
+        <w:rPr>
+          <w:bCs/>
+          <w:b/>
+        </w:rPr>
+        <w:t xml:space="preserve">natural 3 or 4</w:t>
+      </w:r>
+      <w:r>
+        <w:t xml:space="preserve">, or left the target</w:t>
+      </w:r>
+      <w:r>
+        <w:t xml:space="preserve"> </w:t>
+      </w:r>
+      <w:r>
+        <w:rPr>
+          <w:bCs/>
+          <w:b/>
+        </w:rPr>
+        <w:t xml:space="preserve">Dying</w:t>
+      </w:r>
+      <w:r>
+        <w:t xml:space="preserve">.</w:t>
+      </w:r>
+    </w:p>
+    <w:p>
+      <w:pPr>
+        <w:numPr>
+          <w:ilvl w:val="0"/>
+          <w:numId w:val="1016"/>
+        </w:numPr>
+        <w:pStyle w:val="Compact"/>
+      </w:pPr>
+      <w:r>
+        <w:rPr>
+          <w:bCs/>
+          <w:b/>
+        </w:rPr>
+        <w:t xml:space="preserve">A character</w:t>
+      </w:r>
+      <w:r>
+        <w:t xml:space="preserve"> </w:t>
+      </w:r>
+      <w:r>
+        <w:t xml:space="preserve">rolls 3d6 on the table below and suffers the result on top of the boxes.</w:t>
+      </w:r>
+    </w:p>
+    <w:p>
+      <w:pPr>
+        <w:numPr>
+          <w:ilvl w:val="0"/>
+          <w:numId w:val="1016"/>
+        </w:numPr>
+        <w:pStyle w:val="Compact"/>
+      </w:pPr>
+      <w:r>
+        <w:rPr>
+          <w:bCs/>
+          <w:b/>
+        </w:rPr>
+        <w:t xml:space="preserve">An opponent</w:t>
+      </w:r>
+      <w:r>
+        <w:t xml:space="preserve"> </w:t>
+      </w:r>
+      <w:r>
+        <w:t xml:space="preserve">is simply taken out: no roll, no boxes to count. Describe how, or let the GM view roll a description.</w:t>
+      </w:r>
+    </w:p>
+    <w:p>
+      <w:pPr>
+        <w:numPr>
+          <w:ilvl w:val="0"/>
+          <w:numId w:val="1016"/>
+        </w:numPr>
+        <w:pStyle w:val="Compact"/>
+      </w:pPr>
+      <w:r>
+        <w:rPr>
+          <w:bCs/>
+          <w:b/>
+        </w:rPr>
+        <w:t xml:space="preserve">With a telling hit,</w:t>
+      </w:r>
+      <w:r>
+        <w:t xml:space="preserve"> </w:t>
+      </w:r>
+      <w:r>
+        <w:t xml:space="preserve">the attacker also chooses which limb.</w:t>
       </w:r>
     </w:p>
     <w:tbl>
@@ -9640,7 +9797,7 @@
                 <w:b/>
                 <w:sz w:val="19"/>
               </w:rPr>
-              <w:t xml:space="preserve">Weapon</w:t>
+              <w:t xml:space="preserve">3d6</w:t>
             </w:r>
           </w:p>
         </w:tc>
@@ -9658,7 +9815,7 @@
                 <w:b/>
                 <w:sz w:val="19"/>
               </w:rPr>
-              <w:t xml:space="preserve">Range</w:t>
+              <w:t xml:space="preserve">Grievous wound</w:t>
             </w:r>
           </w:p>
         </w:tc>
@@ -9676,7 +9833,7 @@
                 <w:b/>
                 <w:sz w:val="19"/>
               </w:rPr>
-              <w:t xml:space="preserve">Boxes on a hit</w:t>
+              <w:t xml:space="preserve">Effect</w:t>
             </w:r>
           </w:p>
         </w:tc>
@@ -9694,6 +9851,610 @@
                 <w:b/>
                 <w:sz w:val="19"/>
               </w:rPr>
+              <w:t xml:space="preserve">Heals</w:t>
+            </w:r>
+          </w:p>
+        </w:tc>
+      </w:tr>
+      <w:tr>
+        <w:tc>
+          <w:tcPr/>
+          <w:p>
+            <w:pPr>
+              <w:pStyle w:val="Compact"/>
+              <w:jc w:val="left"/>
+            </w:pPr>
+            <w:r>
+              <w:rPr>
+                <w:b/>
+                <w:sz w:val="19"/>
+              </w:rPr>
+              <w:t xml:space="preserve">3–4</w:t>
+            </w:r>
+          </w:p>
+        </w:tc>
+        <w:tc>
+          <w:tcPr/>
+          <w:p>
+            <w:pPr>
+              <w:pStyle w:val="Compact"/>
+              <w:jc w:val="left"/>
+            </w:pPr>
+            <w:r>
+              <w:rPr>
+                <w:sz w:val="19"/>
+              </w:rPr>
+              <w:t xml:space="preserve">Lost limb</w:t>
+            </w:r>
+          </w:p>
+        </w:tc>
+        <w:tc>
+          <w:tcPr/>
+          <w:p>
+            <w:pPr>
+              <w:pStyle w:val="Compact"/>
+              <w:jc w:val="left"/>
+            </w:pPr>
+            <w:r>
+              <w:rPr>
+                <w:sz w:val="19"/>
+              </w:rPr>
+              <w:t xml:space="preserve">A hand, an arm or a leg is gone; the GM says which. −4 to tasks that need it, or impossible. Dying unless someone stops the bleeding.</w:t>
+            </w:r>
+          </w:p>
+        </w:tc>
+        <w:tc>
+          <w:tcPr/>
+          <w:p>
+            <w:pPr>
+              <w:pStyle w:val="Compact"/>
+              <w:jc w:val="left"/>
+            </w:pPr>
+            <w:r>
+              <w:rPr>
+                <w:sz w:val="19"/>
+              </w:rPr>
+              <w:t xml:space="preserve">Never: a complication</w:t>
+            </w:r>
+          </w:p>
+        </w:tc>
+      </w:tr>
+      <w:tr>
+        <w:tc>
+          <w:tcPr/>
+          <w:p>
+            <w:pPr>
+              <w:pStyle w:val="Compact"/>
+              <w:jc w:val="left"/>
+            </w:pPr>
+            <w:r>
+              <w:rPr>
+                <w:b/>
+                <w:sz w:val="19"/>
+              </w:rPr>
+              <w:t xml:space="preserve">5–6</w:t>
+            </w:r>
+          </w:p>
+        </w:tc>
+        <w:tc>
+          <w:tcPr/>
+          <w:p>
+            <w:pPr>
+              <w:pStyle w:val="Compact"/>
+              <w:jc w:val="left"/>
+            </w:pPr>
+            <w:r>
+              <w:rPr>
+                <w:sz w:val="19"/>
+              </w:rPr>
+              <w:t xml:space="preserve">Lost eye</w:t>
+            </w:r>
+          </w:p>
+        </w:tc>
+        <w:tc>
+          <w:tcPr/>
+          <w:p>
+            <w:pPr>
+              <w:pStyle w:val="Compact"/>
+              <w:jc w:val="left"/>
+            </w:pPr>
+            <w:r>
+              <w:rPr>
+                <w:sz w:val="19"/>
+              </w:rPr>
+              <w:t xml:space="preserve">−2 to Shooting and to spotting things.</w:t>
+            </w:r>
+          </w:p>
+        </w:tc>
+        <w:tc>
+          <w:tcPr/>
+          <w:p>
+            <w:pPr>
+              <w:pStyle w:val="Compact"/>
+              <w:jc w:val="left"/>
+            </w:pPr>
+            <w:r>
+              <w:rPr>
+                <w:sz w:val="19"/>
+              </w:rPr>
+              <w:t xml:space="preserve">Never: a complication</w:t>
+            </w:r>
+          </w:p>
+        </w:tc>
+      </w:tr>
+      <w:tr>
+        <w:tc>
+          <w:tcPr/>
+          <w:p>
+            <w:pPr>
+              <w:pStyle w:val="Compact"/>
+              <w:jc w:val="left"/>
+            </w:pPr>
+            <w:r>
+              <w:rPr>
+                <w:b/>
+                <w:sz w:val="19"/>
+              </w:rPr>
+              <w:t xml:space="preserve">7–9</w:t>
+            </w:r>
+          </w:p>
+        </w:tc>
+        <w:tc>
+          <w:tcPr/>
+          <w:p>
+            <w:pPr>
+              <w:pStyle w:val="Compact"/>
+              <w:jc w:val="left"/>
+            </w:pPr>
+            <w:r>
+              <w:rPr>
+                <w:sz w:val="19"/>
+              </w:rPr>
+              <w:t xml:space="preserve">Broken bone</w:t>
+            </w:r>
+          </w:p>
+        </w:tc>
+        <w:tc>
+          <w:tcPr/>
+          <w:p>
+            <w:pPr>
+              <w:pStyle w:val="Compact"/>
+              <w:jc w:val="left"/>
+            </w:pPr>
+            <w:r>
+              <w:rPr>
+                <w:sz w:val="19"/>
+              </w:rPr>
+              <w:t xml:space="preserve">The limb is useless until it’s set with proper care.</w:t>
+            </w:r>
+          </w:p>
+        </w:tc>
+        <w:tc>
+          <w:tcPr/>
+          <w:p>
+            <w:pPr>
+              <w:pStyle w:val="Compact"/>
+              <w:jc w:val="left"/>
+            </w:pPr>
+            <w:r>
+              <w:rPr>
+                <w:sz w:val="19"/>
+              </w:rPr>
+              <w:t xml:space="preserve">Several weeks</w:t>
+            </w:r>
+          </w:p>
+        </w:tc>
+      </w:tr>
+      <w:tr>
+        <w:tc>
+          <w:tcPr/>
+          <w:p>
+            <w:pPr>
+              <w:pStyle w:val="Compact"/>
+              <w:jc w:val="left"/>
+            </w:pPr>
+            <w:r>
+              <w:rPr>
+                <w:b/>
+                <w:sz w:val="19"/>
+              </w:rPr>
+              <w:t xml:space="preserve">10–12</w:t>
+            </w:r>
+          </w:p>
+        </w:tc>
+        <w:tc>
+          <w:tcPr/>
+          <w:p>
+            <w:pPr>
+              <w:pStyle w:val="Compact"/>
+              <w:jc w:val="left"/>
+            </w:pPr>
+            <w:r>
+              <w:rPr>
+                <w:sz w:val="19"/>
+              </w:rPr>
+              <w:t xml:space="preserve">Torn muscle</w:t>
+            </w:r>
+          </w:p>
+        </w:tc>
+        <w:tc>
+          <w:tcPr/>
+          <w:p>
+            <w:pPr>
+              <w:pStyle w:val="Compact"/>
+              <w:jc w:val="left"/>
+            </w:pPr>
+            <w:r>
+              <w:rPr>
+                <w:sz w:val="19"/>
+              </w:rPr>
+              <w:t xml:space="preserve">−1 to physical tasks.</w:t>
+            </w:r>
+          </w:p>
+        </w:tc>
+        <w:tc>
+          <w:tcPr/>
+          <w:p>
+            <w:pPr>
+              <w:pStyle w:val="Compact"/>
+              <w:jc w:val="left"/>
+            </w:pPr>
+            <w:r>
+              <w:rPr>
+                <w:sz w:val="19"/>
+              </w:rPr>
+              <w:t xml:space="preserve">Several weeks</w:t>
+            </w:r>
+          </w:p>
+        </w:tc>
+      </w:tr>
+      <w:tr>
+        <w:tc>
+          <w:tcPr/>
+          <w:p>
+            <w:pPr>
+              <w:pStyle w:val="Compact"/>
+              <w:jc w:val="left"/>
+            </w:pPr>
+            <w:r>
+              <w:rPr>
+                <w:b/>
+                <w:sz w:val="19"/>
+              </w:rPr>
+              <w:t xml:space="preserve">13–15</w:t>
+            </w:r>
+          </w:p>
+        </w:tc>
+        <w:tc>
+          <w:tcPr/>
+          <w:p>
+            <w:pPr>
+              <w:pStyle w:val="Compact"/>
+              <w:jc w:val="left"/>
+            </w:pPr>
+            <w:r>
+              <w:rPr>
+                <w:sz w:val="19"/>
+              </w:rPr>
+              <w:t xml:space="preserve">Concussion</w:t>
+            </w:r>
+          </w:p>
+        </w:tc>
+        <w:tc>
+          <w:tcPr/>
+          <w:p>
+            <w:pPr>
+              <w:pStyle w:val="Compact"/>
+              <w:jc w:val="left"/>
+            </w:pPr>
+            <w:r>
+              <w:rPr>
+                <w:sz w:val="19"/>
+              </w:rPr>
+              <w:t xml:space="preserve">Dazed, and −2 to thinking tasks for the scene.</w:t>
+            </w:r>
+          </w:p>
+        </w:tc>
+        <w:tc>
+          <w:tcPr/>
+          <w:p>
+            <w:pPr>
+              <w:pStyle w:val="Compact"/>
+              <w:jc w:val="left"/>
+            </w:pPr>
+            <w:r>
+              <w:rPr>
+                <w:sz w:val="19"/>
+              </w:rPr>
+              <w:t xml:space="preserve">After the scene</w:t>
+            </w:r>
+          </w:p>
+        </w:tc>
+      </w:tr>
+      <w:tr>
+        <w:tc>
+          <w:tcPr/>
+          <w:p>
+            <w:pPr>
+              <w:pStyle w:val="Compact"/>
+              <w:jc w:val="left"/>
+            </w:pPr>
+            <w:r>
+              <w:rPr>
+                <w:b/>
+                <w:sz w:val="19"/>
+              </w:rPr>
+              <w:t xml:space="preserve">16–18</w:t>
+            </w:r>
+          </w:p>
+        </w:tc>
+        <w:tc>
+          <w:tcPr/>
+          <w:p>
+            <w:pPr>
+              <w:pStyle w:val="Compact"/>
+              <w:jc w:val="left"/>
+            </w:pPr>
+            <w:r>
+              <w:rPr>
+                <w:sz w:val="19"/>
+              </w:rPr>
+              <w:t xml:space="preserve">Internal injury</w:t>
+            </w:r>
+          </w:p>
+        </w:tc>
+        <w:tc>
+          <w:tcPr/>
+          <w:p>
+            <w:pPr>
+              <w:pStyle w:val="Compact"/>
+              <w:jc w:val="left"/>
+            </w:pPr>
+            <w:r>
+              <w:rPr>
+                <w:sz w:val="19"/>
+              </w:rPr>
+              <w:t xml:space="preserve">Dying even with boxes to spare; it needs a doctor.</w:t>
+            </w:r>
+          </w:p>
+        </w:tc>
+        <w:tc>
+          <w:tcPr/>
+          <w:p>
+            <w:pPr>
+              <w:pStyle w:val="Compact"/>
+              <w:jc w:val="left"/>
+            </w:pPr>
+            <w:r>
+              <w:rPr>
+                <w:sz w:val="19"/>
+              </w:rPr>
+              <w:t xml:space="preserve">Several weeks after surgery</w:t>
+            </w:r>
+          </w:p>
+        </w:tc>
+      </w:tr>
+    </w:tbl>
+    <w:p>
+      <w:pPr>
+        <w:numPr>
+          <w:ilvl w:val="0"/>
+          <w:numId w:val="1017"/>
+        </w:numPr>
+        <w:pStyle w:val="Compact"/>
+      </w:pPr>
+      <w:r>
+        <w:rPr>
+          <w:bCs/>
+          <w:b/>
+        </w:rPr>
+        <w:t xml:space="preserve">Grit.</w:t>
+      </w:r>
+      <w:r>
+        <w:t xml:space="preserve"> </w:t>
+      </w:r>
+      <w:r>
+        <w:t xml:space="preserve">Spend a Grit point to</w:t>
+      </w:r>
+      <w:r>
+        <w:t xml:space="preserve"> </w:t>
+      </w:r>
+      <w:r>
+        <w:rPr>
+          <w:bCs/>
+          <w:b/>
+        </w:rPr>
+        <w:t xml:space="preserve">downgrade</w:t>
+      </w:r>
+      <w:r>
+        <w:t xml:space="preserve"> </w:t>
+      </w:r>
+      <w:r>
+        <w:t xml:space="preserve">a grievous wound one step: a lost limb becomes a broken bone, a lost eye a concussion, a broken bone or an internal injury a torn muscle, and a torn muscle or a concussion nothing lasting.</w:t>
+      </w:r>
+    </w:p>
+    <w:p>
+      <w:pPr>
+        <w:numPr>
+          <w:ilvl w:val="0"/>
+          <w:numId w:val="1017"/>
+        </w:numPr>
+        <w:pStyle w:val="Compact"/>
+      </w:pPr>
+      <w:r>
+        <w:rPr>
+          <w:bCs/>
+          <w:b/>
+        </w:rPr>
+        <w:t xml:space="preserve">A limb for a life.</w:t>
+      </w:r>
+      <w:r>
+        <w:t xml:space="preserve"> </w:t>
+      </w:r>
+      <w:r>
+        <w:t xml:space="preserve">Once a fight, a character who would be left Dying or killed can</w:t>
+      </w:r>
+      <w:r>
+        <w:t xml:space="preserve"> </w:t>
+      </w:r>
+      <w:r>
+        <w:rPr>
+          <w:bCs/>
+          <w:b/>
+        </w:rPr>
+        <w:t xml:space="preserve">lose a limb, or the use of one</w:t>
+      </w:r>
+      <w:r>
+        <w:t xml:space="preserve">, instead. They live, Incapacitated but stable, and the limb becomes a complication. It replaces any grievous wound from the same hit.</w:t>
+      </w:r>
+    </w:p>
+    <w:p>
+      <w:pPr>
+        <w:numPr>
+          <w:ilvl w:val="0"/>
+          <w:numId w:val="1017"/>
+        </w:numPr>
+        <w:pStyle w:val="Compact"/>
+      </w:pPr>
+      <w:r>
+        <w:rPr>
+          <w:bCs/>
+          <w:b/>
+        </w:rPr>
+        <w:t xml:space="preserve">Healing.</w:t>
+      </w:r>
+      <w:r>
+        <w:t xml:space="preserve"> </w:t>
+      </w:r>
+      <w:r>
+        <w:t xml:space="preserve">Grievous wounds heal on their own clock, whatever the boxes say. A lost limb, a lost eye or a disfigurement never heals.</w:t>
+      </w:r>
+    </w:p>
+    <w:bookmarkEnd w:id="65"/>
+    <w:bookmarkEnd w:id="66"/>
+    <w:bookmarkStart w:id="67" w:name="weapons-and-damage"/>
+    <w:p>
+      <w:pPr>
+        <w:pStyle w:val="Heading2"/>
+      </w:pPr>
+      <w:r>
+        <w:t xml:space="preserve">Weapons and damage</w:t>
+      </w:r>
+    </w:p>
+    <w:p>
+      <w:pPr>
+        <w:pStyle w:val="FirstParagraph"/>
+      </w:pPr>
+      <w:r>
+        <w:t xml:space="preserve">How many boxes a hit marks depends on the</w:t>
+      </w:r>
+      <w:r>
+        <w:t xml:space="preserve"> </w:t>
+      </w:r>
+      <w:r>
+        <w:rPr>
+          <w:bCs/>
+          <w:b/>
+        </w:rPr>
+        <w:t xml:space="preserve">weapon</w:t>
+      </w:r>
+      <w:r>
+        <w:t xml:space="preserve">, not on how well the attack succeeded.</w:t>
+      </w:r>
+    </w:p>
+    <w:tbl>
+      <w:tblPr>
+        <w:tblStyle w:val="Table"/>
+        <w:tblW w:type="pct" w:w="5000"/>
+        <w:tblLook w:firstRow="1" w:lastRow="0" w:firstColumn="0" w:lastColumn="0" w:noHBand="0" w:noVBand="0" w:val="0020"/>
+        <w:jc w:val="start"/>
+        <w:tblBorders>
+          <w:top w:val="single" w:sz="4" w:color="B8C2D3"/>
+          <w:left w:val="single" w:sz="4" w:color="B8C2D3"/>
+          <w:bottom w:val="single" w:sz="4" w:color="B8C2D3"/>
+          <w:right w:val="single" w:sz="4" w:color="B8C2D3"/>
+          <w:insideH w:val="single" w:sz="4" w:color="B8C2D3"/>
+          <w:insideV w:val="single" w:sz="4" w:color="B8C2D3"/>
+        </w:tblBorders>
+      </w:tblPr>
+      <w:tblGrid>
+        <w:gridCol w:w="1980"/>
+        <w:gridCol w:w="1980"/>
+        <w:gridCol w:w="1980"/>
+        <w:gridCol w:w="1980"/>
+      </w:tblGrid>
+      <w:tr>
+        <w:trPr>
+          <w:tblHeader w:val="true"/>
+        </w:trPr>
+        <w:tc>
+          <w:tcPr>
+            <w:shd w:val="clear" w:fill="F1E6D2"/>
+          </w:tcPr>
+          <w:p>
+            <w:pPr>
+              <w:pStyle w:val="Compact"/>
+              <w:jc w:val="left"/>
+            </w:pPr>
+            <w:r>
+              <w:rPr>
+                <w:b/>
+                <w:sz w:val="19"/>
+              </w:rPr>
+              <w:t xml:space="preserve">Weapon</w:t>
+            </w:r>
+          </w:p>
+        </w:tc>
+        <w:tc>
+          <w:tcPr>
+            <w:shd w:val="clear" w:fill="F1E6D2"/>
+          </w:tcPr>
+          <w:p>
+            <w:pPr>
+              <w:pStyle w:val="Compact"/>
+              <w:jc w:val="left"/>
+            </w:pPr>
+            <w:r>
+              <w:rPr>
+                <w:b/>
+                <w:sz w:val="19"/>
+              </w:rPr>
+              <w:t xml:space="preserve">Range</w:t>
+            </w:r>
+          </w:p>
+        </w:tc>
+        <w:tc>
+          <w:tcPr>
+            <w:shd w:val="clear" w:fill="F1E6D2"/>
+          </w:tcPr>
+          <w:p>
+            <w:pPr>
+              <w:pStyle w:val="Compact"/>
+              <w:jc w:val="left"/>
+            </w:pPr>
+            <w:r>
+              <w:rPr>
+                <w:b/>
+                <w:sz w:val="19"/>
+              </w:rPr>
+              <w:t xml:space="preserve">Boxes on a hit</w:t>
+            </w:r>
+          </w:p>
+        </w:tc>
+        <w:tc>
+          <w:tcPr>
+            <w:shd w:val="clear" w:fill="F1E6D2"/>
+          </w:tcPr>
+          <w:p>
+            <w:pPr>
+              <w:pStyle w:val="Compact"/>
+              <w:jc w:val="left"/>
+            </w:pPr>
+            <w:r>
+              <w:rPr>
+                <w:b/>
+                <w:sz w:val="19"/>
+              </w:rPr>
               <w:t xml:space="preserve">What the injury looks like</w:t>
             </w:r>
           </w:p>
@@ -10744,8 +11505,8 @@
         <w:t xml:space="preserve">a Blutbad’s claws leave Deputy Ames Seriously wounded (two boxes). A revolver shot that gets through marks two more, but the track stops at three: Ames is Incapacitated and Dying, and a further 2-box hit would kill. Spending a Grit point on that revolver shot reduces it to one box, leaving Ames at three boxes but, because the hit only marked one, not Dying.</w:t>
       </w:r>
     </w:p>
-    <w:bookmarkEnd w:id="66"/>
-    <w:bookmarkStart w:id="67" w:name="guns-and-ammunition"/>
+    <w:bookmarkEnd w:id="67"/>
+    <w:bookmarkStart w:id="68" w:name="guns-and-ammunition"/>
     <w:p>
       <w:pPr>
         <w:pStyle w:val="Heading2"/>
@@ -11232,7 +11993,7 @@
       <w:pPr>
         <w:numPr>
           <w:ilvl w:val="0"/>
-          <w:numId w:val="1016"/>
+          <w:numId w:val="1018"/>
         </w:numPr>
         <w:pStyle w:val="Compact"/>
       </w:pPr>
@@ -11254,7 +12015,7 @@
       <w:pPr>
         <w:numPr>
           <w:ilvl w:val="0"/>
-          <w:numId w:val="1016"/>
+          <w:numId w:val="1018"/>
         </w:numPr>
         <w:pStyle w:val="Compact"/>
       </w:pPr>
@@ -11305,7 +12066,7 @@
       <w:pPr>
         <w:numPr>
           <w:ilvl w:val="0"/>
-          <w:numId w:val="1016"/>
+          <w:numId w:val="1018"/>
         </w:numPr>
         <w:pStyle w:val="Compact"/>
       </w:pPr>
@@ -11331,9 +12092,9 @@
         <w:t xml:space="preserve">To take someone down without killing them, use fists, a club, a grapple, or knock-out drops from an Apothecary.</w:t>
       </w:r>
     </w:p>
-    <w:bookmarkEnd w:id="67"/>
     <w:bookmarkEnd w:id="68"/>
-    <w:bookmarkStart w:id="74" w:name="medical-care"/>
+    <w:bookmarkEnd w:id="69"/>
+    <w:bookmarkStart w:id="75" w:name="medical-care"/>
     <w:p>
       <w:pPr>
         <w:pStyle w:val="Heading1"/>
@@ -11350,7 +12111,7 @@
         <w:t xml:space="preserve">Frontier medicine in 1889 has chloroform, carbolic acid, laudanum and steady hands, and not much else. Wesen heal like humans, and some injuries need remedies from older traditions.</w:t>
       </w:r>
     </w:p>
-    <w:bookmarkStart w:id="69" w:name="diagnosis-and-stabilization"/>
+    <w:bookmarkStart w:id="70" w:name="diagnosis-and-stabilization"/>
     <w:p>
       <w:pPr>
         <w:pStyle w:val="Heading2"/>
@@ -11367,8 +12128,8 @@
         <w:t xml:space="preserve">Roll Medicine when the diagnosis is uncertain or an urgent treatment decision matters. Emergency stabilization takes one action and a successful Medicine roll with a doctor’s bag. It ends Dying and stops deterioration, but removes no boxes.</w:t>
       </w:r>
     </w:p>
-    <w:bookmarkEnd w:id="69"/>
-    <w:bookmarkStart w:id="70" w:name="field-treatment"/>
+    <w:bookmarkEnd w:id="70"/>
+    <w:bookmarkStart w:id="71" w:name="field-treatment"/>
     <w:p>
       <w:pPr>
         <w:pStyle w:val="Heading2"/>
@@ -11385,8 +12146,8 @@
         <w:t xml:space="preserve">With a doctor’s bag and several uninterrupted minutes, successful Medicine removes one injury box; success by 5 or more removes two. Each injury receives one field-treatment attempt; further attempts need changed circumstances.</w:t>
       </w:r>
     </w:p>
-    <w:bookmarkEnd w:id="70"/>
-    <w:bookmarkStart w:id="71" w:name="a-doctors-surgery"/>
+    <w:bookmarkEnd w:id="71"/>
+    <w:bookmarkStart w:id="72" w:name="a-doctors-surgery"/>
     <w:p>
       <w:pPr>
         <w:pStyle w:val="Heading2"/>
@@ -11403,8 +12164,8 @@
         <w:t xml:space="preserve">A proper surgery with instruments, chloroform and a clean table grants +2 to Medicine. A successful treatment removes two boxes; success by 5 or more removes three. Allow the time the operation requires.</w:t>
       </w:r>
     </w:p>
-    <w:bookmarkEnd w:id="71"/>
-    <w:bookmarkStart w:id="72" w:name="remedies-and-poisons"/>
+    <w:bookmarkEnd w:id="72"/>
+    <w:bookmarkStart w:id="73" w:name="remedies-and-poisons"/>
     <w:p>
       <w:pPr>
         <w:pStyle w:val="Heading2"/>
@@ -11421,8 +12182,8 @@
         <w:t xml:space="preserve">Apothecary treats what Medicine can’t: Wesen poisons, curses, magical sickness and Wesen-specific ailments. Finding the right remedy usually means first identifying the cause (Wesen Lore or Occult), then brewing it (Apothecary, with an apothecary kit). A remedy can substitute for field treatment against such harm.</w:t>
       </w:r>
     </w:p>
-    <w:bookmarkEnd w:id="72"/>
-    <w:bookmarkStart w:id="73" w:name="natural-recovery"/>
+    <w:bookmarkEnd w:id="73"/>
+    <w:bookmarkStart w:id="74" w:name="natural-recovery"/>
     <w:p>
       <w:pPr>
         <w:pStyle w:val="Heading2"/>
@@ -11607,9 +12368,9 @@
         <w:t xml:space="preserve">At three boxes, rest alone does nothing until someone has stabilized or treated you; after that, a week of rest in their care clears the first box. A doctor’s treatment is faster. The times add up: from three boxes, rest alone takes about a week and a half to heal completely (a week, then three days, then a day).</w:t>
       </w:r>
     </w:p>
-    <w:bookmarkEnd w:id="73"/>
     <w:bookmarkEnd w:id="74"/>
-    <w:bookmarkStart w:id="79" w:name="grit-points-and-trouble"/>
+    <w:bookmarkEnd w:id="75"/>
+    <w:bookmarkStart w:id="80" w:name="grit-points-and-trouble"/>
     <w:p>
       <w:pPr>
         <w:pStyle w:val="Heading1"/>
@@ -11618,7 +12379,7 @@
         <w:t xml:space="preserve">Grit points and Trouble</w:t>
       </w:r>
     </w:p>
-    <w:bookmarkStart w:id="75" w:name="using-grit-points"/>
+    <w:bookmarkStart w:id="76" w:name="using-grit-points"/>
     <w:p>
       <w:pPr>
         <w:pStyle w:val="Heading2"/>
@@ -11836,8 +12597,8 @@
         <w:t xml:space="preserve">Gain one point when one of your complications creates a meaningful problem you accept, including a companion complication from a heritage advantage. You can decline the proposed complication without penalty.</w:t>
       </w:r>
     </w:p>
-    <w:bookmarkEnd w:id="75"/>
-    <w:bookmarkStart w:id="76" w:name="trouble"/>
+    <w:bookmarkEnd w:id="76"/>
+    <w:bookmarkStart w:id="77" w:name="trouble"/>
     <w:p>
       <w:pPr>
         <w:pStyle w:val="Heading2"/>
@@ -12138,8 +12899,8 @@
         <w:t xml:space="preserve">Lying low between cases, a good cover story (Deception), or doing the town a public good can clear a box per case.</w:t>
       </w:r>
     </w:p>
-    <w:bookmarkEnd w:id="76"/>
-    <w:bookmarkStart w:id="78" w:name="advancement"/>
+    <w:bookmarkEnd w:id="77"/>
+    <w:bookmarkStart w:id="79" w:name="advancement"/>
     <w:p>
       <w:pPr>
         <w:pStyle w:val="Heading2"/>
@@ -12176,7 +12937,7 @@
       <w:pPr>
         <w:numPr>
           <w:ilvl w:val="0"/>
-          <w:numId w:val="1017"/>
+          <w:numId w:val="1019"/>
         </w:numPr>
         <w:pStyle w:val="Compact"/>
       </w:pPr>
@@ -12237,7 +12998,7 @@
       <w:pPr>
         <w:numPr>
           <w:ilvl w:val="0"/>
-          <w:numId w:val="1017"/>
+          <w:numId w:val="1019"/>
         </w:numPr>
         <w:pStyle w:val="Compact"/>
       </w:pPr>
@@ -12583,7 +13344,7 @@
         <w:t xml:space="preserve">The creator keeps the ledger: award points in the advancement box under the skills (or from the GM journal), then spend them there.</w:t>
       </w:r>
     </w:p>
-    <w:bookmarkStart w:id="77" w:name="magic-advancement"/>
+    <w:bookmarkStart w:id="78" w:name="magic-advancement"/>
     <w:p>
       <w:pPr>
         <w:pStyle w:val="Heading3"/>
@@ -13077,10 +13838,10 @@
         </w:tc>
       </w:tr>
     </w:tbl>
-    <w:bookmarkEnd w:id="77"/>
     <w:bookmarkEnd w:id="78"/>
     <w:bookmarkEnd w:id="79"/>
-    <w:bookmarkStart w:id="82" w:name="running-cases"/>
+    <w:bookmarkEnd w:id="80"/>
+    <w:bookmarkStart w:id="83" w:name="running-cases"/>
     <w:p>
       <w:pPr>
         <w:pStyle w:val="Heading1"/>
@@ -13089,7 +13850,7 @@
         <w:t xml:space="preserve">Running cases</w:t>
       </w:r>
     </w:p>
-    <w:bookmarkStart w:id="80" w:name="case-seeds"/>
+    <w:bookmarkStart w:id="81" w:name="case-seeds"/>
     <w:p>
       <w:pPr>
         <w:pStyle w:val="Heading2"/>
@@ -15405,8 +16166,8 @@
         </w:tc>
       </w:tr>
     </w:tbl>
-    <w:bookmarkEnd w:id="80"/>
-    <w:bookmarkStart w:id="81" w:name="the-case-journal"/>
+    <w:bookmarkEnd w:id="81"/>
+    <w:bookmarkStart w:id="82" w:name="the-case-journal"/>
     <w:p>
       <w:pPr>
         <w:pStyle w:val="Heading2"/>
@@ -15421,358 +16182,6 @@
       </w:pPr>
       <w:r>
         <w:t xml:space="preserve">End each case with a short journal entry, written together, as the Grimms have always kept their books:</w:t>
-      </w:r>
-    </w:p>
-    <w:p>
-      <w:pPr>
-        <w:numPr>
-          <w:ilvl w:val="0"/>
-          <w:numId w:val="1018"/>
-        </w:numPr>
-        <w:pStyle w:val="Compact"/>
-      </w:pPr>
-      <w:r>
-        <w:rPr>
-          <w:bCs/>
-          <w:b/>
-        </w:rPr>
-        <w:t xml:space="preserve">The case.</w:t>
-      </w:r>
-      <w:r>
-        <w:t xml:space="preserve"> </w:t>
-      </w:r>
-      <w:r>
-        <w:t xml:space="preserve">What happened, and did we resolve it: closed, partly, or failed?</w:t>
-      </w:r>
-    </w:p>
-    <w:p>
-      <w:pPr>
-        <w:numPr>
-          <w:ilvl w:val="0"/>
-          <w:numId w:val="1018"/>
-        </w:numPr>
-        <w:pStyle w:val="Compact"/>
-      </w:pPr>
-      <w:r>
-        <w:rPr>
-          <w:bCs/>
-          <w:b/>
-        </w:rPr>
-        <w:t xml:space="preserve">Who stood out?</w:t>
-      </w:r>
-      <w:r>
-        <w:t xml:space="preserve"> </w:t>
-      </w:r>
-      <w:r>
-        <w:t xml:space="preserve">A moment worth remembering.</w:t>
-      </w:r>
-    </w:p>
-    <w:p>
-      <w:pPr>
-        <w:numPr>
-          <w:ilvl w:val="0"/>
-          <w:numId w:val="1018"/>
-        </w:numPr>
-        <w:pStyle w:val="Compact"/>
-      </w:pPr>
-      <w:r>
-        <w:rPr>
-          <w:bCs/>
-          <w:b/>
-        </w:rPr>
-        <w:t xml:space="preserve">Complications.</w:t>
-      </w:r>
-      <w:r>
-        <w:t xml:space="preserve"> </w:t>
-      </w:r>
-      <w:r>
-        <w:t xml:space="preserve">Which ones came into play, and what did they cost?</w:t>
-      </w:r>
-    </w:p>
-    <w:p>
-      <w:pPr>
-        <w:numPr>
-          <w:ilvl w:val="0"/>
-          <w:numId w:val="1018"/>
-        </w:numPr>
-        <w:pStyle w:val="Compact"/>
-      </w:pPr>
-      <w:r>
-        <w:rPr>
-          <w:bCs/>
-          <w:b/>
-        </w:rPr>
-        <w:t xml:space="preserve">For the books.</w:t>
-      </w:r>
-      <w:r>
-        <w:t xml:space="preserve"> </w:t>
-      </w:r>
-      <w:r>
-        <w:t xml:space="preserve">A new Wesen kind, weakness or custom worth recording.</w:t>
-      </w:r>
-    </w:p>
-    <w:p>
-      <w:pPr>
-        <w:numPr>
-          <w:ilvl w:val="0"/>
-          <w:numId w:val="1018"/>
-        </w:numPr>
-        <w:pStyle w:val="Compact"/>
-      </w:pPr>
-      <w:r>
-        <w:rPr>
-          <w:bCs/>
-          <w:b/>
-        </w:rPr>
-        <w:t xml:space="preserve">Advancement.</w:t>
-      </w:r>
-      <w:r>
-        <w:t xml:space="preserve"> </w:t>
-      </w:r>
-      <w:r>
-        <w:t xml:space="preserve">After a significant case, each character earns 1 advancement point; at a milestone, 2 more.</w:t>
-      </w:r>
-    </w:p>
-    <w:bookmarkEnd w:id="81"/>
-    <w:bookmarkEnd w:id="82"/>
-    <w:bookmarkStart w:id="90" w:name="ready-made-characters"/>
-    <w:p>
-      <w:pPr>
-        <w:pStyle w:val="Heading1"/>
-      </w:pPr>
-      <w:r>
-        <w:t xml:space="preserve">Ready-made characters</w:t>
-      </w:r>
-    </w:p>
-    <w:p>
-      <w:pPr>
-        <w:pStyle w:val="FirstParagraph"/>
-      </w:pPr>
-      <w:r>
-        <w:t xml:space="preserve">Seven characters ready to play. Each follows the creation rules exactly, Edges included, and their connections tie them together.</w:t>
-      </w:r>
-    </w:p>
-    <w:bookmarkStart w:id="83" w:name="eliza-kessler"/>
-    <w:p>
-      <w:pPr>
-        <w:pStyle w:val="Heading2"/>
-      </w:pPr>
-      <w:r>
-        <w:t xml:space="preserve">Eliza Kessler</w:t>
-      </w:r>
-    </w:p>
-    <w:p>
-      <w:pPr>
-        <w:pStyle w:val="FirstParagraph"/>
-      </w:pPr>
-      <w:r>
-        <w:rPr>
-          <w:iCs/>
-          <w:i/>
-        </w:rPr>
-        <w:t xml:space="preserve">Deputy U.S. Marshal, Lawman. Grimm (Tier 2).</w:t>
-      </w:r>
-      <w:r>
-        <w:t xml:space="preserve"> </w:t>
-      </w:r>
-      <w:r>
-        <w:t xml:space="preserve">Wears the badge: the law, and the Code, in one person.</w:t>
-      </w:r>
-    </w:p>
-    <w:p>
-      <w:pPr>
-        <w:numPr>
-          <w:ilvl w:val="0"/>
-          <w:numId w:val="1019"/>
-        </w:numPr>
-        <w:pStyle w:val="Compact"/>
-      </w:pPr>
-      <w:r>
-        <w:rPr>
-          <w:bCs/>
-          <w:b/>
-        </w:rPr>
-        <w:t xml:space="preserve">Attributes:</w:t>
-      </w:r>
-      <w:r>
-        <w:t xml:space="preserve"> </w:t>
-      </w:r>
-      <w:r>
-        <w:t xml:space="preserve">Body 12, Agility 13, Intellect 10, Presence 8, Will 12.</w:t>
-      </w:r>
-      <w:r>
-        <w:t xml:space="preserve"> </w:t>
-      </w:r>
-      <w:r>
-        <w:rPr>
-          <w:bCs/>
-          <w:b/>
-        </w:rPr>
-        <w:t xml:space="preserve">Dodge</w:t>
-      </w:r>
-      <w:r>
-        <w:t xml:space="preserve"> </w:t>
-      </w:r>
-      <w:r>
-        <w:t xml:space="preserve">12.</w:t>
-      </w:r>
-    </w:p>
-    <w:p>
-      <w:pPr>
-        <w:numPr>
-          <w:ilvl w:val="0"/>
-          <w:numId w:val="1019"/>
-        </w:numPr>
-        <w:pStyle w:val="Compact"/>
-      </w:pPr>
-      <w:r>
-        <w:rPr>
-          <w:bCs/>
-          <w:b/>
-        </w:rPr>
-        <w:t xml:space="preserve">Skills:</w:t>
-      </w:r>
-      <w:r>
-        <w:t xml:space="preserve"> </w:t>
-      </w:r>
-      <w:r>
-        <w:t xml:space="preserve">Shooting 16 (Specialty). Trained: Riding 14, Melee 14, Brawling 14, Athletics 13, Investigation 11, Tracking 11, Read People 11, Survival 11, Leadership 9; Wesen Lore 11 (free).</w:t>
-      </w:r>
-    </w:p>
-    <w:p>
-      <w:pPr>
-        <w:numPr>
-          <w:ilvl w:val="0"/>
-          <w:numId w:val="1019"/>
-        </w:numPr>
-        <w:pStyle w:val="Compact"/>
-      </w:pPr>
-      <w:r>
-        <w:rPr>
-          <w:bCs/>
-          <w:b/>
-        </w:rPr>
-        <w:t xml:space="preserve">Edge:</w:t>
-      </w:r>
-      <w:r>
-        <w:t xml:space="preserve"> </w:t>
-      </w:r>
-      <w:r>
-        <w:t xml:space="preserve">Second advantage: Badge: Deputy U.S. Marshal.</w:t>
-      </w:r>
-      <w:r>
-        <w:t xml:space="preserve"> </w:t>
-      </w:r>
-      <w:r>
-        <w:rPr>
-          <w:bCs/>
-          <w:b/>
-        </w:rPr>
-        <w:t xml:space="preserve">Grimm gift:</w:t>
-      </w:r>
-      <w:r>
-        <w:t xml:space="preserve"> </w:t>
-      </w:r>
-      <w:r>
-        <w:t xml:space="preserve">Keeper of the Books (companion: The Books Must Be Kept).</w:t>
-      </w:r>
-      <w:r>
-        <w:t xml:space="preserve"> </w:t>
-      </w:r>
-      <w:r>
-        <w:rPr>
-          <w:bCs/>
-          <w:b/>
-        </w:rPr>
-        <w:t xml:space="preserve">Complication:</w:t>
-      </w:r>
-      <w:r>
-        <w:t xml:space="preserve"> </w:t>
-      </w:r>
-      <w:r>
-        <w:t xml:space="preserve">Law and Order; trigger: a Wesen suspect could be killed instead of arrested.</w:t>
-      </w:r>
-      <w:r>
-        <w:t xml:space="preserve"> </w:t>
-      </w:r>
-      <w:r>
-        <w:rPr>
-          <w:bCs/>
-          <w:b/>
-        </w:rPr>
-        <w:t xml:space="preserve">Allegiance:</w:t>
-      </w:r>
-      <w:r>
-        <w:t xml:space="preserve"> </w:t>
-      </w:r>
-      <w:r>
-        <w:t xml:space="preserve">The U.S. Marshals.</w:t>
-      </w:r>
-    </w:p>
-    <w:p>
-      <w:pPr>
-        <w:numPr>
-          <w:ilvl w:val="0"/>
-          <w:numId w:val="1019"/>
-        </w:numPr>
-        <w:pStyle w:val="Compact"/>
-      </w:pPr>
-      <w:r>
-        <w:rPr>
-          <w:bCs/>
-          <w:b/>
-        </w:rPr>
-        <w:t xml:space="preserve">Why I stand against the dark:</w:t>
-      </w:r>
-      <w:r>
-        <w:t xml:space="preserve"> </w:t>
-      </w:r>
-      <w:r>
-        <w:t xml:space="preserve">The Grimm blood woke in me, and it came with a duty.</w:t>
-      </w:r>
-      <w:r>
-        <w:t xml:space="preserve"> </w:t>
-      </w:r>
-      <w:r>
-        <w:rPr>
-          <w:bCs/>
-          <w:b/>
-        </w:rPr>
-        <w:t xml:space="preserve">Connection:</w:t>
-      </w:r>
-      <w:r>
-        <w:t xml:space="preserve"> </w:t>
-      </w:r>
-      <w:r>
-        <w:t xml:space="preserve">Gus Brandt cut her down from a lynch mob’s rope before anyone knew what she was.</w:t>
-      </w:r>
-    </w:p>
-    <w:bookmarkEnd w:id="83"/>
-    <w:bookmarkStart w:id="84" w:name="gus-brandt"/>
-    <w:p>
-      <w:pPr>
-        <w:pStyle w:val="Heading2"/>
-      </w:pPr>
-      <w:r>
-        <w:t xml:space="preserve">Gus Brandt</w:t>
-      </w:r>
-    </w:p>
-    <w:p>
-      <w:pPr>
-        <w:pStyle w:val="FirstParagraph"/>
-      </w:pPr>
-      <w:r>
-        <w:rPr>
-          <w:iCs/>
-          <w:i/>
-        </w:rPr>
-        <w:t xml:space="preserve">Blacksmith and gunsmith, Tinker. Blutbad (Tier 2).</w:t>
-      </w:r>
-      <w:r>
-        <w:t xml:space="preserve"> </w:t>
-      </w:r>
-      <w:r>
-        <w:t xml:space="preserve">Shoes the horses, fixes the guns, and hasn’t hunted in eleven years.</w:t>
       </w:r>
     </w:p>
     <w:p>
@@ -15788,45 +16197,13 @@
           <w:bCs/>
           <w:b/>
         </w:rPr>
-        <w:t xml:space="preserve">Attributes:</w:t>
-      </w:r>
-      <w:r>
-        <w:t xml:space="preserve"> </w:t>
-      </w:r>
-      <w:r>
-        <w:t xml:space="preserve">Body 11, Agility 11, Intellect 13, Presence 10, Will 10.</w:t>
-      </w:r>
-      <w:r>
-        <w:t xml:space="preserve"> </w:t>
-      </w:r>
-      <w:r>
-        <w:rPr>
-          <w:bCs/>
-          <w:b/>
-        </w:rPr>
-        <w:t xml:space="preserve">Dodge</w:t>
-      </w:r>
-      <w:r>
-        <w:t xml:space="preserve"> </w:t>
-      </w:r>
-      <w:r>
-        <w:t xml:space="preserve">10.</w:t>
-      </w:r>
-      <w:r>
-        <w:t xml:space="preserve"> </w:t>
-      </w:r>
-      <w:r>
-        <w:rPr>
-          <w:bCs/>
-          <w:b/>
-        </w:rPr>
-        <w:t xml:space="preserve">In woge:</w:t>
-      </w:r>
-      <w:r>
-        <w:t xml:space="preserve"> </w:t>
-      </w:r>
-      <w:r>
-        <w:t xml:space="preserve">Body 13, Agility 12; claws and fangs mark 2 boxes.</w:t>
+        <w:t xml:space="preserve">The case.</w:t>
+      </w:r>
+      <w:r>
+        <w:t xml:space="preserve"> </w:t>
+      </w:r>
+      <w:r>
+        <w:t xml:space="preserve">What happened, and did we resolve it: closed, partly, or failed?</w:t>
       </w:r>
     </w:p>
     <w:p>
@@ -15842,13 +16219,13 @@
           <w:bCs/>
           <w:b/>
         </w:rPr>
-        <w:t xml:space="preserve">Skills:</w:t>
-      </w:r>
-      <w:r>
-        <w:t xml:space="preserve"> </w:t>
-      </w:r>
-      <w:r>
-        <w:t xml:space="preserve">Tinkering 16 (Specialty). Trained: Tracking 14, Wesen Lore 14, Investigation 14, Survival 14, Read People 14, Brawling 12, Melee 12, Athletics 12, Persuasion 11.</w:t>
+        <w:t xml:space="preserve">Who stood out?</w:t>
+      </w:r>
+      <w:r>
+        <w:t xml:space="preserve"> </w:t>
+      </w:r>
+      <w:r>
+        <w:t xml:space="preserve">A moment worth remembering.</w:t>
       </w:r>
     </w:p>
     <w:p>
@@ -15864,45 +16241,13 @@
           <w:bCs/>
           <w:b/>
         </w:rPr>
-        <w:t xml:space="preserve">Edge:</w:t>
-      </w:r>
-      <w:r>
-        <w:t xml:space="preserve"> </w:t>
-      </w:r>
-      <w:r>
-        <w:t xml:space="preserve">A fine tool: a master gunsmith’s tools (+2 Tinkering).</w:t>
-      </w:r>
-      <w:r>
-        <w:t xml:space="preserve"> </w:t>
-      </w:r>
-      <w:r>
-        <w:rPr>
-          <w:bCs/>
-          <w:b/>
-        </w:rPr>
-        <w:t xml:space="preserve">Advantage:</w:t>
-      </w:r>
-      <w:r>
-        <w:t xml:space="preserve"> </w:t>
-      </w:r>
-      <w:r>
-        <w:t xml:space="preserve">Blutbad Nose (companion: The Bloodlust).</w:t>
-      </w:r>
-      <w:r>
-        <w:t xml:space="preserve"> </w:t>
-      </w:r>
-      <w:r>
-        <w:rPr>
-          <w:bCs/>
-          <w:b/>
-        </w:rPr>
-        <w:t xml:space="preserve">Complication:</w:t>
-      </w:r>
-      <w:r>
-        <w:t xml:space="preserve"> </w:t>
-      </w:r>
-      <w:r>
-        <w:t xml:space="preserve">Keeps a Dangerous Secret; trigger: someone from his old pack turns up.</w:t>
+        <w:t xml:space="preserve">Complications.</w:t>
+      </w:r>
+      <w:r>
+        <w:t xml:space="preserve"> </w:t>
+      </w:r>
+      <w:r>
+        <w:t xml:space="preserve">Which ones came into play, and what did they cost?</w:t>
       </w:r>
     </w:p>
     <w:p>
@@ -15918,39 +16263,63 @@
           <w:bCs/>
           <w:b/>
         </w:rPr>
-        <w:t xml:space="preserve">Why I stand against the dark:</w:t>
-      </w:r>
-      <w:r>
-        <w:t xml:space="preserve"> </w:t>
-      </w:r>
-      <w:r>
-        <w:t xml:space="preserve">I did harm once. I mean to balance the ledger.</w:t>
-      </w:r>
-      <w:r>
-        <w:t xml:space="preserve"> </w:t>
-      </w:r>
-      <w:r>
-        <w:rPr>
-          <w:bCs/>
-          <w:b/>
-        </w:rPr>
-        <w:t xml:space="preserve">Connection:</w:t>
-      </w:r>
-      <w:r>
-        <w:t xml:space="preserve"> </w:t>
-      </w:r>
-      <w:r>
-        <w:t xml:space="preserve">Owes Roz Vey for the remedies that keep the urge quiet.</w:t>
-      </w:r>
-    </w:p>
-    <w:bookmarkEnd w:id="84"/>
-    <w:bookmarkStart w:id="85" w:name="roz-vey"/>
+        <w:t xml:space="preserve">For the books.</w:t>
+      </w:r>
+      <w:r>
+        <w:t xml:space="preserve"> </w:t>
+      </w:r>
+      <w:r>
+        <w:t xml:space="preserve">A new Wesen kind, weakness or custom worth recording.</w:t>
+      </w:r>
+    </w:p>
+    <w:p>
+      <w:pPr>
+        <w:numPr>
+          <w:ilvl w:val="0"/>
+          <w:numId w:val="1020"/>
+        </w:numPr>
+        <w:pStyle w:val="Compact"/>
+      </w:pPr>
+      <w:r>
+        <w:rPr>
+          <w:bCs/>
+          <w:b/>
+        </w:rPr>
+        <w:t xml:space="preserve">Advancement.</w:t>
+      </w:r>
+      <w:r>
+        <w:t xml:space="preserve"> </w:t>
+      </w:r>
+      <w:r>
+        <w:t xml:space="preserve">After a significant case, each character earns 1 advancement point; at a milestone, 2 more.</w:t>
+      </w:r>
+    </w:p>
+    <w:bookmarkEnd w:id="82"/>
+    <w:bookmarkEnd w:id="83"/>
+    <w:bookmarkStart w:id="91" w:name="ready-made-characters"/>
+    <w:p>
+      <w:pPr>
+        <w:pStyle w:val="Heading1"/>
+      </w:pPr>
+      <w:r>
+        <w:t xml:space="preserve">Ready-made characters</w:t>
+      </w:r>
+    </w:p>
+    <w:p>
+      <w:pPr>
+        <w:pStyle w:val="FirstParagraph"/>
+      </w:pPr>
+      <w:r>
+        <w:t xml:space="preserve">Seven characters ready to play. Each follows the creation rules exactly, Edges included, and their connections tie them together.</w:t>
+      </w:r>
+    </w:p>
+    <w:bookmarkStart w:id="84" w:name="eliza-kessler"/>
     <w:p>
       <w:pPr>
         <w:pStyle w:val="Heading2"/>
       </w:pPr>
       <w:r>
-        <w:t xml:space="preserve">Roz Vey</w:t>
+        <w:t xml:space="preserve">Eliza Kessler</w:t>
       </w:r>
     </w:p>
     <w:p>
@@ -15962,13 +16331,13 @@
           <w:iCs/>
           <w:i/>
         </w:rPr>
-        <w:t xml:space="preserve">Spice and tea merchant, Apothecary. Fuchsbau (Tier 1).</w:t>
-      </w:r>
-      <w:r>
-        <w:t xml:space="preserve"> </w:t>
-      </w:r>
-      <w:r>
-        <w:t xml:space="preserve">Sells tea out front, and other things in the back.</w:t>
+        <w:t xml:space="preserve">Deputy U.S. Marshal, Lawman. Grimm (Tier 2).</w:t>
+      </w:r>
+      <w:r>
+        <w:t xml:space="preserve"> </w:t>
+      </w:r>
+      <w:r>
+        <w:t xml:space="preserve">Wears the badge: the law, and the Code, in one person.</w:t>
       </w:r>
     </w:p>
     <w:p>
@@ -15990,7 +16359,7 @@
         <w:t xml:space="preserve"> </w:t>
       </w:r>
       <w:r>
-        <w:t xml:space="preserve">Body 9, Agility 11, Intellect 13, Presence 12, Will 10.</w:t>
+        <w:t xml:space="preserve">Body 12, Agility 13, Intellect 10, Presence 8, Will 12.</w:t>
       </w:r>
       <w:r>
         <w:t xml:space="preserve"> </w:t>
@@ -16006,7 +16375,7 @@
         <w:t xml:space="preserve"> </w:t>
       </w:r>
       <w:r>
-        <w:t xml:space="preserve">9.</w:t>
+        <w:t xml:space="preserve">12.</w:t>
       </w:r>
     </w:p>
     <w:p>
@@ -16028,7 +16397,7 @@
         <w:t xml:space="preserve"> </w:t>
       </w:r>
       <w:r>
-        <w:t xml:space="preserve">Apothecary 16 (Specialty). Trained: Medicine 14, Wesen Lore 14, Read People 14, Investigation 14, Gambling 14, Survival 14, Occult 14, Persuasion 13, Deception 13, Stealth 12.</w:t>
+        <w:t xml:space="preserve">Shooting 16 (Specialty). Trained: Riding 14, Melee 14, Brawling 14, Athletics 13, Investigation 11, Tracking 11, Read People 11, Survival 11, Leadership 9; Wesen Lore 11 (free).</w:t>
       </w:r>
     </w:p>
     <w:p>
@@ -16044,29 +16413,29 @@
           <w:bCs/>
           <w:b/>
         </w:rPr>
-        <w:t xml:space="preserve">Edges:</w:t>
-      </w:r>
-      <w:r>
-        <w:t xml:space="preserve"> </w:t>
-      </w:r>
-      <w:r>
-        <w:t xml:space="preserve">Extra Trained skill; a friend in town: her cousin Ambrose, a Fuchsbau smuggler on the river docks who can find any ingredient, for a price.</w:t>
-      </w:r>
-      <w:r>
-        <w:t xml:space="preserve"> </w:t>
-      </w:r>
-      <w:r>
-        <w:rPr>
-          <w:bCs/>
-          <w:b/>
-        </w:rPr>
-        <w:t xml:space="preserve">Advantage:</w:t>
-      </w:r>
-      <w:r>
-        <w:t xml:space="preserve"> </w:t>
-      </w:r>
-      <w:r>
-        <w:t xml:space="preserve">Fuchsbau Remedies (companion: Criminal Kin).</w:t>
+        <w:t xml:space="preserve">Edge:</w:t>
+      </w:r>
+      <w:r>
+        <w:t xml:space="preserve"> </w:t>
+      </w:r>
+      <w:r>
+        <w:t xml:space="preserve">Second advantage: Badge: Deputy U.S. Marshal.</w:t>
+      </w:r>
+      <w:r>
+        <w:t xml:space="preserve"> </w:t>
+      </w:r>
+      <w:r>
+        <w:rPr>
+          <w:bCs/>
+          <w:b/>
+        </w:rPr>
+        <w:t xml:space="preserve">Grimm gift:</w:t>
+      </w:r>
+      <w:r>
+        <w:t xml:space="preserve"> </w:t>
+      </w:r>
+      <w:r>
+        <w:t xml:space="preserve">Keeper of the Books (companion: The Books Must Be Kept).</w:t>
       </w:r>
       <w:r>
         <w:t xml:space="preserve"> </w:t>
@@ -16082,7 +16451,23 @@
         <w:t xml:space="preserve"> </w:t>
       </w:r>
       <w:r>
-        <w:t xml:space="preserve">Protects Others at Personal Risk; trigger: a sick or hurt stranger turns up at the shop.</w:t>
+        <w:t xml:space="preserve">Law and Order; trigger: a Wesen suspect could be killed instead of arrested.</w:t>
+      </w:r>
+      <w:r>
+        <w:t xml:space="preserve"> </w:t>
+      </w:r>
+      <w:r>
+        <w:rPr>
+          <w:bCs/>
+          <w:b/>
+        </w:rPr>
+        <w:t xml:space="preserve">Allegiance:</w:t>
+      </w:r>
+      <w:r>
+        <w:t xml:space="preserve"> </w:t>
+      </w:r>
+      <w:r>
+        <w:t xml:space="preserve">The U.S. Marshals.</w:t>
       </w:r>
     </w:p>
     <w:p>
@@ -16104,7 +16489,7 @@
         <w:t xml:space="preserve"> </w:t>
       </w:r>
       <w:r>
-        <w:t xml:space="preserve">Wesen and humans can live side by side, and I mean to prove it.</w:t>
+        <w:t xml:space="preserve">The Grimm blood woke in me, and it came with a duty.</w:t>
       </w:r>
       <w:r>
         <w:t xml:space="preserve"> </w:t>
@@ -16120,17 +16505,17 @@
         <w:t xml:space="preserve"> </w:t>
       </w:r>
       <w:r>
-        <w:t xml:space="preserve">Trades notes with Dr. Whitlock, who still won’t admit some of her remedies work better than his.</w:t>
-      </w:r>
-    </w:p>
-    <w:bookmarkEnd w:id="85"/>
-    <w:bookmarkStart w:id="86" w:name="dr.-thaddeus-whitlock"/>
+        <w:t xml:space="preserve">Gus Brandt cut her down from a lynch mob’s rope before anyone knew what she was.</w:t>
+      </w:r>
+    </w:p>
+    <w:bookmarkEnd w:id="84"/>
+    <w:bookmarkStart w:id="85" w:name="gus-brandt"/>
     <w:p>
       <w:pPr>
         <w:pStyle w:val="Heading2"/>
       </w:pPr>
       <w:r>
-        <w:t xml:space="preserve">Dr. Thaddeus Whitlock</w:t>
+        <w:t xml:space="preserve">Gus Brandt</w:t>
       </w:r>
     </w:p>
     <w:p>
@@ -16142,13 +16527,13 @@
           <w:iCs/>
           <w:i/>
         </w:rPr>
-        <w:t xml:space="preserve">Town physician, Doctor. Human (Tier 0).</w:t>
-      </w:r>
-      <w:r>
-        <w:t xml:space="preserve"> </w:t>
-      </w:r>
-      <w:r>
-        <w:t xml:space="preserve">Army surgeon in the war; now he digs bullets out of his friends and asks too many questions about what made the other wounds.</w:t>
+        <w:t xml:space="preserve">Blacksmith and gunsmith, Tinker. Blutbad (Tier 2).</w:t>
+      </w:r>
+      <w:r>
+        <w:t xml:space="preserve"> </w:t>
+      </w:r>
+      <w:r>
+        <w:t xml:space="preserve">Shoes the horses, fixes the guns, and hasn’t hunted in eleven years.</w:t>
       </w:r>
     </w:p>
     <w:p>
@@ -16170,7 +16555,7 @@
         <w:t xml:space="preserve"> </w:t>
       </w:r>
       <w:r>
-        <w:t xml:space="preserve">Body 10, Agility 10, Intellect 13, Presence 12, Will 11.</w:t>
+        <w:t xml:space="preserve">Body 11, Agility 11, Intellect 13, Presence 10, Will 10.</w:t>
       </w:r>
       <w:r>
         <w:t xml:space="preserve"> </w:t>
@@ -16186,7 +16571,23 @@
         <w:t xml:space="preserve"> </w:t>
       </w:r>
       <w:r>
-        <w:t xml:space="preserve">8.</w:t>
+        <w:t xml:space="preserve">10.</w:t>
+      </w:r>
+      <w:r>
+        <w:t xml:space="preserve"> </w:t>
+      </w:r>
+      <w:r>
+        <w:rPr>
+          <w:bCs/>
+          <w:b/>
+        </w:rPr>
+        <w:t xml:space="preserve">In woge:</w:t>
+      </w:r>
+      <w:r>
+        <w:t xml:space="preserve"> </w:t>
+      </w:r>
+      <w:r>
+        <w:t xml:space="preserve">Body 13, Agility 12; claws and fangs mark 2 boxes.</w:t>
       </w:r>
     </w:p>
     <w:p>
@@ -16208,7 +16609,7 @@
         <w:t xml:space="preserve"> </w:t>
       </w:r>
       <w:r>
-        <w:t xml:space="preserve">Medicine 16 (Specialty). Trained: Apothecary 14, Read People 14, Investigation 14, Wesen Lore 14, Occult 14, Persuasion 13, Leadership 13, Riding 11, Shooting 11.</w:t>
+        <w:t xml:space="preserve">Tinkering 16 (Specialty). Trained: Tracking 14, Wesen Lore 14, Investigation 14, Survival 14, Read People 14, Brawling 12, Melee 12, Athletics 12, Persuasion 11.</w:t>
       </w:r>
     </w:p>
     <w:p>
@@ -16224,13 +16625,13 @@
           <w:bCs/>
           <w:b/>
         </w:rPr>
-        <w:t xml:space="preserve">Edges:</w:t>
-      </w:r>
-      <w:r>
-        <w:t xml:space="preserve"> </w:t>
-      </w:r>
-      <w:r>
-        <w:t xml:space="preserve">+1 attribute point; second advantage: Battlefield Surgeon; a fine tool: his army surgeon’s instruments (+2 Medicine).</w:t>
+        <w:t xml:space="preserve">Edge:</w:t>
+      </w:r>
+      <w:r>
+        <w:t xml:space="preserve"> </w:t>
+      </w:r>
+      <w:r>
+        <w:t xml:space="preserve">A fine tool: a master gunsmith’s tools (+2 Tinkering).</w:t>
       </w:r>
       <w:r>
         <w:t xml:space="preserve"> </w:t>
@@ -16246,7 +16647,7 @@
         <w:t xml:space="preserve"> </w:t>
       </w:r>
       <w:r>
-        <w:t xml:space="preserve">Steady Hands.</w:t>
+        <w:t xml:space="preserve">Blutbad Nose (companion: The Bloodlust).</w:t>
       </w:r>
       <w:r>
         <w:t xml:space="preserve"> </w:t>
@@ -16262,7 +16663,7 @@
         <w:t xml:space="preserve"> </w:t>
       </w:r>
       <w:r>
-        <w:t xml:space="preserve">Haunted by the War; trigger: gunfire in the dark.</w:t>
+        <w:t xml:space="preserve">Keeps a Dangerous Secret; trigger: someone from his old pack turns up.</w:t>
       </w:r>
     </w:p>
     <w:p>
@@ -16284,7 +16685,7 @@
         <w:t xml:space="preserve"> </w:t>
       </w:r>
       <w:r>
-        <w:t xml:space="preserve">I saw what I saw, and no one else believes me.</w:t>
+        <w:t xml:space="preserve">I did harm once. I mean to balance the ledger.</w:t>
       </w:r>
       <w:r>
         <w:t xml:space="preserve"> </w:t>
@@ -16300,17 +16701,17 @@
         <w:t xml:space="preserve"> </w:t>
       </w:r>
       <w:r>
-        <w:t xml:space="preserve">Rode with Silas Thorne’s regiment in the war and has never trusted him since.</w:t>
-      </w:r>
-    </w:p>
-    <w:bookmarkEnd w:id="86"/>
-    <w:bookmarkStart w:id="87" w:name="cora-ridgeway"/>
+        <w:t xml:space="preserve">Owes Roz Vey for the remedies that keep the urge quiet.</w:t>
+      </w:r>
+    </w:p>
+    <w:bookmarkEnd w:id="85"/>
+    <w:bookmarkStart w:id="86" w:name="roz-vey"/>
     <w:p>
       <w:pPr>
         <w:pStyle w:val="Heading2"/>
       </w:pPr>
       <w:r>
-        <w:t xml:space="preserve">Cora Ridgeway</w:t>
+        <w:t xml:space="preserve">Roz Vey</w:t>
       </w:r>
     </w:p>
     <w:p>
@@ -16322,13 +16723,13 @@
           <w:iCs/>
           <w:i/>
         </w:rPr>
-        <w:t xml:space="preserve">Scout and sharpshooter, Scout. Coyotl (Tier 1).</w:t>
-      </w:r>
-      <w:r>
-        <w:t xml:space="preserve"> </w:t>
-      </w:r>
-      <w:r>
-        <w:t xml:space="preserve">Knows the plains and the high country, and keeps her clan’s ways close.</w:t>
+        <w:t xml:space="preserve">Spice and tea merchant, Apothecary. Fuchsbau (Tier 1).</w:t>
+      </w:r>
+      <w:r>
+        <w:t xml:space="preserve"> </w:t>
+      </w:r>
+      <w:r>
+        <w:t xml:space="preserve">Sells tea out front, and other things in the back.</w:t>
       </w:r>
     </w:p>
     <w:p>
@@ -16350,7 +16751,7 @@
         <w:t xml:space="preserve"> </w:t>
       </w:r>
       <w:r>
-        <w:t xml:space="preserve">Body 11, Agility 14, Intellect 10, Presence 11, Will 9.</w:t>
+        <w:t xml:space="preserve">Body 9, Agility 11, Intellect 13, Presence 12, Will 10.</w:t>
       </w:r>
       <w:r>
         <w:t xml:space="preserve"> </w:t>
@@ -16366,23 +16767,7 @@
         <w:t xml:space="preserve"> </w:t>
       </w:r>
       <w:r>
-        <w:t xml:space="preserve">13.</w:t>
-      </w:r>
-      <w:r>
-        <w:t xml:space="preserve"> </w:t>
-      </w:r>
-      <w:r>
-        <w:rPr>
-          <w:bCs/>
-          <w:b/>
-        </w:rPr>
-        <w:t xml:space="preserve">In woge:</w:t>
-      </w:r>
-      <w:r>
-        <w:t xml:space="preserve"> </w:t>
-      </w:r>
-      <w:r>
-        <w:t xml:space="preserve">Body 12, Agility 15, Dodge 15; claws mark 2 boxes.</w:t>
+        <w:t xml:space="preserve">9.</w:t>
       </w:r>
     </w:p>
     <w:p>
@@ -16404,7 +16789,7 @@
         <w:t xml:space="preserve"> </w:t>
       </w:r>
       <w:r>
-        <w:t xml:space="preserve">Shooting 17 (Specialty). Trained: Riding 15, Stealth 15, Brawling 15, Melee 15, Persuasion 12, Athletics 12, Tracking 11, Survival 11, Read People 11, Gambling 11.</w:t>
+        <w:t xml:space="preserve">Apothecary 16 (Specialty). Trained: Medicine 14, Wesen Lore 14, Read People 14, Investigation 14, Gambling 14, Survival 14, Occult 14, Persuasion 13, Deception 13, Stealth 12.</w:t>
       </w:r>
     </w:p>
     <w:p>
@@ -16426,7 +16811,7 @@
         <w:t xml:space="preserve"> </w:t>
       </w:r>
       <w:r>
-        <w:t xml:space="preserve">Extra Trained skill; True grit.</w:t>
+        <w:t xml:space="preserve">Extra Trained skill; a friend in town: her cousin Ambrose, a Fuchsbau smuggler on the river docks who can find any ingredient, for a price.</w:t>
       </w:r>
       <w:r>
         <w:t xml:space="preserve"> </w:t>
@@ -16442,7 +16827,7 @@
         <w:t xml:space="preserve"> </w:t>
       </w:r>
       <w:r>
-        <w:t xml:space="preserve">Plains Wanderer (companion: Restless).</w:t>
+        <w:t xml:space="preserve">Fuchsbau Remedies (companion: Criminal Kin).</w:t>
       </w:r>
       <w:r>
         <w:t xml:space="preserve"> </w:t>
@@ -16458,7 +16843,7 @@
         <w:t xml:space="preserve"> </w:t>
       </w:r>
       <w:r>
-        <w:t xml:space="preserve">Sworn Vengeance; trigger: word of the men who burned her clan’s camp.</w:t>
+        <w:t xml:space="preserve">Protects Others at Personal Risk; trigger: a sick or hurt stranger turns up at the shop.</w:t>
       </w:r>
     </w:p>
     <w:p>
@@ -16480,7 +16865,7 @@
         <w:t xml:space="preserve"> </w:t>
       </w:r>
       <w:r>
-        <w:t xml:space="preserve">Something that wore a human face killed someone I loved.</w:t>
+        <w:t xml:space="preserve">Wesen and humans can live side by side, and I mean to prove it.</w:t>
       </w:r>
       <w:r>
         <w:t xml:space="preserve"> </w:t>
@@ -16496,17 +16881,17 @@
         <w:t xml:space="preserve"> </w:t>
       </w:r>
       <w:r>
-        <w:t xml:space="preserve">Eliza Kessler taught her what she knows about the hidden world.</w:t>
-      </w:r>
-    </w:p>
-    <w:bookmarkEnd w:id="87"/>
-    <w:bookmarkStart w:id="88" w:name="silas-thorne"/>
+        <w:t xml:space="preserve">Trades notes with Dr. Whitlock, who still won’t admit some of her remedies work better than his.</w:t>
+      </w:r>
+    </w:p>
+    <w:bookmarkEnd w:id="86"/>
+    <w:bookmarkStart w:id="87" w:name="dr.-thaddeus-whitlock"/>
     <w:p>
       <w:pPr>
         <w:pStyle w:val="Heading2"/>
       </w:pPr>
       <w:r>
-        <w:t xml:space="preserve">Silas Thorne</w:t>
+        <w:t xml:space="preserve">Dr. Thaddeus Whitlock</w:t>
       </w:r>
     </w:p>
     <w:p>
@@ -16518,13 +16903,13 @@
           <w:iCs/>
           <w:i/>
         </w:rPr>
-        <w:t xml:space="preserve">Professional gambler, Gambler. Ziegevolk (Tier 1); Old hand.</w:t>
-      </w:r>
-      <w:r>
-        <w:t xml:space="preserve"> </w:t>
-      </w:r>
-      <w:r>
-        <w:t xml:space="preserve">Charming, well-dressed, and in debt to the wrong people.</w:t>
+        <w:t xml:space="preserve">Town physician, Doctor. Human (Tier 0).</w:t>
+      </w:r>
+      <w:r>
+        <w:t xml:space="preserve"> </w:t>
+      </w:r>
+      <w:r>
+        <w:t xml:space="preserve">Army surgeon in the war; now he digs bullets out of his friends and asks too many questions about what made the other wounds.</w:t>
       </w:r>
     </w:p>
     <w:p>
@@ -16546,7 +16931,7 @@
         <w:t xml:space="preserve"> </w:t>
       </w:r>
       <w:r>
-        <w:t xml:space="preserve">Body 10, Agility 10, Intellect 13, Presence 13, Will 9.</w:t>
+        <w:t xml:space="preserve">Body 10, Agility 10, Intellect 13, Presence 12, Will 11.</w:t>
       </w:r>
       <w:r>
         <w:t xml:space="preserve"> </w:t>
@@ -16584,7 +16969,7 @@
         <w:t xml:space="preserve"> </w:t>
       </w:r>
       <w:r>
-        <w:t xml:space="preserve">Gambling 18 (Expert). Trained: Deception 14, Persuasion 14, Read People 14, Investigation 14, Shooting 11, Stealth 11, Riding 11.</w:t>
+        <w:t xml:space="preserve">Medicine 16 (Specialty). Trained: Apothecary 14, Read People 14, Investigation 14, Wesen Lore 14, Occult 14, Persuasion 13, Leadership 13, Riding 11, Shooting 11.</w:t>
       </w:r>
     </w:p>
     <w:p>
@@ -16606,7 +16991,7 @@
         <w:t xml:space="preserve"> </w:t>
       </w:r>
       <w:r>
-        <w:t xml:space="preserve">Second advantage: Poker Face; a friend in town: Mae Lin, a faro dealer who hears everything said at her table.</w:t>
+        <w:t xml:space="preserve">+1 attribute point; second advantage: Battlefield Surgeon; a fine tool: his army surgeon’s instruments (+2 Medicine).</w:t>
       </w:r>
       <w:r>
         <w:t xml:space="preserve"> </w:t>
@@ -16622,7 +17007,7 @@
         <w:t xml:space="preserve"> </w:t>
       </w:r>
       <w:r>
-        <w:t xml:space="preserve">Ziegevolk Pheromones (companion: Pheromone Suspicion).</w:t>
+        <w:t xml:space="preserve">Steady Hands.</w:t>
       </w:r>
       <w:r>
         <w:t xml:space="preserve"> </w:t>
@@ -16638,7 +17023,7 @@
         <w:t xml:space="preserve"> </w:t>
       </w:r>
       <w:r>
-        <w:t xml:space="preserve">Owes the Wrong People; trigger: a debt collector arrives.</w:t>
+        <w:t xml:space="preserve">Haunted by the War; trigger: gunfire in the dark.</w:t>
       </w:r>
     </w:p>
     <w:p>
@@ -16660,7 +17045,7 @@
         <w:t xml:space="preserve"> </w:t>
       </w:r>
       <w:r>
-        <w:t xml:space="preserve">The pay’s good, and nobody else will take these jobs.</w:t>
+        <w:t xml:space="preserve">I saw what I saw, and no one else believes me.</w:t>
       </w:r>
       <w:r>
         <w:t xml:space="preserve"> </w:t>
@@ -16676,35 +17061,17 @@
         <w:t xml:space="preserve"> </w:t>
       </w:r>
       <w:r>
-        <w:t xml:space="preserve">Plays cards with Cora every Saturday; she’s the only one who can tell when he’s bluffing.</w:t>
-      </w:r>
-    </w:p>
-    <w:bookmarkEnd w:id="88"/>
-    <w:bookmarkStart w:id="89" w:name="magdalena-lena-baer"/>
+        <w:t xml:space="preserve">Rode with Silas Thorne’s regiment in the war and has never trusted him since.</w:t>
+      </w:r>
+    </w:p>
+    <w:bookmarkEnd w:id="87"/>
+    <w:bookmarkStart w:id="88" w:name="cora-ridgeway"/>
     <w:p>
       <w:pPr>
         <w:pStyle w:val="Heading2"/>
       </w:pPr>
       <w:r>
-        <w:t xml:space="preserve">Magdalena</w:t>
-      </w:r>
-      <w:r>
-        <w:t xml:space="preserve"> </w:t>
-      </w:r>
-      <w:r>
-        <w:t xml:space="preserve">“</w:t>
-      </w:r>
-      <w:r>
-        <w:t xml:space="preserve">Lena</w:t>
-      </w:r>
-      <w:r>
-        <w:t xml:space="preserve">”</w:t>
-      </w:r>
-      <w:r>
-        <w:t xml:space="preserve"> </w:t>
-      </w:r>
-      <w:r>
-        <w:t xml:space="preserve">Baer</w:t>
+        <w:t xml:space="preserve">Cora Ridgeway</w:t>
       </w:r>
     </w:p>
     <w:p>
@@ -16716,26 +17083,13 @@
           <w:iCs/>
           <w:i/>
         </w:rPr>
-        <w:t xml:space="preserve">Braucher, Occultist. Incantare (Tier 2).</w:t>
-      </w:r>
-      <w:r>
-        <w:t xml:space="preserve"> </w:t>
-      </w:r>
-      <w:r>
-        <w:t xml:space="preserve">Came west from Lancaster County with a wagon, a Bible and her grandmother’s</w:t>
-      </w:r>
-      <w:r>
-        <w:t xml:space="preserve"> </w:t>
-      </w:r>
-      <w:r>
-        <w:rPr>
-          <w:iCs/>
-          <w:i/>
-        </w:rPr>
-        <w:t xml:space="preserve">Long Lost Friend</w:t>
-      </w:r>
-      <w:r>
-        <w:t xml:space="preserve">. Heals for gifts, and breaks hexes for no one’s money.</w:t>
+        <w:t xml:space="preserve">Scout and sharpshooter, Scout. Coyotl (Tier 1).</w:t>
+      </w:r>
+      <w:r>
+        <w:t xml:space="preserve"> </w:t>
+      </w:r>
+      <w:r>
+        <w:t xml:space="preserve">Knows the plains and the high country, and keeps her clan’s ways close.</w:t>
       </w:r>
     </w:p>
     <w:p>
@@ -16757,7 +17111,7 @@
         <w:t xml:space="preserve"> </w:t>
       </w:r>
       <w:r>
-        <w:t xml:space="preserve">Body 9, Agility 10, Intellect 13, Presence 11, Will 12.</w:t>
+        <w:t xml:space="preserve">Body 11, Agility 14, Intellect 10, Presence 11, Will 9.</w:t>
       </w:r>
       <w:r>
         <w:t xml:space="preserve"> </w:t>
@@ -16773,7 +17127,23 @@
         <w:t xml:space="preserve"> </w:t>
       </w:r>
       <w:r>
-        <w:t xml:space="preserve">8.</w:t>
+        <w:t xml:space="preserve">13.</w:t>
+      </w:r>
+      <w:r>
+        <w:t xml:space="preserve"> </w:t>
+      </w:r>
+      <w:r>
+        <w:rPr>
+          <w:bCs/>
+          <w:b/>
+        </w:rPr>
+        <w:t xml:space="preserve">In woge:</w:t>
+      </w:r>
+      <w:r>
+        <w:t xml:space="preserve"> </w:t>
+      </w:r>
+      <w:r>
+        <w:t xml:space="preserve">Body 12, Agility 15, Dodge 15; claws mark 2 boxes.</w:t>
       </w:r>
     </w:p>
     <w:p>
@@ -16795,7 +17165,7 @@
         <w:t xml:space="preserve"> </w:t>
       </w:r>
       <w:r>
-        <w:t xml:space="preserve">Occult 16 (Specialty). Trained: Wesen Lore 14, Apothecary 14, Read People 14, Medicine 14, Investigation 14, Survival 14, Persuasion 12, Riding 11, Shooting 11.</w:t>
+        <w:t xml:space="preserve">Shooting 17 (Specialty). Trained: Riding 15, Stealth 15, Brawling 15, Melee 15, Persuasion 12, Athletics 12, Tracking 11, Survival 11, Read People 11, Gambling 11.</w:t>
       </w:r>
     </w:p>
     <w:p>
@@ -16811,29 +17181,29 @@
           <w:bCs/>
           <w:b/>
         </w:rPr>
-        <w:t xml:space="preserve">Edge:</w:t>
-      </w:r>
-      <w:r>
-        <w:t xml:space="preserve"> </w:t>
-      </w:r>
-      <w:r>
-        <w:t xml:space="preserve">A friend in town: Pastor Jakob Unruh of the Volga German colony east of town, who brings her the cases his people won’t take to a doctor.</w:t>
-      </w:r>
-      <w:r>
-        <w:t xml:space="preserve"> </w:t>
-      </w:r>
-      <w:r>
-        <w:rPr>
-          <w:bCs/>
-          <w:b/>
-        </w:rPr>
-        <w:t xml:space="preserve">Lens:</w:t>
-      </w:r>
-      <w:r>
-        <w:t xml:space="preserve"> </w:t>
-      </w:r>
-      <w:r>
-        <w:t xml:space="preserve">Braucher (companion: No Payment).</w:t>
+        <w:t xml:space="preserve">Edges:</w:t>
+      </w:r>
+      <w:r>
+        <w:t xml:space="preserve"> </w:t>
+      </w:r>
+      <w:r>
+        <w:t xml:space="preserve">Extra Trained skill; True grit.</w:t>
+      </w:r>
+      <w:r>
+        <w:t xml:space="preserve"> </w:t>
+      </w:r>
+      <w:r>
+        <w:rPr>
+          <w:bCs/>
+          <w:b/>
+        </w:rPr>
+        <w:t xml:space="preserve">Advantage:</w:t>
+      </w:r>
+      <w:r>
+        <w:t xml:space="preserve"> </w:t>
+      </w:r>
+      <w:r>
+        <w:t xml:space="preserve">Plains Wanderer (companion: Restless).</w:t>
       </w:r>
       <w:r>
         <w:t xml:space="preserve"> </w:t>
@@ -16849,7 +17219,7 @@
         <w:t xml:space="preserve"> </w:t>
       </w:r>
       <w:r>
-        <w:t xml:space="preserve">Reluctant to Kill; trigger: an enemy lies wounded and helpless in front of her.</w:t>
+        <w:t xml:space="preserve">Sworn Vengeance; trigger: word of the men who burned her clan’s camp.</w:t>
       </w:r>
     </w:p>
     <w:p>
@@ -16865,20 +17235,411 @@
           <w:bCs/>
           <w:b/>
         </w:rPr>
-        <w:t xml:space="preserve">Magic:</w:t>
-      </w:r>
-      <w:r>
-        <w:t xml:space="preserve"> </w:t>
-      </w:r>
-      <w:r>
-        <w:t xml:space="preserve">works rituals with Occult at ten minutes a roll, +2 to heal, protect or break a hex; carries 3 ready charms (Occult as her Specialty). Carries a Himmelsbrief, and writes them for others.</w:t>
+        <w:t xml:space="preserve">Why I stand against the dark:</w:t>
+      </w:r>
+      <w:r>
+        <w:t xml:space="preserve"> </w:t>
+      </w:r>
+      <w:r>
+        <w:t xml:space="preserve">Something that wore a human face killed someone I loved.</w:t>
+      </w:r>
+      <w:r>
+        <w:t xml:space="preserve"> </w:t>
+      </w:r>
+      <w:r>
+        <w:rPr>
+          <w:bCs/>
+          <w:b/>
+        </w:rPr>
+        <w:t xml:space="preserve">Connection:</w:t>
+      </w:r>
+      <w:r>
+        <w:t xml:space="preserve"> </w:t>
+      </w:r>
+      <w:r>
+        <w:t xml:space="preserve">Eliza Kessler taught her what she knows about the hidden world.</w:t>
+      </w:r>
+    </w:p>
+    <w:bookmarkEnd w:id="88"/>
+    <w:bookmarkStart w:id="89" w:name="silas-thorne"/>
+    <w:p>
+      <w:pPr>
+        <w:pStyle w:val="Heading2"/>
+      </w:pPr>
+      <w:r>
+        <w:t xml:space="preserve">Silas Thorne</w:t>
+      </w:r>
+    </w:p>
+    <w:p>
+      <w:pPr>
+        <w:pStyle w:val="FirstParagraph"/>
+      </w:pPr>
+      <w:r>
+        <w:rPr>
+          <w:iCs/>
+          <w:i/>
+        </w:rPr>
+        <w:t xml:space="preserve">Professional gambler, Gambler. Ziegevolk (Tier 1); Old hand.</w:t>
+      </w:r>
+      <w:r>
+        <w:t xml:space="preserve"> </w:t>
+      </w:r>
+      <w:r>
+        <w:t xml:space="preserve">Charming, well-dressed, and in debt to the wrong people.</w:t>
       </w:r>
     </w:p>
     <w:p>
       <w:pPr>
         <w:numPr>
           <w:ilvl w:val="0"/>
-          <w:numId w:val="1025"/>
+          <w:numId w:val="1026"/>
+        </w:numPr>
+        <w:pStyle w:val="Compact"/>
+      </w:pPr>
+      <w:r>
+        <w:rPr>
+          <w:bCs/>
+          <w:b/>
+        </w:rPr>
+        <w:t xml:space="preserve">Attributes:</w:t>
+      </w:r>
+      <w:r>
+        <w:t xml:space="preserve"> </w:t>
+      </w:r>
+      <w:r>
+        <w:t xml:space="preserve">Body 10, Agility 10, Intellect 13, Presence 13, Will 9.</w:t>
+      </w:r>
+      <w:r>
+        <w:t xml:space="preserve"> </w:t>
+      </w:r>
+      <w:r>
+        <w:rPr>
+          <w:bCs/>
+          <w:b/>
+        </w:rPr>
+        <w:t xml:space="preserve">Dodge</w:t>
+      </w:r>
+      <w:r>
+        <w:t xml:space="preserve"> </w:t>
+      </w:r>
+      <w:r>
+        <w:t xml:space="preserve">8.</w:t>
+      </w:r>
+    </w:p>
+    <w:p>
+      <w:pPr>
+        <w:numPr>
+          <w:ilvl w:val="0"/>
+          <w:numId w:val="1026"/>
+        </w:numPr>
+        <w:pStyle w:val="Compact"/>
+      </w:pPr>
+      <w:r>
+        <w:rPr>
+          <w:bCs/>
+          <w:b/>
+        </w:rPr>
+        <w:t xml:space="preserve">Skills:</w:t>
+      </w:r>
+      <w:r>
+        <w:t xml:space="preserve"> </w:t>
+      </w:r>
+      <w:r>
+        <w:t xml:space="preserve">Gambling 18 (Expert). Trained: Deception 14, Persuasion 14, Read People 14, Investigation 14, Shooting 11, Stealth 11, Riding 11.</w:t>
+      </w:r>
+    </w:p>
+    <w:p>
+      <w:pPr>
+        <w:numPr>
+          <w:ilvl w:val="0"/>
+          <w:numId w:val="1026"/>
+        </w:numPr>
+        <w:pStyle w:val="Compact"/>
+      </w:pPr>
+      <w:r>
+        <w:rPr>
+          <w:bCs/>
+          <w:b/>
+        </w:rPr>
+        <w:t xml:space="preserve">Edges:</w:t>
+      </w:r>
+      <w:r>
+        <w:t xml:space="preserve"> </w:t>
+      </w:r>
+      <w:r>
+        <w:t xml:space="preserve">Second advantage: Poker Face; a friend in town: Mae Lin, a faro dealer who hears everything said at her table.</w:t>
+      </w:r>
+      <w:r>
+        <w:t xml:space="preserve"> </w:t>
+      </w:r>
+      <w:r>
+        <w:rPr>
+          <w:bCs/>
+          <w:b/>
+        </w:rPr>
+        <w:t xml:space="preserve">Advantage:</w:t>
+      </w:r>
+      <w:r>
+        <w:t xml:space="preserve"> </w:t>
+      </w:r>
+      <w:r>
+        <w:t xml:space="preserve">Ziegevolk Pheromones (companion: Pheromone Suspicion).</w:t>
+      </w:r>
+      <w:r>
+        <w:t xml:space="preserve"> </w:t>
+      </w:r>
+      <w:r>
+        <w:rPr>
+          <w:bCs/>
+          <w:b/>
+        </w:rPr>
+        <w:t xml:space="preserve">Complication:</w:t>
+      </w:r>
+      <w:r>
+        <w:t xml:space="preserve"> </w:t>
+      </w:r>
+      <w:r>
+        <w:t xml:space="preserve">Owes the Wrong People; trigger: a debt collector arrives.</w:t>
+      </w:r>
+    </w:p>
+    <w:p>
+      <w:pPr>
+        <w:numPr>
+          <w:ilvl w:val="0"/>
+          <w:numId w:val="1026"/>
+        </w:numPr>
+        <w:pStyle w:val="Compact"/>
+      </w:pPr>
+      <w:r>
+        <w:rPr>
+          <w:bCs/>
+          <w:b/>
+        </w:rPr>
+        <w:t xml:space="preserve">Why I stand against the dark:</w:t>
+      </w:r>
+      <w:r>
+        <w:t xml:space="preserve"> </w:t>
+      </w:r>
+      <w:r>
+        <w:t xml:space="preserve">The pay’s good, and nobody else will take these jobs.</w:t>
+      </w:r>
+      <w:r>
+        <w:t xml:space="preserve"> </w:t>
+      </w:r>
+      <w:r>
+        <w:rPr>
+          <w:bCs/>
+          <w:b/>
+        </w:rPr>
+        <w:t xml:space="preserve">Connection:</w:t>
+      </w:r>
+      <w:r>
+        <w:t xml:space="preserve"> </w:t>
+      </w:r>
+      <w:r>
+        <w:t xml:space="preserve">Plays cards with Cora every Saturday; she’s the only one who can tell when he’s bluffing.</w:t>
+      </w:r>
+    </w:p>
+    <w:bookmarkEnd w:id="89"/>
+    <w:bookmarkStart w:id="90" w:name="magdalena-lena-baer"/>
+    <w:p>
+      <w:pPr>
+        <w:pStyle w:val="Heading2"/>
+      </w:pPr>
+      <w:r>
+        <w:t xml:space="preserve">Magdalena</w:t>
+      </w:r>
+      <w:r>
+        <w:t xml:space="preserve"> </w:t>
+      </w:r>
+      <w:r>
+        <w:t xml:space="preserve">“</w:t>
+      </w:r>
+      <w:r>
+        <w:t xml:space="preserve">Lena</w:t>
+      </w:r>
+      <w:r>
+        <w:t xml:space="preserve">”</w:t>
+      </w:r>
+      <w:r>
+        <w:t xml:space="preserve"> </w:t>
+      </w:r>
+      <w:r>
+        <w:t xml:space="preserve">Baer</w:t>
+      </w:r>
+    </w:p>
+    <w:p>
+      <w:pPr>
+        <w:pStyle w:val="FirstParagraph"/>
+      </w:pPr>
+      <w:r>
+        <w:rPr>
+          <w:iCs/>
+          <w:i/>
+        </w:rPr>
+        <w:t xml:space="preserve">Braucher, Occultist. Incantare (Tier 2).</w:t>
+      </w:r>
+      <w:r>
+        <w:t xml:space="preserve"> </w:t>
+      </w:r>
+      <w:r>
+        <w:t xml:space="preserve">Came west from Lancaster County with a wagon, a Bible and her grandmother’s</w:t>
+      </w:r>
+      <w:r>
+        <w:t xml:space="preserve"> </w:t>
+      </w:r>
+      <w:r>
+        <w:rPr>
+          <w:iCs/>
+          <w:i/>
+        </w:rPr>
+        <w:t xml:space="preserve">Long Lost Friend</w:t>
+      </w:r>
+      <w:r>
+        <w:t xml:space="preserve">. Heals for gifts, and breaks hexes for no one’s money.</w:t>
+      </w:r>
+    </w:p>
+    <w:p>
+      <w:pPr>
+        <w:numPr>
+          <w:ilvl w:val="0"/>
+          <w:numId w:val="1027"/>
+        </w:numPr>
+        <w:pStyle w:val="Compact"/>
+      </w:pPr>
+      <w:r>
+        <w:rPr>
+          <w:bCs/>
+          <w:b/>
+        </w:rPr>
+        <w:t xml:space="preserve">Attributes:</w:t>
+      </w:r>
+      <w:r>
+        <w:t xml:space="preserve"> </w:t>
+      </w:r>
+      <w:r>
+        <w:t xml:space="preserve">Body 9, Agility 10, Intellect 13, Presence 11, Will 12.</w:t>
+      </w:r>
+      <w:r>
+        <w:t xml:space="preserve"> </w:t>
+      </w:r>
+      <w:r>
+        <w:rPr>
+          <w:bCs/>
+          <w:b/>
+        </w:rPr>
+        <w:t xml:space="preserve">Dodge</w:t>
+      </w:r>
+      <w:r>
+        <w:t xml:space="preserve"> </w:t>
+      </w:r>
+      <w:r>
+        <w:t xml:space="preserve">8.</w:t>
+      </w:r>
+    </w:p>
+    <w:p>
+      <w:pPr>
+        <w:numPr>
+          <w:ilvl w:val="0"/>
+          <w:numId w:val="1027"/>
+        </w:numPr>
+        <w:pStyle w:val="Compact"/>
+      </w:pPr>
+      <w:r>
+        <w:rPr>
+          <w:bCs/>
+          <w:b/>
+        </w:rPr>
+        <w:t xml:space="preserve">Skills:</w:t>
+      </w:r>
+      <w:r>
+        <w:t xml:space="preserve"> </w:t>
+      </w:r>
+      <w:r>
+        <w:t xml:space="preserve">Occult 16 (Specialty). Trained: Wesen Lore 14, Apothecary 14, Read People 14, Medicine 14, Investigation 14, Survival 14, Persuasion 12, Riding 11, Shooting 11.</w:t>
+      </w:r>
+    </w:p>
+    <w:p>
+      <w:pPr>
+        <w:numPr>
+          <w:ilvl w:val="0"/>
+          <w:numId w:val="1027"/>
+        </w:numPr>
+        <w:pStyle w:val="Compact"/>
+      </w:pPr>
+      <w:r>
+        <w:rPr>
+          <w:bCs/>
+          <w:b/>
+        </w:rPr>
+        <w:t xml:space="preserve">Edge:</w:t>
+      </w:r>
+      <w:r>
+        <w:t xml:space="preserve"> </w:t>
+      </w:r>
+      <w:r>
+        <w:t xml:space="preserve">A friend in town: Pastor Jakob Unruh of the Volga German colony east of town, who brings her the cases his people won’t take to a doctor.</w:t>
+      </w:r>
+      <w:r>
+        <w:t xml:space="preserve"> </w:t>
+      </w:r>
+      <w:r>
+        <w:rPr>
+          <w:bCs/>
+          <w:b/>
+        </w:rPr>
+        <w:t xml:space="preserve">Lens:</w:t>
+      </w:r>
+      <w:r>
+        <w:t xml:space="preserve"> </w:t>
+      </w:r>
+      <w:r>
+        <w:t xml:space="preserve">Braucher (companion: No Payment).</w:t>
+      </w:r>
+      <w:r>
+        <w:t xml:space="preserve"> </w:t>
+      </w:r>
+      <w:r>
+        <w:rPr>
+          <w:bCs/>
+          <w:b/>
+        </w:rPr>
+        <w:t xml:space="preserve">Complication:</w:t>
+      </w:r>
+      <w:r>
+        <w:t xml:space="preserve"> </w:t>
+      </w:r>
+      <w:r>
+        <w:t xml:space="preserve">Reluctant to Kill; trigger: an enemy lies wounded and helpless in front of her.</w:t>
+      </w:r>
+    </w:p>
+    <w:p>
+      <w:pPr>
+        <w:numPr>
+          <w:ilvl w:val="0"/>
+          <w:numId w:val="1027"/>
+        </w:numPr>
+        <w:pStyle w:val="Compact"/>
+      </w:pPr>
+      <w:r>
+        <w:rPr>
+          <w:bCs/>
+          <w:b/>
+        </w:rPr>
+        <w:t xml:space="preserve">Magic:</w:t>
+      </w:r>
+      <w:r>
+        <w:t xml:space="preserve"> </w:t>
+      </w:r>
+      <w:r>
+        <w:t xml:space="preserve">works rituals with Occult at ten minutes a roll, +2 to heal, protect or break a hex; carries 3 ready charms (Occult as her Specialty). Carries a Himmelsbrief, and writes them for others.</w:t>
+      </w:r>
+    </w:p>
+    <w:p>
+      <w:pPr>
+        <w:numPr>
+          <w:ilvl w:val="0"/>
+          <w:numId w:val="1027"/>
         </w:numPr>
         <w:pStyle w:val="Compact"/>
       </w:pPr>
@@ -18180,9 +18941,9 @@
         <w:t xml:space="preserve">For a tougher version, add +1 to its targets and one box; for a weaker one, subtract.</w:t>
       </w:r>
     </w:p>
-    <w:bookmarkEnd w:id="89"/>
     <w:bookmarkEnd w:id="90"/>
-    <w:bookmarkStart w:id="91" w:name="advantages"/>
+    <w:bookmarkEnd w:id="91"/>
+    <w:bookmarkStart w:id="92" w:name="advantages"/>
     <w:p>
       <w:pPr>
         <w:pStyle w:val="Heading1"/>
@@ -18938,8 +19699,8 @@
         <w:t xml:space="preserve">A badge is legal authority, not a magic word: Wesen, outlaws and the powers of the hidden world don’t care about it, and it carries a duty. Your superiors can give you orders, and abusing the badge or failing in your duty can cost you it. Law callings (Marshal, Deputy) usually take one, as their advantage or as a second advantage Edge. A Pinkerton detective takes Pinkerton Credentials instead: the agency’s reach and files, but no badge.</w:t>
       </w:r>
     </w:p>
-    <w:bookmarkEnd w:id="91"/>
-    <w:bookmarkStart w:id="113" w:name="heritages"/>
+    <w:bookmarkEnd w:id="92"/>
+    <w:bookmarkStart w:id="114" w:name="heritages"/>
     <w:p>
       <w:pPr>
         <w:pStyle w:val="Heading1"/>
@@ -20344,7 +21105,7 @@
         </w:tc>
       </w:tr>
     </w:tbl>
-    <w:bookmarkStart w:id="92" w:name="core-wesen-rules"/>
+    <w:bookmarkStart w:id="93" w:name="core-wesen-rules"/>
     <w:p>
       <w:pPr>
         <w:pStyle w:val="Heading2"/>
@@ -20656,8 +21417,8 @@
         <w:t xml:space="preserve">means each hit that marks 2 or more boxes marks one fewer, never below 1.</w:t>
       </w:r>
     </w:p>
-    <w:bookmarkEnd w:id="92"/>
-    <w:bookmarkStart w:id="93" w:name="human"/>
+    <w:bookmarkEnd w:id="93"/>
+    <w:bookmarkStart w:id="94" w:name="human"/>
     <w:p>
       <w:pPr>
         <w:pStyle w:val="Heading2"/>
@@ -20890,8 +21651,8 @@
         </w:tc>
       </w:tr>
     </w:tbl>
-    <w:bookmarkEnd w:id="93"/>
-    <w:bookmarkStart w:id="94" w:name="bauerschwein"/>
+    <w:bookmarkEnd w:id="94"/>
+    <w:bookmarkStart w:id="95" w:name="bauerschwein"/>
     <w:p>
       <w:pPr>
         <w:pStyle w:val="Heading2"/>
@@ -20936,7 +21697,7 @@
       <w:pPr>
         <w:numPr>
           <w:ilvl w:val="0"/>
-          <w:numId w:val="1026"/>
+          <w:numId w:val="1028"/>
         </w:numPr>
         <w:pStyle w:val="Compact"/>
       </w:pPr>
@@ -21184,8 +21945,8 @@
         </w:tc>
       </w:tr>
     </w:tbl>
-    <w:bookmarkEnd w:id="94"/>
-    <w:bookmarkStart w:id="95" w:name="coyotl"/>
+    <w:bookmarkEnd w:id="95"/>
+    <w:bookmarkStart w:id="96" w:name="coyotl"/>
     <w:p>
       <w:pPr>
         <w:pStyle w:val="Heading2"/>
@@ -21454,8 +22215,8 @@
         </w:tc>
       </w:tr>
     </w:tbl>
-    <w:bookmarkEnd w:id="95"/>
-    <w:bookmarkStart w:id="96" w:name="eisbiber"/>
+    <w:bookmarkEnd w:id="96"/>
+    <w:bookmarkStart w:id="97" w:name="eisbiber"/>
     <w:p>
       <w:pPr>
         <w:pStyle w:val="Heading2"/>
@@ -21724,8 +22485,8 @@
         </w:tc>
       </w:tr>
     </w:tbl>
-    <w:bookmarkEnd w:id="96"/>
-    <w:bookmarkStart w:id="97" w:name="fuchsbau"/>
+    <w:bookmarkEnd w:id="97"/>
+    <w:bookmarkStart w:id="98" w:name="fuchsbau"/>
     <w:p>
       <w:pPr>
         <w:pStyle w:val="Heading2"/>
@@ -22056,8 +22817,8 @@
         </w:tc>
       </w:tr>
     </w:tbl>
-    <w:bookmarkEnd w:id="97"/>
-    <w:bookmarkStart w:id="98" w:name="mauzhertz"/>
+    <w:bookmarkEnd w:id="98"/>
+    <w:bookmarkStart w:id="99" w:name="mauzhertz"/>
     <w:p>
       <w:pPr>
         <w:pStyle w:val="Heading2"/>
@@ -22326,8 +23087,8 @@
         </w:tc>
       </w:tr>
     </w:tbl>
-    <w:bookmarkEnd w:id="98"/>
-    <w:bookmarkStart w:id="99" w:name="steinadler"/>
+    <w:bookmarkEnd w:id="99"/>
+    <w:bookmarkStart w:id="100" w:name="steinadler"/>
     <w:p>
       <w:pPr>
         <w:pStyle w:val="Heading2"/>
@@ -22596,8 +23357,8 @@
         </w:tc>
       </w:tr>
     </w:tbl>
-    <w:bookmarkEnd w:id="99"/>
-    <w:bookmarkStart w:id="100" w:name="taniwha"/>
+    <w:bookmarkEnd w:id="100"/>
+    <w:bookmarkStart w:id="101" w:name="taniwha"/>
     <w:p>
       <w:pPr>
         <w:pStyle w:val="Heading2"/>
@@ -22642,7 +23403,7 @@
       <w:pPr>
         <w:numPr>
           <w:ilvl w:val="0"/>
-          <w:numId w:val="1027"/>
+          <w:numId w:val="1029"/>
         </w:numPr>
         <w:pStyle w:val="Compact"/>
       </w:pPr>
@@ -22654,7 +23415,7 @@
       <w:pPr>
         <w:numPr>
           <w:ilvl w:val="0"/>
-          <w:numId w:val="1027"/>
+          <w:numId w:val="1029"/>
         </w:numPr>
         <w:pStyle w:val="Compact"/>
       </w:pPr>
@@ -22918,8 +23679,8 @@
         </w:tc>
       </w:tr>
     </w:tbl>
-    <w:bookmarkEnd w:id="100"/>
-    <w:bookmarkStart w:id="101" w:name="ziegevolk"/>
+    <w:bookmarkEnd w:id="101"/>
+    <w:bookmarkStart w:id="102" w:name="ziegevolk"/>
     <w:p>
       <w:pPr>
         <w:pStyle w:val="Heading2"/>
@@ -23188,8 +23949,8 @@
         </w:tc>
       </w:tr>
     </w:tbl>
-    <w:bookmarkEnd w:id="101"/>
-    <w:bookmarkStart w:id="102" w:name="blutbad"/>
+    <w:bookmarkEnd w:id="102"/>
+    <w:bookmarkStart w:id="103" w:name="blutbad"/>
     <w:p>
       <w:pPr>
         <w:pStyle w:val="Heading2"/>
@@ -23234,7 +23995,7 @@
       <w:pPr>
         <w:numPr>
           <w:ilvl w:val="0"/>
-          <w:numId w:val="1028"/>
+          <w:numId w:val="1030"/>
         </w:numPr>
         <w:pStyle w:val="Compact"/>
       </w:pPr>
@@ -23544,8 +24305,8 @@
         </w:tc>
       </w:tr>
     </w:tbl>
-    <w:bookmarkEnd w:id="102"/>
-    <w:bookmarkStart w:id="103" w:name="grimm"/>
+    <w:bookmarkEnd w:id="103"/>
+    <w:bookmarkStart w:id="104" w:name="grimm"/>
     <w:p>
       <w:pPr>
         <w:pStyle w:val="Heading2"/>
@@ -23590,7 +24351,7 @@
       <w:pPr>
         <w:numPr>
           <w:ilvl w:val="0"/>
-          <w:numId w:val="1029"/>
+          <w:numId w:val="1031"/>
         </w:numPr>
         <w:pStyle w:val="Compact"/>
       </w:pPr>
@@ -23602,7 +24363,7 @@
       <w:pPr>
         <w:numPr>
           <w:ilvl w:val="0"/>
-          <w:numId w:val="1029"/>
+          <w:numId w:val="1031"/>
         </w:numPr>
         <w:pStyle w:val="Compact"/>
       </w:pPr>
@@ -23614,7 +24375,7 @@
       <w:pPr>
         <w:numPr>
           <w:ilvl w:val="0"/>
-          <w:numId w:val="1029"/>
+          <w:numId w:val="1031"/>
         </w:numPr>
         <w:pStyle w:val="Compact"/>
       </w:pPr>
@@ -23626,7 +24387,7 @@
       <w:pPr>
         <w:numPr>
           <w:ilvl w:val="0"/>
-          <w:numId w:val="1029"/>
+          <w:numId w:val="1031"/>
         </w:numPr>
         <w:pStyle w:val="Compact"/>
       </w:pPr>
@@ -23638,7 +24399,7 @@
       <w:pPr>
         <w:numPr>
           <w:ilvl w:val="0"/>
-          <w:numId w:val="1029"/>
+          <w:numId w:val="1031"/>
         </w:numPr>
         <w:pStyle w:val="Compact"/>
       </w:pPr>
@@ -23650,7 +24411,7 @@
       <w:pPr>
         <w:numPr>
           <w:ilvl w:val="0"/>
-          <w:numId w:val="1029"/>
+          <w:numId w:val="1031"/>
         </w:numPr>
         <w:pStyle w:val="Compact"/>
       </w:pPr>
@@ -23662,7 +24423,7 @@
       <w:pPr>
         <w:numPr>
           <w:ilvl w:val="0"/>
-          <w:numId w:val="1029"/>
+          <w:numId w:val="1031"/>
         </w:numPr>
         <w:pStyle w:val="Compact"/>
       </w:pPr>
@@ -24450,8 +25211,8 @@
         </w:tc>
       </w:tr>
     </w:tbl>
-    <w:bookmarkEnd w:id="103"/>
-    <w:bookmarkStart w:id="104" w:name="incantare"/>
+    <w:bookmarkEnd w:id="104"/>
+    <w:bookmarkStart w:id="105" w:name="incantare"/>
     <w:p>
       <w:pPr>
         <w:pStyle w:val="Heading2"/>
@@ -24496,7 +25257,7 @@
       <w:pPr>
         <w:numPr>
           <w:ilvl w:val="0"/>
-          <w:numId w:val="1030"/>
+          <w:numId w:val="1032"/>
         </w:numPr>
         <w:pStyle w:val="Compact"/>
       </w:pPr>
@@ -24508,7 +25269,7 @@
       <w:pPr>
         <w:numPr>
           <w:ilvl w:val="0"/>
-          <w:numId w:val="1030"/>
+          <w:numId w:val="1032"/>
         </w:numPr>
         <w:pStyle w:val="Compact"/>
       </w:pPr>
@@ -24520,7 +25281,7 @@
       <w:pPr>
         <w:numPr>
           <w:ilvl w:val="0"/>
-          <w:numId w:val="1030"/>
+          <w:numId w:val="1032"/>
         </w:numPr>
         <w:pStyle w:val="Compact"/>
       </w:pPr>
@@ -25122,8 +25883,8 @@
         </w:tc>
       </w:tr>
     </w:tbl>
-    <w:bookmarkEnd w:id="104"/>
-    <w:bookmarkStart w:id="105" w:name="jägerbär"/>
+    <w:bookmarkEnd w:id="105"/>
+    <w:bookmarkStart w:id="106" w:name="jägerbär"/>
     <w:p>
       <w:pPr>
         <w:pStyle w:val="Heading2"/>
@@ -25392,8 +26153,8 @@
         </w:tc>
       </w:tr>
     </w:tbl>
-    <w:bookmarkEnd w:id="105"/>
-    <w:bookmarkStart w:id="106" w:name="mauvais-dentes"/>
+    <w:bookmarkEnd w:id="106"/>
+    <w:bookmarkStart w:id="107" w:name="mauvais-dentes"/>
     <w:p>
       <w:pPr>
         <w:pStyle w:val="Heading2"/>
@@ -25438,7 +26199,7 @@
       <w:pPr>
         <w:numPr>
           <w:ilvl w:val="0"/>
-          <w:numId w:val="1031"/>
+          <w:numId w:val="1033"/>
         </w:numPr>
         <w:pStyle w:val="Compact"/>
       </w:pPr>
@@ -25686,8 +26447,8 @@
         </w:tc>
       </w:tr>
     </w:tbl>
-    <w:bookmarkEnd w:id="106"/>
-    <w:bookmarkStart w:id="107" w:name="naschazer"/>
+    <w:bookmarkEnd w:id="107"/>
+    <w:bookmarkStart w:id="108" w:name="naschazer"/>
     <w:p>
       <w:pPr>
         <w:pStyle w:val="Heading2"/>
@@ -25732,7 +26493,7 @@
       <w:pPr>
         <w:numPr>
           <w:ilvl w:val="0"/>
-          <w:numId w:val="1032"/>
+          <w:numId w:val="1034"/>
         </w:numPr>
         <w:pStyle w:val="Compact"/>
       </w:pPr>
@@ -25980,8 +26741,8 @@
         </w:tc>
       </w:tr>
     </w:tbl>
-    <w:bookmarkEnd w:id="107"/>
-    <w:bookmarkStart w:id="108" w:name="skalengeck"/>
+    <w:bookmarkEnd w:id="108"/>
+    <w:bookmarkStart w:id="109" w:name="skalengeck"/>
     <w:p>
       <w:pPr>
         <w:pStyle w:val="Heading2"/>
@@ -26250,8 +27011,8 @@
         </w:tc>
       </w:tr>
     </w:tbl>
-    <w:bookmarkEnd w:id="108"/>
-    <w:bookmarkStart w:id="109" w:name="vallachi"/>
+    <w:bookmarkEnd w:id="109"/>
+    <w:bookmarkStart w:id="110" w:name="vallachi"/>
     <w:p>
       <w:pPr>
         <w:pStyle w:val="Heading2"/>
@@ -26296,7 +27057,7 @@
       <w:pPr>
         <w:numPr>
           <w:ilvl w:val="0"/>
-          <w:numId w:val="1033"/>
+          <w:numId w:val="1035"/>
         </w:numPr>
         <w:pStyle w:val="Compact"/>
       </w:pPr>
@@ -26308,7 +27069,7 @@
       <w:pPr>
         <w:numPr>
           <w:ilvl w:val="0"/>
-          <w:numId w:val="1033"/>
+          <w:numId w:val="1035"/>
         </w:numPr>
         <w:pStyle w:val="Compact"/>
       </w:pPr>
@@ -26320,7 +27081,7 @@
       <w:pPr>
         <w:numPr>
           <w:ilvl w:val="0"/>
-          <w:numId w:val="1033"/>
+          <w:numId w:val="1035"/>
         </w:numPr>
         <w:pStyle w:val="Compact"/>
       </w:pPr>
@@ -26332,7 +27093,7 @@
       <w:pPr>
         <w:numPr>
           <w:ilvl w:val="0"/>
-          <w:numId w:val="1033"/>
+          <w:numId w:val="1035"/>
         </w:numPr>
         <w:pStyle w:val="Compact"/>
       </w:pPr>
@@ -26580,8 +27341,8 @@
         </w:tc>
       </w:tr>
     </w:tbl>
-    <w:bookmarkEnd w:id="109"/>
-    <w:bookmarkStart w:id="110" w:name="fuchsteufelwild"/>
+    <w:bookmarkEnd w:id="110"/>
+    <w:bookmarkStart w:id="111" w:name="fuchsteufelwild"/>
     <w:p>
       <w:pPr>
         <w:pStyle w:val="Heading2"/>
@@ -26626,7 +27387,7 @@
       <w:pPr>
         <w:numPr>
           <w:ilvl w:val="0"/>
-          <w:numId w:val="1034"/>
+          <w:numId w:val="1036"/>
         </w:numPr>
         <w:pStyle w:val="Compact"/>
       </w:pPr>
@@ -26638,7 +27399,7 @@
       <w:pPr>
         <w:numPr>
           <w:ilvl w:val="0"/>
-          <w:numId w:val="1034"/>
+          <w:numId w:val="1036"/>
         </w:numPr>
         <w:pStyle w:val="Compact"/>
       </w:pPr>
@@ -26902,8 +27663,8 @@
         </w:tc>
       </w:tr>
     </w:tbl>
-    <w:bookmarkEnd w:id="110"/>
-    <w:bookmarkStart w:id="111" w:name="hexenbiest-or-zauberbiest"/>
+    <w:bookmarkEnd w:id="111"/>
+    <w:bookmarkStart w:id="112" w:name="hexenbiest-or-zauberbiest"/>
     <w:p>
       <w:pPr>
         <w:pStyle w:val="Heading2"/>
@@ -26948,7 +27709,7 @@
       <w:pPr>
         <w:numPr>
           <w:ilvl w:val="0"/>
-          <w:numId w:val="1035"/>
+          <w:numId w:val="1037"/>
         </w:numPr>
         <w:pStyle w:val="Compact"/>
       </w:pPr>
@@ -26960,7 +27721,7 @@
       <w:pPr>
         <w:numPr>
           <w:ilvl w:val="0"/>
-          <w:numId w:val="1035"/>
+          <w:numId w:val="1037"/>
         </w:numPr>
         <w:pStyle w:val="Compact"/>
       </w:pPr>
@@ -26972,7 +27733,7 @@
       <w:pPr>
         <w:numPr>
           <w:ilvl w:val="0"/>
-          <w:numId w:val="1035"/>
+          <w:numId w:val="1037"/>
         </w:numPr>
         <w:pStyle w:val="Compact"/>
       </w:pPr>
@@ -27298,8 +28059,8 @@
         </w:tc>
       </w:tr>
     </w:tbl>
-    <w:bookmarkEnd w:id="111"/>
-    <w:bookmarkStart w:id="112" w:name="murcielago"/>
+    <w:bookmarkEnd w:id="112"/>
+    <w:bookmarkStart w:id="113" w:name="murcielago"/>
     <w:p>
       <w:pPr>
         <w:pStyle w:val="Heading2"/>
@@ -27344,7 +28105,7 @@
       <w:pPr>
         <w:numPr>
           <w:ilvl w:val="0"/>
-          <w:numId w:val="1036"/>
+          <w:numId w:val="1038"/>
         </w:numPr>
         <w:pStyle w:val="Compact"/>
       </w:pPr>
@@ -27592,9 +28353,9 @@
         </w:tc>
       </w:tr>
     </w:tbl>
-    <w:bookmarkEnd w:id="112"/>
     <w:bookmarkEnd w:id="113"/>
-    <w:bookmarkStart w:id="124" w:name="making-your-own"/>
+    <w:bookmarkEnd w:id="114"/>
+    <w:bookmarkStart w:id="125" w:name="making-your-own"/>
     <w:p>
       <w:pPr>
         <w:pStyle w:val="Heading1"/>
@@ -27627,7 +28388,7 @@
         <w:t xml:space="preserve">option at the end of each list, and its checklist holds a custom choice to the same rules as everything else.</w:t>
       </w:r>
     </w:p>
-    <w:bookmarkStart w:id="114" w:name="a-custom-calling"/>
+    <w:bookmarkStart w:id="115" w:name="a-custom-calling"/>
     <w:p>
       <w:pPr>
         <w:pStyle w:val="Heading2"/>
@@ -27648,7 +28409,7 @@
       <w:pPr>
         <w:numPr>
           <w:ilvl w:val="0"/>
-          <w:numId w:val="1037"/>
+          <w:numId w:val="1039"/>
         </w:numPr>
         <w:pStyle w:val="Compact"/>
       </w:pPr>
@@ -27694,7 +28455,7 @@
       <w:pPr>
         <w:numPr>
           <w:ilvl w:val="0"/>
-          <w:numId w:val="1037"/>
+          <w:numId w:val="1039"/>
         </w:numPr>
         <w:pStyle w:val="Compact"/>
       </w:pPr>
@@ -27716,7 +28477,7 @@
       <w:pPr>
         <w:numPr>
           <w:ilvl w:val="0"/>
-          <w:numId w:val="1037"/>
+          <w:numId w:val="1039"/>
         </w:numPr>
         <w:pStyle w:val="Compact"/>
       </w:pPr>
@@ -27738,7 +28499,7 @@
       <w:pPr>
         <w:numPr>
           <w:ilvl w:val="0"/>
-          <w:numId w:val="1037"/>
+          <w:numId w:val="1039"/>
         </w:numPr>
         <w:pStyle w:val="Compact"/>
       </w:pPr>
@@ -27803,8 +28564,8 @@
         <w:t xml:space="preserve">.</w:t>
       </w:r>
     </w:p>
-    <w:bookmarkEnd w:id="114"/>
-    <w:bookmarkStart w:id="123" w:name="a-custom-heritage"/>
+    <w:bookmarkEnd w:id="115"/>
+    <w:bookmarkStart w:id="124" w:name="a-custom-heritage"/>
     <w:p>
       <w:pPr>
         <w:pStyle w:val="Heading2"/>
@@ -27821,7 +28582,7 @@
         <w:t xml:space="preserve">Build it with the GM, one step at a time.</w:t>
       </w:r>
     </w:p>
-    <w:bookmarkStart w:id="115" w:name="the-concept"/>
+    <w:bookmarkStart w:id="116" w:name="the-concept"/>
     <w:p>
       <w:pPr>
         <w:pStyle w:val="Heading3"/>
@@ -27838,8 +28599,8 @@
         <w:t xml:space="preserve">Two or three sentences: where they come from, what sets them apart, and how others see them. It should be something the heritages in this book don’t already cover.</w:t>
       </w:r>
     </w:p>
-    <w:bookmarkEnd w:id="115"/>
-    <w:bookmarkStart w:id="116" w:name="the-tier"/>
+    <w:bookmarkEnd w:id="116"/>
+    <w:bookmarkStart w:id="117" w:name="the-tier"/>
     <w:p>
       <w:pPr>
         <w:pStyle w:val="Heading3"/>
@@ -28136,8 +28897,8 @@
         <w:t xml:space="preserve">When in doubt, choose the higher tier.</w:t>
       </w:r>
     </w:p>
-    <w:bookmarkEnd w:id="116"/>
-    <w:bookmarkStart w:id="117" w:name="attribute-adjustments"/>
+    <w:bookmarkEnd w:id="117"/>
+    <w:bookmarkStart w:id="118" w:name="attribute-adjustments"/>
     <w:p>
       <w:pPr>
         <w:pStyle w:val="Heading3"/>
@@ -28183,8 +28944,8 @@
         <w:t xml:space="preserve">: a +2 needs a −2 or two −1s. The adjustments move the attribute’s base (+1 starts it at 11) and raise its starting maximum (13 plus the bonus). Most heritages change two to four attributes.</w:t>
       </w:r>
     </w:p>
-    <w:bookmarkEnd w:id="117"/>
-    <w:bookmarkStart w:id="118" w:name="core-rules-tier-1-and-up"/>
+    <w:bookmarkEnd w:id="118"/>
+    <w:bookmarkStart w:id="119" w:name="core-rules-tier-1-and-up"/>
     <w:p>
       <w:pPr>
         <w:pStyle w:val="Heading3"/>
@@ -28201,8 +28962,8 @@
         <w:t xml:space="preserve">One to three short rules that always apply: what they can do (see in the dark, resist cold, a free Trained skill) and what it costs (a weakness, a people’s distrust, a hazard they can’t abide). A strength with no drawback is worth more than it looks, so price it a tier higher.</w:t>
       </w:r>
     </w:p>
-    <w:bookmarkEnd w:id="118"/>
-    <w:bookmarkStart w:id="119" w:name="heritage-advantages"/>
+    <w:bookmarkEnd w:id="119"/>
+    <w:bookmarkStart w:id="120" w:name="heritage-advantages"/>
     <w:p>
       <w:pPr>
         <w:pStyle w:val="Heading3"/>
@@ -28257,8 +29018,8 @@
         <w:t xml:space="preserve">: a problem the trait causes, with a clear trigger and a real consequence, which earns a Grit point when it bites, like any complication. A character takes one advantage, general or heritage, so make them distinct choices.</w:t>
       </w:r>
     </w:p>
-    <w:bookmarkEnd w:id="119"/>
-    <w:bookmarkStart w:id="120" w:name="a-woge-optional-tier-2-or-3"/>
+    <w:bookmarkEnd w:id="120"/>
+    <w:bookmarkStart w:id="121" w:name="a-woge-optional-tier-2-or-3"/>
     <w:p>
       <w:pPr>
         <w:pStyle w:val="Heading3"/>
@@ -28291,8 +29052,8 @@
         <w:t xml:space="preserve">apply.</w:t>
       </w:r>
     </w:p>
-    <w:bookmarkEnd w:id="120"/>
-    <w:bookmarkStart w:id="121" w:name="in-the-creator"/>
+    <w:bookmarkEnd w:id="121"/>
+    <w:bookmarkStart w:id="122" w:name="in-the-creator"/>
     <w:p>
       <w:pPr>
         <w:pStyle w:val="Heading3"/>
@@ -28305,7 +29066,7 @@
       <w:pPr>
         <w:numPr>
           <w:ilvl w:val="0"/>
-          <w:numId w:val="1038"/>
+          <w:numId w:val="1040"/>
         </w:numPr>
         <w:pStyle w:val="Compact"/>
       </w:pPr>
@@ -28333,7 +29094,7 @@
       <w:pPr>
         <w:numPr>
           <w:ilvl w:val="0"/>
-          <w:numId w:val="1038"/>
+          <w:numId w:val="1040"/>
         </w:numPr>
         <w:pStyle w:val="Compact"/>
       </w:pPr>
@@ -28345,7 +29106,7 @@
       <w:pPr>
         <w:numPr>
           <w:ilvl w:val="0"/>
-          <w:numId w:val="1038"/>
+          <w:numId w:val="1040"/>
         </w:numPr>
         <w:pStyle w:val="Compact"/>
       </w:pPr>
@@ -28373,7 +29134,7 @@
       <w:pPr>
         <w:numPr>
           <w:ilvl w:val="0"/>
-          <w:numId w:val="1038"/>
+          <w:numId w:val="1040"/>
         </w:numPr>
         <w:pStyle w:val="Compact"/>
       </w:pPr>
@@ -28397,8 +29158,8 @@
         <w:t xml:space="preserve">and enter the advantage and its companion complication.</w:t>
       </w:r>
     </w:p>
-    <w:bookmarkEnd w:id="121"/>
-    <w:bookmarkStart w:id="122" w:name="example"/>
+    <w:bookmarkEnd w:id="122"/>
+    <w:bookmarkStart w:id="123" w:name="example"/>
     <w:p>
       <w:pPr>
         <w:pStyle w:val="Heading3"/>
@@ -28503,10 +29264,10 @@
         <w:t xml:space="preserve">: Wesen recognize their own, and some want you back in the fold; accept the visit at the worst time.</w:t>
       </w:r>
     </w:p>
-    <w:bookmarkEnd w:id="122"/>
     <w:bookmarkEnd w:id="123"/>
     <w:bookmarkEnd w:id="124"/>
-    <w:bookmarkStart w:id="125" w:name="complications"/>
+    <w:bookmarkEnd w:id="125"/>
+    <w:bookmarkStart w:id="126" w:name="complications"/>
     <w:p>
       <w:pPr>
         <w:pStyle w:val="Heading1"/>
@@ -29310,8 +30071,8 @@
         </w:tc>
       </w:tr>
     </w:tbl>
-    <w:bookmarkEnd w:id="125"/>
-    <w:bookmarkStart w:id="126" w:name="quick-reference"/>
+    <w:bookmarkEnd w:id="126"/>
+    <w:bookmarkStart w:id="127" w:name="quick-reference"/>
     <w:p>
       <w:pPr>
         <w:pStyle w:val="Heading1"/>
@@ -29518,7 +30279,7 @@
         <w:t xml:space="preserve">start each session with two (three with True grit). Reroll, reduce an injury by one box, shrug off a telling hit, or establish a small preparation. Earn one from an accepted complication.</w:t>
       </w:r>
     </w:p>
-    <w:bookmarkEnd w:id="126"/>
+    <w:bookmarkEnd w:id="127"/>
     <w:sectPr/>
   </w:body>
 </w:document>
@@ -29922,6 +30683,12 @@
     <w:abstractNumId w:val="991"/>
   </w:num>
   <w:num w:numId="1018">
+    <w:abstractNumId w:val="991"/>
+  </w:num>
+  <w:num w:numId="1019">
+    <w:abstractNumId w:val="991"/>
+  </w:num>
+  <w:num w:numId="1020">
     <w:abstractNumId w:val="99411"/>
     <w:lvlOverride w:ilvl="0">
       <w:startOverride w:val="1"/>
@@ -29950,12 +30717,6 @@
     <w:lvlOverride w:ilvl="8">
       <w:startOverride w:val="1"/>
     </w:lvlOverride>
-  </w:num>
-  <w:num w:numId="1019">
-    <w:abstractNumId w:val="991"/>
-  </w:num>
-  <w:num w:numId="1020">
-    <w:abstractNumId w:val="991"/>
   </w:num>
   <w:num w:numId="1021">
     <w:abstractNumId w:val="991"/>
@@ -30006,6 +30767,12 @@
     <w:abstractNumId w:val="991"/>
   </w:num>
   <w:num w:numId="1037">
+    <w:abstractNumId w:val="991"/>
+  </w:num>
+  <w:num w:numId="1038">
+    <w:abstractNumId w:val="991"/>
+  </w:num>
+  <w:num w:numId="1039">
     <w:abstractNumId w:val="99411"/>
     <w:lvlOverride w:ilvl="0">
       <w:startOverride w:val="1"/>
@@ -30035,7 +30802,7 @@
       <w:startOverride w:val="1"/>
     </w:lvlOverride>
   </w:num>
-  <w:num w:numId="1038">
+  <w:num w:numId="1040">
     <w:abstractNumId w:val="99411"/>
     <w:lvlOverride w:ilvl="0">
       <w:startOverride w:val="1"/>

</xml_diff>

<commit_message>
Grimm: callings rebalanced with abilities, the Politician, and parity with Trails
Fifteen callings follow the calling recipe (fight or a second signature,
trail, people, signature), each with an ability of the same size; the
Politician, the Doctor, the Apothecary, the Scholar and the Occultist aren't
fighters. New: Circuit Judge and Politician (The Law), Monster Hunter and
Shotgun Messenger (The Frontier). Quick draw and Know its weakness are
automated as in Trails. Grimm gains the Animal Handling and Law skills, the
Talisman Edge, and law books. tools/check-callings.py checks the recipe.

Co-Authored-By: Claude Opus 5.5 <noreply@anthropic.com>
Claude-Session: https://claude.ai/code/session_015SADCFzhKijkC2foUmXrpC
</commit_message>
<xml_diff>
--- a/grimm-west/Grimm_Players_Guide.docx
+++ b/grimm-west/Grimm_Players_Guide.docx
@@ -459,10 +459,11 @@
         </w:tblBorders>
       </w:tblPr>
       <w:tblGrid>
-        <w:gridCol w:w="1980"/>
-        <w:gridCol w:w="1980"/>
-        <w:gridCol w:w="1980"/>
-        <w:gridCol w:w="1980"/>
+        <w:gridCol w:w="1584"/>
+        <w:gridCol w:w="1584"/>
+        <w:gridCol w:w="1584"/>
+        <w:gridCol w:w="1584"/>
+        <w:gridCol w:w="1584"/>
       </w:tblGrid>
       <w:tr>
         <w:trPr>
@@ -540,6 +541,24 @@
             </w:r>
           </w:p>
         </w:tc>
+        <w:tc>
+          <w:tcPr>
+            <w:shd w:val="clear" w:fill="F1E6D2"/>
+          </w:tcPr>
+          <w:p>
+            <w:pPr>
+              <w:pStyle w:val="Compact"/>
+              <w:jc w:val="left"/>
+            </w:pPr>
+            <w:r>
+              <w:rPr>
+                <w:b/>
+                <w:sz w:val="19"/>
+              </w:rPr>
+              <w:t xml:space="preserve">Ability</w:t>
+            </w:r>
+          </w:p>
+        </w:tc>
       </w:tr>
       <w:tr>
         <w:tc>
@@ -584,22 +603,51 @@
               <w:rPr>
                 <w:sz w:val="19"/>
               </w:rPr>
-              <w:t xml:space="preserve">Wear a badge or carry credentials and bring the guilty in: a marshal, a Ranger, a sheriff or deputy, a city policeman, a Pinkerton. Your Allegiance says which force; a Badge or Pinkerton Credentials advantage gives its authority</w:t>
-            </w:r>
-          </w:p>
-        </w:tc>
-        <w:tc>
-          <w:tcPr/>
-          <w:p>
-            <w:pPr>
-              <w:pStyle w:val="Compact"/>
-              <w:jc w:val="left"/>
-            </w:pPr>
-            <w:r>
-              <w:rPr>
-                <w:sz w:val="19"/>
-              </w:rPr>
-              <w:t xml:space="preserve">Shooting, Investigation, Read People, Riding</w:t>
+              <w:t xml:space="preserve">Wears a badge or carries credentials, and brings the guilty in: a U.S. marshal, a Texas Ranger, a sheriff or deputy, a city policeman, or a Pinkerton detective. Your Allegiance says which force you serve; a Badge or Pinkerton Credentials advantage gives its authority.</w:t>
+            </w:r>
+          </w:p>
+        </w:tc>
+        <w:tc>
+          <w:tcPr/>
+          <w:p>
+            <w:pPr>
+              <w:pStyle w:val="Compact"/>
+              <w:jc w:val="left"/>
+            </w:pPr>
+            <w:r>
+              <w:rPr>
+                <w:sz w:val="19"/>
+              </w:rPr>
+              <w:t xml:space="preserve">Shooting, Riding, Leadership, Investigation</w:t>
+            </w:r>
+          </w:p>
+        </w:tc>
+        <w:tc>
+          <w:tcPr/>
+          <w:p>
+            <w:pPr>
+              <w:pStyle w:val="Compact"/>
+              <w:jc w:val="left"/>
+            </w:pPr>
+            <w:r>
+              <w:rPr>
+                <w:bCs/>
+                <w:b/>
+                <w:sz w:val="19"/>
+              </w:rPr>
+              <w:t xml:space="preserve">The badge.</w:t>
+            </w:r>
+            <w:r>
+              <w:rPr>
+                <w:sz w:val="19"/>
+              </w:rPr>
+              <w:t xml:space="preserve"> </w:t>
+            </w:r>
+            <w:r>
+              <w:rPr>
+                <w:sz w:val="19"/>
+              </w:rPr>
+              <w:t xml:space="preserve">+2 to Leadership when you give orders in the law’s name: an arrest, raising a posse, clearing a street.</w:t>
             </w:r>
           </w:p>
         </w:tc>
@@ -647,22 +695,235 @@
               <w:rPr>
                 <w:sz w:val="19"/>
               </w:rPr>
-              <w:t xml:space="preserve">Track and bring in wanted men, and things that aren’t men</w:t>
-            </w:r>
-          </w:p>
-        </w:tc>
-        <w:tc>
-          <w:tcPr/>
-          <w:p>
-            <w:pPr>
-              <w:pStyle w:val="Compact"/>
-              <w:jc w:val="left"/>
-            </w:pPr>
-            <w:r>
-              <w:rPr>
-                <w:sz w:val="19"/>
-              </w:rPr>
-              <w:t xml:space="preserve">Tracking, Shooting, Riding, Wesen Lore</w:t>
+              <w:t xml:space="preserve">Tracks and brings in wanted men, and the things that only look like men.</w:t>
+            </w:r>
+          </w:p>
+        </w:tc>
+        <w:tc>
+          <w:tcPr/>
+          <w:p>
+            <w:pPr>
+              <w:pStyle w:val="Compact"/>
+              <w:jc w:val="left"/>
+            </w:pPr>
+            <w:r>
+              <w:rPr>
+                <w:sz w:val="19"/>
+              </w:rPr>
+              <w:t xml:space="preserve">Shooting, Tracking, Read People, Wesen Lore</w:t>
+            </w:r>
+          </w:p>
+        </w:tc>
+        <w:tc>
+          <w:tcPr/>
+          <w:p>
+            <w:pPr>
+              <w:pStyle w:val="Compact"/>
+              <w:jc w:val="left"/>
+            </w:pPr>
+            <w:r>
+              <w:rPr>
+                <w:bCs/>
+                <w:b/>
+                <w:sz w:val="19"/>
+              </w:rPr>
+              <w:t xml:space="preserve">Paper on them.</w:t>
+            </w:r>
+            <w:r>
+              <w:rPr>
+                <w:sz w:val="19"/>
+              </w:rPr>
+              <w:t xml:space="preserve"> </w:t>
+            </w:r>
+            <w:r>
+              <w:rPr>
+                <w:sz w:val="19"/>
+              </w:rPr>
+              <w:t xml:space="preserve">+2 to Tracking and Investigation to find someone with a price on their head or a warrant out.</w:t>
+            </w:r>
+          </w:p>
+        </w:tc>
+      </w:tr>
+      <w:tr>
+        <w:tc>
+          <w:tcPr/>
+          <w:p>
+            <w:pPr>
+              <w:pStyle w:val="Compact"/>
+              <w:jc w:val="left"/>
+            </w:pPr>
+            <w:r>
+              <w:rPr>
+                <w:b/>
+                <w:sz w:val="19"/>
+              </w:rPr>
+              <w:t xml:space="preserve">Circuit Judge</w:t>
+            </w:r>
+          </w:p>
+        </w:tc>
+        <w:tc>
+          <w:tcPr/>
+          <w:p>
+            <w:pPr>
+              <w:pStyle w:val="Compact"/>
+              <w:jc w:val="left"/>
+            </w:pPr>
+            <w:r>
+              <w:rPr>
+                <w:sz w:val="19"/>
+              </w:rPr>
+              <w:t xml:space="preserve">The Law</w:t>
+            </w:r>
+          </w:p>
+        </w:tc>
+        <w:tc>
+          <w:tcPr/>
+          <w:p>
+            <w:pPr>
+              <w:pStyle w:val="Compact"/>
+              <w:jc w:val="left"/>
+            </w:pPr>
+            <w:r>
+              <w:rPr>
+                <w:sz w:val="19"/>
+              </w:rPr>
+              <w:t xml:space="preserve">Rides from town to town holding court, and not every town wants one.</w:t>
+            </w:r>
+          </w:p>
+        </w:tc>
+        <w:tc>
+          <w:tcPr/>
+          <w:p>
+            <w:pPr>
+              <w:pStyle w:val="Compact"/>
+              <w:jc w:val="left"/>
+            </w:pPr>
+            <w:r>
+              <w:rPr>
+                <w:sz w:val="19"/>
+              </w:rPr>
+              <w:t xml:space="preserve">Brawling, Survival, Persuasion, Law</w:t>
+            </w:r>
+          </w:p>
+        </w:tc>
+        <w:tc>
+          <w:tcPr/>
+          <w:p>
+            <w:pPr>
+              <w:pStyle w:val="Compact"/>
+              <w:jc w:val="left"/>
+            </w:pPr>
+            <w:r>
+              <w:rPr>
+                <w:bCs/>
+                <w:b/>
+                <w:sz w:val="19"/>
+              </w:rPr>
+              <w:t xml:space="preserve">Heard it all before.</w:t>
+            </w:r>
+            <w:r>
+              <w:rPr>
+                <w:sz w:val="19"/>
+              </w:rPr>
+              <w:t xml:space="preserve"> </w:t>
+            </w:r>
+            <w:r>
+              <w:rPr>
+                <w:sz w:val="19"/>
+              </w:rPr>
+              <w:t xml:space="preserve">+2 to Read People to catch a lie told to your face.</w:t>
+            </w:r>
+          </w:p>
+        </w:tc>
+      </w:tr>
+      <w:tr>
+        <w:tc>
+          <w:tcPr/>
+          <w:p>
+            <w:pPr>
+              <w:pStyle w:val="Compact"/>
+              <w:jc w:val="left"/>
+            </w:pPr>
+            <w:r>
+              <w:rPr>
+                <w:b/>
+                <w:sz w:val="19"/>
+              </w:rPr>
+              <w:t xml:space="preserve">Politician</w:t>
+            </w:r>
+          </w:p>
+        </w:tc>
+        <w:tc>
+          <w:tcPr/>
+          <w:p>
+            <w:pPr>
+              <w:pStyle w:val="Compact"/>
+              <w:jc w:val="left"/>
+            </w:pPr>
+            <w:r>
+              <w:rPr>
+                <w:sz w:val="19"/>
+              </w:rPr>
+              <w:t xml:space="preserve">The Law</w:t>
+            </w:r>
+          </w:p>
+        </w:tc>
+        <w:tc>
+          <w:tcPr/>
+          <w:p>
+            <w:pPr>
+              <w:pStyle w:val="Compact"/>
+              <w:jc w:val="left"/>
+            </w:pPr>
+            <w:r>
+              <w:rPr>
+                <w:sz w:val="19"/>
+              </w:rPr>
+              <w:t xml:space="preserve">Holds office or wants it: a mayor, an alderman, a territorial delegate, a governor’s man, or a party boss with friends in the capital.</w:t>
+            </w:r>
+          </w:p>
+        </w:tc>
+        <w:tc>
+          <w:tcPr/>
+          <w:p>
+            <w:pPr>
+              <w:pStyle w:val="Compact"/>
+              <w:jc w:val="left"/>
+            </w:pPr>
+            <w:r>
+              <w:rPr>
+                <w:sz w:val="19"/>
+              </w:rPr>
+              <w:t xml:space="preserve">Investigation, Riding, Leadership, Law</w:t>
+            </w:r>
+          </w:p>
+        </w:tc>
+        <w:tc>
+          <w:tcPr/>
+          <w:p>
+            <w:pPr>
+              <w:pStyle w:val="Compact"/>
+              <w:jc w:val="left"/>
+            </w:pPr>
+            <w:r>
+              <w:rPr>
+                <w:bCs/>
+                <w:b/>
+                <w:sz w:val="19"/>
+              </w:rPr>
+              <w:t xml:space="preserve">Friends in office.</w:t>
+            </w:r>
+            <w:r>
+              <w:rPr>
+                <w:sz w:val="19"/>
+              </w:rPr>
+              <w:t xml:space="preserve"> </w:t>
+            </w:r>
+            <w:r>
+              <w:rPr>
+                <w:sz w:val="19"/>
+              </w:rPr>
+              <w:t xml:space="preserve">Once per case, the town or territory gives you what it can: rooms at the hotel, horses for a posse, the jail cells, the telegraph office, or the doctor’s time.</w:t>
             </w:r>
           </w:p>
         </w:tc>
@@ -710,22 +971,51 @@
               <w:rPr>
                 <w:sz w:val="19"/>
               </w:rPr>
-              <w:t xml:space="preserve">Patch up the wounded and read what a body tells you</w:t>
-            </w:r>
-          </w:p>
-        </w:tc>
-        <w:tc>
-          <w:tcPr/>
-          <w:p>
-            <w:pPr>
-              <w:pStyle w:val="Compact"/>
-              <w:jc w:val="left"/>
-            </w:pPr>
-            <w:r>
-              <w:rPr>
-                <w:sz w:val="19"/>
-              </w:rPr>
-              <w:t xml:space="preserve">Medicine, Investigation, Read People, Apothecary</w:t>
+              <w:t xml:space="preserve">Patches up the wounded and reads what a body says about what killed it.</w:t>
+            </w:r>
+          </w:p>
+        </w:tc>
+        <w:tc>
+          <w:tcPr/>
+          <w:p>
+            <w:pPr>
+              <w:pStyle w:val="Compact"/>
+              <w:jc w:val="left"/>
+            </w:pPr>
+            <w:r>
+              <w:rPr>
+                <w:sz w:val="19"/>
+              </w:rPr>
+              <w:t xml:space="preserve">Investigation, Riding, Read People, Medicine</w:t>
+            </w:r>
+          </w:p>
+        </w:tc>
+        <w:tc>
+          <w:tcPr/>
+          <w:p>
+            <w:pPr>
+              <w:pStyle w:val="Compact"/>
+              <w:jc w:val="left"/>
+            </w:pPr>
+            <w:r>
+              <w:rPr>
+                <w:bCs/>
+                <w:b/>
+                <w:sz w:val="19"/>
+              </w:rPr>
+              <w:t xml:space="preserve">Steady hands.</w:t>
+            </w:r>
+            <w:r>
+              <w:rPr>
+                <w:sz w:val="19"/>
+              </w:rPr>
+              <w:t xml:space="preserve"> </w:t>
+            </w:r>
+            <w:r>
+              <w:rPr>
+                <w:sz w:val="19"/>
+              </w:rPr>
+              <w:t xml:space="preserve">+2 to Medicine when stabilizing the Dying or working under fire.</w:t>
             </w:r>
           </w:p>
         </w:tc>
@@ -773,22 +1063,51 @@
               <w:rPr>
                 <w:sz w:val="19"/>
               </w:rPr>
-              <w:t xml:space="preserve">Brew remedies, antidotes and stranger things</w:t>
-            </w:r>
-          </w:p>
-        </w:tc>
-        <w:tc>
-          <w:tcPr/>
-          <w:p>
-            <w:pPr>
-              <w:pStyle w:val="Compact"/>
-              <w:jc w:val="left"/>
-            </w:pPr>
-            <w:r>
-              <w:rPr>
-                <w:sz w:val="19"/>
-              </w:rPr>
-              <w:t xml:space="preserve">Apothecary, Medicine, Occult, Wesen Lore</w:t>
+              <w:t xml:space="preserve">Brews remedies, antidotes and stranger things, and knows which ingredients come from where.</w:t>
+            </w:r>
+          </w:p>
+        </w:tc>
+        <w:tc>
+          <w:tcPr/>
+          <w:p>
+            <w:pPr>
+              <w:pStyle w:val="Compact"/>
+              <w:jc w:val="left"/>
+            </w:pPr>
+            <w:r>
+              <w:rPr>
+                <w:sz w:val="19"/>
+              </w:rPr>
+              <w:t xml:space="preserve">Occult, Stealth, Persuasion, Apothecary</w:t>
+            </w:r>
+          </w:p>
+        </w:tc>
+        <w:tc>
+          <w:tcPr/>
+          <w:p>
+            <w:pPr>
+              <w:pStyle w:val="Compact"/>
+              <w:jc w:val="left"/>
+            </w:pPr>
+            <w:r>
+              <w:rPr>
+                <w:bCs/>
+                <w:b/>
+                <w:sz w:val="19"/>
+              </w:rPr>
+              <w:t xml:space="preserve">Already brewed.</w:t>
+            </w:r>
+            <w:r>
+              <w:rPr>
+                <w:sz w:val="19"/>
+              </w:rPr>
+              <w:t xml:space="preserve"> </w:t>
+            </w:r>
+            <w:r>
+              <w:rPr>
+                <w:sz w:val="19"/>
+              </w:rPr>
+              <w:t xml:space="preserve">Once per case, you have the right remedy, poison or antidote already made.</w:t>
             </w:r>
           </w:p>
         </w:tc>
@@ -836,22 +1155,51 @@
               <w:rPr>
                 <w:sz w:val="19"/>
               </w:rPr>
-              <w:t xml:space="preserve">Know the old books, the old languages and the occult</w:t>
-            </w:r>
-          </w:p>
-        </w:tc>
-        <w:tc>
-          <w:tcPr/>
-          <w:p>
-            <w:pPr>
-              <w:pStyle w:val="Compact"/>
-              <w:jc w:val="left"/>
-            </w:pPr>
-            <w:r>
-              <w:rPr>
-                <w:sz w:val="19"/>
-              </w:rPr>
-              <w:t xml:space="preserve">Wesen Lore, Occult, Investigation, Persuasion</w:t>
+              <w:t xml:space="preserve">Knows the old books, the old languages and the occult, and finds the answer in a footnote.</w:t>
+            </w:r>
+          </w:p>
+        </w:tc>
+        <w:tc>
+          <w:tcPr/>
+          <w:p>
+            <w:pPr>
+              <w:pStyle w:val="Compact"/>
+              <w:jc w:val="left"/>
+            </w:pPr>
+            <w:r>
+              <w:rPr>
+                <w:sz w:val="19"/>
+              </w:rPr>
+              <w:t xml:space="preserve">Investigation, Stealth, Persuasion, Wesen Lore</w:t>
+            </w:r>
+          </w:p>
+        </w:tc>
+        <w:tc>
+          <w:tcPr/>
+          <w:p>
+            <w:pPr>
+              <w:pStyle w:val="Compact"/>
+              <w:jc w:val="left"/>
+            </w:pPr>
+            <w:r>
+              <w:rPr>
+                <w:bCs/>
+                <w:b/>
+                <w:sz w:val="19"/>
+              </w:rPr>
+              <w:t xml:space="preserve">The family books.</w:t>
+            </w:r>
+            <w:r>
+              <w:rPr>
+                <w:sz w:val="19"/>
+              </w:rPr>
+              <w:t xml:space="preserve"> </w:t>
+            </w:r>
+            <w:r>
+              <w:rPr>
+                <w:sz w:val="19"/>
+              </w:rPr>
+              <w:t xml:space="preserve">Once per case, your books have a page on this creature: one true weakness or habit.</w:t>
             </w:r>
           </w:p>
         </w:tc>
@@ -899,22 +1247,51 @@
               <w:rPr>
                 <w:sz w:val="19"/>
               </w:rPr>
-              <w:t xml:space="preserve">Work the old arts, and know what’s out there</w:t>
-            </w:r>
-          </w:p>
-        </w:tc>
-        <w:tc>
-          <w:tcPr/>
-          <w:p>
-            <w:pPr>
-              <w:pStyle w:val="Compact"/>
-              <w:jc w:val="left"/>
-            </w:pPr>
-            <w:r>
-              <w:rPr>
-                <w:sz w:val="19"/>
-              </w:rPr>
-              <w:t xml:space="preserve">Occult, Wesen Lore, Apothecary, Read People</w:t>
+              <w:t xml:space="preserve">Works the old arts, knows what’s out there, and knows what it costs.</w:t>
+            </w:r>
+          </w:p>
+        </w:tc>
+        <w:tc>
+          <w:tcPr/>
+          <w:p>
+            <w:pPr>
+              <w:pStyle w:val="Compact"/>
+              <w:jc w:val="left"/>
+            </w:pPr>
+            <w:r>
+              <w:rPr>
+                <w:sz w:val="19"/>
+              </w:rPr>
+              <w:t xml:space="preserve">Wesen Lore, Stealth, Deception, Occult</w:t>
+            </w:r>
+          </w:p>
+        </w:tc>
+        <w:tc>
+          <w:tcPr/>
+          <w:p>
+            <w:pPr>
+              <w:pStyle w:val="Compact"/>
+              <w:jc w:val="left"/>
+            </w:pPr>
+            <w:r>
+              <w:rPr>
+                <w:bCs/>
+                <w:b/>
+                <w:sz w:val="19"/>
+              </w:rPr>
+              <w:t xml:space="preserve">Forbidden lore.</w:t>
+            </w:r>
+            <w:r>
+              <w:rPr>
+                <w:sz w:val="19"/>
+              </w:rPr>
+              <w:t xml:space="preserve"> </w:t>
+            </w:r>
+            <w:r>
+              <w:rPr>
+                <w:sz w:val="19"/>
+              </w:rPr>
+              <w:t xml:space="preserve">Once per case, ask the GM one question about a supernatural thing you’ve seen, and get a true answer.</w:t>
             </w:r>
           </w:p>
         </w:tc>
@@ -962,22 +1339,143 @@
               <w:rPr>
                 <w:sz w:val="19"/>
               </w:rPr>
-              <w:t xml:space="preserve">Comfort, counsel, and stand against the dark</w:t>
-            </w:r>
-          </w:p>
-        </w:tc>
-        <w:tc>
-          <w:tcPr/>
-          <w:p>
-            <w:pPr>
-              <w:pStyle w:val="Compact"/>
-              <w:jc w:val="left"/>
-            </w:pPr>
-            <w:r>
-              <w:rPr>
-                <w:sz w:val="19"/>
-              </w:rPr>
-              <w:t xml:space="preserve">Persuasion, Leadership, Occult, Shooting</w:t>
+              <w:t xml:space="preserve">Comforts the frightened, counsels the troubled, and stands against the dark with faith and a shotgun.</w:t>
+            </w:r>
+          </w:p>
+        </w:tc>
+        <w:tc>
+          <w:tcPr/>
+          <w:p>
+            <w:pPr>
+              <w:pStyle w:val="Compact"/>
+              <w:jc w:val="left"/>
+            </w:pPr>
+            <w:r>
+              <w:rPr>
+                <w:sz w:val="19"/>
+              </w:rPr>
+              <w:t xml:space="preserve">Shooting, Riding, Leadership, Occult</w:t>
+            </w:r>
+          </w:p>
+        </w:tc>
+        <w:tc>
+          <w:tcPr/>
+          <w:p>
+            <w:pPr>
+              <w:pStyle w:val="Compact"/>
+              <w:jc w:val="left"/>
+            </w:pPr>
+            <w:r>
+              <w:rPr>
+                <w:bCs/>
+                <w:b/>
+                <w:sz w:val="19"/>
+              </w:rPr>
+              <w:t xml:space="preserve">Hold fast.</w:t>
+            </w:r>
+            <w:r>
+              <w:rPr>
+                <w:sz w:val="19"/>
+              </w:rPr>
+              <w:t xml:space="preserve"> </w:t>
+            </w:r>
+            <w:r>
+              <w:rPr>
+                <w:sz w:val="19"/>
+              </w:rPr>
+              <w:t xml:space="preserve">+2 to Will against fear, possession and temptation, and to Leadership to steady others against them.</w:t>
+            </w:r>
+          </w:p>
+        </w:tc>
+      </w:tr>
+      <w:tr>
+        <w:tc>
+          <w:tcPr/>
+          <w:p>
+            <w:pPr>
+              <w:pStyle w:val="Compact"/>
+              <w:jc w:val="left"/>
+            </w:pPr>
+            <w:r>
+              <w:rPr>
+                <w:b/>
+                <w:sz w:val="19"/>
+              </w:rPr>
+              <w:t xml:space="preserve">Monster Hunter</w:t>
+            </w:r>
+          </w:p>
+        </w:tc>
+        <w:tc>
+          <w:tcPr/>
+          <w:p>
+            <w:pPr>
+              <w:pStyle w:val="Compact"/>
+              <w:jc w:val="left"/>
+            </w:pPr>
+            <w:r>
+              <w:rPr>
+                <w:sz w:val="19"/>
+              </w:rPr>
+              <w:t xml:space="preserve">The Frontier</w:t>
+            </w:r>
+          </w:p>
+        </w:tc>
+        <w:tc>
+          <w:tcPr/>
+          <w:p>
+            <w:pPr>
+              <w:pStyle w:val="Compact"/>
+              <w:jc w:val="left"/>
+            </w:pPr>
+            <w:r>
+              <w:rPr>
+                <w:sz w:val="19"/>
+              </w:rPr>
+              <w:t xml:space="preserve">Hunts what walks at night by study, traps and patience, not a Grimm’s sight. A Grimm can be one, but needn’t be, and most monster hunters aren’t Grimms.</w:t>
+            </w:r>
+          </w:p>
+        </w:tc>
+        <w:tc>
+          <w:tcPr/>
+          <w:p>
+            <w:pPr>
+              <w:pStyle w:val="Compact"/>
+              <w:jc w:val="left"/>
+            </w:pPr>
+            <w:r>
+              <w:rPr>
+                <w:sz w:val="19"/>
+              </w:rPr>
+              <w:t xml:space="preserve">Melee, Tracking, Read People, Wesen Lore</w:t>
+            </w:r>
+          </w:p>
+        </w:tc>
+        <w:tc>
+          <w:tcPr/>
+          <w:p>
+            <w:pPr>
+              <w:pStyle w:val="Compact"/>
+              <w:jc w:val="left"/>
+            </w:pPr>
+            <w:r>
+              <w:rPr>
+                <w:bCs/>
+                <w:b/>
+                <w:sz w:val="19"/>
+              </w:rPr>
+              <w:t xml:space="preserve">Know its weakness.</w:t>
+            </w:r>
+            <w:r>
+              <w:rPr>
+                <w:sz w:val="19"/>
+              </w:rPr>
+              <w:t xml:space="preserve"> </w:t>
+            </w:r>
+            <w:r>
+              <w:rPr>
+                <w:sz w:val="19"/>
+              </w:rPr>
+              <w:t xml:space="preserve">Once you’ve identified a creature with Wesen Lore, your called shots against it take no penalty.</w:t>
             </w:r>
           </w:p>
         </w:tc>
@@ -1025,22 +1523,51 @@
               <w:rPr>
                 <w:sz w:val="19"/>
               </w:rPr>
-              <w:t xml:space="preserve">Be the fastest and steadiest gun in the room</w:t>
-            </w:r>
-          </w:p>
-        </w:tc>
-        <w:tc>
-          <w:tcPr/>
-          <w:p>
-            <w:pPr>
-              <w:pStyle w:val="Compact"/>
-              <w:jc w:val="left"/>
-            </w:pPr>
-            <w:r>
-              <w:rPr>
-                <w:sz w:val="19"/>
-              </w:rPr>
-              <w:t xml:space="preserve">Shooting, Athletics, Read People, Riding</w:t>
+              <w:t xml:space="preserve">The fastest and steadiest gun in the room, and the one who decides when it’s time to draw.</w:t>
+            </w:r>
+          </w:p>
+        </w:tc>
+        <w:tc>
+          <w:tcPr/>
+          <w:p>
+            <w:pPr>
+              <w:pStyle w:val="Compact"/>
+              <w:jc w:val="left"/>
+            </w:pPr>
+            <w:r>
+              <w:rPr>
+                <w:sz w:val="19"/>
+              </w:rPr>
+              <w:t xml:space="preserve">Shooting, Riding, Read People, Athletics</w:t>
+            </w:r>
+          </w:p>
+        </w:tc>
+        <w:tc>
+          <w:tcPr/>
+          <w:p>
+            <w:pPr>
+              <w:pStyle w:val="Compact"/>
+              <w:jc w:val="left"/>
+            </w:pPr>
+            <w:r>
+              <w:rPr>
+                <w:bCs/>
+                <w:b/>
+                <w:sz w:val="19"/>
+              </w:rPr>
+              <w:t xml:space="preserve">Quick draw.</w:t>
+            </w:r>
+            <w:r>
+              <w:rPr>
+                <w:sz w:val="19"/>
+              </w:rPr>
+              <w:t xml:space="preserve"> </w:t>
+            </w:r>
+            <w:r>
+              <w:rPr>
+                <w:sz w:val="19"/>
+              </w:rPr>
+              <w:t xml:space="preserve">In the first round of a gunfight, you act first, whatever your Agility.</w:t>
             </w:r>
           </w:p>
         </w:tc>
@@ -1088,22 +1615,51 @@
               <w:rPr>
                 <w:sz w:val="19"/>
               </w:rPr>
-              <w:t xml:space="preserve">Find the trail, read the land, keep everyone alive in it</w:t>
-            </w:r>
-          </w:p>
-        </w:tc>
-        <w:tc>
-          <w:tcPr/>
-          <w:p>
-            <w:pPr>
-              <w:pStyle w:val="Compact"/>
-              <w:jc w:val="left"/>
-            </w:pPr>
-            <w:r>
-              <w:rPr>
-                <w:sz w:val="19"/>
-              </w:rPr>
-              <w:t xml:space="preserve">Tracking, Survival, Riding, Stealth</w:t>
+              <w:t xml:space="preserve">Finds the trail, reads the land, and keeps everyone alive out in it.</w:t>
+            </w:r>
+          </w:p>
+        </w:tc>
+        <w:tc>
+          <w:tcPr/>
+          <w:p>
+            <w:pPr>
+              <w:pStyle w:val="Compact"/>
+              <w:jc w:val="left"/>
+            </w:pPr>
+            <w:r>
+              <w:rPr>
+                <w:sz w:val="19"/>
+              </w:rPr>
+              <w:t xml:space="preserve">Melee, Tracking, Persuasion, Survival</w:t>
+            </w:r>
+          </w:p>
+        </w:tc>
+        <w:tc>
+          <w:tcPr/>
+          <w:p>
+            <w:pPr>
+              <w:pStyle w:val="Compact"/>
+              <w:jc w:val="left"/>
+            </w:pPr>
+            <w:r>
+              <w:rPr>
+                <w:bCs/>
+                <w:b/>
+                <w:sz w:val="19"/>
+              </w:rPr>
+              <w:t xml:space="preserve">Lay of the land.</w:t>
+            </w:r>
+            <w:r>
+              <w:rPr>
+                <w:sz w:val="19"/>
+              </w:rPr>
+              <w:t xml:space="preserve"> </w:t>
+            </w:r>
+            <w:r>
+              <w:rPr>
+                <w:sz w:val="19"/>
+              </w:rPr>
+              <w:t xml:space="preserve">Once per case, you know a way: a hidden pass, a water hole, a shortcut that saves a day, or a place to make a stand.</w:t>
             </w:r>
           </w:p>
         </w:tc>
@@ -1151,22 +1707,51 @@
               <w:rPr>
                 <w:sz w:val="19"/>
               </w:rPr>
-              <w:t xml:space="preserve">Read people, bluff, and hear what the saloon hears</w:t>
-            </w:r>
-          </w:p>
-        </w:tc>
-        <w:tc>
-          <w:tcPr/>
-          <w:p>
-            <w:pPr>
-              <w:pStyle w:val="Compact"/>
-              <w:jc w:val="left"/>
-            </w:pPr>
-            <w:r>
-              <w:rPr>
-                <w:sz w:val="19"/>
-              </w:rPr>
-              <w:t xml:space="preserve">Gambling, Read People, Deception, Shooting</w:t>
+              <w:t xml:space="preserve">Reads people, bluffs, and hears everything the saloon hears.</w:t>
+            </w:r>
+          </w:p>
+        </w:tc>
+        <w:tc>
+          <w:tcPr/>
+          <w:p>
+            <w:pPr>
+              <w:pStyle w:val="Compact"/>
+              <w:jc w:val="left"/>
+            </w:pPr>
+            <w:r>
+              <w:rPr>
+                <w:sz w:val="19"/>
+              </w:rPr>
+              <w:t xml:space="preserve">Shooting, Stealth, Deception, Gambling</w:t>
+            </w:r>
+          </w:p>
+        </w:tc>
+        <w:tc>
+          <w:tcPr/>
+          <w:p>
+            <w:pPr>
+              <w:pStyle w:val="Compact"/>
+              <w:jc w:val="left"/>
+            </w:pPr>
+            <w:r>
+              <w:rPr>
+                <w:bCs/>
+                <w:b/>
+                <w:sz w:val="19"/>
+              </w:rPr>
+              <w:t xml:space="preserve">Markers.</w:t>
+            </w:r>
+            <w:r>
+              <w:rPr>
+                <w:sz w:val="19"/>
+              </w:rPr>
+              <w:t xml:space="preserve"> </w:t>
+            </w:r>
+            <w:r>
+              <w:rPr>
+                <w:sz w:val="19"/>
+              </w:rPr>
+              <w:t xml:space="preserve">Once per case, call in a debt: someone owes you a favor, a horse, a room or the truth.</w:t>
             </w:r>
           </w:p>
         </w:tc>
@@ -1214,22 +1799,143 @@
               <w:rPr>
                 <w:sz w:val="19"/>
               </w:rPr>
-              <w:t xml:space="preserve">Fix guns, build traps, and make the impossible gadget</w:t>
-            </w:r>
-          </w:p>
-        </w:tc>
-        <w:tc>
-          <w:tcPr/>
-          <w:p>
-            <w:pPr>
-              <w:pStyle w:val="Compact"/>
-              <w:jc w:val="left"/>
-            </w:pPr>
-            <w:r>
-              <w:rPr>
-                <w:sz w:val="19"/>
-              </w:rPr>
-              <w:t xml:space="preserve">Tinkering, Shooting, Investigation, Athletics</w:t>
+              <w:t xml:space="preserve">Fixes the guns, builds the traps, and makes the gadget nobody else thought possible.</w:t>
+            </w:r>
+          </w:p>
+        </w:tc>
+        <w:tc>
+          <w:tcPr/>
+          <w:p>
+            <w:pPr>
+              <w:pStyle w:val="Compact"/>
+              <w:jc w:val="left"/>
+            </w:pPr>
+            <w:r>
+              <w:rPr>
+                <w:sz w:val="19"/>
+              </w:rPr>
+              <w:t xml:space="preserve">Brawling, Athletics, Deception, Tinkering</w:t>
+            </w:r>
+          </w:p>
+        </w:tc>
+        <w:tc>
+          <w:tcPr/>
+          <w:p>
+            <w:pPr>
+              <w:pStyle w:val="Compact"/>
+              <w:jc w:val="left"/>
+            </w:pPr>
+            <w:r>
+              <w:rPr>
+                <w:bCs/>
+                <w:b/>
+                <w:sz w:val="19"/>
+              </w:rPr>
+              <w:t xml:space="preserve">Jury-rig.</w:t>
+            </w:r>
+            <w:r>
+              <w:rPr>
+                <w:sz w:val="19"/>
+              </w:rPr>
+              <w:t xml:space="preserve"> </w:t>
+            </w:r>
+            <w:r>
+              <w:rPr>
+                <w:sz w:val="19"/>
+              </w:rPr>
+              <w:t xml:space="preserve">Once per case, make the gadget, lock pick, silver-loaded shell or repair you need from whatever is to hand.</w:t>
+            </w:r>
+          </w:p>
+        </w:tc>
+      </w:tr>
+      <w:tr>
+        <w:tc>
+          <w:tcPr/>
+          <w:p>
+            <w:pPr>
+              <w:pStyle w:val="Compact"/>
+              <w:jc w:val="left"/>
+            </w:pPr>
+            <w:r>
+              <w:rPr>
+                <w:b/>
+                <w:sz w:val="19"/>
+              </w:rPr>
+              <w:t xml:space="preserve">Shotgun Messenger</w:t>
+            </w:r>
+          </w:p>
+        </w:tc>
+        <w:tc>
+          <w:tcPr/>
+          <w:p>
+            <w:pPr>
+              <w:pStyle w:val="Compact"/>
+              <w:jc w:val="left"/>
+            </w:pPr>
+            <w:r>
+              <w:rPr>
+                <w:sz w:val="19"/>
+              </w:rPr>
+              <w:t xml:space="preserve">The Frontier</w:t>
+            </w:r>
+          </w:p>
+        </w:tc>
+        <w:tc>
+          <w:tcPr/>
+          <w:p>
+            <w:pPr>
+              <w:pStyle w:val="Compact"/>
+              <w:jc w:val="left"/>
+            </w:pPr>
+            <w:r>
+              <w:rPr>
+                <w:sz w:val="19"/>
+              </w:rPr>
+              <w:t xml:space="preserve">Rides beside the driver guarding the mail, the strongbox and the passengers.</w:t>
+            </w:r>
+          </w:p>
+        </w:tc>
+        <w:tc>
+          <w:tcPr/>
+          <w:p>
+            <w:pPr>
+              <w:pStyle w:val="Compact"/>
+              <w:jc w:val="left"/>
+            </w:pPr>
+            <w:r>
+              <w:rPr>
+                <w:sz w:val="19"/>
+              </w:rPr>
+              <w:t xml:space="preserve">Shooting, Animal Handling, Leadership, Survival</w:t>
+            </w:r>
+          </w:p>
+        </w:tc>
+        <w:tc>
+          <w:tcPr/>
+          <w:p>
+            <w:pPr>
+              <w:pStyle w:val="Compact"/>
+              <w:jc w:val="left"/>
+            </w:pPr>
+            <w:r>
+              <w:rPr>
+                <w:bCs/>
+                <w:b/>
+                <w:sz w:val="19"/>
+              </w:rPr>
+              <w:t xml:space="preserve">Riding shotgun.</w:t>
+            </w:r>
+            <w:r>
+              <w:rPr>
+                <w:sz w:val="19"/>
+              </w:rPr>
+              <w:t xml:space="preserve"> </w:t>
+            </w:r>
+            <w:r>
+              <w:rPr>
+                <w:sz w:val="19"/>
+              </w:rPr>
+              <w:t xml:space="preserve">Once per fight, when someone next to you is hit, you take the hit instead.</w:t>
             </w:r>
           </w:p>
         </w:tc>
@@ -1267,6 +1973,30 @@
       </w:r>
       <w:r>
         <w:t xml:space="preserve">works real magic through their Lens. With any other heritage, an Occultist knows the lore but can’t work the art: a scholar of the occult, a charlatan, or someone still searching for a teacher.</w:t>
+      </w:r>
+    </w:p>
+    <w:p>
+      <w:pPr>
+        <w:pStyle w:val="BodyText"/>
+      </w:pPr>
+      <w:r>
+        <w:t xml:space="preserve">Every calling has its own</w:t>
+      </w:r>
+      <w:r>
+        <w:t xml:space="preserve"> </w:t>
+      </w:r>
+      <w:r>
+        <w:rPr>
+          <w:bCs/>
+          <w:b/>
+        </w:rPr>
+        <w:t xml:space="preserve">ability</w:t>
+      </w:r>
+      <w:r>
+        <w:t xml:space="preserve"> </w:t>
+      </w:r>
+      <w:r>
+        <w:t xml:space="preserve">(in the table above), printed on your sheet. Callings follow one recipe: a fighting skill, a trail skill, a people skill and a signature skill. The Politician and the four scholars and healers of the Learned aren’t fighters: they take a second signature skill instead, though anyone can still train a fighting skill.</w:t>
       </w:r>
     </w:p>
     <w:p>
@@ -2219,6 +2949,54 @@
           </w:p>
         </w:tc>
       </w:tr>
+      <w:tr>
+        <w:tc>
+          <w:tcPr/>
+          <w:p>
+            <w:pPr>
+              <w:pStyle w:val="Compact"/>
+              <w:jc w:val="left"/>
+            </w:pPr>
+            <w:r>
+              <w:rPr>
+                <w:b/>
+                <w:sz w:val="19"/>
+              </w:rPr>
+              <w:t xml:space="preserve">Talisman</w:t>
+            </w:r>
+          </w:p>
+        </w:tc>
+        <w:tc>
+          <w:tcPr/>
+          <w:p>
+            <w:pPr>
+              <w:pStyle w:val="Compact"/>
+              <w:jc w:val="left"/>
+            </w:pPr>
+            <w:r>
+              <w:rPr>
+                <w:sz w:val="19"/>
+              </w:rPr>
+              <w:t xml:space="preserve">A ready charm made for you by a Braucher, a hexenbiest or a root doctor (a Himmelsbrief, a mojo hand, a blessed buckeye), holding a Minor ritual agreed with the GM; break it to release it. Renewed between cases; doesn’t count against a charm limit</w:t>
+            </w:r>
+          </w:p>
+        </w:tc>
+        <w:tc>
+          <w:tcPr/>
+          <w:p>
+            <w:pPr>
+              <w:pStyle w:val="Compact"/>
+              <w:jc w:val="left"/>
+            </w:pPr>
+            <w:r>
+              <w:rPr>
+                <w:sz w:val="19"/>
+              </w:rPr>
+              <w:t xml:space="preserve">1</w:t>
+            </w:r>
+          </w:p>
+        </w:tc>
+      </w:tr>
     </w:tbl>
     <w:bookmarkEnd w:id="26"/>
     <w:bookmarkStart w:id="27" w:name="spending-points"/>
@@ -4172,6 +4950,54 @@
                 <w:b/>
                 <w:sz w:val="19"/>
               </w:rPr>
+              <w:t xml:space="preserve">Animal Handling</w:t>
+            </w:r>
+          </w:p>
+        </w:tc>
+        <w:tc>
+          <w:tcPr/>
+          <w:p>
+            <w:pPr>
+              <w:pStyle w:val="Compact"/>
+              <w:jc w:val="left"/>
+            </w:pPr>
+            <w:r>
+              <w:rPr>
+                <w:sz w:val="19"/>
+              </w:rPr>
+              <w:t xml:space="preserve">Presence</w:t>
+            </w:r>
+          </w:p>
+        </w:tc>
+        <w:tc>
+          <w:tcPr/>
+          <w:p>
+            <w:pPr>
+              <w:pStyle w:val="Compact"/>
+              <w:jc w:val="left"/>
+            </w:pPr>
+            <w:r>
+              <w:rPr>
+                <w:sz w:val="19"/>
+              </w:rPr>
+              <w:t xml:space="preserve">Calm, train and handle horses, mules and dogs, and face down a beast</w:t>
+            </w:r>
+          </w:p>
+        </w:tc>
+      </w:tr>
+      <w:tr>
+        <w:tc>
+          <w:tcPr/>
+          <w:p>
+            <w:pPr>
+              <w:pStyle w:val="Compact"/>
+              <w:jc w:val="left"/>
+            </w:pPr>
+            <w:r>
+              <w:rPr>
+                <w:b/>
+                <w:sz w:val="19"/>
+              </w:rPr>
               <w:t xml:space="preserve">Read People</w:t>
             </w:r>
           </w:p>
@@ -4251,6 +5077,54 @@
                 <w:sz w:val="19"/>
               </w:rPr>
               <w:t xml:space="preserve">Search a scene, examine clues, follow paper trails</w:t>
+            </w:r>
+          </w:p>
+        </w:tc>
+      </w:tr>
+      <w:tr>
+        <w:tc>
+          <w:tcPr/>
+          <w:p>
+            <w:pPr>
+              <w:pStyle w:val="Compact"/>
+              <w:jc w:val="left"/>
+            </w:pPr>
+            <w:r>
+              <w:rPr>
+                <w:b/>
+                <w:sz w:val="19"/>
+              </w:rPr>
+              <w:t xml:space="preserve">Law</w:t>
+            </w:r>
+          </w:p>
+        </w:tc>
+        <w:tc>
+          <w:tcPr/>
+          <w:p>
+            <w:pPr>
+              <w:pStyle w:val="Compact"/>
+              <w:jc w:val="left"/>
+            </w:pPr>
+            <w:r>
+              <w:rPr>
+                <w:sz w:val="19"/>
+              </w:rPr>
+              <w:t xml:space="preserve">Intellect</w:t>
+            </w:r>
+          </w:p>
+        </w:tc>
+        <w:tc>
+          <w:tcPr/>
+          <w:p>
+            <w:pPr>
+              <w:pStyle w:val="Compact"/>
+              <w:jc w:val="left"/>
+            </w:pPr>
+            <w:r>
+              <w:rPr>
+                <w:sz w:val="19"/>
+              </w:rPr>
+              <w:t xml:space="preserve">Statutes, warrants, courts, claims and contracts</w:t>
             </w:r>
           </w:p>
         </w:tc>
@@ -5382,6 +6256,39 @@
                 <w:sz w:val="19"/>
               </w:rPr>
               <w:t xml:space="preserve">Light for a few hours. Searching in the dark without light is very difficult (−4) or impossible.</w:t>
+            </w:r>
+          </w:p>
+        </w:tc>
+      </w:tr>
+      <w:tr>
+        <w:tc>
+          <w:tcPr/>
+          <w:p>
+            <w:pPr>
+              <w:pStyle w:val="Compact"/>
+              <w:jc w:val="left"/>
+            </w:pPr>
+            <w:r>
+              <w:rPr>
+                <w:b/>
+                <w:sz w:val="19"/>
+              </w:rPr>
+              <w:t xml:space="preserve">Law books and blank warrants</w:t>
+            </w:r>
+          </w:p>
+        </w:tc>
+        <w:tc>
+          <w:tcPr/>
+          <w:p>
+            <w:pPr>
+              <w:pStyle w:val="Compact"/>
+              <w:jc w:val="left"/>
+            </w:pPr>
+            <w:r>
+              <w:rPr>
+                <w:sz w:val="19"/>
+              </w:rPr>
+              <w:t xml:space="preserve">Needed to draw up papers, check a statute or argue a point of law away from a courthouse.</w:t>
             </w:r>
           </w:p>
         </w:tc>

</xml_diff>

<commit_message>
Grimm: the Lawyer joins The Law, as in Trails
Brawling, Athletics, Deception, Law; Due process: once per case, get someone
out of jail, a warrant issued or quashed, or a deed or contract in hand.

Co-Authored-By: Claude Opus 5.5 <noreply@anthropic.com>
Claude-Session: https://claude.ai/code/session_015SADCFzhKijkC2foUmXrpC
</commit_message>
<xml_diff>
--- a/grimm-west/Grimm_Players_Guide.docx
+++ b/grimm-west/Grimm_Players_Guide.docx
@@ -740,6 +740,98 @@
                 <w:sz w:val="19"/>
               </w:rPr>
               <w:t xml:space="preserve">+2 to Tracking and Investigation to find someone with a price on their head or a warrant out.</w:t>
+            </w:r>
+          </w:p>
+        </w:tc>
+      </w:tr>
+      <w:tr>
+        <w:tc>
+          <w:tcPr/>
+          <w:p>
+            <w:pPr>
+              <w:pStyle w:val="Compact"/>
+              <w:jc w:val="left"/>
+            </w:pPr>
+            <w:r>
+              <w:rPr>
+                <w:b/>
+                <w:sz w:val="19"/>
+              </w:rPr>
+              <w:t xml:space="preserve">Lawyer</w:t>
+            </w:r>
+          </w:p>
+        </w:tc>
+        <w:tc>
+          <w:tcPr/>
+          <w:p>
+            <w:pPr>
+              <w:pStyle w:val="Compact"/>
+              <w:jc w:val="left"/>
+            </w:pPr>
+            <w:r>
+              <w:rPr>
+                <w:sz w:val="19"/>
+              </w:rPr>
+              <w:t xml:space="preserve">The Law</w:t>
+            </w:r>
+          </w:p>
+        </w:tc>
+        <w:tc>
+          <w:tcPr/>
+          <w:p>
+            <w:pPr>
+              <w:pStyle w:val="Compact"/>
+              <w:jc w:val="left"/>
+            </w:pPr>
+            <w:r>
+              <w:rPr>
+                <w:sz w:val="19"/>
+              </w:rPr>
+              <w:t xml:space="preserve">Argues cases, draws up deeds and contracts, and knows which laws a town forgot it had.</w:t>
+            </w:r>
+          </w:p>
+        </w:tc>
+        <w:tc>
+          <w:tcPr/>
+          <w:p>
+            <w:pPr>
+              <w:pStyle w:val="Compact"/>
+              <w:jc w:val="left"/>
+            </w:pPr>
+            <w:r>
+              <w:rPr>
+                <w:sz w:val="19"/>
+              </w:rPr>
+              <w:t xml:space="preserve">Brawling, Athletics, Deception, Law</w:t>
+            </w:r>
+          </w:p>
+        </w:tc>
+        <w:tc>
+          <w:tcPr/>
+          <w:p>
+            <w:pPr>
+              <w:pStyle w:val="Compact"/>
+              <w:jc w:val="left"/>
+            </w:pPr>
+            <w:r>
+              <w:rPr>
+                <w:bCs/>
+                <w:b/>
+                <w:sz w:val="19"/>
+              </w:rPr>
+              <w:t xml:space="preserve">Due process.</w:t>
+            </w:r>
+            <w:r>
+              <w:rPr>
+                <w:sz w:val="19"/>
+              </w:rPr>
+              <w:t xml:space="preserve"> </w:t>
+            </w:r>
+            <w:r>
+              <w:rPr>
+                <w:sz w:val="19"/>
+              </w:rPr>
+              <w:t xml:space="preserve">Once per case, get someone out of jail, a warrant issued or quashed, or a deed or contract into your hands, wherever there’s law to work.</w:t>
             </w:r>
           </w:p>
         </w:tc>

</xml_diff>

<commit_message>
Battle map: tokens carry their tracks, both ways
Select a posse token to see and change that character's injury, Dying,
Stunned or Dazed, points and personal track (Corruption, Strain); a change
on the map is a change to the GM's copy of the character, and a change on
their card shows on the map. Opponents can be added from the setting's
threats (its data, or the Players' Guide's Threats table) with their
boxes, Dodge, attacks and trait; mark hits on them and they're taken out
when the boxes are full. Every token shows injury pips. The map now fits
itself the first time it's shown, centers properly, and places new tokens
inside the grid.

Co-Authored-By: Claude Opus 5.5 <noreply@anthropic.com>
Claude-Session: https://claude.ai/code/session_015SADCFzhKijkC2foUmXrpC

Also: a missing blank line had swallowed the guide's Threats heading.
</commit_message>
<xml_diff>
--- a/grimm-west/Grimm_Players_Guide.docx
+++ b/grimm-west/Grimm_Players_Guide.docx
@@ -18671,11 +18671,16 @@
       <w:r>
         <w:t xml:space="preserve">Dr. Whitlock calls her a superstitious old woman, and sends his hopeless cases to her door after dark.</w:t>
       </w:r>
-      <w:r>
-        <w:t xml:space="preserve"> </w:t>
-      </w:r>
-      <w:r>
-        <w:t xml:space="preserve"># Threats</w:t>
+    </w:p>
+    <w:bookmarkEnd w:id="90"/>
+    <w:bookmarkEnd w:id="91"/>
+    <w:bookmarkStart w:id="92" w:name="threats"/>
+    <w:p>
+      <w:pPr>
+        <w:pStyle w:val="Heading1"/>
+      </w:pPr>
+      <w:r>
+        <w:t xml:space="preserve">Threats</w:t>
       </w:r>
     </w:p>
     <w:p>
@@ -19940,9 +19945,8 @@
         <w:t xml:space="preserve">For a tougher version, add +1 to its targets and one box; for a weaker one, subtract.</w:t>
       </w:r>
     </w:p>
-    <w:bookmarkEnd w:id="90"/>
-    <w:bookmarkEnd w:id="91"/>
-    <w:bookmarkStart w:id="92" w:name="advantages"/>
+    <w:bookmarkEnd w:id="92"/>
+    <w:bookmarkStart w:id="93" w:name="advantages"/>
     <w:p>
       <w:pPr>
         <w:pStyle w:val="Heading1"/>
@@ -20698,8 +20702,8 @@
         <w:t xml:space="preserve">A badge is legal authority, not a magic word: Wesen, outlaws and the powers of the hidden world don’t care about it, and it carries a duty. Your superiors can give you orders, and abusing the badge or failing in your duty can cost you it. Law callings (Marshal, Deputy) usually take one, as their advantage or as a second advantage Edge. A Pinkerton detective takes Pinkerton Credentials instead: the agency’s reach and files, but no badge.</w:t>
       </w:r>
     </w:p>
-    <w:bookmarkEnd w:id="92"/>
-    <w:bookmarkStart w:id="114" w:name="heritages"/>
+    <w:bookmarkEnd w:id="93"/>
+    <w:bookmarkStart w:id="115" w:name="heritages"/>
     <w:p>
       <w:pPr>
         <w:pStyle w:val="Heading1"/>
@@ -22104,7 +22108,7 @@
         </w:tc>
       </w:tr>
     </w:tbl>
-    <w:bookmarkStart w:id="93" w:name="core-wesen-rules"/>
+    <w:bookmarkStart w:id="94" w:name="core-wesen-rules"/>
     <w:p>
       <w:pPr>
         <w:pStyle w:val="Heading2"/>
@@ -22416,8 +22420,8 @@
         <w:t xml:space="preserve">means each hit that marks 2 or more boxes marks one fewer, never below 1.</w:t>
       </w:r>
     </w:p>
-    <w:bookmarkEnd w:id="93"/>
-    <w:bookmarkStart w:id="94" w:name="human"/>
+    <w:bookmarkEnd w:id="94"/>
+    <w:bookmarkStart w:id="95" w:name="human"/>
     <w:p>
       <w:pPr>
         <w:pStyle w:val="Heading2"/>
@@ -22650,8 +22654,8 @@
         </w:tc>
       </w:tr>
     </w:tbl>
-    <w:bookmarkEnd w:id="94"/>
-    <w:bookmarkStart w:id="95" w:name="bauerschwein"/>
+    <w:bookmarkEnd w:id="95"/>
+    <w:bookmarkStart w:id="96" w:name="bauerschwein"/>
     <w:p>
       <w:pPr>
         <w:pStyle w:val="Heading2"/>
@@ -22944,8 +22948,8 @@
         </w:tc>
       </w:tr>
     </w:tbl>
-    <w:bookmarkEnd w:id="95"/>
-    <w:bookmarkStart w:id="96" w:name="coyotl"/>
+    <w:bookmarkEnd w:id="96"/>
+    <w:bookmarkStart w:id="97" w:name="coyotl"/>
     <w:p>
       <w:pPr>
         <w:pStyle w:val="Heading2"/>
@@ -23214,8 +23218,8 @@
         </w:tc>
       </w:tr>
     </w:tbl>
-    <w:bookmarkEnd w:id="96"/>
-    <w:bookmarkStart w:id="97" w:name="eisbiber"/>
+    <w:bookmarkEnd w:id="97"/>
+    <w:bookmarkStart w:id="98" w:name="eisbiber"/>
     <w:p>
       <w:pPr>
         <w:pStyle w:val="Heading2"/>
@@ -23484,8 +23488,8 @@
         </w:tc>
       </w:tr>
     </w:tbl>
-    <w:bookmarkEnd w:id="97"/>
-    <w:bookmarkStart w:id="98" w:name="fuchsbau"/>
+    <w:bookmarkEnd w:id="98"/>
+    <w:bookmarkStart w:id="99" w:name="fuchsbau"/>
     <w:p>
       <w:pPr>
         <w:pStyle w:val="Heading2"/>
@@ -23816,8 +23820,8 @@
         </w:tc>
       </w:tr>
     </w:tbl>
-    <w:bookmarkEnd w:id="98"/>
-    <w:bookmarkStart w:id="99" w:name="mauzhertz"/>
+    <w:bookmarkEnd w:id="99"/>
+    <w:bookmarkStart w:id="100" w:name="mauzhertz"/>
     <w:p>
       <w:pPr>
         <w:pStyle w:val="Heading2"/>
@@ -24086,8 +24090,8 @@
         </w:tc>
       </w:tr>
     </w:tbl>
-    <w:bookmarkEnd w:id="99"/>
-    <w:bookmarkStart w:id="100" w:name="steinadler"/>
+    <w:bookmarkEnd w:id="100"/>
+    <w:bookmarkStart w:id="101" w:name="steinadler"/>
     <w:p>
       <w:pPr>
         <w:pStyle w:val="Heading2"/>
@@ -24356,8 +24360,8 @@
         </w:tc>
       </w:tr>
     </w:tbl>
-    <w:bookmarkEnd w:id="100"/>
-    <w:bookmarkStart w:id="101" w:name="taniwha"/>
+    <w:bookmarkEnd w:id="101"/>
+    <w:bookmarkStart w:id="102" w:name="taniwha"/>
     <w:p>
       <w:pPr>
         <w:pStyle w:val="Heading2"/>
@@ -24678,8 +24682,8 @@
         </w:tc>
       </w:tr>
     </w:tbl>
-    <w:bookmarkEnd w:id="101"/>
-    <w:bookmarkStart w:id="102" w:name="ziegevolk"/>
+    <w:bookmarkEnd w:id="102"/>
+    <w:bookmarkStart w:id="103" w:name="ziegevolk"/>
     <w:p>
       <w:pPr>
         <w:pStyle w:val="Heading2"/>
@@ -24948,8 +24952,8 @@
         </w:tc>
       </w:tr>
     </w:tbl>
-    <w:bookmarkEnd w:id="102"/>
-    <w:bookmarkStart w:id="103" w:name="blutbad"/>
+    <w:bookmarkEnd w:id="103"/>
+    <w:bookmarkStart w:id="104" w:name="blutbad"/>
     <w:p>
       <w:pPr>
         <w:pStyle w:val="Heading2"/>
@@ -25304,8 +25308,8 @@
         </w:tc>
       </w:tr>
     </w:tbl>
-    <w:bookmarkEnd w:id="103"/>
-    <w:bookmarkStart w:id="104" w:name="grimm"/>
+    <w:bookmarkEnd w:id="104"/>
+    <w:bookmarkStart w:id="105" w:name="grimm"/>
     <w:p>
       <w:pPr>
         <w:pStyle w:val="Heading2"/>
@@ -26210,8 +26214,8 @@
         </w:tc>
       </w:tr>
     </w:tbl>
-    <w:bookmarkEnd w:id="104"/>
-    <w:bookmarkStart w:id="105" w:name="incantare"/>
+    <w:bookmarkEnd w:id="105"/>
+    <w:bookmarkStart w:id="106" w:name="incantare"/>
     <w:p>
       <w:pPr>
         <w:pStyle w:val="Heading2"/>
@@ -26882,8 +26886,8 @@
         </w:tc>
       </w:tr>
     </w:tbl>
-    <w:bookmarkEnd w:id="105"/>
-    <w:bookmarkStart w:id="106" w:name="jägerbär"/>
+    <w:bookmarkEnd w:id="106"/>
+    <w:bookmarkStart w:id="107" w:name="jägerbär"/>
     <w:p>
       <w:pPr>
         <w:pStyle w:val="Heading2"/>
@@ -27152,8 +27156,8 @@
         </w:tc>
       </w:tr>
     </w:tbl>
-    <w:bookmarkEnd w:id="106"/>
-    <w:bookmarkStart w:id="107" w:name="mauvais-dentes"/>
+    <w:bookmarkEnd w:id="107"/>
+    <w:bookmarkStart w:id="108" w:name="mauvais-dentes"/>
     <w:p>
       <w:pPr>
         <w:pStyle w:val="Heading2"/>
@@ -27446,8 +27450,8 @@
         </w:tc>
       </w:tr>
     </w:tbl>
-    <w:bookmarkEnd w:id="107"/>
-    <w:bookmarkStart w:id="108" w:name="naschazer"/>
+    <w:bookmarkEnd w:id="108"/>
+    <w:bookmarkStart w:id="109" w:name="naschazer"/>
     <w:p>
       <w:pPr>
         <w:pStyle w:val="Heading2"/>
@@ -27740,8 +27744,8 @@
         </w:tc>
       </w:tr>
     </w:tbl>
-    <w:bookmarkEnd w:id="108"/>
-    <w:bookmarkStart w:id="109" w:name="skalengeck"/>
+    <w:bookmarkEnd w:id="109"/>
+    <w:bookmarkStart w:id="110" w:name="skalengeck"/>
     <w:p>
       <w:pPr>
         <w:pStyle w:val="Heading2"/>
@@ -28010,8 +28014,8 @@
         </w:tc>
       </w:tr>
     </w:tbl>
-    <w:bookmarkEnd w:id="109"/>
-    <w:bookmarkStart w:id="110" w:name="vallachi"/>
+    <w:bookmarkEnd w:id="110"/>
+    <w:bookmarkStart w:id="111" w:name="vallachi"/>
     <w:p>
       <w:pPr>
         <w:pStyle w:val="Heading2"/>
@@ -28340,8 +28344,8 @@
         </w:tc>
       </w:tr>
     </w:tbl>
-    <w:bookmarkEnd w:id="110"/>
-    <w:bookmarkStart w:id="111" w:name="fuchsteufelwild"/>
+    <w:bookmarkEnd w:id="111"/>
+    <w:bookmarkStart w:id="112" w:name="fuchsteufelwild"/>
     <w:p>
       <w:pPr>
         <w:pStyle w:val="Heading2"/>
@@ -28662,8 +28666,8 @@
         </w:tc>
       </w:tr>
     </w:tbl>
-    <w:bookmarkEnd w:id="111"/>
-    <w:bookmarkStart w:id="112" w:name="hexenbiest-or-zauberbiest"/>
+    <w:bookmarkEnd w:id="112"/>
+    <w:bookmarkStart w:id="113" w:name="hexenbiest-or-zauberbiest"/>
     <w:p>
       <w:pPr>
         <w:pStyle w:val="Heading2"/>
@@ -29058,8 +29062,8 @@
         </w:tc>
       </w:tr>
     </w:tbl>
-    <w:bookmarkEnd w:id="112"/>
-    <w:bookmarkStart w:id="113" w:name="murcielago"/>
+    <w:bookmarkEnd w:id="113"/>
+    <w:bookmarkStart w:id="114" w:name="murcielago"/>
     <w:p>
       <w:pPr>
         <w:pStyle w:val="Heading2"/>
@@ -29352,9 +29356,9 @@
         </w:tc>
       </w:tr>
     </w:tbl>
-    <w:bookmarkEnd w:id="113"/>
     <w:bookmarkEnd w:id="114"/>
-    <w:bookmarkStart w:id="125" w:name="making-your-own"/>
+    <w:bookmarkEnd w:id="115"/>
+    <w:bookmarkStart w:id="126" w:name="making-your-own"/>
     <w:p>
       <w:pPr>
         <w:pStyle w:val="Heading1"/>
@@ -29387,7 +29391,7 @@
         <w:t xml:space="preserve">option at the end of each list, and its checklist holds a custom choice to the same rules as everything else.</w:t>
       </w:r>
     </w:p>
-    <w:bookmarkStart w:id="115" w:name="a-custom-calling"/>
+    <w:bookmarkStart w:id="116" w:name="a-custom-calling"/>
     <w:p>
       <w:pPr>
         <w:pStyle w:val="Heading2"/>
@@ -29563,8 +29567,8 @@
         <w:t xml:space="preserve">.</w:t>
       </w:r>
     </w:p>
-    <w:bookmarkEnd w:id="115"/>
-    <w:bookmarkStart w:id="124" w:name="a-custom-heritage"/>
+    <w:bookmarkEnd w:id="116"/>
+    <w:bookmarkStart w:id="125" w:name="a-custom-heritage"/>
     <w:p>
       <w:pPr>
         <w:pStyle w:val="Heading2"/>
@@ -29581,7 +29585,7 @@
         <w:t xml:space="preserve">Build it with the GM, one step at a time.</w:t>
       </w:r>
     </w:p>
-    <w:bookmarkStart w:id="116" w:name="the-concept"/>
+    <w:bookmarkStart w:id="117" w:name="the-concept"/>
     <w:p>
       <w:pPr>
         <w:pStyle w:val="Heading3"/>
@@ -29598,8 +29602,8 @@
         <w:t xml:space="preserve">Two or three sentences: where they come from, what sets them apart, and how others see them. It should be something the heritages in this book don’t already cover.</w:t>
       </w:r>
     </w:p>
-    <w:bookmarkEnd w:id="116"/>
-    <w:bookmarkStart w:id="117" w:name="the-tier"/>
+    <w:bookmarkEnd w:id="117"/>
+    <w:bookmarkStart w:id="118" w:name="the-tier"/>
     <w:p>
       <w:pPr>
         <w:pStyle w:val="Heading3"/>
@@ -29896,8 +29900,8 @@
         <w:t xml:space="preserve">When in doubt, choose the higher tier.</w:t>
       </w:r>
     </w:p>
-    <w:bookmarkEnd w:id="117"/>
-    <w:bookmarkStart w:id="118" w:name="attribute-adjustments"/>
+    <w:bookmarkEnd w:id="118"/>
+    <w:bookmarkStart w:id="119" w:name="attribute-adjustments"/>
     <w:p>
       <w:pPr>
         <w:pStyle w:val="Heading3"/>
@@ -29943,8 +29947,8 @@
         <w:t xml:space="preserve">: a +2 needs a −2 or two −1s. The adjustments move the attribute’s base (+1 starts it at 11) and raise its starting maximum (13 plus the bonus). Most heritages change two to four attributes.</w:t>
       </w:r>
     </w:p>
-    <w:bookmarkEnd w:id="118"/>
-    <w:bookmarkStart w:id="119" w:name="core-rules-tier-1-and-up"/>
+    <w:bookmarkEnd w:id="119"/>
+    <w:bookmarkStart w:id="120" w:name="core-rules-tier-1-and-up"/>
     <w:p>
       <w:pPr>
         <w:pStyle w:val="Heading3"/>
@@ -29961,8 +29965,8 @@
         <w:t xml:space="preserve">One to three short rules that always apply: what they can do (see in the dark, resist cold, a free Trained skill) and what it costs (a weakness, a people’s distrust, a hazard they can’t abide). A strength with no drawback is worth more than it looks, so price it a tier higher.</w:t>
       </w:r>
     </w:p>
-    <w:bookmarkEnd w:id="119"/>
-    <w:bookmarkStart w:id="120" w:name="heritage-advantages"/>
+    <w:bookmarkEnd w:id="120"/>
+    <w:bookmarkStart w:id="121" w:name="heritage-advantages"/>
     <w:p>
       <w:pPr>
         <w:pStyle w:val="Heading3"/>
@@ -30017,8 +30021,8 @@
         <w:t xml:space="preserve">: a problem the trait causes, with a clear trigger and a real consequence, which earns a Grit point when it bites, like any complication. A character takes one advantage, general or heritage, so make them distinct choices.</w:t>
       </w:r>
     </w:p>
-    <w:bookmarkEnd w:id="120"/>
-    <w:bookmarkStart w:id="121" w:name="a-woge-optional-tier-2-or-3"/>
+    <w:bookmarkEnd w:id="121"/>
+    <w:bookmarkStart w:id="122" w:name="a-woge-optional-tier-2-or-3"/>
     <w:p>
       <w:pPr>
         <w:pStyle w:val="Heading3"/>
@@ -30051,8 +30055,8 @@
         <w:t xml:space="preserve">apply.</w:t>
       </w:r>
     </w:p>
-    <w:bookmarkEnd w:id="121"/>
-    <w:bookmarkStart w:id="122" w:name="in-the-creator"/>
+    <w:bookmarkEnd w:id="122"/>
+    <w:bookmarkStart w:id="123" w:name="in-the-creator"/>
     <w:p>
       <w:pPr>
         <w:pStyle w:val="Heading3"/>
@@ -30157,8 +30161,8 @@
         <w:t xml:space="preserve">and enter the advantage and its companion complication.</w:t>
       </w:r>
     </w:p>
-    <w:bookmarkEnd w:id="122"/>
-    <w:bookmarkStart w:id="123" w:name="example"/>
+    <w:bookmarkEnd w:id="123"/>
+    <w:bookmarkStart w:id="124" w:name="example"/>
     <w:p>
       <w:pPr>
         <w:pStyle w:val="Heading3"/>
@@ -30263,10 +30267,10 @@
         <w:t xml:space="preserve">: Wesen recognize their own, and some want you back in the fold; accept the visit at the worst time.</w:t>
       </w:r>
     </w:p>
-    <w:bookmarkEnd w:id="123"/>
     <w:bookmarkEnd w:id="124"/>
     <w:bookmarkEnd w:id="125"/>
-    <w:bookmarkStart w:id="126" w:name="complications"/>
+    <w:bookmarkEnd w:id="126"/>
+    <w:bookmarkStart w:id="127" w:name="complications"/>
     <w:p>
       <w:pPr>
         <w:pStyle w:val="Heading1"/>
@@ -31070,8 +31074,8 @@
         </w:tc>
       </w:tr>
     </w:tbl>
-    <w:bookmarkEnd w:id="126"/>
-    <w:bookmarkStart w:id="127" w:name="quick-reference"/>
+    <w:bookmarkEnd w:id="127"/>
+    <w:bookmarkStart w:id="128" w:name="quick-reference"/>
     <w:p>
       <w:pPr>
         <w:pStyle w:val="Heading1"/>
@@ -31278,7 +31282,7 @@
         <w:t xml:space="preserve">start each session with two (three with True grit). Reroll, reduce an injury by one box, shrug off a telling hit, or establish a small preparation. Earn one from an accepted complication.</w:t>
       </w:r>
     </w:p>
-    <w:bookmarkEnd w:id="127"/>
+    <w:bookmarkEnd w:id="128"/>
     <w:sectPr/>
   </w:body>
 </w:document>

</xml_diff>

<commit_message>
Battle map instructions: on the map and in the Players' Guide
Co-Authored-By: Claude Opus 5.5 <noreply@anthropic.com>
Claude-Session: https://claude.ai/code/session_015SADCFzhKijkC2foUmXrpC
</commit_message>
<xml_diff>
--- a/grimm-west/Grimm_Players_Guide.docx
+++ b/grimm-west/Grimm_Players_Guide.docx
@@ -9023,7 +9023,7 @@
     </w:p>
     <w:bookmarkEnd w:id="58"/>
     <w:bookmarkEnd w:id="59"/>
-    <w:bookmarkStart w:id="69" w:name="personal-combat"/>
+    <w:bookmarkStart w:id="70" w:name="personal-combat"/>
     <w:p>
       <w:pPr>
         <w:pStyle w:val="Heading1"/>
@@ -13092,8 +13092,179 @@
       </w:r>
     </w:p>
     <w:bookmarkEnd w:id="68"/>
+    <w:bookmarkStart w:id="69" w:name="the-battle-map"/>
+    <w:p>
+      <w:pPr>
+        <w:pStyle w:val="Heading2"/>
+      </w:pPr>
+      <w:r>
+        <w:t xml:space="preserve">The battle map</w:t>
+      </w:r>
+    </w:p>
+    <w:p>
+      <w:pPr>
+        <w:pStyle w:val="FirstParagraph"/>
+      </w:pPr>
+      <w:r>
+        <w:t xml:space="preserve">The GM view of the character creator has a</w:t>
+      </w:r>
+      <w:r>
+        <w:t xml:space="preserve"> </w:t>
+      </w:r>
+      <w:r>
+        <w:rPr>
+          <w:bCs/>
+          <w:b/>
+        </w:rPr>
+        <w:t xml:space="preserve">battle map</w:t>
+      </w:r>
+      <w:r>
+        <w:t xml:space="preserve"> </w:t>
+      </w:r>
+      <w:r>
+        <w:t xml:space="preserve">for fights where it helps to see who is where. It is a tool, not a rule: everything on it follows the rules in this chapter, and a fight without it works the same way. Open</w:t>
+      </w:r>
+      <w:r>
+        <w:t xml:space="preserve"> </w:t>
+      </w:r>
+      <w:r>
+        <w:rPr>
+          <w:bCs/>
+          <w:b/>
+        </w:rPr>
+        <w:t xml:space="preserve">How to use the map</w:t>
+      </w:r>
+      <w:r>
+        <w:t xml:space="preserve"> </w:t>
+      </w:r>
+      <w:r>
+        <w:t xml:space="preserve">on the map itself for the buttons, step by step.</w:t>
+      </w:r>
+    </w:p>
+    <w:p>
+      <w:pPr>
+        <w:pStyle w:val="BodyText"/>
+      </w:pPr>
+      <w:r>
+        <w:rPr>
+          <w:bCs/>
+          <w:b/>
+        </w:rPr>
+        <w:t xml:space="preserve">Two kinds of map.</w:t>
+      </w:r>
+    </w:p>
+    <w:p>
+      <w:pPr>
+        <w:numPr>
+          <w:ilvl w:val="0"/>
+          <w:numId w:val="1019"/>
+        </w:numPr>
+        <w:pStyle w:val="Compact"/>
+      </w:pPr>
+      <w:r>
+        <w:rPr>
+          <w:bCs/>
+          <w:b/>
+        </w:rPr>
+        <w:t xml:space="preserve">A hex map</w:t>
+      </w:r>
+      <w:r>
+        <w:t xml:space="preserve"> </w:t>
+      </w:r>
+      <w:r>
+        <w:t xml:space="preserve">for fights where position matters: cover, doorways, who can reach whom. The GM chooses what one hex is: 1 yard for a brawl in a saloon, 5 or 10 yards for a street, 50 for open prairie. Dragging a token or measuring shows the distance and its</w:t>
+      </w:r>
+      <w:r>
+        <w:t xml:space="preserve"> </w:t>
+      </w:r>
+      <w:r>
+        <w:rPr>
+          <w:bCs/>
+          <w:b/>
+        </w:rPr>
+        <w:t xml:space="preserve">range band</w:t>
+      </w:r>
+      <w:r>
+        <w:t xml:space="preserve">, so the GM can read the penalty from the Range table above.</w:t>
+      </w:r>
+    </w:p>
+    <w:p>
+      <w:pPr>
+        <w:numPr>
+          <w:ilvl w:val="0"/>
+          <w:numId w:val="1019"/>
+        </w:numPr>
+        <w:pStyle w:val="Compact"/>
+      </w:pPr>
+      <w:r>
+        <w:rPr>
+          <w:bCs/>
+          <w:b/>
+        </w:rPr>
+        <w:t xml:space="preserve">A range track</w:t>
+      </w:r>
+      <w:r>
+        <w:t xml:space="preserve"> </w:t>
+      </w:r>
+      <w:r>
+        <w:t xml:space="preserve">for fights where only distance matters: a chase after a stagecoach, a running fight across open country. It has a lane for the posse and one for each range band. Moving a token into the next lane moves it one band in or out.</w:t>
+      </w:r>
+    </w:p>
+    <w:p>
+      <w:pPr>
+        <w:pStyle w:val="FirstParagraph"/>
+      </w:pPr>
+      <w:r>
+        <w:rPr>
+          <w:bCs/>
+          <w:b/>
+        </w:rPr>
+        <w:t xml:space="preserve">Tokens.</w:t>
+      </w:r>
+      <w:r>
+        <w:t xml:space="preserve"> </w:t>
+      </w:r>
+      <w:r>
+        <w:t xml:space="preserve">The GM places the posse with one button. Their tokens stay linked to the characters in the GM view: marking Injury, Dying, Dazed or Grit points on a token marks it on the character, and the other way round. Opponents come from the Threats table with their boxes filled in. Their pips fill as they are hurt, and a token whose boxes are all marked is taken out.</w:t>
+      </w:r>
+    </w:p>
+    <w:p>
+      <w:pPr>
+        <w:pStyle w:val="BodyText"/>
+      </w:pPr>
+      <w:r>
+        <w:rPr>
+          <w:bCs/>
+          <w:b/>
+        </w:rPr>
+        <w:t xml:space="preserve">Keeping a map.</w:t>
+      </w:r>
+      <w:r>
+        <w:t xml:space="preserve"> </w:t>
+      </w:r>
+      <w:r>
+        <w:t xml:space="preserve">The map stays in the GM’s browser.</w:t>
+      </w:r>
+      <w:r>
+        <w:t xml:space="preserve"> </w:t>
+      </w:r>
+      <w:r>
+        <w:rPr>
+          <w:bCs/>
+          <w:b/>
+        </w:rPr>
+        <w:t xml:space="preserve">Save map to file</w:t>
+      </w:r>
+      <w:r>
+        <w:t xml:space="preserve"> </w:t>
+      </w:r>
+      <w:r>
+        <w:t xml:space="preserve">keeps both maps, their pictures and tokens in one file, to prepare a fight ahead of time or share it with another GM.</w:t>
+      </w:r>
+    </w:p>
     <w:bookmarkEnd w:id="69"/>
-    <w:bookmarkStart w:id="75" w:name="medical-care"/>
+    <w:bookmarkEnd w:id="70"/>
+    <w:bookmarkStart w:id="76" w:name="medical-care"/>
     <w:p>
       <w:pPr>
         <w:pStyle w:val="Heading1"/>
@@ -13110,7 +13281,7 @@
         <w:t xml:space="preserve">Frontier medicine in 1889 has chloroform, carbolic acid, laudanum and steady hands, and not much else. Wesen heal like humans, and some injuries need remedies from older traditions.</w:t>
       </w:r>
     </w:p>
-    <w:bookmarkStart w:id="70" w:name="diagnosis-and-stabilization"/>
+    <w:bookmarkStart w:id="71" w:name="diagnosis-and-stabilization"/>
     <w:p>
       <w:pPr>
         <w:pStyle w:val="Heading2"/>
@@ -13127,8 +13298,8 @@
         <w:t xml:space="preserve">Roll Medicine when the diagnosis is uncertain or an urgent treatment decision matters. Emergency stabilization takes one action and a successful Medicine roll with a doctor’s bag. It ends Dying and stops deterioration, but removes no boxes.</w:t>
       </w:r>
     </w:p>
-    <w:bookmarkEnd w:id="70"/>
-    <w:bookmarkStart w:id="71" w:name="field-treatment"/>
+    <w:bookmarkEnd w:id="71"/>
+    <w:bookmarkStart w:id="72" w:name="field-treatment"/>
     <w:p>
       <w:pPr>
         <w:pStyle w:val="Heading2"/>
@@ -13145,8 +13316,8 @@
         <w:t xml:space="preserve">With a doctor’s bag and several uninterrupted minutes, successful Medicine removes one injury box; success by 5 or more removes two. Each injury receives one field-treatment attempt; further attempts need changed circumstances.</w:t>
       </w:r>
     </w:p>
-    <w:bookmarkEnd w:id="71"/>
-    <w:bookmarkStart w:id="72" w:name="a-doctors-surgery"/>
+    <w:bookmarkEnd w:id="72"/>
+    <w:bookmarkStart w:id="73" w:name="a-doctors-surgery"/>
     <w:p>
       <w:pPr>
         <w:pStyle w:val="Heading2"/>
@@ -13163,8 +13334,8 @@
         <w:t xml:space="preserve">A proper surgery with instruments, chloroform and a clean table grants +2 to Medicine. A successful treatment removes two boxes; success by 5 or more removes three. Allow the time the operation requires.</w:t>
       </w:r>
     </w:p>
-    <w:bookmarkEnd w:id="72"/>
-    <w:bookmarkStart w:id="73" w:name="remedies-and-poisons"/>
+    <w:bookmarkEnd w:id="73"/>
+    <w:bookmarkStart w:id="74" w:name="remedies-and-poisons"/>
     <w:p>
       <w:pPr>
         <w:pStyle w:val="Heading2"/>
@@ -13181,8 +13352,8 @@
         <w:t xml:space="preserve">Apothecary treats what Medicine can’t: Wesen poisons, curses, magical sickness and Wesen-specific ailments. Finding the right remedy usually means first identifying the cause (Wesen Lore or Occult), then brewing it (Apothecary, with an apothecary kit). A remedy can substitute for field treatment against such harm.</w:t>
       </w:r>
     </w:p>
-    <w:bookmarkEnd w:id="73"/>
-    <w:bookmarkStart w:id="74" w:name="natural-recovery"/>
+    <w:bookmarkEnd w:id="74"/>
+    <w:bookmarkStart w:id="75" w:name="natural-recovery"/>
     <w:p>
       <w:pPr>
         <w:pStyle w:val="Heading2"/>
@@ -13367,9 +13538,9 @@
         <w:t xml:space="preserve">At three boxes, rest alone does nothing until someone has stabilized or treated you; after that, a week of rest in their care clears the first box. A doctor’s treatment is faster. The times add up: from three boxes, rest alone takes about a week and a half to heal completely (a week, then three days, then a day).</w:t>
       </w:r>
     </w:p>
-    <w:bookmarkEnd w:id="74"/>
     <w:bookmarkEnd w:id="75"/>
-    <w:bookmarkStart w:id="80" w:name="grit-points-and-trouble"/>
+    <w:bookmarkEnd w:id="76"/>
+    <w:bookmarkStart w:id="81" w:name="grit-points-and-trouble"/>
     <w:p>
       <w:pPr>
         <w:pStyle w:val="Heading1"/>
@@ -13378,7 +13549,7 @@
         <w:t xml:space="preserve">Grit points and Trouble</w:t>
       </w:r>
     </w:p>
-    <w:bookmarkStart w:id="76" w:name="using-grit-points"/>
+    <w:bookmarkStart w:id="77" w:name="using-grit-points"/>
     <w:p>
       <w:pPr>
         <w:pStyle w:val="Heading2"/>
@@ -13596,8 +13767,8 @@
         <w:t xml:space="preserve">Gain one point when one of your complications creates a meaningful problem you accept, including a companion complication from a heritage advantage. You can decline the proposed complication without penalty.</w:t>
       </w:r>
     </w:p>
-    <w:bookmarkEnd w:id="76"/>
-    <w:bookmarkStart w:id="77" w:name="trouble"/>
+    <w:bookmarkEnd w:id="77"/>
+    <w:bookmarkStart w:id="78" w:name="trouble"/>
     <w:p>
       <w:pPr>
         <w:pStyle w:val="Heading2"/>
@@ -13898,8 +14069,8 @@
         <w:t xml:space="preserve">Lying low between cases, a good cover story (Deception), or doing the town a public good can clear a box per case.</w:t>
       </w:r>
     </w:p>
-    <w:bookmarkEnd w:id="77"/>
-    <w:bookmarkStart w:id="79" w:name="advancement"/>
+    <w:bookmarkEnd w:id="78"/>
+    <w:bookmarkStart w:id="80" w:name="advancement"/>
     <w:p>
       <w:pPr>
         <w:pStyle w:val="Heading2"/>
@@ -13936,7 +14107,7 @@
       <w:pPr>
         <w:numPr>
           <w:ilvl w:val="0"/>
-          <w:numId w:val="1019"/>
+          <w:numId w:val="1020"/>
         </w:numPr>
         <w:pStyle w:val="Compact"/>
       </w:pPr>
@@ -13997,7 +14168,7 @@
       <w:pPr>
         <w:numPr>
           <w:ilvl w:val="0"/>
-          <w:numId w:val="1019"/>
+          <w:numId w:val="1020"/>
         </w:numPr>
         <w:pStyle w:val="Compact"/>
       </w:pPr>
@@ -14343,7 +14514,7 @@
         <w:t xml:space="preserve">The creator keeps the ledger: award points in the advancement box under the skills (or from the GM journal), then spend them there.</w:t>
       </w:r>
     </w:p>
-    <w:bookmarkStart w:id="78" w:name="magic-advancement"/>
+    <w:bookmarkStart w:id="79" w:name="magic-advancement"/>
     <w:p>
       <w:pPr>
         <w:pStyle w:val="Heading3"/>
@@ -14837,10 +15008,10 @@
         </w:tc>
       </w:tr>
     </w:tbl>
-    <w:bookmarkEnd w:id="78"/>
     <w:bookmarkEnd w:id="79"/>
     <w:bookmarkEnd w:id="80"/>
-    <w:bookmarkStart w:id="83" w:name="running-cases"/>
+    <w:bookmarkEnd w:id="81"/>
+    <w:bookmarkStart w:id="84" w:name="running-cases"/>
     <w:p>
       <w:pPr>
         <w:pStyle w:val="Heading1"/>
@@ -14849,7 +15020,7 @@
         <w:t xml:space="preserve">Running cases</w:t>
       </w:r>
     </w:p>
-    <w:bookmarkStart w:id="81" w:name="case-seeds"/>
+    <w:bookmarkStart w:id="82" w:name="case-seeds"/>
     <w:p>
       <w:pPr>
         <w:pStyle w:val="Heading2"/>
@@ -17165,8 +17336,8 @@
         </w:tc>
       </w:tr>
     </w:tbl>
-    <w:bookmarkEnd w:id="81"/>
-    <w:bookmarkStart w:id="82" w:name="the-case-journal"/>
+    <w:bookmarkEnd w:id="82"/>
+    <w:bookmarkStart w:id="83" w:name="the-case-journal"/>
     <w:p>
       <w:pPr>
         <w:pStyle w:val="Heading2"/>
@@ -17181,162 +17352,6 @@
       </w:pPr>
       <w:r>
         <w:t xml:space="preserve">End each case with a short journal entry, written together, as the Grimms have always kept their books:</w:t>
-      </w:r>
-    </w:p>
-    <w:p>
-      <w:pPr>
-        <w:numPr>
-          <w:ilvl w:val="0"/>
-          <w:numId w:val="1020"/>
-        </w:numPr>
-        <w:pStyle w:val="Compact"/>
-      </w:pPr>
-      <w:r>
-        <w:rPr>
-          <w:bCs/>
-          <w:b/>
-        </w:rPr>
-        <w:t xml:space="preserve">The case.</w:t>
-      </w:r>
-      <w:r>
-        <w:t xml:space="preserve"> </w:t>
-      </w:r>
-      <w:r>
-        <w:t xml:space="preserve">What happened, and did we resolve it: closed, partly, or failed?</w:t>
-      </w:r>
-    </w:p>
-    <w:p>
-      <w:pPr>
-        <w:numPr>
-          <w:ilvl w:val="0"/>
-          <w:numId w:val="1020"/>
-        </w:numPr>
-        <w:pStyle w:val="Compact"/>
-      </w:pPr>
-      <w:r>
-        <w:rPr>
-          <w:bCs/>
-          <w:b/>
-        </w:rPr>
-        <w:t xml:space="preserve">Who stood out?</w:t>
-      </w:r>
-      <w:r>
-        <w:t xml:space="preserve"> </w:t>
-      </w:r>
-      <w:r>
-        <w:t xml:space="preserve">A moment worth remembering.</w:t>
-      </w:r>
-    </w:p>
-    <w:p>
-      <w:pPr>
-        <w:numPr>
-          <w:ilvl w:val="0"/>
-          <w:numId w:val="1020"/>
-        </w:numPr>
-        <w:pStyle w:val="Compact"/>
-      </w:pPr>
-      <w:r>
-        <w:rPr>
-          <w:bCs/>
-          <w:b/>
-        </w:rPr>
-        <w:t xml:space="preserve">Complications.</w:t>
-      </w:r>
-      <w:r>
-        <w:t xml:space="preserve"> </w:t>
-      </w:r>
-      <w:r>
-        <w:t xml:space="preserve">Which ones came into play, and what did they cost?</w:t>
-      </w:r>
-    </w:p>
-    <w:p>
-      <w:pPr>
-        <w:numPr>
-          <w:ilvl w:val="0"/>
-          <w:numId w:val="1020"/>
-        </w:numPr>
-        <w:pStyle w:val="Compact"/>
-      </w:pPr>
-      <w:r>
-        <w:rPr>
-          <w:bCs/>
-          <w:b/>
-        </w:rPr>
-        <w:t xml:space="preserve">For the books.</w:t>
-      </w:r>
-      <w:r>
-        <w:t xml:space="preserve"> </w:t>
-      </w:r>
-      <w:r>
-        <w:t xml:space="preserve">A new Wesen kind, weakness or custom worth recording.</w:t>
-      </w:r>
-    </w:p>
-    <w:p>
-      <w:pPr>
-        <w:numPr>
-          <w:ilvl w:val="0"/>
-          <w:numId w:val="1020"/>
-        </w:numPr>
-        <w:pStyle w:val="Compact"/>
-      </w:pPr>
-      <w:r>
-        <w:rPr>
-          <w:bCs/>
-          <w:b/>
-        </w:rPr>
-        <w:t xml:space="preserve">Advancement.</w:t>
-      </w:r>
-      <w:r>
-        <w:t xml:space="preserve"> </w:t>
-      </w:r>
-      <w:r>
-        <w:t xml:space="preserve">After a significant case, each character earns 1 advancement point; at a milestone, 2 more.</w:t>
-      </w:r>
-    </w:p>
-    <w:bookmarkEnd w:id="82"/>
-    <w:bookmarkEnd w:id="83"/>
-    <w:bookmarkStart w:id="91" w:name="ready-made-characters"/>
-    <w:p>
-      <w:pPr>
-        <w:pStyle w:val="Heading1"/>
-      </w:pPr>
-      <w:r>
-        <w:t xml:space="preserve">Ready-made characters</w:t>
-      </w:r>
-    </w:p>
-    <w:p>
-      <w:pPr>
-        <w:pStyle w:val="FirstParagraph"/>
-      </w:pPr>
-      <w:r>
-        <w:t xml:space="preserve">Seven characters ready to play. Each follows the creation rules exactly, Edges included, and their connections tie them together.</w:t>
-      </w:r>
-    </w:p>
-    <w:bookmarkStart w:id="84" w:name="eliza-kessler"/>
-    <w:p>
-      <w:pPr>
-        <w:pStyle w:val="Heading2"/>
-      </w:pPr>
-      <w:r>
-        <w:t xml:space="preserve">Eliza Kessler</w:t>
-      </w:r>
-    </w:p>
-    <w:p>
-      <w:pPr>
-        <w:pStyle w:val="FirstParagraph"/>
-      </w:pPr>
-      <w:r>
-        <w:rPr>
-          <w:iCs/>
-          <w:i/>
-        </w:rPr>
-        <w:t xml:space="preserve">Deputy U.S. Marshal, Lawman. Grimm (Tier 2).</w:t>
-      </w:r>
-      <w:r>
-        <w:t xml:space="preserve"> </w:t>
-      </w:r>
-      <w:r>
-        <w:t xml:space="preserve">Wears the badge: the law, and the Code, in one person.</w:t>
       </w:r>
     </w:p>
     <w:p>
@@ -17352,29 +17367,13 @@
           <w:bCs/>
           <w:b/>
         </w:rPr>
-        <w:t xml:space="preserve">Attributes:</w:t>
-      </w:r>
-      <w:r>
-        <w:t xml:space="preserve"> </w:t>
-      </w:r>
-      <w:r>
-        <w:t xml:space="preserve">Body 12, Agility 13, Intellect 10, Presence 8, Will 12.</w:t>
-      </w:r>
-      <w:r>
-        <w:t xml:space="preserve"> </w:t>
-      </w:r>
-      <w:r>
-        <w:rPr>
-          <w:bCs/>
-          <w:b/>
-        </w:rPr>
-        <w:t xml:space="preserve">Dodge</w:t>
-      </w:r>
-      <w:r>
-        <w:t xml:space="preserve"> </w:t>
-      </w:r>
-      <w:r>
-        <w:t xml:space="preserve">12.</w:t>
+        <w:t xml:space="preserve">The case.</w:t>
+      </w:r>
+      <w:r>
+        <w:t xml:space="preserve"> </w:t>
+      </w:r>
+      <w:r>
+        <w:t xml:space="preserve">What happened, and did we resolve it: closed, partly, or failed?</w:t>
       </w:r>
     </w:p>
     <w:p>
@@ -17390,13 +17389,13 @@
           <w:bCs/>
           <w:b/>
         </w:rPr>
-        <w:t xml:space="preserve">Skills:</w:t>
-      </w:r>
-      <w:r>
-        <w:t xml:space="preserve"> </w:t>
-      </w:r>
-      <w:r>
-        <w:t xml:space="preserve">Shooting 16 (Specialty). Trained: Riding 14, Melee 14, Brawling 14, Athletics 13, Investigation 11, Tracking 11, Read People 11, Survival 11, Leadership 9; Wesen Lore 11 (free).</w:t>
+        <w:t xml:space="preserve">Who stood out?</w:t>
+      </w:r>
+      <w:r>
+        <w:t xml:space="preserve"> </w:t>
+      </w:r>
+      <w:r>
+        <w:t xml:space="preserve">A moment worth remembering.</w:t>
       </w:r>
     </w:p>
     <w:p>
@@ -17412,61 +17411,13 @@
           <w:bCs/>
           <w:b/>
         </w:rPr>
-        <w:t xml:space="preserve">Edge:</w:t>
-      </w:r>
-      <w:r>
-        <w:t xml:space="preserve"> </w:t>
-      </w:r>
-      <w:r>
-        <w:t xml:space="preserve">Second advantage: Badge: Deputy U.S. Marshal.</w:t>
-      </w:r>
-      <w:r>
-        <w:t xml:space="preserve"> </w:t>
-      </w:r>
-      <w:r>
-        <w:rPr>
-          <w:bCs/>
-          <w:b/>
-        </w:rPr>
-        <w:t xml:space="preserve">Grimm gift:</w:t>
-      </w:r>
-      <w:r>
-        <w:t xml:space="preserve"> </w:t>
-      </w:r>
-      <w:r>
-        <w:t xml:space="preserve">Keeper of the Books (companion: The Books Must Be Kept).</w:t>
-      </w:r>
-      <w:r>
-        <w:t xml:space="preserve"> </w:t>
-      </w:r>
-      <w:r>
-        <w:rPr>
-          <w:bCs/>
-          <w:b/>
-        </w:rPr>
-        <w:t xml:space="preserve">Complication:</w:t>
-      </w:r>
-      <w:r>
-        <w:t xml:space="preserve"> </w:t>
-      </w:r>
-      <w:r>
-        <w:t xml:space="preserve">Law and Order; trigger: a Wesen suspect could be killed instead of arrested.</w:t>
-      </w:r>
-      <w:r>
-        <w:t xml:space="preserve"> </w:t>
-      </w:r>
-      <w:r>
-        <w:rPr>
-          <w:bCs/>
-          <w:b/>
-        </w:rPr>
-        <w:t xml:space="preserve">Allegiance:</w:t>
-      </w:r>
-      <w:r>
-        <w:t xml:space="preserve"> </w:t>
-      </w:r>
-      <w:r>
-        <w:t xml:space="preserve">The U.S. Marshals.</w:t>
+        <w:t xml:space="preserve">Complications.</w:t>
+      </w:r>
+      <w:r>
+        <w:t xml:space="preserve"> </w:t>
+      </w:r>
+      <w:r>
+        <w:t xml:space="preserve">Which ones came into play, and what did they cost?</w:t>
       </w:r>
     </w:p>
     <w:p>
@@ -17482,39 +17433,63 @@
           <w:bCs/>
           <w:b/>
         </w:rPr>
-        <w:t xml:space="preserve">Why I stand against the dark:</w:t>
-      </w:r>
-      <w:r>
-        <w:t xml:space="preserve"> </w:t>
-      </w:r>
-      <w:r>
-        <w:t xml:space="preserve">The Grimm blood woke in me, and it came with a duty.</w:t>
-      </w:r>
-      <w:r>
-        <w:t xml:space="preserve"> </w:t>
-      </w:r>
-      <w:r>
-        <w:rPr>
-          <w:bCs/>
-          <w:b/>
-        </w:rPr>
-        <w:t xml:space="preserve">Connection:</w:t>
-      </w:r>
-      <w:r>
-        <w:t xml:space="preserve"> </w:t>
-      </w:r>
-      <w:r>
-        <w:t xml:space="preserve">Gus Brandt cut her down from a lynch mob’s rope before anyone knew what she was.</w:t>
-      </w:r>
-    </w:p>
+        <w:t xml:space="preserve">For the books.</w:t>
+      </w:r>
+      <w:r>
+        <w:t xml:space="preserve"> </w:t>
+      </w:r>
+      <w:r>
+        <w:t xml:space="preserve">A new Wesen kind, weakness or custom worth recording.</w:t>
+      </w:r>
+    </w:p>
+    <w:p>
+      <w:pPr>
+        <w:numPr>
+          <w:ilvl w:val="0"/>
+          <w:numId w:val="1021"/>
+        </w:numPr>
+        <w:pStyle w:val="Compact"/>
+      </w:pPr>
+      <w:r>
+        <w:rPr>
+          <w:bCs/>
+          <w:b/>
+        </w:rPr>
+        <w:t xml:space="preserve">Advancement.</w:t>
+      </w:r>
+      <w:r>
+        <w:t xml:space="preserve"> </w:t>
+      </w:r>
+      <w:r>
+        <w:t xml:space="preserve">After a significant case, each character earns 1 advancement point; at a milestone, 2 more.</w:t>
+      </w:r>
+    </w:p>
+    <w:bookmarkEnd w:id="83"/>
     <w:bookmarkEnd w:id="84"/>
-    <w:bookmarkStart w:id="85" w:name="gus-brandt"/>
+    <w:bookmarkStart w:id="92" w:name="ready-made-characters"/>
+    <w:p>
+      <w:pPr>
+        <w:pStyle w:val="Heading1"/>
+      </w:pPr>
+      <w:r>
+        <w:t xml:space="preserve">Ready-made characters</w:t>
+      </w:r>
+    </w:p>
+    <w:p>
+      <w:pPr>
+        <w:pStyle w:val="FirstParagraph"/>
+      </w:pPr>
+      <w:r>
+        <w:t xml:space="preserve">Seven characters ready to play. Each follows the creation rules exactly, Edges included, and their connections tie them together.</w:t>
+      </w:r>
+    </w:p>
+    <w:bookmarkStart w:id="85" w:name="eliza-kessler"/>
     <w:p>
       <w:pPr>
         <w:pStyle w:val="Heading2"/>
       </w:pPr>
       <w:r>
-        <w:t xml:space="preserve">Gus Brandt</w:t>
+        <w:t xml:space="preserve">Eliza Kessler</w:t>
       </w:r>
     </w:p>
     <w:p>
@@ -17526,13 +17501,13 @@
           <w:iCs/>
           <w:i/>
         </w:rPr>
-        <w:t xml:space="preserve">Blacksmith and gunsmith, Tinker. Blutbad (Tier 2).</w:t>
-      </w:r>
-      <w:r>
-        <w:t xml:space="preserve"> </w:t>
-      </w:r>
-      <w:r>
-        <w:t xml:space="preserve">Shoes the horses, fixes the guns, and hasn’t hunted in eleven years.</w:t>
+        <w:t xml:space="preserve">Deputy U.S. Marshal, Lawman. Grimm (Tier 2).</w:t>
+      </w:r>
+      <w:r>
+        <w:t xml:space="preserve"> </w:t>
+      </w:r>
+      <w:r>
+        <w:t xml:space="preserve">Wears the badge: the law, and the Code, in one person.</w:t>
       </w:r>
     </w:p>
     <w:p>
@@ -17554,7 +17529,7 @@
         <w:t xml:space="preserve"> </w:t>
       </w:r>
       <w:r>
-        <w:t xml:space="preserve">Body 11, Agility 11, Intellect 13, Presence 10, Will 10.</w:t>
+        <w:t xml:space="preserve">Body 12, Agility 13, Intellect 10, Presence 8, Will 12.</w:t>
       </w:r>
       <w:r>
         <w:t xml:space="preserve"> </w:t>
@@ -17570,23 +17545,7 @@
         <w:t xml:space="preserve"> </w:t>
       </w:r>
       <w:r>
-        <w:t xml:space="preserve">10.</w:t>
-      </w:r>
-      <w:r>
-        <w:t xml:space="preserve"> </w:t>
-      </w:r>
-      <w:r>
-        <w:rPr>
-          <w:bCs/>
-          <w:b/>
-        </w:rPr>
-        <w:t xml:space="preserve">In woge:</w:t>
-      </w:r>
-      <w:r>
-        <w:t xml:space="preserve"> </w:t>
-      </w:r>
-      <w:r>
-        <w:t xml:space="preserve">Body 13, Agility 12; claws and fangs mark 2 boxes.</w:t>
+        <w:t xml:space="preserve">12.</w:t>
       </w:r>
     </w:p>
     <w:p>
@@ -17608,7 +17567,7 @@
         <w:t xml:space="preserve"> </w:t>
       </w:r>
       <w:r>
-        <w:t xml:space="preserve">Tinkering 16 (Specialty). Trained: Tracking 14, Wesen Lore 14, Investigation 14, Survival 14, Read People 14, Brawling 12, Melee 12, Athletics 12, Persuasion 11.</w:t>
+        <w:t xml:space="preserve">Shooting 16 (Specialty). Trained: Riding 14, Melee 14, Brawling 14, Athletics 13, Investigation 11, Tracking 11, Read People 11, Survival 11, Leadership 9; Wesen Lore 11 (free).</w:t>
       </w:r>
     </w:p>
     <w:p>
@@ -17630,23 +17589,23 @@
         <w:t xml:space="preserve"> </w:t>
       </w:r>
       <w:r>
-        <w:t xml:space="preserve">A fine tool: a master gunsmith’s tools (+2 Tinkering).</w:t>
-      </w:r>
-      <w:r>
-        <w:t xml:space="preserve"> </w:t>
-      </w:r>
-      <w:r>
-        <w:rPr>
-          <w:bCs/>
-          <w:b/>
-        </w:rPr>
-        <w:t xml:space="preserve">Advantage:</w:t>
-      </w:r>
-      <w:r>
-        <w:t xml:space="preserve"> </w:t>
-      </w:r>
-      <w:r>
-        <w:t xml:space="preserve">Blutbad Nose (companion: The Bloodlust).</w:t>
+        <w:t xml:space="preserve">Second advantage: Badge: Deputy U.S. Marshal.</w:t>
+      </w:r>
+      <w:r>
+        <w:t xml:space="preserve"> </w:t>
+      </w:r>
+      <w:r>
+        <w:rPr>
+          <w:bCs/>
+          <w:b/>
+        </w:rPr>
+        <w:t xml:space="preserve">Grimm gift:</w:t>
+      </w:r>
+      <w:r>
+        <w:t xml:space="preserve"> </w:t>
+      </w:r>
+      <w:r>
+        <w:t xml:space="preserve">Keeper of the Books (companion: The Books Must Be Kept).</w:t>
       </w:r>
       <w:r>
         <w:t xml:space="preserve"> </w:t>
@@ -17662,7 +17621,23 @@
         <w:t xml:space="preserve"> </w:t>
       </w:r>
       <w:r>
-        <w:t xml:space="preserve">Keeps a Dangerous Secret; trigger: someone from his old pack turns up.</w:t>
+        <w:t xml:space="preserve">Law and Order; trigger: a Wesen suspect could be killed instead of arrested.</w:t>
+      </w:r>
+      <w:r>
+        <w:t xml:space="preserve"> </w:t>
+      </w:r>
+      <w:r>
+        <w:rPr>
+          <w:bCs/>
+          <w:b/>
+        </w:rPr>
+        <w:t xml:space="preserve">Allegiance:</w:t>
+      </w:r>
+      <w:r>
+        <w:t xml:space="preserve"> </w:t>
+      </w:r>
+      <w:r>
+        <w:t xml:space="preserve">The U.S. Marshals.</w:t>
       </w:r>
     </w:p>
     <w:p>
@@ -17684,7 +17659,7 @@
         <w:t xml:space="preserve"> </w:t>
       </w:r>
       <w:r>
-        <w:t xml:space="preserve">I did harm once. I mean to balance the ledger.</w:t>
+        <w:t xml:space="preserve">The Grimm blood woke in me, and it came with a duty.</w:t>
       </w:r>
       <w:r>
         <w:t xml:space="preserve"> </w:t>
@@ -17700,17 +17675,17 @@
         <w:t xml:space="preserve"> </w:t>
       </w:r>
       <w:r>
-        <w:t xml:space="preserve">Owes Roz Vey for the remedies that keep the urge quiet.</w:t>
+        <w:t xml:space="preserve">Gus Brandt cut her down from a lynch mob’s rope before anyone knew what she was.</w:t>
       </w:r>
     </w:p>
     <w:bookmarkEnd w:id="85"/>
-    <w:bookmarkStart w:id="86" w:name="roz-vey"/>
+    <w:bookmarkStart w:id="86" w:name="gus-brandt"/>
     <w:p>
       <w:pPr>
         <w:pStyle w:val="Heading2"/>
       </w:pPr>
       <w:r>
-        <w:t xml:space="preserve">Roz Vey</w:t>
+        <w:t xml:space="preserve">Gus Brandt</w:t>
       </w:r>
     </w:p>
     <w:p>
@@ -17722,13 +17697,13 @@
           <w:iCs/>
           <w:i/>
         </w:rPr>
-        <w:t xml:space="preserve">Spice and tea merchant, Apothecary. Fuchsbau (Tier 1).</w:t>
-      </w:r>
-      <w:r>
-        <w:t xml:space="preserve"> </w:t>
-      </w:r>
-      <w:r>
-        <w:t xml:space="preserve">Sells tea out front, and other things in the back.</w:t>
+        <w:t xml:space="preserve">Blacksmith and gunsmith, Tinker. Blutbad (Tier 2).</w:t>
+      </w:r>
+      <w:r>
+        <w:t xml:space="preserve"> </w:t>
+      </w:r>
+      <w:r>
+        <w:t xml:space="preserve">Shoes the horses, fixes the guns, and hasn’t hunted in eleven years.</w:t>
       </w:r>
     </w:p>
     <w:p>
@@ -17750,7 +17725,7 @@
         <w:t xml:space="preserve"> </w:t>
       </w:r>
       <w:r>
-        <w:t xml:space="preserve">Body 9, Agility 11, Intellect 13, Presence 12, Will 10.</w:t>
+        <w:t xml:space="preserve">Body 11, Agility 11, Intellect 13, Presence 10, Will 10.</w:t>
       </w:r>
       <w:r>
         <w:t xml:space="preserve"> </w:t>
@@ -17766,7 +17741,23 @@
         <w:t xml:space="preserve"> </w:t>
       </w:r>
       <w:r>
-        <w:t xml:space="preserve">9.</w:t>
+        <w:t xml:space="preserve">10.</w:t>
+      </w:r>
+      <w:r>
+        <w:t xml:space="preserve"> </w:t>
+      </w:r>
+      <w:r>
+        <w:rPr>
+          <w:bCs/>
+          <w:b/>
+        </w:rPr>
+        <w:t xml:space="preserve">In woge:</w:t>
+      </w:r>
+      <w:r>
+        <w:t xml:space="preserve"> </w:t>
+      </w:r>
+      <w:r>
+        <w:t xml:space="preserve">Body 13, Agility 12; claws and fangs mark 2 boxes.</w:t>
       </w:r>
     </w:p>
     <w:p>
@@ -17788,7 +17779,7 @@
         <w:t xml:space="preserve"> </w:t>
       </w:r>
       <w:r>
-        <w:t xml:space="preserve">Apothecary 16 (Specialty). Trained: Medicine 14, Wesen Lore 14, Read People 14, Investigation 14, Gambling 14, Survival 14, Occult 14, Persuasion 13, Deception 13, Stealth 12.</w:t>
+        <w:t xml:space="preserve">Tinkering 16 (Specialty). Trained: Tracking 14, Wesen Lore 14, Investigation 14, Survival 14, Read People 14, Brawling 12, Melee 12, Athletics 12, Persuasion 11.</w:t>
       </w:r>
     </w:p>
     <w:p>
@@ -17804,13 +17795,13 @@
           <w:bCs/>
           <w:b/>
         </w:rPr>
-        <w:t xml:space="preserve">Edges:</w:t>
-      </w:r>
-      <w:r>
-        <w:t xml:space="preserve"> </w:t>
-      </w:r>
-      <w:r>
-        <w:t xml:space="preserve">Extra Trained skill; a friend in town: her cousin Ambrose, a Fuchsbau smuggler on the river docks who can find any ingredient, for a price.</w:t>
+        <w:t xml:space="preserve">Edge:</w:t>
+      </w:r>
+      <w:r>
+        <w:t xml:space="preserve"> </w:t>
+      </w:r>
+      <w:r>
+        <w:t xml:space="preserve">A fine tool: a master gunsmith’s tools (+2 Tinkering).</w:t>
       </w:r>
       <w:r>
         <w:t xml:space="preserve"> </w:t>
@@ -17826,7 +17817,7 @@
         <w:t xml:space="preserve"> </w:t>
       </w:r>
       <w:r>
-        <w:t xml:space="preserve">Fuchsbau Remedies (companion: Criminal Kin).</w:t>
+        <w:t xml:space="preserve">Blutbad Nose (companion: The Bloodlust).</w:t>
       </w:r>
       <w:r>
         <w:t xml:space="preserve"> </w:t>
@@ -17842,7 +17833,7 @@
         <w:t xml:space="preserve"> </w:t>
       </w:r>
       <w:r>
-        <w:t xml:space="preserve">Protects Others at Personal Risk; trigger: a sick or hurt stranger turns up at the shop.</w:t>
+        <w:t xml:space="preserve">Keeps a Dangerous Secret; trigger: someone from his old pack turns up.</w:t>
       </w:r>
     </w:p>
     <w:p>
@@ -17864,7 +17855,7 @@
         <w:t xml:space="preserve"> </w:t>
       </w:r>
       <w:r>
-        <w:t xml:space="preserve">Wesen and humans can live side by side, and I mean to prove it.</w:t>
+        <w:t xml:space="preserve">I did harm once. I mean to balance the ledger.</w:t>
       </w:r>
       <w:r>
         <w:t xml:space="preserve"> </w:t>
@@ -17880,17 +17871,17 @@
         <w:t xml:space="preserve"> </w:t>
       </w:r>
       <w:r>
-        <w:t xml:space="preserve">Trades notes with Dr. Whitlock, who still won’t admit some of her remedies work better than his.</w:t>
+        <w:t xml:space="preserve">Owes Roz Vey for the remedies that keep the urge quiet.</w:t>
       </w:r>
     </w:p>
     <w:bookmarkEnd w:id="86"/>
-    <w:bookmarkStart w:id="87" w:name="dr.-thaddeus-whitlock"/>
+    <w:bookmarkStart w:id="87" w:name="roz-vey"/>
     <w:p>
       <w:pPr>
         <w:pStyle w:val="Heading2"/>
       </w:pPr>
       <w:r>
-        <w:t xml:space="preserve">Dr. Thaddeus Whitlock</w:t>
+        <w:t xml:space="preserve">Roz Vey</w:t>
       </w:r>
     </w:p>
     <w:p>
@@ -17902,13 +17893,13 @@
           <w:iCs/>
           <w:i/>
         </w:rPr>
-        <w:t xml:space="preserve">Town physician, Doctor. Human (Tier 0).</w:t>
-      </w:r>
-      <w:r>
-        <w:t xml:space="preserve"> </w:t>
-      </w:r>
-      <w:r>
-        <w:t xml:space="preserve">Army surgeon in the war; now he digs bullets out of his friends and asks too many questions about what made the other wounds.</w:t>
+        <w:t xml:space="preserve">Spice and tea merchant, Apothecary. Fuchsbau (Tier 1).</w:t>
+      </w:r>
+      <w:r>
+        <w:t xml:space="preserve"> </w:t>
+      </w:r>
+      <w:r>
+        <w:t xml:space="preserve">Sells tea out front, and other things in the back.</w:t>
       </w:r>
     </w:p>
     <w:p>
@@ -17930,7 +17921,7 @@
         <w:t xml:space="preserve"> </w:t>
       </w:r>
       <w:r>
-        <w:t xml:space="preserve">Body 10, Agility 10, Intellect 13, Presence 12, Will 11.</w:t>
+        <w:t xml:space="preserve">Body 9, Agility 11, Intellect 13, Presence 12, Will 10.</w:t>
       </w:r>
       <w:r>
         <w:t xml:space="preserve"> </w:t>
@@ -17946,7 +17937,7 @@
         <w:t xml:space="preserve"> </w:t>
       </w:r>
       <w:r>
-        <w:t xml:space="preserve">8.</w:t>
+        <w:t xml:space="preserve">9.</w:t>
       </w:r>
     </w:p>
     <w:p>
@@ -17968,7 +17959,7 @@
         <w:t xml:space="preserve"> </w:t>
       </w:r>
       <w:r>
-        <w:t xml:space="preserve">Medicine 16 (Specialty). Trained: Apothecary 14, Read People 14, Investigation 14, Wesen Lore 14, Occult 14, Persuasion 13, Leadership 13, Riding 11, Shooting 11.</w:t>
+        <w:t xml:space="preserve">Apothecary 16 (Specialty). Trained: Medicine 14, Wesen Lore 14, Read People 14, Investigation 14, Gambling 14, Survival 14, Occult 14, Persuasion 13, Deception 13, Stealth 12.</w:t>
       </w:r>
     </w:p>
     <w:p>
@@ -17990,7 +17981,7 @@
         <w:t xml:space="preserve"> </w:t>
       </w:r>
       <w:r>
-        <w:t xml:space="preserve">+1 attribute point; second advantage: Battlefield Surgeon; a fine tool: his army surgeon’s instruments (+2 Medicine).</w:t>
+        <w:t xml:space="preserve">Extra Trained skill; a friend in town: her cousin Ambrose, a Fuchsbau smuggler on the river docks who can find any ingredient, for a price.</w:t>
       </w:r>
       <w:r>
         <w:t xml:space="preserve"> </w:t>
@@ -18006,7 +17997,7 @@
         <w:t xml:space="preserve"> </w:t>
       </w:r>
       <w:r>
-        <w:t xml:space="preserve">Steady Hands.</w:t>
+        <w:t xml:space="preserve">Fuchsbau Remedies (companion: Criminal Kin).</w:t>
       </w:r>
       <w:r>
         <w:t xml:space="preserve"> </w:t>
@@ -18022,7 +18013,7 @@
         <w:t xml:space="preserve"> </w:t>
       </w:r>
       <w:r>
-        <w:t xml:space="preserve">Haunted by the War; trigger: gunfire in the dark.</w:t>
+        <w:t xml:space="preserve">Protects Others at Personal Risk; trigger: a sick or hurt stranger turns up at the shop.</w:t>
       </w:r>
     </w:p>
     <w:p>
@@ -18044,7 +18035,7 @@
         <w:t xml:space="preserve"> </w:t>
       </w:r>
       <w:r>
-        <w:t xml:space="preserve">I saw what I saw, and no one else believes me.</w:t>
+        <w:t xml:space="preserve">Wesen and humans can live side by side, and I mean to prove it.</w:t>
       </w:r>
       <w:r>
         <w:t xml:space="preserve"> </w:t>
@@ -18060,17 +18051,17 @@
         <w:t xml:space="preserve"> </w:t>
       </w:r>
       <w:r>
-        <w:t xml:space="preserve">Rode with Silas Thorne’s regiment in the war and has never trusted him since.</w:t>
+        <w:t xml:space="preserve">Trades notes with Dr. Whitlock, who still won’t admit some of her remedies work better than his.</w:t>
       </w:r>
     </w:p>
     <w:bookmarkEnd w:id="87"/>
-    <w:bookmarkStart w:id="88" w:name="cora-ridgeway"/>
+    <w:bookmarkStart w:id="88" w:name="dr.-thaddeus-whitlock"/>
     <w:p>
       <w:pPr>
         <w:pStyle w:val="Heading2"/>
       </w:pPr>
       <w:r>
-        <w:t xml:space="preserve">Cora Ridgeway</w:t>
+        <w:t xml:space="preserve">Dr. Thaddeus Whitlock</w:t>
       </w:r>
     </w:p>
     <w:p>
@@ -18082,13 +18073,13 @@
           <w:iCs/>
           <w:i/>
         </w:rPr>
-        <w:t xml:space="preserve">Scout and sharpshooter, Scout. Coyotl (Tier 1).</w:t>
-      </w:r>
-      <w:r>
-        <w:t xml:space="preserve"> </w:t>
-      </w:r>
-      <w:r>
-        <w:t xml:space="preserve">Knows the plains and the high country, and keeps her clan’s ways close.</w:t>
+        <w:t xml:space="preserve">Town physician, Doctor. Human (Tier 0).</w:t>
+      </w:r>
+      <w:r>
+        <w:t xml:space="preserve"> </w:t>
+      </w:r>
+      <w:r>
+        <w:t xml:space="preserve">Army surgeon in the war; now he digs bullets out of his friends and asks too many questions about what made the other wounds.</w:t>
       </w:r>
     </w:p>
     <w:p>
@@ -18110,7 +18101,7 @@
         <w:t xml:space="preserve"> </w:t>
       </w:r>
       <w:r>
-        <w:t xml:space="preserve">Body 11, Agility 14, Intellect 10, Presence 11, Will 9.</w:t>
+        <w:t xml:space="preserve">Body 10, Agility 10, Intellect 13, Presence 12, Will 11.</w:t>
       </w:r>
       <w:r>
         <w:t xml:space="preserve"> </w:t>
@@ -18126,23 +18117,7 @@
         <w:t xml:space="preserve"> </w:t>
       </w:r>
       <w:r>
-        <w:t xml:space="preserve">13.</w:t>
-      </w:r>
-      <w:r>
-        <w:t xml:space="preserve"> </w:t>
-      </w:r>
-      <w:r>
-        <w:rPr>
-          <w:bCs/>
-          <w:b/>
-        </w:rPr>
-        <w:t xml:space="preserve">In woge:</w:t>
-      </w:r>
-      <w:r>
-        <w:t xml:space="preserve"> </w:t>
-      </w:r>
-      <w:r>
-        <w:t xml:space="preserve">Body 12, Agility 15, Dodge 15; claws mark 2 boxes.</w:t>
+        <w:t xml:space="preserve">8.</w:t>
       </w:r>
     </w:p>
     <w:p>
@@ -18164,7 +18139,7 @@
         <w:t xml:space="preserve"> </w:t>
       </w:r>
       <w:r>
-        <w:t xml:space="preserve">Shooting 17 (Specialty). Trained: Riding 15, Stealth 15, Brawling 15, Melee 15, Persuasion 12, Athletics 12, Tracking 11, Survival 11, Read People 11, Gambling 11.</w:t>
+        <w:t xml:space="preserve">Medicine 16 (Specialty). Trained: Apothecary 14, Read People 14, Investigation 14, Wesen Lore 14, Occult 14, Persuasion 13, Leadership 13, Riding 11, Shooting 11.</w:t>
       </w:r>
     </w:p>
     <w:p>
@@ -18186,7 +18161,7 @@
         <w:t xml:space="preserve"> </w:t>
       </w:r>
       <w:r>
-        <w:t xml:space="preserve">Extra Trained skill; True grit.</w:t>
+        <w:t xml:space="preserve">+1 attribute point; second advantage: Battlefield Surgeon; a fine tool: his army surgeon’s instruments (+2 Medicine).</w:t>
       </w:r>
       <w:r>
         <w:t xml:space="preserve"> </w:t>
@@ -18202,7 +18177,7 @@
         <w:t xml:space="preserve"> </w:t>
       </w:r>
       <w:r>
-        <w:t xml:space="preserve">Plains Wanderer (companion: Restless).</w:t>
+        <w:t xml:space="preserve">Steady Hands.</w:t>
       </w:r>
       <w:r>
         <w:t xml:space="preserve"> </w:t>
@@ -18218,7 +18193,7 @@
         <w:t xml:space="preserve"> </w:t>
       </w:r>
       <w:r>
-        <w:t xml:space="preserve">Sworn Vengeance; trigger: word of the men who burned her clan’s camp.</w:t>
+        <w:t xml:space="preserve">Haunted by the War; trigger: gunfire in the dark.</w:t>
       </w:r>
     </w:p>
     <w:p>
@@ -18240,7 +18215,7 @@
         <w:t xml:space="preserve"> </w:t>
       </w:r>
       <w:r>
-        <w:t xml:space="preserve">Something that wore a human face killed someone I loved.</w:t>
+        <w:t xml:space="preserve">I saw what I saw, and no one else believes me.</w:t>
       </w:r>
       <w:r>
         <w:t xml:space="preserve"> </w:t>
@@ -18256,17 +18231,17 @@
         <w:t xml:space="preserve"> </w:t>
       </w:r>
       <w:r>
-        <w:t xml:space="preserve">Eliza Kessler taught her what she knows about the hidden world.</w:t>
+        <w:t xml:space="preserve">Rode with Silas Thorne’s regiment in the war and has never trusted him since.</w:t>
       </w:r>
     </w:p>
     <w:bookmarkEnd w:id="88"/>
-    <w:bookmarkStart w:id="89" w:name="silas-thorne"/>
+    <w:bookmarkStart w:id="89" w:name="cora-ridgeway"/>
     <w:p>
       <w:pPr>
         <w:pStyle w:val="Heading2"/>
       </w:pPr>
       <w:r>
-        <w:t xml:space="preserve">Silas Thorne</w:t>
+        <w:t xml:space="preserve">Cora Ridgeway</w:t>
       </w:r>
     </w:p>
     <w:p>
@@ -18278,13 +18253,13 @@
           <w:iCs/>
           <w:i/>
         </w:rPr>
-        <w:t xml:space="preserve">Professional gambler, Gambler. Ziegevolk (Tier 1); Old hand.</w:t>
-      </w:r>
-      <w:r>
-        <w:t xml:space="preserve"> </w:t>
-      </w:r>
-      <w:r>
-        <w:t xml:space="preserve">Charming, well-dressed, and in debt to the wrong people.</w:t>
+        <w:t xml:space="preserve">Scout and sharpshooter, Scout. Coyotl (Tier 1).</w:t>
+      </w:r>
+      <w:r>
+        <w:t xml:space="preserve"> </w:t>
+      </w:r>
+      <w:r>
+        <w:t xml:space="preserve">Knows the plains and the high country, and keeps her clan’s ways close.</w:t>
       </w:r>
     </w:p>
     <w:p>
@@ -18306,7 +18281,7 @@
         <w:t xml:space="preserve"> </w:t>
       </w:r>
       <w:r>
-        <w:t xml:space="preserve">Body 10, Agility 10, Intellect 13, Presence 13, Will 9.</w:t>
+        <w:t xml:space="preserve">Body 11, Agility 14, Intellect 10, Presence 11, Will 9.</w:t>
       </w:r>
       <w:r>
         <w:t xml:space="preserve"> </w:t>
@@ -18322,7 +18297,23 @@
         <w:t xml:space="preserve"> </w:t>
       </w:r>
       <w:r>
-        <w:t xml:space="preserve">8.</w:t>
+        <w:t xml:space="preserve">13.</w:t>
+      </w:r>
+      <w:r>
+        <w:t xml:space="preserve"> </w:t>
+      </w:r>
+      <w:r>
+        <w:rPr>
+          <w:bCs/>
+          <w:b/>
+        </w:rPr>
+        <w:t xml:space="preserve">In woge:</w:t>
+      </w:r>
+      <w:r>
+        <w:t xml:space="preserve"> </w:t>
+      </w:r>
+      <w:r>
+        <w:t xml:space="preserve">Body 12, Agility 15, Dodge 15; claws mark 2 boxes.</w:t>
       </w:r>
     </w:p>
     <w:p>
@@ -18344,7 +18335,7 @@
         <w:t xml:space="preserve"> </w:t>
       </w:r>
       <w:r>
-        <w:t xml:space="preserve">Gambling 18 (Expert). Trained: Deception 14, Persuasion 14, Read People 14, Investigation 14, Shooting 11, Stealth 11, Riding 11.</w:t>
+        <w:t xml:space="preserve">Shooting 17 (Specialty). Trained: Riding 15, Stealth 15, Brawling 15, Melee 15, Persuasion 12, Athletics 12, Tracking 11, Survival 11, Read People 11, Gambling 11.</w:t>
       </w:r>
     </w:p>
     <w:p>
@@ -18366,7 +18357,7 @@
         <w:t xml:space="preserve"> </w:t>
       </w:r>
       <w:r>
-        <w:t xml:space="preserve">Second advantage: Poker Face; a friend in town: Mae Lin, a faro dealer who hears everything said at her table.</w:t>
+        <w:t xml:space="preserve">Extra Trained skill; True grit.</w:t>
       </w:r>
       <w:r>
         <w:t xml:space="preserve"> </w:t>
@@ -18382,7 +18373,7 @@
         <w:t xml:space="preserve"> </w:t>
       </w:r>
       <w:r>
-        <w:t xml:space="preserve">Ziegevolk Pheromones (companion: Pheromone Suspicion).</w:t>
+        <w:t xml:space="preserve">Plains Wanderer (companion: Restless).</w:t>
       </w:r>
       <w:r>
         <w:t xml:space="preserve"> </w:t>
@@ -18398,7 +18389,7 @@
         <w:t xml:space="preserve"> </w:t>
       </w:r>
       <w:r>
-        <w:t xml:space="preserve">Owes the Wrong People; trigger: a debt collector arrives.</w:t>
+        <w:t xml:space="preserve">Sworn Vengeance; trigger: word of the men who burned her clan’s camp.</w:t>
       </w:r>
     </w:p>
     <w:p>
@@ -18420,7 +18411,7 @@
         <w:t xml:space="preserve"> </w:t>
       </w:r>
       <w:r>
-        <w:t xml:space="preserve">The pay’s good, and nobody else will take these jobs.</w:t>
+        <w:t xml:space="preserve">Something that wore a human face killed someone I loved.</w:t>
       </w:r>
       <w:r>
         <w:t xml:space="preserve"> </w:t>
@@ -18436,35 +18427,17 @@
         <w:t xml:space="preserve"> </w:t>
       </w:r>
       <w:r>
-        <w:t xml:space="preserve">Plays cards with Cora every Saturday; she’s the only one who can tell when he’s bluffing.</w:t>
+        <w:t xml:space="preserve">Eliza Kessler taught her what she knows about the hidden world.</w:t>
       </w:r>
     </w:p>
     <w:bookmarkEnd w:id="89"/>
-    <w:bookmarkStart w:id="90" w:name="magdalena-lena-baer"/>
+    <w:bookmarkStart w:id="90" w:name="silas-thorne"/>
     <w:p>
       <w:pPr>
         <w:pStyle w:val="Heading2"/>
       </w:pPr>
       <w:r>
-        <w:t xml:space="preserve">Magdalena</w:t>
-      </w:r>
-      <w:r>
-        <w:t xml:space="preserve"> </w:t>
-      </w:r>
-      <w:r>
-        <w:t xml:space="preserve">“</w:t>
-      </w:r>
-      <w:r>
-        <w:t xml:space="preserve">Lena</w:t>
-      </w:r>
-      <w:r>
-        <w:t xml:space="preserve">”</w:t>
-      </w:r>
-      <w:r>
-        <w:t xml:space="preserve"> </w:t>
-      </w:r>
-      <w:r>
-        <w:t xml:space="preserve">Baer</w:t>
+        <w:t xml:space="preserve">Silas Thorne</w:t>
       </w:r>
     </w:p>
     <w:p>
@@ -18476,26 +18449,13 @@
           <w:iCs/>
           <w:i/>
         </w:rPr>
-        <w:t xml:space="preserve">Braucher, Occultist. Incantare (Tier 2).</w:t>
-      </w:r>
-      <w:r>
-        <w:t xml:space="preserve"> </w:t>
-      </w:r>
-      <w:r>
-        <w:t xml:space="preserve">Came west from Lancaster County with a wagon, a Bible and her grandmother’s</w:t>
-      </w:r>
-      <w:r>
-        <w:t xml:space="preserve"> </w:t>
-      </w:r>
-      <w:r>
-        <w:rPr>
-          <w:iCs/>
-          <w:i/>
-        </w:rPr>
-        <w:t xml:space="preserve">Long Lost Friend</w:t>
-      </w:r>
-      <w:r>
-        <w:t xml:space="preserve">. Heals for gifts, and breaks hexes for no one’s money.</w:t>
+        <w:t xml:space="preserve">Professional gambler, Gambler. Ziegevolk (Tier 1); Old hand.</w:t>
+      </w:r>
+      <w:r>
+        <w:t xml:space="preserve"> </w:t>
+      </w:r>
+      <w:r>
+        <w:t xml:space="preserve">Charming, well-dressed, and in debt to the wrong people.</w:t>
       </w:r>
     </w:p>
     <w:p>
@@ -18517,7 +18477,7 @@
         <w:t xml:space="preserve"> </w:t>
       </w:r>
       <w:r>
-        <w:t xml:space="preserve">Body 9, Agility 10, Intellect 13, Presence 11, Will 12.</w:t>
+        <w:t xml:space="preserve">Body 10, Agility 10, Intellect 13, Presence 13, Will 9.</w:t>
       </w:r>
       <w:r>
         <w:t xml:space="preserve"> </w:t>
@@ -18555,7 +18515,7 @@
         <w:t xml:space="preserve"> </w:t>
       </w:r>
       <w:r>
-        <w:t xml:space="preserve">Occult 16 (Specialty). Trained: Wesen Lore 14, Apothecary 14, Read People 14, Medicine 14, Investigation 14, Survival 14, Persuasion 12, Riding 11, Shooting 11.</w:t>
+        <w:t xml:space="preserve">Gambling 18 (Expert). Trained: Deception 14, Persuasion 14, Read People 14, Investigation 14, Shooting 11, Stealth 11, Riding 11.</w:t>
       </w:r>
     </w:p>
     <w:p>
@@ -18571,29 +18531,29 @@
           <w:bCs/>
           <w:b/>
         </w:rPr>
-        <w:t xml:space="preserve">Edge:</w:t>
-      </w:r>
-      <w:r>
-        <w:t xml:space="preserve"> </w:t>
-      </w:r>
-      <w:r>
-        <w:t xml:space="preserve">A friend in town: Pastor Jakob Unruh of the Volga German colony east of town, who brings her the cases his people won’t take to a doctor.</w:t>
-      </w:r>
-      <w:r>
-        <w:t xml:space="preserve"> </w:t>
-      </w:r>
-      <w:r>
-        <w:rPr>
-          <w:bCs/>
-          <w:b/>
-        </w:rPr>
-        <w:t xml:space="preserve">Lens:</w:t>
-      </w:r>
-      <w:r>
-        <w:t xml:space="preserve"> </w:t>
-      </w:r>
-      <w:r>
-        <w:t xml:space="preserve">Braucher (companion: No Payment).</w:t>
+        <w:t xml:space="preserve">Edges:</w:t>
+      </w:r>
+      <w:r>
+        <w:t xml:space="preserve"> </w:t>
+      </w:r>
+      <w:r>
+        <w:t xml:space="preserve">Second advantage: Poker Face; a friend in town: Mae Lin, a faro dealer who hears everything said at her table.</w:t>
+      </w:r>
+      <w:r>
+        <w:t xml:space="preserve"> </w:t>
+      </w:r>
+      <w:r>
+        <w:rPr>
+          <w:bCs/>
+          <w:b/>
+        </w:rPr>
+        <w:t xml:space="preserve">Advantage:</w:t>
+      </w:r>
+      <w:r>
+        <w:t xml:space="preserve"> </w:t>
+      </w:r>
+      <w:r>
+        <w:t xml:space="preserve">Ziegevolk Pheromones (companion: Pheromone Suspicion).</w:t>
       </w:r>
       <w:r>
         <w:t xml:space="preserve"> </w:t>
@@ -18609,7 +18569,7 @@
         <w:t xml:space="preserve"> </w:t>
       </w:r>
       <w:r>
-        <w:t xml:space="preserve">Reluctant to Kill; trigger: an enemy lies wounded and helpless in front of her.</w:t>
+        <w:t xml:space="preserve">Owes the Wrong People; trigger: a debt collector arrives.</w:t>
       </w:r>
     </w:p>
     <w:p>
@@ -18625,20 +18585,95 @@
           <w:bCs/>
           <w:b/>
         </w:rPr>
-        <w:t xml:space="preserve">Magic:</w:t>
-      </w:r>
-      <w:r>
-        <w:t xml:space="preserve"> </w:t>
-      </w:r>
-      <w:r>
-        <w:t xml:space="preserve">works rituals with Occult at ten minutes a roll, +2 to heal, protect or break a hex; carries 3 ready charms (Occult as her Specialty). Carries a Himmelsbrief, and writes them for others.</w:t>
+        <w:t xml:space="preserve">Why I stand against the dark:</w:t>
+      </w:r>
+      <w:r>
+        <w:t xml:space="preserve"> </w:t>
+      </w:r>
+      <w:r>
+        <w:t xml:space="preserve">The pay’s good, and nobody else will take these jobs.</w:t>
+      </w:r>
+      <w:r>
+        <w:t xml:space="preserve"> </w:t>
+      </w:r>
+      <w:r>
+        <w:rPr>
+          <w:bCs/>
+          <w:b/>
+        </w:rPr>
+        <w:t xml:space="preserve">Connection:</w:t>
+      </w:r>
+      <w:r>
+        <w:t xml:space="preserve"> </w:t>
+      </w:r>
+      <w:r>
+        <w:t xml:space="preserve">Plays cards with Cora every Saturday; she’s the only one who can tell when he’s bluffing.</w:t>
+      </w:r>
+    </w:p>
+    <w:bookmarkEnd w:id="90"/>
+    <w:bookmarkStart w:id="91" w:name="magdalena-lena-baer"/>
+    <w:p>
+      <w:pPr>
+        <w:pStyle w:val="Heading2"/>
+      </w:pPr>
+      <w:r>
+        <w:t xml:space="preserve">Magdalena</w:t>
+      </w:r>
+      <w:r>
+        <w:t xml:space="preserve"> </w:t>
+      </w:r>
+      <w:r>
+        <w:t xml:space="preserve">“</w:t>
+      </w:r>
+      <w:r>
+        <w:t xml:space="preserve">Lena</w:t>
+      </w:r>
+      <w:r>
+        <w:t xml:space="preserve">”</w:t>
+      </w:r>
+      <w:r>
+        <w:t xml:space="preserve"> </w:t>
+      </w:r>
+      <w:r>
+        <w:t xml:space="preserve">Baer</w:t>
+      </w:r>
+    </w:p>
+    <w:p>
+      <w:pPr>
+        <w:pStyle w:val="FirstParagraph"/>
+      </w:pPr>
+      <w:r>
+        <w:rPr>
+          <w:iCs/>
+          <w:i/>
+        </w:rPr>
+        <w:t xml:space="preserve">Braucher, Occultist. Incantare (Tier 2).</w:t>
+      </w:r>
+      <w:r>
+        <w:t xml:space="preserve"> </w:t>
+      </w:r>
+      <w:r>
+        <w:t xml:space="preserve">Came west from Lancaster County with a wagon, a Bible and her grandmother’s</w:t>
+      </w:r>
+      <w:r>
+        <w:t xml:space="preserve"> </w:t>
+      </w:r>
+      <w:r>
+        <w:rPr>
+          <w:iCs/>
+          <w:i/>
+        </w:rPr>
+        <w:t xml:space="preserve">Long Lost Friend</w:t>
+      </w:r>
+      <w:r>
+        <w:t xml:space="preserve">. Heals for gifts, and breaks hexes for no one’s money.</w:t>
       </w:r>
     </w:p>
     <w:p>
       <w:pPr>
         <w:numPr>
           <w:ilvl w:val="0"/>
-          <w:numId w:val="1027"/>
+          <w:numId w:val="1028"/>
         </w:numPr>
         <w:pStyle w:val="Compact"/>
       </w:pPr>
@@ -18647,6 +18682,142 @@
           <w:bCs/>
           <w:b/>
         </w:rPr>
+        <w:t xml:space="preserve">Attributes:</w:t>
+      </w:r>
+      <w:r>
+        <w:t xml:space="preserve"> </w:t>
+      </w:r>
+      <w:r>
+        <w:t xml:space="preserve">Body 9, Agility 10, Intellect 13, Presence 11, Will 12.</w:t>
+      </w:r>
+      <w:r>
+        <w:t xml:space="preserve"> </w:t>
+      </w:r>
+      <w:r>
+        <w:rPr>
+          <w:bCs/>
+          <w:b/>
+        </w:rPr>
+        <w:t xml:space="preserve">Dodge</w:t>
+      </w:r>
+      <w:r>
+        <w:t xml:space="preserve"> </w:t>
+      </w:r>
+      <w:r>
+        <w:t xml:space="preserve">8.</w:t>
+      </w:r>
+    </w:p>
+    <w:p>
+      <w:pPr>
+        <w:numPr>
+          <w:ilvl w:val="0"/>
+          <w:numId w:val="1028"/>
+        </w:numPr>
+        <w:pStyle w:val="Compact"/>
+      </w:pPr>
+      <w:r>
+        <w:rPr>
+          <w:bCs/>
+          <w:b/>
+        </w:rPr>
+        <w:t xml:space="preserve">Skills:</w:t>
+      </w:r>
+      <w:r>
+        <w:t xml:space="preserve"> </w:t>
+      </w:r>
+      <w:r>
+        <w:t xml:space="preserve">Occult 16 (Specialty). Trained: Wesen Lore 14, Apothecary 14, Read People 14, Medicine 14, Investigation 14, Survival 14, Persuasion 12, Riding 11, Shooting 11.</w:t>
+      </w:r>
+    </w:p>
+    <w:p>
+      <w:pPr>
+        <w:numPr>
+          <w:ilvl w:val="0"/>
+          <w:numId w:val="1028"/>
+        </w:numPr>
+        <w:pStyle w:val="Compact"/>
+      </w:pPr>
+      <w:r>
+        <w:rPr>
+          <w:bCs/>
+          <w:b/>
+        </w:rPr>
+        <w:t xml:space="preserve">Edge:</w:t>
+      </w:r>
+      <w:r>
+        <w:t xml:space="preserve"> </w:t>
+      </w:r>
+      <w:r>
+        <w:t xml:space="preserve">A friend in town: Pastor Jakob Unruh of the Volga German colony east of town, who brings her the cases his people won’t take to a doctor.</w:t>
+      </w:r>
+      <w:r>
+        <w:t xml:space="preserve"> </w:t>
+      </w:r>
+      <w:r>
+        <w:rPr>
+          <w:bCs/>
+          <w:b/>
+        </w:rPr>
+        <w:t xml:space="preserve">Lens:</w:t>
+      </w:r>
+      <w:r>
+        <w:t xml:space="preserve"> </w:t>
+      </w:r>
+      <w:r>
+        <w:t xml:space="preserve">Braucher (companion: No Payment).</w:t>
+      </w:r>
+      <w:r>
+        <w:t xml:space="preserve"> </w:t>
+      </w:r>
+      <w:r>
+        <w:rPr>
+          <w:bCs/>
+          <w:b/>
+        </w:rPr>
+        <w:t xml:space="preserve">Complication:</w:t>
+      </w:r>
+      <w:r>
+        <w:t xml:space="preserve"> </w:t>
+      </w:r>
+      <w:r>
+        <w:t xml:space="preserve">Reluctant to Kill; trigger: an enemy lies wounded and helpless in front of her.</w:t>
+      </w:r>
+    </w:p>
+    <w:p>
+      <w:pPr>
+        <w:numPr>
+          <w:ilvl w:val="0"/>
+          <w:numId w:val="1028"/>
+        </w:numPr>
+        <w:pStyle w:val="Compact"/>
+      </w:pPr>
+      <w:r>
+        <w:rPr>
+          <w:bCs/>
+          <w:b/>
+        </w:rPr>
+        <w:t xml:space="preserve">Magic:</w:t>
+      </w:r>
+      <w:r>
+        <w:t xml:space="preserve"> </w:t>
+      </w:r>
+      <w:r>
+        <w:t xml:space="preserve">works rituals with Occult at ten minutes a roll, +2 to heal, protect or break a hex; carries 3 ready charms (Occult as her Specialty). Carries a Himmelsbrief, and writes them for others.</w:t>
+      </w:r>
+    </w:p>
+    <w:p>
+      <w:pPr>
+        <w:numPr>
+          <w:ilvl w:val="0"/>
+          <w:numId w:val="1028"/>
+        </w:numPr>
+        <w:pStyle w:val="Compact"/>
+      </w:pPr>
+      <w:r>
+        <w:rPr>
+          <w:bCs/>
+          <w:b/>
+        </w:rPr>
         <w:t xml:space="preserve">Why I stand against the dark:</w:t>
       </w:r>
       <w:r>
@@ -18672,9 +18843,9 @@
         <w:t xml:space="preserve">Dr. Whitlock calls her a superstitious old woman, and sends his hopeless cases to her door after dark.</w:t>
       </w:r>
     </w:p>
-    <w:bookmarkEnd w:id="90"/>
     <w:bookmarkEnd w:id="91"/>
-    <w:bookmarkStart w:id="92" w:name="threats"/>
+    <w:bookmarkEnd w:id="92"/>
+    <w:bookmarkStart w:id="93" w:name="threats"/>
     <w:p>
       <w:pPr>
         <w:pStyle w:val="Heading1"/>
@@ -19945,8 +20116,8 @@
         <w:t xml:space="preserve">For a tougher version, add +1 to its targets and one box; for a weaker one, subtract.</w:t>
       </w:r>
     </w:p>
-    <w:bookmarkEnd w:id="92"/>
-    <w:bookmarkStart w:id="93" w:name="advantages"/>
+    <w:bookmarkEnd w:id="93"/>
+    <w:bookmarkStart w:id="94" w:name="advantages"/>
     <w:p>
       <w:pPr>
         <w:pStyle w:val="Heading1"/>
@@ -20702,8 +20873,8 @@
         <w:t xml:space="preserve">A badge is legal authority, not a magic word: Wesen, outlaws and the powers of the hidden world don’t care about it, and it carries a duty. Your superiors can give you orders, and abusing the badge or failing in your duty can cost you it. Law callings (Marshal, Deputy) usually take one, as their advantage or as a second advantage Edge. A Pinkerton detective takes Pinkerton Credentials instead: the agency’s reach and files, but no badge.</w:t>
       </w:r>
     </w:p>
-    <w:bookmarkEnd w:id="93"/>
-    <w:bookmarkStart w:id="115" w:name="heritages"/>
+    <w:bookmarkEnd w:id="94"/>
+    <w:bookmarkStart w:id="116" w:name="heritages"/>
     <w:p>
       <w:pPr>
         <w:pStyle w:val="Heading1"/>
@@ -22108,7 +22279,7 @@
         </w:tc>
       </w:tr>
     </w:tbl>
-    <w:bookmarkStart w:id="94" w:name="core-wesen-rules"/>
+    <w:bookmarkStart w:id="95" w:name="core-wesen-rules"/>
     <w:p>
       <w:pPr>
         <w:pStyle w:val="Heading2"/>
@@ -22420,8 +22591,8 @@
         <w:t xml:space="preserve">means each hit that marks 2 or more boxes marks one fewer, never below 1.</w:t>
       </w:r>
     </w:p>
-    <w:bookmarkEnd w:id="94"/>
-    <w:bookmarkStart w:id="95" w:name="human"/>
+    <w:bookmarkEnd w:id="95"/>
+    <w:bookmarkStart w:id="96" w:name="human"/>
     <w:p>
       <w:pPr>
         <w:pStyle w:val="Heading2"/>
@@ -22654,8 +22825,8 @@
         </w:tc>
       </w:tr>
     </w:tbl>
-    <w:bookmarkEnd w:id="95"/>
-    <w:bookmarkStart w:id="96" w:name="bauerschwein"/>
+    <w:bookmarkEnd w:id="96"/>
+    <w:bookmarkStart w:id="97" w:name="bauerschwein"/>
     <w:p>
       <w:pPr>
         <w:pStyle w:val="Heading2"/>
@@ -22700,7 +22871,7 @@
       <w:pPr>
         <w:numPr>
           <w:ilvl w:val="0"/>
-          <w:numId w:val="1028"/>
+          <w:numId w:val="1029"/>
         </w:numPr>
         <w:pStyle w:val="Compact"/>
       </w:pPr>
@@ -22948,8 +23119,8 @@
         </w:tc>
       </w:tr>
     </w:tbl>
-    <w:bookmarkEnd w:id="96"/>
-    <w:bookmarkStart w:id="97" w:name="coyotl"/>
+    <w:bookmarkEnd w:id="97"/>
+    <w:bookmarkStart w:id="98" w:name="coyotl"/>
     <w:p>
       <w:pPr>
         <w:pStyle w:val="Heading2"/>
@@ -23218,8 +23389,8 @@
         </w:tc>
       </w:tr>
     </w:tbl>
-    <w:bookmarkEnd w:id="97"/>
-    <w:bookmarkStart w:id="98" w:name="eisbiber"/>
+    <w:bookmarkEnd w:id="98"/>
+    <w:bookmarkStart w:id="99" w:name="eisbiber"/>
     <w:p>
       <w:pPr>
         <w:pStyle w:val="Heading2"/>
@@ -23488,8 +23659,8 @@
         </w:tc>
       </w:tr>
     </w:tbl>
-    <w:bookmarkEnd w:id="98"/>
-    <w:bookmarkStart w:id="99" w:name="fuchsbau"/>
+    <w:bookmarkEnd w:id="99"/>
+    <w:bookmarkStart w:id="100" w:name="fuchsbau"/>
     <w:p>
       <w:pPr>
         <w:pStyle w:val="Heading2"/>
@@ -23820,8 +23991,8 @@
         </w:tc>
       </w:tr>
     </w:tbl>
-    <w:bookmarkEnd w:id="99"/>
-    <w:bookmarkStart w:id="100" w:name="mauzhertz"/>
+    <w:bookmarkEnd w:id="100"/>
+    <w:bookmarkStart w:id="101" w:name="mauzhertz"/>
     <w:p>
       <w:pPr>
         <w:pStyle w:val="Heading2"/>
@@ -24090,8 +24261,8 @@
         </w:tc>
       </w:tr>
     </w:tbl>
-    <w:bookmarkEnd w:id="100"/>
-    <w:bookmarkStart w:id="101" w:name="steinadler"/>
+    <w:bookmarkEnd w:id="101"/>
+    <w:bookmarkStart w:id="102" w:name="steinadler"/>
     <w:p>
       <w:pPr>
         <w:pStyle w:val="Heading2"/>
@@ -24360,8 +24531,8 @@
         </w:tc>
       </w:tr>
     </w:tbl>
-    <w:bookmarkEnd w:id="101"/>
-    <w:bookmarkStart w:id="102" w:name="taniwha"/>
+    <w:bookmarkEnd w:id="102"/>
+    <w:bookmarkStart w:id="103" w:name="taniwha"/>
     <w:p>
       <w:pPr>
         <w:pStyle w:val="Heading2"/>
@@ -24406,7 +24577,7 @@
       <w:pPr>
         <w:numPr>
           <w:ilvl w:val="0"/>
-          <w:numId w:val="1029"/>
+          <w:numId w:val="1030"/>
         </w:numPr>
         <w:pStyle w:val="Compact"/>
       </w:pPr>
@@ -24418,7 +24589,7 @@
       <w:pPr>
         <w:numPr>
           <w:ilvl w:val="0"/>
-          <w:numId w:val="1029"/>
+          <w:numId w:val="1030"/>
         </w:numPr>
         <w:pStyle w:val="Compact"/>
       </w:pPr>
@@ -24682,8 +24853,8 @@
         </w:tc>
       </w:tr>
     </w:tbl>
-    <w:bookmarkEnd w:id="102"/>
-    <w:bookmarkStart w:id="103" w:name="ziegevolk"/>
+    <w:bookmarkEnd w:id="103"/>
+    <w:bookmarkStart w:id="104" w:name="ziegevolk"/>
     <w:p>
       <w:pPr>
         <w:pStyle w:val="Heading2"/>
@@ -24952,8 +25123,8 @@
         </w:tc>
       </w:tr>
     </w:tbl>
-    <w:bookmarkEnd w:id="103"/>
-    <w:bookmarkStart w:id="104" w:name="blutbad"/>
+    <w:bookmarkEnd w:id="104"/>
+    <w:bookmarkStart w:id="105" w:name="blutbad"/>
     <w:p>
       <w:pPr>
         <w:pStyle w:val="Heading2"/>
@@ -24998,7 +25169,7 @@
       <w:pPr>
         <w:numPr>
           <w:ilvl w:val="0"/>
-          <w:numId w:val="1030"/>
+          <w:numId w:val="1031"/>
         </w:numPr>
         <w:pStyle w:val="Compact"/>
       </w:pPr>
@@ -25308,8 +25479,8 @@
         </w:tc>
       </w:tr>
     </w:tbl>
-    <w:bookmarkEnd w:id="104"/>
-    <w:bookmarkStart w:id="105" w:name="grimm"/>
+    <w:bookmarkEnd w:id="105"/>
+    <w:bookmarkStart w:id="106" w:name="grimm"/>
     <w:p>
       <w:pPr>
         <w:pStyle w:val="Heading2"/>
@@ -25354,7 +25525,7 @@
       <w:pPr>
         <w:numPr>
           <w:ilvl w:val="0"/>
-          <w:numId w:val="1031"/>
+          <w:numId w:val="1032"/>
         </w:numPr>
         <w:pStyle w:val="Compact"/>
       </w:pPr>
@@ -25366,7 +25537,7 @@
       <w:pPr>
         <w:numPr>
           <w:ilvl w:val="0"/>
-          <w:numId w:val="1031"/>
+          <w:numId w:val="1032"/>
         </w:numPr>
         <w:pStyle w:val="Compact"/>
       </w:pPr>
@@ -25378,7 +25549,7 @@
       <w:pPr>
         <w:numPr>
           <w:ilvl w:val="0"/>
-          <w:numId w:val="1031"/>
+          <w:numId w:val="1032"/>
         </w:numPr>
         <w:pStyle w:val="Compact"/>
       </w:pPr>
@@ -25390,7 +25561,7 @@
       <w:pPr>
         <w:numPr>
           <w:ilvl w:val="0"/>
-          <w:numId w:val="1031"/>
+          <w:numId w:val="1032"/>
         </w:numPr>
         <w:pStyle w:val="Compact"/>
       </w:pPr>
@@ -25402,7 +25573,7 @@
       <w:pPr>
         <w:numPr>
           <w:ilvl w:val="0"/>
-          <w:numId w:val="1031"/>
+          <w:numId w:val="1032"/>
         </w:numPr>
         <w:pStyle w:val="Compact"/>
       </w:pPr>
@@ -25414,7 +25585,7 @@
       <w:pPr>
         <w:numPr>
           <w:ilvl w:val="0"/>
-          <w:numId w:val="1031"/>
+          <w:numId w:val="1032"/>
         </w:numPr>
         <w:pStyle w:val="Compact"/>
       </w:pPr>
@@ -25426,7 +25597,7 @@
       <w:pPr>
         <w:numPr>
           <w:ilvl w:val="0"/>
-          <w:numId w:val="1031"/>
+          <w:numId w:val="1032"/>
         </w:numPr>
         <w:pStyle w:val="Compact"/>
       </w:pPr>
@@ -26214,8 +26385,8 @@
         </w:tc>
       </w:tr>
     </w:tbl>
-    <w:bookmarkEnd w:id="105"/>
-    <w:bookmarkStart w:id="106" w:name="incantare"/>
+    <w:bookmarkEnd w:id="106"/>
+    <w:bookmarkStart w:id="107" w:name="incantare"/>
     <w:p>
       <w:pPr>
         <w:pStyle w:val="Heading2"/>
@@ -26260,7 +26431,7 @@
       <w:pPr>
         <w:numPr>
           <w:ilvl w:val="0"/>
-          <w:numId w:val="1032"/>
+          <w:numId w:val="1033"/>
         </w:numPr>
         <w:pStyle w:val="Compact"/>
       </w:pPr>
@@ -26272,7 +26443,7 @@
       <w:pPr>
         <w:numPr>
           <w:ilvl w:val="0"/>
-          <w:numId w:val="1032"/>
+          <w:numId w:val="1033"/>
         </w:numPr>
         <w:pStyle w:val="Compact"/>
       </w:pPr>
@@ -26284,7 +26455,7 @@
       <w:pPr>
         <w:numPr>
           <w:ilvl w:val="0"/>
-          <w:numId w:val="1032"/>
+          <w:numId w:val="1033"/>
         </w:numPr>
         <w:pStyle w:val="Compact"/>
       </w:pPr>
@@ -26886,8 +27057,8 @@
         </w:tc>
       </w:tr>
     </w:tbl>
-    <w:bookmarkEnd w:id="106"/>
-    <w:bookmarkStart w:id="107" w:name="jägerbär"/>
+    <w:bookmarkEnd w:id="107"/>
+    <w:bookmarkStart w:id="108" w:name="jägerbär"/>
     <w:p>
       <w:pPr>
         <w:pStyle w:val="Heading2"/>
@@ -27156,8 +27327,8 @@
         </w:tc>
       </w:tr>
     </w:tbl>
-    <w:bookmarkEnd w:id="107"/>
-    <w:bookmarkStart w:id="108" w:name="mauvais-dentes"/>
+    <w:bookmarkEnd w:id="108"/>
+    <w:bookmarkStart w:id="109" w:name="mauvais-dentes"/>
     <w:p>
       <w:pPr>
         <w:pStyle w:val="Heading2"/>
@@ -27202,7 +27373,7 @@
       <w:pPr>
         <w:numPr>
           <w:ilvl w:val="0"/>
-          <w:numId w:val="1033"/>
+          <w:numId w:val="1034"/>
         </w:numPr>
         <w:pStyle w:val="Compact"/>
       </w:pPr>
@@ -27450,8 +27621,8 @@
         </w:tc>
       </w:tr>
     </w:tbl>
-    <w:bookmarkEnd w:id="108"/>
-    <w:bookmarkStart w:id="109" w:name="naschazer"/>
+    <w:bookmarkEnd w:id="109"/>
+    <w:bookmarkStart w:id="110" w:name="naschazer"/>
     <w:p>
       <w:pPr>
         <w:pStyle w:val="Heading2"/>
@@ -27496,7 +27667,7 @@
       <w:pPr>
         <w:numPr>
           <w:ilvl w:val="0"/>
-          <w:numId w:val="1034"/>
+          <w:numId w:val="1035"/>
         </w:numPr>
         <w:pStyle w:val="Compact"/>
       </w:pPr>
@@ -27744,8 +27915,8 @@
         </w:tc>
       </w:tr>
     </w:tbl>
-    <w:bookmarkEnd w:id="109"/>
-    <w:bookmarkStart w:id="110" w:name="skalengeck"/>
+    <w:bookmarkEnd w:id="110"/>
+    <w:bookmarkStart w:id="111" w:name="skalengeck"/>
     <w:p>
       <w:pPr>
         <w:pStyle w:val="Heading2"/>
@@ -28014,8 +28185,8 @@
         </w:tc>
       </w:tr>
     </w:tbl>
-    <w:bookmarkEnd w:id="110"/>
-    <w:bookmarkStart w:id="111" w:name="vallachi"/>
+    <w:bookmarkEnd w:id="111"/>
+    <w:bookmarkStart w:id="112" w:name="vallachi"/>
     <w:p>
       <w:pPr>
         <w:pStyle w:val="Heading2"/>
@@ -28060,7 +28231,7 @@
       <w:pPr>
         <w:numPr>
           <w:ilvl w:val="0"/>
-          <w:numId w:val="1035"/>
+          <w:numId w:val="1036"/>
         </w:numPr>
         <w:pStyle w:val="Compact"/>
       </w:pPr>
@@ -28072,7 +28243,7 @@
       <w:pPr>
         <w:numPr>
           <w:ilvl w:val="0"/>
-          <w:numId w:val="1035"/>
+          <w:numId w:val="1036"/>
         </w:numPr>
         <w:pStyle w:val="Compact"/>
       </w:pPr>
@@ -28084,7 +28255,7 @@
       <w:pPr>
         <w:numPr>
           <w:ilvl w:val="0"/>
-          <w:numId w:val="1035"/>
+          <w:numId w:val="1036"/>
         </w:numPr>
         <w:pStyle w:val="Compact"/>
       </w:pPr>
@@ -28096,7 +28267,7 @@
       <w:pPr>
         <w:numPr>
           <w:ilvl w:val="0"/>
-          <w:numId w:val="1035"/>
+          <w:numId w:val="1036"/>
         </w:numPr>
         <w:pStyle w:val="Compact"/>
       </w:pPr>
@@ -28344,8 +28515,8 @@
         </w:tc>
       </w:tr>
     </w:tbl>
-    <w:bookmarkEnd w:id="111"/>
-    <w:bookmarkStart w:id="112" w:name="fuchsteufelwild"/>
+    <w:bookmarkEnd w:id="112"/>
+    <w:bookmarkStart w:id="113" w:name="fuchsteufelwild"/>
     <w:p>
       <w:pPr>
         <w:pStyle w:val="Heading2"/>
@@ -28390,7 +28561,7 @@
       <w:pPr>
         <w:numPr>
           <w:ilvl w:val="0"/>
-          <w:numId w:val="1036"/>
+          <w:numId w:val="1037"/>
         </w:numPr>
         <w:pStyle w:val="Compact"/>
       </w:pPr>
@@ -28402,7 +28573,7 @@
       <w:pPr>
         <w:numPr>
           <w:ilvl w:val="0"/>
-          <w:numId w:val="1036"/>
+          <w:numId w:val="1037"/>
         </w:numPr>
         <w:pStyle w:val="Compact"/>
       </w:pPr>
@@ -28666,8 +28837,8 @@
         </w:tc>
       </w:tr>
     </w:tbl>
-    <w:bookmarkEnd w:id="112"/>
-    <w:bookmarkStart w:id="113" w:name="hexenbiest-or-zauberbiest"/>
+    <w:bookmarkEnd w:id="113"/>
+    <w:bookmarkStart w:id="114" w:name="hexenbiest-or-zauberbiest"/>
     <w:p>
       <w:pPr>
         <w:pStyle w:val="Heading2"/>
@@ -28712,7 +28883,7 @@
       <w:pPr>
         <w:numPr>
           <w:ilvl w:val="0"/>
-          <w:numId w:val="1037"/>
+          <w:numId w:val="1038"/>
         </w:numPr>
         <w:pStyle w:val="Compact"/>
       </w:pPr>
@@ -28724,7 +28895,7 @@
       <w:pPr>
         <w:numPr>
           <w:ilvl w:val="0"/>
-          <w:numId w:val="1037"/>
+          <w:numId w:val="1038"/>
         </w:numPr>
         <w:pStyle w:val="Compact"/>
       </w:pPr>
@@ -28736,7 +28907,7 @@
       <w:pPr>
         <w:numPr>
           <w:ilvl w:val="0"/>
-          <w:numId w:val="1037"/>
+          <w:numId w:val="1038"/>
         </w:numPr>
         <w:pStyle w:val="Compact"/>
       </w:pPr>
@@ -29062,8 +29233,8 @@
         </w:tc>
       </w:tr>
     </w:tbl>
-    <w:bookmarkEnd w:id="113"/>
-    <w:bookmarkStart w:id="114" w:name="murcielago"/>
+    <w:bookmarkEnd w:id="114"/>
+    <w:bookmarkStart w:id="115" w:name="murcielago"/>
     <w:p>
       <w:pPr>
         <w:pStyle w:val="Heading2"/>
@@ -29108,7 +29279,7 @@
       <w:pPr>
         <w:numPr>
           <w:ilvl w:val="0"/>
-          <w:numId w:val="1038"/>
+          <w:numId w:val="1039"/>
         </w:numPr>
         <w:pStyle w:val="Compact"/>
       </w:pPr>
@@ -29356,9 +29527,9 @@
         </w:tc>
       </w:tr>
     </w:tbl>
-    <w:bookmarkEnd w:id="114"/>
     <w:bookmarkEnd w:id="115"/>
-    <w:bookmarkStart w:id="126" w:name="making-your-own"/>
+    <w:bookmarkEnd w:id="116"/>
+    <w:bookmarkStart w:id="127" w:name="making-your-own"/>
     <w:p>
       <w:pPr>
         <w:pStyle w:val="Heading1"/>
@@ -29391,7 +29562,7 @@
         <w:t xml:space="preserve">option at the end of each list, and its checklist holds a custom choice to the same rules as everything else.</w:t>
       </w:r>
     </w:p>
-    <w:bookmarkStart w:id="116" w:name="a-custom-calling"/>
+    <w:bookmarkStart w:id="117" w:name="a-custom-calling"/>
     <w:p>
       <w:pPr>
         <w:pStyle w:val="Heading2"/>
@@ -29412,7 +29583,7 @@
       <w:pPr>
         <w:numPr>
           <w:ilvl w:val="0"/>
-          <w:numId w:val="1039"/>
+          <w:numId w:val="1040"/>
         </w:numPr>
         <w:pStyle w:val="Compact"/>
       </w:pPr>
@@ -29458,7 +29629,7 @@
       <w:pPr>
         <w:numPr>
           <w:ilvl w:val="0"/>
-          <w:numId w:val="1039"/>
+          <w:numId w:val="1040"/>
         </w:numPr>
         <w:pStyle w:val="Compact"/>
       </w:pPr>
@@ -29480,7 +29651,7 @@
       <w:pPr>
         <w:numPr>
           <w:ilvl w:val="0"/>
-          <w:numId w:val="1039"/>
+          <w:numId w:val="1040"/>
         </w:numPr>
         <w:pStyle w:val="Compact"/>
       </w:pPr>
@@ -29502,7 +29673,7 @@
       <w:pPr>
         <w:numPr>
           <w:ilvl w:val="0"/>
-          <w:numId w:val="1039"/>
+          <w:numId w:val="1040"/>
         </w:numPr>
         <w:pStyle w:val="Compact"/>
       </w:pPr>
@@ -29567,8 +29738,8 @@
         <w:t xml:space="preserve">.</w:t>
       </w:r>
     </w:p>
-    <w:bookmarkEnd w:id="116"/>
-    <w:bookmarkStart w:id="125" w:name="a-custom-heritage"/>
+    <w:bookmarkEnd w:id="117"/>
+    <w:bookmarkStart w:id="126" w:name="a-custom-heritage"/>
     <w:p>
       <w:pPr>
         <w:pStyle w:val="Heading2"/>
@@ -29585,7 +29756,7 @@
         <w:t xml:space="preserve">Build it with the GM, one step at a time.</w:t>
       </w:r>
     </w:p>
-    <w:bookmarkStart w:id="117" w:name="the-concept"/>
+    <w:bookmarkStart w:id="118" w:name="the-concept"/>
     <w:p>
       <w:pPr>
         <w:pStyle w:val="Heading3"/>
@@ -29602,8 +29773,8 @@
         <w:t xml:space="preserve">Two or three sentences: where they come from, what sets them apart, and how others see them. It should be something the heritages in this book don’t already cover.</w:t>
       </w:r>
     </w:p>
-    <w:bookmarkEnd w:id="117"/>
-    <w:bookmarkStart w:id="118" w:name="the-tier"/>
+    <w:bookmarkEnd w:id="118"/>
+    <w:bookmarkStart w:id="119" w:name="the-tier"/>
     <w:p>
       <w:pPr>
         <w:pStyle w:val="Heading3"/>
@@ -29900,8 +30071,8 @@
         <w:t xml:space="preserve">When in doubt, choose the higher tier.</w:t>
       </w:r>
     </w:p>
-    <w:bookmarkEnd w:id="118"/>
-    <w:bookmarkStart w:id="119" w:name="attribute-adjustments"/>
+    <w:bookmarkEnd w:id="119"/>
+    <w:bookmarkStart w:id="120" w:name="attribute-adjustments"/>
     <w:p>
       <w:pPr>
         <w:pStyle w:val="Heading3"/>
@@ -29947,8 +30118,8 @@
         <w:t xml:space="preserve">: a +2 needs a −2 or two −1s. The adjustments move the attribute’s base (+1 starts it at 11) and raise its starting maximum (13 plus the bonus). Most heritages change two to four attributes.</w:t>
       </w:r>
     </w:p>
-    <w:bookmarkEnd w:id="119"/>
-    <w:bookmarkStart w:id="120" w:name="core-rules-tier-1-and-up"/>
+    <w:bookmarkEnd w:id="120"/>
+    <w:bookmarkStart w:id="121" w:name="core-rules-tier-1-and-up"/>
     <w:p>
       <w:pPr>
         <w:pStyle w:val="Heading3"/>
@@ -29965,8 +30136,8 @@
         <w:t xml:space="preserve">One to three short rules that always apply: what they can do (see in the dark, resist cold, a free Trained skill) and what it costs (a weakness, a people’s distrust, a hazard they can’t abide). A strength with no drawback is worth more than it looks, so price it a tier higher.</w:t>
       </w:r>
     </w:p>
-    <w:bookmarkEnd w:id="120"/>
-    <w:bookmarkStart w:id="121" w:name="heritage-advantages"/>
+    <w:bookmarkEnd w:id="121"/>
+    <w:bookmarkStart w:id="122" w:name="heritage-advantages"/>
     <w:p>
       <w:pPr>
         <w:pStyle w:val="Heading3"/>
@@ -30021,8 +30192,8 @@
         <w:t xml:space="preserve">: a problem the trait causes, with a clear trigger and a real consequence, which earns a Grit point when it bites, like any complication. A character takes one advantage, general or heritage, so make them distinct choices.</w:t>
       </w:r>
     </w:p>
-    <w:bookmarkEnd w:id="121"/>
-    <w:bookmarkStart w:id="122" w:name="a-woge-optional-tier-2-or-3"/>
+    <w:bookmarkEnd w:id="122"/>
+    <w:bookmarkStart w:id="123" w:name="a-woge-optional-tier-2-or-3"/>
     <w:p>
       <w:pPr>
         <w:pStyle w:val="Heading3"/>
@@ -30055,8 +30226,8 @@
         <w:t xml:space="preserve">apply.</w:t>
       </w:r>
     </w:p>
-    <w:bookmarkEnd w:id="122"/>
-    <w:bookmarkStart w:id="123" w:name="in-the-creator"/>
+    <w:bookmarkEnd w:id="123"/>
+    <w:bookmarkStart w:id="124" w:name="in-the-creator"/>
     <w:p>
       <w:pPr>
         <w:pStyle w:val="Heading3"/>
@@ -30069,7 +30240,7 @@
       <w:pPr>
         <w:numPr>
           <w:ilvl w:val="0"/>
-          <w:numId w:val="1040"/>
+          <w:numId w:val="1041"/>
         </w:numPr>
         <w:pStyle w:val="Compact"/>
       </w:pPr>
@@ -30097,7 +30268,7 @@
       <w:pPr>
         <w:numPr>
           <w:ilvl w:val="0"/>
-          <w:numId w:val="1040"/>
+          <w:numId w:val="1041"/>
         </w:numPr>
         <w:pStyle w:val="Compact"/>
       </w:pPr>
@@ -30109,7 +30280,7 @@
       <w:pPr>
         <w:numPr>
           <w:ilvl w:val="0"/>
-          <w:numId w:val="1040"/>
+          <w:numId w:val="1041"/>
         </w:numPr>
         <w:pStyle w:val="Compact"/>
       </w:pPr>
@@ -30137,7 +30308,7 @@
       <w:pPr>
         <w:numPr>
           <w:ilvl w:val="0"/>
-          <w:numId w:val="1040"/>
+          <w:numId w:val="1041"/>
         </w:numPr>
         <w:pStyle w:val="Compact"/>
       </w:pPr>
@@ -30161,8 +30332,8 @@
         <w:t xml:space="preserve">and enter the advantage and its companion complication.</w:t>
       </w:r>
     </w:p>
-    <w:bookmarkEnd w:id="123"/>
-    <w:bookmarkStart w:id="124" w:name="example"/>
+    <w:bookmarkEnd w:id="124"/>
+    <w:bookmarkStart w:id="125" w:name="example"/>
     <w:p>
       <w:pPr>
         <w:pStyle w:val="Heading3"/>
@@ -30267,10 +30438,10 @@
         <w:t xml:space="preserve">: Wesen recognize their own, and some want you back in the fold; accept the visit at the worst time.</w:t>
       </w:r>
     </w:p>
-    <w:bookmarkEnd w:id="124"/>
     <w:bookmarkEnd w:id="125"/>
     <w:bookmarkEnd w:id="126"/>
-    <w:bookmarkStart w:id="127" w:name="complications"/>
+    <w:bookmarkEnd w:id="127"/>
+    <w:bookmarkStart w:id="128" w:name="complications"/>
     <w:p>
       <w:pPr>
         <w:pStyle w:val="Heading1"/>
@@ -31074,8 +31245,8 @@
         </w:tc>
       </w:tr>
     </w:tbl>
-    <w:bookmarkEnd w:id="127"/>
-    <w:bookmarkStart w:id="128" w:name="quick-reference"/>
+    <w:bookmarkEnd w:id="128"/>
+    <w:bookmarkStart w:id="129" w:name="quick-reference"/>
     <w:p>
       <w:pPr>
         <w:pStyle w:val="Heading1"/>
@@ -31282,7 +31453,7 @@
         <w:t xml:space="preserve">start each session with two (three with True grit). Reroll, reduce an injury by one box, shrug off a telling hit, or establish a small preparation. Earn one from an accepted complication.</w:t>
       </w:r>
     </w:p>
-    <w:bookmarkEnd w:id="128"/>
+    <w:bookmarkEnd w:id="129"/>
     <w:sectPr/>
   </w:body>
 </w:document>
@@ -31692,6 +31863,9 @@
     <w:abstractNumId w:val="991"/>
   </w:num>
   <w:num w:numId="1020">
+    <w:abstractNumId w:val="991"/>
+  </w:num>
+  <w:num w:numId="1021">
     <w:abstractNumId w:val="99411"/>
     <w:lvlOverride w:ilvl="0">
       <w:startOverride w:val="1"/>
@@ -31720,9 +31894,6 @@
     <w:lvlOverride w:ilvl="8">
       <w:startOverride w:val="1"/>
     </w:lvlOverride>
-  </w:num>
-  <w:num w:numId="1021">
-    <w:abstractNumId w:val="991"/>
   </w:num>
   <w:num w:numId="1022">
     <w:abstractNumId w:val="991"/>
@@ -31776,6 +31947,9 @@
     <w:abstractNumId w:val="991"/>
   </w:num>
   <w:num w:numId="1039">
+    <w:abstractNumId w:val="991"/>
+  </w:num>
+  <w:num w:numId="1040">
     <w:abstractNumId w:val="99411"/>
     <w:lvlOverride w:ilvl="0">
       <w:startOverride w:val="1"/>
@@ -31805,7 +31979,7 @@
       <w:startOverride w:val="1"/>
     </w:lvlOverride>
   </w:num>
-  <w:num w:numId="1040">
+  <w:num w:numId="1041">
     <w:abstractNumId w:val="99411"/>
     <w:lvlOverride w:ilvl="0">
       <w:startOverride w:val="1"/>

</xml_diff>

<commit_message>
Grimm: switch between the human face and full woge on the sheet, the GM view and in encounters
Co-Authored-By: Claude Opus 5.5 <noreply@anthropic.com>
Claude-Session: https://claude.ai/code/session_015SADCFzhKijkC2foUmXrpC
</commit_message>
<xml_diff>
--- a/grimm-west/Grimm_Players_Guide.docx
+++ b/grimm-west/Grimm_Players_Guide.docx
@@ -7620,23 +7620,23 @@
         <w:t xml:space="preserve"> </w:t>
       </w:r>
       <w:r>
-        <w:t xml:space="preserve">While woged, the profile’s attribute bonuses apply to rolls on those attributes and the skills based on them, even above the starting maximum; its other traits and drawbacks apply too. The creator’s</w:t>
-      </w:r>
-      <w:r>
-        <w:t xml:space="preserve"> </w:t>
-      </w:r>
-      <w:r>
-        <w:rPr>
-          <w:bCs/>
-          <w:b/>
-        </w:rPr>
-        <w:t xml:space="preserve">In full woge</w:t>
-      </w:r>
-      <w:r>
-        <w:t xml:space="preserve"> </w:t>
-      </w:r>
-      <w:r>
-        <w:t xml:space="preserve">box adds them for you.</w:t>
+        <w:t xml:space="preserve">While woged, the profile’s attribute bonuses apply to rolls on those attributes and the skills based on them, even above the starting maximum; its other traits and drawbacks apply too. Your sheet has a</w:t>
+      </w:r>
+      <w:r>
+        <w:t xml:space="preserve"> </w:t>
+      </w:r>
+      <w:r>
+        <w:rPr>
+          <w:bCs/>
+          <w:b/>
+        </w:rPr>
+        <w:t xml:space="preserve">Human face / Full woge</w:t>
+      </w:r>
+      <w:r>
+        <w:t xml:space="preserve"> </w:t>
+      </w:r>
+      <w:r>
+        <w:t xml:space="preserve">switch: it shows the numbers of the face you’re wearing (the human ones beside them), and the dice roller and the GM’s Encounter panel follow it.</w:t>
       </w:r>
     </w:p>
     <w:p>

</xml_diff>

<commit_message>
Grimm: Bind and Force follow the core Pin and Knock down; the Taniwha swims at full Move
Bind holds as a pin (the next action frees them; holding again takes another
casting). Force knocks down as a telling hit does. A Taniwha in woge swims at
full Move, fast as a dolphin: water isn't hard going for them, though a strong
current, a storm or choked water still halves it.

Co-Authored-By: Claude Opus 5.5 <noreply@anthropic.com>
Claude-Session: https://claude.ai/code/session_015SADCFzhKijkC2foUmXrpC
</commit_message>
<xml_diff>
--- a/grimm-west/Grimm_Players_Guide.docx
+++ b/grimm-west/Grimm_Players_Guide.docx
@@ -9171,7 +9171,7 @@
               <w:rPr>
                 <w:sz w:val="19"/>
               </w:rPr>
-              <w:t xml:space="preserve">Unseen force hurls the target down: 1 box, and they lose their next move (Body resists).</w:t>
+              <w:t xml:space="preserve">Unseen force hurls the target down: 1 box, and they’re knocked down as by a telling hit: prone, or driven back a few steps, and standing up uses their next move (Body resists).</w:t>
             </w:r>
           </w:p>
         </w:tc>
@@ -9270,7 +9270,7 @@
               <w:rPr>
                 <w:sz w:val="19"/>
               </w:rPr>
-              <w:t xml:space="preserve">The target is held where they stand for the scene, or until they break free (Body resists).</w:t>
+              <w:t xml:space="preserve">The target is held where they stand, as a pin: their next action goes to getting free, and then they’re free. Holding them again takes another casting (Body resists).</w:t>
             </w:r>
           </w:p>
         </w:tc>
@@ -22785,7 +22785,7 @@
         <w:t xml:space="preserve"> </w:t>
       </w:r>
       <w:r>
-        <w:t xml:space="preserve">Body +1; Claws mark 2 boxes; Tough: hits of 2+ boxes mark one fewer; Amphibious: breathes water, swims as fast as a horse runs; Burrows through earth; Dark sight.</w:t>
+        <w:t xml:space="preserve">Body +1; Claws mark 2 boxes; Tough: hits of 2+ boxes mark one fewer; Amphibious: breathes water and swims at full Move, fast as a dolphin (water isn’t hard going for them; a strong current, a storm or choked water still halves it); Burrows through earth; Dark sight.</w:t>
       </w:r>
       <w:r>
         <w:t xml:space="preserve"> </w:t>

</xml_diff>